<commit_message>
docs(tcc): fixar títulos pretos e pontos literais no sumário
</commit_message>
<xml_diff>
--- a/TCC/TCC_MAB_Facens_Ralph_10x.docx
+++ b/TCC/TCC_MAB_Facens_Ralph_10x.docx
@@ -191,6 +191,7 @@
           <w:rFonts w:ascii="Arial" w:hAnsi="Arial" w:eastAsia="Arial" w:cs="Arial"/>
           <w:b/>
           <w:caps/>
+          <w:color w:val="000000"/>
           <w:sz w:val="28"/>
         </w:rPr>
         <w:t>FOLHA DE APROVAÇÃO</w:t>
@@ -218,6 +219,7 @@
           <w:rFonts w:ascii="Arial" w:hAnsi="Arial" w:eastAsia="Arial" w:cs="Arial"/>
           <w:b/>
           <w:caps/>
+          <w:color w:val="000000"/>
           <w:sz w:val="28"/>
         </w:rPr>
         <w:t>FICHA CATALOGRÁFICA</w:t>
@@ -245,6 +247,7 @@
           <w:rFonts w:ascii="Arial" w:hAnsi="Arial" w:eastAsia="Arial" w:cs="Arial"/>
           <w:b/>
           <w:caps/>
+          <w:color w:val="000000"/>
           <w:sz w:val="28"/>
         </w:rPr>
         <w:t>RESUMO</w:t>
@@ -286,6 +289,7 @@
           <w:rFonts w:ascii="Arial" w:hAnsi="Arial" w:eastAsia="Arial" w:cs="Arial"/>
           <w:b/>
           <w:caps/>
+          <w:color w:val="000000"/>
           <w:sz w:val="28"/>
         </w:rPr>
         <w:t>ABSTRACT</w:t>
@@ -328,6 +332,7 @@
           <w:rFonts w:ascii="Arial" w:hAnsi="Arial" w:eastAsia="Arial" w:cs="Arial"/>
           <w:b/>
           <w:caps/>
+          <w:color w:val="000000"/>
           <w:sz w:val="28"/>
         </w:rPr>
         <w:t>SUMÁRIO</w:t>
@@ -336,9 +341,6 @@
     <w:p>
       <w:pPr>
         <w:pStyle w:val="FacensTOC1"/>
-        <w:tabs>
-          <w:tab w:pos="9071" w:val="right" w:leader="dot"/>
-        </w:tabs>
       </w:pPr>
       <w:hyperlink w:anchor="_TCC_H_1000" w:history="1">
         <w:r>
@@ -356,9 +358,10 @@
           <w:rFonts w:ascii="Arial" w:hAnsi="Arial" w:eastAsia="Arial" w:cs="Arial"/>
           <w:b/>
           <w:caps w:val="0"/>
+          <w:color w:val="000000"/>
           <w:sz w:val="24"/>
         </w:rPr>
-        <w:tab/>
+        <w:t>.........................................................................................................</w:t>
       </w:r>
       <w:hyperlink w:anchor="_TCC_H_1000" w:history="1">
         <w:r>
@@ -375,9 +378,6 @@
     <w:p>
       <w:pPr>
         <w:pStyle w:val="FacensTOC1"/>
-        <w:tabs>
-          <w:tab w:pos="9071" w:val="right" w:leader="dot"/>
-        </w:tabs>
       </w:pPr>
       <w:hyperlink w:anchor="_TCC_H_1001" w:history="1">
         <w:r>
@@ -395,9 +395,10 @@
           <w:rFonts w:ascii="Arial" w:hAnsi="Arial" w:eastAsia="Arial" w:cs="Arial"/>
           <w:b/>
           <w:caps w:val="0"/>
+          <w:color w:val="000000"/>
           <w:sz w:val="24"/>
         </w:rPr>
-        <w:tab/>
+        <w:t>.............................................................................</w:t>
       </w:r>
       <w:hyperlink w:anchor="_TCC_H_1001" w:history="1">
         <w:r>
@@ -414,9 +415,6 @@
     <w:p>
       <w:pPr>
         <w:pStyle w:val="FacensTOC2"/>
-        <w:tabs>
-          <w:tab w:pos="9071" w:val="right" w:leader="dot"/>
-        </w:tabs>
       </w:pPr>
       <w:hyperlink w:anchor="_TCC_H_1002" w:history="1">
         <w:r>
@@ -434,9 +432,10 @@
           <w:rFonts w:ascii="Arial" w:hAnsi="Arial" w:eastAsia="Arial" w:cs="Arial"/>
           <w:b w:val="0"/>
           <w:caps w:val="0"/>
+          <w:color w:val="000000"/>
           <w:sz w:val="24"/>
         </w:rPr>
-        <w:tab/>
+        <w:t>........................................</w:t>
       </w:r>
       <w:hyperlink w:anchor="_TCC_H_1002" w:history="1">
         <w:r>
@@ -453,9 +452,6 @@
     <w:p>
       <w:pPr>
         <w:pStyle w:val="FacensTOC3"/>
-        <w:tabs>
-          <w:tab w:pos="9071" w:val="right" w:leader="dot"/>
-        </w:tabs>
       </w:pPr>
       <w:hyperlink w:anchor="_TCC_H_1003" w:history="1">
         <w:r>
@@ -473,9 +469,10 @@
           <w:rFonts w:ascii="Arial" w:hAnsi="Arial" w:eastAsia="Arial" w:cs="Arial"/>
           <w:b w:val="0"/>
           <w:caps w:val="0"/>
+          <w:color w:val="000000"/>
           <w:sz w:val="24"/>
         </w:rPr>
-        <w:tab/>
+        <w:t>...................................</w:t>
       </w:r>
       <w:hyperlink w:anchor="_TCC_H_1003" w:history="1">
         <w:r>
@@ -492,9 +489,6 @@
     <w:p>
       <w:pPr>
         <w:pStyle w:val="FacensTOC3"/>
-        <w:tabs>
-          <w:tab w:pos="9071" w:val="right" w:leader="dot"/>
-        </w:tabs>
       </w:pPr>
       <w:hyperlink w:anchor="_TCC_H_1004" w:history="1">
         <w:r>
@@ -512,9 +506,10 @@
           <w:rFonts w:ascii="Arial" w:hAnsi="Arial" w:eastAsia="Arial" w:cs="Arial"/>
           <w:b w:val="0"/>
           <w:caps w:val="0"/>
+          <w:color w:val="000000"/>
           <w:sz w:val="24"/>
         </w:rPr>
-        <w:tab/>
+        <w:t>................................</w:t>
       </w:r>
       <w:hyperlink w:anchor="_TCC_H_1004" w:history="1">
         <w:r>
@@ -531,9 +526,6 @@
     <w:p>
       <w:pPr>
         <w:pStyle w:val="FacensTOC3"/>
-        <w:tabs>
-          <w:tab w:pos="9071" w:val="right" w:leader="dot"/>
-        </w:tabs>
       </w:pPr>
       <w:hyperlink w:anchor="_TCC_H_1005" w:history="1">
         <w:r>
@@ -551,9 +543,10 @@
           <w:rFonts w:ascii="Arial" w:hAnsi="Arial" w:eastAsia="Arial" w:cs="Arial"/>
           <w:b w:val="0"/>
           <w:caps w:val="0"/>
+          <w:color w:val="000000"/>
           <w:sz w:val="24"/>
         </w:rPr>
-        <w:tab/>
+        <w:t>..............................................</w:t>
       </w:r>
       <w:hyperlink w:anchor="_TCC_H_1005" w:history="1">
         <w:r>
@@ -570,9 +563,6 @@
     <w:p>
       <w:pPr>
         <w:pStyle w:val="FacensTOC2"/>
-        <w:tabs>
-          <w:tab w:pos="9071" w:val="right" w:leader="dot"/>
-        </w:tabs>
       </w:pPr>
       <w:hyperlink w:anchor="_TCC_H_1006" w:history="1">
         <w:r>
@@ -590,9 +580,10 @@
           <w:rFonts w:ascii="Arial" w:hAnsi="Arial" w:eastAsia="Arial" w:cs="Arial"/>
           <w:b w:val="0"/>
           <w:caps w:val="0"/>
+          <w:color w:val="000000"/>
           <w:sz w:val="24"/>
         </w:rPr>
-        <w:tab/>
+        <w:t>.....................</w:t>
       </w:r>
       <w:hyperlink w:anchor="_TCC_H_1006" w:history="1">
         <w:r>
@@ -609,9 +600,6 @@
     <w:p>
       <w:pPr>
         <w:pStyle w:val="FacensTOC3"/>
-        <w:tabs>
-          <w:tab w:pos="9071" w:val="right" w:leader="dot"/>
-        </w:tabs>
       </w:pPr>
       <w:hyperlink w:anchor="_TCC_H_1007" w:history="1">
         <w:r>
@@ -629,9 +617,10 @@
           <w:rFonts w:ascii="Arial" w:hAnsi="Arial" w:eastAsia="Arial" w:cs="Arial"/>
           <w:b w:val="0"/>
           <w:caps w:val="0"/>
+          <w:color w:val="000000"/>
           <w:sz w:val="24"/>
         </w:rPr>
-        <w:tab/>
+        <w:t>............................................................................</w:t>
       </w:r>
       <w:hyperlink w:anchor="_TCC_H_1007" w:history="1">
         <w:r>
@@ -648,9 +637,6 @@
     <w:p>
       <w:pPr>
         <w:pStyle w:val="FacensTOC3"/>
-        <w:tabs>
-          <w:tab w:pos="9071" w:val="right" w:leader="dot"/>
-        </w:tabs>
       </w:pPr>
       <w:hyperlink w:anchor="_TCC_H_1008" w:history="1">
         <w:r>
@@ -668,9 +654,10 @@
           <w:rFonts w:ascii="Arial" w:hAnsi="Arial" w:eastAsia="Arial" w:cs="Arial"/>
           <w:b w:val="0"/>
           <w:caps w:val="0"/>
+          <w:color w:val="000000"/>
           <w:sz w:val="24"/>
         </w:rPr>
-        <w:tab/>
+        <w:t>..............................................................</w:t>
       </w:r>
       <w:hyperlink w:anchor="_TCC_H_1008" w:history="1">
         <w:r>
@@ -687,9 +674,6 @@
     <w:p>
       <w:pPr>
         <w:pStyle w:val="FacensTOC3"/>
-        <w:tabs>
-          <w:tab w:pos="9071" w:val="right" w:leader="dot"/>
-        </w:tabs>
       </w:pPr>
       <w:hyperlink w:anchor="_TCC_H_1009" w:history="1">
         <w:r>
@@ -707,9 +691,10 @@
           <w:rFonts w:ascii="Arial" w:hAnsi="Arial" w:eastAsia="Arial" w:cs="Arial"/>
           <w:b w:val="0"/>
           <w:caps w:val="0"/>
+          <w:color w:val="000000"/>
           <w:sz w:val="24"/>
         </w:rPr>
-        <w:tab/>
+        <w:t>......................................................</w:t>
       </w:r>
       <w:hyperlink w:anchor="_TCC_H_1009" w:history="1">
         <w:r>
@@ -726,9 +711,6 @@
     <w:p>
       <w:pPr>
         <w:pStyle w:val="FacensTOC2"/>
-        <w:tabs>
-          <w:tab w:pos="9071" w:val="right" w:leader="dot"/>
-        </w:tabs>
       </w:pPr>
       <w:hyperlink w:anchor="_TCC_H_1010" w:history="1">
         <w:r>
@@ -746,9 +728,10 @@
           <w:rFonts w:ascii="Arial" w:hAnsi="Arial" w:eastAsia="Arial" w:cs="Arial"/>
           <w:b w:val="0"/>
           <w:caps w:val="0"/>
+          <w:color w:val="000000"/>
           <w:sz w:val="24"/>
         </w:rPr>
-        <w:tab/>
+        <w:t>........................................................................</w:t>
       </w:r>
       <w:hyperlink w:anchor="_TCC_H_1010" w:history="1">
         <w:r>
@@ -765,9 +748,6 @@
     <w:p>
       <w:pPr>
         <w:pStyle w:val="FacensTOC3"/>
-        <w:tabs>
-          <w:tab w:pos="9071" w:val="right" w:leader="dot"/>
-        </w:tabs>
       </w:pPr>
       <w:hyperlink w:anchor="_TCC_H_1011" w:history="1">
         <w:r>
@@ -785,9 +765,10 @@
           <w:rFonts w:ascii="Arial" w:hAnsi="Arial" w:eastAsia="Arial" w:cs="Arial"/>
           <w:b w:val="0"/>
           <w:caps w:val="0"/>
+          <w:color w:val="000000"/>
           <w:sz w:val="24"/>
         </w:rPr>
-        <w:tab/>
+        <w:t>....................................................</w:t>
       </w:r>
       <w:hyperlink w:anchor="_TCC_H_1011" w:history="1">
         <w:r>
@@ -804,9 +785,6 @@
     <w:p>
       <w:pPr>
         <w:pStyle w:val="FacensTOC3"/>
-        <w:tabs>
-          <w:tab w:pos="9071" w:val="right" w:leader="dot"/>
-        </w:tabs>
       </w:pPr>
       <w:hyperlink w:anchor="_TCC_H_1012" w:history="1">
         <w:r>
@@ -824,9 +802,10 @@
           <w:rFonts w:ascii="Arial" w:hAnsi="Arial" w:eastAsia="Arial" w:cs="Arial"/>
           <w:b w:val="0"/>
           <w:caps w:val="0"/>
+          <w:color w:val="000000"/>
           <w:sz w:val="24"/>
         </w:rPr>
-        <w:tab/>
+        <w:t>..............................</w:t>
       </w:r>
       <w:hyperlink w:anchor="_TCC_H_1012" w:history="1">
         <w:r>
@@ -843,9 +822,6 @@
     <w:p>
       <w:pPr>
         <w:pStyle w:val="FacensTOC3"/>
-        <w:tabs>
-          <w:tab w:pos="9071" w:val="right" w:leader="dot"/>
-        </w:tabs>
       </w:pPr>
       <w:hyperlink w:anchor="_TCC_H_1013" w:history="1">
         <w:r>
@@ -863,9 +839,10 @@
           <w:rFonts w:ascii="Arial" w:hAnsi="Arial" w:eastAsia="Arial" w:cs="Arial"/>
           <w:b w:val="0"/>
           <w:caps w:val="0"/>
+          <w:color w:val="000000"/>
           <w:sz w:val="24"/>
         </w:rPr>
-        <w:tab/>
+        <w:t>..................</w:t>
       </w:r>
       <w:hyperlink w:anchor="_TCC_H_1013" w:history="1">
         <w:r>
@@ -882,9 +859,6 @@
     <w:p>
       <w:pPr>
         <w:pStyle w:val="FacensTOC2"/>
-        <w:tabs>
-          <w:tab w:pos="9071" w:val="right" w:leader="dot"/>
-        </w:tabs>
       </w:pPr>
       <w:hyperlink w:anchor="_TCC_H_1014" w:history="1">
         <w:r>
@@ -902,9 +876,10 @@
           <w:rFonts w:ascii="Arial" w:hAnsi="Arial" w:eastAsia="Arial" w:cs="Arial"/>
           <w:b w:val="0"/>
           <w:caps w:val="0"/>
+          <w:color w:val="000000"/>
           <w:sz w:val="24"/>
         </w:rPr>
-        <w:tab/>
+        <w:t>.......................................................</w:t>
       </w:r>
       <w:hyperlink w:anchor="_TCC_H_1014" w:history="1">
         <w:r>
@@ -921,9 +896,6 @@
     <w:p>
       <w:pPr>
         <w:pStyle w:val="FacensTOC3"/>
-        <w:tabs>
-          <w:tab w:pos="9071" w:val="right" w:leader="dot"/>
-        </w:tabs>
       </w:pPr>
       <w:hyperlink w:anchor="_TCC_H_1015" w:history="1">
         <w:r>
@@ -941,9 +913,10 @@
           <w:rFonts w:ascii="Arial" w:hAnsi="Arial" w:eastAsia="Arial" w:cs="Arial"/>
           <w:b w:val="0"/>
           <w:caps w:val="0"/>
+          <w:color w:val="000000"/>
           <w:sz w:val="24"/>
         </w:rPr>
-        <w:tab/>
+        <w:t>..................................................</w:t>
       </w:r>
       <w:hyperlink w:anchor="_TCC_H_1015" w:history="1">
         <w:r>
@@ -960,9 +933,6 @@
     <w:p>
       <w:pPr>
         <w:pStyle w:val="FacensTOC3"/>
-        <w:tabs>
-          <w:tab w:pos="9071" w:val="right" w:leader="dot"/>
-        </w:tabs>
       </w:pPr>
       <w:hyperlink w:anchor="_TCC_H_1016" w:history="1">
         <w:r>
@@ -980,9 +950,10 @@
           <w:rFonts w:ascii="Arial" w:hAnsi="Arial" w:eastAsia="Arial" w:cs="Arial"/>
           <w:b w:val="0"/>
           <w:caps w:val="0"/>
+          <w:color w:val="000000"/>
           <w:sz w:val="24"/>
         </w:rPr>
-        <w:tab/>
+        <w:t>...........................................................</w:t>
       </w:r>
       <w:hyperlink w:anchor="_TCC_H_1016" w:history="1">
         <w:r>
@@ -999,9 +970,6 @@
     <w:p>
       <w:pPr>
         <w:pStyle w:val="FacensTOC3"/>
-        <w:tabs>
-          <w:tab w:pos="9071" w:val="right" w:leader="dot"/>
-        </w:tabs>
       </w:pPr>
       <w:hyperlink w:anchor="_TCC_H_1017" w:history="1">
         <w:r>
@@ -1019,9 +987,10 @@
           <w:rFonts w:ascii="Arial" w:hAnsi="Arial" w:eastAsia="Arial" w:cs="Arial"/>
           <w:b w:val="0"/>
           <w:caps w:val="0"/>
+          <w:color w:val="000000"/>
           <w:sz w:val="24"/>
         </w:rPr>
-        <w:tab/>
+        <w:t>...................................</w:t>
       </w:r>
       <w:hyperlink w:anchor="_TCC_H_1017" w:history="1">
         <w:r>
@@ -1038,9 +1007,6 @@
     <w:p>
       <w:pPr>
         <w:pStyle w:val="FacensTOC3"/>
-        <w:tabs>
-          <w:tab w:pos="9071" w:val="right" w:leader="dot"/>
-        </w:tabs>
       </w:pPr>
       <w:hyperlink w:anchor="_TCC_H_1018" w:history="1">
         <w:r>
@@ -1058,9 +1024,10 @@
           <w:rFonts w:ascii="Arial" w:hAnsi="Arial" w:eastAsia="Arial" w:cs="Arial"/>
           <w:b w:val="0"/>
           <w:caps w:val="0"/>
+          <w:color w:val="000000"/>
           <w:sz w:val="24"/>
         </w:rPr>
-        <w:tab/>
+        <w:t>.........................................</w:t>
       </w:r>
       <w:hyperlink w:anchor="_TCC_H_1018" w:history="1">
         <w:r>
@@ -1077,9 +1044,6 @@
     <w:p>
       <w:pPr>
         <w:pStyle w:val="FacensTOC2"/>
-        <w:tabs>
-          <w:tab w:pos="9071" w:val="right" w:leader="dot"/>
-        </w:tabs>
       </w:pPr>
       <w:hyperlink w:anchor="_TCC_H_1019" w:history="1">
         <w:r>
@@ -1097,9 +1061,10 @@
           <w:rFonts w:ascii="Arial" w:hAnsi="Arial" w:eastAsia="Arial" w:cs="Arial"/>
           <w:b w:val="0"/>
           <w:caps w:val="0"/>
+          <w:color w:val="000000"/>
           <w:sz w:val="24"/>
         </w:rPr>
-        <w:tab/>
+        <w:t>................................................................</w:t>
       </w:r>
       <w:hyperlink w:anchor="_TCC_H_1019" w:history="1">
         <w:r>
@@ -1116,9 +1081,6 @@
     <w:p>
       <w:pPr>
         <w:pStyle w:val="FacensTOC3"/>
-        <w:tabs>
-          <w:tab w:pos="9071" w:val="right" w:leader="dot"/>
-        </w:tabs>
       </w:pPr>
       <w:hyperlink w:anchor="_TCC_H_1020" w:history="1">
         <w:r>
@@ -1136,9 +1098,10 @@
           <w:rFonts w:ascii="Arial" w:hAnsi="Arial" w:eastAsia="Arial" w:cs="Arial"/>
           <w:b w:val="0"/>
           <w:caps w:val="0"/>
+          <w:color w:val="000000"/>
           <w:sz w:val="24"/>
         </w:rPr>
-        <w:tab/>
+        <w:t>........................</w:t>
       </w:r>
       <w:hyperlink w:anchor="_TCC_H_1020" w:history="1">
         <w:r>
@@ -1155,9 +1118,6 @@
     <w:p>
       <w:pPr>
         <w:pStyle w:val="FacensTOC3"/>
-        <w:tabs>
-          <w:tab w:pos="9071" w:val="right" w:leader="dot"/>
-        </w:tabs>
       </w:pPr>
       <w:hyperlink w:anchor="_TCC_H_1021" w:history="1">
         <w:r>
@@ -1175,9 +1135,10 @@
           <w:rFonts w:ascii="Arial" w:hAnsi="Arial" w:eastAsia="Arial" w:cs="Arial"/>
           <w:b w:val="0"/>
           <w:caps w:val="0"/>
+          <w:color w:val="000000"/>
           <w:sz w:val="24"/>
         </w:rPr>
-        <w:tab/>
+        <w:t>..............................................................</w:t>
       </w:r>
       <w:hyperlink w:anchor="_TCC_H_1021" w:history="1">
         <w:r>
@@ -1194,9 +1155,6 @@
     <w:p>
       <w:pPr>
         <w:pStyle w:val="FacensTOC3"/>
-        <w:tabs>
-          <w:tab w:pos="9071" w:val="right" w:leader="dot"/>
-        </w:tabs>
       </w:pPr>
       <w:hyperlink w:anchor="_TCC_H_1022" w:history="1">
         <w:r>
@@ -1214,9 +1172,10 @@
           <w:rFonts w:ascii="Arial" w:hAnsi="Arial" w:eastAsia="Arial" w:cs="Arial"/>
           <w:b w:val="0"/>
           <w:caps w:val="0"/>
+          <w:color w:val="000000"/>
           <w:sz w:val="24"/>
         </w:rPr>
-        <w:tab/>
+        <w:t>................................................</w:t>
       </w:r>
       <w:hyperlink w:anchor="_TCC_H_1022" w:history="1">
         <w:r>
@@ -1233,9 +1192,6 @@
     <w:p>
       <w:pPr>
         <w:pStyle w:val="FacensTOC1"/>
-        <w:tabs>
-          <w:tab w:pos="9071" w:val="right" w:leader="dot"/>
-        </w:tabs>
       </w:pPr>
       <w:hyperlink w:anchor="_TCC_H_1023" w:history="1">
         <w:r>
@@ -1253,9 +1209,10 @@
           <w:rFonts w:ascii="Arial" w:hAnsi="Arial" w:eastAsia="Arial" w:cs="Arial"/>
           <w:b/>
           <w:caps w:val="0"/>
+          <w:color w:val="000000"/>
           <w:sz w:val="24"/>
         </w:rPr>
-        <w:tab/>
+        <w:t>...............................................................................</w:t>
       </w:r>
       <w:hyperlink w:anchor="_TCC_H_1023" w:history="1">
         <w:r>
@@ -1272,9 +1229,6 @@
     <w:p>
       <w:pPr>
         <w:pStyle w:val="FacensTOC2"/>
-        <w:tabs>
-          <w:tab w:pos="9071" w:val="right" w:leader="dot"/>
-        </w:tabs>
       </w:pPr>
       <w:hyperlink w:anchor="_TCC_H_1024" w:history="1">
         <w:r>
@@ -1292,9 +1246,10 @@
           <w:rFonts w:ascii="Arial" w:hAnsi="Arial" w:eastAsia="Arial" w:cs="Arial"/>
           <w:b w:val="0"/>
           <w:caps w:val="0"/>
+          <w:color w:val="000000"/>
           <w:sz w:val="24"/>
         </w:rPr>
-        <w:tab/>
+        <w:t>......................................</w:t>
       </w:r>
       <w:hyperlink w:anchor="_TCC_H_1024" w:history="1">
         <w:r>
@@ -1311,9 +1266,6 @@
     <w:p>
       <w:pPr>
         <w:pStyle w:val="FacensTOC2"/>
-        <w:tabs>
-          <w:tab w:pos="9071" w:val="right" w:leader="dot"/>
-        </w:tabs>
       </w:pPr>
       <w:hyperlink w:anchor="_TCC_H_1025" w:history="1">
         <w:r>
@@ -1331,9 +1283,10 @@
           <w:rFonts w:ascii="Arial" w:hAnsi="Arial" w:eastAsia="Arial" w:cs="Arial"/>
           <w:b w:val="0"/>
           <w:caps w:val="0"/>
+          <w:color w:val="000000"/>
           <w:sz w:val="24"/>
         </w:rPr>
-        <w:tab/>
+        <w:t>..................................................</w:t>
       </w:r>
       <w:hyperlink w:anchor="_TCC_H_1025" w:history="1">
         <w:r>
@@ -1350,9 +1303,6 @@
     <w:p>
       <w:pPr>
         <w:pStyle w:val="FacensTOC2"/>
-        <w:tabs>
-          <w:tab w:pos="9071" w:val="right" w:leader="dot"/>
-        </w:tabs>
       </w:pPr>
       <w:hyperlink w:anchor="_TCC_H_1026" w:history="1">
         <w:r>
@@ -1370,9 +1320,10 @@
           <w:rFonts w:ascii="Arial" w:hAnsi="Arial" w:eastAsia="Arial" w:cs="Arial"/>
           <w:b w:val="0"/>
           <w:caps w:val="0"/>
+          <w:color w:val="000000"/>
           <w:sz w:val="24"/>
         </w:rPr>
-        <w:tab/>
+        <w:t>.......................................</w:t>
       </w:r>
       <w:hyperlink w:anchor="_TCC_H_1026" w:history="1">
         <w:r>
@@ -1389,9 +1340,6 @@
     <w:p>
       <w:pPr>
         <w:pStyle w:val="FacensTOC2"/>
-        <w:tabs>
-          <w:tab w:pos="9071" w:val="right" w:leader="dot"/>
-        </w:tabs>
       </w:pPr>
       <w:hyperlink w:anchor="_TCC_H_1027" w:history="1">
         <w:r>
@@ -1409,9 +1357,10 @@
           <w:rFonts w:ascii="Arial" w:hAnsi="Arial" w:eastAsia="Arial" w:cs="Arial"/>
           <w:b w:val="0"/>
           <w:caps w:val="0"/>
+          <w:color w:val="000000"/>
           <w:sz w:val="24"/>
         </w:rPr>
-        <w:tab/>
+        <w:t>.........................................................................</w:t>
       </w:r>
       <w:hyperlink w:anchor="_TCC_H_1027" w:history="1">
         <w:r>
@@ -1428,9 +1377,6 @@
     <w:p>
       <w:pPr>
         <w:pStyle w:val="FacensTOC1"/>
-        <w:tabs>
-          <w:tab w:pos="9071" w:val="right" w:leader="dot"/>
-        </w:tabs>
       </w:pPr>
       <w:hyperlink w:anchor="_TCC_H_1028" w:history="1">
         <w:r>
@@ -1448,9 +1394,10 @@
           <w:rFonts w:ascii="Arial" w:hAnsi="Arial" w:eastAsia="Arial" w:cs="Arial"/>
           <w:b/>
           <w:caps w:val="0"/>
+          <w:color w:val="000000"/>
           <w:sz w:val="24"/>
         </w:rPr>
-        <w:tab/>
+        <w:t>....................................................................................................</w:t>
       </w:r>
       <w:hyperlink w:anchor="_TCC_H_1028" w:history="1">
         <w:r>
@@ -1467,9 +1414,6 @@
     <w:p>
       <w:pPr>
         <w:pStyle w:val="FacensTOC2"/>
-        <w:tabs>
-          <w:tab w:pos="9071" w:val="right" w:leader="dot"/>
-        </w:tabs>
       </w:pPr>
       <w:hyperlink w:anchor="_TCC_H_1029" w:history="1">
         <w:r>
@@ -1487,9 +1431,10 @@
           <w:rFonts w:ascii="Arial" w:hAnsi="Arial" w:eastAsia="Arial" w:cs="Arial"/>
           <w:b w:val="0"/>
           <w:caps w:val="0"/>
+          <w:color w:val="000000"/>
           <w:sz w:val="24"/>
         </w:rPr>
-        <w:tab/>
+        <w:t>....................................................................................</w:t>
       </w:r>
       <w:hyperlink w:anchor="_TCC_H_1029" w:history="1">
         <w:r>
@@ -1506,9 +1451,6 @@
     <w:p>
       <w:pPr>
         <w:pStyle w:val="FacensTOC2"/>
-        <w:tabs>
-          <w:tab w:pos="9071" w:val="right" w:leader="dot"/>
-        </w:tabs>
       </w:pPr>
       <w:hyperlink w:anchor="_TCC_H_1030" w:history="1">
         <w:r>
@@ -1526,9 +1468,10 @@
           <w:rFonts w:ascii="Arial" w:hAnsi="Arial" w:eastAsia="Arial" w:cs="Arial"/>
           <w:b w:val="0"/>
           <w:caps w:val="0"/>
+          <w:color w:val="000000"/>
           <w:sz w:val="24"/>
         </w:rPr>
-        <w:tab/>
+        <w:t>..............................................................................</w:t>
       </w:r>
       <w:hyperlink w:anchor="_TCC_H_1030" w:history="1">
         <w:r>
@@ -1545,9 +1488,6 @@
     <w:p>
       <w:pPr>
         <w:pStyle w:val="FacensTOC2"/>
-        <w:tabs>
-          <w:tab w:pos="9071" w:val="right" w:leader="dot"/>
-        </w:tabs>
       </w:pPr>
       <w:hyperlink w:anchor="_TCC_H_1031" w:history="1">
         <w:r>
@@ -1565,9 +1505,10 @@
           <w:rFonts w:ascii="Arial" w:hAnsi="Arial" w:eastAsia="Arial" w:cs="Arial"/>
           <w:b w:val="0"/>
           <w:caps w:val="0"/>
+          <w:color w:val="000000"/>
           <w:sz w:val="24"/>
         </w:rPr>
-        <w:tab/>
+        <w:t>...............................................</w:t>
       </w:r>
       <w:hyperlink w:anchor="_TCC_H_1031" w:history="1">
         <w:r>
@@ -1584,9 +1525,6 @@
     <w:p>
       <w:pPr>
         <w:pStyle w:val="FacensTOC2"/>
-        <w:tabs>
-          <w:tab w:pos="9071" w:val="right" w:leader="dot"/>
-        </w:tabs>
       </w:pPr>
       <w:hyperlink w:anchor="_TCC_H_1032" w:history="1">
         <w:r>
@@ -1604,9 +1542,10 @@
           <w:rFonts w:ascii="Arial" w:hAnsi="Arial" w:eastAsia="Arial" w:cs="Arial"/>
           <w:b w:val="0"/>
           <w:caps w:val="0"/>
+          <w:color w:val="000000"/>
           <w:sz w:val="24"/>
         </w:rPr>
-        <w:tab/>
+        <w:t>.........................................................................</w:t>
       </w:r>
       <w:hyperlink w:anchor="_TCC_H_1032" w:history="1">
         <w:r>
@@ -1623,9 +1562,6 @@
     <w:p>
       <w:pPr>
         <w:pStyle w:val="FacensTOC1"/>
-        <w:tabs>
-          <w:tab w:pos="9071" w:val="right" w:leader="dot"/>
-        </w:tabs>
       </w:pPr>
       <w:hyperlink w:anchor="_TCC_H_1033" w:history="1">
         <w:r>
@@ -1643,9 +1579,10 @@
           <w:rFonts w:ascii="Arial" w:hAnsi="Arial" w:eastAsia="Arial" w:cs="Arial"/>
           <w:b/>
           <w:caps w:val="0"/>
+          <w:color w:val="000000"/>
           <w:sz w:val="24"/>
         </w:rPr>
-        <w:tab/>
+        <w:t>..............................................................................</w:t>
       </w:r>
       <w:hyperlink w:anchor="_TCC_H_1033" w:history="1">
         <w:r>
@@ -1662,9 +1599,6 @@
     <w:p>
       <w:pPr>
         <w:pStyle w:val="FacensTOC2"/>
-        <w:tabs>
-          <w:tab w:pos="9071" w:val="right" w:leader="dot"/>
-        </w:tabs>
       </w:pPr>
       <w:hyperlink w:anchor="_TCC_H_1034" w:history="1">
         <w:r>
@@ -1682,9 +1616,10 @@
           <w:rFonts w:ascii="Arial" w:hAnsi="Arial" w:eastAsia="Arial" w:cs="Arial"/>
           <w:b w:val="0"/>
           <w:caps w:val="0"/>
+          <w:color w:val="000000"/>
           <w:sz w:val="24"/>
         </w:rPr>
-        <w:tab/>
+        <w:t>.......................................................................</w:t>
       </w:r>
       <w:hyperlink w:anchor="_TCC_H_1034" w:history="1">
         <w:r>
@@ -1701,9 +1636,6 @@
     <w:p>
       <w:pPr>
         <w:pStyle w:val="FacensTOC2"/>
-        <w:tabs>
-          <w:tab w:pos="9071" w:val="right" w:leader="dot"/>
-        </w:tabs>
       </w:pPr>
       <w:hyperlink w:anchor="_TCC_H_1035" w:history="1">
         <w:r>
@@ -1721,9 +1653,10 @@
           <w:rFonts w:ascii="Arial" w:hAnsi="Arial" w:eastAsia="Arial" w:cs="Arial"/>
           <w:b w:val="0"/>
           <w:caps w:val="0"/>
+          <w:color w:val="000000"/>
           <w:sz w:val="24"/>
         </w:rPr>
-        <w:tab/>
+        <w:t>........................................................................</w:t>
       </w:r>
       <w:hyperlink w:anchor="_TCC_H_1035" w:history="1">
         <w:r>
@@ -1740,9 +1673,6 @@
     <w:p>
       <w:pPr>
         <w:pStyle w:val="FacensTOC2"/>
-        <w:tabs>
-          <w:tab w:pos="9071" w:val="right" w:leader="dot"/>
-        </w:tabs>
       </w:pPr>
       <w:hyperlink w:anchor="_TCC_H_1036" w:history="1">
         <w:r>
@@ -1760,9 +1690,10 @@
           <w:rFonts w:ascii="Arial" w:hAnsi="Arial" w:eastAsia="Arial" w:cs="Arial"/>
           <w:b w:val="0"/>
           <w:caps w:val="0"/>
+          <w:color w:val="000000"/>
           <w:sz w:val="24"/>
         </w:rPr>
-        <w:tab/>
+        <w:t>...................................................................</w:t>
       </w:r>
       <w:hyperlink w:anchor="_TCC_H_1036" w:history="1">
         <w:r>
@@ -1779,9 +1710,6 @@
     <w:p>
       <w:pPr>
         <w:pStyle w:val="FacensTOC2"/>
-        <w:tabs>
-          <w:tab w:pos="9071" w:val="right" w:leader="dot"/>
-        </w:tabs>
       </w:pPr>
       <w:hyperlink w:anchor="_TCC_H_1037" w:history="1">
         <w:r>
@@ -1799,9 +1727,10 @@
           <w:rFonts w:ascii="Arial" w:hAnsi="Arial" w:eastAsia="Arial" w:cs="Arial"/>
           <w:b w:val="0"/>
           <w:caps w:val="0"/>
+          <w:color w:val="000000"/>
           <w:sz w:val="24"/>
         </w:rPr>
-        <w:tab/>
+        <w:t>.........................................................................</w:t>
       </w:r>
       <w:hyperlink w:anchor="_TCC_H_1037" w:history="1">
         <w:r>
@@ -1818,9 +1747,6 @@
     <w:p>
       <w:pPr>
         <w:pStyle w:val="FacensTOC1"/>
-        <w:tabs>
-          <w:tab w:pos="9071" w:val="right" w:leader="dot"/>
-        </w:tabs>
       </w:pPr>
       <w:hyperlink w:anchor="_TCC_H_1038" w:history="1">
         <w:r>
@@ -1838,9 +1764,10 @@
           <w:rFonts w:ascii="Arial" w:hAnsi="Arial" w:eastAsia="Arial" w:cs="Arial"/>
           <w:b/>
           <w:caps w:val="0"/>
+          <w:color w:val="000000"/>
           <w:sz w:val="24"/>
         </w:rPr>
-        <w:tab/>
+        <w:t>....................................................................</w:t>
       </w:r>
       <w:hyperlink w:anchor="_TCC_H_1038" w:history="1">
         <w:r>
@@ -1857,9 +1784,6 @@
     <w:p>
       <w:pPr>
         <w:pStyle w:val="FacensTOC2"/>
-        <w:tabs>
-          <w:tab w:pos="9071" w:val="right" w:leader="dot"/>
-        </w:tabs>
       </w:pPr>
       <w:hyperlink w:anchor="_TCC_H_1039" w:history="1">
         <w:r>
@@ -1877,9 +1801,10 @@
           <w:rFonts w:ascii="Arial" w:hAnsi="Arial" w:eastAsia="Arial" w:cs="Arial"/>
           <w:b w:val="0"/>
           <w:caps w:val="0"/>
+          <w:color w:val="000000"/>
           <w:sz w:val="24"/>
         </w:rPr>
-        <w:tab/>
+        <w:t>.......................................................................</w:t>
       </w:r>
       <w:hyperlink w:anchor="_TCC_H_1039" w:history="1">
         <w:r>
@@ -1896,9 +1821,6 @@
     <w:p>
       <w:pPr>
         <w:pStyle w:val="FacensTOC2"/>
-        <w:tabs>
-          <w:tab w:pos="9071" w:val="right" w:leader="dot"/>
-        </w:tabs>
       </w:pPr>
       <w:hyperlink w:anchor="_TCC_H_1040" w:history="1">
         <w:r>
@@ -1916,9 +1838,10 @@
           <w:rFonts w:ascii="Arial" w:hAnsi="Arial" w:eastAsia="Arial" w:cs="Arial"/>
           <w:b w:val="0"/>
           <w:caps w:val="0"/>
+          <w:color w:val="000000"/>
           <w:sz w:val="24"/>
         </w:rPr>
-        <w:tab/>
+        <w:t>.............................................................</w:t>
       </w:r>
       <w:hyperlink w:anchor="_TCC_H_1040" w:history="1">
         <w:r>
@@ -1935,9 +1858,6 @@
     <w:p>
       <w:pPr>
         <w:pStyle w:val="FacensTOC2"/>
-        <w:tabs>
-          <w:tab w:pos="9071" w:val="right" w:leader="dot"/>
-        </w:tabs>
       </w:pPr>
       <w:hyperlink w:anchor="_TCC_H_1041" w:history="1">
         <w:r>
@@ -1955,9 +1875,10 @@
           <w:rFonts w:ascii="Arial" w:hAnsi="Arial" w:eastAsia="Arial" w:cs="Arial"/>
           <w:b w:val="0"/>
           <w:caps w:val="0"/>
+          <w:color w:val="000000"/>
           <w:sz w:val="24"/>
         </w:rPr>
-        <w:tab/>
+        <w:t>..................................................</w:t>
       </w:r>
       <w:hyperlink w:anchor="_TCC_H_1041" w:history="1">
         <w:r>
@@ -1974,9 +1895,6 @@
     <w:p>
       <w:pPr>
         <w:pStyle w:val="FacensTOC2"/>
-        <w:tabs>
-          <w:tab w:pos="9071" w:val="right" w:leader="dot"/>
-        </w:tabs>
       </w:pPr>
       <w:hyperlink w:anchor="_TCC_H_1042" w:history="1">
         <w:r>
@@ -1994,9 +1912,10 @@
           <w:rFonts w:ascii="Arial" w:hAnsi="Arial" w:eastAsia="Arial" w:cs="Arial"/>
           <w:b w:val="0"/>
           <w:caps w:val="0"/>
+          <w:color w:val="000000"/>
           <w:sz w:val="24"/>
         </w:rPr>
-        <w:tab/>
+        <w:t>.........................................................</w:t>
       </w:r>
       <w:hyperlink w:anchor="_TCC_H_1042" w:history="1">
         <w:r>
@@ -2013,9 +1932,6 @@
     <w:p>
       <w:pPr>
         <w:pStyle w:val="FacensTOC1"/>
-        <w:tabs>
-          <w:tab w:pos="9071" w:val="right" w:leader="dot"/>
-        </w:tabs>
       </w:pPr>
       <w:hyperlink w:anchor="_TCC_H_1043" w:history="1">
         <w:r>
@@ -2033,9 +1949,10 @@
           <w:rFonts w:ascii="Arial" w:hAnsi="Arial" w:eastAsia="Arial" w:cs="Arial"/>
           <w:b/>
           <w:caps w:val="0"/>
+          <w:color w:val="000000"/>
           <w:sz w:val="24"/>
         </w:rPr>
-        <w:tab/>
+        <w:t>......................................................................</w:t>
       </w:r>
       <w:hyperlink w:anchor="_TCC_H_1043" w:history="1">
         <w:r>
@@ -2052,9 +1969,6 @@
     <w:p>
       <w:pPr>
         <w:pStyle w:val="FacensTOC2"/>
-        <w:tabs>
-          <w:tab w:pos="9071" w:val="right" w:leader="dot"/>
-        </w:tabs>
       </w:pPr>
       <w:hyperlink w:anchor="_TCC_H_1044" w:history="1">
         <w:r>
@@ -2072,9 +1986,10 @@
           <w:rFonts w:ascii="Arial" w:hAnsi="Arial" w:eastAsia="Arial" w:cs="Arial"/>
           <w:b w:val="0"/>
           <w:caps w:val="0"/>
+          <w:color w:val="000000"/>
           <w:sz w:val="24"/>
         </w:rPr>
-        <w:tab/>
+        <w:t>.................................................................................</w:t>
       </w:r>
       <w:hyperlink w:anchor="_TCC_H_1044" w:history="1">
         <w:r>
@@ -2091,9 +2006,6 @@
     <w:p>
       <w:pPr>
         <w:pStyle w:val="FacensTOC2"/>
-        <w:tabs>
-          <w:tab w:pos="9071" w:val="right" w:leader="dot"/>
-        </w:tabs>
       </w:pPr>
       <w:hyperlink w:anchor="_TCC_H_1045" w:history="1">
         <w:r>
@@ -2111,9 +2023,10 @@
           <w:rFonts w:ascii="Arial" w:hAnsi="Arial" w:eastAsia="Arial" w:cs="Arial"/>
           <w:b w:val="0"/>
           <w:caps w:val="0"/>
+          <w:color w:val="000000"/>
           <w:sz w:val="24"/>
         </w:rPr>
-        <w:tab/>
+        <w:t>............................................................................</w:t>
       </w:r>
       <w:hyperlink w:anchor="_TCC_H_1045" w:history="1">
         <w:r>
@@ -2130,9 +2043,6 @@
     <w:p>
       <w:pPr>
         <w:pStyle w:val="FacensTOC2"/>
-        <w:tabs>
-          <w:tab w:pos="9071" w:val="right" w:leader="dot"/>
-        </w:tabs>
       </w:pPr>
       <w:hyperlink w:anchor="_TCC_H_1046" w:history="1">
         <w:r>
@@ -2150,9 +2060,10 @@
           <w:rFonts w:ascii="Arial" w:hAnsi="Arial" w:eastAsia="Arial" w:cs="Arial"/>
           <w:b w:val="0"/>
           <w:caps w:val="0"/>
+          <w:color w:val="000000"/>
           <w:sz w:val="24"/>
         </w:rPr>
-        <w:tab/>
+        <w:t>.............................................................................</w:t>
       </w:r>
       <w:hyperlink w:anchor="_TCC_H_1046" w:history="1">
         <w:r>
@@ -2169,9 +2080,6 @@
     <w:p>
       <w:pPr>
         <w:pStyle w:val="FacensTOC2"/>
-        <w:tabs>
-          <w:tab w:pos="9071" w:val="right" w:leader="dot"/>
-        </w:tabs>
       </w:pPr>
       <w:hyperlink w:anchor="_TCC_H_1047" w:history="1">
         <w:r>
@@ -2189,9 +2097,10 @@
           <w:rFonts w:ascii="Arial" w:hAnsi="Arial" w:eastAsia="Arial" w:cs="Arial"/>
           <w:b w:val="0"/>
           <w:caps w:val="0"/>
+          <w:color w:val="000000"/>
           <w:sz w:val="24"/>
         </w:rPr>
-        <w:tab/>
+        <w:t>..................................................</w:t>
       </w:r>
       <w:hyperlink w:anchor="_TCC_H_1047" w:history="1">
         <w:r>
@@ -2208,9 +2117,6 @@
     <w:p>
       <w:pPr>
         <w:pStyle w:val="FacensTOC1"/>
-        <w:tabs>
-          <w:tab w:pos="9071" w:val="right" w:leader="dot"/>
-        </w:tabs>
       </w:pPr>
       <w:hyperlink w:anchor="_TCC_H_1048" w:history="1">
         <w:r>
@@ -2228,9 +2134,10 @@
           <w:rFonts w:ascii="Arial" w:hAnsi="Arial" w:eastAsia="Arial" w:cs="Arial"/>
           <w:b/>
           <w:caps w:val="0"/>
+          <w:color w:val="000000"/>
           <w:sz w:val="24"/>
         </w:rPr>
-        <w:tab/>
+        <w:t>..........................................................................................................</w:t>
       </w:r>
       <w:hyperlink w:anchor="_TCC_H_1048" w:history="1">
         <w:r>
@@ -2247,9 +2154,6 @@
     <w:p>
       <w:pPr>
         <w:pStyle w:val="FacensTOC2"/>
-        <w:tabs>
-          <w:tab w:pos="9071" w:val="right" w:leader="dot"/>
-        </w:tabs>
       </w:pPr>
       <w:hyperlink w:anchor="_TCC_H_1049" w:history="1">
         <w:r>
@@ -2267,9 +2171,10 @@
           <w:rFonts w:ascii="Arial" w:hAnsi="Arial" w:eastAsia="Arial" w:cs="Arial"/>
           <w:b w:val="0"/>
           <w:caps w:val="0"/>
+          <w:color w:val="000000"/>
           <w:sz w:val="24"/>
         </w:rPr>
-        <w:tab/>
+        <w:t>.....................................................................</w:t>
       </w:r>
       <w:hyperlink w:anchor="_TCC_H_1049" w:history="1">
         <w:r>
@@ -2286,9 +2191,6 @@
     <w:p>
       <w:pPr>
         <w:pStyle w:val="FacensTOC2"/>
-        <w:tabs>
-          <w:tab w:pos="9071" w:val="right" w:leader="dot"/>
-        </w:tabs>
       </w:pPr>
       <w:hyperlink w:anchor="_TCC_H_1050" w:history="1">
         <w:r>
@@ -2306,9 +2208,10 @@
           <w:rFonts w:ascii="Arial" w:hAnsi="Arial" w:eastAsia="Arial" w:cs="Arial"/>
           <w:b w:val="0"/>
           <w:caps w:val="0"/>
+          <w:color w:val="000000"/>
           <w:sz w:val="24"/>
         </w:rPr>
-        <w:tab/>
+        <w:t>.......................................................................</w:t>
       </w:r>
       <w:hyperlink w:anchor="_TCC_H_1050" w:history="1">
         <w:r>
@@ -2325,9 +2228,6 @@
     <w:p>
       <w:pPr>
         <w:pStyle w:val="FacensTOC2"/>
-        <w:tabs>
-          <w:tab w:pos="9071" w:val="right" w:leader="dot"/>
-        </w:tabs>
       </w:pPr>
       <w:hyperlink w:anchor="_TCC_H_1051" w:history="1">
         <w:r>
@@ -2345,9 +2245,10 @@
           <w:rFonts w:ascii="Arial" w:hAnsi="Arial" w:eastAsia="Arial" w:cs="Arial"/>
           <w:b w:val="0"/>
           <w:caps w:val="0"/>
+          <w:color w:val="000000"/>
           <w:sz w:val="24"/>
         </w:rPr>
-        <w:tab/>
+        <w:t>...........................................................................</w:t>
       </w:r>
       <w:hyperlink w:anchor="_TCC_H_1051" w:history="1">
         <w:r>
@@ -2364,9 +2265,6 @@
     <w:p>
       <w:pPr>
         <w:pStyle w:val="FacensTOC1"/>
-        <w:tabs>
-          <w:tab w:pos="9071" w:val="right" w:leader="dot"/>
-        </w:tabs>
       </w:pPr>
       <w:hyperlink w:anchor="_TCC_H_1052" w:history="1">
         <w:r>
@@ -2384,9 +2282,10 @@
           <w:rFonts w:ascii="Arial" w:hAnsi="Arial" w:eastAsia="Arial" w:cs="Arial"/>
           <w:b/>
           <w:caps w:val="0"/>
+          <w:color w:val="000000"/>
           <w:sz w:val="24"/>
         </w:rPr>
-        <w:tab/>
+        <w:t>...................................................................................</w:t>
       </w:r>
       <w:hyperlink w:anchor="_TCC_H_1052" w:history="1">
         <w:r>
@@ -2403,9 +2302,6 @@
     <w:p>
       <w:pPr>
         <w:pStyle w:val="FacensTOC2"/>
-        <w:tabs>
-          <w:tab w:pos="9071" w:val="right" w:leader="dot"/>
-        </w:tabs>
       </w:pPr>
       <w:hyperlink w:anchor="_TCC_H_1053" w:history="1">
         <w:r>
@@ -2423,9 +2319,10 @@
           <w:rFonts w:ascii="Arial" w:hAnsi="Arial" w:eastAsia="Arial" w:cs="Arial"/>
           <w:b w:val="0"/>
           <w:caps w:val="0"/>
+          <w:color w:val="000000"/>
           <w:sz w:val="24"/>
         </w:rPr>
-        <w:tab/>
+        <w:t>.............................................................................................</w:t>
       </w:r>
       <w:hyperlink w:anchor="_TCC_H_1053" w:history="1">
         <w:r>
@@ -2442,9 +2339,6 @@
     <w:p>
       <w:pPr>
         <w:pStyle w:val="FacensTOC2"/>
-        <w:tabs>
-          <w:tab w:pos="9071" w:val="right" w:leader="dot"/>
-        </w:tabs>
       </w:pPr>
       <w:hyperlink w:anchor="_TCC_H_1054" w:history="1">
         <w:r>
@@ -2462,9 +2356,10 @@
           <w:rFonts w:ascii="Arial" w:hAnsi="Arial" w:eastAsia="Arial" w:cs="Arial"/>
           <w:b w:val="0"/>
           <w:caps w:val="0"/>
+          <w:color w:val="000000"/>
           <w:sz w:val="24"/>
         </w:rPr>
-        <w:tab/>
+        <w:t>.............................................................</w:t>
       </w:r>
       <w:hyperlink w:anchor="_TCC_H_1054" w:history="1">
         <w:r>
@@ -2481,9 +2376,6 @@
     <w:p>
       <w:pPr>
         <w:pStyle w:val="FacensTOC2"/>
-        <w:tabs>
-          <w:tab w:pos="9071" w:val="right" w:leader="dot"/>
-        </w:tabs>
       </w:pPr>
       <w:hyperlink w:anchor="_TCC_H_1055" w:history="1">
         <w:r>
@@ -2501,9 +2393,10 @@
           <w:rFonts w:ascii="Arial" w:hAnsi="Arial" w:eastAsia="Arial" w:cs="Arial"/>
           <w:b w:val="0"/>
           <w:caps w:val="0"/>
+          <w:color w:val="000000"/>
           <w:sz w:val="24"/>
         </w:rPr>
-        <w:tab/>
+        <w:t>..............................................................................</w:t>
       </w:r>
       <w:hyperlink w:anchor="_TCC_H_1055" w:history="1">
         <w:r>
@@ -2520,9 +2413,6 @@
     <w:p>
       <w:pPr>
         <w:pStyle w:val="FacensTOC1"/>
-        <w:tabs>
-          <w:tab w:pos="9071" w:val="right" w:leader="dot"/>
-        </w:tabs>
       </w:pPr>
       <w:hyperlink w:anchor="_TCC_H_1056" w:history="1">
         <w:r>
@@ -2540,9 +2430,10 @@
           <w:rFonts w:ascii="Arial" w:hAnsi="Arial" w:eastAsia="Arial" w:cs="Arial"/>
           <w:b/>
           <w:caps w:val="0"/>
+          <w:color w:val="000000"/>
           <w:sz w:val="24"/>
         </w:rPr>
-        <w:tab/>
+        <w:t>........................................................................................................</w:t>
       </w:r>
       <w:hyperlink w:anchor="_TCC_H_1056" w:history="1">
         <w:r>
@@ -2583,6 +2474,7 @@
           <w:rFonts w:ascii="Arial" w:hAnsi="Arial" w:eastAsia="Arial" w:cs="Arial"/>
           <w:b/>
           <w:caps/>
+          <w:color w:val="000000"/>
           <w:sz w:val="28"/>
         </w:rPr>
         <w:t>INTRODUÇÃO</w:t>
@@ -2594,6 +2486,7 @@
       <w:r>
         <w:rPr>
           <w:rFonts w:ascii="Arial" w:hAnsi="Arial" w:eastAsia="Arial" w:cs="Arial"/>
+          <w:color w:val="000000"/>
           <w:sz w:val="24"/>
         </w:rPr>
         <w:t>A inteligência artificial (IA) tem ampliado sua presença em diferentes setores econômicos e funções organizacionais, com avanço particularmente visível em atividades ligadas a operações de serviço, automação empresarial e atendimento ao cliente. Relatórios recentes indicam que a adoção de IA deixou de ser predominantemente experimental em muitas organizações e passou a integrar, de forma mais sistemática, processos de negócio voltados à produtividade, à personalização e ao suporte à decisão (STANFORD HAI, 2025; MCKINSEY &amp; COMPANY, 2024a).</w:t>
@@ -2604,6 +2497,7 @@
       <w:r>
         <w:rPr>
           <w:rFonts w:ascii="Arial" w:hAnsi="Arial" w:eastAsia="Arial" w:cs="Arial"/>
+          <w:color w:val="000000"/>
           <w:sz w:val="24"/>
         </w:rPr>
         <w:t xml:space="preserve">Esse movimento favoreceu o desenvolvimento de sistemas capazes de interpretar solicitações em linguagem natural, acionar ferramentas, estruturar subtarefas e apoiar fluxos de atendimento de maneira mais eficiente. No campo de customer care e service operations, a literatura recente mostra que a IA vem sendo incorporada justamente em cenários marcados por alto volume de interações, pressão por rapidez e necessidade de reorganização contínua dos processos de atendimento (BUESING </w:t>
@@ -2613,6 +2507,7 @@
           <w:rFonts w:ascii="Arial" w:hAnsi="Arial" w:eastAsia="Arial" w:cs="Arial"/>
           <w:i w:val="1"/>
           <w:iCs w:val="1"/>
+          <w:color w:val="000000"/>
           <w:sz w:val="24"/>
         </w:rPr>
         <w:t>et al.</w:t>
@@ -2620,6 +2515,7 @@
       <w:r>
         <w:rPr>
           <w:rFonts w:ascii="Arial" w:hAnsi="Arial" w:eastAsia="Arial" w:cs="Arial"/>
+          <w:color w:val="000000"/>
           <w:sz w:val="24"/>
         </w:rPr>
         <w:t xml:space="preserve">, 2024; YU </w:t>
@@ -2629,6 +2525,7 @@
           <w:rFonts w:ascii="Arial" w:hAnsi="Arial" w:eastAsia="Arial" w:cs="Arial"/>
           <w:i w:val="1"/>
           <w:iCs w:val="1"/>
+          <w:color w:val="000000"/>
           <w:sz w:val="24"/>
         </w:rPr>
         <w:t>et al.</w:t>
@@ -2636,6 +2533,7 @@
       <w:r>
         <w:rPr>
           <w:rFonts w:ascii="Arial" w:hAnsi="Arial" w:eastAsia="Arial" w:cs="Arial"/>
+          <w:color w:val="000000"/>
           <w:sz w:val="24"/>
         </w:rPr>
         <w:t>, 2025).</w:t>
@@ -2646,6 +2544,7 @@
       <w:r>
         <w:rPr>
           <w:rFonts w:ascii="Arial" w:hAnsi="Arial" w:eastAsia="Arial" w:cs="Arial"/>
+          <w:color w:val="000000"/>
           <w:sz w:val="24"/>
         </w:rPr>
         <w:t xml:space="preserve">Nesse cenário, os sistemas multiagentes destacam-se por permitir a distribuição de responsabilidades entre agentes especializados, favorecendo arranjos mais flexíveis, escaláveis e aderentes a problemas complexos. Revisões recentes sobre sistemas multiagentes baseados em grandes modelos de linguagem indicam que a arquitetura de coordenação influencia diretamente aspectos como comunicação entre componentes, uso de memória, integração com ferramentas externas, controle do fluxo de execução e capacidade de adaptação do sistema (LI </w:t>
@@ -2655,6 +2554,7 @@
           <w:rFonts w:ascii="Arial" w:hAnsi="Arial" w:eastAsia="Arial" w:cs="Arial"/>
           <w:i w:val="1"/>
           <w:iCs w:val="1"/>
+          <w:color w:val="000000"/>
           <w:sz w:val="24"/>
         </w:rPr>
         <w:t>et al.</w:t>
@@ -2662,6 +2562,7 @@
       <w:r>
         <w:rPr>
           <w:rFonts w:ascii="Arial" w:hAnsi="Arial" w:eastAsia="Arial" w:cs="Arial"/>
+          <w:color w:val="000000"/>
           <w:sz w:val="24"/>
         </w:rPr>
         <w:t xml:space="preserve">, 2024; PICCIALLI </w:t>
@@ -2671,6 +2572,7 @@
           <w:rFonts w:ascii="Arial" w:hAnsi="Arial" w:eastAsia="Arial" w:cs="Arial"/>
           <w:i w:val="1"/>
           <w:iCs w:val="1"/>
+          <w:color w:val="000000"/>
           <w:sz w:val="24"/>
         </w:rPr>
         <w:t>et al.</w:t>
@@ -2678,6 +2580,7 @@
       <w:r>
         <w:rPr>
           <w:rFonts w:ascii="Arial" w:hAnsi="Arial" w:eastAsia="Arial" w:cs="Arial"/>
+          <w:color w:val="000000"/>
           <w:sz w:val="24"/>
         </w:rPr>
         <w:t>, 2025).</w:t>
@@ -2688,6 +2591,7 @@
       <w:r>
         <w:rPr>
           <w:rFonts w:ascii="Arial" w:hAnsi="Arial" w:eastAsia="Arial" w:cs="Arial"/>
+          <w:color w:val="000000"/>
           <w:sz w:val="24"/>
         </w:rPr>
         <w:t xml:space="preserve">No contexto farmacêutico, o atendimento não se limita à dispensação de medicamentos. Farmácias comunitárias frequentemente acumulam funções relacionadas à orientação ao usuário, ao esclarecimento de dúvidas, ao suporte sobre serviços disponíveis, à mediação do acesso a informações em saúde e ao encaminhamento de demandas para atendimento profissional apropriado. Ao mesmo tempo, documentos institucionais e estudos recentes mostram que esse ambiente convive com desafios operacionais relevantes, como pressão por produtividade, carga de trabalho elevada, necessidade de rastreabilidade e manutenção da qualidade do cuidado em condições de trabalho adversas (WHO EUROPE, 2024; ALVAREZ </w:t>
@@ -2697,6 +2601,7 @@
           <w:rFonts w:ascii="Arial" w:hAnsi="Arial" w:eastAsia="Arial" w:cs="Arial"/>
           <w:i w:val="1"/>
           <w:iCs w:val="1"/>
+          <w:color w:val="000000"/>
           <w:sz w:val="24"/>
         </w:rPr>
         <w:t>et al.</w:t>
@@ -2704,6 +2609,7 @@
       <w:r>
         <w:rPr>
           <w:rFonts w:ascii="Arial" w:hAnsi="Arial" w:eastAsia="Arial" w:cs="Arial"/>
+          <w:color w:val="000000"/>
           <w:sz w:val="24"/>
         </w:rPr>
         <w:t>, 2025; PGEU, 2025).</w:t>
@@ -2714,6 +2620,7 @@
       <w:r>
         <w:rPr>
           <w:rFonts w:ascii="Arial" w:hAnsi="Arial" w:eastAsia="Arial" w:cs="Arial"/>
+          <w:color w:val="000000"/>
           <w:sz w:val="24"/>
         </w:rPr>
         <w:t>Diante desse contexto, foi desenvolvido o MAB (multi agent benchmark), uma plataforma para comparação de sistemas multiagente, inicialmente aplicada no atendimento inteligente em farmácias, com foco na análise comparativa de diferentes arquiteturas de coordenação. A proposta contempla três abordagens distintas de coordenação entre agentes: orquestração centralizada, workflow estruturado e organização descentralizada. A análise detalhada dessas arquiteturas é apresentada no referencial teórico.</w:t>
@@ -2724,6 +2631,7 @@
       <w:r>
         <w:rPr>
           <w:rFonts w:ascii="Arial" w:hAnsi="Arial" w:eastAsia="Arial" w:cs="Arial"/>
+          <w:color w:val="000000"/>
           <w:sz w:val="24"/>
         </w:rPr>
         <w:t xml:space="preserve">Apesar dos avanços recentes em assistentes virtuais, agentes autônomos e aplicações de IA para atendimento, a definição da arquitetura de coordenação ainda permanece como uma questão central de projeto. Em sistemas excessivamente centralizados, podem surgir gargalos de supervisão e concentração decisória; em fluxos demasiadamente rígidos, pode haver perda de flexibilidade; por outro lado, em arranjos altamente descentralizados, aumentam os desafios de controle, consistência e rastreabilidade. Assim, o problema investigado neste trabalho não se restringe à automatização do atendimento em si, mas se concentra na análise de como a arquitetura de coordenação afeta desempenho, organização do fluxo e qualidade operacional em um ambiente de serviços farmacêuticos (LI </w:t>
@@ -2733,6 +2641,7 @@
           <w:rFonts w:ascii="Arial" w:hAnsi="Arial" w:eastAsia="Arial" w:cs="Arial"/>
           <w:i w:val="1"/>
           <w:iCs w:val="1"/>
+          <w:color w:val="000000"/>
           <w:sz w:val="24"/>
         </w:rPr>
         <w:t>et al.</w:t>
@@ -2740,6 +2649,7 @@
       <w:r>
         <w:rPr>
           <w:rFonts w:ascii="Arial" w:hAnsi="Arial" w:eastAsia="Arial" w:cs="Arial"/>
+          <w:color w:val="000000"/>
           <w:sz w:val="24"/>
         </w:rPr>
         <w:t xml:space="preserve">, 2024; YU </w:t>
@@ -2749,6 +2659,7 @@
           <w:rFonts w:ascii="Arial" w:hAnsi="Arial" w:eastAsia="Arial" w:cs="Arial"/>
           <w:i w:val="1"/>
           <w:iCs w:val="1"/>
+          <w:color w:val="000000"/>
           <w:sz w:val="24"/>
         </w:rPr>
         <w:t>et al.</w:t>
@@ -2756,6 +2667,7 @@
       <w:r>
         <w:rPr>
           <w:rFonts w:ascii="Arial" w:hAnsi="Arial" w:eastAsia="Arial" w:cs="Arial"/>
+          <w:color w:val="000000"/>
           <w:sz w:val="24"/>
         </w:rPr>
         <w:t xml:space="preserve">, 2025; ALVAREZ </w:t>
@@ -2765,6 +2677,7 @@
           <w:rFonts w:ascii="Arial" w:hAnsi="Arial" w:eastAsia="Arial" w:cs="Arial"/>
           <w:i w:val="1"/>
           <w:iCs w:val="1"/>
+          <w:color w:val="000000"/>
           <w:sz w:val="24"/>
         </w:rPr>
         <w:t>et al.</w:t>
@@ -2772,6 +2685,7 @@
       <w:r>
         <w:rPr>
           <w:rFonts w:ascii="Arial" w:hAnsi="Arial" w:eastAsia="Arial" w:cs="Arial"/>
+          <w:color w:val="000000"/>
           <w:sz w:val="24"/>
         </w:rPr>
         <w:t>, 2025).</w:t>
@@ -2782,6 +2696,7 @@
       <w:r>
         <w:rPr>
           <w:rFonts w:ascii="Arial" w:hAnsi="Arial" w:eastAsia="Arial" w:cs="Arial"/>
+          <w:color w:val="000000"/>
           <w:sz w:val="24"/>
         </w:rPr>
         <w:t xml:space="preserve">A problematização central da pesquisa consiste em investigar como diferentes arquiteturas multiagentes influenciam o desempenho de um sistema de atendimento em farmácias. Para isso, serão comparados modelos baseados em orquestração, workflow e swarm, com observação do tempo de resposta, da distribuição de tarefas entre agentes, da taxa de sucesso técnico, do uso de recursos, da qualidade das respostas e da necessidade de intervenção humana. Nessa perspectiva, a arquitetura de coordenação é tratada não como mero detalhe técnico, mas como elemento capaz de alterar o comportamento global do sistema (LI </w:t>
@@ -2791,6 +2706,7 @@
           <w:rFonts w:ascii="Arial" w:hAnsi="Arial" w:eastAsia="Arial" w:cs="Arial"/>
           <w:i w:val="1"/>
           <w:iCs w:val="1"/>
+          <w:color w:val="000000"/>
           <w:sz w:val="24"/>
         </w:rPr>
         <w:t>et al.</w:t>
@@ -2798,6 +2714,7 @@
       <w:r>
         <w:rPr>
           <w:rFonts w:ascii="Arial" w:hAnsi="Arial" w:eastAsia="Arial" w:cs="Arial"/>
+          <w:color w:val="000000"/>
           <w:sz w:val="24"/>
         </w:rPr>
         <w:t xml:space="preserve">, 2024; PICCIALLI </w:t>
@@ -2807,6 +2724,7 @@
           <w:rFonts w:ascii="Arial" w:hAnsi="Arial" w:eastAsia="Arial" w:cs="Arial"/>
           <w:i w:val="1"/>
           <w:iCs w:val="1"/>
+          <w:color w:val="000000"/>
           <w:sz w:val="24"/>
         </w:rPr>
         <w:t>et al.</w:t>
@@ -2814,6 +2732,7 @@
       <w:r>
         <w:rPr>
           <w:rFonts w:ascii="Arial" w:hAnsi="Arial" w:eastAsia="Arial" w:cs="Arial"/>
+          <w:color w:val="000000"/>
           <w:sz w:val="24"/>
         </w:rPr>
         <w:t>, 2025).</w:t>
@@ -2824,6 +2743,7 @@
       <w:r>
         <w:rPr>
           <w:rFonts w:ascii="Arial" w:hAnsi="Arial" w:eastAsia="Arial" w:cs="Arial"/>
+          <w:color w:val="000000"/>
           <w:sz w:val="24"/>
         </w:rPr>
         <w:t>O objetivo geral desta pesquisa consiste em desenvolver um sistema multiagente para atendimento inteligente em farmácias e comparar, em ambiente experimental, diferentes arquiteturas de coordenação entre agentes. Como objetivos específicos, busca-se: levantar o estado da arte sobre inteligência artificial aplicada ao atendimento e sobre sistemas multiagentes; modelar uma arquitetura capaz de comportar diferentes estratégias de coordenação; construir um protótipo funcional para simulação de cenários de atendimento farmacêutico; e avaliar comparativamente os modelos adotados com base em métricas de desempenho previamente definidas.</w:t>
@@ -2834,6 +2754,7 @@
       <w:r>
         <w:rPr>
           <w:rFonts w:ascii="Arial" w:hAnsi="Arial" w:eastAsia="Arial" w:cs="Arial"/>
+          <w:color w:val="000000"/>
           <w:sz w:val="24"/>
         </w:rPr>
         <w:t>A justificativa do trabalho está associada à sua relevância científica, tecnológica e aplicada. No plano científico, a pesquisa busca contribuir para a discussão sobre arquiteturas multiagentes em contextos reais de serviço, especialmente em um domínio no qual a comparação entre estratégias de coordenação ainda aparece de forma limitada. No plano aplicado, os resultados poderão oferecer subsídios para o desenvolvimento de soluções mais eficientes no setor farmacêutico, sem substituir a tomada de decisão profissional (STANFORD HAI, 2025; MCKINSEY &amp; COMPANY, 2024a; PGEU, 2025; FIP, 2025).</w:t>
@@ -2844,6 +2765,7 @@
       <w:r>
         <w:rPr>
           <w:rFonts w:ascii="Arial" w:hAnsi="Arial" w:eastAsia="Arial" w:cs="Arial"/>
+          <w:color w:val="000000"/>
           <w:sz w:val="24"/>
         </w:rPr>
         <w:t>Quanto à metodologia, está sendo realizada uma pesquisa bibliográfica e experimental. O levantamento teórico abrange inteligência artificial, sistemas multiagentes, arquiteturas de coordenação, workflows de agentes e aplicações de IA no contexto farmacêutico. Em seguida, foi modelada e implementada uma arquitetura experimental composta por ponto de entrada das solicitações, agentes especializados, ferramentas, integração com serviços externos e possibilidade de supervisão humana. Os experimentos comparativos ainda serão conduzidos após o congelamento do protocolo, utilizando métricas de eficiência, coordenação, qualidade e necessidade de intervenção humana.</w:t>
@@ -2854,6 +2776,7 @@
       <w:r>
         <w:rPr>
           <w:rFonts w:ascii="Arial" w:hAnsi="Arial" w:eastAsia="Arial" w:cs="Arial"/>
+          <w:color w:val="000000"/>
           <w:sz w:val="24"/>
         </w:rPr>
         <w:t>Por fim, esta monografia organiza-se de modo a apresentar, de forma progressiva, os fundamentos, o desenvolvimento e a avaliação da proposta. Após esta introdução, o capítulo seguinte apresenta o referencial teórico sobre inteligência artificial, sistemas multiagentes, arquiteturas de coordenação e atendimento automatizado. Na sequência, são descritos a metodologia adotada, a modelagem da arquitetura e o protótipo experimental. Os capítulos de resultados, discussão e considerações finais permanecem reservados até a obtenção e validação das evidências experimentais.</w:t>
@@ -2873,6 +2796,7 @@
           <w:rFonts w:ascii="Arial" w:hAnsi="Arial" w:eastAsia="Arial" w:cs="Arial"/>
           <w:b/>
           <w:caps/>
+          <w:color w:val="000000"/>
           <w:sz w:val="28"/>
         </w:rPr>
         <w:t>FUNDAMENTAÇÃO TEÓRICA</w:t>
@@ -2893,6 +2817,7 @@
           <w:rFonts w:ascii="Arial" w:hAnsi="Arial" w:eastAsia="Arial" w:cs="Arial"/>
           <w:b/>
           <w:caps/>
+          <w:color w:val="000000"/>
           <w:sz w:val="24"/>
         </w:rPr>
         <w:t>INTELIGÊNCIA ARTIFICIAL NO ATENDIMENTO</w:t>
@@ -2913,6 +2838,7 @@
           <w:rFonts w:ascii="Arial" w:hAnsi="Arial" w:eastAsia="Arial" w:cs="Arial"/>
           <w:b w:val="0"/>
           <w:caps/>
+          <w:color w:val="000000"/>
           <w:sz w:val="24"/>
         </w:rPr>
         <w:t>CONCEITOS DE INTELIGÊNCIA ARTIFICIAL</w:t>
@@ -2924,6 +2850,7 @@
       <w:r>
         <w:rPr>
           <w:rFonts w:ascii="Arial" w:hAnsi="Arial" w:eastAsia="Arial" w:cs="Arial"/>
+          <w:color w:val="000000"/>
           <w:sz w:val="24"/>
         </w:rPr>
         <w:t>A inteligência artificial compreende métodos computacionais capazes de executar tarefas que exigem percepção, inferência, aprendizagem, planejamento ou produção de linguagem. No escopo deste trabalho, o interesse não está em reproduzir toda a amplitude do campo, mas em compreender sistemas que recebem uma solicitação em linguagem natural, selecionam ações, consultam fontes externas e produzem uma resposta. Essa delimitação diferencia o protótipo de um chatbot baseado apenas em respostas pré-programadas: o comportamento depende do contexto, das ferramentas disponíveis e da estratégia de coordenação definida para os agentes.</w:t>
@@ -2943,6 +2870,7 @@
           <w:rFonts w:ascii="Arial" w:hAnsi="Arial" w:eastAsia="Arial" w:cs="Arial"/>
           <w:b w:val="0"/>
           <w:caps/>
+          <w:color w:val="000000"/>
           <w:sz w:val="24"/>
         </w:rPr>
         <w:t>IA APLICADA AO ATENDIMENTO AO CLIENTE</w:t>
@@ -2954,6 +2882,7 @@
       <w:r>
         <w:rPr>
           <w:rFonts w:ascii="Arial" w:hAnsi="Arial" w:eastAsia="Arial" w:cs="Arial"/>
+          <w:color w:val="000000"/>
           <w:sz w:val="24"/>
         </w:rPr>
         <w:t>Em operações de atendimento, a IA pode apoiar classificação de intenção, recuperação de informações, encaminhamento de demandas, composição de respostas e identificação de casos que exigem intervenção humana. A utilidade prática, entretanto, não deve ser avaliada somente pela fluência do texto. Um sistema de atendimento também precisa responder dentro de limites de tempo, acionar a ferramenta correta, preservar o contexto da conversa e encaminhar situações sensíveis. Por isso, o presente trabalho combina medidas de eficiência operacional com critérios de qualidade e segurança.</w:t>
@@ -2973,6 +2902,7 @@
           <w:rFonts w:ascii="Arial" w:hAnsi="Arial" w:eastAsia="Arial" w:cs="Arial"/>
           <w:b w:val="0"/>
           <w:caps/>
+          <w:color w:val="000000"/>
           <w:sz w:val="24"/>
         </w:rPr>
         <w:t>USO DE IA EM SAÚDE E FARMÁCIAS</w:t>
@@ -2984,6 +2914,7 @@
       <w:r>
         <w:rPr>
           <w:rFonts w:ascii="Arial" w:hAnsi="Arial" w:eastAsia="Arial" w:cs="Arial"/>
+          <w:color w:val="000000"/>
           <w:sz w:val="24"/>
         </w:rPr>
         <w:t>O uso de IA em saúde exige cautela adicional porque uma resposta inadequada pode afetar decisões individuais. O protótipo desenvolvido não realiza diagnóstico nem prescrição e não deve fornecer dosagens específicas. Seu domínio é o atendimento operacional de farmácia, incluindo perguntas frequentes, consulta de disponibilidade de produtos, processamento inicial de anexos e direcionamento para revisão profissional quando necessário. Essa fronteira funcional é coerente com a ampliação do papel das farmácias comunitárias, que passaram a oferecer serviços para além da dispensação de medicamentos, mantendo o farmacêutico como profissional responsável por orientações clínicas e uso seguro de medicamentos (WHO EUROPE, 2024).</w:t>
@@ -3003,6 +2934,7 @@
           <w:rFonts w:ascii="Arial" w:hAnsi="Arial" w:eastAsia="Arial" w:cs="Arial"/>
           <w:b/>
           <w:caps/>
+          <w:color w:val="000000"/>
           <w:sz w:val="24"/>
         </w:rPr>
         <w:t>LARGE LANGUAGE MODELS E AGENTES INTELIGENTES</w:t>
@@ -3023,6 +2955,7 @@
           <w:rFonts w:ascii="Arial" w:hAnsi="Arial" w:eastAsia="Arial" w:cs="Arial"/>
           <w:b w:val="0"/>
           <w:caps/>
+          <w:color w:val="000000"/>
           <w:sz w:val="24"/>
         </w:rPr>
         <w:t>CONCEITO DE LLM</w:t>
@@ -3034,6 +2967,7 @@
       <w:r>
         <w:rPr>
           <w:rFonts w:ascii="Arial" w:hAnsi="Arial" w:eastAsia="Arial" w:cs="Arial"/>
+          <w:color w:val="000000"/>
           <w:sz w:val="24"/>
         </w:rPr>
         <w:t>Large Language Models (LLMs) são modelos treinados em grandes coleções de texto para estimar e gerar sequências linguísticas. Quando empregados isoladamente, podem interpretar instruções e produzir respostas, mas não garantem, por si só, acesso a dados atualizados, execução de ações ou observância de regras de negócio. Essas capacidades adicionais dependem da arquitetura que envolve o modelo.</w:t>
@@ -3053,6 +2987,7 @@
           <w:rFonts w:ascii="Arial" w:hAnsi="Arial" w:eastAsia="Arial" w:cs="Arial"/>
           <w:b w:val="0"/>
           <w:caps/>
+          <w:color w:val="000000"/>
           <w:sz w:val="24"/>
         </w:rPr>
         <w:t>USO DE LLM EM AGENTES</w:t>
@@ -3064,6 +2999,7 @@
       <w:r>
         <w:rPr>
           <w:rFonts w:ascii="Arial" w:hAnsi="Arial" w:eastAsia="Arial" w:cs="Arial"/>
+          <w:color w:val="000000"/>
           <w:sz w:val="24"/>
         </w:rPr>
         <w:t xml:space="preserve">Um agente baseado em LLM associa o modelo a um objetivo, um conjunto de instruções, estado de execução e mecanismos de ação. O agente pode selecionar ferramentas, interpretar seus retornos e decidir como prosseguir. Li </w:t>
@@ -3073,6 +3009,7 @@
           <w:rFonts w:ascii="Arial" w:hAnsi="Arial" w:eastAsia="Arial" w:cs="Arial"/>
           <w:i w:val="1"/>
           <w:iCs w:val="1"/>
+          <w:color w:val="000000"/>
           <w:sz w:val="24"/>
         </w:rPr>
         <w:t>et al.</w:t>
@@ -3080,6 +3017,7 @@
       <w:r>
         <w:rPr>
           <w:rFonts w:ascii="Arial" w:hAnsi="Arial" w:eastAsia="Arial" w:cs="Arial"/>
+          <w:color w:val="000000"/>
           <w:sz w:val="24"/>
         </w:rPr>
         <w:t xml:space="preserve"> (2024) organizam sistemas desse tipo em componentes como perfil, percepção, ação individual, interação e evolução. Essa visão é útil para separar a capacidade linguística do modelo das responsabilidades arquiteturais necessárias para operar um sistema completo.</w:t>
@@ -3099,6 +3037,7 @@
           <w:rFonts w:ascii="Arial" w:hAnsi="Arial" w:eastAsia="Arial" w:cs="Arial"/>
           <w:b w:val="0"/>
           <w:caps/>
+          <w:color w:val="000000"/>
           <w:sz w:val="24"/>
         </w:rPr>
         <w:t>FERRAMENTAS E INTEGRAÇÃO</w:t>
@@ -3110,6 +3049,7 @@
       <w:r>
         <w:rPr>
           <w:rFonts w:ascii="Arial" w:hAnsi="Arial" w:eastAsia="Arial" w:cs="Arial"/>
+          <w:color w:val="000000"/>
           <w:sz w:val="24"/>
         </w:rPr>
         <w:t>Ferramentas conectam o agente a funções determinísticas ou serviços externos. No MAB, elas representam operações como consulta de perguntas frequentes, busca de estoque e análise inicial de anexos. A ferramenta devolve evidência estruturada; o agente decide quando acioná-la e como incorporar seu retorno. Essa separação melhora a observabilidade, pois chamadas, erros, tempo de execução e transições entre agentes podem ser registrados independentemente do texto final.</w:t>
@@ -3129,6 +3069,7 @@
           <w:rFonts w:ascii="Arial" w:hAnsi="Arial" w:eastAsia="Arial" w:cs="Arial"/>
           <w:b/>
           <w:caps/>
+          <w:color w:val="000000"/>
           <w:sz w:val="24"/>
         </w:rPr>
         <w:t>SISTEMAS MULTIAGENTES</w:t>
@@ -3149,6 +3090,7 @@
           <w:rFonts w:ascii="Arial" w:hAnsi="Arial" w:eastAsia="Arial" w:cs="Arial"/>
           <w:b w:val="0"/>
           <w:caps/>
+          <w:color w:val="000000"/>
           <w:sz w:val="24"/>
         </w:rPr>
         <w:t>DEFINIÇÃO E CARACTERÍSTICAS</w:t>
@@ -3160,6 +3102,7 @@
       <w:r>
         <w:rPr>
           <w:rFonts w:ascii="Arial" w:hAnsi="Arial" w:eastAsia="Arial" w:cs="Arial"/>
+          <w:color w:val="000000"/>
           <w:sz w:val="24"/>
         </w:rPr>
         <w:t>Um sistema multiagente é composto por múltiplas unidades capazes de perceber informações, tomar decisões e atuar de maneira coordenada. Em sistemas baseados em LLMs, os agentes podem ser diferenciados por instruções, funções e ferramentas. A especialização permite decompor uma solicitação em responsabilidades menores, mas introduz custos de comunicação, sincronização e controle. Assim, adicionar agentes não implica automaticamente melhorar o desempenho.</w:t>
@@ -3179,6 +3122,7 @@
           <w:rFonts w:ascii="Arial" w:hAnsi="Arial" w:eastAsia="Arial" w:cs="Arial"/>
           <w:b w:val="0"/>
           <w:caps/>
+          <w:color w:val="000000"/>
           <w:sz w:val="24"/>
         </w:rPr>
         <w:t>ARQUITETURA DE SISTEMAS MULTIAGENTES</w:t>
@@ -3190,6 +3134,7 @@
       <w:r>
         <w:rPr>
           <w:rFonts w:ascii="Arial" w:hAnsi="Arial" w:eastAsia="Arial" w:cs="Arial"/>
+          <w:color w:val="000000"/>
           <w:sz w:val="24"/>
         </w:rPr>
         <w:t xml:space="preserve">A arquitetura define quais agentes existem, quem inicia a execução, como o estado é compartilhado e quem produz a resposta final. Revisões recentes destacam que sistemas multiagentes podem variar quanto à autonomia, topologia de comunicação, distribuição das decisões e mecanismos de supervisão (LI </w:t>
@@ -3199,6 +3144,7 @@
           <w:rFonts w:ascii="Arial" w:hAnsi="Arial" w:eastAsia="Arial" w:cs="Arial"/>
           <w:i w:val="1"/>
           <w:iCs w:val="1"/>
+          <w:color w:val="000000"/>
           <w:sz w:val="24"/>
         </w:rPr>
         <w:t>et al.</w:t>
@@ -3206,6 +3152,7 @@
       <w:r>
         <w:rPr>
           <w:rFonts w:ascii="Arial" w:hAnsi="Arial" w:eastAsia="Arial" w:cs="Arial"/>
+          <w:color w:val="000000"/>
           <w:sz w:val="24"/>
         </w:rPr>
         <w:t xml:space="preserve">, 2024; PICCIALLI </w:t>
@@ -3215,6 +3162,7 @@
           <w:rFonts w:ascii="Arial" w:hAnsi="Arial" w:eastAsia="Arial" w:cs="Arial"/>
           <w:i w:val="1"/>
           <w:iCs w:val="1"/>
+          <w:color w:val="000000"/>
           <w:sz w:val="24"/>
         </w:rPr>
         <w:t>et al.</w:t>
@@ -3222,6 +3170,7 @@
       <w:r>
         <w:rPr>
           <w:rFonts w:ascii="Arial" w:hAnsi="Arial" w:eastAsia="Arial" w:cs="Arial"/>
+          <w:color w:val="000000"/>
           <w:sz w:val="24"/>
         </w:rPr>
         <w:t>, 2025). Essas escolhas influenciam rastreabilidade, robustez e custo computacional, além de determinar quais eventos podem ser observados durante um atendimento.</w:t>
@@ -3241,6 +3190,7 @@
           <w:rFonts w:ascii="Arial" w:hAnsi="Arial" w:eastAsia="Arial" w:cs="Arial"/>
           <w:b w:val="0"/>
           <w:caps/>
+          <w:color w:val="000000"/>
           <w:sz w:val="24"/>
         </w:rPr>
         <w:t>COMUNICAÇÃO E COORDENAÇÃO ENTRE AGENTES</w:t>
@@ -3252,6 +3202,7 @@
       <w:r>
         <w:rPr>
           <w:rFonts w:ascii="Arial" w:hAnsi="Arial" w:eastAsia="Arial" w:cs="Arial"/>
+          <w:color w:val="000000"/>
           <w:sz w:val="24"/>
         </w:rPr>
         <w:t xml:space="preserve">A comunicação pode ocorrer por mensagens diretas, estado compartilhado, handoffs ou por um controlador que intermedeia as decisões. Ela é necessária para distribuir subtarefas, mas também pode propagar erros ou ampliar divergências. Hammond </w:t>
@@ -3261,6 +3212,7 @@
           <w:rFonts w:ascii="Arial" w:hAnsi="Arial" w:eastAsia="Arial" w:cs="Arial"/>
           <w:i w:val="1"/>
           <w:iCs w:val="1"/>
+          <w:color w:val="000000"/>
           <w:sz w:val="24"/>
         </w:rPr>
         <w:t>et al.</w:t>
@@ -3268,6 +3220,7 @@
       <w:r>
         <w:rPr>
           <w:rFonts w:ascii="Arial" w:hAnsi="Arial" w:eastAsia="Arial" w:cs="Arial"/>
+          <w:color w:val="000000"/>
           <w:sz w:val="24"/>
         </w:rPr>
         <w:t xml:space="preserve"> (2025) organizam riscos multiagentes em categorias que incluem descoordenação, conflito e cooperação indesejada. Embora o MAB opere com agentes que compartilham um objetivo, o risco de descoordenação permanece relevante quando uma rota incorreta, uma evidência insuficiente ou uma transferência excessiva altera o atendimento.</w:t>
@@ -3287,6 +3240,7 @@
           <w:rFonts w:ascii="Arial" w:hAnsi="Arial" w:eastAsia="Arial" w:cs="Arial"/>
           <w:b/>
           <w:caps/>
+          <w:color w:val="000000"/>
           <w:sz w:val="24"/>
         </w:rPr>
         <w:t>ARQUITETURAS DE COORDENAÇÃO</w:t>
@@ -3307,6 +3261,7 @@
           <w:rFonts w:ascii="Arial" w:hAnsi="Arial" w:eastAsia="Arial" w:cs="Arial"/>
           <w:b w:val="0"/>
           <w:caps/>
+          <w:color w:val="000000"/>
           <w:sz w:val="24"/>
         </w:rPr>
         <w:t>ORQUESTRAÇÃO CENTRALIZADA</w:t>
@@ -3318,6 +3273,7 @@
       <w:r>
         <w:rPr>
           <w:rFonts w:ascii="Arial" w:hAnsi="Arial" w:eastAsia="Arial" w:cs="Arial"/>
+          <w:color w:val="000000"/>
           <w:sz w:val="24"/>
         </w:rPr>
         <w:t>Na orquestração centralizada, um supervisor concentra as decisões de classificação, seleção de ferramentas ou agentes e composição da resposta. A principal vantagem é a existência de um ponto claro de controle, que simplifica a aplicação de políticas e a reconstrução do fluxo. Como contrapartida, o supervisor pode se tornar gargalo e ponto único de falha. No MAB, a arquitetura centralizada utiliza um agente supervisor que escolhe entre ferramentas de FAQ, estoque e anexos e produz a resposta final.</w:t>
@@ -3337,6 +3293,7 @@
           <w:rFonts w:ascii="Arial" w:hAnsi="Arial" w:eastAsia="Arial" w:cs="Arial"/>
           <w:b w:val="0"/>
           <w:caps/>
+          <w:color w:val="000000"/>
           <w:sz w:val="24"/>
         </w:rPr>
         <w:t>WORKFLOW ESTRUTURADO</w:t>
@@ -3348,6 +3305,7 @@
       <w:r>
         <w:rPr>
           <w:rFonts w:ascii="Arial" w:hAnsi="Arial" w:eastAsia="Arial" w:cs="Arial"/>
+          <w:color w:val="000000"/>
           <w:sz w:val="24"/>
         </w:rPr>
         <w:t xml:space="preserve">O workflow organiza a execução em etapas previamente definidas. No protótipo, o fluxo inclui classificação, coleta de evidência, análise multimodal quando aplicável, revisão e síntese. Cada etapa possui responsabilidade explícita e ordem estável. A previsibilidade facilita testes e auditoria, mas reduz a flexibilidade para alterar o caminho durante a execução. A revisão de Yu </w:t>
@@ -3357,6 +3315,7 @@
           <w:rFonts w:ascii="Arial" w:hAnsi="Arial" w:eastAsia="Arial" w:cs="Arial"/>
           <w:i w:val="1"/>
           <w:iCs w:val="1"/>
+          <w:color w:val="000000"/>
           <w:sz w:val="24"/>
         </w:rPr>
         <w:t>et al.</w:t>
@@ -3364,6 +3323,7 @@
       <w:r>
         <w:rPr>
           <w:rFonts w:ascii="Arial" w:hAnsi="Arial" w:eastAsia="Arial" w:cs="Arial"/>
+          <w:color w:val="000000"/>
           <w:sz w:val="24"/>
         </w:rPr>
         <w:t xml:space="preserve"> (2025) mostra que workflows de agentes combinam planejamento, execução e controle em estruturas que variam de sequências fixas a fluxos adaptativos.</w:t>
@@ -3383,6 +3343,7 @@
           <w:rFonts w:ascii="Arial" w:hAnsi="Arial" w:eastAsia="Arial" w:cs="Arial"/>
           <w:b w:val="0"/>
           <w:caps/>
+          <w:color w:val="000000"/>
           <w:sz w:val="24"/>
         </w:rPr>
         <w:t>SISTEMAS DESCENTRALIZADOS (SWARM)</w:t>
@@ -3394,6 +3355,7 @@
       <w:r>
         <w:rPr>
           <w:rFonts w:ascii="Arial" w:hAnsi="Arial" w:eastAsia="Arial" w:cs="Arial"/>
+          <w:color w:val="000000"/>
           <w:sz w:val="24"/>
         </w:rPr>
         <w:t>Em uma organização descentralizada, os agentes podem transferir a tarefa diretamente entre pares. O MAB implementa essa estratégia por meio de handoffs: um coordenador inicia a cadeia, especialistas podem delegar a outros especialistas e um sintetizador produz a resposta final. O mecanismo aumenta a autonomia local, porém exige limites de handoff e telemetria para evitar ciclos, custo excessivo ou perda de contexto.</w:t>
@@ -3413,6 +3375,7 @@
           <w:rFonts w:ascii="Arial" w:hAnsi="Arial" w:eastAsia="Arial" w:cs="Arial"/>
           <w:b w:val="0"/>
           <w:caps/>
+          <w:color w:val="000000"/>
           <w:sz w:val="24"/>
         </w:rPr>
         <w:t>COMPARAÇÃO ENTRE ARQUITETURAS</w:t>
@@ -3424,6 +3387,7 @@
       <w:r>
         <w:rPr>
           <w:rFonts w:ascii="Arial" w:hAnsi="Arial" w:eastAsia="Arial" w:cs="Arial"/>
+          <w:color w:val="000000"/>
           <w:sz w:val="24"/>
         </w:rPr>
         <w:t xml:space="preserve">A comparação entre arquiteturas de coordenação não pode ser reduzida à quantidade de agentes empregados. Duas soluções com o mesmo número de agentes podem distribuir autoridade, estado e comunicação de maneiras distintas. Para analisá-las, é necessário observar pelo menos quatro dimensões: onde as decisões são concentradas; como o caminho de execução é definido; de que forma o contexto circula entre os agentes; e quais mecanismos permitem reconstruir ou interromper o fluxo. As taxonomias de Li </w:t>
@@ -3433,6 +3397,7 @@
           <w:rFonts w:ascii="Arial" w:hAnsi="Arial" w:eastAsia="Arial" w:cs="Arial"/>
           <w:i w:val="1"/>
           <w:iCs w:val="1"/>
+          <w:color w:val="000000"/>
           <w:sz w:val="24"/>
         </w:rPr>
         <w:t>et al.</w:t>
@@ -3440,6 +3405,7 @@
       <w:r>
         <w:rPr>
           <w:rFonts w:ascii="Arial" w:hAnsi="Arial" w:eastAsia="Arial" w:cs="Arial"/>
+          <w:color w:val="000000"/>
           <w:sz w:val="24"/>
         </w:rPr>
         <w:t xml:space="preserve"> (2024) e Piccialli </w:t>
@@ -3449,6 +3415,7 @@
           <w:rFonts w:ascii="Arial" w:hAnsi="Arial" w:eastAsia="Arial" w:cs="Arial"/>
           <w:i w:val="1"/>
           <w:iCs w:val="1"/>
+          <w:color w:val="000000"/>
           <w:sz w:val="24"/>
         </w:rPr>
         <w:t>et al.</w:t>
@@ -3456,6 +3423,7 @@
       <w:r>
         <w:rPr>
           <w:rFonts w:ascii="Arial" w:hAnsi="Arial" w:eastAsia="Arial" w:cs="Arial"/>
+          <w:color w:val="000000"/>
           <w:sz w:val="24"/>
         </w:rPr>
         <w:t xml:space="preserve"> (2025) mostram que interação, autonomia e organização são componentes próprios da arquitetura, e não apenas características do modelo de linguagem utilizado.</w:t>
@@ -3466,6 +3434,7 @@
       <w:r>
         <w:rPr>
           <w:rFonts w:ascii="Arial" w:hAnsi="Arial" w:eastAsia="Arial" w:cs="Arial"/>
+          <w:color w:val="000000"/>
           <w:sz w:val="24"/>
         </w:rPr>
         <w:t>Na orquestração centralizada, a autoridade de roteamento permanece em um supervisor. Esse componente recebe a solicitação, seleciona especialistas ou ferramentas e pode consolidar a resposta. A concentração favorece a aplicação uniforme de políticas e oferece um ponto explícito para registrar decisões. Em contrapartida, a execução fica condicionada à capacidade do supervisor de interpretar corretamente cada etapa. Um erro de classificação pode direcionar todo o fluxo para uma rota inadequada, enquanto o acúmulo de decisões em um único componente pode ampliar latência e dependência operacional. Assim, centralização significa maior controle global, mas também maior concentração de responsabilidade.</w:t>
@@ -3476,6 +3445,7 @@
       <w:r>
         <w:rPr>
           <w:rFonts w:ascii="Arial" w:hAnsi="Arial" w:eastAsia="Arial" w:cs="Arial"/>
+          <w:color w:val="000000"/>
           <w:sz w:val="24"/>
         </w:rPr>
         <w:t xml:space="preserve">No workflow estruturado, parte do controle deixa de estar exclusivamente em um agente e passa a ser representada pela própria sequência de etapas. O fluxo pode definir antecipadamente operações de classificação, obtenção de evidências, revisão e síntese, incluindo condições para desvio ou encerramento. Yu </w:t>
@@ -3485,6 +3455,7 @@
           <w:rFonts w:ascii="Arial" w:hAnsi="Arial" w:eastAsia="Arial" w:cs="Arial"/>
           <w:i w:val="1"/>
           <w:iCs w:val="1"/>
+          <w:color w:val="000000"/>
           <w:sz w:val="24"/>
         </w:rPr>
         <w:t>et al.</w:t>
@@ -3492,6 +3463,7 @@
       <w:r>
         <w:rPr>
           <w:rFonts w:ascii="Arial" w:hAnsi="Arial" w:eastAsia="Arial" w:cs="Arial"/>
+          <w:color w:val="000000"/>
           <w:sz w:val="24"/>
         </w:rPr>
         <w:t xml:space="preserve"> (2025) descrevem workflows de agentes como combinações de planejamento, execução e controle que podem variar entre sequências fixas e estruturas adaptativas. A explicitação das transições favorece repetibilidade e auditoria, pois torna possível identificar em qual etapa ocorreu uma falha. Entretanto, um caminho rígido pode executar operações desnecessárias ou responder de forma limitada a solicitações que não se ajustem às rotas previstas.</w:t>
@@ -3502,6 +3474,7 @@
       <w:r>
         <w:rPr>
           <w:rFonts w:ascii="Arial" w:hAnsi="Arial" w:eastAsia="Arial" w:cs="Arial"/>
+          <w:color w:val="000000"/>
           <w:sz w:val="24"/>
         </w:rPr>
         <w:t xml:space="preserve">Em sistemas descentralizados, a decisão de continuidade pode ser transferida entre os próprios agentes. Em vez de consultar um supervisor a cada passo, um especialista avalia o contexto recebido e realiza um handoff quando identifica outra competência necessária. Balaprakash </w:t>
@@ -3511,6 +3484,7 @@
           <w:rFonts w:ascii="Arial" w:hAnsi="Arial" w:eastAsia="Arial" w:cs="Arial"/>
           <w:i w:val="1"/>
           <w:iCs w:val="1"/>
+          <w:color w:val="000000"/>
           <w:sz w:val="24"/>
         </w:rPr>
         <w:t>et al.</w:t>
@@ -3518,6 +3492,7 @@
       <w:r>
         <w:rPr>
           <w:rFonts w:ascii="Arial" w:hAnsi="Arial" w:eastAsia="Arial" w:cs="Arial"/>
+          <w:color w:val="000000"/>
           <w:sz w:val="24"/>
         </w:rPr>
         <w:t xml:space="preserve"> (2025) apresentam o SWARM como uma proposta de distribuição das funções tradicionalmente centralizadas de gestão de workflows, motivada por problemas de resiliência e escalabilidade. Essa autonomia local pode reduzir a dependência de um único controlador, mas exige regras para preservar contexto, limitar transferências e impedir ciclos. Também pode aumentar a comunicação e a repetição de trabalho quando mais de um agente interpreta a mesma solicitação.</w:t>
@@ -3528,6 +3503,7 @@
       <w:r>
         <w:rPr>
           <w:rFonts w:ascii="Arial" w:hAnsi="Arial" w:eastAsia="Arial" w:cs="Arial"/>
+          <w:color w:val="000000"/>
           <w:sz w:val="24"/>
         </w:rPr>
         <w:t xml:space="preserve">Esses benefícios e custos dependem do tipo de tarefa e da capacidade dos modelos envolvidos. Kim </w:t>
@@ -3537,6 +3513,7 @@
           <w:rFonts w:ascii="Arial" w:hAnsi="Arial" w:eastAsia="Arial" w:cs="Arial"/>
           <w:i w:val="1"/>
           <w:iCs w:val="1"/>
+          <w:color w:val="000000"/>
           <w:sz w:val="24"/>
         </w:rPr>
         <w:t>et al.</w:t>
@@ -3544,6 +3521,7 @@
       <w:r>
         <w:rPr>
           <w:rFonts w:ascii="Arial" w:hAnsi="Arial" w:eastAsia="Arial" w:cs="Arial"/>
+          <w:color w:val="000000"/>
           <w:sz w:val="24"/>
         </w:rPr>
         <w:t xml:space="preserve"> (2026) compararam configurações de agente único, independentes, centralizadas, descentralizadas e híbridas em diferentes benchmarks. Os autores observaram que os ganhos da colaboração não são uniformes: tarefas decomponíveis podem se beneficiar da divisão de trabalho, enquanto tarefas que dependem de uma sequência rígida ou de coordenação intensa podem sofrer com o custo adicional de comunicação. O estudo também indica que modelos mais capazes podem reduzir a vantagem relativa da colaboração, pois parte do trabalho distribuído pode ser resolvida por um único agente sem os mesmos custos de coordenação.</w:t>
@@ -3554,6 +3532,7 @@
       <w:r>
         <w:rPr>
           <w:rFonts w:ascii="Arial" w:hAnsi="Arial" w:eastAsia="Arial" w:cs="Arial"/>
+          <w:color w:val="000000"/>
           <w:sz w:val="24"/>
         </w:rPr>
         <w:t>Portanto, não existe fundamento para declarar previamente uma arquitetura como superior em qualquer contexto. Uma comparação controlada precisa manter constantes os elementos que não constituem o objeto do estudo, como cenários, ferramentas disponíveis, modelo de linguagem e critérios de avaliação. Em seguida, deve observar consequências mensuráveis da coordenação, como rota percorrida, quantidade de handoffs, chamadas de ferramentas, consumo de tokens, latência, ocorrência de erros e qualidade da resposta. Essa relação entre desenho arquitetural e eventos observáveis sustenta a comparação proposta pelo MAB, sem antecipar resultados: orquestração, workflow e swarm representam formas distintas de distribuir controle, e sua adequação ao atendimento farmacêutico deve ser determinada pelas evidências do experimento.</w:t>
@@ -3573,6 +3552,7 @@
           <w:rFonts w:ascii="Arial" w:hAnsi="Arial" w:eastAsia="Arial" w:cs="Arial"/>
           <w:b/>
           <w:caps/>
+          <w:color w:val="000000"/>
           <w:sz w:val="24"/>
         </w:rPr>
         <w:t>ATENDIMENTO EM FARMÁCIAS</w:t>
@@ -3593,6 +3573,7 @@
           <w:rFonts w:ascii="Arial" w:hAnsi="Arial" w:eastAsia="Arial" w:cs="Arial"/>
           <w:b w:val="0"/>
           <w:caps/>
+          <w:color w:val="000000"/>
           <w:sz w:val="24"/>
         </w:rPr>
         <w:t>ESTRUTURA DO ATENDIMENTO FARMACÊUTICO</w:t>
@@ -3604,6 +3585,7 @@
       <w:r>
         <w:rPr>
           <w:rFonts w:ascii="Arial" w:hAnsi="Arial" w:eastAsia="Arial" w:cs="Arial"/>
+          <w:color w:val="000000"/>
           <w:sz w:val="24"/>
         </w:rPr>
         <w:t>O atendimento em farmácias reúne demandas administrativas, comerciais e de orientação em saúde. Perguntas sobre horário, entrega e disponibilidade podem ser tratadas por rotinas operacionais; solicitações clínicas ou ambíguas devem ser encaminhadas ao farmacêutico. Essa diversidade permite testar roteamento, uso de ferramentas, manutenção de contexto e revisão humana sem atribuir ao sistema uma autonomia clínica que ele não possui.</w:t>
@@ -3623,6 +3605,7 @@
           <w:rFonts w:ascii="Arial" w:hAnsi="Arial" w:eastAsia="Arial" w:cs="Arial"/>
           <w:b w:val="0"/>
           <w:caps/>
+          <w:color w:val="000000"/>
           <w:sz w:val="24"/>
         </w:rPr>
         <w:t>DESAFIOS OPERACIONAIS</w:t>
@@ -3634,6 +3617,7 @@
       <w:r>
         <w:rPr>
           <w:rFonts w:ascii="Arial" w:hAnsi="Arial" w:eastAsia="Arial" w:cs="Arial"/>
+          <w:color w:val="000000"/>
           <w:sz w:val="24"/>
         </w:rPr>
         <w:t>Entre os desafios do domínio estão volume variável de solicitações, linguagem informal, anexos, continuidade entre mensagens e necessidade de distinguir dúvidas operacionais de situações sensíveis. A qualidade do sistema depende tanto da resposta final quanto da capacidade de reconhecer quando não deve responder autonomamente.</w:t>
@@ -3653,6 +3637,7 @@
           <w:rFonts w:ascii="Arial" w:hAnsi="Arial" w:eastAsia="Arial" w:cs="Arial"/>
           <w:b w:val="0"/>
           <w:caps/>
+          <w:color w:val="000000"/>
           <w:sz w:val="24"/>
         </w:rPr>
         <w:t>OPORTUNIDADES DE AUTOMAÇÃO</w:t>
@@ -3664,6 +3649,7 @@
       <w:r>
         <w:rPr>
           <w:rFonts w:ascii="Arial" w:hAnsi="Arial" w:eastAsia="Arial" w:cs="Arial"/>
+          <w:color w:val="000000"/>
           <w:sz w:val="24"/>
         </w:rPr>
         <w:t>A automação é mais apropriada em tarefas repetitivas, verificáveis e de baixo risco, como localização de informação institucional ou consulta a dados estruturados. O valor do sistema multiagente está em organizar essas funções e preservar uma rota de supervisão. O objetivo experimental, portanto, é medir como a estratégia de coordenação altera eficiência, observabilidade e qualidade operacional, sem avaliar aconselhamento clínico ou substituir profissionais.</w:t>
@@ -3683,6 +3669,7 @@
           <w:rFonts w:ascii="Arial" w:hAnsi="Arial" w:eastAsia="Arial" w:cs="Arial"/>
           <w:b/>
           <w:caps/>
+          <w:color w:val="000000"/>
           <w:sz w:val="28"/>
         </w:rPr>
         <w:t>TRABALHOS CORRELATOS</w:t>
@@ -3694,6 +3681,7 @@
       <w:r>
         <w:rPr>
           <w:rFonts w:ascii="Arial" w:hAnsi="Arial" w:eastAsia="Arial" w:cs="Arial"/>
+          <w:color w:val="000000"/>
           <w:sz w:val="24"/>
         </w:rPr>
         <w:t>Este capítulo apresenta os trabalhos mais relevantes para a fundamentação desta pesquisa, com foco em sistemas multiagentes e arquiteturas de coordenação aplicadas a tarefas complexas de atendimento inteligente. Como o objetivo central do trabalho é comparar diferentes formas de coordenação entre agentes, foram priorizados estudos que discutem organização do fluxo, distribuição de tarefas, centralização ou descentralização da decisão e efeitos dessas escolhas sobre desempenho, escalabilidade e controle.</w:t>
@@ -3704,6 +3692,7 @@
       <w:r>
         <w:rPr>
           <w:rFonts w:ascii="Arial" w:hAnsi="Arial" w:eastAsia="Arial" w:cs="Arial"/>
+          <w:color w:val="000000"/>
           <w:sz w:val="24"/>
         </w:rPr>
         <w:t>Os trabalhos analisados neste capítulo tratam de temas complementares ao desenvolvimento desta pesquisa. De um lado, foram considerados estudos sobre sistemas multiagentes, arquiteturas de coordenação, workflows e abordagens descentralizadas, pois esses temas ajudam a compreender como diferentes agentes podem ser organizados para executar tarefas de forma cooperativa. De outro lado, foram considerados trabalhos relacionados ao uso de inteligência artificial em farmácias e serviços farmacêuticos, pois eles aproximam a discussão teórica do contexto prático escolhido para este projeto.</w:t>
@@ -3714,6 +3703,7 @@
       <w:r>
         <w:rPr>
           <w:rFonts w:ascii="Arial" w:hAnsi="Arial" w:eastAsia="Arial" w:cs="Arial"/>
+          <w:color w:val="000000"/>
           <w:sz w:val="24"/>
         </w:rPr>
         <w:t>A relação entre esses dois grupos de trabalhos é importante porque o objetivo desta pesquisa não é apenas propor um sistema de atendimento automatizado, mas analisar como diferentes formas de coordenação entre agentes podem influenciar o comportamento do sistema. Assim, as referências sobre sistemas multiagentes contribuem para a fundamentação técnica da arquitetura, enquanto os trabalhos ligados ao contexto farmacêutico ajudam a justificar o domínio de aplicação e os tipos de problema que podem surgir em atendimentos reais.</w:t>
@@ -3724,6 +3714,7 @@
       <w:r>
         <w:rPr>
           <w:rFonts w:ascii="Arial" w:hAnsi="Arial" w:eastAsia="Arial" w:cs="Arial"/>
+          <w:color w:val="000000"/>
           <w:sz w:val="24"/>
         </w:rPr>
         <w:t>A literatura recente mostra que a discussão sobre sistemas multiagentes baseados em LLMs vem se consolidando em torno de três questões principais: como estruturar os agentes, como coordená-los e em quais tipos de tarefa cada arquitetura produz melhores resultados. Trabalhos mais amplos de revisão oferecem taxonomias e desafios gerais, enquanto estudos mais específicos tratam de workflow, swarm, descentralização e aplicações em domínios particulares, como serviços farmacêuticos.</w:t>
@@ -3743,6 +3734,7 @@
           <w:rFonts w:ascii="Arial" w:hAnsi="Arial" w:eastAsia="Arial" w:cs="Arial"/>
           <w:b/>
           <w:caps/>
+          <w:color w:val="000000"/>
           <w:sz w:val="24"/>
         </w:rPr>
         <w:t>SISTEMAS DE ATENDIMENTO AUTOMATIZADO</w:t>
@@ -3754,6 +3746,7 @@
       <w:r>
         <w:rPr>
           <w:rFonts w:ascii="Arial" w:hAnsi="Arial" w:eastAsia="Arial" w:cs="Arial"/>
+          <w:color w:val="000000"/>
           <w:sz w:val="24"/>
         </w:rPr>
         <w:t>Jagatap, Merugu e Comar (2025) investigam a automação do processamento de prescrições no contexto farmacêutico digital. A metodologia consiste em uma solução em etapas, ou pipeline, baseada em LLM, OCR, extração de medicamentos e correspondência com catálogo. Nesse caso, pipeline significa uma sequência organizada de etapas, em que a saída de uma etapa serve como entrada para a próxima.</w:t>
@@ -3764,6 +3757,7 @@
       <w:r>
         <w:rPr>
           <w:rFonts w:ascii="Arial" w:hAnsi="Arial" w:eastAsia="Arial" w:cs="Arial"/>
+          <w:color w:val="000000"/>
           <w:sz w:val="24"/>
         </w:rPr>
         <w:t>Como resultado, o sistema melhora o Recall@3 em relação a métodos anteriores. O termo recall é uma métrica usada para medir a capacidade de um sistema encontrar corretamente os itens relevantes. No caso do Recall@3, verifica-se se a resposta correta aparece entre as três primeiras sugestões retornadas pelo sistema. Essa métrica é relevante no contexto farmacêutico porque, ao buscar medicamentos ou informações em um catálogo, não basta o sistema responder rápido; ele precisa recuperar corretamente as opções mais adequadas. Portanto, a menção ao recall ajuda a mostrar que aplicações de IA em farmácias também precisam ser avaliadas por métricas objetivas de qualidade, e não apenas por funcionamento geral.</w:t>
@@ -3774,6 +3768,7 @@
       <w:r>
         <w:rPr>
           <w:rFonts w:ascii="Arial" w:hAnsi="Arial" w:eastAsia="Arial" w:cs="Arial"/>
+          <w:color w:val="000000"/>
           <w:sz w:val="24"/>
         </w:rPr>
         <w:t>Esse trabalho contribui para a presente pesquisa por demonstrar que o domínio farmacêutico possui tarefas que podem ser divididas em etapas e apoiadas por agentes ou componentes especializados. Entretanto, seu foco está na automação de uma tarefa específica, e não na comparação entre diferentes arquiteturas de coordenação. Essa diferença reforça a lacuna explorada pelo presente trabalho.</w:t>
@@ -3784,6 +3779,7 @@
       <w:r>
         <w:rPr>
           <w:rFonts w:ascii="Arial" w:hAnsi="Arial" w:eastAsia="Arial" w:cs="Arial"/>
+          <w:color w:val="000000"/>
           <w:sz w:val="24"/>
         </w:rPr>
         <w:t xml:space="preserve">Hatzimanolis </w:t>
@@ -3793,6 +3789,7 @@
           <w:rFonts w:ascii="Arial" w:hAnsi="Arial" w:eastAsia="Arial" w:cs="Arial"/>
           <w:i w:val="1"/>
           <w:iCs w:val="1"/>
+          <w:color w:val="000000"/>
           <w:sz w:val="24"/>
         </w:rPr>
         <w:t>et al.</w:t>
@@ -3800,6 +3797,7 @@
       <w:r>
         <w:rPr>
           <w:rFonts w:ascii="Arial" w:hAnsi="Arial" w:eastAsia="Arial" w:cs="Arial"/>
+          <w:color w:val="000000"/>
           <w:sz w:val="24"/>
         </w:rPr>
         <w:t xml:space="preserve"> (2025) tratam do uso atual de IA na prática farmacêutica. A metodologia é uma scoping review, ou revisão de escopo, voltada a mapear como a IA vem sendo aplicada na área. Os resultados indicam que muitas aplicações ainda estão ligadas à gestão de fluxo, produtividade, triagem e apoio operacional, mais do que à melhoria direta de desfechos clínicos.</w:t>
@@ -3810,6 +3808,7 @@
       <w:r>
         <w:rPr>
           <w:rFonts w:ascii="Arial" w:hAnsi="Arial" w:eastAsia="Arial" w:cs="Arial"/>
+          <w:color w:val="000000"/>
           <w:sz w:val="24"/>
         </w:rPr>
         <w:t>Esse estudo é relevante porque ajuda a justificar a farmácia como cenário de aplicação. O atendimento farmacêutico envolve solicitações variadas, organização de informações, encaminhamento de demandas e necessidade de respostas consistentes. Essas características tornam o ambiente adequado para testar arquiteturas multiagentes voltadas ao atendimento inteligente.</w:t>
@@ -3829,6 +3828,7 @@
           <w:rFonts w:ascii="Arial" w:hAnsi="Arial" w:eastAsia="Arial" w:cs="Arial"/>
           <w:b/>
           <w:caps/>
+          <w:color w:val="000000"/>
           <w:sz w:val="24"/>
         </w:rPr>
         <w:t>SISTEMAS MULTIAGENTES APLICADOS</w:t>
@@ -3840,6 +3840,7 @@
       <w:r>
         <w:rPr>
           <w:rFonts w:ascii="Arial" w:hAnsi="Arial" w:eastAsia="Arial" w:cs="Arial"/>
+          <w:color w:val="000000"/>
           <w:sz w:val="24"/>
         </w:rPr>
         <w:t xml:space="preserve">Li </w:t>
@@ -3849,6 +3850,7 @@
           <w:rFonts w:ascii="Arial" w:hAnsi="Arial" w:eastAsia="Arial" w:cs="Arial"/>
           <w:i w:val="1"/>
           <w:iCs w:val="1"/>
+          <w:color w:val="000000"/>
           <w:sz w:val="24"/>
         </w:rPr>
         <w:t>et al.</w:t>
@@ -3856,6 +3858,7 @@
       <w:r>
         <w:rPr>
           <w:rFonts w:ascii="Arial" w:hAnsi="Arial" w:eastAsia="Arial" w:cs="Arial"/>
+          <w:color w:val="000000"/>
           <w:sz w:val="24"/>
         </w:rPr>
         <w:t xml:space="preserve"> (2024) tratam como problema central a ausência de uma síntese sistemática sobre a construção de sistemas multiagentes baseados em LLMs. A metodologia do estudo é uma revisão organizada em torno de componentes como perfil dos agentes, percepção, ação individual, interação e evolução. Como resultado, os autores propõem uma estrutura de análise para compreender como agentes são organizados e como interagem entre si.</w:t>
@@ -3866,6 +3869,7 @@
       <w:r>
         <w:rPr>
           <w:rFonts w:ascii="Arial" w:hAnsi="Arial" w:eastAsia="Arial" w:cs="Arial"/>
+          <w:color w:val="000000"/>
           <w:sz w:val="24"/>
         </w:rPr>
         <w:t>Esse trabalho é relevante porque mostra que um sistema multiagente não depende apenas da capacidade individual de cada agente, mas também da forma como eles são coordenados. Para esta pesquisa, essa discussão serve como base para analisar por que diferentes arquiteturas podem gerar resultados distintos em um mesmo cenário de atendimento.</w:t>
@@ -3876,6 +3880,7 @@
       <w:r>
         <w:rPr>
           <w:rFonts w:ascii="Arial" w:hAnsi="Arial" w:eastAsia="Arial" w:cs="Arial"/>
+          <w:color w:val="000000"/>
           <w:sz w:val="24"/>
         </w:rPr>
         <w:t xml:space="preserve">Piccialli </w:t>
@@ -3885,6 +3890,7 @@
           <w:rFonts w:ascii="Arial" w:hAnsi="Arial" w:eastAsia="Arial" w:cs="Arial"/>
           <w:i w:val="1"/>
           <w:iCs w:val="1"/>
+          <w:color w:val="000000"/>
           <w:sz w:val="24"/>
         </w:rPr>
         <w:t>et al.</w:t>
@@ -3892,6 +3898,7 @@
       <w:r>
         <w:rPr>
           <w:rFonts w:ascii="Arial" w:hAnsi="Arial" w:eastAsia="Arial" w:cs="Arial"/>
+          <w:color w:val="000000"/>
           <w:sz w:val="24"/>
         </w:rPr>
         <w:t xml:space="preserve"> (2025) abordam agentes autônomos em ambientes de inteligência artificial distribuída. O problema tratado pelos autores está na fragmentação da literatura sobre agentes colaborativos e autônomos. A metodologia consiste em uma revisão ampla, organizada em forma de taxonomia, e o resultado principal é a consolidação de uma visão sobre como agentes podem colaborar para ampliar flexibilidade, robustez e escalabilidade.</w:t>
@@ -3902,6 +3909,7 @@
       <w:r>
         <w:rPr>
           <w:rFonts w:ascii="Arial" w:hAnsi="Arial" w:eastAsia="Arial" w:cs="Arial"/>
+          <w:color w:val="000000"/>
           <w:sz w:val="24"/>
         </w:rPr>
         <w:t>A contribuição desse estudo para o presente trabalho está na relação entre colaboração e desempenho. Em um atendimento farmacêutico automatizado, diferentes agentes podem assumir funções distintas, como interpretar a solicitação, consultar informações, validar respostas e encaminhar demandas. Por isso, compreender como agentes colaboram ajuda a justificar a proposta de comparar arquiteturas de coordenação.</w:t>
@@ -3912,6 +3920,7 @@
       <w:r>
         <w:rPr>
           <w:rFonts w:ascii="Arial" w:hAnsi="Arial" w:eastAsia="Arial" w:cs="Arial"/>
+          <w:color w:val="000000"/>
           <w:sz w:val="24"/>
         </w:rPr>
         <w:t xml:space="preserve">Balaprakash </w:t>
@@ -3921,6 +3930,7 @@
           <w:rFonts w:ascii="Arial" w:hAnsi="Arial" w:eastAsia="Arial" w:cs="Arial"/>
           <w:i w:val="1"/>
           <w:iCs w:val="1"/>
+          <w:color w:val="000000"/>
           <w:sz w:val="24"/>
         </w:rPr>
         <w:t>et al.</w:t>
@@ -3928,6 +3938,7 @@
       <w:r>
         <w:rPr>
           <w:rFonts w:ascii="Arial" w:hAnsi="Arial" w:eastAsia="Arial" w:cs="Arial"/>
+          <w:color w:val="000000"/>
           <w:sz w:val="24"/>
         </w:rPr>
         <w:t xml:space="preserve"> (2025) tratam das limitações de modelos tradicionais de workflow em ambientes distribuídos. O trabalho propõe uma estrutura descentralizada baseada em swarm intelligence, ou inteligência de enxame. Esse conceito se refere a sistemas nos quais múltiplos agentes simples interagem entre si e produzem um comportamento coletivo, sem depender totalmente de um controlador central.</w:t>
@@ -3938,6 +3949,7 @@
       <w:r>
         <w:rPr>
           <w:rFonts w:ascii="Arial" w:hAnsi="Arial" w:eastAsia="Arial" w:cs="Arial"/>
+          <w:color w:val="000000"/>
           <w:sz w:val="24"/>
         </w:rPr>
         <w:t>Esse estudo é relevante porque aproxima a discussão da arquitetura swarm, uma das abordagens consideradas neste projeto. A lógica descentralizada pode oferecer maior flexibilidade, mas também pode trazer desafios de controle, rastreabilidade e consistência. Essa tensão é importante para a comparação proposta neste trabalho.</w:t>
@@ -3948,6 +3960,7 @@
       <w:r>
         <w:rPr>
           <w:rFonts w:ascii="Arial" w:hAnsi="Arial" w:eastAsia="Arial" w:cs="Arial"/>
+          <w:color w:val="000000"/>
           <w:sz w:val="24"/>
         </w:rPr>
         <w:t xml:space="preserve">Kim </w:t>
@@ -3957,6 +3970,7 @@
           <w:rFonts w:ascii="Arial" w:hAnsi="Arial" w:eastAsia="Arial" w:cs="Arial"/>
           <w:i w:val="1"/>
           <w:iCs w:val="1"/>
+          <w:color w:val="000000"/>
           <w:sz w:val="24"/>
         </w:rPr>
         <w:t>et al.</w:t>
@@ -3964,6 +3978,7 @@
       <w:r>
         <w:rPr>
           <w:rFonts w:ascii="Arial" w:hAnsi="Arial" w:eastAsia="Arial" w:cs="Arial"/>
+          <w:color w:val="000000"/>
           <w:sz w:val="24"/>
         </w:rPr>
         <w:t xml:space="preserve"> (2025; 2026) abordam diretamente um problema próximo ao desta monografia: como a arquitetura de coordenação afeta o desempenho de sistemas de agentes. A metodologia é experimental e compara diferentes arquiteturas, como agente único, arquitetura centralizada, descentralizada e híbrida, em múltiplos benchmarks. Nesse contexto, benchmark significa um conjunto de testes padronizados usado para comparar o desempenho de diferentes soluções. Os autores também utilizam o termo baseline, que representa um resultado de referência usado como ponto de comparação.</w:t>
@@ -3974,6 +3989,7 @@
       <w:r>
         <w:rPr>
           <w:rFonts w:ascii="Arial" w:hAnsi="Arial" w:eastAsia="Arial" w:cs="Arial"/>
+          <w:color w:val="000000"/>
           <w:sz w:val="24"/>
         </w:rPr>
         <w:t>Os resultados mostram que não existe uma arquitetura universalmente melhor. Sistemas multiagentes podem superar o baseline em tarefas que podem ser divididas entre agentes, mas também podem apresentar desempenho inferior quando a tarefa exige uma sequência rígida de passos ou quando a coordenação entre agentes é inadequada. Essa conclusão é central para esta pesquisa, pois reforça a necessidade de comparar, no mesmo contexto farmacêutico, arquiteturas como orquestração, workflow e swarm.</w:t>
@@ -3993,6 +4009,7 @@
           <w:rFonts w:ascii="Arial" w:hAnsi="Arial" w:eastAsia="Arial" w:cs="Arial"/>
           <w:b/>
           <w:caps/>
+          <w:color w:val="000000"/>
           <w:sz w:val="24"/>
         </w:rPr>
         <w:t>COMPARAÇÃO COM SOLUÇÕES EXISTENTES</w:t>
@@ -4010,6 +4027,7 @@
           <w:rFonts w:ascii="Arial" w:hAnsi="Arial" w:eastAsia="Arial" w:cs="Arial"/>
           <w:b w:val="0"/>
           <w:i w:val="0"/>
+          <w:color w:val="000000"/>
           <w:sz w:val="24"/>
         </w:rPr>
         <w:t>Quadro 1 - Referência cruzada dos trabalhos relacionados e suas abordagens arquiteturais</w:t>
@@ -4053,6 +4071,7 @@
             <w:r>
               <w:rPr>
                 <w:rFonts w:ascii="Arial" w:hAnsi="Arial" w:eastAsia="Arial" w:cs="Arial"/>
+                <w:color w:val="000000"/>
                 <w:sz w:val="24"/>
               </w:rPr>
             </w:r>
@@ -4061,6 +4080,7 @@
                 <w:rFonts w:ascii="Arial" w:hAnsi="Arial" w:eastAsia="Arial" w:cs="Arial"/>
                 <w:b/>
                 <w:i w:val="0"/>
+                <w:color w:val="000000"/>
                 <w:sz w:val="24"/>
               </w:rPr>
               <w:t>Autor</w:t>
@@ -4087,6 +4107,7 @@
             <w:r>
               <w:rPr>
                 <w:rFonts w:ascii="Arial" w:hAnsi="Arial" w:eastAsia="Arial" w:cs="Arial"/>
+                <w:color w:val="000000"/>
                 <w:sz w:val="24"/>
               </w:rPr>
             </w:r>
@@ -4095,6 +4116,7 @@
                 <w:rFonts w:ascii="Arial" w:hAnsi="Arial" w:eastAsia="Arial" w:cs="Arial"/>
                 <w:b/>
                 <w:i w:val="0"/>
+                <w:color w:val="000000"/>
                 <w:sz w:val="24"/>
               </w:rPr>
               <w:t>Título</w:t>
@@ -4121,6 +4143,7 @@
             <w:r>
               <w:rPr>
                 <w:rFonts w:ascii="Arial" w:hAnsi="Arial" w:eastAsia="Arial" w:cs="Arial"/>
+                <w:color w:val="000000"/>
                 <w:sz w:val="24"/>
               </w:rPr>
             </w:r>
@@ -4129,6 +4152,7 @@
                 <w:rFonts w:ascii="Arial" w:hAnsi="Arial" w:eastAsia="Arial" w:cs="Arial"/>
                 <w:b/>
                 <w:i w:val="0"/>
+                <w:color w:val="000000"/>
                 <w:sz w:val="24"/>
               </w:rPr>
               <w:t>Problema</w:t>
@@ -4155,6 +4179,7 @@
             <w:r>
               <w:rPr>
                 <w:rFonts w:ascii="Arial" w:hAnsi="Arial" w:eastAsia="Arial" w:cs="Arial"/>
+                <w:color w:val="000000"/>
                 <w:sz w:val="24"/>
               </w:rPr>
             </w:r>
@@ -4163,6 +4188,7 @@
                 <w:rFonts w:ascii="Arial" w:hAnsi="Arial" w:eastAsia="Arial" w:cs="Arial"/>
                 <w:b/>
                 <w:i w:val="0"/>
+                <w:color w:val="000000"/>
                 <w:sz w:val="24"/>
               </w:rPr>
               <w:t>Metodologia / Ferramenta</w:t>
@@ -4189,6 +4215,7 @@
             <w:r>
               <w:rPr>
                 <w:rFonts w:ascii="Arial" w:hAnsi="Arial" w:eastAsia="Arial" w:cs="Arial"/>
+                <w:color w:val="000000"/>
                 <w:sz w:val="24"/>
               </w:rPr>
             </w:r>
@@ -4197,6 +4224,7 @@
                 <w:rFonts w:ascii="Arial" w:hAnsi="Arial" w:eastAsia="Arial" w:cs="Arial"/>
                 <w:b/>
                 <w:i w:val="0"/>
+                <w:color w:val="000000"/>
                 <w:sz w:val="24"/>
               </w:rPr>
               <w:t>Resultado principal</w:t>
@@ -4225,6 +4253,7 @@
             <w:r>
               <w:rPr>
                 <w:rFonts w:ascii="Arial" w:hAnsi="Arial" w:eastAsia="Arial" w:cs="Arial"/>
+                <w:color w:val="000000"/>
                 <w:sz w:val="24"/>
               </w:rPr>
             </w:r>
@@ -4233,6 +4262,7 @@
                 <w:rFonts w:ascii="Arial" w:hAnsi="Arial" w:eastAsia="Arial" w:cs="Arial"/>
                 <w:b w:val="0"/>
                 <w:i w:val="0"/>
+                <w:color w:val="000000"/>
                 <w:sz w:val="24"/>
               </w:rPr>
               <w:t xml:space="preserve">Li </w:t>
@@ -4242,6 +4272,7 @@
                 <w:rFonts w:ascii="Arial" w:hAnsi="Arial" w:eastAsia="Arial" w:cs="Arial"/>
                 <w:b w:val="0"/>
                 <w:i w:val="1"/>
+                <w:color w:val="000000"/>
                 <w:sz w:val="24"/>
                 <w:iCs w:val="1"/>
               </w:rPr>
@@ -4252,6 +4283,7 @@
                 <w:rFonts w:ascii="Arial" w:hAnsi="Arial" w:eastAsia="Arial" w:cs="Arial"/>
                 <w:b w:val="0"/>
                 <w:i w:val="0"/>
+                <w:color w:val="000000"/>
                 <w:sz w:val="24"/>
               </w:rPr>
               <w:t xml:space="preserve"> (2024)</w:t>
@@ -4278,6 +4310,7 @@
             <w:r>
               <w:rPr>
                 <w:rFonts w:ascii="Arial" w:hAnsi="Arial" w:eastAsia="Arial" w:cs="Arial"/>
+                <w:color w:val="000000"/>
                 <w:sz w:val="24"/>
               </w:rPr>
             </w:r>
@@ -4286,6 +4319,7 @@
                 <w:rFonts w:ascii="Arial" w:hAnsi="Arial" w:eastAsia="Arial" w:cs="Arial"/>
                 <w:b w:val="0"/>
                 <w:i w:val="0"/>
+                <w:color w:val="000000"/>
                 <w:sz w:val="24"/>
               </w:rPr>
               <w:t>A survey on LLM based multi-agent systems:  workflow, infrastructure, and challenges</w:t>
@@ -4312,6 +4346,7 @@
             <w:r>
               <w:rPr>
                 <w:rFonts w:ascii="Arial" w:hAnsi="Arial" w:eastAsia="Arial" w:cs="Arial"/>
+                <w:color w:val="000000"/>
                 <w:sz w:val="24"/>
               </w:rPr>
             </w:r>
@@ -4320,6 +4355,7 @@
                 <w:rFonts w:ascii="Arial" w:hAnsi="Arial" w:eastAsia="Arial" w:cs="Arial"/>
                 <w:b w:val="0"/>
                 <w:i w:val="0"/>
+                <w:color w:val="000000"/>
                 <w:sz w:val="24"/>
               </w:rPr>
               <w:t>Falta de síntese estruturada sobre MAS baseados em LLM</w:t>
@@ -4346,6 +4382,7 @@
             <w:r>
               <w:rPr>
                 <w:rFonts w:ascii="Arial" w:hAnsi="Arial" w:eastAsia="Arial" w:cs="Arial"/>
+                <w:color w:val="000000"/>
                 <w:sz w:val="24"/>
               </w:rPr>
             </w:r>
@@ -4354,6 +4391,7 @@
                 <w:rFonts w:ascii="Arial" w:hAnsi="Arial" w:eastAsia="Arial" w:cs="Arial"/>
                 <w:b w:val="0"/>
                 <w:i w:val="0"/>
+                <w:color w:val="000000"/>
                 <w:sz w:val="24"/>
               </w:rPr>
               <w:t>Revisão sistemática; análise por componentes de workflow</w:t>
@@ -4380,6 +4418,7 @@
             <w:r>
               <w:rPr>
                 <w:rFonts w:ascii="Arial" w:hAnsi="Arial" w:eastAsia="Arial" w:cs="Arial"/>
+                <w:color w:val="000000"/>
                 <w:sz w:val="24"/>
               </w:rPr>
             </w:r>
@@ -4388,6 +4427,7 @@
                 <w:rFonts w:ascii="Arial" w:hAnsi="Arial" w:eastAsia="Arial" w:cs="Arial"/>
                 <w:b w:val="0"/>
                 <w:i w:val="0"/>
+                <w:color w:val="000000"/>
                 <w:sz w:val="24"/>
               </w:rPr>
               <w:t>Propõe estrutura unificada e destaca coordenação como elemento central</w:t>
@@ -4416,6 +4456,7 @@
             <w:r>
               <w:rPr>
                 <w:rFonts w:ascii="Arial" w:hAnsi="Arial" w:eastAsia="Arial" w:cs="Arial"/>
+                <w:color w:val="000000"/>
                 <w:sz w:val="24"/>
               </w:rPr>
             </w:r>
@@ -4424,6 +4465,7 @@
                 <w:rFonts w:ascii="Arial" w:hAnsi="Arial" w:eastAsia="Arial" w:cs="Arial"/>
                 <w:b w:val="0"/>
                 <w:i w:val="0"/>
+                <w:color w:val="000000"/>
                 <w:sz w:val="24"/>
               </w:rPr>
               <w:t xml:space="preserve">Piccialli </w:t>
@@ -4433,6 +4475,7 @@
                 <w:rFonts w:ascii="Arial" w:hAnsi="Arial" w:eastAsia="Arial" w:cs="Arial"/>
                 <w:b w:val="0"/>
                 <w:i w:val="1"/>
+                <w:color w:val="000000"/>
                 <w:sz w:val="24"/>
                 <w:iCs w:val="1"/>
               </w:rPr>
@@ -4443,6 +4486,7 @@
                 <w:rFonts w:ascii="Arial" w:hAnsi="Arial" w:eastAsia="Arial" w:cs="Arial"/>
                 <w:b w:val="0"/>
                 <w:i w:val="0"/>
+                <w:color w:val="000000"/>
                 <w:sz w:val="24"/>
               </w:rPr>
               <w:t xml:space="preserve"> (2025)</w:t>
@@ -4469,6 +4513,7 @@
             <w:r>
               <w:rPr>
                 <w:rFonts w:ascii="Arial" w:hAnsi="Arial" w:eastAsia="Arial" w:cs="Arial"/>
+                <w:color w:val="000000"/>
                 <w:sz w:val="24"/>
               </w:rPr>
             </w:r>
@@ -4477,6 +4522,7 @@
                 <w:rFonts w:ascii="Arial" w:hAnsi="Arial" w:eastAsia="Arial" w:cs="Arial"/>
                 <w:b w:val="0"/>
                 <w:i w:val="0"/>
+                <w:color w:val="000000"/>
                 <w:sz w:val="24"/>
               </w:rPr>
               <w:t>AgentAI: A comprehensive survey on autonomous agents in distributed AI for Industry 4.0</w:t>
@@ -4503,6 +4549,7 @@
             <w:r>
               <w:rPr>
                 <w:rFonts w:ascii="Arial" w:hAnsi="Arial" w:eastAsia="Arial" w:cs="Arial"/>
+                <w:color w:val="000000"/>
                 <w:sz w:val="24"/>
               </w:rPr>
             </w:r>
@@ -4511,6 +4558,7 @@
                 <w:rFonts w:ascii="Arial" w:hAnsi="Arial" w:eastAsia="Arial" w:cs="Arial"/>
                 <w:b w:val="0"/>
                 <w:i w:val="0"/>
+                <w:color w:val="000000"/>
                 <w:sz w:val="24"/>
               </w:rPr>
               <w:t>Fragmentação da literatura sobre agentes autônomos distribuídos</w:t>
@@ -4537,6 +4585,7 @@
             <w:r>
               <w:rPr>
                 <w:rFonts w:ascii="Arial" w:hAnsi="Arial" w:eastAsia="Arial" w:cs="Arial"/>
+                <w:color w:val="000000"/>
                 <w:sz w:val="24"/>
               </w:rPr>
             </w:r>
@@ -4545,6 +4594,7 @@
                 <w:rFonts w:ascii="Arial" w:hAnsi="Arial" w:eastAsia="Arial" w:cs="Arial"/>
                 <w:b w:val="0"/>
                 <w:i w:val="0"/>
+                <w:color w:val="000000"/>
                 <w:sz w:val="24"/>
               </w:rPr>
               <w:t>Survey taxonômico multidomínio</w:t>
@@ -4571,6 +4621,7 @@
             <w:r>
               <w:rPr>
                 <w:rFonts w:ascii="Arial" w:hAnsi="Arial" w:eastAsia="Arial" w:cs="Arial"/>
+                <w:color w:val="000000"/>
                 <w:sz w:val="24"/>
               </w:rPr>
             </w:r>
@@ -4579,6 +4630,7 @@
                 <w:rFonts w:ascii="Arial" w:hAnsi="Arial" w:eastAsia="Arial" w:cs="Arial"/>
                 <w:b w:val="0"/>
                 <w:i w:val="0"/>
+                <w:color w:val="000000"/>
                 <w:sz w:val="24"/>
               </w:rPr>
               <w:t>Consolida visão sobre escalabilidade, robustez e flexibilidade dos agentes</w:t>
@@ -4607,6 +4659,7 @@
             <w:r>
               <w:rPr>
                 <w:rFonts w:ascii="Arial" w:hAnsi="Arial" w:eastAsia="Arial" w:cs="Arial"/>
+                <w:color w:val="000000"/>
                 <w:sz w:val="24"/>
               </w:rPr>
             </w:r>
@@ -4615,6 +4668,7 @@
                 <w:rFonts w:ascii="Arial" w:hAnsi="Arial" w:eastAsia="Arial" w:cs="Arial"/>
                 <w:b w:val="0"/>
                 <w:i w:val="0"/>
+                <w:color w:val="000000"/>
                 <w:sz w:val="24"/>
               </w:rPr>
               <w:t xml:space="preserve">Balaprakash </w:t>
@@ -4624,6 +4678,7 @@
                 <w:rFonts w:ascii="Arial" w:hAnsi="Arial" w:eastAsia="Arial" w:cs="Arial"/>
                 <w:b w:val="0"/>
                 <w:i w:val="1"/>
+                <w:color w:val="000000"/>
                 <w:sz w:val="24"/>
                 <w:iCs w:val="1"/>
               </w:rPr>
@@ -4634,6 +4689,7 @@
                 <w:rFonts w:ascii="Arial" w:hAnsi="Arial" w:eastAsia="Arial" w:cs="Arial"/>
                 <w:b w:val="0"/>
                 <w:i w:val="0"/>
+                <w:color w:val="000000"/>
                 <w:sz w:val="24"/>
               </w:rPr>
               <w:t xml:space="preserve"> (2025)</w:t>
@@ -4660,6 +4716,7 @@
             <w:r>
               <w:rPr>
                 <w:rFonts w:ascii="Arial" w:hAnsi="Arial" w:eastAsia="Arial" w:cs="Arial"/>
+                <w:color w:val="000000"/>
                 <w:sz w:val="24"/>
               </w:rPr>
             </w:r>
@@ -4668,6 +4725,7 @@
                 <w:rFonts w:ascii="Arial" w:hAnsi="Arial" w:eastAsia="Arial" w:cs="Arial"/>
                 <w:b w:val="0"/>
                 <w:i w:val="0"/>
+                <w:color w:val="000000"/>
                 <w:sz w:val="24"/>
               </w:rPr>
               <w:t>SWARM: Reimagining scientific workflow management systems in a distributed world</w:t>
@@ -4694,6 +4752,7 @@
             <w:r>
               <w:rPr>
                 <w:rFonts w:ascii="Arial" w:hAnsi="Arial" w:eastAsia="Arial" w:cs="Arial"/>
+                <w:color w:val="000000"/>
                 <w:sz w:val="24"/>
               </w:rPr>
             </w:r>
@@ -4702,6 +4761,7 @@
                 <w:rFonts w:ascii="Arial" w:hAnsi="Arial" w:eastAsia="Arial" w:cs="Arial"/>
                 <w:b w:val="0"/>
                 <w:i w:val="0"/>
+                <w:color w:val="000000"/>
                 <w:sz w:val="24"/>
               </w:rPr>
               <w:t>Rigidez de workflows tradicionais em ambientes distribuídos</w:t>
@@ -4728,6 +4788,7 @@
             <w:r>
               <w:rPr>
                 <w:rFonts w:ascii="Arial" w:hAnsi="Arial" w:eastAsia="Arial" w:cs="Arial"/>
+                <w:color w:val="000000"/>
                 <w:sz w:val="24"/>
               </w:rPr>
             </w:r>
@@ -4736,6 +4797,7 @@
                 <w:rFonts w:ascii="Arial" w:hAnsi="Arial" w:eastAsia="Arial" w:cs="Arial"/>
                 <w:b w:val="0"/>
                 <w:i w:val="0"/>
+                <w:color w:val="000000"/>
                 <w:sz w:val="24"/>
               </w:rPr>
               <w:t>Framework descentralizado com swarm intelligence</w:t>
@@ -4762,6 +4824,7 @@
             <w:r>
               <w:rPr>
                 <w:rFonts w:ascii="Arial" w:hAnsi="Arial" w:eastAsia="Arial" w:cs="Arial"/>
+                <w:color w:val="000000"/>
                 <w:sz w:val="24"/>
               </w:rPr>
             </w:r>
@@ -4770,6 +4833,7 @@
                 <w:rFonts w:ascii="Arial" w:hAnsi="Arial" w:eastAsia="Arial" w:cs="Arial"/>
                 <w:b w:val="0"/>
                 <w:i w:val="0"/>
+                <w:color w:val="000000"/>
                 <w:sz w:val="24"/>
               </w:rPr>
               <w:t>Mostra potencial de coordenação emergente e distribuição da decisão</w:t>
@@ -4798,6 +4862,7 @@
             <w:r>
               <w:rPr>
                 <w:rFonts w:ascii="Arial" w:hAnsi="Arial" w:eastAsia="Arial" w:cs="Arial"/>
+                <w:color w:val="000000"/>
                 <w:sz w:val="24"/>
               </w:rPr>
             </w:r>
@@ -4806,6 +4871,7 @@
                 <w:rFonts w:ascii="Arial" w:hAnsi="Arial" w:eastAsia="Arial" w:cs="Arial"/>
                 <w:b w:val="0"/>
                 <w:i w:val="0"/>
+                <w:color w:val="000000"/>
                 <w:sz w:val="24"/>
               </w:rPr>
               <w:t xml:space="preserve">Kim </w:t>
@@ -4815,6 +4881,7 @@
                 <w:rFonts w:ascii="Arial" w:hAnsi="Arial" w:eastAsia="Arial" w:cs="Arial"/>
                 <w:b w:val="0"/>
                 <w:i w:val="1"/>
+                <w:color w:val="000000"/>
                 <w:sz w:val="24"/>
                 <w:iCs w:val="1"/>
               </w:rPr>
@@ -4825,6 +4892,7 @@
                 <w:rFonts w:ascii="Arial" w:hAnsi="Arial" w:eastAsia="Arial" w:cs="Arial"/>
                 <w:b w:val="0"/>
                 <w:i w:val="0"/>
+                <w:color w:val="000000"/>
                 <w:sz w:val="24"/>
               </w:rPr>
               <w:t xml:space="preserve"> (2025/2026)</w:t>
@@ -4851,6 +4919,7 @@
             <w:r>
               <w:rPr>
                 <w:rFonts w:ascii="Arial" w:hAnsi="Arial" w:eastAsia="Arial" w:cs="Arial"/>
+                <w:color w:val="000000"/>
                 <w:sz w:val="24"/>
               </w:rPr>
             </w:r>
@@ -4859,6 +4928,7 @@
                 <w:rFonts w:ascii="Arial" w:hAnsi="Arial" w:eastAsia="Arial" w:cs="Arial"/>
                 <w:b w:val="0"/>
                 <w:i w:val="0"/>
+                <w:color w:val="000000"/>
                 <w:sz w:val="24"/>
               </w:rPr>
               <w:t>Towards a Science of Scaling Agent Systems</w:t>
@@ -4885,6 +4955,7 @@
             <w:r>
               <w:rPr>
                 <w:rFonts w:ascii="Arial" w:hAnsi="Arial" w:eastAsia="Arial" w:cs="Arial"/>
+                <w:color w:val="000000"/>
                 <w:sz w:val="24"/>
               </w:rPr>
             </w:r>
@@ -4893,6 +4964,7 @@
                 <w:rFonts w:ascii="Arial" w:hAnsi="Arial" w:eastAsia="Arial" w:cs="Arial"/>
                 <w:b w:val="0"/>
                 <w:i w:val="0"/>
+                <w:color w:val="000000"/>
                 <w:sz w:val="24"/>
               </w:rPr>
               <w:t>Falta de evidência comparativa sobre o efeito da arquitetura</w:t>
@@ -4919,6 +4991,7 @@
             <w:r>
               <w:rPr>
                 <w:rFonts w:ascii="Arial" w:hAnsi="Arial" w:eastAsia="Arial" w:cs="Arial"/>
+                <w:color w:val="000000"/>
                 <w:sz w:val="24"/>
               </w:rPr>
             </w:r>
@@ -4927,6 +5000,7 @@
                 <w:rFonts w:ascii="Arial" w:hAnsi="Arial" w:eastAsia="Arial" w:cs="Arial"/>
                 <w:b w:val="0"/>
                 <w:i w:val="0"/>
+                <w:color w:val="000000"/>
                 <w:sz w:val="24"/>
               </w:rPr>
               <w:t>Avaliação experimental controlada entre arquiteturas</w:t>
@@ -4953,6 +5027,7 @@
             <w:r>
               <w:rPr>
                 <w:rFonts w:ascii="Arial" w:hAnsi="Arial" w:eastAsia="Arial" w:cs="Arial"/>
+                <w:color w:val="000000"/>
                 <w:sz w:val="24"/>
               </w:rPr>
             </w:r>
@@ -4961,6 +5036,7 @@
                 <w:rFonts w:ascii="Arial" w:hAnsi="Arial" w:eastAsia="Arial" w:cs="Arial"/>
                 <w:b w:val="0"/>
                 <w:i w:val="0"/>
+                <w:color w:val="000000"/>
                 <w:sz w:val="24"/>
               </w:rPr>
               <w:t>Mostra que desempenho depende do alinhamento entre tarefa e coordenação</w:t>
@@ -4989,6 +5065,7 @@
             <w:r>
               <w:rPr>
                 <w:rFonts w:ascii="Arial" w:hAnsi="Arial" w:eastAsia="Arial" w:cs="Arial"/>
+                <w:color w:val="000000"/>
                 <w:sz w:val="24"/>
               </w:rPr>
             </w:r>
@@ -4997,6 +5074,7 @@
                 <w:rFonts w:ascii="Arial" w:hAnsi="Arial" w:eastAsia="Arial" w:cs="Arial"/>
                 <w:b w:val="0"/>
                 <w:i w:val="0"/>
+                <w:color w:val="000000"/>
                 <w:sz w:val="24"/>
               </w:rPr>
               <w:t xml:space="preserve">Jagatap </w:t>
@@ -5006,6 +5084,7 @@
                 <w:rFonts w:ascii="Arial" w:hAnsi="Arial" w:eastAsia="Arial" w:cs="Arial"/>
                 <w:b w:val="0"/>
                 <w:i w:val="1"/>
+                <w:color w:val="000000"/>
                 <w:sz w:val="24"/>
                 <w:iCs w:val="1"/>
               </w:rPr>
@@ -5016,6 +5095,7 @@
                 <w:rFonts w:ascii="Arial" w:hAnsi="Arial" w:eastAsia="Arial" w:cs="Arial"/>
                 <w:b w:val="0"/>
                 <w:i w:val="0"/>
+                <w:color w:val="000000"/>
                 <w:sz w:val="24"/>
               </w:rPr>
               <w:t xml:space="preserve"> (2025)</w:t>
@@ -5042,6 +5122,7 @@
             <w:r>
               <w:rPr>
                 <w:rFonts w:ascii="Arial" w:hAnsi="Arial" w:eastAsia="Arial" w:cs="Arial"/>
+                <w:color w:val="000000"/>
                 <w:sz w:val="24"/>
               </w:rPr>
             </w:r>
@@ -5050,6 +5131,7 @@
                 <w:rFonts w:ascii="Arial" w:hAnsi="Arial" w:eastAsia="Arial" w:cs="Arial"/>
                 <w:b w:val="0"/>
                 <w:i w:val="0"/>
+                <w:color w:val="000000"/>
                 <w:sz w:val="24"/>
               </w:rPr>
               <w:t>RxLens: Multi-Agent LLM-powered Scan and Order for Pharmacy</w:t>
@@ -5076,6 +5158,7 @@
             <w:r>
               <w:rPr>
                 <w:rFonts w:ascii="Arial" w:hAnsi="Arial" w:eastAsia="Arial" w:cs="Arial"/>
+                <w:color w:val="000000"/>
                 <w:sz w:val="24"/>
               </w:rPr>
             </w:r>
@@ -5084,6 +5167,7 @@
                 <w:rFonts w:ascii="Arial" w:hAnsi="Arial" w:eastAsia="Arial" w:cs="Arial"/>
                 <w:b w:val="0"/>
                 <w:i w:val="0"/>
+                <w:color w:val="000000"/>
                 <w:sz w:val="24"/>
               </w:rPr>
               <w:t>Automação do processamento de prescrições em farmácia</w:t>
@@ -5110,6 +5194,7 @@
             <w:r>
               <w:rPr>
                 <w:rFonts w:ascii="Arial" w:hAnsi="Arial" w:eastAsia="Arial" w:cs="Arial"/>
+                <w:color w:val="000000"/>
                 <w:sz w:val="24"/>
               </w:rPr>
             </w:r>
@@ -5118,6 +5203,7 @@
                 <w:rFonts w:ascii="Arial" w:hAnsi="Arial" w:eastAsia="Arial" w:cs="Arial"/>
                 <w:b w:val="0"/>
                 <w:i w:val="0"/>
+                <w:color w:val="000000"/>
                 <w:sz w:val="24"/>
               </w:rPr>
               <w:t>Pipeline com LLM, OCR, extração e matching</w:t>
@@ -5144,6 +5230,7 @@
             <w:r>
               <w:rPr>
                 <w:rFonts w:ascii="Arial" w:hAnsi="Arial" w:eastAsia="Arial" w:cs="Arial"/>
+                <w:color w:val="000000"/>
                 <w:sz w:val="24"/>
               </w:rPr>
             </w:r>
@@ -5152,6 +5239,7 @@
                 <w:rFonts w:ascii="Arial" w:hAnsi="Arial" w:eastAsia="Arial" w:cs="Arial"/>
                 <w:b w:val="0"/>
                 <w:i w:val="0"/>
+                <w:color w:val="000000"/>
                 <w:sz w:val="24"/>
               </w:rPr>
               <w:t>Melhora recall e demonstra viabilidade de agentes no domínio farmacêutico</w:t>
@@ -5180,6 +5268,7 @@
             <w:r>
               <w:rPr>
                 <w:rFonts w:ascii="Arial" w:hAnsi="Arial" w:eastAsia="Arial" w:cs="Arial"/>
+                <w:color w:val="000000"/>
                 <w:sz w:val="24"/>
               </w:rPr>
             </w:r>
@@ -5188,6 +5277,7 @@
                 <w:rFonts w:ascii="Arial" w:hAnsi="Arial" w:eastAsia="Arial" w:cs="Arial"/>
                 <w:b w:val="0"/>
                 <w:i w:val="0"/>
+                <w:color w:val="000000"/>
                 <w:sz w:val="24"/>
               </w:rPr>
               <w:t xml:space="preserve">Hatzimanolis </w:t>
@@ -5197,6 +5287,7 @@
                 <w:rFonts w:ascii="Arial" w:hAnsi="Arial" w:eastAsia="Arial" w:cs="Arial"/>
                 <w:b w:val="0"/>
                 <w:i w:val="1"/>
+                <w:color w:val="000000"/>
                 <w:sz w:val="24"/>
                 <w:iCs w:val="1"/>
               </w:rPr>
@@ -5207,6 +5298,7 @@
                 <w:rFonts w:ascii="Arial" w:hAnsi="Arial" w:eastAsia="Arial" w:cs="Arial"/>
                 <w:b w:val="0"/>
                 <w:i w:val="0"/>
+                <w:color w:val="000000"/>
                 <w:sz w:val="24"/>
               </w:rPr>
               <w:t xml:space="preserve"> (2025)</w:t>
@@ -5233,6 +5325,7 @@
             <w:r>
               <w:rPr>
                 <w:rFonts w:ascii="Arial" w:hAnsi="Arial" w:eastAsia="Arial" w:cs="Arial"/>
+                <w:color w:val="000000"/>
                 <w:sz w:val="24"/>
               </w:rPr>
             </w:r>
@@ -5241,6 +5334,7 @@
                 <w:rFonts w:ascii="Arial" w:hAnsi="Arial" w:eastAsia="Arial" w:cs="Arial"/>
                 <w:b w:val="0"/>
                 <w:i w:val="0"/>
+                <w:color w:val="000000"/>
                 <w:sz w:val="24"/>
               </w:rPr>
               <w:t>Applications of artificial intelligence in current pharmacy practice: A scoping review</w:t>
@@ -5267,6 +5361,7 @@
             <w:r>
               <w:rPr>
                 <w:rFonts w:ascii="Arial" w:hAnsi="Arial" w:eastAsia="Arial" w:cs="Arial"/>
+                <w:color w:val="000000"/>
                 <w:sz w:val="24"/>
               </w:rPr>
             </w:r>
@@ -5275,6 +5370,7 @@
                 <w:rFonts w:ascii="Arial" w:hAnsi="Arial" w:eastAsia="Arial" w:cs="Arial"/>
                 <w:b w:val="0"/>
                 <w:i w:val="0"/>
+                <w:color w:val="000000"/>
                 <w:sz w:val="24"/>
               </w:rPr>
               <w:t>Mapear usos atuais de IA na prática farmacêutica</w:t>
@@ -5301,6 +5397,7 @@
             <w:r>
               <w:rPr>
                 <w:rFonts w:ascii="Arial" w:hAnsi="Arial" w:eastAsia="Arial" w:cs="Arial"/>
+                <w:color w:val="000000"/>
                 <w:sz w:val="24"/>
               </w:rPr>
             </w:r>
@@ -5309,6 +5406,7 @@
                 <w:rFonts w:ascii="Arial" w:hAnsi="Arial" w:eastAsia="Arial" w:cs="Arial"/>
                 <w:b w:val="0"/>
                 <w:i w:val="0"/>
+                <w:color w:val="000000"/>
                 <w:sz w:val="24"/>
               </w:rPr>
               <w:t>Scoping review com PRISMA-ScR</w:t>
@@ -5335,6 +5433,7 @@
             <w:r>
               <w:rPr>
                 <w:rFonts w:ascii="Arial" w:hAnsi="Arial" w:eastAsia="Arial" w:cs="Arial"/>
+                <w:color w:val="000000"/>
                 <w:sz w:val="24"/>
               </w:rPr>
             </w:r>
@@ -5343,6 +5442,7 @@
                 <w:rFonts w:ascii="Arial" w:hAnsi="Arial" w:eastAsia="Arial" w:cs="Arial"/>
                 <w:b w:val="0"/>
                 <w:i w:val="0"/>
+                <w:color w:val="000000"/>
                 <w:sz w:val="24"/>
               </w:rPr>
               <w:t>Identifica foco em fluxo, produtividade e triagem</w:t>
@@ -5371,6 +5471,7 @@
             <w:r>
               <w:rPr>
                 <w:rFonts w:ascii="Arial" w:hAnsi="Arial" w:eastAsia="Arial" w:cs="Arial"/>
+                <w:color w:val="000000"/>
                 <w:sz w:val="24"/>
               </w:rPr>
             </w:r>
@@ -5379,6 +5480,7 @@
                 <w:rFonts w:ascii="Arial" w:hAnsi="Arial" w:eastAsia="Arial" w:cs="Arial"/>
                 <w:b w:val="0"/>
                 <w:i w:val="0"/>
+                <w:color w:val="000000"/>
                 <w:sz w:val="24"/>
               </w:rPr>
               <w:t>MAB</w:t>
@@ -5405,6 +5507,7 @@
             <w:r>
               <w:rPr>
                 <w:rFonts w:ascii="Arial" w:hAnsi="Arial" w:eastAsia="Arial" w:cs="Arial"/>
+                <w:color w:val="000000"/>
                 <w:sz w:val="24"/>
               </w:rPr>
             </w:r>
@@ -5413,6 +5516,7 @@
                 <w:rFonts w:ascii="Arial" w:hAnsi="Arial" w:eastAsia="Arial" w:cs="Arial"/>
                 <w:b w:val="0"/>
                 <w:i w:val="0"/>
+                <w:color w:val="000000"/>
                 <w:sz w:val="24"/>
               </w:rPr>
               <w:t>Sistema multiagente para atendimento inteligente em farmácias: uma análise comparativa de arquiteturas de coordenação</w:t>
@@ -5439,6 +5543,7 @@
             <w:r>
               <w:rPr>
                 <w:rFonts w:ascii="Arial" w:hAnsi="Arial" w:eastAsia="Arial" w:cs="Arial"/>
+                <w:color w:val="000000"/>
                 <w:sz w:val="24"/>
               </w:rPr>
             </w:r>
@@ -5447,6 +5552,7 @@
                 <w:rFonts w:ascii="Arial" w:hAnsi="Arial" w:eastAsia="Arial" w:cs="Arial"/>
                 <w:b w:val="0"/>
                 <w:i w:val="0"/>
+                <w:color w:val="000000"/>
                 <w:sz w:val="24"/>
               </w:rPr>
               <w:t>Comparar qual arquitetura de coordenação é mais adequada para atendimento inteligente</w:t>
@@ -5473,6 +5579,7 @@
             <w:r>
               <w:rPr>
                 <w:rFonts w:ascii="Arial" w:hAnsi="Arial" w:eastAsia="Arial" w:cs="Arial"/>
+                <w:color w:val="000000"/>
                 <w:sz w:val="24"/>
               </w:rPr>
             </w:r>
@@ -5481,6 +5588,7 @@
                 <w:rFonts w:ascii="Arial" w:hAnsi="Arial" w:eastAsia="Arial" w:cs="Arial"/>
                 <w:b w:val="0"/>
                 <w:i w:val="0"/>
+                <w:color w:val="000000"/>
                 <w:sz w:val="24"/>
               </w:rPr>
               <w:t>Protótipo experimental com orquestração, workflow e swarm; métricas de tempo, resolução, distribuição e intervenção humana</w:t>
@@ -5507,6 +5615,7 @@
             <w:r>
               <w:rPr>
                 <w:rFonts w:ascii="Arial" w:hAnsi="Arial" w:eastAsia="Arial" w:cs="Arial"/>
+                <w:color w:val="000000"/>
                 <w:sz w:val="24"/>
               </w:rPr>
             </w:r>
@@ -5515,6 +5624,7 @@
                 <w:rFonts w:ascii="Arial" w:hAnsi="Arial" w:eastAsia="Arial" w:cs="Arial"/>
                 <w:b w:val="0"/>
                 <w:i w:val="0"/>
+                <w:color w:val="000000"/>
                 <w:sz w:val="24"/>
               </w:rPr>
               <w:t>Busca comparar arquiteturas no mesmo cenário, isolando o efeito da coordenação no comportamento do sistema</w:t>
@@ -5530,6 +5640,7 @@
       <w:r>
         <w:rPr>
           <w:rFonts w:ascii="Arial" w:hAnsi="Arial" w:eastAsia="Arial" w:cs="Arial"/>
+          <w:color w:val="000000"/>
           <w:sz w:val="24"/>
         </w:rPr>
         <w:t>Fonte: elaborado pelos autores, 2026.</w:t>
@@ -5549,6 +5660,7 @@
           <w:rFonts w:ascii="Arial" w:hAnsi="Arial" w:eastAsia="Arial" w:cs="Arial"/>
           <w:b/>
           <w:caps/>
+          <w:color w:val="000000"/>
           <w:sz w:val="24"/>
         </w:rPr>
         <w:t>LACUNAS IDENTIFICADAS</w:t>
@@ -5560,6 +5672,7 @@
       <w:r>
         <w:rPr>
           <w:rFonts w:ascii="Arial" w:hAnsi="Arial" w:eastAsia="Arial" w:cs="Arial"/>
+          <w:color w:val="000000"/>
           <w:sz w:val="24"/>
         </w:rPr>
         <w:t>Os trabalhos analisados mostram que a literatura já apresenta avanços importantes em sistemas multiagentes, arquiteturas de coordenação e aplicações de IA no setor farmacêutico. No entanto, esses temas aparecem, em grande parte, de forma separada. Os estudos sobre sistemas multiagentes explicam como agentes podem ser estruturados e coordenados, enquanto os trabalhos sobre farmácia mostram aplicações práticas de IA nesse domínio.</w:t>
@@ -5570,6 +5683,7 @@
       <w:r>
         <w:rPr>
           <w:rFonts w:ascii="Arial" w:hAnsi="Arial" w:eastAsia="Arial" w:cs="Arial"/>
+          <w:color w:val="000000"/>
           <w:sz w:val="24"/>
         </w:rPr>
         <w:t>A lacuna identificada está justamente na comparação entre diferentes arquiteturas de coordenação dentro de um mesmo contexto farmacêutico. Em outras palavras, ainda há espaço para investigar como modelos como orquestração centralizada, workflow estruturado e swarm se comportam quando aplicados ao mesmo tipo de atendimento. Essa comparação é importante porque a escolha da arquitetura pode influenciar tempo de resposta, distribuição de tarefas, qualidade das respostas, necessidade de intervenção humana e controle do processo.</w:t>
@@ -5580,6 +5694,7 @@
       <w:r>
         <w:rPr>
           <w:rFonts w:ascii="Arial" w:hAnsi="Arial" w:eastAsia="Arial" w:cs="Arial"/>
+          <w:color w:val="000000"/>
           <w:sz w:val="24"/>
         </w:rPr>
         <w:t>O quadro 1 mostra que os estudos mais próximos do núcleo do MAB são os que tratam explicitamente de estrutura, coordenação e descentralização. Já os trabalhos em farmácia ajudam mais a justificar o cenário de aplicação do que a responder diretamente ao problema arquitetural. Em outras palavras, a literatura já mostra que farmácia é um contexto válido para automação e IA, mas ainda oferece pouco suporte comparativo sobre qual modelo de coordenação entre agentes é o mais adequado para esse tipo de serviço.</w:t>
@@ -5590,6 +5705,7 @@
       <w:r>
         <w:rPr>
           <w:rFonts w:ascii="Arial" w:hAnsi="Arial" w:eastAsia="Arial" w:cs="Arial"/>
+          <w:color w:val="000000"/>
           <w:sz w:val="24"/>
         </w:rPr>
         <w:t>Com base nos trabalhos selecionados, observa-se uma lacuna clara: há revisões e taxonomias importantes sobre sistemas multiagentes, há propostas de coordenação descentralizada e há aplicações em farmácia, mas são menos frequentes os estudos que colocam, lado a lado, arquiteturas diferentes sob um mesmo contexto experimental para avaliar seus efeitos de forma comparável. É exatamente nesse ponto que esta pesquisa se posiciona.</w:t>
@@ -5600,6 +5716,7 @@
       <w:r>
         <w:rPr>
           <w:rFonts w:ascii="Arial" w:hAnsi="Arial" w:eastAsia="Arial" w:cs="Arial"/>
+          <w:color w:val="000000"/>
           <w:sz w:val="24"/>
         </w:rPr>
         <w:t xml:space="preserve">As referências escolhidas foram mantidas porque sustentam, cada uma, uma parte essencial do problema: Li </w:t>
@@ -5609,6 +5726,7 @@
           <w:rFonts w:ascii="Arial" w:hAnsi="Arial" w:eastAsia="Arial" w:cs="Arial"/>
           <w:i w:val="1"/>
           <w:iCs w:val="1"/>
+          <w:color w:val="000000"/>
           <w:sz w:val="24"/>
         </w:rPr>
         <w:t>et al.</w:t>
@@ -5616,6 +5734,7 @@
       <w:r>
         <w:rPr>
           <w:rFonts w:ascii="Arial" w:hAnsi="Arial" w:eastAsia="Arial" w:cs="Arial"/>
+          <w:color w:val="000000"/>
           <w:sz w:val="24"/>
         </w:rPr>
         <w:t xml:space="preserve"> e Piccialli </w:t>
@@ -5625,6 +5744,7 @@
           <w:rFonts w:ascii="Arial" w:hAnsi="Arial" w:eastAsia="Arial" w:cs="Arial"/>
           <w:i w:val="1"/>
           <w:iCs w:val="1"/>
+          <w:color w:val="000000"/>
           <w:sz w:val="24"/>
         </w:rPr>
         <w:t>et al.</w:t>
@@ -5632,6 +5752,7 @@
       <w:r>
         <w:rPr>
           <w:rFonts w:ascii="Arial" w:hAnsi="Arial" w:eastAsia="Arial" w:cs="Arial"/>
+          <w:color w:val="000000"/>
           <w:sz w:val="24"/>
         </w:rPr>
         <w:t xml:space="preserve"> organizam o campo dos sistemas multiagentes; Balaprakash </w:t>
@@ -5641,6 +5762,7 @@
           <w:rFonts w:ascii="Arial" w:hAnsi="Arial" w:eastAsia="Arial" w:cs="Arial"/>
           <w:i w:val="1"/>
           <w:iCs w:val="1"/>
+          <w:color w:val="000000"/>
           <w:sz w:val="24"/>
         </w:rPr>
         <w:t>et al.</w:t>
@@ -5648,6 +5770,7 @@
       <w:r>
         <w:rPr>
           <w:rFonts w:ascii="Arial" w:hAnsi="Arial" w:eastAsia="Arial" w:cs="Arial"/>
+          <w:color w:val="000000"/>
           <w:sz w:val="24"/>
         </w:rPr>
         <w:t xml:space="preserve"> e Kim </w:t>
@@ -5657,6 +5780,7 @@
           <w:rFonts w:ascii="Arial" w:hAnsi="Arial" w:eastAsia="Arial" w:cs="Arial"/>
           <w:i w:val="1"/>
           <w:iCs w:val="1"/>
+          <w:color w:val="000000"/>
           <w:sz w:val="24"/>
         </w:rPr>
         <w:t>et al.</w:t>
@@ -5664,6 +5788,7 @@
       <w:r>
         <w:rPr>
           <w:rFonts w:ascii="Arial" w:hAnsi="Arial" w:eastAsia="Arial" w:cs="Arial"/>
+          <w:color w:val="000000"/>
           <w:sz w:val="24"/>
         </w:rPr>
         <w:t xml:space="preserve"> aproximam a discussão da comparação arquitetural entre centralização, workflow e descentralização; Jagatap </w:t>
@@ -5673,6 +5798,7 @@
           <w:rFonts w:ascii="Arial" w:hAnsi="Arial" w:eastAsia="Arial" w:cs="Arial"/>
           <w:i w:val="1"/>
           <w:iCs w:val="1"/>
+          <w:color w:val="000000"/>
           <w:sz w:val="24"/>
         </w:rPr>
         <w:t>et al.</w:t>
@@ -5680,6 +5806,7 @@
       <w:r>
         <w:rPr>
           <w:rFonts w:ascii="Arial" w:hAnsi="Arial" w:eastAsia="Arial" w:cs="Arial"/>
+          <w:color w:val="000000"/>
           <w:sz w:val="24"/>
         </w:rPr>
         <w:t xml:space="preserve"> e Hatzimanolis </w:t>
@@ -5689,6 +5816,7 @@
           <w:rFonts w:ascii="Arial" w:hAnsi="Arial" w:eastAsia="Arial" w:cs="Arial"/>
           <w:i w:val="1"/>
           <w:iCs w:val="1"/>
+          <w:color w:val="000000"/>
           <w:sz w:val="24"/>
         </w:rPr>
         <w:t>et al.</w:t>
@@ -5696,6 +5824,7 @@
       <w:r>
         <w:rPr>
           <w:rFonts w:ascii="Arial" w:hAnsi="Arial" w:eastAsia="Arial" w:cs="Arial"/>
+          <w:color w:val="000000"/>
           <w:sz w:val="24"/>
         </w:rPr>
         <w:t xml:space="preserve"> justificam a escolha da farmácia como estudo de caso operacional. Assim, o capítulo preserva o foco central nas arquiteturas de agentes, enquanto o domínio farmacêutico permanece como contexto aplicado. Tudo o que diz respeito à arquitetura proposta, ao fluxo de desenvolvimento, à implementação do protótipo e aos experimentos comparativos será detalhado no capítulo de metodologia.</w:t>
@@ -5715,6 +5844,7 @@
           <w:rFonts w:ascii="Arial" w:hAnsi="Arial" w:eastAsia="Arial" w:cs="Arial"/>
           <w:b/>
           <w:caps/>
+          <w:color w:val="000000"/>
           <w:sz w:val="28"/>
         </w:rPr>
         <w:t>METODOLOGIA</w:t>
@@ -5735,6 +5865,7 @@
           <w:rFonts w:ascii="Arial" w:hAnsi="Arial" w:eastAsia="Arial" w:cs="Arial"/>
           <w:b/>
           <w:caps/>
+          <w:color w:val="000000"/>
           <w:sz w:val="24"/>
         </w:rPr>
         <w:t>TIPO DE PESQUISA</w:t>
@@ -5746,6 +5877,7 @@
       <w:r>
         <w:rPr>
           <w:rFonts w:ascii="Arial" w:hAnsi="Arial" w:eastAsia="Arial" w:cs="Arial"/>
+          <w:color w:val="000000"/>
           <w:sz w:val="24"/>
         </w:rPr>
         <w:t>O trabalho caracteriza-se como pesquisa aplicada, bibliográfica, tecnológica e experimental. É aplicada porque busca produzir conhecimento utilizável na construção de um sistema de atendimento; bibliográfica porque organiza conceitos e evidências publicados sobre agentes e coordenação; tecnológica porque envolve modelagem e implementação de um protótipo; e experimental porque compara arquiteturas sob condições controladas. A comparação será realizada somente após o congelamento do protocolo e a preparação do conjunto de cenários.</w:t>
@@ -5765,6 +5897,7 @@
           <w:rFonts w:ascii="Arial" w:hAnsi="Arial" w:eastAsia="Arial" w:cs="Arial"/>
           <w:b/>
           <w:caps/>
+          <w:color w:val="000000"/>
           <w:sz w:val="24"/>
         </w:rPr>
         <w:t>ETAPAS DO TRABALHO</w:t>
@@ -5776,6 +5909,7 @@
       <w:r>
         <w:rPr>
           <w:rFonts w:ascii="Arial" w:hAnsi="Arial" w:eastAsia="Arial" w:cs="Arial"/>
+          <w:color w:val="000000"/>
           <w:sz w:val="24"/>
         </w:rPr>
         <w:t>A revisão bibliográfica realizada até este estágio é classificada como revisão estruturada da literatura, e não como revisão sistemática. Foram usadas expressões relacionadas a sistemas multiagentes baseados em LLMs, orquestração, workflow, swarm, agentes distribuídos, avaliação de agentes e IA aplicada a farmácias. As fontes foram localizadas em páginas de editoras, bibliotecas digitais, repositórios de preprints e documentos institucionais. A rastreabilidade é mantida no registro vivo de referências, que armazena URL, prioridade, tipo, seção-alvo e decisão editorial.</w:t>
@@ -5786,6 +5920,7 @@
       <w:r>
         <w:rPr>
           <w:rFonts w:ascii="Arial" w:hAnsi="Arial" w:eastAsia="Arial" w:cs="Arial"/>
+          <w:color w:val="000000"/>
           <w:sz w:val="24"/>
         </w:rPr>
         <w:t>Os critérios de inclusão priorizam trabalhos que: definam ou organizem sistemas multiagentes; discutam arquiteturas de coordenação; comparem empiricamente estratégias arquiteturais; proponham métricas de avaliação; ou contextualizem o atendimento farmacêutico. São excluídos textos sem relação direta com a pergunta de pesquisa, materiais de marketing usados como única sustentação científica e referências cujo metadado primário não possa ser verificado. A revisão não reivindica exaustividade, protocolo PRISMA, dupla triagem independente ou cobertura completa de bases indexadas, pois essas etapas não foram executadas e documentadas.</w:t>
@@ -5796,6 +5931,7 @@
       <w:r>
         <w:rPr>
           <w:rFonts w:ascii="Arial" w:hAnsi="Arial" w:eastAsia="Arial" w:cs="Arial"/>
+          <w:color w:val="000000"/>
           <w:sz w:val="24"/>
         </w:rPr>
         <w:t>O desenvolvimento tecnológico foi dividido em quatro etapas: modelagem de uma interface comum de execução; implementação das arquiteturas centralizada, workflow e swarm; instrumentação de eventos e métricas; e preparação dos cenários comparáveis. A etapa experimental utilizará a mesma entrada, conjunto de ferramentas, modelo, configuração e limites operacionais para as três arquiteturas. Ordem de execução, repetições, seed quando disponível, versão do código e parâmetros do modelo deverão ser preservados junto aos artefatos do experimento.</w:t>
@@ -5806,6 +5942,7 @@
       <w:r>
         <w:rPr>
           <w:rFonts w:ascii="Arial" w:hAnsi="Arial" w:eastAsia="Arial" w:cs="Arial"/>
+          <w:color w:val="000000"/>
           <w:sz w:val="24"/>
         </w:rPr>
         <w:t>A origem e a transformação dos cenários derivados de conversas de WhatsApp permanecem pendentes da OQ-001. Até a decisão dos autores, nenhum dado real será copiado para o repositório e o protocolo utilizará apenas o esquema de campos e cenários sintéticos já existentes.</w:t>
@@ -5825,6 +5962,7 @@
           <w:rFonts w:ascii="Arial" w:hAnsi="Arial" w:eastAsia="Arial" w:cs="Arial"/>
           <w:b/>
           <w:caps/>
+          <w:color w:val="000000"/>
           <w:sz w:val="24"/>
         </w:rPr>
         <w:t>DEFINIÇÃO DO PROBLEMA E HIPÓTESES</w:t>
@@ -5836,6 +5974,7 @@
       <w:r>
         <w:rPr>
           <w:rFonts w:ascii="Arial" w:hAnsi="Arial" w:eastAsia="Arial" w:cs="Arial"/>
+          <w:color w:val="000000"/>
           <w:sz w:val="24"/>
         </w:rPr>
         <w:t>A pergunta de pesquisa é: como a escolha entre orquestração centralizada, workflow estruturado e coordenação descentralizada por handoffs influencia a eficiência operacional, a qualidade das respostas e o custo de coordenação de um sistema de atendimento farmacêutico, quando as demais condições são mantidas constantes?</w:t>
@@ -5846,6 +5985,7 @@
       <w:r>
         <w:rPr>
           <w:rFonts w:ascii="Arial" w:hAnsi="Arial" w:eastAsia="Arial" w:cs="Arial"/>
+          <w:color w:val="000000"/>
           <w:sz w:val="24"/>
         </w:rPr>
         <w:t>As hipóteses foram formuladas de maneira não direcional para evitar presumir uma arquitetura vencedora antes dos testes:</w:t>
@@ -5861,6 +6001,7 @@
       <w:r>
         <w:rPr>
           <w:rFonts w:ascii="Arial" w:hAnsi="Arial" w:eastAsia="Arial" w:cs="Arial"/>
+          <w:color w:val="000000"/>
           <w:sz w:val="24"/>
         </w:rPr>
         <w:t>H0: não existe diferença estatisticamente detectável entre as arquiteturas nas métricas primárias definidas no protocolo.</w:t>
@@ -5876,6 +6017,7 @@
       <w:r>
         <w:rPr>
           <w:rFonts w:ascii="Arial" w:hAnsi="Arial" w:eastAsia="Arial" w:cs="Arial"/>
+          <w:color w:val="000000"/>
           <w:sz w:val="24"/>
         </w:rPr>
         <w:t>H1: pelo menos uma arquitetura apresenta diferença estatisticamente detectável em uma ou mais métricas primárias.</w:t>
@@ -5891,6 +6033,7 @@
       <w:r>
         <w:rPr>
           <w:rFonts w:ascii="Arial" w:hAnsi="Arial" w:eastAsia="Arial" w:cs="Arial"/>
+          <w:color w:val="000000"/>
           <w:sz w:val="24"/>
         </w:rPr>
         <w:t>H2: o efeito da arquitetura depende do tipo de cenário, especialmente da necessidade de ferramentas, anexos, continuidade de contexto ou revisão humana.</w:t>
@@ -5901,6 +6044,7 @@
       <w:r>
         <w:rPr>
           <w:rFonts w:ascii="Arial" w:hAnsi="Arial" w:eastAsia="Arial" w:cs="Arial"/>
+          <w:color w:val="000000"/>
           <w:sz w:val="24"/>
         </w:rPr>
         <w:t>As hipóteses permanecem com status de proposta até aprovação dos autores e congelamento do protocolo. Qualquer alteração posterior à coleta deverá ser identificada como exploratória e registrada no histórico.</w:t>
@@ -5920,6 +6064,7 @@
           <w:rFonts w:ascii="Arial" w:hAnsi="Arial" w:eastAsia="Arial" w:cs="Arial"/>
           <w:b/>
           <w:caps/>
+          <w:color w:val="000000"/>
           <w:sz w:val="24"/>
         </w:rPr>
         <w:t>MÉTRICAS DE AVALIAÇÃO</w:t>
@@ -5931,6 +6076,7 @@
       <w:r>
         <w:rPr>
           <w:rFonts w:ascii="Arial" w:hAnsi="Arial" w:eastAsia="Arial" w:cs="Arial"/>
+          <w:color w:val="000000"/>
           <w:sz w:val="24"/>
         </w:rPr>
         <w:t>As métricas operacionais disponíveis no protótipo serão calculadas por arquitetura e por cenário. O sucesso técnico corresponde à conclusão da execução sem erro; a latência será resumida por mediana (p50) e percentil 95 (p95); tokens serão separados em entrada, saída e total; chamadas de ferramenta, erros de ferramenta, ciclos e handoffs serão contados a partir da telemetria; e a taxa de revisão corresponderá à proporção de execuções encaminhadas para avaliação humana.</w:t>
@@ -5941,6 +6087,7 @@
       <w:r>
         <w:rPr>
           <w:rFonts w:ascii="Arial" w:hAnsi="Arial" w:eastAsia="Arial" w:cs="Arial"/>
+          <w:color w:val="000000"/>
           <w:sz w:val="24"/>
         </w:rPr>
         <w:t>A qualidade da resposta não será inferida apenas pelo sucesso técnico. Ela exigirá uma rubrica que considere correção em relação ao cenário, aderência à intenção, segurança, completude e clareza. A escolha entre avaliação humana, LLM-as-Judge ou abordagem híbrida permanece aberta na OQ-002. Até essa decisão, a métrica de qualidade é um campo metodológico pendente e não será calculada retroativamente sem registrar a versão da rubrica.</w:t>
@@ -5951,6 +6098,7 @@
       <w:r>
         <w:rPr>
           <w:rFonts w:ascii="Arial" w:hAnsi="Arial" w:eastAsia="Arial" w:cs="Arial"/>
+          <w:color w:val="000000"/>
           <w:sz w:val="24"/>
         </w:rPr>
         <w:t>Para reduzir viés, as comparações deverão manter constantes o conjunto de cenários, a versão do modelo, as ferramentas, os prompts de domínio e os limites de execução. Sempre que a distribuição permitir, serão apresentados medida central, dispersão e intervalo de confiança. A análise inferencial e o número mínimo de repetições serão definidos no congelamento do protocolo, antes dos testes definitivos.</w:t>
@@ -5970,6 +6118,7 @@
           <w:rFonts w:ascii="Arial" w:hAnsi="Arial" w:eastAsia="Arial" w:cs="Arial"/>
           <w:b/>
           <w:caps/>
+          <w:color w:val="000000"/>
           <w:sz w:val="28"/>
         </w:rPr>
         <w:t>MODELAGEM DA SOLUÇÃO</w:t>
@@ -5990,6 +6139,7 @@
           <w:rFonts w:ascii="Arial" w:hAnsi="Arial" w:eastAsia="Arial" w:cs="Arial"/>
           <w:b/>
           <w:caps/>
+          <w:color w:val="000000"/>
           <w:sz w:val="24"/>
         </w:rPr>
         <w:t>VISÃO GERAL DO SISTEMA</w:t>
@@ -6001,6 +6151,7 @@
       <w:r>
         <w:rPr>
           <w:rFonts w:ascii="Arial" w:hAnsi="Arial" w:eastAsia="Arial" w:cs="Arial"/>
+          <w:color w:val="000000"/>
           <w:sz w:val="24"/>
         </w:rPr>
         <w:t>O MAB foi modelado para comparar estratégias de coordenação sem alterar o domínio, as ferramentas ou o formato de entrada. O sistema recebe mensagens de atendimento, persiste a conversa, cria uma execução identificada como run e encaminha a solicitação ao serviço responsável pelos agentes. A arquitetura selecionada processa o mesmo contrato de entrada e devolve, além do texto final, eventos que descrevem decisões, ferramentas, transferências e necessidade de revisão.</w:t>
@@ -6011,6 +6162,7 @@
       <w:r>
         <w:rPr>
           <w:rFonts w:ascii="Arial" w:hAnsi="Arial" w:eastAsia="Arial" w:cs="Arial"/>
+          <w:color w:val="000000"/>
           <w:sz w:val="24"/>
         </w:rPr>
         <w:t>A separação entre canal, API e runtime permite que uma mensagem proveniente da interface web ou de uma integração futura seja normalizada antes de chegar aos agentes. Essa decisão evita acoplar as arquiteturas ao WhatsApp e mantém o experimento centrado no mecanismo de coordenação.</w:t>
@@ -6030,6 +6182,7 @@
           <w:rFonts w:ascii="Arial" w:hAnsi="Arial" w:eastAsia="Arial" w:cs="Arial"/>
           <w:b/>
           <w:caps/>
+          <w:color w:val="000000"/>
           <w:sz w:val="24"/>
         </w:rPr>
         <w:t>ARQUITETURA PROPOSTA</w:t>
@@ -6041,6 +6194,7 @@
       <w:r>
         <w:rPr>
           <w:rFonts w:ascii="Arial" w:hAnsi="Arial" w:eastAsia="Arial" w:cs="Arial"/>
+          <w:color w:val="000000"/>
           <w:sz w:val="24"/>
         </w:rPr>
         <w:t>A solução é organizada em três camadas. A camada de interação recebe mensagens e exibe respostas, eventos e painéis de acompanhamento. A API transacional gerencia conversas, mensagens, anexos, runs e persistência. O runtime dos agentes implementa uma interface comum de execução e registra as arquiteturas centralized_orchestration, structured_workflow e decentralized_swarm.</w:t>
@@ -6051,6 +6205,7 @@
       <w:r>
         <w:rPr>
           <w:rFonts w:ascii="Arial" w:hAnsi="Arial" w:eastAsia="Arial" w:cs="Arial"/>
+          <w:color w:val="000000"/>
           <w:sz w:val="24"/>
         </w:rPr>
         <w:t>Todas as estratégias recebem o mesmo objeto de requisição, que inclui a mensagem atual, histórico recente, anexos e metadados. O contexto de execução concentra emissão de eventos, contagem de tokens, chamadas de ferramentas, loops, handoffs e tempo decorrido. Essa interface comum é essencial para a validade interna da comparação, pois reduz diferenças que não pertencem à arquitetura avaliada.</w:t>
@@ -6070,6 +6225,7 @@
           <w:rFonts w:ascii="Arial" w:hAnsi="Arial" w:eastAsia="Arial" w:cs="Arial"/>
           <w:b/>
           <w:caps/>
+          <w:color w:val="000000"/>
           <w:sz w:val="24"/>
         </w:rPr>
         <w:t>COMPONENTES DO SISTEMA</w:t>
@@ -6081,6 +6237,7 @@
       <w:r>
         <w:rPr>
           <w:rFonts w:ascii="Arial" w:hAnsi="Arial" w:eastAsia="Arial" w:cs="Arial"/>
+          <w:color w:val="000000"/>
           <w:sz w:val="24"/>
         </w:rPr>
         <w:t>O supervisor da arquitetura centralizada classifica a mensagem, escolhe entre FAQ, estoque e análise de anexos e compõe a resposta. No workflow, agentes especializados executam estágios ordenados de classificação, coleta de evidência, revisão e síntese. No swarm, um coordenador inicia a delegação; especialistas de FAQ, estoque e anexos podem realizar handoffs entre pares; e um sintetizador produz a saída final quando necessário.</w:t>
@@ -6091,6 +6248,7 @@
       <w:r>
         <w:rPr>
           <w:rFonts w:ascii="Arial" w:hAnsi="Arial" w:eastAsia="Arial" w:cs="Arial"/>
+          <w:color w:val="000000"/>
           <w:sz w:val="24"/>
         </w:rPr>
         <w:t>As ferramentas de domínio são funções separadas dos agentes. Elas retornam dados de FAQ, disponibilidade simulada e informações iniciais sobre anexos. A revisão humana é representada por um indicador explícito na run. A telemetria utiliza eventos de início, conclusão e falha para nós, ferramentas, mensagens e handoffs, permitindo reconstruir o caminho de cada execução.</w:t>
@@ -6101,6 +6259,7 @@
       <w:r>
         <w:rPr>
           <w:rFonts w:ascii="Arial" w:hAnsi="Arial" w:eastAsia="Arial" w:cs="Arial"/>
+          <w:color w:val="000000"/>
           <w:sz w:val="24"/>
         </w:rPr>
         <w:t>O armazenamento relacional preserva conversas, mensagens e runs, enquanto anexos podem ser mantidos em armazenamento local ou compatível com S3. Contratos compartilhados reduzem divergências entre frontend, API e runtime. Nenhum desses componentes autoriza armazenamento de conversas reais do WhatsApp no repositório público.</w:t>
@@ -6120,6 +6279,7 @@
           <w:rFonts w:ascii="Arial" w:hAnsi="Arial" w:eastAsia="Arial" w:cs="Arial"/>
           <w:b/>
           <w:caps/>
+          <w:color w:val="000000"/>
           <w:sz w:val="24"/>
         </w:rPr>
         <w:t>FLUXO DE ATENDIMENTO</w:t>
@@ -6131,6 +6291,7 @@
       <w:r>
         <w:rPr>
           <w:rFonts w:ascii="Arial" w:hAnsi="Arial" w:eastAsia="Arial" w:cs="Arial"/>
+          <w:color w:val="000000"/>
           <w:sz w:val="24"/>
         </w:rPr>
         <w:t>O fluxo inicia com a normalização da mensagem e a seleção da arquitetura pelos metadados da conversa ou da run. Em seguida, a API despacha a solicitação ao runtime e publica eventos de processamento. A arquitetura interpreta o contexto, aciona ferramentas e produz a resposta. Quando identifica conteúdo clínico, insuficiência de evidência ou outro critério de risco, a execução é marcada para revisão humana.</w:t>
@@ -6141,6 +6302,7 @@
       <w:r>
         <w:rPr>
           <w:rFonts w:ascii="Arial" w:hAnsi="Arial" w:eastAsia="Arial" w:cs="Arial"/>
+          <w:color w:val="000000"/>
           <w:sz w:val="24"/>
         </w:rPr>
         <w:t>Na arquitetura centralizada, as decisões passam por um supervisor. No workflow, cada etapa só começa depois da anterior, com responsabilidades previsíveis. No swarm, as transferências são registradas como handoffs e limitadas por configuração. Ao final, o runtime devolve texto, desfecho, contagens e identificador de trace; a API persiste o resultado e a interface atualiza o atendimento por eventos enviados ao cliente.</w:t>
@@ -6160,6 +6322,7 @@
           <w:rFonts w:ascii="Arial" w:hAnsi="Arial" w:eastAsia="Arial" w:cs="Arial"/>
           <w:b/>
           <w:caps/>
+          <w:color w:val="000000"/>
           <w:sz w:val="28"/>
         </w:rPr>
         <w:t>DESENVOLVIMENTO DO SISTEMA</w:t>
@@ -6180,6 +6343,7 @@
           <w:rFonts w:ascii="Arial" w:hAnsi="Arial" w:eastAsia="Arial" w:cs="Arial"/>
           <w:b/>
           <w:caps/>
+          <w:color w:val="000000"/>
           <w:sz w:val="24"/>
         </w:rPr>
         <w:t>TECNOLOGIAS UTILIZADAS</w:t>
@@ -6191,6 +6355,7 @@
       <w:r>
         <w:rPr>
           <w:rFonts w:ascii="Arial" w:hAnsi="Arial" w:eastAsia="Arial" w:cs="Arial"/>
+          <w:color w:val="000000"/>
           <w:sz w:val="24"/>
         </w:rPr>
         <w:t>O projeto utiliza uma stack dividida em backend transacional, frontend web e serviço de execução dos agentes. No backend, Python, FastAPI, Pydantic, SQLAlchemy, Alembic e PostgreSQL sustentam endpoints, validação e persistência. Server-Sent Events transmitem atualizações de processamento. Anexos podem ser armazenados localmente ou em serviço compatível com S3, com MinIO no ambiente local.</w:t>
@@ -6201,6 +6366,7 @@
       <w:r>
         <w:rPr>
           <w:rFonts w:ascii="Arial" w:hAnsi="Arial" w:eastAsia="Arial" w:cs="Arial"/>
+          <w:color w:val="000000"/>
           <w:sz w:val="24"/>
         </w:rPr>
         <w:t>O frontend utiliza Next.js, React, TypeScript e Tailwind CSS. A interface reúne workspace de chat, histórico, anexos, timeline operacional, revisão humana, inspeção técnica, dashboard e visualização dos fluxos. Contratos compartilhados em TypeScript mantêm alinhados os objetos usados pelo frontend e pela API.</w:t>
@@ -6211,6 +6377,7 @@
       <w:r>
         <w:rPr>
           <w:rFonts w:ascii="Arial" w:hAnsi="Arial" w:eastAsia="Arial" w:cs="Arial"/>
+          <w:color w:val="000000"/>
           <w:sz w:val="24"/>
         </w:rPr>
         <w:t>O runtime dos agentes utiliza Python, FastAPI, Strands Agents e AWS Bedrock quando o modo live está ativado. OpenTelemetry/OTLP pode exportar telemetria. O runtime também possui modo mock, empregado em testes determinísticos, no qual ferramentas e respostas controladas verificam contratos e sequências de eventos sem depender do modelo remoto.</w:t>
@@ -6230,6 +6397,7 @@
           <w:rFonts w:ascii="Arial" w:hAnsi="Arial" w:eastAsia="Arial" w:cs="Arial"/>
           <w:b/>
           <w:caps/>
+          <w:color w:val="000000"/>
           <w:sz w:val="24"/>
         </w:rPr>
         <w:t>IMPLEMENTAÇÃO DOS AGENTES</w:t>
@@ -6241,6 +6409,7 @@
       <w:r>
         <w:rPr>
           <w:rFonts w:ascii="Arial" w:hAnsi="Arial" w:eastAsia="Arial" w:cs="Arial"/>
+          <w:color w:val="000000"/>
           <w:sz w:val="24"/>
         </w:rPr>
         <w:t>Os agentes compartilham um contexto de execução que oferece histórico recente da conversa, mensagem atual, anexos e ferramentas. O contexto mede chamadas, erros, loops, handoffs, tokens e tempos até eventos públicos. A seleção de rota considera três intenções implementadas: perguntas frequentes, consulta de estoque e processamento de anexos.</w:t>
@@ -6251,6 +6420,7 @@
       <w:r>
         <w:rPr>
           <w:rFonts w:ascii="Arial" w:hAnsi="Arial" w:eastAsia="Arial" w:cs="Arial"/>
+          <w:color w:val="000000"/>
           <w:sz w:val="24"/>
         </w:rPr>
         <w:t>As ferramentas faq_lookup, stock_lookup e attachment_intake encapsulam a lógica de domínio. No modo live, hooks registram o início e o término de cada chamada. Se a invocação do modelo falha ou não está habilitada, o runtime utiliza respostas mock explicitamente identificadas, evitando apresentar a simulação como execução real.</w:t>
@@ -6270,6 +6440,7 @@
           <w:rFonts w:ascii="Arial" w:hAnsi="Arial" w:eastAsia="Arial" w:cs="Arial"/>
           <w:b/>
           <w:caps/>
+          <w:color w:val="000000"/>
           <w:sz w:val="24"/>
         </w:rPr>
         <w:t>IMPLEMENTAÇÃO DAS ARQUITETURAS</w:t>
@@ -6281,6 +6452,7 @@
       <w:r>
         <w:rPr>
           <w:rFonts w:ascii="Arial" w:hAnsi="Arial" w:eastAsia="Arial" w:cs="Arial"/>
+          <w:color w:val="000000"/>
           <w:sz w:val="24"/>
         </w:rPr>
         <w:t>Na orquestração centralizada, um único supervisor recebe a mensagem e dispõe das três ferramentas. O prompt do supervisor define as regras de roteamento e exige encaminhamento profissional para perguntas clínicas. Depois de usar uma ferramenta, o mesmo agente compõe a resposta final. O fluxo não realiza handoffs entre pares.</w:t>
@@ -6291,6 +6463,7 @@
       <w:r>
         <w:rPr>
           <w:rFonts w:ascii="Arial" w:hAnsi="Arial" w:eastAsia="Arial" w:cs="Arial"/>
+          <w:color w:val="000000"/>
           <w:sz w:val="24"/>
         </w:rPr>
         <w:t>O workflow estruturado implementa um pipeline com agentes diferentes para classificação, coleta de evidência, revisão e síntese. Se houver anexo, a rota de análise de imagem é priorizada. O agente de revisão decide se a resposta exige intervenção humana com base em categorias de risco, e o sintetizador recebe evidência e decisão de revisão antes de produzir o texto final.</w:t>
@@ -6301,6 +6474,7 @@
       <w:r>
         <w:rPr>
           <w:rFonts w:ascii="Arial" w:hAnsi="Arial" w:eastAsia="Arial" w:cs="Arial"/>
+          <w:color w:val="000000"/>
           <w:sz w:val="24"/>
         </w:rPr>
         <w:t>O swarm descentralizado utiliza uma ferramenta de handoff. Um coordenador delega a solicitação para especialistas de FAQ, estoque ou anexos; esses especialistas podem transferir a tarefa a outro par quando precisam de informação complementar. Um limite configurável impede transferências indefinidas. Um sintetizador é acionado quando o retorno do coordenador não constitui uma resposta final adequada. Cada transferência incrementa contadores de handoff e loop.</w:t>
@@ -6320,6 +6494,7 @@
           <w:rFonts w:ascii="Arial" w:hAnsi="Arial" w:eastAsia="Arial" w:cs="Arial"/>
           <w:b/>
           <w:caps/>
+          <w:color w:val="000000"/>
           <w:sz w:val="24"/>
         </w:rPr>
         <w:t>INTEGRAÇÃO COM FERRAMENTAS</w:t>
@@ -6331,6 +6506,7 @@
       <w:r>
         <w:rPr>
           <w:rFonts w:ascii="Arial" w:hAnsi="Arial" w:eastAsia="Arial" w:cs="Arial"/>
+          <w:color w:val="000000"/>
           <w:sz w:val="24"/>
         </w:rPr>
         <w:t>A API cria e acompanha runs, despacha a execução ao runtime e persiste o desfecho. Eventos técnicos descrevem nós, mensagens, ferramentas e handoffs, permitindo alimentar a timeline da interface e os relatórios comparativos. O benchmark existente executa os mesmos cenários contra as três arquiteturas e agrega sucesso, latência p50/p95, tokens, chamadas de ferramenta, erros, loops, handoffs e revisão humana.</w:t>
@@ -6341,6 +6517,7 @@
       <w:r>
         <w:rPr>
           <w:rFonts w:ascii="Arial" w:hAnsi="Arial" w:eastAsia="Arial" w:cs="Arial"/>
+          <w:color w:val="000000"/>
           <w:sz w:val="24"/>
         </w:rPr>
         <w:t>Os testes utilizam Pytest no backend e no runtime, Playwright no frontend e cenários declarativos em YAML para validação E2E. O framework atual verifica rota, eventos, termos esperados, termos proibidos e timeout. A avaliação semântica das respostas em modo live permanece pendente da definição metodológica registrada na OQ-002; portanto, ela não é tratada como resultado implementado.</w:t>
@@ -6360,6 +6537,7 @@
           <w:rFonts w:ascii="Arial" w:hAnsi="Arial" w:eastAsia="Arial" w:cs="Arial"/>
           <w:b/>
           <w:caps/>
+          <w:color w:val="000000"/>
           <w:sz w:val="28"/>
         </w:rPr>
         <w:t>EXPERIMENTOS E RESULTADOS</w:t>
@@ -6380,6 +6558,7 @@
           <w:rFonts w:ascii="Arial" w:hAnsi="Arial" w:eastAsia="Arial" w:cs="Arial"/>
           <w:b/>
           <w:caps/>
+          <w:color w:val="000000"/>
           <w:sz w:val="24"/>
         </w:rPr>
         <w:t>CENÁRIOS DE TESTE</w:t>
@@ -6393,6 +6572,7 @@
       <w:r>
         <w:rPr>
           <w:rFonts w:ascii="Arial" w:hAnsi="Arial" w:eastAsia="Arial" w:cs="Arial"/>
+          <w:color w:val="000000"/>
           <w:sz w:val="24"/>
         </w:rPr>
         <w:t>Placeholder protegido: descrever somente após congelamento do protocolo e preparação dos cenários.</w:t>
@@ -6412,6 +6592,7 @@
           <w:rFonts w:ascii="Arial" w:hAnsi="Arial" w:eastAsia="Arial" w:cs="Arial"/>
           <w:b/>
           <w:caps/>
+          <w:color w:val="000000"/>
           <w:sz w:val="24"/>
         </w:rPr>
         <w:t>MÉTRICAS ANALISADAS</w:t>
@@ -6425,6 +6606,7 @@
       <w:r>
         <w:rPr>
           <w:rFonts w:ascii="Arial" w:hAnsi="Arial" w:eastAsia="Arial" w:cs="Arial"/>
+          <w:color w:val="000000"/>
           <w:sz w:val="24"/>
         </w:rPr>
         <w:t>Placeholder protegido: preencher somente após aprovação das métricas e execução reproduzível.</w:t>
@@ -6444,6 +6626,7 @@
           <w:rFonts w:ascii="Arial" w:hAnsi="Arial" w:eastAsia="Arial" w:cs="Arial"/>
           <w:b/>
           <w:caps/>
+          <w:color w:val="000000"/>
           <w:sz w:val="24"/>
         </w:rPr>
         <w:t>RESULTADOS OBTIDOS</w:t>
@@ -6457,6 +6640,7 @@
       <w:r>
         <w:rPr>
           <w:rFonts w:ascii="Arial" w:hAnsi="Arial" w:eastAsia="Arial" w:cs="Arial"/>
+          <w:color w:val="000000"/>
           <w:sz w:val="24"/>
         </w:rPr>
         <w:t>Placeholder protegido: não inserir resultados antes da abertura humana do evidence gate.</w:t>
@@ -6476,6 +6660,7 @@
           <w:rFonts w:ascii="Arial" w:hAnsi="Arial" w:eastAsia="Arial" w:cs="Arial"/>
           <w:b/>
           <w:caps/>
+          <w:color w:val="000000"/>
           <w:sz w:val="24"/>
         </w:rPr>
         <w:t>COMPARAÇÃO ENTRE ARQUITETURAS</w:t>
@@ -6489,6 +6674,7 @@
       <w:r>
         <w:rPr>
           <w:rFonts w:ascii="Arial" w:hAnsi="Arial" w:eastAsia="Arial" w:cs="Arial"/>
+          <w:color w:val="000000"/>
           <w:sz w:val="24"/>
         </w:rPr>
         <w:t>Placeholder protegido: comparar apenas evidências revisadas pelos autores.</w:t>
@@ -6508,6 +6694,7 @@
           <w:rFonts w:ascii="Arial" w:hAnsi="Arial" w:eastAsia="Arial" w:cs="Arial"/>
           <w:b/>
           <w:caps/>
+          <w:color w:val="000000"/>
           <w:sz w:val="28"/>
         </w:rPr>
         <w:t>DISCUSSÃO</w:t>
@@ -6528,6 +6715,7 @@
           <w:rFonts w:ascii="Arial" w:hAnsi="Arial" w:eastAsia="Arial" w:cs="Arial"/>
           <w:b/>
           <w:caps/>
+          <w:color w:val="000000"/>
           <w:sz w:val="24"/>
         </w:rPr>
         <w:t>ANÁLISE DOS RESULTADOS</w:t>
@@ -6541,6 +6729,7 @@
       <w:r>
         <w:rPr>
           <w:rFonts w:ascii="Arial" w:hAnsi="Arial" w:eastAsia="Arial" w:cs="Arial"/>
+          <w:color w:val="000000"/>
           <w:sz w:val="24"/>
         </w:rPr>
         <w:t>Placeholder protegido: redigir somente após validação dos resultados.</w:t>
@@ -6560,6 +6749,7 @@
           <w:rFonts w:ascii="Arial" w:hAnsi="Arial" w:eastAsia="Arial" w:cs="Arial"/>
           <w:b/>
           <w:caps/>
+          <w:color w:val="000000"/>
           <w:sz w:val="24"/>
         </w:rPr>
         <w:t>VANTAGENS E LIMITAÇÕES</w:t>
@@ -6573,6 +6763,7 @@
       <w:r>
         <w:rPr>
           <w:rFonts w:ascii="Arial" w:hAnsi="Arial" w:eastAsia="Arial" w:cs="Arial"/>
+          <w:color w:val="000000"/>
           <w:sz w:val="24"/>
         </w:rPr>
         <w:t>Placeholder protegido: derivar das evidências e ameaças à validade verificadas.</w:t>
@@ -6592,6 +6783,7 @@
           <w:rFonts w:ascii="Arial" w:hAnsi="Arial" w:eastAsia="Arial" w:cs="Arial"/>
           <w:b/>
           <w:caps/>
+          <w:color w:val="000000"/>
           <w:sz w:val="24"/>
         </w:rPr>
         <w:t>IMPLICAÇÕES PRÁTICAS</w:t>
@@ -6605,6 +6797,7 @@
       <w:r>
         <w:rPr>
           <w:rFonts w:ascii="Arial" w:hAnsi="Arial" w:eastAsia="Arial" w:cs="Arial"/>
+          <w:color w:val="000000"/>
           <w:sz w:val="24"/>
         </w:rPr>
         <w:t>Placeholder protegido: não antecipar implicações sem resultados revisados.</w:t>
@@ -6624,6 +6817,7 @@
           <w:rFonts w:ascii="Arial" w:hAnsi="Arial" w:eastAsia="Arial" w:cs="Arial"/>
           <w:b/>
           <w:caps/>
+          <w:color w:val="000000"/>
           <w:sz w:val="28"/>
         </w:rPr>
         <w:t>CONSIDERAÇÕES FINAIS</w:t>
@@ -6644,6 +6838,7 @@
           <w:rFonts w:ascii="Arial" w:hAnsi="Arial" w:eastAsia="Arial" w:cs="Arial"/>
           <w:b/>
           <w:caps/>
+          <w:color w:val="000000"/>
           <w:sz w:val="24"/>
         </w:rPr>
         <w:t>CONCLUSÕES</w:t>
@@ -6657,6 +6852,7 @@
       <w:r>
         <w:rPr>
           <w:rFonts w:ascii="Arial" w:hAnsi="Arial" w:eastAsia="Arial" w:cs="Arial"/>
+          <w:color w:val="000000"/>
           <w:sz w:val="24"/>
         </w:rPr>
         <w:t>Placeholder protegido: responder à pergunta de pesquisa somente após os experimentos.</w:t>
@@ -6676,6 +6872,7 @@
           <w:rFonts w:ascii="Arial" w:hAnsi="Arial" w:eastAsia="Arial" w:cs="Arial"/>
           <w:b/>
           <w:caps/>
+          <w:color w:val="000000"/>
           <w:sz w:val="24"/>
         </w:rPr>
         <w:t>CONTRIBUIÇÕES DO TRABALHO</w:t>
@@ -6689,6 +6886,7 @@
       <w:r>
         <w:rPr>
           <w:rFonts w:ascii="Arial" w:hAnsi="Arial" w:eastAsia="Arial" w:cs="Arial"/>
+          <w:color w:val="000000"/>
           <w:sz w:val="24"/>
         </w:rPr>
         <w:t>Placeholder protegido: consolidar apenas contribuições sustentadas pelas evidências.</w:t>
@@ -6708,6 +6906,7 @@
           <w:rFonts w:ascii="Arial" w:hAnsi="Arial" w:eastAsia="Arial" w:cs="Arial"/>
           <w:b/>
           <w:caps/>
+          <w:color w:val="000000"/>
           <w:sz w:val="24"/>
         </w:rPr>
         <w:t>TRABALHOS FUTUROS</w:t>
@@ -6721,6 +6920,7 @@
       <w:r>
         <w:rPr>
           <w:rFonts w:ascii="Arial" w:hAnsi="Arial" w:eastAsia="Arial" w:cs="Arial"/>
+          <w:color w:val="000000"/>
           <w:sz w:val="24"/>
         </w:rPr>
         <w:t>Placeholder protegido: definir após discussão das limitações e resultados.</w:t>
@@ -6737,6 +6937,7 @@
           <w:rFonts w:ascii="Arial" w:hAnsi="Arial" w:eastAsia="Arial" w:cs="Arial"/>
           <w:b/>
           <w:caps/>
+          <w:color w:val="000000"/>
           <w:sz w:val="28"/>
         </w:rPr>
         <w:t>REFERÊNCIAS</w:t>
@@ -6751,6 +6952,7 @@
       <w:r>
         <w:rPr>
           <w:rFonts w:ascii="Arial" w:hAnsi="Arial" w:eastAsia="Arial" w:cs="Arial"/>
+          <w:color w:val="000000"/>
           <w:sz w:val="24"/>
         </w:rPr>
         <w:t>ADA HEALTH. Health. Powered by Ada. Disponível em: https://ada.com/. Acesso em: 11 maio 2026.</w:t>
@@ -6764,6 +6966,7 @@
       <w:r>
         <w:rPr>
           <w:rFonts w:ascii="Arial" w:hAnsi="Arial" w:eastAsia="Arial" w:cs="Arial"/>
+          <w:color w:val="000000"/>
           <w:sz w:val="24"/>
         </w:rPr>
         <w:t xml:space="preserve">ALVAREZ, Goar </w:t>
@@ -6773,6 +6976,7 @@
           <w:rFonts w:ascii="Arial" w:hAnsi="Arial" w:eastAsia="Arial" w:cs="Arial"/>
           <w:i w:val="1"/>
           <w:iCs w:val="1"/>
+          <w:color w:val="000000"/>
           <w:sz w:val="24"/>
         </w:rPr>
         <w:t>et al.</w:t>
@@ -6780,6 +6984,7 @@
       <w:r>
         <w:rPr>
           <w:rFonts w:ascii="Arial" w:hAnsi="Arial" w:eastAsia="Arial" w:cs="Arial"/>
+          <w:color w:val="000000"/>
           <w:sz w:val="24"/>
         </w:rPr>
         <w:t xml:space="preserve"> Community pharmacy working conditions: is stress impacting patient care? Exploratory Research in Clinical and Social Pharmacy, [S. l.], v. 20, art. 100641, 2025. DOI: 10.1016/j.rcsop.2025.100641. Disponível em: https://www.sciencedirect.com/science/article/pii/S2667276625000824. Acesso em: 30 mar. 2026.</w:t>
@@ -6793,6 +6998,7 @@
       <w:r>
         <w:rPr>
           <w:rFonts w:ascii="Arial" w:hAnsi="Arial" w:eastAsia="Arial" w:cs="Arial"/>
+          <w:color w:val="000000"/>
           <w:sz w:val="24"/>
         </w:rPr>
         <w:t>AMAZON. Pharmacy AI Assistant FAQs. Disponível em: https://www.amazon.com/gp/help/customer/display.html?nodeId=TUr5MrIi8Cltxsx4cQ. Acesso em: 11 maio 2026.</w:t>
@@ -6806,6 +7012,7 @@
       <w:r>
         <w:rPr>
           <w:rFonts w:ascii="Arial" w:hAnsi="Arial" w:eastAsia="Arial" w:cs="Arial"/>
+          <w:color w:val="000000"/>
           <w:sz w:val="24"/>
         </w:rPr>
         <w:t>AMAZON SCIENCE. The life of a prescription at Amazon Pharmacy. Disponível em: https://www.amazon.science/blog/the-life-of-a-prescription-at-amazon-pharmacy. Acesso em: 11 maio 2026.</w:t>
@@ -6819,6 +7026,7 @@
       <w:r>
         <w:rPr>
           <w:rFonts w:ascii="Arial" w:hAnsi="Arial" w:eastAsia="Arial" w:cs="Arial"/>
+          <w:color w:val="000000"/>
           <w:sz w:val="24"/>
         </w:rPr>
         <w:t>ANTHROPIC. Building effective AI agents. 2024. Disponível em: https://www.anthropic.com/research/building-effective-agents. Acesso em: 20 mar. 2026.</w:t>
@@ -6832,6 +7040,7 @@
       <w:r>
         <w:rPr>
           <w:rFonts w:ascii="Arial" w:hAnsi="Arial" w:eastAsia="Arial" w:cs="Arial"/>
+          <w:color w:val="000000"/>
           <w:sz w:val="24"/>
         </w:rPr>
         <w:t xml:space="preserve">BALAPRAKASH, Prasanna </w:t>
@@ -6841,6 +7050,7 @@
           <w:rFonts w:ascii="Arial" w:hAnsi="Arial" w:eastAsia="Arial" w:cs="Arial"/>
           <w:i w:val="1"/>
           <w:iCs w:val="1"/>
+          <w:color w:val="000000"/>
           <w:sz w:val="24"/>
         </w:rPr>
         <w:t>et al.</w:t>
@@ -6848,6 +7058,7 @@
       <w:r>
         <w:rPr>
           <w:rFonts w:ascii="Arial" w:hAnsi="Arial" w:eastAsia="Arial" w:cs="Arial"/>
+          <w:color w:val="000000"/>
           <w:sz w:val="24"/>
         </w:rPr>
         <w:t xml:space="preserve"> SWARM: reimagining scientific workflow management systems in a distributed world. International Journal of High Performance Computing Applications, [S. l.], v. 39, n. 5, p. 692-712, 2025. DOI: 10.1177/10943420251339317. Disponível em: https://doi.org/10.1177/10943420251339317. Acesso em: 30 mar. 2026.</w:t>
@@ -6861,6 +7072,7 @@
       <w:r>
         <w:rPr>
           <w:rFonts w:ascii="Arial" w:hAnsi="Arial" w:eastAsia="Arial" w:cs="Arial"/>
+          <w:color w:val="000000"/>
           <w:sz w:val="24"/>
         </w:rPr>
         <w:t xml:space="preserve">BUESING, Eric </w:t>
@@ -6870,6 +7082,7 @@
           <w:rFonts w:ascii="Arial" w:hAnsi="Arial" w:eastAsia="Arial" w:cs="Arial"/>
           <w:i w:val="1"/>
           <w:iCs w:val="1"/>
+          <w:color w:val="000000"/>
           <w:sz w:val="24"/>
         </w:rPr>
         <w:t>et al.</w:t>
@@ -6877,6 +7090,7 @@
       <w:r>
         <w:rPr>
           <w:rFonts w:ascii="Arial" w:hAnsi="Arial" w:eastAsia="Arial" w:cs="Arial"/>
+          <w:color w:val="000000"/>
           <w:sz w:val="24"/>
         </w:rPr>
         <w:t xml:space="preserve"> Where is customer care in 2024? [S. l.]: McKinsey &amp; Company, 2024. Disponível em: https://www.mckinsey.com/capabilities/operations/our-insights/where-is-customer-care-in-2024. Acesso em: 30 mar. 2026.</w:t>
@@ -6890,6 +7104,7 @@
       <w:r>
         <w:rPr>
           <w:rFonts w:ascii="Arial" w:hAnsi="Arial" w:eastAsia="Arial" w:cs="Arial"/>
+          <w:color w:val="000000"/>
           <w:sz w:val="24"/>
         </w:rPr>
         <w:t>FIP. An artificial intelligence toolkit for pharmacy: an introduction and resource guide for pharmacists. The Hague: International Pharmaceutical Federation, 2025. Disponível em: https://www.fip.org/file/6202. Acesso em: 30 mar. 2026.</w:t>
@@ -6903,6 +7118,7 @@
       <w:r>
         <w:rPr>
           <w:rFonts w:ascii="Arial" w:hAnsi="Arial" w:eastAsia="Arial" w:cs="Arial"/>
+          <w:color w:val="000000"/>
           <w:sz w:val="24"/>
         </w:rPr>
         <w:t xml:space="preserve">HAMMOND, Lewis </w:t>
@@ -6912,6 +7128,7 @@
           <w:rFonts w:ascii="Arial" w:hAnsi="Arial" w:eastAsia="Arial" w:cs="Arial"/>
           <w:i w:val="1"/>
           <w:iCs w:val="1"/>
+          <w:color w:val="000000"/>
           <w:sz w:val="24"/>
         </w:rPr>
         <w:t>et al.</w:t>
@@ -6919,6 +7136,7 @@
       <w:r>
         <w:rPr>
           <w:rFonts w:ascii="Arial" w:hAnsi="Arial" w:eastAsia="Arial" w:cs="Arial"/>
+          <w:color w:val="000000"/>
           <w:sz w:val="24"/>
         </w:rPr>
         <w:t xml:space="preserve"> Multi-Agent Risks from Advanced AI. arXiv:2502.14143, 2025. Disponível em: https://arxiv.org/abs/2502.14143. Acesso em: 16 ago. 2026.</w:t>
@@ -6932,6 +7150,7 @@
       <w:r>
         <w:rPr>
           <w:rFonts w:ascii="Arial" w:hAnsi="Arial" w:eastAsia="Arial" w:cs="Arial"/>
+          <w:color w:val="000000"/>
           <w:sz w:val="24"/>
         </w:rPr>
         <w:t xml:space="preserve">HATZIMANOLIS, Andrew </w:t>
@@ -6941,6 +7160,7 @@
           <w:rFonts w:ascii="Arial" w:hAnsi="Arial" w:eastAsia="Arial" w:cs="Arial"/>
           <w:i w:val="1"/>
           <w:iCs w:val="1"/>
+          <w:color w:val="000000"/>
           <w:sz w:val="24"/>
         </w:rPr>
         <w:t>et al.</w:t>
@@ -6948,6 +7168,7 @@
       <w:r>
         <w:rPr>
           <w:rFonts w:ascii="Arial" w:hAnsi="Arial" w:eastAsia="Arial" w:cs="Arial"/>
+          <w:color w:val="000000"/>
           <w:sz w:val="24"/>
         </w:rPr>
         <w:t xml:space="preserve"> Applications of artificial intelligence in current pharmacy practice: a scoping review. Research in Social and Administrative Pharmacy, [S. l.], v. 21, n. 3, p. 134-141, 2025. DOI: 10.1016/j.sapharm.2024.12.007. Disponível em: https://doi.org/10.1016/j.sapharm.2024.12.007. Acesso em: 30 mar. 2026.</w:t>
@@ -6961,6 +7182,7 @@
       <w:r>
         <w:rPr>
           <w:rFonts w:ascii="Arial" w:hAnsi="Arial" w:eastAsia="Arial" w:cs="Arial"/>
+          <w:color w:val="000000"/>
           <w:sz w:val="24"/>
         </w:rPr>
         <w:t>INFERMEDICA. Symptom Checker. Disponível em: https://infermedica.com/product/symptom-checker. Acesso em: 11 maio 2026.</w:t>
@@ -6974,6 +7196,7 @@
       <w:r>
         <w:rPr>
           <w:rFonts w:ascii="Arial" w:hAnsi="Arial" w:eastAsia="Arial" w:cs="Arial"/>
+          <w:color w:val="000000"/>
           <w:sz w:val="24"/>
         </w:rPr>
         <w:t>INTERCOM. Fin AI Agent explained. Disponível em: https://www.intercom.com/help/en/articles/7120684-fin-ai-agent-explained. Acesso em: 11 maio 2026.</w:t>
@@ -6987,6 +7210,7 @@
       <w:r>
         <w:rPr>
           <w:rFonts w:ascii="Arial" w:hAnsi="Arial" w:eastAsia="Arial" w:cs="Arial"/>
+          <w:color w:val="000000"/>
           <w:sz w:val="24"/>
         </w:rPr>
         <w:t>JAGATAP, Akshay; MERUGU, Srujana; COMAR, Prakash Mandayam. RxLens: Multi-Agent LLM-powered Scan and Order for Pharmacy. In: Proceedings of the 2025 Conference of the Nations of the Americas Chapter of the Association for Computational Linguistics: Human Language Technologies, 2025, Albuquerque. [S. l.]: Association for Computational Linguistics, 2025. p. 822-832. DOI: 10.18653/v1/2025.naacl-industry.63.</w:t>
@@ -7000,6 +7224,7 @@
       <w:r>
         <w:rPr>
           <w:rFonts w:ascii="Arial" w:hAnsi="Arial" w:eastAsia="Arial" w:cs="Arial"/>
+          <w:color w:val="000000"/>
           <w:sz w:val="24"/>
         </w:rPr>
         <w:t xml:space="preserve">KIM, Yubin </w:t>
@@ -7009,6 +7234,7 @@
           <w:rFonts w:ascii="Arial" w:hAnsi="Arial" w:eastAsia="Arial" w:cs="Arial"/>
           <w:i w:val="1"/>
           <w:iCs w:val="1"/>
+          <w:color w:val="000000"/>
           <w:sz w:val="24"/>
         </w:rPr>
         <w:t>et al.</w:t>
@@ -7016,6 +7242,7 @@
       <w:r>
         <w:rPr>
           <w:rFonts w:ascii="Arial" w:hAnsi="Arial" w:eastAsia="Arial" w:cs="Arial"/>
+          <w:color w:val="000000"/>
           <w:sz w:val="24"/>
         </w:rPr>
         <w:t xml:space="preserve"> Capable language models can outgrow the benefits of collaboration. Nature Machine Intelligence, [S. l.], v. 8, p. 1157-1172, 2026. DOI: 10.1038/s42256-026-01268-y. Disponível em: https://doi.org/10.1038/s42256-026-01268-y. Acesso em: 16 ago. 2026.</w:t>
@@ -7029,6 +7256,7 @@
       <w:r>
         <w:rPr>
           <w:rFonts w:ascii="Arial" w:hAnsi="Arial" w:eastAsia="Arial" w:cs="Arial"/>
+          <w:color w:val="000000"/>
           <w:sz w:val="24"/>
         </w:rPr>
         <w:t xml:space="preserve">LI, Xinyi </w:t>
@@ -7038,6 +7266,7 @@
           <w:rFonts w:ascii="Arial" w:hAnsi="Arial" w:eastAsia="Arial" w:cs="Arial"/>
           <w:i w:val="1"/>
           <w:iCs w:val="1"/>
+          <w:color w:val="000000"/>
           <w:sz w:val="24"/>
         </w:rPr>
         <w:t>et al.</w:t>
@@ -7045,6 +7274,7 @@
       <w:r>
         <w:rPr>
           <w:rFonts w:ascii="Arial" w:hAnsi="Arial" w:eastAsia="Arial" w:cs="Arial"/>
+          <w:color w:val="000000"/>
           <w:sz w:val="24"/>
         </w:rPr>
         <w:t xml:space="preserve"> A survey on LLM-based multi-agent systems: workflow, infrastructure, and challenges. Vicinagearth, [S. l.], v. 1, art. 9, 2024. DOI: 10.1007/s44336-024-00009-2. Disponível em: https://link.springer.com/article/10.1007/s44336-024-00009-2. Acesso em: 30 mar. 2026.</w:t>
@@ -7058,6 +7288,7 @@
       <w:r>
         <w:rPr>
           <w:rFonts w:ascii="Arial" w:hAnsi="Arial" w:eastAsia="Arial" w:cs="Arial"/>
+          <w:color w:val="000000"/>
           <w:sz w:val="24"/>
         </w:rPr>
         <w:t>MCKINSEY &amp; COMPANY. The state of AI in early 2024: gen AI adoption spikes and starts to generate value. [S. l.], 2024. Disponível em: https://www.mckinsey.com/capabilities/quantumblack/our-insights/the-state-of-ai-2024. Acesso em: 30 mar. 2026.</w:t>
@@ -7071,6 +7302,7 @@
       <w:r>
         <w:rPr>
           <w:rFonts w:ascii="Arial" w:hAnsi="Arial" w:eastAsia="Arial" w:cs="Arial"/>
+          <w:color w:val="000000"/>
           <w:sz w:val="24"/>
         </w:rPr>
         <w:t>PGEU. Position paper on artificial intelligence. Brussels: Pharmaceutical Group of the European Union, 2025. Disponível em: https://www.pgeu.eu/wp-content/uploads/2025/06/PGEU-Position-Paper-on-Artificial-Intelligence.pdf. Acesso em: 30 mar. 2026.</w:t>
@@ -7084,6 +7316,7 @@
       <w:r>
         <w:rPr>
           <w:rFonts w:ascii="Arial" w:hAnsi="Arial" w:eastAsia="Arial" w:cs="Arial"/>
+          <w:color w:val="000000"/>
           <w:sz w:val="24"/>
         </w:rPr>
         <w:t xml:space="preserve">PICCIALLI, Francesco </w:t>
@@ -7093,6 +7326,7 @@
           <w:rFonts w:ascii="Arial" w:hAnsi="Arial" w:eastAsia="Arial" w:cs="Arial"/>
           <w:i w:val="1"/>
           <w:iCs w:val="1"/>
+          <w:color w:val="000000"/>
           <w:sz w:val="24"/>
         </w:rPr>
         <w:t>et al.</w:t>
@@ -7100,6 +7334,7 @@
       <w:r>
         <w:rPr>
           <w:rFonts w:ascii="Arial" w:hAnsi="Arial" w:eastAsia="Arial" w:cs="Arial"/>
+          <w:color w:val="000000"/>
           <w:sz w:val="24"/>
         </w:rPr>
         <w:t xml:space="preserve"> AgentAI: a comprehensive survey on autonomous agents in distributed AI for industry 4.0. Expert Systems with Applications, [S. l.], v. 291, art. 128404, 2025. DOI: 10.1016/j.eswa.2025.128404. Disponível em: https://doi.org/10.1016/j.eswa.2025.128404. Acesso em: 16 ago. 2026.</w:t>
@@ -7113,6 +7348,7 @@
       <w:r>
         <w:rPr>
           <w:rFonts w:ascii="Arial" w:hAnsi="Arial" w:eastAsia="Arial" w:cs="Arial"/>
+          <w:color w:val="000000"/>
           <w:sz w:val="24"/>
         </w:rPr>
         <w:t>SALESFORCE. AI Customer Service Agents. Disponível em: https://www.salesforce.com/service/ai/customer-service-agents/. Acesso em: 11 maio 2026.</w:t>
@@ -7126,6 +7362,7 @@
       <w:r>
         <w:rPr>
           <w:rFonts w:ascii="Arial" w:hAnsi="Arial" w:eastAsia="Arial" w:cs="Arial"/>
+          <w:color w:val="000000"/>
           <w:sz w:val="24"/>
         </w:rPr>
         <w:t>STANFORD HAI. AI Index Report 2025. Stanford: Stanford Institute for Human-Centered Artificial Intelligence, 2025. Disponível em: https://hai.stanford.edu/ai-index. Acesso em: 30 mar. 2026.</w:t>
@@ -7139,6 +7376,7 @@
       <w:r>
         <w:rPr>
           <w:rFonts w:ascii="Arial" w:hAnsi="Arial" w:eastAsia="Arial" w:cs="Arial"/>
+          <w:color w:val="000000"/>
           <w:sz w:val="24"/>
         </w:rPr>
         <w:t>WHO EUROPE. Advancing the role of pharmacists to meet changing patient and health system needs. Copenhagen: World Health Organization Regional Office for Europe, 2024. Disponível em: https://www.who.int/belgium/feature-stories/item/advancing-the-role-of-pharmacists-to-meet-changing-patient-and-health-system-needs. Acesso em: 16 ago. 2026.</w:t>
@@ -7152,6 +7390,7 @@
       <w:r>
         <w:rPr>
           <w:rFonts w:ascii="Arial" w:hAnsi="Arial" w:eastAsia="Arial" w:cs="Arial"/>
+          <w:color w:val="000000"/>
           <w:sz w:val="24"/>
         </w:rPr>
         <w:t xml:space="preserve">YU, Chaojia </w:t>
@@ -7161,6 +7400,7 @@
           <w:rFonts w:ascii="Arial" w:hAnsi="Arial" w:eastAsia="Arial" w:cs="Arial"/>
           <w:i w:val="1"/>
           <w:iCs w:val="1"/>
+          <w:color w:val="000000"/>
           <w:sz w:val="24"/>
         </w:rPr>
         <w:t>et al.</w:t>
@@ -7168,6 +7408,7 @@
       <w:r>
         <w:rPr>
           <w:rFonts w:ascii="Arial" w:hAnsi="Arial" w:eastAsia="Arial" w:cs="Arial"/>
+          <w:color w:val="000000"/>
           <w:sz w:val="24"/>
         </w:rPr>
         <w:t xml:space="preserve"> A survey on agent workflow: status and future. In: 2025 8th International Conference on Artificial Intelligence and Big Data (ICAIBD), 2025, Chengdu. [S. l.]: IEEE, 2025. p. 770-781. DOI: 10.1109/ICAIBD64986.2025.11082076. Disponível em: https://doi.org/10.1109/ICAIBD64986.2025.11082076. Acesso em: 30 mar. 2026.</w:t>
@@ -7181,6 +7422,7 @@
       <w:r>
         <w:rPr>
           <w:rFonts w:ascii="Arial" w:hAnsi="Arial" w:eastAsia="Arial" w:cs="Arial"/>
+          <w:color w:val="000000"/>
           <w:sz w:val="24"/>
         </w:rPr>
         <w:t>ZENDESK. About AI agents. Disponível em: https://support.zendesk.com/hc/en-us/articles/6970583409690-About-AI-agents. Acesso em: 11 maio 2026.</w:t>

</xml_diff>

<commit_message>
docs(tcc): ajustar espaçamento, estrangeirismos e referências
</commit_message>
<xml_diff>
--- a/TCC/TCC_MAB_Facens_Ralph_10x.docx
+++ b/TCC/TCC_MAB_Facens_Ralph_10x.docx
@@ -572,7 +572,27 @@
             <w:u w:val="none"/>
             <w:sz w:val="24"/>
           </w:rPr>
-          <w:t>2.2 LARGE LANGUAGE MODELS E AGENTES INTELIGENTES</w:t>
+          <w:t xml:space="preserve">2.2 </w:t>
+        </w:r>
+        <w:r>
+          <w:rPr>
+            <w:rFonts w:ascii="Arial" w:hAnsi="Arial" w:eastAsia="Arial" w:cs="Arial"/>
+            <w:color w:val="000000"/>
+            <w:u w:val="none"/>
+            <w:sz w:val="24"/>
+            <w:i w:val="1"/>
+            <w:iCs w:val="1"/>
+          </w:rPr>
+          <w:t>LARGE LANGUAGE MODELS</w:t>
+        </w:r>
+        <w:r>
+          <w:rPr>
+            <w:rFonts w:ascii="Arial" w:hAnsi="Arial" w:eastAsia="Arial" w:cs="Arial"/>
+            <w:color w:val="000000"/>
+            <w:u w:val="none"/>
+            <w:sz w:val="24"/>
+          </w:rPr>
+          <w:t xml:space="preserve"> E AGENTES INTELIGENTES</w:t>
         </w:r>
       </w:hyperlink>
       <w:r>
@@ -942,7 +962,27 @@
             <w:u w:val="none"/>
             <w:sz w:val="24"/>
           </w:rPr>
-          <w:t>2.4.2 WORKFLOW ESTRUTURADO</w:t>
+          <w:t xml:space="preserve">2.4.2 </w:t>
+        </w:r>
+        <w:r>
+          <w:rPr>
+            <w:rFonts w:ascii="Arial" w:hAnsi="Arial" w:eastAsia="Arial" w:cs="Arial"/>
+            <w:color w:val="000000"/>
+            <w:u w:val="none"/>
+            <w:sz w:val="24"/>
+            <w:i w:val="1"/>
+            <w:iCs w:val="1"/>
+          </w:rPr>
+          <w:t>WORKFLOW</w:t>
+        </w:r>
+        <w:r>
+          <w:rPr>
+            <w:rFonts w:ascii="Arial" w:hAnsi="Arial" w:eastAsia="Arial" w:cs="Arial"/>
+            <w:color w:val="000000"/>
+            <w:u w:val="none"/>
+            <w:sz w:val="24"/>
+          </w:rPr>
+          <w:t xml:space="preserve"> ESTRUTURADO</w:t>
         </w:r>
       </w:hyperlink>
       <w:r>
@@ -979,7 +1019,27 @@
             <w:u w:val="none"/>
             <w:sz w:val="24"/>
           </w:rPr>
-          <w:t>2.4.3 SISTEMAS DESCENTRALIZADOS (SWARM)</w:t>
+          <w:t>2.4.3 SISTEMAS DESCENTRALIZADOS (</w:t>
+        </w:r>
+        <w:r>
+          <w:rPr>
+            <w:rFonts w:ascii="Arial" w:hAnsi="Arial" w:eastAsia="Arial" w:cs="Arial"/>
+            <w:color w:val="000000"/>
+            <w:u w:val="none"/>
+            <w:sz w:val="24"/>
+            <w:i w:val="1"/>
+            <w:iCs w:val="1"/>
+          </w:rPr>
+          <w:t>SWARM</w:t>
+        </w:r>
+        <w:r>
+          <w:rPr>
+            <w:rFonts w:ascii="Arial" w:hAnsi="Arial" w:eastAsia="Arial" w:cs="Arial"/>
+            <w:color w:val="000000"/>
+            <w:u w:val="none"/>
+            <w:sz w:val="24"/>
+          </w:rPr>
+          <w:t>)</w:t>
         </w:r>
       </w:hyperlink>
       <w:r>
@@ -1037,7 +1097,7 @@
             <w:u w:val="none"/>
             <w:sz w:val="24"/>
           </w:rPr>
-          <w:t>14</w:t>
+          <w:t>15</w:t>
         </w:r>
       </w:hyperlink>
     </w:p>
@@ -1074,7 +1134,7 @@
             <w:u w:val="none"/>
             <w:sz w:val="24"/>
           </w:rPr>
-          <w:t>16</w:t>
+          <w:t>17</w:t>
         </w:r>
       </w:hyperlink>
     </w:p>
@@ -1111,7 +1171,7 @@
             <w:u w:val="none"/>
             <w:sz w:val="24"/>
           </w:rPr>
-          <w:t>16</w:t>
+          <w:t>17</w:t>
         </w:r>
       </w:hyperlink>
     </w:p>
@@ -2467,6 +2527,7 @@
           <w:ilvl w:val="0"/>
           <w:numId w:val="10"/>
         </w:numPr>
+        <w:spacing w:before="0" w:after="360"/>
       </w:pPr>
       <w:bookmarkStart w:id="1000" w:name="_TCC_H_1000"/>
       <w:r>
@@ -2500,7 +2561,43 @@
           <w:color w:val="000000"/>
           <w:sz w:val="24"/>
         </w:rPr>
-        <w:t xml:space="preserve">Esse movimento favoreceu o desenvolvimento de sistemas capazes de interpretar solicitações em linguagem natural, acionar ferramentas, estruturar subtarefas e apoiar fluxos de atendimento de maneira mais eficiente. No campo de customer care e service operations, a literatura recente mostra que a IA vem sendo incorporada justamente em cenários marcados por alto volume de interações, pressão por rapidez e necessidade de reorganização contínua dos processos de atendimento (BUESING </w:t>
+        <w:t xml:space="preserve">Esse movimento favoreceu o desenvolvimento de sistemas capazes de interpretar solicitações em linguagem natural, acionar ferramentas, estruturar subtarefas e apoiar fluxos de atendimento de maneira mais eficiente. No campo de </w:t>
+      </w:r>
+      <w:r>
+        <w:rPr>
+          <w:rFonts w:ascii="Arial" w:hAnsi="Arial" w:eastAsia="Arial" w:cs="Arial"/>
+          <w:color w:val="000000"/>
+          <w:sz w:val="24"/>
+          <w:i w:val="1"/>
+          <w:iCs w:val="1"/>
+        </w:rPr>
+        <w:t>customer care</w:t>
+      </w:r>
+      <w:r>
+        <w:rPr>
+          <w:rFonts w:ascii="Arial" w:hAnsi="Arial" w:eastAsia="Arial" w:cs="Arial"/>
+          <w:color w:val="000000"/>
+          <w:sz w:val="24"/>
+        </w:rPr>
+        <w:t xml:space="preserve"> e </w:t>
+      </w:r>
+      <w:r>
+        <w:rPr>
+          <w:rFonts w:ascii="Arial" w:hAnsi="Arial" w:eastAsia="Arial" w:cs="Arial"/>
+          <w:color w:val="000000"/>
+          <w:sz w:val="24"/>
+          <w:i w:val="1"/>
+          <w:iCs w:val="1"/>
+        </w:rPr>
+        <w:t>service operations</w:t>
+      </w:r>
+      <w:r>
+        <w:rPr>
+          <w:rFonts w:ascii="Arial" w:hAnsi="Arial" w:eastAsia="Arial" w:cs="Arial"/>
+          <w:color w:val="000000"/>
+          <w:sz w:val="24"/>
+        </w:rPr>
+        <w:t xml:space="preserve">, a literatura recente mostra que a IA vem sendo incorporada justamente em cenários marcados por alto volume de interações, pressão por rapidez e necessidade de reorganização contínua dos processos de atendimento (BUESING </w:t>
       </w:r>
       <w:r>
         <w:rPr>
@@ -2623,7 +2720,43 @@
           <w:color w:val="000000"/>
           <w:sz w:val="24"/>
         </w:rPr>
-        <w:t>Diante desse contexto, foi desenvolvido o MAB (multi agent benchmark), uma plataforma para comparação de sistemas multiagente, inicialmente aplicada no atendimento inteligente em farmácias, com foco na análise comparativa de diferentes arquiteturas de coordenação. A proposta contempla três abordagens distintas de coordenação entre agentes: orquestração centralizada, workflow estruturado e organização descentralizada. A análise detalhada dessas arquiteturas é apresentada no referencial teórico.</w:t>
+        <w:t xml:space="preserve">Diante desse contexto, foi desenvolvido o MAB (multi agent </w:t>
+      </w:r>
+      <w:r>
+        <w:rPr>
+          <w:rFonts w:ascii="Arial" w:hAnsi="Arial" w:eastAsia="Arial" w:cs="Arial"/>
+          <w:color w:val="000000"/>
+          <w:sz w:val="24"/>
+          <w:i w:val="1"/>
+          <w:iCs w:val="1"/>
+        </w:rPr>
+        <w:t>benchmark</w:t>
+      </w:r>
+      <w:r>
+        <w:rPr>
+          <w:rFonts w:ascii="Arial" w:hAnsi="Arial" w:eastAsia="Arial" w:cs="Arial"/>
+          <w:color w:val="000000"/>
+          <w:sz w:val="24"/>
+        </w:rPr>
+        <w:t xml:space="preserve">), uma plataforma para comparação de sistemas multiagente, inicialmente aplicada no atendimento inteligente em farmácias, com foco na análise comparativa de diferentes arquiteturas de coordenação. A proposta contempla três abordagens distintas de coordenação entre agentes: orquestração centralizada, </w:t>
+      </w:r>
+      <w:r>
+        <w:rPr>
+          <w:rFonts w:ascii="Arial" w:hAnsi="Arial" w:eastAsia="Arial" w:cs="Arial"/>
+          <w:color w:val="000000"/>
+          <w:sz w:val="24"/>
+          <w:i w:val="1"/>
+          <w:iCs w:val="1"/>
+        </w:rPr>
+        <w:t>workflow</w:t>
+      </w:r>
+      <w:r>
+        <w:rPr>
+          <w:rFonts w:ascii="Arial" w:hAnsi="Arial" w:eastAsia="Arial" w:cs="Arial"/>
+          <w:color w:val="000000"/>
+          <w:sz w:val="24"/>
+        </w:rPr>
+        <w:t xml:space="preserve"> estruturado e organização descentralizada. A análise detalhada dessas arquiteturas é apresentada no referencial teórico.</w:t>
       </w:r>
     </w:p>
     <w:p>
@@ -2699,7 +2832,43 @@
           <w:color w:val="000000"/>
           <w:sz w:val="24"/>
         </w:rPr>
-        <w:t xml:space="preserve">A problematização central da pesquisa consiste em investigar como diferentes arquiteturas multiagentes influenciam o desempenho de um sistema de atendimento em farmácias. Para isso, serão comparados modelos baseados em orquestração, workflow e swarm, com observação do tempo de resposta, da distribuição de tarefas entre agentes, da taxa de sucesso técnico, do uso de recursos, da qualidade das respostas e da necessidade de intervenção humana. Nessa perspectiva, a arquitetura de coordenação é tratada não como mero detalhe técnico, mas como elemento capaz de alterar o comportamento global do sistema (LI </w:t>
+        <w:t xml:space="preserve">A problematização central da pesquisa consiste em investigar como diferentes arquiteturas multiagentes influenciam o desempenho de um sistema de atendimento em farmácias. Para isso, serão comparados modelos baseados em orquestração, </w:t>
+      </w:r>
+      <w:r>
+        <w:rPr>
+          <w:rFonts w:ascii="Arial" w:hAnsi="Arial" w:eastAsia="Arial" w:cs="Arial"/>
+          <w:color w:val="000000"/>
+          <w:sz w:val="24"/>
+          <w:i w:val="1"/>
+          <w:iCs w:val="1"/>
+        </w:rPr>
+        <w:t>workflow</w:t>
+      </w:r>
+      <w:r>
+        <w:rPr>
+          <w:rFonts w:ascii="Arial" w:hAnsi="Arial" w:eastAsia="Arial" w:cs="Arial"/>
+          <w:color w:val="000000"/>
+          <w:sz w:val="24"/>
+        </w:rPr>
+        <w:t xml:space="preserve"> e </w:t>
+      </w:r>
+      <w:r>
+        <w:rPr>
+          <w:rFonts w:ascii="Arial" w:hAnsi="Arial" w:eastAsia="Arial" w:cs="Arial"/>
+          <w:color w:val="000000"/>
+          <w:sz w:val="24"/>
+          <w:i w:val="1"/>
+          <w:iCs w:val="1"/>
+        </w:rPr>
+        <w:t>swarm</w:t>
+      </w:r>
+      <w:r>
+        <w:rPr>
+          <w:rFonts w:ascii="Arial" w:hAnsi="Arial" w:eastAsia="Arial" w:cs="Arial"/>
+          <w:color w:val="000000"/>
+          <w:sz w:val="24"/>
+        </w:rPr>
+        <w:t xml:space="preserve">, com observação do tempo de resposta, da distribuição de tarefas entre agentes, da taxa de sucesso técnico, do uso de recursos, da qualidade das respostas e da necessidade de intervenção humana. Nessa perspectiva, a arquitetura de coordenação é tratada não como mero detalhe técnico, mas como elemento capaz de alterar o comportamento global do sistema (LI </w:t>
       </w:r>
       <w:r>
         <w:rPr>
@@ -2768,7 +2937,25 @@
           <w:color w:val="000000"/>
           <w:sz w:val="24"/>
         </w:rPr>
-        <w:t>Quanto à metodologia, está sendo realizada uma pesquisa bibliográfica e experimental. O levantamento teórico abrange inteligência artificial, sistemas multiagentes, arquiteturas de coordenação, workflows de agentes e aplicações de IA no contexto farmacêutico. Em seguida, foi modelada e implementada uma arquitetura experimental composta por ponto de entrada das solicitações, agentes especializados, ferramentas, integração com serviços externos e possibilidade de supervisão humana. Os experimentos comparativos ainda serão conduzidos após o congelamento do protocolo, utilizando métricas de eficiência, coordenação, qualidade e necessidade de intervenção humana.</w:t>
+        <w:t xml:space="preserve">Quanto à metodologia, está sendo realizada uma pesquisa bibliográfica e experimental. O levantamento teórico abrange inteligência artificial, sistemas multiagentes, arquiteturas de coordenação, </w:t>
+      </w:r>
+      <w:r>
+        <w:rPr>
+          <w:rFonts w:ascii="Arial" w:hAnsi="Arial" w:eastAsia="Arial" w:cs="Arial"/>
+          <w:color w:val="000000"/>
+          <w:sz w:val="24"/>
+          <w:i w:val="1"/>
+          <w:iCs w:val="1"/>
+        </w:rPr>
+        <w:t>workflows</w:t>
+      </w:r>
+      <w:r>
+        <w:rPr>
+          <w:rFonts w:ascii="Arial" w:hAnsi="Arial" w:eastAsia="Arial" w:cs="Arial"/>
+          <w:color w:val="000000"/>
+          <w:sz w:val="24"/>
+        </w:rPr>
+        <w:t xml:space="preserve"> de agentes e aplicações de IA no contexto farmacêutico. Em seguida, foi modelada e implementada uma arquitetura experimental composta por ponto de entrada das solicitações, agentes especializados, ferramentas, integração com serviços externos e possibilidade de supervisão humana. Os experimentos comparativos ainda serão conduzidos após o congelamento do protocolo, utilizando métricas de eficiência, coordenação, qualidade e necessidade de intervenção humana.</w:t>
       </w:r>
     </w:p>
     <w:p>
@@ -2789,6 +2976,7 @@
           <w:ilvl w:val="0"/>
           <w:numId w:val="10"/>
         </w:numPr>
+        <w:spacing w:before="0" w:after="360"/>
       </w:pPr>
       <w:bookmarkStart w:id="1001" w:name="_TCC_H_1001"/>
       <w:r>
@@ -2810,6 +2998,7 @@
           <w:ilvl w:val="1"/>
           <w:numId w:val="10"/>
         </w:numPr>
+        <w:spacing w:before="0" w:after="360"/>
       </w:pPr>
       <w:bookmarkStart w:id="1002" w:name="_TCC_H_1002"/>
       <w:r>
@@ -2831,6 +3020,7 @@
           <w:ilvl w:val="2"/>
           <w:numId w:val="10"/>
         </w:numPr>
+        <w:spacing w:before="0" w:after="360"/>
       </w:pPr>
       <w:bookmarkStart w:id="1003" w:name="_TCC_H_1003"/>
       <w:r>
@@ -2853,7 +3043,25 @@
           <w:color w:val="000000"/>
           <w:sz w:val="24"/>
         </w:rPr>
-        <w:t>A inteligência artificial compreende métodos computacionais capazes de executar tarefas que exigem percepção, inferência, aprendizagem, planejamento ou produção de linguagem. No escopo deste trabalho, o interesse não está em reproduzir toda a amplitude do campo, mas em compreender sistemas que recebem uma solicitação em linguagem natural, selecionam ações, consultam fontes externas e produzem uma resposta. Essa delimitação diferencia o protótipo de um chatbot baseado apenas em respostas pré-programadas: o comportamento depende do contexto, das ferramentas disponíveis e da estratégia de coordenação definida para os agentes.</w:t>
+        <w:t xml:space="preserve">A inteligência artificial compreende métodos computacionais capazes de executar tarefas que exigem percepção, inferência, aprendizagem, planejamento ou produção de linguagem. No escopo deste trabalho, o interesse não está em reproduzir toda a amplitude do campo, mas em compreender sistemas que recebem uma solicitação em linguagem natural, selecionam ações, consultam fontes externas e produzem uma resposta. Essa delimitação diferencia o protótipo de um </w:t>
+      </w:r>
+      <w:r>
+        <w:rPr>
+          <w:rFonts w:ascii="Arial" w:hAnsi="Arial" w:eastAsia="Arial" w:cs="Arial"/>
+          <w:color w:val="000000"/>
+          <w:sz w:val="24"/>
+          <w:i w:val="1"/>
+          <w:iCs w:val="1"/>
+        </w:rPr>
+        <w:t>chatbot</w:t>
+      </w:r>
+      <w:r>
+        <w:rPr>
+          <w:rFonts w:ascii="Arial" w:hAnsi="Arial" w:eastAsia="Arial" w:cs="Arial"/>
+          <w:color w:val="000000"/>
+          <w:sz w:val="24"/>
+        </w:rPr>
+        <w:t xml:space="preserve"> baseado apenas em respostas pré-programadas: o comportamento depende do contexto, das ferramentas disponíveis e da estratégia de coordenação definida para os agentes.</w:t>
       </w:r>
     </w:p>
     <w:p>
@@ -2863,6 +3071,7 @@
           <w:ilvl w:val="2"/>
           <w:numId w:val="10"/>
         </w:numPr>
+        <w:spacing w:before="360" w:after="360"/>
       </w:pPr>
       <w:bookmarkStart w:id="1004" w:name="_TCC_H_1004"/>
       <w:r>
@@ -2895,6 +3104,7 @@
           <w:ilvl w:val="2"/>
           <w:numId w:val="10"/>
         </w:numPr>
+        <w:spacing w:before="360" w:after="360"/>
       </w:pPr>
       <w:bookmarkStart w:id="1005" w:name="_TCC_H_1005"/>
       <w:r>
@@ -2927,6 +3137,7 @@
           <w:ilvl w:val="1"/>
           <w:numId w:val="10"/>
         </w:numPr>
+        <w:spacing w:before="360" w:after="360"/>
       </w:pPr>
       <w:bookmarkStart w:id="1006" w:name="_TCC_H_1006"/>
       <w:r>
@@ -2936,8 +3147,20 @@
           <w:caps/>
           <w:color w:val="000000"/>
           <w:sz w:val="24"/>
-        </w:rPr>
-        <w:t>LARGE LANGUAGE MODELS E AGENTES INTELIGENTES</w:t>
+          <w:i w:val="1"/>
+          <w:iCs w:val="1"/>
+        </w:rPr>
+        <w:t>LARGE LANGUAGE MODELS</w:t>
+      </w:r>
+      <w:r>
+        <w:rPr>
+          <w:rFonts w:ascii="Arial" w:hAnsi="Arial" w:eastAsia="Arial" w:cs="Arial"/>
+          <w:b/>
+          <w:caps/>
+          <w:color w:val="000000"/>
+          <w:sz w:val="24"/>
+        </w:rPr>
+        <w:t xml:space="preserve"> E AGENTES INTELIGENTES</w:t>
       </w:r>
       <w:bookmarkEnd w:id="1006"/>
     </w:p>
@@ -2948,6 +3171,7 @@
           <w:ilvl w:val="2"/>
           <w:numId w:val="10"/>
         </w:numPr>
+        <w:spacing w:before="0" w:after="360"/>
       </w:pPr>
       <w:bookmarkStart w:id="1007" w:name="_TCC_H_1007"/>
       <w:r>
@@ -2969,8 +3193,18 @@
           <w:rFonts w:ascii="Arial" w:hAnsi="Arial" w:eastAsia="Arial" w:cs="Arial"/>
           <w:color w:val="000000"/>
           <w:sz w:val="24"/>
-        </w:rPr>
-        <w:t>Large Language Models (LLMs) são modelos treinados em grandes coleções de texto para estimar e gerar sequências linguísticas. Quando empregados isoladamente, podem interpretar instruções e produzir respostas, mas não garantem, por si só, acesso a dados atualizados, execução de ações ou observância de regras de negócio. Essas capacidades adicionais dependem da arquitetura que envolve o modelo.</w:t>
+          <w:i w:val="1"/>
+          <w:iCs w:val="1"/>
+        </w:rPr>
+        <w:t>Large Language Models</w:t>
+      </w:r>
+      <w:r>
+        <w:rPr>
+          <w:rFonts w:ascii="Arial" w:hAnsi="Arial" w:eastAsia="Arial" w:cs="Arial"/>
+          <w:color w:val="000000"/>
+          <w:sz w:val="24"/>
+        </w:rPr>
+        <w:t xml:space="preserve"> (LLMs) são modelos treinados em grandes coleções de texto para estimar e gerar sequências linguísticas. Quando empregados isoladamente, podem interpretar instruções e produzir respostas, mas não garantem, por si só, acesso a dados atualizados, execução de ações ou observância de regras de negócio. Essas capacidades adicionais dependem da arquitetura que envolve o modelo.</w:t>
       </w:r>
     </w:p>
     <w:p>
@@ -2980,6 +3214,7 @@
           <w:ilvl w:val="2"/>
           <w:numId w:val="10"/>
         </w:numPr>
+        <w:spacing w:before="360" w:after="360"/>
       </w:pPr>
       <w:bookmarkStart w:id="1008" w:name="_TCC_H_1008"/>
       <w:r>
@@ -3030,6 +3265,7 @@
           <w:ilvl w:val="2"/>
           <w:numId w:val="10"/>
         </w:numPr>
+        <w:spacing w:before="360" w:after="360"/>
       </w:pPr>
       <w:bookmarkStart w:id="1009" w:name="_TCC_H_1009"/>
       <w:r>
@@ -3062,6 +3298,7 @@
           <w:ilvl w:val="1"/>
           <w:numId w:val="10"/>
         </w:numPr>
+        <w:spacing w:before="360" w:after="360"/>
       </w:pPr>
       <w:bookmarkStart w:id="1010" w:name="_TCC_H_1010"/>
       <w:r>
@@ -3083,6 +3320,7 @@
           <w:ilvl w:val="2"/>
           <w:numId w:val="10"/>
         </w:numPr>
+        <w:spacing w:before="0" w:after="360"/>
       </w:pPr>
       <w:bookmarkStart w:id="1011" w:name="_TCC_H_1011"/>
       <w:r>
@@ -3115,6 +3353,7 @@
           <w:ilvl w:val="2"/>
           <w:numId w:val="10"/>
         </w:numPr>
+        <w:spacing w:before="360" w:after="360"/>
       </w:pPr>
       <w:bookmarkStart w:id="1012" w:name="_TCC_H_1012"/>
       <w:r>
@@ -3183,6 +3422,7 @@
           <w:ilvl w:val="2"/>
           <w:numId w:val="10"/>
         </w:numPr>
+        <w:spacing w:before="360" w:after="360"/>
       </w:pPr>
       <w:bookmarkStart w:id="1013" w:name="_TCC_H_1013"/>
       <w:r>
@@ -3205,7 +3445,25 @@
           <w:color w:val="000000"/>
           <w:sz w:val="24"/>
         </w:rPr>
-        <w:t xml:space="preserve">A comunicação pode ocorrer por mensagens diretas, estado compartilhado, handoffs ou por um controlador que intermedeia as decisões. Ela é necessária para distribuir subtarefas, mas também pode propagar erros ou ampliar divergências. Hammond </w:t>
+        <w:t xml:space="preserve">A comunicação pode ocorrer por mensagens diretas, estado compartilhado, </w:t>
+      </w:r>
+      <w:r>
+        <w:rPr>
+          <w:rFonts w:ascii="Arial" w:hAnsi="Arial" w:eastAsia="Arial" w:cs="Arial"/>
+          <w:color w:val="000000"/>
+          <w:sz w:val="24"/>
+          <w:i w:val="1"/>
+          <w:iCs w:val="1"/>
+        </w:rPr>
+        <w:t>handoffs</w:t>
+      </w:r>
+      <w:r>
+        <w:rPr>
+          <w:rFonts w:ascii="Arial" w:hAnsi="Arial" w:eastAsia="Arial" w:cs="Arial"/>
+          <w:color w:val="000000"/>
+          <w:sz w:val="24"/>
+        </w:rPr>
+        <w:t xml:space="preserve"> ou por um controlador que intermedeia as decisões. Ela é necessária para distribuir subtarefas, mas também pode propagar erros ou ampliar divergências. Hammond </w:t>
       </w:r>
       <w:r>
         <w:rPr>
@@ -3233,6 +3491,7 @@
           <w:ilvl w:val="1"/>
           <w:numId w:val="10"/>
         </w:numPr>
+        <w:spacing w:before="360" w:after="360"/>
       </w:pPr>
       <w:bookmarkStart w:id="1014" w:name="_TCC_H_1014"/>
       <w:r>
@@ -3254,6 +3513,7 @@
           <w:ilvl w:val="2"/>
           <w:numId w:val="10"/>
         </w:numPr>
+        <w:spacing w:before="0" w:after="360"/>
       </w:pPr>
       <w:bookmarkStart w:id="1015" w:name="_TCC_H_1015"/>
       <w:r>
@@ -3286,6 +3546,7 @@
           <w:ilvl w:val="2"/>
           <w:numId w:val="10"/>
         </w:numPr>
+        <w:spacing w:before="360" w:after="360"/>
       </w:pPr>
       <w:bookmarkStart w:id="1016" w:name="_TCC_H_1016"/>
       <w:r>
@@ -3295,8 +3556,20 @@
           <w:caps/>
           <w:color w:val="000000"/>
           <w:sz w:val="24"/>
-        </w:rPr>
-        <w:t>WORKFLOW ESTRUTURADO</w:t>
+          <w:i w:val="1"/>
+          <w:iCs w:val="1"/>
+        </w:rPr>
+        <w:t>WORKFLOW</w:t>
+      </w:r>
+      <w:r>
+        <w:rPr>
+          <w:rFonts w:ascii="Arial" w:hAnsi="Arial" w:eastAsia="Arial" w:cs="Arial"/>
+          <w:b w:val="0"/>
+          <w:caps/>
+          <w:color w:val="000000"/>
+          <w:sz w:val="24"/>
+        </w:rPr>
+        <w:t xml:space="preserve"> ESTRUTURADO</w:t>
       </w:r>
       <w:bookmarkEnd w:id="1016"/>
     </w:p>
@@ -3308,13 +3581,31 @@
           <w:color w:val="000000"/>
           <w:sz w:val="24"/>
         </w:rPr>
-        <w:t xml:space="preserve">O workflow organiza a execução em etapas previamente definidas. No protótipo, o fluxo inclui classificação, coleta de evidência, análise multimodal quando aplicável, revisão e síntese. Cada etapa possui responsabilidade explícita e ordem estável. A previsibilidade facilita testes e auditoria, mas reduz a flexibilidade para alterar o caminho durante a execução. A revisão de Yu </w:t>
-      </w:r>
-      <w:r>
-        <w:rPr>
-          <w:rFonts w:ascii="Arial" w:hAnsi="Arial" w:eastAsia="Arial" w:cs="Arial"/>
+        <w:t xml:space="preserve">O </w:t>
+      </w:r>
+      <w:r>
+        <w:rPr>
+          <w:rFonts w:ascii="Arial" w:hAnsi="Arial" w:eastAsia="Arial" w:cs="Arial"/>
+          <w:color w:val="000000"/>
+          <w:sz w:val="24"/>
           <w:i w:val="1"/>
           <w:iCs w:val="1"/>
+        </w:rPr>
+        <w:t>workflow</w:t>
+      </w:r>
+      <w:r>
+        <w:rPr>
+          <w:rFonts w:ascii="Arial" w:hAnsi="Arial" w:eastAsia="Arial" w:cs="Arial"/>
+          <w:color w:val="000000"/>
+          <w:sz w:val="24"/>
+        </w:rPr>
+        <w:t xml:space="preserve"> organiza a execução em etapas previamente definidas. No protótipo, o fluxo inclui classificação, coleta de evidência, análise multimodal quando aplicável, revisão e síntese. Cada etapa possui responsabilidade explícita e ordem estável. A previsibilidade facilita testes e auditoria, mas reduz a flexibilidade para alterar o caminho durante a execução. A revisão de Yu </w:t>
+      </w:r>
+      <w:r>
+        <w:rPr>
+          <w:rFonts w:ascii="Arial" w:hAnsi="Arial" w:eastAsia="Arial" w:cs="Arial"/>
+          <w:i w:val="1"/>
+          <w:iCs w:val="1"/>
           <w:color w:val="000000"/>
           <w:sz w:val="24"/>
         </w:rPr>
@@ -3326,7 +3617,25 @@
           <w:color w:val="000000"/>
           <w:sz w:val="24"/>
         </w:rPr>
-        <w:t xml:space="preserve"> (2025) mostra que workflows de agentes combinam planejamento, execução e controle em estruturas que variam de sequências fixas a fluxos adaptativos.</w:t>
+        <w:t xml:space="preserve"> (2025) mostra que </w:t>
+      </w:r>
+      <w:r>
+        <w:rPr>
+          <w:rFonts w:ascii="Arial" w:hAnsi="Arial" w:eastAsia="Arial" w:cs="Arial"/>
+          <w:color w:val="000000"/>
+          <w:sz w:val="24"/>
+          <w:i w:val="1"/>
+          <w:iCs w:val="1"/>
+        </w:rPr>
+        <w:t>workflows</w:t>
+      </w:r>
+      <w:r>
+        <w:rPr>
+          <w:rFonts w:ascii="Arial" w:hAnsi="Arial" w:eastAsia="Arial" w:cs="Arial"/>
+          <w:color w:val="000000"/>
+          <w:sz w:val="24"/>
+        </w:rPr>
+        <w:t xml:space="preserve"> de agentes combinam planejamento, execução e controle em estruturas que variam de sequências fixas a fluxos adaptativos.</w:t>
       </w:r>
     </w:p>
     <w:p>
@@ -3336,6 +3645,7 @@
           <w:ilvl w:val="2"/>
           <w:numId w:val="10"/>
         </w:numPr>
+        <w:spacing w:before="360" w:after="360"/>
       </w:pPr>
       <w:bookmarkStart w:id="1017" w:name="_TCC_H_1017"/>
       <w:r>
@@ -3346,7 +3656,29 @@
           <w:color w:val="000000"/>
           <w:sz w:val="24"/>
         </w:rPr>
-        <w:t>SISTEMAS DESCENTRALIZADOS (SWARM)</w:t>
+        <w:t>SISTEMAS DESCENTRALIZADOS (</w:t>
+      </w:r>
+      <w:r>
+        <w:rPr>
+          <w:rFonts w:ascii="Arial" w:hAnsi="Arial" w:eastAsia="Arial" w:cs="Arial"/>
+          <w:b w:val="0"/>
+          <w:caps/>
+          <w:color w:val="000000"/>
+          <w:sz w:val="24"/>
+          <w:i w:val="1"/>
+          <w:iCs w:val="1"/>
+        </w:rPr>
+        <w:t>SWARM</w:t>
+      </w:r>
+      <w:r>
+        <w:rPr>
+          <w:rFonts w:ascii="Arial" w:hAnsi="Arial" w:eastAsia="Arial" w:cs="Arial"/>
+          <w:b w:val="0"/>
+          <w:caps/>
+          <w:color w:val="000000"/>
+          <w:sz w:val="24"/>
+        </w:rPr>
+        <w:t>)</w:t>
       </w:r>
       <w:bookmarkEnd w:id="1017"/>
     </w:p>
@@ -3358,7 +3690,43 @@
           <w:color w:val="000000"/>
           <w:sz w:val="24"/>
         </w:rPr>
-        <w:t>Em uma organização descentralizada, os agentes podem transferir a tarefa diretamente entre pares. O MAB implementa essa estratégia por meio de handoffs: um coordenador inicia a cadeia, especialistas podem delegar a outros especialistas e um sintetizador produz a resposta final. O mecanismo aumenta a autonomia local, porém exige limites de handoff e telemetria para evitar ciclos, custo excessivo ou perda de contexto.</w:t>
+        <w:t xml:space="preserve">Em uma organização descentralizada, os agentes podem transferir a tarefa diretamente entre pares. O MAB implementa essa estratégia por meio de </w:t>
+      </w:r>
+      <w:r>
+        <w:rPr>
+          <w:rFonts w:ascii="Arial" w:hAnsi="Arial" w:eastAsia="Arial" w:cs="Arial"/>
+          <w:color w:val="000000"/>
+          <w:sz w:val="24"/>
+          <w:i w:val="1"/>
+          <w:iCs w:val="1"/>
+        </w:rPr>
+        <w:t>handoffs</w:t>
+      </w:r>
+      <w:r>
+        <w:rPr>
+          <w:rFonts w:ascii="Arial" w:hAnsi="Arial" w:eastAsia="Arial" w:cs="Arial"/>
+          <w:color w:val="000000"/>
+          <w:sz w:val="24"/>
+        </w:rPr>
+        <w:t xml:space="preserve">: um coordenador inicia a cadeia, especialistas podem delegar a outros especialistas e um sintetizador produz a resposta final. O mecanismo aumenta a autonomia local, porém exige limites de </w:t>
+      </w:r>
+      <w:r>
+        <w:rPr>
+          <w:rFonts w:ascii="Arial" w:hAnsi="Arial" w:eastAsia="Arial" w:cs="Arial"/>
+          <w:color w:val="000000"/>
+          <w:sz w:val="24"/>
+          <w:i w:val="1"/>
+          <w:iCs w:val="1"/>
+        </w:rPr>
+        <w:t>handoff</w:t>
+      </w:r>
+      <w:r>
+        <w:rPr>
+          <w:rFonts w:ascii="Arial" w:hAnsi="Arial" w:eastAsia="Arial" w:cs="Arial"/>
+          <w:color w:val="000000"/>
+          <w:sz w:val="24"/>
+        </w:rPr>
+        <w:t xml:space="preserve"> e telemetria para evitar ciclos, custo excessivo ou perda de contexto.</w:t>
       </w:r>
     </w:p>
     <w:p>
@@ -3368,6 +3736,7 @@
           <w:ilvl w:val="2"/>
           <w:numId w:val="10"/>
         </w:numPr>
+        <w:spacing w:before="360" w:after="360"/>
       </w:pPr>
       <w:bookmarkStart w:id="1018" w:name="_TCC_H_1018"/>
       <w:r>
@@ -3448,13 +3817,31 @@
           <w:color w:val="000000"/>
           <w:sz w:val="24"/>
         </w:rPr>
-        <w:t xml:space="preserve">No workflow estruturado, parte do controle deixa de estar exclusivamente em um agente e passa a ser representada pela própria sequência de etapas. O fluxo pode definir antecipadamente operações de classificação, obtenção de evidências, revisão e síntese, incluindo condições para desvio ou encerramento. Yu </w:t>
-      </w:r>
-      <w:r>
-        <w:rPr>
-          <w:rFonts w:ascii="Arial" w:hAnsi="Arial" w:eastAsia="Arial" w:cs="Arial"/>
+        <w:t xml:space="preserve">No </w:t>
+      </w:r>
+      <w:r>
+        <w:rPr>
+          <w:rFonts w:ascii="Arial" w:hAnsi="Arial" w:eastAsia="Arial" w:cs="Arial"/>
+          <w:color w:val="000000"/>
+          <w:sz w:val="24"/>
           <w:i w:val="1"/>
           <w:iCs w:val="1"/>
+        </w:rPr>
+        <w:t>workflow</w:t>
+      </w:r>
+      <w:r>
+        <w:rPr>
+          <w:rFonts w:ascii="Arial" w:hAnsi="Arial" w:eastAsia="Arial" w:cs="Arial"/>
+          <w:color w:val="000000"/>
+          <w:sz w:val="24"/>
+        </w:rPr>
+        <w:t xml:space="preserve"> estruturado, parte do controle deixa de estar exclusivamente em um agente e passa a ser representada pela própria sequência de etapas. O fluxo pode definir antecipadamente operações de classificação, obtenção de evidências, revisão e síntese, incluindo condições para desvio ou encerramento. Yu </w:t>
+      </w:r>
+      <w:r>
+        <w:rPr>
+          <w:rFonts w:ascii="Arial" w:hAnsi="Arial" w:eastAsia="Arial" w:cs="Arial"/>
+          <w:i w:val="1"/>
+          <w:iCs w:val="1"/>
           <w:color w:val="000000"/>
           <w:sz w:val="24"/>
         </w:rPr>
@@ -3466,7 +3853,25 @@
           <w:color w:val="000000"/>
           <w:sz w:val="24"/>
         </w:rPr>
-        <w:t xml:space="preserve"> (2025) descrevem workflows de agentes como combinações de planejamento, execução e controle que podem variar entre sequências fixas e estruturas adaptativas. A explicitação das transições favorece repetibilidade e auditoria, pois torna possível identificar em qual etapa ocorreu uma falha. Entretanto, um caminho rígido pode executar operações desnecessárias ou responder de forma limitada a solicitações que não se ajustem às rotas previstas.</w:t>
+        <w:t xml:space="preserve"> (2025) descrevem </w:t>
+      </w:r>
+      <w:r>
+        <w:rPr>
+          <w:rFonts w:ascii="Arial" w:hAnsi="Arial" w:eastAsia="Arial" w:cs="Arial"/>
+          <w:color w:val="000000"/>
+          <w:sz w:val="24"/>
+          <w:i w:val="1"/>
+          <w:iCs w:val="1"/>
+        </w:rPr>
+        <w:t>workflows</w:t>
+      </w:r>
+      <w:r>
+        <w:rPr>
+          <w:rFonts w:ascii="Arial" w:hAnsi="Arial" w:eastAsia="Arial" w:cs="Arial"/>
+          <w:color w:val="000000"/>
+          <w:sz w:val="24"/>
+        </w:rPr>
+        <w:t xml:space="preserve"> de agentes como combinações de planejamento, execução e controle que podem variar entre sequências fixas e estruturas adaptativas. A explicitação das transições favorece repetibilidade e auditoria, pois torna possível identificar em qual etapa ocorreu uma falha. Entretanto, um caminho rígido pode executar operações desnecessárias ou responder de forma limitada a solicitações que não se ajustem às rotas previstas.</w:t>
       </w:r>
     </w:p>
     <w:p>
@@ -3477,13 +3882,31 @@
           <w:color w:val="000000"/>
           <w:sz w:val="24"/>
         </w:rPr>
-        <w:t xml:space="preserve">Em sistemas descentralizados, a decisão de continuidade pode ser transferida entre os próprios agentes. Em vez de consultar um supervisor a cada passo, um especialista avalia o contexto recebido e realiza um handoff quando identifica outra competência necessária. Balaprakash </w:t>
-      </w:r>
-      <w:r>
-        <w:rPr>
-          <w:rFonts w:ascii="Arial" w:hAnsi="Arial" w:eastAsia="Arial" w:cs="Arial"/>
+        <w:t xml:space="preserve">Em sistemas descentralizados, a decisão de continuidade pode ser transferida entre os próprios agentes. Em vez de consultar um supervisor a cada passo, um especialista avalia o contexto recebido e realiza um </w:t>
+      </w:r>
+      <w:r>
+        <w:rPr>
+          <w:rFonts w:ascii="Arial" w:hAnsi="Arial" w:eastAsia="Arial" w:cs="Arial"/>
+          <w:color w:val="000000"/>
+          <w:sz w:val="24"/>
           <w:i w:val="1"/>
           <w:iCs w:val="1"/>
+        </w:rPr>
+        <w:t>handoff</w:t>
+      </w:r>
+      <w:r>
+        <w:rPr>
+          <w:rFonts w:ascii="Arial" w:hAnsi="Arial" w:eastAsia="Arial" w:cs="Arial"/>
+          <w:color w:val="000000"/>
+          <w:sz w:val="24"/>
+        </w:rPr>
+        <w:t xml:space="preserve"> quando identifica outra competência necessária. Balaprakash </w:t>
+      </w:r>
+      <w:r>
+        <w:rPr>
+          <w:rFonts w:ascii="Arial" w:hAnsi="Arial" w:eastAsia="Arial" w:cs="Arial"/>
+          <w:i w:val="1"/>
+          <w:iCs w:val="1"/>
           <w:color w:val="000000"/>
           <w:sz w:val="24"/>
         </w:rPr>
@@ -3495,7 +3918,43 @@
           <w:color w:val="000000"/>
           <w:sz w:val="24"/>
         </w:rPr>
-        <w:t xml:space="preserve"> (2025) apresentam o SWARM como uma proposta de distribuição das funções tradicionalmente centralizadas de gestão de workflows, motivada por problemas de resiliência e escalabilidade. Essa autonomia local pode reduzir a dependência de um único controlador, mas exige regras para preservar contexto, limitar transferências e impedir ciclos. Também pode aumentar a comunicação e a repetição de trabalho quando mais de um agente interpreta a mesma solicitação.</w:t>
+        <w:t xml:space="preserve"> (2025) apresentam o </w:t>
+      </w:r>
+      <w:r>
+        <w:rPr>
+          <w:rFonts w:ascii="Arial" w:hAnsi="Arial" w:eastAsia="Arial" w:cs="Arial"/>
+          <w:color w:val="000000"/>
+          <w:sz w:val="24"/>
+          <w:i w:val="1"/>
+          <w:iCs w:val="1"/>
+        </w:rPr>
+        <w:t>SWARM</w:t>
+      </w:r>
+      <w:r>
+        <w:rPr>
+          <w:rFonts w:ascii="Arial" w:hAnsi="Arial" w:eastAsia="Arial" w:cs="Arial"/>
+          <w:color w:val="000000"/>
+          <w:sz w:val="24"/>
+        </w:rPr>
+        <w:t xml:space="preserve"> como uma proposta de distribuição das funções tradicionalmente centralizadas de gestão de </w:t>
+      </w:r>
+      <w:r>
+        <w:rPr>
+          <w:rFonts w:ascii="Arial" w:hAnsi="Arial" w:eastAsia="Arial" w:cs="Arial"/>
+          <w:color w:val="000000"/>
+          <w:sz w:val="24"/>
+          <w:i w:val="1"/>
+          <w:iCs w:val="1"/>
+        </w:rPr>
+        <w:t>workflows</w:t>
+      </w:r>
+      <w:r>
+        <w:rPr>
+          <w:rFonts w:ascii="Arial" w:hAnsi="Arial" w:eastAsia="Arial" w:cs="Arial"/>
+          <w:color w:val="000000"/>
+          <w:sz w:val="24"/>
+        </w:rPr>
+        <w:t>, motivada por problemas de resiliência e escalabilidade. Essa autonomia local pode reduzir a dependência de um único controlador, mas exige regras para preservar contexto, limitar transferências e impedir ciclos. Também pode aumentar a comunicação e a repetição de trabalho quando mais de um agente interpreta a mesma solicitação.</w:t>
       </w:r>
     </w:p>
     <w:p>
@@ -3524,7 +3983,25 @@
           <w:color w:val="000000"/>
           <w:sz w:val="24"/>
         </w:rPr>
-        <w:t xml:space="preserve"> (2026) compararam configurações de agente único, independentes, centralizadas, descentralizadas e híbridas em diferentes benchmarks. Os autores observaram que os ganhos da colaboração não são uniformes: tarefas decomponíveis podem se beneficiar da divisão de trabalho, enquanto tarefas que dependem de uma sequência rígida ou de coordenação intensa podem sofrer com o custo adicional de comunicação. O estudo também indica que modelos mais capazes podem reduzir a vantagem relativa da colaboração, pois parte do trabalho distribuído pode ser resolvida por um único agente sem os mesmos custos de coordenação.</w:t>
+        <w:t xml:space="preserve"> (2026) compararam configurações de agente único, independentes, centralizadas, descentralizadas e híbridas em diferentes </w:t>
+      </w:r>
+      <w:r>
+        <w:rPr>
+          <w:rFonts w:ascii="Arial" w:hAnsi="Arial" w:eastAsia="Arial" w:cs="Arial"/>
+          <w:color w:val="000000"/>
+          <w:sz w:val="24"/>
+          <w:i w:val="1"/>
+          <w:iCs w:val="1"/>
+        </w:rPr>
+        <w:t>benchmarks</w:t>
+      </w:r>
+      <w:r>
+        <w:rPr>
+          <w:rFonts w:ascii="Arial" w:hAnsi="Arial" w:eastAsia="Arial" w:cs="Arial"/>
+          <w:color w:val="000000"/>
+          <w:sz w:val="24"/>
+        </w:rPr>
+        <w:t>. Os autores observaram que os ganhos da colaboração não são uniformes: tarefas decomponíveis podem se beneficiar da divisão de trabalho, enquanto tarefas que dependem de uma sequência rígida ou de coordenação intensa podem sofrer com o custo adicional de comunicação. O estudo também indica que modelos mais capazes podem reduzir a vantagem relativa da colaboração, pois parte do trabalho distribuído pode ser resolvida por um único agente sem os mesmos custos de coordenação.</w:t>
       </w:r>
     </w:p>
     <w:p>
@@ -3535,7 +4012,61 @@
           <w:color w:val="000000"/>
           <w:sz w:val="24"/>
         </w:rPr>
-        <w:t>Portanto, não existe fundamento para declarar previamente uma arquitetura como superior em qualquer contexto. Uma comparação controlada precisa manter constantes os elementos que não constituem o objeto do estudo, como cenários, ferramentas disponíveis, modelo de linguagem e critérios de avaliação. Em seguida, deve observar consequências mensuráveis da coordenação, como rota percorrida, quantidade de handoffs, chamadas de ferramentas, consumo de tokens, latência, ocorrência de erros e qualidade da resposta. Essa relação entre desenho arquitetural e eventos observáveis sustenta a comparação proposta pelo MAB, sem antecipar resultados: orquestração, workflow e swarm representam formas distintas de distribuir controle, e sua adequação ao atendimento farmacêutico deve ser determinada pelas evidências do experimento.</w:t>
+        <w:t xml:space="preserve">Portanto, não existe fundamento para declarar previamente uma arquitetura como superior em qualquer contexto. Uma comparação controlada precisa manter constantes os elementos que não constituem o objeto do estudo, como cenários, ferramentas disponíveis, modelo de linguagem e critérios de avaliação. Em seguida, deve observar consequências mensuráveis da coordenação, como rota percorrida, quantidade de </w:t>
+      </w:r>
+      <w:r>
+        <w:rPr>
+          <w:rFonts w:ascii="Arial" w:hAnsi="Arial" w:eastAsia="Arial" w:cs="Arial"/>
+          <w:color w:val="000000"/>
+          <w:sz w:val="24"/>
+          <w:i w:val="1"/>
+          <w:iCs w:val="1"/>
+        </w:rPr>
+        <w:t>handoffs</w:t>
+      </w:r>
+      <w:r>
+        <w:rPr>
+          <w:rFonts w:ascii="Arial" w:hAnsi="Arial" w:eastAsia="Arial" w:cs="Arial"/>
+          <w:color w:val="000000"/>
+          <w:sz w:val="24"/>
+        </w:rPr>
+        <w:t xml:space="preserve">, chamadas de ferramentas, consumo de tokens, latência, ocorrência de erros e qualidade da resposta. Essa relação entre desenho arquitetural e eventos observáveis sustenta a comparação proposta pelo MAB, sem antecipar resultados: orquestração, </w:t>
+      </w:r>
+      <w:r>
+        <w:rPr>
+          <w:rFonts w:ascii="Arial" w:hAnsi="Arial" w:eastAsia="Arial" w:cs="Arial"/>
+          <w:color w:val="000000"/>
+          <w:sz w:val="24"/>
+          <w:i w:val="1"/>
+          <w:iCs w:val="1"/>
+        </w:rPr>
+        <w:t>workflow</w:t>
+      </w:r>
+      <w:r>
+        <w:rPr>
+          <w:rFonts w:ascii="Arial" w:hAnsi="Arial" w:eastAsia="Arial" w:cs="Arial"/>
+          <w:color w:val="000000"/>
+          <w:sz w:val="24"/>
+        </w:rPr>
+        <w:t xml:space="preserve"> e </w:t>
+      </w:r>
+      <w:r>
+        <w:rPr>
+          <w:rFonts w:ascii="Arial" w:hAnsi="Arial" w:eastAsia="Arial" w:cs="Arial"/>
+          <w:color w:val="000000"/>
+          <w:sz w:val="24"/>
+          <w:i w:val="1"/>
+          <w:iCs w:val="1"/>
+        </w:rPr>
+        <w:t>swarm</w:t>
+      </w:r>
+      <w:r>
+        <w:rPr>
+          <w:rFonts w:ascii="Arial" w:hAnsi="Arial" w:eastAsia="Arial" w:cs="Arial"/>
+          <w:color w:val="000000"/>
+          <w:sz w:val="24"/>
+        </w:rPr>
+        <w:t xml:space="preserve"> representam formas distintas de distribuir controle, e sua adequação ao atendimento farmacêutico deve ser determinada pelas evidências do experimento.</w:t>
       </w:r>
     </w:p>
     <w:p>
@@ -3545,6 +4076,7 @@
           <w:ilvl w:val="1"/>
           <w:numId w:val="10"/>
         </w:numPr>
+        <w:spacing w:before="360" w:after="360"/>
       </w:pPr>
       <w:bookmarkStart w:id="1019" w:name="_TCC_H_1019"/>
       <w:r>
@@ -3566,6 +4098,7 @@
           <w:ilvl w:val="2"/>
           <w:numId w:val="10"/>
         </w:numPr>
+        <w:spacing w:before="0" w:after="360"/>
       </w:pPr>
       <w:bookmarkStart w:id="1020" w:name="_TCC_H_1020"/>
       <w:r>
@@ -3598,6 +4131,7 @@
           <w:ilvl w:val="2"/>
           <w:numId w:val="10"/>
         </w:numPr>
+        <w:spacing w:before="360" w:after="360"/>
       </w:pPr>
       <w:bookmarkStart w:id="1021" w:name="_TCC_H_1021"/>
       <w:r>
@@ -3630,6 +4164,7 @@
           <w:ilvl w:val="2"/>
           <w:numId w:val="10"/>
         </w:numPr>
+        <w:spacing w:before="360" w:after="360"/>
       </w:pPr>
       <w:bookmarkStart w:id="1022" w:name="_TCC_H_1022"/>
       <w:r>
@@ -3662,6 +4197,7 @@
           <w:ilvl w:val="0"/>
           <w:numId w:val="10"/>
         </w:numPr>
+        <w:spacing w:before="0" w:after="360"/>
       </w:pPr>
       <w:bookmarkStart w:id="1023" w:name="_TCC_H_1023"/>
       <w:r>
@@ -3695,7 +4231,25 @@
           <w:color w:val="000000"/>
           <w:sz w:val="24"/>
         </w:rPr>
-        <w:t>Os trabalhos analisados neste capítulo tratam de temas complementares ao desenvolvimento desta pesquisa. De um lado, foram considerados estudos sobre sistemas multiagentes, arquiteturas de coordenação, workflows e abordagens descentralizadas, pois esses temas ajudam a compreender como diferentes agentes podem ser organizados para executar tarefas de forma cooperativa. De outro lado, foram considerados trabalhos relacionados ao uso de inteligência artificial em farmácias e serviços farmacêuticos, pois eles aproximam a discussão teórica do contexto prático escolhido para este projeto.</w:t>
+        <w:t xml:space="preserve">Os trabalhos analisados neste capítulo tratam de temas complementares ao desenvolvimento desta pesquisa. De um lado, foram considerados estudos sobre sistemas multiagentes, arquiteturas de coordenação, </w:t>
+      </w:r>
+      <w:r>
+        <w:rPr>
+          <w:rFonts w:ascii="Arial" w:hAnsi="Arial" w:eastAsia="Arial" w:cs="Arial"/>
+          <w:color w:val="000000"/>
+          <w:sz w:val="24"/>
+          <w:i w:val="1"/>
+          <w:iCs w:val="1"/>
+        </w:rPr>
+        <w:t>workflows</w:t>
+      </w:r>
+      <w:r>
+        <w:rPr>
+          <w:rFonts w:ascii="Arial" w:hAnsi="Arial" w:eastAsia="Arial" w:cs="Arial"/>
+          <w:color w:val="000000"/>
+          <w:sz w:val="24"/>
+        </w:rPr>
+        <w:t xml:space="preserve"> e abordagens descentralizadas, pois esses temas ajudam a compreender como diferentes agentes podem ser organizados para executar tarefas de forma cooperativa. De outro lado, foram considerados trabalhos relacionados ao uso de inteligência artificial em farmácias e serviços farmacêuticos, pois eles aproximam a discussão teórica do contexto prático escolhido para este projeto.</w:t>
       </w:r>
     </w:p>
     <w:p>
@@ -3717,7 +4271,43 @@
           <w:color w:val="000000"/>
           <w:sz w:val="24"/>
         </w:rPr>
-        <w:t>A literatura recente mostra que a discussão sobre sistemas multiagentes baseados em LLMs vem se consolidando em torno de três questões principais: como estruturar os agentes, como coordená-los e em quais tipos de tarefa cada arquitetura produz melhores resultados. Trabalhos mais amplos de revisão oferecem taxonomias e desafios gerais, enquanto estudos mais específicos tratam de workflow, swarm, descentralização e aplicações em domínios particulares, como serviços farmacêuticos.</w:t>
+        <w:t xml:space="preserve">A literatura recente mostra que a discussão sobre sistemas multiagentes baseados em LLMs vem se consolidando em torno de três questões principais: como estruturar os agentes, como coordená-los e em quais tipos de tarefa cada arquitetura produz melhores resultados. Trabalhos mais amplos de revisão oferecem taxonomias e desafios gerais, enquanto estudos mais específicos tratam de </w:t>
+      </w:r>
+      <w:r>
+        <w:rPr>
+          <w:rFonts w:ascii="Arial" w:hAnsi="Arial" w:eastAsia="Arial" w:cs="Arial"/>
+          <w:color w:val="000000"/>
+          <w:sz w:val="24"/>
+          <w:i w:val="1"/>
+          <w:iCs w:val="1"/>
+        </w:rPr>
+        <w:t>workflow</w:t>
+      </w:r>
+      <w:r>
+        <w:rPr>
+          <w:rFonts w:ascii="Arial" w:hAnsi="Arial" w:eastAsia="Arial" w:cs="Arial"/>
+          <w:color w:val="000000"/>
+          <w:sz w:val="24"/>
+        </w:rPr>
+        <w:t xml:space="preserve">, </w:t>
+      </w:r>
+      <w:r>
+        <w:rPr>
+          <w:rFonts w:ascii="Arial" w:hAnsi="Arial" w:eastAsia="Arial" w:cs="Arial"/>
+          <w:color w:val="000000"/>
+          <w:sz w:val="24"/>
+          <w:i w:val="1"/>
+          <w:iCs w:val="1"/>
+        </w:rPr>
+        <w:t>swarm</w:t>
+      </w:r>
+      <w:r>
+        <w:rPr>
+          <w:rFonts w:ascii="Arial" w:hAnsi="Arial" w:eastAsia="Arial" w:cs="Arial"/>
+          <w:color w:val="000000"/>
+          <w:sz w:val="24"/>
+        </w:rPr>
+        <w:t>, descentralização e aplicações em domínios particulares, como serviços farmacêuticos.</w:t>
       </w:r>
     </w:p>
     <w:p>
@@ -3727,6 +4317,7 @@
           <w:ilvl w:val="1"/>
           <w:numId w:val="10"/>
         </w:numPr>
+        <w:spacing w:before="360" w:after="360"/>
       </w:pPr>
       <w:bookmarkStart w:id="1024" w:name="_TCC_H_1024"/>
       <w:r>
@@ -3749,7 +4340,43 @@
           <w:color w:val="000000"/>
           <w:sz w:val="24"/>
         </w:rPr>
-        <w:t>Jagatap, Merugu e Comar (2025) investigam a automação do processamento de prescrições no contexto farmacêutico digital. A metodologia consiste em uma solução em etapas, ou pipeline, baseada em LLM, OCR, extração de medicamentos e correspondência com catálogo. Nesse caso, pipeline significa uma sequência organizada de etapas, em que a saída de uma etapa serve como entrada para a próxima.</w:t>
+        <w:t xml:space="preserve">Jagatap, Merugu e Comar (2025) investigam a automação do processamento de prescrições no contexto farmacêutico digital. A metodologia consiste em uma solução em etapas, ou </w:t>
+      </w:r>
+      <w:r>
+        <w:rPr>
+          <w:rFonts w:ascii="Arial" w:hAnsi="Arial" w:eastAsia="Arial" w:cs="Arial"/>
+          <w:color w:val="000000"/>
+          <w:sz w:val="24"/>
+          <w:i w:val="1"/>
+          <w:iCs w:val="1"/>
+        </w:rPr>
+        <w:t>pipeline</w:t>
+      </w:r>
+      <w:r>
+        <w:rPr>
+          <w:rFonts w:ascii="Arial" w:hAnsi="Arial" w:eastAsia="Arial" w:cs="Arial"/>
+          <w:color w:val="000000"/>
+          <w:sz w:val="24"/>
+        </w:rPr>
+        <w:t xml:space="preserve">, baseada em LLM, OCR, extração de medicamentos e correspondência com catálogo. Nesse caso, </w:t>
+      </w:r>
+      <w:r>
+        <w:rPr>
+          <w:rFonts w:ascii="Arial" w:hAnsi="Arial" w:eastAsia="Arial" w:cs="Arial"/>
+          <w:color w:val="000000"/>
+          <w:sz w:val="24"/>
+          <w:i w:val="1"/>
+          <w:iCs w:val="1"/>
+        </w:rPr>
+        <w:t>pipeline</w:t>
+      </w:r>
+      <w:r>
+        <w:rPr>
+          <w:rFonts w:ascii="Arial" w:hAnsi="Arial" w:eastAsia="Arial" w:cs="Arial"/>
+          <w:color w:val="000000"/>
+          <w:sz w:val="24"/>
+        </w:rPr>
+        <w:t xml:space="preserve"> significa uma sequência organizada de etapas, em que a saída de uma etapa serve como entrada para a próxima.</w:t>
       </w:r>
     </w:p>
     <w:p>
@@ -3760,7 +4387,79 @@
           <w:color w:val="000000"/>
           <w:sz w:val="24"/>
         </w:rPr>
-        <w:t>Como resultado, o sistema melhora o Recall@3 em relação a métodos anteriores. O termo recall é uma métrica usada para medir a capacidade de um sistema encontrar corretamente os itens relevantes. No caso do Recall@3, verifica-se se a resposta correta aparece entre as três primeiras sugestões retornadas pelo sistema. Essa métrica é relevante no contexto farmacêutico porque, ao buscar medicamentos ou informações em um catálogo, não basta o sistema responder rápido; ele precisa recuperar corretamente as opções mais adequadas. Portanto, a menção ao recall ajuda a mostrar que aplicações de IA em farmácias também precisam ser avaliadas por métricas objetivas de qualidade, e não apenas por funcionamento geral.</w:t>
+        <w:t xml:space="preserve">Como resultado, o sistema melhora o </w:t>
+      </w:r>
+      <w:r>
+        <w:rPr>
+          <w:rFonts w:ascii="Arial" w:hAnsi="Arial" w:eastAsia="Arial" w:cs="Arial"/>
+          <w:color w:val="000000"/>
+          <w:sz w:val="24"/>
+          <w:i w:val="1"/>
+          <w:iCs w:val="1"/>
+        </w:rPr>
+        <w:t>Recall@3</w:t>
+      </w:r>
+      <w:r>
+        <w:rPr>
+          <w:rFonts w:ascii="Arial" w:hAnsi="Arial" w:eastAsia="Arial" w:cs="Arial"/>
+          <w:color w:val="000000"/>
+          <w:sz w:val="24"/>
+        </w:rPr>
+        <w:t xml:space="preserve"> em relação a métodos anteriores. O termo </w:t>
+      </w:r>
+      <w:r>
+        <w:rPr>
+          <w:rFonts w:ascii="Arial" w:hAnsi="Arial" w:eastAsia="Arial" w:cs="Arial"/>
+          <w:color w:val="000000"/>
+          <w:sz w:val="24"/>
+          <w:i w:val="1"/>
+          <w:iCs w:val="1"/>
+        </w:rPr>
+        <w:t>recall</w:t>
+      </w:r>
+      <w:r>
+        <w:rPr>
+          <w:rFonts w:ascii="Arial" w:hAnsi="Arial" w:eastAsia="Arial" w:cs="Arial"/>
+          <w:color w:val="000000"/>
+          <w:sz w:val="24"/>
+        </w:rPr>
+        <w:t xml:space="preserve"> é uma métrica usada para medir a capacidade de um sistema encontrar corretamente os itens relevantes. No caso do </w:t>
+      </w:r>
+      <w:r>
+        <w:rPr>
+          <w:rFonts w:ascii="Arial" w:hAnsi="Arial" w:eastAsia="Arial" w:cs="Arial"/>
+          <w:color w:val="000000"/>
+          <w:sz w:val="24"/>
+          <w:i w:val="1"/>
+          <w:iCs w:val="1"/>
+        </w:rPr>
+        <w:t>Recall@3</w:t>
+      </w:r>
+      <w:r>
+        <w:rPr>
+          <w:rFonts w:ascii="Arial" w:hAnsi="Arial" w:eastAsia="Arial" w:cs="Arial"/>
+          <w:color w:val="000000"/>
+          <w:sz w:val="24"/>
+        </w:rPr>
+        <w:t xml:space="preserve">, verifica-se se a resposta correta aparece entre as três primeiras sugestões retornadas pelo sistema. Essa métrica é relevante no contexto farmacêutico porque, ao buscar medicamentos ou informações em um catálogo, não basta o sistema responder rápido; ele precisa recuperar corretamente as opções mais adequadas. Portanto, a menção ao </w:t>
+      </w:r>
+      <w:r>
+        <w:rPr>
+          <w:rFonts w:ascii="Arial" w:hAnsi="Arial" w:eastAsia="Arial" w:cs="Arial"/>
+          <w:color w:val="000000"/>
+          <w:sz w:val="24"/>
+          <w:i w:val="1"/>
+          <w:iCs w:val="1"/>
+        </w:rPr>
+        <w:t>recall</w:t>
+      </w:r>
+      <w:r>
+        <w:rPr>
+          <w:rFonts w:ascii="Arial" w:hAnsi="Arial" w:eastAsia="Arial" w:cs="Arial"/>
+          <w:color w:val="000000"/>
+          <w:sz w:val="24"/>
+        </w:rPr>
+        <w:t xml:space="preserve"> ajuda a mostrar que aplicações de IA em farmácias também precisam ser avaliadas por métricas objetivas de qualidade, e não apenas por funcionamento geral.</w:t>
       </w:r>
     </w:p>
     <w:p>
@@ -3800,7 +4499,25 @@
           <w:color w:val="000000"/>
           <w:sz w:val="24"/>
         </w:rPr>
-        <w:t xml:space="preserve"> (2025) tratam do uso atual de IA na prática farmacêutica. A metodologia é uma scoping review, ou revisão de escopo, voltada a mapear como a IA vem sendo aplicada na área. Os resultados indicam que muitas aplicações ainda estão ligadas à gestão de fluxo, produtividade, triagem e apoio operacional, mais do que à melhoria direta de desfechos clínicos.</w:t>
+        <w:t xml:space="preserve"> (2025) tratam do uso atual de IA na prática farmacêutica. A metodologia é uma </w:t>
+      </w:r>
+      <w:r>
+        <w:rPr>
+          <w:rFonts w:ascii="Arial" w:hAnsi="Arial" w:eastAsia="Arial" w:cs="Arial"/>
+          <w:color w:val="000000"/>
+          <w:sz w:val="24"/>
+          <w:i w:val="1"/>
+          <w:iCs w:val="1"/>
+        </w:rPr>
+        <w:t>scoping review</w:t>
+      </w:r>
+      <w:r>
+        <w:rPr>
+          <w:rFonts w:ascii="Arial" w:hAnsi="Arial" w:eastAsia="Arial" w:cs="Arial"/>
+          <w:color w:val="000000"/>
+          <w:sz w:val="24"/>
+        </w:rPr>
+        <w:t>, ou revisão de escopo, voltada a mapear como a IA vem sendo aplicada na área. Os resultados indicam que muitas aplicações ainda estão ligadas à gestão de fluxo, produtividade, triagem e apoio operacional, mais do que à melhoria direta de desfechos clínicos.</w:t>
       </w:r>
     </w:p>
     <w:p>
@@ -3821,6 +4538,7 @@
           <w:ilvl w:val="1"/>
           <w:numId w:val="10"/>
         </w:numPr>
+        <w:spacing w:before="360" w:after="360"/>
       </w:pPr>
       <w:bookmarkStart w:id="1025" w:name="_TCC_H_1025"/>
       <w:r>
@@ -3941,7 +4659,43 @@
           <w:color w:val="000000"/>
           <w:sz w:val="24"/>
         </w:rPr>
-        <w:t xml:space="preserve"> (2025) tratam das limitações de modelos tradicionais de workflow em ambientes distribuídos. O trabalho propõe uma estrutura descentralizada baseada em swarm intelligence, ou inteligência de enxame. Esse conceito se refere a sistemas nos quais múltiplos agentes simples interagem entre si e produzem um comportamento coletivo, sem depender totalmente de um controlador central.</w:t>
+        <w:t xml:space="preserve"> (2025) tratam das limitações de modelos tradicionais de </w:t>
+      </w:r>
+      <w:r>
+        <w:rPr>
+          <w:rFonts w:ascii="Arial" w:hAnsi="Arial" w:eastAsia="Arial" w:cs="Arial"/>
+          <w:color w:val="000000"/>
+          <w:sz w:val="24"/>
+          <w:i w:val="1"/>
+          <w:iCs w:val="1"/>
+        </w:rPr>
+        <w:t>workflow</w:t>
+      </w:r>
+      <w:r>
+        <w:rPr>
+          <w:rFonts w:ascii="Arial" w:hAnsi="Arial" w:eastAsia="Arial" w:cs="Arial"/>
+          <w:color w:val="000000"/>
+          <w:sz w:val="24"/>
+        </w:rPr>
+        <w:t xml:space="preserve"> em ambientes distribuídos. O trabalho propõe uma estrutura descentralizada baseada em </w:t>
+      </w:r>
+      <w:r>
+        <w:rPr>
+          <w:rFonts w:ascii="Arial" w:hAnsi="Arial" w:eastAsia="Arial" w:cs="Arial"/>
+          <w:color w:val="000000"/>
+          <w:sz w:val="24"/>
+          <w:i w:val="1"/>
+          <w:iCs w:val="1"/>
+        </w:rPr>
+        <w:t>swarm intelligence</w:t>
+      </w:r>
+      <w:r>
+        <w:rPr>
+          <w:rFonts w:ascii="Arial" w:hAnsi="Arial" w:eastAsia="Arial" w:cs="Arial"/>
+          <w:color w:val="000000"/>
+          <w:sz w:val="24"/>
+        </w:rPr>
+        <w:t>, ou inteligência de enxame. Esse conceito se refere a sistemas nos quais múltiplos agentes simples interagem entre si e produzem um comportamento coletivo, sem depender totalmente de um controlador central.</w:t>
       </w:r>
     </w:p>
     <w:p>
@@ -3952,7 +4706,25 @@
           <w:color w:val="000000"/>
           <w:sz w:val="24"/>
         </w:rPr>
-        <w:t>Esse estudo é relevante porque aproxima a discussão da arquitetura swarm, uma das abordagens consideradas neste projeto. A lógica descentralizada pode oferecer maior flexibilidade, mas também pode trazer desafios de controle, rastreabilidade e consistência. Essa tensão é importante para a comparação proposta neste trabalho.</w:t>
+        <w:t xml:space="preserve">Esse estudo é relevante porque aproxima a discussão da arquitetura </w:t>
+      </w:r>
+      <w:r>
+        <w:rPr>
+          <w:rFonts w:ascii="Arial" w:hAnsi="Arial" w:eastAsia="Arial" w:cs="Arial"/>
+          <w:color w:val="000000"/>
+          <w:sz w:val="24"/>
+          <w:i w:val="1"/>
+          <w:iCs w:val="1"/>
+        </w:rPr>
+        <w:t>swarm</w:t>
+      </w:r>
+      <w:r>
+        <w:rPr>
+          <w:rFonts w:ascii="Arial" w:hAnsi="Arial" w:eastAsia="Arial" w:cs="Arial"/>
+          <w:color w:val="000000"/>
+          <w:sz w:val="24"/>
+        </w:rPr>
+        <w:t>, uma das abordagens consideradas neste projeto. A lógica descentralizada pode oferecer maior flexibilidade, mas também pode trazer desafios de controle, rastreabilidade e consistência. Essa tensão é importante para a comparação proposta neste trabalho.</w:t>
       </w:r>
     </w:p>
     <w:p>
@@ -3981,7 +4753,61 @@
           <w:color w:val="000000"/>
           <w:sz w:val="24"/>
         </w:rPr>
-        <w:t xml:space="preserve"> (2025; 2026) abordam diretamente um problema próximo ao desta monografia: como a arquitetura de coordenação afeta o desempenho de sistemas de agentes. A metodologia é experimental e compara diferentes arquiteturas, como agente único, arquitetura centralizada, descentralizada e híbrida, em múltiplos benchmarks. Nesse contexto, benchmark significa um conjunto de testes padronizados usado para comparar o desempenho de diferentes soluções. Os autores também utilizam o termo baseline, que representa um resultado de referência usado como ponto de comparação.</w:t>
+        <w:t xml:space="preserve"> (2025; 2026) abordam diretamente um problema próximo ao desta monografia: como a arquitetura de coordenação afeta o desempenho de sistemas de agentes. A metodologia é experimental e compara diferentes arquiteturas, como agente único, arquitetura centralizada, descentralizada e híbrida, em múltiplos </w:t>
+      </w:r>
+      <w:r>
+        <w:rPr>
+          <w:rFonts w:ascii="Arial" w:hAnsi="Arial" w:eastAsia="Arial" w:cs="Arial"/>
+          <w:color w:val="000000"/>
+          <w:sz w:val="24"/>
+          <w:i w:val="1"/>
+          <w:iCs w:val="1"/>
+        </w:rPr>
+        <w:t>benchmarks</w:t>
+      </w:r>
+      <w:r>
+        <w:rPr>
+          <w:rFonts w:ascii="Arial" w:hAnsi="Arial" w:eastAsia="Arial" w:cs="Arial"/>
+          <w:color w:val="000000"/>
+          <w:sz w:val="24"/>
+        </w:rPr>
+        <w:t xml:space="preserve">. Nesse contexto, </w:t>
+      </w:r>
+      <w:r>
+        <w:rPr>
+          <w:rFonts w:ascii="Arial" w:hAnsi="Arial" w:eastAsia="Arial" w:cs="Arial"/>
+          <w:color w:val="000000"/>
+          <w:sz w:val="24"/>
+          <w:i w:val="1"/>
+          <w:iCs w:val="1"/>
+        </w:rPr>
+        <w:t>benchmark</w:t>
+      </w:r>
+      <w:r>
+        <w:rPr>
+          <w:rFonts w:ascii="Arial" w:hAnsi="Arial" w:eastAsia="Arial" w:cs="Arial"/>
+          <w:color w:val="000000"/>
+          <w:sz w:val="24"/>
+        </w:rPr>
+        <w:t xml:space="preserve"> significa um conjunto de testes padronizados usado para comparar o desempenho de diferentes soluções. Os autores também utilizam o termo </w:t>
+      </w:r>
+      <w:r>
+        <w:rPr>
+          <w:rFonts w:ascii="Arial" w:hAnsi="Arial" w:eastAsia="Arial" w:cs="Arial"/>
+          <w:color w:val="000000"/>
+          <w:sz w:val="24"/>
+          <w:i w:val="1"/>
+          <w:iCs w:val="1"/>
+        </w:rPr>
+        <w:t>baseline</w:t>
+      </w:r>
+      <w:r>
+        <w:rPr>
+          <w:rFonts w:ascii="Arial" w:hAnsi="Arial" w:eastAsia="Arial" w:cs="Arial"/>
+          <w:color w:val="000000"/>
+          <w:sz w:val="24"/>
+        </w:rPr>
+        <w:t>, que representa um resultado de referência usado como ponto de comparação.</w:t>
       </w:r>
     </w:p>
     <w:p>
@@ -3992,7 +4818,61 @@
           <w:color w:val="000000"/>
           <w:sz w:val="24"/>
         </w:rPr>
-        <w:t>Os resultados mostram que não existe uma arquitetura universalmente melhor. Sistemas multiagentes podem superar o baseline em tarefas que podem ser divididas entre agentes, mas também podem apresentar desempenho inferior quando a tarefa exige uma sequência rígida de passos ou quando a coordenação entre agentes é inadequada. Essa conclusão é central para esta pesquisa, pois reforça a necessidade de comparar, no mesmo contexto farmacêutico, arquiteturas como orquestração, workflow e swarm.</w:t>
+        <w:t xml:space="preserve">Os resultados mostram que não existe uma arquitetura universalmente melhor. Sistemas multiagentes podem superar o </w:t>
+      </w:r>
+      <w:r>
+        <w:rPr>
+          <w:rFonts w:ascii="Arial" w:hAnsi="Arial" w:eastAsia="Arial" w:cs="Arial"/>
+          <w:color w:val="000000"/>
+          <w:sz w:val="24"/>
+          <w:i w:val="1"/>
+          <w:iCs w:val="1"/>
+        </w:rPr>
+        <w:t>baseline</w:t>
+      </w:r>
+      <w:r>
+        <w:rPr>
+          <w:rFonts w:ascii="Arial" w:hAnsi="Arial" w:eastAsia="Arial" w:cs="Arial"/>
+          <w:color w:val="000000"/>
+          <w:sz w:val="24"/>
+        </w:rPr>
+        <w:t xml:space="preserve"> em tarefas que podem ser divididas entre agentes, mas também podem apresentar desempenho inferior quando a tarefa exige uma sequência rígida de passos ou quando a coordenação entre agentes é inadequada. Essa conclusão é central para esta pesquisa, pois reforça a necessidade de comparar, no mesmo contexto farmacêutico, arquiteturas como orquestração, </w:t>
+      </w:r>
+      <w:r>
+        <w:rPr>
+          <w:rFonts w:ascii="Arial" w:hAnsi="Arial" w:eastAsia="Arial" w:cs="Arial"/>
+          <w:color w:val="000000"/>
+          <w:sz w:val="24"/>
+          <w:i w:val="1"/>
+          <w:iCs w:val="1"/>
+        </w:rPr>
+        <w:t>workflow</w:t>
+      </w:r>
+      <w:r>
+        <w:rPr>
+          <w:rFonts w:ascii="Arial" w:hAnsi="Arial" w:eastAsia="Arial" w:cs="Arial"/>
+          <w:color w:val="000000"/>
+          <w:sz w:val="24"/>
+        </w:rPr>
+        <w:t xml:space="preserve"> e </w:t>
+      </w:r>
+      <w:r>
+        <w:rPr>
+          <w:rFonts w:ascii="Arial" w:hAnsi="Arial" w:eastAsia="Arial" w:cs="Arial"/>
+          <w:color w:val="000000"/>
+          <w:sz w:val="24"/>
+          <w:i w:val="1"/>
+          <w:iCs w:val="1"/>
+        </w:rPr>
+        <w:t>swarm</w:t>
+      </w:r>
+      <w:r>
+        <w:rPr>
+          <w:rFonts w:ascii="Arial" w:hAnsi="Arial" w:eastAsia="Arial" w:cs="Arial"/>
+          <w:color w:val="000000"/>
+          <w:sz w:val="24"/>
+        </w:rPr>
+        <w:t>.</w:t>
       </w:r>
     </w:p>
     <w:p>
@@ -4002,6 +4882,7 @@
           <w:ilvl w:val="1"/>
           <w:numId w:val="10"/>
         </w:numPr>
+        <w:spacing w:before="360" w:after="360"/>
       </w:pPr>
       <w:bookmarkStart w:id="1026" w:name="_TCC_H_1026"/>
       <w:r>
@@ -4322,7 +5203,28 @@
                 <w:color w:val="000000"/>
                 <w:sz w:val="24"/>
               </w:rPr>
-              <w:t>A survey on LLM based multi-agent systems:  workflow, infrastructure, and challenges</w:t>
+              <w:t xml:space="preserve">A survey on LLM based multi-agent systems:  </w:t>
+            </w:r>
+            <w:r>
+              <w:rPr>
+                <w:rFonts w:ascii="Arial" w:hAnsi="Arial" w:eastAsia="Arial" w:cs="Arial"/>
+                <w:b w:val="0"/>
+                <w:i w:val="1"/>
+                <w:color w:val="000000"/>
+                <w:sz w:val="24"/>
+                <w:iCs w:val="1"/>
+              </w:rPr>
+              <w:t>workflow</w:t>
+            </w:r>
+            <w:r>
+              <w:rPr>
+                <w:rFonts w:ascii="Arial" w:hAnsi="Arial" w:eastAsia="Arial" w:cs="Arial"/>
+                <w:b w:val="0"/>
+                <w:i w:val="0"/>
+                <w:color w:val="000000"/>
+                <w:sz w:val="24"/>
+              </w:rPr>
+              <w:t>, infrastructure, and challenges</w:t>
             </w:r>
           </w:p>
         </w:tc>
@@ -4394,7 +5296,18 @@
                 <w:color w:val="000000"/>
                 <w:sz w:val="24"/>
               </w:rPr>
-              <w:t>Revisão sistemática; análise por componentes de workflow</w:t>
+              <w:t xml:space="preserve">Revisão sistemática; análise por componentes de </w:t>
+            </w:r>
+            <w:r>
+              <w:rPr>
+                <w:rFonts w:ascii="Arial" w:hAnsi="Arial" w:eastAsia="Arial" w:cs="Arial"/>
+                <w:b w:val="0"/>
+                <w:i w:val="1"/>
+                <w:color w:val="000000"/>
+                <w:sz w:val="24"/>
+                <w:iCs w:val="1"/>
+              </w:rPr>
+              <w:t>workflow</w:t>
             </w:r>
           </w:p>
         </w:tc>
@@ -4724,11 +5637,43 @@
               <w:rPr>
                 <w:rFonts w:ascii="Arial" w:hAnsi="Arial" w:eastAsia="Arial" w:cs="Arial"/>
                 <w:b w:val="0"/>
+                <w:i w:val="1"/>
+                <w:color w:val="000000"/>
+                <w:sz w:val="24"/>
+                <w:iCs w:val="1"/>
+              </w:rPr>
+              <w:t>SWARM</w:t>
+            </w:r>
+            <w:r>
+              <w:rPr>
+                <w:rFonts w:ascii="Arial" w:hAnsi="Arial" w:eastAsia="Arial" w:cs="Arial"/>
+                <w:b w:val="0"/>
                 <w:i w:val="0"/>
                 <w:color w:val="000000"/>
                 <w:sz w:val="24"/>
               </w:rPr>
-              <w:t>SWARM: Reimagining scientific workflow management systems in a distributed world</w:t>
+              <w:t xml:space="preserve">: Reimagining scientific </w:t>
+            </w:r>
+            <w:r>
+              <w:rPr>
+                <w:rFonts w:ascii="Arial" w:hAnsi="Arial" w:eastAsia="Arial" w:cs="Arial"/>
+                <w:b w:val="0"/>
+                <w:i w:val="1"/>
+                <w:color w:val="000000"/>
+                <w:sz w:val="24"/>
+                <w:iCs w:val="1"/>
+              </w:rPr>
+              <w:t>workflow</w:t>
+            </w:r>
+            <w:r>
+              <w:rPr>
+                <w:rFonts w:ascii="Arial" w:hAnsi="Arial" w:eastAsia="Arial" w:cs="Arial"/>
+                <w:b w:val="0"/>
+                <w:i w:val="0"/>
+                <w:color w:val="000000"/>
+                <w:sz w:val="24"/>
+              </w:rPr>
+              <w:t xml:space="preserve"> management systems in a distributed world</w:t>
             </w:r>
           </w:p>
         </w:tc>
@@ -4764,7 +5709,28 @@
                 <w:color w:val="000000"/>
                 <w:sz w:val="24"/>
               </w:rPr>
-              <w:t>Rigidez de workflows tradicionais em ambientes distribuídos</w:t>
+              <w:t xml:space="preserve">Rigidez de </w:t>
+            </w:r>
+            <w:r>
+              <w:rPr>
+                <w:rFonts w:ascii="Arial" w:hAnsi="Arial" w:eastAsia="Arial" w:cs="Arial"/>
+                <w:b w:val="0"/>
+                <w:i w:val="1"/>
+                <w:color w:val="000000"/>
+                <w:sz w:val="24"/>
+                <w:iCs w:val="1"/>
+              </w:rPr>
+              <w:t>workflows</w:t>
+            </w:r>
+            <w:r>
+              <w:rPr>
+                <w:rFonts w:ascii="Arial" w:hAnsi="Arial" w:eastAsia="Arial" w:cs="Arial"/>
+                <w:b w:val="0"/>
+                <w:i w:val="0"/>
+                <w:color w:val="000000"/>
+                <w:sz w:val="24"/>
+              </w:rPr>
+              <w:t xml:space="preserve"> tradicionais em ambientes distribuídos</w:t>
             </w:r>
           </w:p>
         </w:tc>
@@ -4800,7 +5766,18 @@
                 <w:color w:val="000000"/>
                 <w:sz w:val="24"/>
               </w:rPr>
-              <w:t>Framework descentralizado com swarm intelligence</w:t>
+              <w:t xml:space="preserve">Framework descentralizado com </w:t>
+            </w:r>
+            <w:r>
+              <w:rPr>
+                <w:rFonts w:ascii="Arial" w:hAnsi="Arial" w:eastAsia="Arial" w:cs="Arial"/>
+                <w:b w:val="0"/>
+                <w:i w:val="1"/>
+                <w:color w:val="000000"/>
+                <w:sz w:val="24"/>
+                <w:iCs w:val="1"/>
+              </w:rPr>
+              <w:t>swarm intelligence</w:t>
             </w:r>
           </w:p>
         </w:tc>
@@ -5202,11 +6179,22 @@
               <w:rPr>
                 <w:rFonts w:ascii="Arial" w:hAnsi="Arial" w:eastAsia="Arial" w:cs="Arial"/>
                 <w:b w:val="0"/>
+                <w:i w:val="1"/>
+                <w:color w:val="000000"/>
+                <w:sz w:val="24"/>
+                <w:iCs w:val="1"/>
+              </w:rPr>
+              <w:t>Pipeline</w:t>
+            </w:r>
+            <w:r>
+              <w:rPr>
+                <w:rFonts w:ascii="Arial" w:hAnsi="Arial" w:eastAsia="Arial" w:cs="Arial"/>
+                <w:b w:val="0"/>
                 <w:i w:val="0"/>
                 <w:color w:val="000000"/>
                 <w:sz w:val="24"/>
               </w:rPr>
-              <w:t>Pipeline com LLM, OCR, extração e matching</w:t>
+              <w:t xml:space="preserve"> com LLM, OCR, extração e matching</w:t>
             </w:r>
           </w:p>
         </w:tc>
@@ -5242,7 +6230,28 @@
                 <w:color w:val="000000"/>
                 <w:sz w:val="24"/>
               </w:rPr>
-              <w:t>Melhora recall e demonstra viabilidade de agentes no domínio farmacêutico</w:t>
+              <w:t xml:space="preserve">Melhora </w:t>
+            </w:r>
+            <w:r>
+              <w:rPr>
+                <w:rFonts w:ascii="Arial" w:hAnsi="Arial" w:eastAsia="Arial" w:cs="Arial"/>
+                <w:b w:val="0"/>
+                <w:i w:val="1"/>
+                <w:color w:val="000000"/>
+                <w:sz w:val="24"/>
+                <w:iCs w:val="1"/>
+              </w:rPr>
+              <w:t>recall</w:t>
+            </w:r>
+            <w:r>
+              <w:rPr>
+                <w:rFonts w:ascii="Arial" w:hAnsi="Arial" w:eastAsia="Arial" w:cs="Arial"/>
+                <w:b w:val="0"/>
+                <w:i w:val="0"/>
+                <w:color w:val="000000"/>
+                <w:sz w:val="24"/>
+              </w:rPr>
+              <w:t xml:space="preserve"> e demonstra viabilidade de agentes no domínio farmacêutico</w:t>
             </w:r>
           </w:p>
         </w:tc>
@@ -5337,7 +6346,18 @@
                 <w:color w:val="000000"/>
                 <w:sz w:val="24"/>
               </w:rPr>
-              <w:t>Applications of artificial intelligence in current pharmacy practice: A scoping review</w:t>
+              <w:t xml:space="preserve">Applications of artificial intelligence in current pharmacy practice: A </w:t>
+            </w:r>
+            <w:r>
+              <w:rPr>
+                <w:rFonts w:ascii="Arial" w:hAnsi="Arial" w:eastAsia="Arial" w:cs="Arial"/>
+                <w:b w:val="0"/>
+                <w:i w:val="1"/>
+                <w:color w:val="000000"/>
+                <w:sz w:val="24"/>
+                <w:iCs w:val="1"/>
+              </w:rPr>
+              <w:t>scoping review</w:t>
             </w:r>
           </w:p>
         </w:tc>
@@ -5405,11 +6425,22 @@
               <w:rPr>
                 <w:rFonts w:ascii="Arial" w:hAnsi="Arial" w:eastAsia="Arial" w:cs="Arial"/>
                 <w:b w:val="0"/>
+                <w:i w:val="1"/>
+                <w:color w:val="000000"/>
+                <w:sz w:val="24"/>
+                <w:iCs w:val="1"/>
+              </w:rPr>
+              <w:t>Scoping review</w:t>
+            </w:r>
+            <w:r>
+              <w:rPr>
+                <w:rFonts w:ascii="Arial" w:hAnsi="Arial" w:eastAsia="Arial" w:cs="Arial"/>
+                <w:b w:val="0"/>
                 <w:i w:val="0"/>
                 <w:color w:val="000000"/>
                 <w:sz w:val="24"/>
               </w:rPr>
-              <w:t>Scoping review com PRISMA-ScR</w:t>
+              <w:t xml:space="preserve"> com PRISMA-ScR</w:t>
             </w:r>
           </w:p>
         </w:tc>
@@ -5591,7 +6622,49 @@
                 <w:color w:val="000000"/>
                 <w:sz w:val="24"/>
               </w:rPr>
-              <w:t>Protótipo experimental com orquestração, workflow e swarm; métricas de tempo, resolução, distribuição e intervenção humana</w:t>
+              <w:t xml:space="preserve">Protótipo experimental com orquestração, </w:t>
+            </w:r>
+            <w:r>
+              <w:rPr>
+                <w:rFonts w:ascii="Arial" w:hAnsi="Arial" w:eastAsia="Arial" w:cs="Arial"/>
+                <w:b w:val="0"/>
+                <w:i w:val="1"/>
+                <w:color w:val="000000"/>
+                <w:sz w:val="24"/>
+                <w:iCs w:val="1"/>
+              </w:rPr>
+              <w:t>workflow</w:t>
+            </w:r>
+            <w:r>
+              <w:rPr>
+                <w:rFonts w:ascii="Arial" w:hAnsi="Arial" w:eastAsia="Arial" w:cs="Arial"/>
+                <w:b w:val="0"/>
+                <w:i w:val="0"/>
+                <w:color w:val="000000"/>
+                <w:sz w:val="24"/>
+              </w:rPr>
+              <w:t xml:space="preserve"> e </w:t>
+            </w:r>
+            <w:r>
+              <w:rPr>
+                <w:rFonts w:ascii="Arial" w:hAnsi="Arial" w:eastAsia="Arial" w:cs="Arial"/>
+                <w:b w:val="0"/>
+                <w:i w:val="1"/>
+                <w:color w:val="000000"/>
+                <w:sz w:val="24"/>
+                <w:iCs w:val="1"/>
+              </w:rPr>
+              <w:t>swarm</w:t>
+            </w:r>
+            <w:r>
+              <w:rPr>
+                <w:rFonts w:ascii="Arial" w:hAnsi="Arial" w:eastAsia="Arial" w:cs="Arial"/>
+                <w:b w:val="0"/>
+                <w:i w:val="0"/>
+                <w:color w:val="000000"/>
+                <w:sz w:val="24"/>
+              </w:rPr>
+              <w:t>; métricas de tempo, resolução, distribuição e intervenção humana</w:t>
             </w:r>
           </w:p>
         </w:tc>
@@ -5653,6 +6726,7 @@
           <w:ilvl w:val="1"/>
           <w:numId w:val="10"/>
         </w:numPr>
+        <w:spacing w:before="360" w:after="360"/>
       </w:pPr>
       <w:bookmarkStart w:id="1027" w:name="_TCC_H_1027"/>
       <w:r>
@@ -5686,7 +6760,43 @@
           <w:color w:val="000000"/>
           <w:sz w:val="24"/>
         </w:rPr>
-        <w:t>A lacuna identificada está justamente na comparação entre diferentes arquiteturas de coordenação dentro de um mesmo contexto farmacêutico. Em outras palavras, ainda há espaço para investigar como modelos como orquestração centralizada, workflow estruturado e swarm se comportam quando aplicados ao mesmo tipo de atendimento. Essa comparação é importante porque a escolha da arquitetura pode influenciar tempo de resposta, distribuição de tarefas, qualidade das respostas, necessidade de intervenção humana e controle do processo.</w:t>
+        <w:t xml:space="preserve">A lacuna identificada está justamente na comparação entre diferentes arquiteturas de coordenação dentro de um mesmo contexto farmacêutico. Em outras palavras, ainda há espaço para investigar como modelos como orquestração centralizada, </w:t>
+      </w:r>
+      <w:r>
+        <w:rPr>
+          <w:rFonts w:ascii="Arial" w:hAnsi="Arial" w:eastAsia="Arial" w:cs="Arial"/>
+          <w:color w:val="000000"/>
+          <w:sz w:val="24"/>
+          <w:i w:val="1"/>
+          <w:iCs w:val="1"/>
+        </w:rPr>
+        <w:t>workflow</w:t>
+      </w:r>
+      <w:r>
+        <w:rPr>
+          <w:rFonts w:ascii="Arial" w:hAnsi="Arial" w:eastAsia="Arial" w:cs="Arial"/>
+          <w:color w:val="000000"/>
+          <w:sz w:val="24"/>
+        </w:rPr>
+        <w:t xml:space="preserve"> estruturado e </w:t>
+      </w:r>
+      <w:r>
+        <w:rPr>
+          <w:rFonts w:ascii="Arial" w:hAnsi="Arial" w:eastAsia="Arial" w:cs="Arial"/>
+          <w:color w:val="000000"/>
+          <w:sz w:val="24"/>
+          <w:i w:val="1"/>
+          <w:iCs w:val="1"/>
+        </w:rPr>
+        <w:t>swarm</w:t>
+      </w:r>
+      <w:r>
+        <w:rPr>
+          <w:rFonts w:ascii="Arial" w:hAnsi="Arial" w:eastAsia="Arial" w:cs="Arial"/>
+          <w:color w:val="000000"/>
+          <w:sz w:val="24"/>
+        </w:rPr>
+        <w:t xml:space="preserve"> se comportam quando aplicados ao mesmo tipo de atendimento. Essa comparação é importante porque a escolha da arquitetura pode influenciar tempo de resposta, distribuição de tarefas, qualidade das respostas, necessidade de intervenção humana e controle do processo.</w:t>
       </w:r>
     </w:p>
     <w:p>
@@ -5791,7 +6901,25 @@
           <w:color w:val="000000"/>
           <w:sz w:val="24"/>
         </w:rPr>
-        <w:t xml:space="preserve"> aproximam a discussão da comparação arquitetural entre centralização, workflow e descentralização; Jagatap </w:t>
+        <w:t xml:space="preserve"> aproximam a discussão da comparação arquitetural entre centralização, </w:t>
+      </w:r>
+      <w:r>
+        <w:rPr>
+          <w:rFonts w:ascii="Arial" w:hAnsi="Arial" w:eastAsia="Arial" w:cs="Arial"/>
+          <w:color w:val="000000"/>
+          <w:sz w:val="24"/>
+          <w:i w:val="1"/>
+          <w:iCs w:val="1"/>
+        </w:rPr>
+        <w:t>workflow</w:t>
+      </w:r>
+      <w:r>
+        <w:rPr>
+          <w:rFonts w:ascii="Arial" w:hAnsi="Arial" w:eastAsia="Arial" w:cs="Arial"/>
+          <w:color w:val="000000"/>
+          <w:sz w:val="24"/>
+        </w:rPr>
+        <w:t xml:space="preserve"> e descentralização; Jagatap </w:t>
       </w:r>
       <w:r>
         <w:rPr>
@@ -5837,6 +6965,7 @@
           <w:ilvl w:val="0"/>
           <w:numId w:val="10"/>
         </w:numPr>
+        <w:spacing w:before="0" w:after="360"/>
       </w:pPr>
       <w:bookmarkStart w:id="1028" w:name="_TCC_H_1028"/>
       <w:r>
@@ -5858,6 +6987,7 @@
           <w:ilvl w:val="1"/>
           <w:numId w:val="10"/>
         </w:numPr>
+        <w:spacing w:before="0" w:after="360"/>
       </w:pPr>
       <w:bookmarkStart w:id="1029" w:name="_TCC_H_1029"/>
       <w:r>
@@ -5890,6 +7020,7 @@
           <w:ilvl w:val="1"/>
           <w:numId w:val="10"/>
         </w:numPr>
+        <w:spacing w:before="360" w:after="360"/>
       </w:pPr>
       <w:bookmarkStart w:id="1030" w:name="_TCC_H_1030"/>
       <w:r>
@@ -5912,7 +7043,43 @@
           <w:color w:val="000000"/>
           <w:sz w:val="24"/>
         </w:rPr>
-        <w:t>A revisão bibliográfica realizada até este estágio é classificada como revisão estruturada da literatura, e não como revisão sistemática. Foram usadas expressões relacionadas a sistemas multiagentes baseados em LLMs, orquestração, workflow, swarm, agentes distribuídos, avaliação de agentes e IA aplicada a farmácias. As fontes foram localizadas em páginas de editoras, bibliotecas digitais, repositórios de preprints e documentos institucionais. A rastreabilidade é mantida no registro vivo de referências, que armazena URL, prioridade, tipo, seção-alvo e decisão editorial.</w:t>
+        <w:t xml:space="preserve">A revisão bibliográfica realizada até este estágio é classificada como revisão estruturada da literatura, e não como revisão sistemática. Foram usadas expressões relacionadas a sistemas multiagentes baseados em LLMs, orquestração, </w:t>
+      </w:r>
+      <w:r>
+        <w:rPr>
+          <w:rFonts w:ascii="Arial" w:hAnsi="Arial" w:eastAsia="Arial" w:cs="Arial"/>
+          <w:color w:val="000000"/>
+          <w:sz w:val="24"/>
+          <w:i w:val="1"/>
+          <w:iCs w:val="1"/>
+        </w:rPr>
+        <w:t>workflow</w:t>
+      </w:r>
+      <w:r>
+        <w:rPr>
+          <w:rFonts w:ascii="Arial" w:hAnsi="Arial" w:eastAsia="Arial" w:cs="Arial"/>
+          <w:color w:val="000000"/>
+          <w:sz w:val="24"/>
+        </w:rPr>
+        <w:t xml:space="preserve">, </w:t>
+      </w:r>
+      <w:r>
+        <w:rPr>
+          <w:rFonts w:ascii="Arial" w:hAnsi="Arial" w:eastAsia="Arial" w:cs="Arial"/>
+          <w:color w:val="000000"/>
+          <w:sz w:val="24"/>
+          <w:i w:val="1"/>
+          <w:iCs w:val="1"/>
+        </w:rPr>
+        <w:t>swarm</w:t>
+      </w:r>
+      <w:r>
+        <w:rPr>
+          <w:rFonts w:ascii="Arial" w:hAnsi="Arial" w:eastAsia="Arial" w:cs="Arial"/>
+          <w:color w:val="000000"/>
+          <w:sz w:val="24"/>
+        </w:rPr>
+        <w:t>, agentes distribuídos, avaliação de agentes e IA aplicada a farmácias. As fontes foram localizadas em páginas de editoras, bibliotecas digitais, repositórios de preprints e documentos institucionais. A rastreabilidade é mantida no registro vivo de referências, que armazena URL, prioridade, tipo, seção-alvo e decisão editorial.</w:t>
       </w:r>
     </w:p>
     <w:p>
@@ -5934,7 +7101,61 @@
           <w:color w:val="000000"/>
           <w:sz w:val="24"/>
         </w:rPr>
-        <w:t>O desenvolvimento tecnológico foi dividido em quatro etapas: modelagem de uma interface comum de execução; implementação das arquiteturas centralizada, workflow e swarm; instrumentação de eventos e métricas; e preparação dos cenários comparáveis. A etapa experimental utilizará a mesma entrada, conjunto de ferramentas, modelo, configuração e limites operacionais para as três arquiteturas. Ordem de execução, repetições, seed quando disponível, versão do código e parâmetros do modelo deverão ser preservados junto aos artefatos do experimento.</w:t>
+        <w:t xml:space="preserve">O desenvolvimento tecnológico foi dividido em quatro etapas: modelagem de uma interface comum de execução; implementação das arquiteturas centralizada, </w:t>
+      </w:r>
+      <w:r>
+        <w:rPr>
+          <w:rFonts w:ascii="Arial" w:hAnsi="Arial" w:eastAsia="Arial" w:cs="Arial"/>
+          <w:color w:val="000000"/>
+          <w:sz w:val="24"/>
+          <w:i w:val="1"/>
+          <w:iCs w:val="1"/>
+        </w:rPr>
+        <w:t>workflow</w:t>
+      </w:r>
+      <w:r>
+        <w:rPr>
+          <w:rFonts w:ascii="Arial" w:hAnsi="Arial" w:eastAsia="Arial" w:cs="Arial"/>
+          <w:color w:val="000000"/>
+          <w:sz w:val="24"/>
+        </w:rPr>
+        <w:t xml:space="preserve"> e </w:t>
+      </w:r>
+      <w:r>
+        <w:rPr>
+          <w:rFonts w:ascii="Arial" w:hAnsi="Arial" w:eastAsia="Arial" w:cs="Arial"/>
+          <w:color w:val="000000"/>
+          <w:sz w:val="24"/>
+          <w:i w:val="1"/>
+          <w:iCs w:val="1"/>
+        </w:rPr>
+        <w:t>swarm</w:t>
+      </w:r>
+      <w:r>
+        <w:rPr>
+          <w:rFonts w:ascii="Arial" w:hAnsi="Arial" w:eastAsia="Arial" w:cs="Arial"/>
+          <w:color w:val="000000"/>
+          <w:sz w:val="24"/>
+        </w:rPr>
+        <w:t xml:space="preserve">; instrumentação de eventos e métricas; e preparação dos cenários comparáveis. A etapa experimental utilizará a mesma entrada, conjunto de ferramentas, modelo, configuração e limites operacionais para as três arquiteturas. Ordem de execução, repetições, </w:t>
+      </w:r>
+      <w:r>
+        <w:rPr>
+          <w:rFonts w:ascii="Arial" w:hAnsi="Arial" w:eastAsia="Arial" w:cs="Arial"/>
+          <w:color w:val="000000"/>
+          <w:sz w:val="24"/>
+          <w:i w:val="1"/>
+          <w:iCs w:val="1"/>
+        </w:rPr>
+        <w:t>seed</w:t>
+      </w:r>
+      <w:r>
+        <w:rPr>
+          <w:rFonts w:ascii="Arial" w:hAnsi="Arial" w:eastAsia="Arial" w:cs="Arial"/>
+          <w:color w:val="000000"/>
+          <w:sz w:val="24"/>
+        </w:rPr>
+        <w:t xml:space="preserve"> quando disponível, versão do código e parâmetros do modelo deverão ser preservados junto aos artefatos do experimento.</w:t>
       </w:r>
     </w:p>
     <w:p>
@@ -5955,6 +7176,7 @@
           <w:ilvl w:val="1"/>
           <w:numId w:val="10"/>
         </w:numPr>
+        <w:spacing w:before="360" w:after="360"/>
       </w:pPr>
       <w:bookmarkStart w:id="1031" w:name="_TCC_H_1031"/>
       <w:r>
@@ -5977,7 +7199,43 @@
           <w:color w:val="000000"/>
           <w:sz w:val="24"/>
         </w:rPr>
-        <w:t>A pergunta de pesquisa é: como a escolha entre orquestração centralizada, workflow estruturado e coordenação descentralizada por handoffs influencia a eficiência operacional, a qualidade das respostas e o custo de coordenação de um sistema de atendimento farmacêutico, quando as demais condições são mantidas constantes?</w:t>
+        <w:t xml:space="preserve">A pergunta de pesquisa é: como a escolha entre orquestração centralizada, </w:t>
+      </w:r>
+      <w:r>
+        <w:rPr>
+          <w:rFonts w:ascii="Arial" w:hAnsi="Arial" w:eastAsia="Arial" w:cs="Arial"/>
+          <w:color w:val="000000"/>
+          <w:sz w:val="24"/>
+          <w:i w:val="1"/>
+          <w:iCs w:val="1"/>
+        </w:rPr>
+        <w:t>workflow</w:t>
+      </w:r>
+      <w:r>
+        <w:rPr>
+          <w:rFonts w:ascii="Arial" w:hAnsi="Arial" w:eastAsia="Arial" w:cs="Arial"/>
+          <w:color w:val="000000"/>
+          <w:sz w:val="24"/>
+        </w:rPr>
+        <w:t xml:space="preserve"> estruturado e coordenação descentralizada por </w:t>
+      </w:r>
+      <w:r>
+        <w:rPr>
+          <w:rFonts w:ascii="Arial" w:hAnsi="Arial" w:eastAsia="Arial" w:cs="Arial"/>
+          <w:color w:val="000000"/>
+          <w:sz w:val="24"/>
+          <w:i w:val="1"/>
+          <w:iCs w:val="1"/>
+        </w:rPr>
+        <w:t>handoffs</w:t>
+      </w:r>
+      <w:r>
+        <w:rPr>
+          <w:rFonts w:ascii="Arial" w:hAnsi="Arial" w:eastAsia="Arial" w:cs="Arial"/>
+          <w:color w:val="000000"/>
+          <w:sz w:val="24"/>
+        </w:rPr>
+        <w:t xml:space="preserve"> influencia a eficiência operacional, a qualidade das respostas e o custo de coordenação de um sistema de atendimento farmacêutico, quando as demais condições são mantidas constantes?</w:t>
       </w:r>
     </w:p>
     <w:p>
@@ -6057,6 +7315,7 @@
           <w:ilvl w:val="1"/>
           <w:numId w:val="10"/>
         </w:numPr>
+        <w:spacing w:before="360" w:after="360"/>
       </w:pPr>
       <w:bookmarkStart w:id="1032" w:name="_TCC_H_1032"/>
       <w:r>
@@ -6079,7 +7338,25 @@
           <w:color w:val="000000"/>
           <w:sz w:val="24"/>
         </w:rPr>
-        <w:t>As métricas operacionais disponíveis no protótipo serão calculadas por arquitetura e por cenário. O sucesso técnico corresponde à conclusão da execução sem erro; a latência será resumida por mediana (p50) e percentil 95 (p95); tokens serão separados em entrada, saída e total; chamadas de ferramenta, erros de ferramenta, ciclos e handoffs serão contados a partir da telemetria; e a taxa de revisão corresponderá à proporção de execuções encaminhadas para avaliação humana.</w:t>
+        <w:t xml:space="preserve">As métricas operacionais disponíveis no protótipo serão calculadas por arquitetura e por cenário. O sucesso técnico corresponde à conclusão da execução sem erro; a latência será resumida por mediana (p50) e percentil 95 (p95); tokens serão separados em entrada, saída e total; chamadas de ferramenta, erros de ferramenta, ciclos e </w:t>
+      </w:r>
+      <w:r>
+        <w:rPr>
+          <w:rFonts w:ascii="Arial" w:hAnsi="Arial" w:eastAsia="Arial" w:cs="Arial"/>
+          <w:color w:val="000000"/>
+          <w:sz w:val="24"/>
+          <w:i w:val="1"/>
+          <w:iCs w:val="1"/>
+        </w:rPr>
+        <w:t>handoffs</w:t>
+      </w:r>
+      <w:r>
+        <w:rPr>
+          <w:rFonts w:ascii="Arial" w:hAnsi="Arial" w:eastAsia="Arial" w:cs="Arial"/>
+          <w:color w:val="000000"/>
+          <w:sz w:val="24"/>
+        </w:rPr>
+        <w:t xml:space="preserve"> serão contados a partir da telemetria; e a taxa de revisão corresponderá à proporção de execuções encaminhadas para avaliação humana.</w:t>
       </w:r>
     </w:p>
     <w:p>
@@ -6090,7 +7367,25 @@
           <w:color w:val="000000"/>
           <w:sz w:val="24"/>
         </w:rPr>
-        <w:t>A qualidade da resposta não será inferida apenas pelo sucesso técnico. Ela exigirá uma rubrica que considere correção em relação ao cenário, aderência à intenção, segurança, completude e clareza. A escolha entre avaliação humana, LLM-as-Judge ou abordagem híbrida permanece aberta na OQ-002. Até essa decisão, a métrica de qualidade é um campo metodológico pendente e não será calculada retroativamente sem registrar a versão da rubrica.</w:t>
+        <w:t xml:space="preserve">A qualidade da resposta não será inferida apenas pelo sucesso técnico. Ela exigirá uma rubrica que considere correção em relação ao cenário, aderência à intenção, segurança, completude e clareza. A escolha entre avaliação humana, </w:t>
+      </w:r>
+      <w:r>
+        <w:rPr>
+          <w:rFonts w:ascii="Arial" w:hAnsi="Arial" w:eastAsia="Arial" w:cs="Arial"/>
+          <w:color w:val="000000"/>
+          <w:sz w:val="24"/>
+          <w:i w:val="1"/>
+          <w:iCs w:val="1"/>
+        </w:rPr>
+        <w:t>LLM-as-Judge</w:t>
+      </w:r>
+      <w:r>
+        <w:rPr>
+          <w:rFonts w:ascii="Arial" w:hAnsi="Arial" w:eastAsia="Arial" w:cs="Arial"/>
+          <w:color w:val="000000"/>
+          <w:sz w:val="24"/>
+        </w:rPr>
+        <w:t xml:space="preserve"> ou abordagem híbrida permanece aberta na OQ-002. Até essa decisão, a métrica de qualidade é um campo metodológico pendente e não será calculada retroativamente sem registrar a versão da rubrica.</w:t>
       </w:r>
     </w:p>
     <w:p>
@@ -6111,6 +7406,7 @@
           <w:ilvl w:val="0"/>
           <w:numId w:val="10"/>
         </w:numPr>
+        <w:spacing w:before="0" w:after="360"/>
       </w:pPr>
       <w:bookmarkStart w:id="1033" w:name="_TCC_H_1033"/>
       <w:r>
@@ -6132,6 +7428,7 @@
           <w:ilvl w:val="1"/>
           <w:numId w:val="10"/>
         </w:numPr>
+        <w:spacing w:before="0" w:after="360"/>
       </w:pPr>
       <w:bookmarkStart w:id="1034" w:name="_TCC_H_1034"/>
       <w:r>
@@ -6154,7 +7451,25 @@
           <w:color w:val="000000"/>
           <w:sz w:val="24"/>
         </w:rPr>
-        <w:t>O MAB foi modelado para comparar estratégias de coordenação sem alterar o domínio, as ferramentas ou o formato de entrada. O sistema recebe mensagens de atendimento, persiste a conversa, cria uma execução identificada como run e encaminha a solicitação ao serviço responsável pelos agentes. A arquitetura selecionada processa o mesmo contrato de entrada e devolve, além do texto final, eventos que descrevem decisões, ferramentas, transferências e necessidade de revisão.</w:t>
+        <w:t xml:space="preserve">O MAB foi modelado para comparar estratégias de coordenação sem alterar o domínio, as ferramentas ou o formato de entrada. O sistema recebe mensagens de atendimento, persiste a conversa, cria uma execução identificada como </w:t>
+      </w:r>
+      <w:r>
+        <w:rPr>
+          <w:rFonts w:ascii="Arial" w:hAnsi="Arial" w:eastAsia="Arial" w:cs="Arial"/>
+          <w:color w:val="000000"/>
+          <w:sz w:val="24"/>
+          <w:i w:val="1"/>
+          <w:iCs w:val="1"/>
+        </w:rPr>
+        <w:t>run</w:t>
+      </w:r>
+      <w:r>
+        <w:rPr>
+          <w:rFonts w:ascii="Arial" w:hAnsi="Arial" w:eastAsia="Arial" w:cs="Arial"/>
+          <w:color w:val="000000"/>
+          <w:sz w:val="24"/>
+        </w:rPr>
+        <w:t xml:space="preserve"> e encaminha a solicitação ao serviço responsável pelos agentes. A arquitetura selecionada processa o mesmo contrato de entrada e devolve, além do texto final, eventos que descrevem decisões, ferramentas, transferências e necessidade de revisão.</w:t>
       </w:r>
     </w:p>
     <w:p>
@@ -6165,7 +7480,25 @@
           <w:color w:val="000000"/>
           <w:sz w:val="24"/>
         </w:rPr>
-        <w:t>A separação entre canal, API e runtime permite que uma mensagem proveniente da interface web ou de uma integração futura seja normalizada antes de chegar aos agentes. Essa decisão evita acoplar as arquiteturas ao WhatsApp e mantém o experimento centrado no mecanismo de coordenação.</w:t>
+        <w:t xml:space="preserve">A separação entre canal, API e </w:t>
+      </w:r>
+      <w:r>
+        <w:rPr>
+          <w:rFonts w:ascii="Arial" w:hAnsi="Arial" w:eastAsia="Arial" w:cs="Arial"/>
+          <w:color w:val="000000"/>
+          <w:sz w:val="24"/>
+          <w:i w:val="1"/>
+          <w:iCs w:val="1"/>
+        </w:rPr>
+        <w:t>runtime</w:t>
+      </w:r>
+      <w:r>
+        <w:rPr>
+          <w:rFonts w:ascii="Arial" w:hAnsi="Arial" w:eastAsia="Arial" w:cs="Arial"/>
+          <w:color w:val="000000"/>
+          <w:sz w:val="24"/>
+        </w:rPr>
+        <w:t xml:space="preserve"> permite que uma mensagem proveniente da interface web ou de uma integração futura seja normalizada antes de chegar aos agentes. Essa decisão evita acoplar as arquiteturas ao WhatsApp e mantém o experimento centrado no mecanismo de coordenação.</w:t>
       </w:r>
     </w:p>
     <w:p>
@@ -6175,6 +7508,7 @@
           <w:ilvl w:val="1"/>
           <w:numId w:val="10"/>
         </w:numPr>
+        <w:spacing w:before="360" w:after="360"/>
       </w:pPr>
       <w:bookmarkStart w:id="1035" w:name="_TCC_H_1035"/>
       <w:r>
@@ -6197,7 +7531,97 @@
           <w:color w:val="000000"/>
           <w:sz w:val="24"/>
         </w:rPr>
-        <w:t>A solução é organizada em três camadas. A camada de interação recebe mensagens e exibe respostas, eventos e painéis de acompanhamento. A API transacional gerencia conversas, mensagens, anexos, runs e persistência. O runtime dos agentes implementa uma interface comum de execução e registra as arquiteturas centralized_orchestration, structured_workflow e decentralized_swarm.</w:t>
+        <w:t xml:space="preserve">A solução é organizada em três camadas. A camada de interação recebe mensagens e exibe respostas, eventos e painéis de acompanhamento. A API transacional gerencia conversas, mensagens, anexos, </w:t>
+      </w:r>
+      <w:r>
+        <w:rPr>
+          <w:rFonts w:ascii="Arial" w:hAnsi="Arial" w:eastAsia="Arial" w:cs="Arial"/>
+          <w:color w:val="000000"/>
+          <w:sz w:val="24"/>
+          <w:i w:val="1"/>
+          <w:iCs w:val="1"/>
+        </w:rPr>
+        <w:t>runs</w:t>
+      </w:r>
+      <w:r>
+        <w:rPr>
+          <w:rFonts w:ascii="Arial" w:hAnsi="Arial" w:eastAsia="Arial" w:cs="Arial"/>
+          <w:color w:val="000000"/>
+          <w:sz w:val="24"/>
+        </w:rPr>
+        <w:t xml:space="preserve"> e persistência. O </w:t>
+      </w:r>
+      <w:r>
+        <w:rPr>
+          <w:rFonts w:ascii="Arial" w:hAnsi="Arial" w:eastAsia="Arial" w:cs="Arial"/>
+          <w:color w:val="000000"/>
+          <w:sz w:val="24"/>
+          <w:i w:val="1"/>
+          <w:iCs w:val="1"/>
+        </w:rPr>
+        <w:t>runtime</w:t>
+      </w:r>
+      <w:r>
+        <w:rPr>
+          <w:rFonts w:ascii="Arial" w:hAnsi="Arial" w:eastAsia="Arial" w:cs="Arial"/>
+          <w:color w:val="000000"/>
+          <w:sz w:val="24"/>
+        </w:rPr>
+        <w:t xml:space="preserve"> dos agentes implementa uma interface comum de execução e registra as arquiteturas </w:t>
+      </w:r>
+      <w:r>
+        <w:rPr>
+          <w:rFonts w:ascii="Arial" w:hAnsi="Arial" w:eastAsia="Arial" w:cs="Arial"/>
+          <w:color w:val="000000"/>
+          <w:sz w:val="24"/>
+          <w:i w:val="1"/>
+          <w:iCs w:val="1"/>
+        </w:rPr>
+        <w:t>centralized_orchestration</w:t>
+      </w:r>
+      <w:r>
+        <w:rPr>
+          <w:rFonts w:ascii="Arial" w:hAnsi="Arial" w:eastAsia="Arial" w:cs="Arial"/>
+          <w:color w:val="000000"/>
+          <w:sz w:val="24"/>
+        </w:rPr>
+        <w:t xml:space="preserve">, </w:t>
+      </w:r>
+      <w:r>
+        <w:rPr>
+          <w:rFonts w:ascii="Arial" w:hAnsi="Arial" w:eastAsia="Arial" w:cs="Arial"/>
+          <w:color w:val="000000"/>
+          <w:sz w:val="24"/>
+          <w:i w:val="1"/>
+          <w:iCs w:val="1"/>
+        </w:rPr>
+        <w:t>structured_workflow</w:t>
+      </w:r>
+      <w:r>
+        <w:rPr>
+          <w:rFonts w:ascii="Arial" w:hAnsi="Arial" w:eastAsia="Arial" w:cs="Arial"/>
+          <w:color w:val="000000"/>
+          <w:sz w:val="24"/>
+        </w:rPr>
+        <w:t xml:space="preserve"> e </w:t>
+      </w:r>
+      <w:r>
+        <w:rPr>
+          <w:rFonts w:ascii="Arial" w:hAnsi="Arial" w:eastAsia="Arial" w:cs="Arial"/>
+          <w:color w:val="000000"/>
+          <w:sz w:val="24"/>
+          <w:i w:val="1"/>
+          <w:iCs w:val="1"/>
+        </w:rPr>
+        <w:t>decentralized_swarm</w:t>
+      </w:r>
+      <w:r>
+        <w:rPr>
+          <w:rFonts w:ascii="Arial" w:hAnsi="Arial" w:eastAsia="Arial" w:cs="Arial"/>
+          <w:color w:val="000000"/>
+          <w:sz w:val="24"/>
+        </w:rPr>
+        <w:t>.</w:t>
       </w:r>
     </w:p>
     <w:p>
@@ -6208,7 +7632,43 @@
           <w:color w:val="000000"/>
           <w:sz w:val="24"/>
         </w:rPr>
-        <w:t>Todas as estratégias recebem o mesmo objeto de requisição, que inclui a mensagem atual, histórico recente, anexos e metadados. O contexto de execução concentra emissão de eventos, contagem de tokens, chamadas de ferramentas, loops, handoffs e tempo decorrido. Essa interface comum é essencial para a validade interna da comparação, pois reduz diferenças que não pertencem à arquitetura avaliada.</w:t>
+        <w:t xml:space="preserve">Todas as estratégias recebem o mesmo objeto de requisição, que inclui a mensagem atual, histórico recente, anexos e metadados. O contexto de execução concentra emissão de eventos, contagem de tokens, chamadas de ferramentas, </w:t>
+      </w:r>
+      <w:r>
+        <w:rPr>
+          <w:rFonts w:ascii="Arial" w:hAnsi="Arial" w:eastAsia="Arial" w:cs="Arial"/>
+          <w:color w:val="000000"/>
+          <w:sz w:val="24"/>
+          <w:i w:val="1"/>
+          <w:iCs w:val="1"/>
+        </w:rPr>
+        <w:t>loops</w:t>
+      </w:r>
+      <w:r>
+        <w:rPr>
+          <w:rFonts w:ascii="Arial" w:hAnsi="Arial" w:eastAsia="Arial" w:cs="Arial"/>
+          <w:color w:val="000000"/>
+          <w:sz w:val="24"/>
+        </w:rPr>
+        <w:t xml:space="preserve">, </w:t>
+      </w:r>
+      <w:r>
+        <w:rPr>
+          <w:rFonts w:ascii="Arial" w:hAnsi="Arial" w:eastAsia="Arial" w:cs="Arial"/>
+          <w:color w:val="000000"/>
+          <w:sz w:val="24"/>
+          <w:i w:val="1"/>
+          <w:iCs w:val="1"/>
+        </w:rPr>
+        <w:t>handoffs</w:t>
+      </w:r>
+      <w:r>
+        <w:rPr>
+          <w:rFonts w:ascii="Arial" w:hAnsi="Arial" w:eastAsia="Arial" w:cs="Arial"/>
+          <w:color w:val="000000"/>
+          <w:sz w:val="24"/>
+        </w:rPr>
+        <w:t xml:space="preserve"> e tempo decorrido. Essa interface comum é essencial para a validade interna da comparação, pois reduz diferenças que não pertencem à arquitetura avaliada.</w:t>
       </w:r>
     </w:p>
     <w:p>
@@ -6218,6 +7678,7 @@
           <w:ilvl w:val="1"/>
           <w:numId w:val="10"/>
         </w:numPr>
+        <w:spacing w:before="360" w:after="360"/>
       </w:pPr>
       <w:bookmarkStart w:id="1036" w:name="_TCC_H_1036"/>
       <w:r>
@@ -6240,7 +7701,61 @@
           <w:color w:val="000000"/>
           <w:sz w:val="24"/>
         </w:rPr>
-        <w:t>O supervisor da arquitetura centralizada classifica a mensagem, escolhe entre FAQ, estoque e análise de anexos e compõe a resposta. No workflow, agentes especializados executam estágios ordenados de classificação, coleta de evidência, revisão e síntese. No swarm, um coordenador inicia a delegação; especialistas de FAQ, estoque e anexos podem realizar handoffs entre pares; e um sintetizador produz a saída final quando necessário.</w:t>
+        <w:t xml:space="preserve">O supervisor da arquitetura centralizada classifica a mensagem, escolhe entre FAQ, estoque e análise de anexos e compõe a resposta. No </w:t>
+      </w:r>
+      <w:r>
+        <w:rPr>
+          <w:rFonts w:ascii="Arial" w:hAnsi="Arial" w:eastAsia="Arial" w:cs="Arial"/>
+          <w:color w:val="000000"/>
+          <w:sz w:val="24"/>
+          <w:i w:val="1"/>
+          <w:iCs w:val="1"/>
+        </w:rPr>
+        <w:t>workflow</w:t>
+      </w:r>
+      <w:r>
+        <w:rPr>
+          <w:rFonts w:ascii="Arial" w:hAnsi="Arial" w:eastAsia="Arial" w:cs="Arial"/>
+          <w:color w:val="000000"/>
+          <w:sz w:val="24"/>
+        </w:rPr>
+        <w:t xml:space="preserve">, agentes especializados executam estágios ordenados de classificação, coleta de evidência, revisão e síntese. No </w:t>
+      </w:r>
+      <w:r>
+        <w:rPr>
+          <w:rFonts w:ascii="Arial" w:hAnsi="Arial" w:eastAsia="Arial" w:cs="Arial"/>
+          <w:color w:val="000000"/>
+          <w:sz w:val="24"/>
+          <w:i w:val="1"/>
+          <w:iCs w:val="1"/>
+        </w:rPr>
+        <w:t>swarm</w:t>
+      </w:r>
+      <w:r>
+        <w:rPr>
+          <w:rFonts w:ascii="Arial" w:hAnsi="Arial" w:eastAsia="Arial" w:cs="Arial"/>
+          <w:color w:val="000000"/>
+          <w:sz w:val="24"/>
+        </w:rPr>
+        <w:t xml:space="preserve">, um coordenador inicia a delegação; especialistas de FAQ, estoque e anexos podem realizar </w:t>
+      </w:r>
+      <w:r>
+        <w:rPr>
+          <w:rFonts w:ascii="Arial" w:hAnsi="Arial" w:eastAsia="Arial" w:cs="Arial"/>
+          <w:color w:val="000000"/>
+          <w:sz w:val="24"/>
+          <w:i w:val="1"/>
+          <w:iCs w:val="1"/>
+        </w:rPr>
+        <w:t>handoffs</w:t>
+      </w:r>
+      <w:r>
+        <w:rPr>
+          <w:rFonts w:ascii="Arial" w:hAnsi="Arial" w:eastAsia="Arial" w:cs="Arial"/>
+          <w:color w:val="000000"/>
+          <w:sz w:val="24"/>
+        </w:rPr>
+        <w:t xml:space="preserve"> entre pares; e um sintetizador produz a saída final quando necessário.</w:t>
       </w:r>
     </w:p>
     <w:p>
@@ -6251,7 +7766,43 @@
           <w:color w:val="000000"/>
           <w:sz w:val="24"/>
         </w:rPr>
-        <w:t>As ferramentas de domínio são funções separadas dos agentes. Elas retornam dados de FAQ, disponibilidade simulada e informações iniciais sobre anexos. A revisão humana é representada por um indicador explícito na run. A telemetria utiliza eventos de início, conclusão e falha para nós, ferramentas, mensagens e handoffs, permitindo reconstruir o caminho de cada execução.</w:t>
+        <w:t xml:space="preserve">As ferramentas de domínio são funções separadas dos agentes. Elas retornam dados de FAQ, disponibilidade simulada e informações iniciais sobre anexos. A revisão humana é representada por um indicador explícito na </w:t>
+      </w:r>
+      <w:r>
+        <w:rPr>
+          <w:rFonts w:ascii="Arial" w:hAnsi="Arial" w:eastAsia="Arial" w:cs="Arial"/>
+          <w:color w:val="000000"/>
+          <w:sz w:val="24"/>
+          <w:i w:val="1"/>
+          <w:iCs w:val="1"/>
+        </w:rPr>
+        <w:t>run</w:t>
+      </w:r>
+      <w:r>
+        <w:rPr>
+          <w:rFonts w:ascii="Arial" w:hAnsi="Arial" w:eastAsia="Arial" w:cs="Arial"/>
+          <w:color w:val="000000"/>
+          <w:sz w:val="24"/>
+        </w:rPr>
+        <w:t xml:space="preserve">. A telemetria utiliza eventos de início, conclusão e falha para nós, ferramentas, mensagens e </w:t>
+      </w:r>
+      <w:r>
+        <w:rPr>
+          <w:rFonts w:ascii="Arial" w:hAnsi="Arial" w:eastAsia="Arial" w:cs="Arial"/>
+          <w:color w:val="000000"/>
+          <w:sz w:val="24"/>
+          <w:i w:val="1"/>
+          <w:iCs w:val="1"/>
+        </w:rPr>
+        <w:t>handoffs</w:t>
+      </w:r>
+      <w:r>
+        <w:rPr>
+          <w:rFonts w:ascii="Arial" w:hAnsi="Arial" w:eastAsia="Arial" w:cs="Arial"/>
+          <w:color w:val="000000"/>
+          <w:sz w:val="24"/>
+        </w:rPr>
+        <w:t>, permitindo reconstruir o caminho de cada execução.</w:t>
       </w:r>
     </w:p>
     <w:p>
@@ -6262,7 +7813,61 @@
           <w:color w:val="000000"/>
           <w:sz w:val="24"/>
         </w:rPr>
-        <w:t>O armazenamento relacional preserva conversas, mensagens e runs, enquanto anexos podem ser mantidos em armazenamento local ou compatível com S3. Contratos compartilhados reduzem divergências entre frontend, API e runtime. Nenhum desses componentes autoriza armazenamento de conversas reais do WhatsApp no repositório público.</w:t>
+        <w:t xml:space="preserve">O armazenamento relacional preserva conversas, mensagens e </w:t>
+      </w:r>
+      <w:r>
+        <w:rPr>
+          <w:rFonts w:ascii="Arial" w:hAnsi="Arial" w:eastAsia="Arial" w:cs="Arial"/>
+          <w:color w:val="000000"/>
+          <w:sz w:val="24"/>
+          <w:i w:val="1"/>
+          <w:iCs w:val="1"/>
+        </w:rPr>
+        <w:t>runs</w:t>
+      </w:r>
+      <w:r>
+        <w:rPr>
+          <w:rFonts w:ascii="Arial" w:hAnsi="Arial" w:eastAsia="Arial" w:cs="Arial"/>
+          <w:color w:val="000000"/>
+          <w:sz w:val="24"/>
+        </w:rPr>
+        <w:t xml:space="preserve">, enquanto anexos podem ser mantidos em armazenamento local ou compatível com S3. Contratos compartilhados reduzem divergências entre </w:t>
+      </w:r>
+      <w:r>
+        <w:rPr>
+          <w:rFonts w:ascii="Arial" w:hAnsi="Arial" w:eastAsia="Arial" w:cs="Arial"/>
+          <w:color w:val="000000"/>
+          <w:sz w:val="24"/>
+          <w:i w:val="1"/>
+          <w:iCs w:val="1"/>
+        </w:rPr>
+        <w:t>frontend</w:t>
+      </w:r>
+      <w:r>
+        <w:rPr>
+          <w:rFonts w:ascii="Arial" w:hAnsi="Arial" w:eastAsia="Arial" w:cs="Arial"/>
+          <w:color w:val="000000"/>
+          <w:sz w:val="24"/>
+        </w:rPr>
+        <w:t xml:space="preserve">, API e </w:t>
+      </w:r>
+      <w:r>
+        <w:rPr>
+          <w:rFonts w:ascii="Arial" w:hAnsi="Arial" w:eastAsia="Arial" w:cs="Arial"/>
+          <w:color w:val="000000"/>
+          <w:sz w:val="24"/>
+          <w:i w:val="1"/>
+          <w:iCs w:val="1"/>
+        </w:rPr>
+        <w:t>runtime</w:t>
+      </w:r>
+      <w:r>
+        <w:rPr>
+          <w:rFonts w:ascii="Arial" w:hAnsi="Arial" w:eastAsia="Arial" w:cs="Arial"/>
+          <w:color w:val="000000"/>
+          <w:sz w:val="24"/>
+        </w:rPr>
+        <w:t>. Nenhum desses componentes autoriza armazenamento de conversas reais do WhatsApp no repositório público.</w:t>
       </w:r>
     </w:p>
     <w:p>
@@ -6272,6 +7877,7 @@
           <w:ilvl w:val="1"/>
           <w:numId w:val="10"/>
         </w:numPr>
+        <w:spacing w:before="360" w:after="360"/>
       </w:pPr>
       <w:bookmarkStart w:id="1037" w:name="_TCC_H_1037"/>
       <w:r>
@@ -6294,7 +7900,43 @@
           <w:color w:val="000000"/>
           <w:sz w:val="24"/>
         </w:rPr>
-        <w:t>O fluxo inicia com a normalização da mensagem e a seleção da arquitetura pelos metadados da conversa ou da run. Em seguida, a API despacha a solicitação ao runtime e publica eventos de processamento. A arquitetura interpreta o contexto, aciona ferramentas e produz a resposta. Quando identifica conteúdo clínico, insuficiência de evidência ou outro critério de risco, a execução é marcada para revisão humana.</w:t>
+        <w:t xml:space="preserve">O fluxo inicia com a normalização da mensagem e a seleção da arquitetura pelos metadados da conversa ou da </w:t>
+      </w:r>
+      <w:r>
+        <w:rPr>
+          <w:rFonts w:ascii="Arial" w:hAnsi="Arial" w:eastAsia="Arial" w:cs="Arial"/>
+          <w:color w:val="000000"/>
+          <w:sz w:val="24"/>
+          <w:i w:val="1"/>
+          <w:iCs w:val="1"/>
+        </w:rPr>
+        <w:t>run</w:t>
+      </w:r>
+      <w:r>
+        <w:rPr>
+          <w:rFonts w:ascii="Arial" w:hAnsi="Arial" w:eastAsia="Arial" w:cs="Arial"/>
+          <w:color w:val="000000"/>
+          <w:sz w:val="24"/>
+        </w:rPr>
+        <w:t xml:space="preserve">. Em seguida, a API despacha a solicitação ao </w:t>
+      </w:r>
+      <w:r>
+        <w:rPr>
+          <w:rFonts w:ascii="Arial" w:hAnsi="Arial" w:eastAsia="Arial" w:cs="Arial"/>
+          <w:color w:val="000000"/>
+          <w:sz w:val="24"/>
+          <w:i w:val="1"/>
+          <w:iCs w:val="1"/>
+        </w:rPr>
+        <w:t>runtime</w:t>
+      </w:r>
+      <w:r>
+        <w:rPr>
+          <w:rFonts w:ascii="Arial" w:hAnsi="Arial" w:eastAsia="Arial" w:cs="Arial"/>
+          <w:color w:val="000000"/>
+          <w:sz w:val="24"/>
+        </w:rPr>
+        <w:t xml:space="preserve"> e publica eventos de processamento. A arquitetura interpreta o contexto, aciona ferramentas e produz a resposta. Quando identifica conteúdo clínico, insuficiência de evidência ou outro critério de risco, a execução é marcada para revisão humana.</w:t>
       </w:r>
     </w:p>
     <w:p>
@@ -6305,7 +7947,79 @@
           <w:color w:val="000000"/>
           <w:sz w:val="24"/>
         </w:rPr>
-        <w:t>Na arquitetura centralizada, as decisões passam por um supervisor. No workflow, cada etapa só começa depois da anterior, com responsabilidades previsíveis. No swarm, as transferências são registradas como handoffs e limitadas por configuração. Ao final, o runtime devolve texto, desfecho, contagens e identificador de trace; a API persiste o resultado e a interface atualiza o atendimento por eventos enviados ao cliente.</w:t>
+        <w:t xml:space="preserve">Na arquitetura centralizada, as decisões passam por um supervisor. No </w:t>
+      </w:r>
+      <w:r>
+        <w:rPr>
+          <w:rFonts w:ascii="Arial" w:hAnsi="Arial" w:eastAsia="Arial" w:cs="Arial"/>
+          <w:color w:val="000000"/>
+          <w:sz w:val="24"/>
+          <w:i w:val="1"/>
+          <w:iCs w:val="1"/>
+        </w:rPr>
+        <w:t>workflow</w:t>
+      </w:r>
+      <w:r>
+        <w:rPr>
+          <w:rFonts w:ascii="Arial" w:hAnsi="Arial" w:eastAsia="Arial" w:cs="Arial"/>
+          <w:color w:val="000000"/>
+          <w:sz w:val="24"/>
+        </w:rPr>
+        <w:t xml:space="preserve">, cada etapa só começa depois da anterior, com responsabilidades previsíveis. No </w:t>
+      </w:r>
+      <w:r>
+        <w:rPr>
+          <w:rFonts w:ascii="Arial" w:hAnsi="Arial" w:eastAsia="Arial" w:cs="Arial"/>
+          <w:color w:val="000000"/>
+          <w:sz w:val="24"/>
+          <w:i w:val="1"/>
+          <w:iCs w:val="1"/>
+        </w:rPr>
+        <w:t>swarm</w:t>
+      </w:r>
+      <w:r>
+        <w:rPr>
+          <w:rFonts w:ascii="Arial" w:hAnsi="Arial" w:eastAsia="Arial" w:cs="Arial"/>
+          <w:color w:val="000000"/>
+          <w:sz w:val="24"/>
+        </w:rPr>
+        <w:t xml:space="preserve">, as transferências são registradas como </w:t>
+      </w:r>
+      <w:r>
+        <w:rPr>
+          <w:rFonts w:ascii="Arial" w:hAnsi="Arial" w:eastAsia="Arial" w:cs="Arial"/>
+          <w:color w:val="000000"/>
+          <w:sz w:val="24"/>
+          <w:i w:val="1"/>
+          <w:iCs w:val="1"/>
+        </w:rPr>
+        <w:t>handoffs</w:t>
+      </w:r>
+      <w:r>
+        <w:rPr>
+          <w:rFonts w:ascii="Arial" w:hAnsi="Arial" w:eastAsia="Arial" w:cs="Arial"/>
+          <w:color w:val="000000"/>
+          <w:sz w:val="24"/>
+        </w:rPr>
+        <w:t xml:space="preserve"> e limitadas por configuração. Ao final, o </w:t>
+      </w:r>
+      <w:r>
+        <w:rPr>
+          <w:rFonts w:ascii="Arial" w:hAnsi="Arial" w:eastAsia="Arial" w:cs="Arial"/>
+          <w:color w:val="000000"/>
+          <w:sz w:val="24"/>
+          <w:i w:val="1"/>
+          <w:iCs w:val="1"/>
+        </w:rPr>
+        <w:t>runtime</w:t>
+      </w:r>
+      <w:r>
+        <w:rPr>
+          <w:rFonts w:ascii="Arial" w:hAnsi="Arial" w:eastAsia="Arial" w:cs="Arial"/>
+          <w:color w:val="000000"/>
+          <w:sz w:val="24"/>
+        </w:rPr>
+        <w:t xml:space="preserve"> devolve texto, desfecho, contagens e identificador de trace; a API persiste o resultado e a interface atualiza o atendimento por eventos enviados ao cliente.</w:t>
       </w:r>
     </w:p>
     <w:p>
@@ -6315,6 +8029,7 @@
           <w:ilvl w:val="0"/>
           <w:numId w:val="10"/>
         </w:numPr>
+        <w:spacing w:before="0" w:after="360"/>
       </w:pPr>
       <w:bookmarkStart w:id="1038" w:name="_TCC_H_1038"/>
       <w:r>
@@ -6336,6 +8051,7 @@
           <w:ilvl w:val="1"/>
           <w:numId w:val="10"/>
         </w:numPr>
+        <w:spacing w:before="0" w:after="360"/>
       </w:pPr>
       <w:bookmarkStart w:id="1039" w:name="_TCC_H_1039"/>
       <w:r>
@@ -6358,7 +8074,115 @@
           <w:color w:val="000000"/>
           <w:sz w:val="24"/>
         </w:rPr>
-        <w:t>O projeto utiliza uma stack dividida em backend transacional, frontend web e serviço de execução dos agentes. No backend, Python, FastAPI, Pydantic, SQLAlchemy, Alembic e PostgreSQL sustentam endpoints, validação e persistência. Server-Sent Events transmitem atualizações de processamento. Anexos podem ser armazenados localmente ou em serviço compatível com S3, com MinIO no ambiente local.</w:t>
+        <w:t xml:space="preserve">O projeto utiliza uma </w:t>
+      </w:r>
+      <w:r>
+        <w:rPr>
+          <w:rFonts w:ascii="Arial" w:hAnsi="Arial" w:eastAsia="Arial" w:cs="Arial"/>
+          <w:color w:val="000000"/>
+          <w:sz w:val="24"/>
+          <w:i w:val="1"/>
+          <w:iCs w:val="1"/>
+        </w:rPr>
+        <w:t>stack</w:t>
+      </w:r>
+      <w:r>
+        <w:rPr>
+          <w:rFonts w:ascii="Arial" w:hAnsi="Arial" w:eastAsia="Arial" w:cs="Arial"/>
+          <w:color w:val="000000"/>
+          <w:sz w:val="24"/>
+        </w:rPr>
+        <w:t xml:space="preserve"> dividida em </w:t>
+      </w:r>
+      <w:r>
+        <w:rPr>
+          <w:rFonts w:ascii="Arial" w:hAnsi="Arial" w:eastAsia="Arial" w:cs="Arial"/>
+          <w:color w:val="000000"/>
+          <w:sz w:val="24"/>
+          <w:i w:val="1"/>
+          <w:iCs w:val="1"/>
+        </w:rPr>
+        <w:t>backend</w:t>
+      </w:r>
+      <w:r>
+        <w:rPr>
+          <w:rFonts w:ascii="Arial" w:hAnsi="Arial" w:eastAsia="Arial" w:cs="Arial"/>
+          <w:color w:val="000000"/>
+          <w:sz w:val="24"/>
+        </w:rPr>
+        <w:t xml:space="preserve"> transacional, </w:t>
+      </w:r>
+      <w:r>
+        <w:rPr>
+          <w:rFonts w:ascii="Arial" w:hAnsi="Arial" w:eastAsia="Arial" w:cs="Arial"/>
+          <w:color w:val="000000"/>
+          <w:sz w:val="24"/>
+          <w:i w:val="1"/>
+          <w:iCs w:val="1"/>
+        </w:rPr>
+        <w:t>frontend</w:t>
+      </w:r>
+      <w:r>
+        <w:rPr>
+          <w:rFonts w:ascii="Arial" w:hAnsi="Arial" w:eastAsia="Arial" w:cs="Arial"/>
+          <w:color w:val="000000"/>
+          <w:sz w:val="24"/>
+        </w:rPr>
+        <w:t xml:space="preserve"> web e serviço de execução dos agentes. No </w:t>
+      </w:r>
+      <w:r>
+        <w:rPr>
+          <w:rFonts w:ascii="Arial" w:hAnsi="Arial" w:eastAsia="Arial" w:cs="Arial"/>
+          <w:color w:val="000000"/>
+          <w:sz w:val="24"/>
+          <w:i w:val="1"/>
+          <w:iCs w:val="1"/>
+        </w:rPr>
+        <w:t>backend</w:t>
+      </w:r>
+      <w:r>
+        <w:rPr>
+          <w:rFonts w:ascii="Arial" w:hAnsi="Arial" w:eastAsia="Arial" w:cs="Arial"/>
+          <w:color w:val="000000"/>
+          <w:sz w:val="24"/>
+        </w:rPr>
+        <w:t xml:space="preserve">, Python, FastAPI, Pydantic, SQLAlchemy, Alembic e PostgreSQL sustentam </w:t>
+      </w:r>
+      <w:r>
+        <w:rPr>
+          <w:rFonts w:ascii="Arial" w:hAnsi="Arial" w:eastAsia="Arial" w:cs="Arial"/>
+          <w:color w:val="000000"/>
+          <w:sz w:val="24"/>
+          <w:i w:val="1"/>
+          <w:iCs w:val="1"/>
+        </w:rPr>
+        <w:t>endpoints</w:t>
+      </w:r>
+      <w:r>
+        <w:rPr>
+          <w:rFonts w:ascii="Arial" w:hAnsi="Arial" w:eastAsia="Arial" w:cs="Arial"/>
+          <w:color w:val="000000"/>
+          <w:sz w:val="24"/>
+        </w:rPr>
+        <w:t xml:space="preserve">, validação e persistência. </w:t>
+      </w:r>
+      <w:r>
+        <w:rPr>
+          <w:rFonts w:ascii="Arial" w:hAnsi="Arial" w:eastAsia="Arial" w:cs="Arial"/>
+          <w:color w:val="000000"/>
+          <w:sz w:val="24"/>
+          <w:i w:val="1"/>
+          <w:iCs w:val="1"/>
+        </w:rPr>
+        <w:t>Server-Sent Events</w:t>
+      </w:r>
+      <w:r>
+        <w:rPr>
+          <w:rFonts w:ascii="Arial" w:hAnsi="Arial" w:eastAsia="Arial" w:cs="Arial"/>
+          <w:color w:val="000000"/>
+          <w:sz w:val="24"/>
+        </w:rPr>
+        <w:t xml:space="preserve"> transmitem atualizações de processamento. Anexos podem ser armazenados localmente ou em serviço compatível com S3, com MinIO no ambiente local.</w:t>
       </w:r>
     </w:p>
     <w:p>
@@ -6369,7 +8193,97 @@
           <w:color w:val="000000"/>
           <w:sz w:val="24"/>
         </w:rPr>
-        <w:t>O frontend utiliza Next.js, React, TypeScript e Tailwind CSS. A interface reúne workspace de chat, histórico, anexos, timeline operacional, revisão humana, inspeção técnica, dashboard e visualização dos fluxos. Contratos compartilhados em TypeScript mantêm alinhados os objetos usados pelo frontend e pela API.</w:t>
+        <w:t xml:space="preserve">O </w:t>
+      </w:r>
+      <w:r>
+        <w:rPr>
+          <w:rFonts w:ascii="Arial" w:hAnsi="Arial" w:eastAsia="Arial" w:cs="Arial"/>
+          <w:color w:val="000000"/>
+          <w:sz w:val="24"/>
+          <w:i w:val="1"/>
+          <w:iCs w:val="1"/>
+        </w:rPr>
+        <w:t>frontend</w:t>
+      </w:r>
+      <w:r>
+        <w:rPr>
+          <w:rFonts w:ascii="Arial" w:hAnsi="Arial" w:eastAsia="Arial" w:cs="Arial"/>
+          <w:color w:val="000000"/>
+          <w:sz w:val="24"/>
+        </w:rPr>
+        <w:t xml:space="preserve"> utiliza Next.js, React, TypeScript e Tailwind CSS. A interface reúne </w:t>
+      </w:r>
+      <w:r>
+        <w:rPr>
+          <w:rFonts w:ascii="Arial" w:hAnsi="Arial" w:eastAsia="Arial" w:cs="Arial"/>
+          <w:color w:val="000000"/>
+          <w:sz w:val="24"/>
+          <w:i w:val="1"/>
+          <w:iCs w:val="1"/>
+        </w:rPr>
+        <w:t>workspace</w:t>
+      </w:r>
+      <w:r>
+        <w:rPr>
+          <w:rFonts w:ascii="Arial" w:hAnsi="Arial" w:eastAsia="Arial" w:cs="Arial"/>
+          <w:color w:val="000000"/>
+          <w:sz w:val="24"/>
+        </w:rPr>
+        <w:t xml:space="preserve"> de </w:t>
+      </w:r>
+      <w:r>
+        <w:rPr>
+          <w:rFonts w:ascii="Arial" w:hAnsi="Arial" w:eastAsia="Arial" w:cs="Arial"/>
+          <w:color w:val="000000"/>
+          <w:sz w:val="24"/>
+          <w:i w:val="1"/>
+          <w:iCs w:val="1"/>
+        </w:rPr>
+        <w:t>chat</w:t>
+      </w:r>
+      <w:r>
+        <w:rPr>
+          <w:rFonts w:ascii="Arial" w:hAnsi="Arial" w:eastAsia="Arial" w:cs="Arial"/>
+          <w:color w:val="000000"/>
+          <w:sz w:val="24"/>
+        </w:rPr>
+        <w:t xml:space="preserve">, histórico, anexos, timeline operacional, revisão humana, inspeção técnica, </w:t>
+      </w:r>
+      <w:r>
+        <w:rPr>
+          <w:rFonts w:ascii="Arial" w:hAnsi="Arial" w:eastAsia="Arial" w:cs="Arial"/>
+          <w:color w:val="000000"/>
+          <w:sz w:val="24"/>
+          <w:i w:val="1"/>
+          <w:iCs w:val="1"/>
+        </w:rPr>
+        <w:t>dashboard</w:t>
+      </w:r>
+      <w:r>
+        <w:rPr>
+          <w:rFonts w:ascii="Arial" w:hAnsi="Arial" w:eastAsia="Arial" w:cs="Arial"/>
+          <w:color w:val="000000"/>
+          <w:sz w:val="24"/>
+        </w:rPr>
+        <w:t xml:space="preserve"> e visualização dos fluxos. Contratos compartilhados em TypeScript mantêm alinhados os objetos usados pelo </w:t>
+      </w:r>
+      <w:r>
+        <w:rPr>
+          <w:rFonts w:ascii="Arial" w:hAnsi="Arial" w:eastAsia="Arial" w:cs="Arial"/>
+          <w:color w:val="000000"/>
+          <w:sz w:val="24"/>
+          <w:i w:val="1"/>
+          <w:iCs w:val="1"/>
+        </w:rPr>
+        <w:t>frontend</w:t>
+      </w:r>
+      <w:r>
+        <w:rPr>
+          <w:rFonts w:ascii="Arial" w:hAnsi="Arial" w:eastAsia="Arial" w:cs="Arial"/>
+          <w:color w:val="000000"/>
+          <w:sz w:val="24"/>
+        </w:rPr>
+        <w:t xml:space="preserve"> e pela API.</w:t>
       </w:r>
     </w:p>
     <w:p>
@@ -6380,7 +8294,79 @@
           <w:color w:val="000000"/>
           <w:sz w:val="24"/>
         </w:rPr>
-        <w:t>O runtime dos agentes utiliza Python, FastAPI, Strands Agents e AWS Bedrock quando o modo live está ativado. OpenTelemetry/OTLP pode exportar telemetria. O runtime também possui modo mock, empregado em testes determinísticos, no qual ferramentas e respostas controladas verificam contratos e sequências de eventos sem depender do modelo remoto.</w:t>
+        <w:t xml:space="preserve">O </w:t>
+      </w:r>
+      <w:r>
+        <w:rPr>
+          <w:rFonts w:ascii="Arial" w:hAnsi="Arial" w:eastAsia="Arial" w:cs="Arial"/>
+          <w:color w:val="000000"/>
+          <w:sz w:val="24"/>
+          <w:i w:val="1"/>
+          <w:iCs w:val="1"/>
+        </w:rPr>
+        <w:t>runtime</w:t>
+      </w:r>
+      <w:r>
+        <w:rPr>
+          <w:rFonts w:ascii="Arial" w:hAnsi="Arial" w:eastAsia="Arial" w:cs="Arial"/>
+          <w:color w:val="000000"/>
+          <w:sz w:val="24"/>
+        </w:rPr>
+        <w:t xml:space="preserve"> dos agentes utiliza Python, FastAPI, Strands Agents e AWS Bedrock quando o modo </w:t>
+      </w:r>
+      <w:r>
+        <w:rPr>
+          <w:rFonts w:ascii="Arial" w:hAnsi="Arial" w:eastAsia="Arial" w:cs="Arial"/>
+          <w:color w:val="000000"/>
+          <w:sz w:val="24"/>
+          <w:i w:val="1"/>
+          <w:iCs w:val="1"/>
+        </w:rPr>
+        <w:t>live</w:t>
+      </w:r>
+      <w:r>
+        <w:rPr>
+          <w:rFonts w:ascii="Arial" w:hAnsi="Arial" w:eastAsia="Arial" w:cs="Arial"/>
+          <w:color w:val="000000"/>
+          <w:sz w:val="24"/>
+        </w:rPr>
+        <w:t xml:space="preserve"> está ativado. OpenTelemetry/OTLP pode exportar telemetria. O </w:t>
+      </w:r>
+      <w:r>
+        <w:rPr>
+          <w:rFonts w:ascii="Arial" w:hAnsi="Arial" w:eastAsia="Arial" w:cs="Arial"/>
+          <w:color w:val="000000"/>
+          <w:sz w:val="24"/>
+          <w:i w:val="1"/>
+          <w:iCs w:val="1"/>
+        </w:rPr>
+        <w:t>runtime</w:t>
+      </w:r>
+      <w:r>
+        <w:rPr>
+          <w:rFonts w:ascii="Arial" w:hAnsi="Arial" w:eastAsia="Arial" w:cs="Arial"/>
+          <w:color w:val="000000"/>
+          <w:sz w:val="24"/>
+        </w:rPr>
+        <w:t xml:space="preserve"> também possui modo </w:t>
+      </w:r>
+      <w:r>
+        <w:rPr>
+          <w:rFonts w:ascii="Arial" w:hAnsi="Arial" w:eastAsia="Arial" w:cs="Arial"/>
+          <w:color w:val="000000"/>
+          <w:sz w:val="24"/>
+          <w:i w:val="1"/>
+          <w:iCs w:val="1"/>
+        </w:rPr>
+        <w:t>mock</w:t>
+      </w:r>
+      <w:r>
+        <w:rPr>
+          <w:rFonts w:ascii="Arial" w:hAnsi="Arial" w:eastAsia="Arial" w:cs="Arial"/>
+          <w:color w:val="000000"/>
+          <w:sz w:val="24"/>
+        </w:rPr>
+        <w:t>, empregado em testes determinísticos, no qual ferramentas e respostas controladas verificam contratos e sequências de eventos sem depender do modelo remoto.</w:t>
       </w:r>
     </w:p>
     <w:p>
@@ -6390,6 +8376,7 @@
           <w:ilvl w:val="1"/>
           <w:numId w:val="10"/>
         </w:numPr>
+        <w:spacing w:before="360" w:after="360"/>
       </w:pPr>
       <w:bookmarkStart w:id="1040" w:name="_TCC_H_1040"/>
       <w:r>
@@ -6412,7 +8399,43 @@
           <w:color w:val="000000"/>
           <w:sz w:val="24"/>
         </w:rPr>
-        <w:t>Os agentes compartilham um contexto de execução que oferece histórico recente da conversa, mensagem atual, anexos e ferramentas. O contexto mede chamadas, erros, loops, handoffs, tokens e tempos até eventos públicos. A seleção de rota considera três intenções implementadas: perguntas frequentes, consulta de estoque e processamento de anexos.</w:t>
+        <w:t xml:space="preserve">Os agentes compartilham um contexto de execução que oferece histórico recente da conversa, mensagem atual, anexos e ferramentas. O contexto mede chamadas, erros, </w:t>
+      </w:r>
+      <w:r>
+        <w:rPr>
+          <w:rFonts w:ascii="Arial" w:hAnsi="Arial" w:eastAsia="Arial" w:cs="Arial"/>
+          <w:color w:val="000000"/>
+          <w:sz w:val="24"/>
+          <w:i w:val="1"/>
+          <w:iCs w:val="1"/>
+        </w:rPr>
+        <w:t>loops</w:t>
+      </w:r>
+      <w:r>
+        <w:rPr>
+          <w:rFonts w:ascii="Arial" w:hAnsi="Arial" w:eastAsia="Arial" w:cs="Arial"/>
+          <w:color w:val="000000"/>
+          <w:sz w:val="24"/>
+        </w:rPr>
+        <w:t xml:space="preserve">, </w:t>
+      </w:r>
+      <w:r>
+        <w:rPr>
+          <w:rFonts w:ascii="Arial" w:hAnsi="Arial" w:eastAsia="Arial" w:cs="Arial"/>
+          <w:color w:val="000000"/>
+          <w:sz w:val="24"/>
+          <w:i w:val="1"/>
+          <w:iCs w:val="1"/>
+        </w:rPr>
+        <w:t>handoffs</w:t>
+      </w:r>
+      <w:r>
+        <w:rPr>
+          <w:rFonts w:ascii="Arial" w:hAnsi="Arial" w:eastAsia="Arial" w:cs="Arial"/>
+          <w:color w:val="000000"/>
+          <w:sz w:val="24"/>
+        </w:rPr>
+        <w:t>, tokens e tempos até eventos públicos. A seleção de rota considera três intenções implementadas: perguntas frequentes, consulta de estoque e processamento de anexos.</w:t>
       </w:r>
     </w:p>
     <w:p>
@@ -6423,7 +8446,133 @@
           <w:color w:val="000000"/>
           <w:sz w:val="24"/>
         </w:rPr>
-        <w:t>As ferramentas faq_lookup, stock_lookup e attachment_intake encapsulam a lógica de domínio. No modo live, hooks registram o início e o término de cada chamada. Se a invocação do modelo falha ou não está habilitada, o runtime utiliza respostas mock explicitamente identificadas, evitando apresentar a simulação como execução real.</w:t>
+        <w:t xml:space="preserve">As ferramentas </w:t>
+      </w:r>
+      <w:r>
+        <w:rPr>
+          <w:rFonts w:ascii="Arial" w:hAnsi="Arial" w:eastAsia="Arial" w:cs="Arial"/>
+          <w:color w:val="000000"/>
+          <w:sz w:val="24"/>
+          <w:i w:val="1"/>
+          <w:iCs w:val="1"/>
+        </w:rPr>
+        <w:t>faq_lookup</w:t>
+      </w:r>
+      <w:r>
+        <w:rPr>
+          <w:rFonts w:ascii="Arial" w:hAnsi="Arial" w:eastAsia="Arial" w:cs="Arial"/>
+          <w:color w:val="000000"/>
+          <w:sz w:val="24"/>
+        </w:rPr>
+        <w:t xml:space="preserve">, </w:t>
+      </w:r>
+      <w:r>
+        <w:rPr>
+          <w:rFonts w:ascii="Arial" w:hAnsi="Arial" w:eastAsia="Arial" w:cs="Arial"/>
+          <w:color w:val="000000"/>
+          <w:sz w:val="24"/>
+          <w:i w:val="1"/>
+          <w:iCs w:val="1"/>
+        </w:rPr>
+        <w:t>stock_lookup</w:t>
+      </w:r>
+      <w:r>
+        <w:rPr>
+          <w:rFonts w:ascii="Arial" w:hAnsi="Arial" w:eastAsia="Arial" w:cs="Arial"/>
+          <w:color w:val="000000"/>
+          <w:sz w:val="24"/>
+        </w:rPr>
+        <w:t xml:space="preserve"> e </w:t>
+      </w:r>
+      <w:r>
+        <w:rPr>
+          <w:rFonts w:ascii="Arial" w:hAnsi="Arial" w:eastAsia="Arial" w:cs="Arial"/>
+          <w:color w:val="000000"/>
+          <w:sz w:val="24"/>
+          <w:i w:val="1"/>
+          <w:iCs w:val="1"/>
+        </w:rPr>
+        <w:t>attachment_intake</w:t>
+      </w:r>
+      <w:r>
+        <w:rPr>
+          <w:rFonts w:ascii="Arial" w:hAnsi="Arial" w:eastAsia="Arial" w:cs="Arial"/>
+          <w:color w:val="000000"/>
+          <w:sz w:val="24"/>
+        </w:rPr>
+        <w:t xml:space="preserve"> encapsulam a lógica de domínio. No modo </w:t>
+      </w:r>
+      <w:r>
+        <w:rPr>
+          <w:rFonts w:ascii="Arial" w:hAnsi="Arial" w:eastAsia="Arial" w:cs="Arial"/>
+          <w:color w:val="000000"/>
+          <w:sz w:val="24"/>
+          <w:i w:val="1"/>
+          <w:iCs w:val="1"/>
+        </w:rPr>
+        <w:t>live</w:t>
+      </w:r>
+      <w:r>
+        <w:rPr>
+          <w:rFonts w:ascii="Arial" w:hAnsi="Arial" w:eastAsia="Arial" w:cs="Arial"/>
+          <w:color w:val="000000"/>
+          <w:sz w:val="24"/>
+        </w:rPr>
+        <w:t xml:space="preserve">, </w:t>
+      </w:r>
+      <w:r>
+        <w:rPr>
+          <w:rFonts w:ascii="Arial" w:hAnsi="Arial" w:eastAsia="Arial" w:cs="Arial"/>
+          <w:color w:val="000000"/>
+          <w:sz w:val="24"/>
+          <w:i w:val="1"/>
+          <w:iCs w:val="1"/>
+        </w:rPr>
+        <w:t>hooks</w:t>
+      </w:r>
+      <w:r>
+        <w:rPr>
+          <w:rFonts w:ascii="Arial" w:hAnsi="Arial" w:eastAsia="Arial" w:cs="Arial"/>
+          <w:color w:val="000000"/>
+          <w:sz w:val="24"/>
+        </w:rPr>
+        <w:t xml:space="preserve"> registram o início e o término de cada chamada. Se a invocação do modelo falha ou não está habilitada, o </w:t>
+      </w:r>
+      <w:r>
+        <w:rPr>
+          <w:rFonts w:ascii="Arial" w:hAnsi="Arial" w:eastAsia="Arial" w:cs="Arial"/>
+          <w:color w:val="000000"/>
+          <w:sz w:val="24"/>
+          <w:i w:val="1"/>
+          <w:iCs w:val="1"/>
+        </w:rPr>
+        <w:t>runtime</w:t>
+      </w:r>
+      <w:r>
+        <w:rPr>
+          <w:rFonts w:ascii="Arial" w:hAnsi="Arial" w:eastAsia="Arial" w:cs="Arial"/>
+          <w:color w:val="000000"/>
+          <w:sz w:val="24"/>
+        </w:rPr>
+        <w:t xml:space="preserve"> utiliza respostas </w:t>
+      </w:r>
+      <w:r>
+        <w:rPr>
+          <w:rFonts w:ascii="Arial" w:hAnsi="Arial" w:eastAsia="Arial" w:cs="Arial"/>
+          <w:color w:val="000000"/>
+          <w:sz w:val="24"/>
+          <w:i w:val="1"/>
+          <w:iCs w:val="1"/>
+        </w:rPr>
+        <w:t>mock</w:t>
+      </w:r>
+      <w:r>
+        <w:rPr>
+          <w:rFonts w:ascii="Arial" w:hAnsi="Arial" w:eastAsia="Arial" w:cs="Arial"/>
+          <w:color w:val="000000"/>
+          <w:sz w:val="24"/>
+        </w:rPr>
+        <w:t xml:space="preserve"> explicitamente identificadas, evitando apresentar a simulação como execução real.</w:t>
       </w:r>
     </w:p>
     <w:p>
@@ -6433,6 +8582,7 @@
           <w:ilvl w:val="1"/>
           <w:numId w:val="10"/>
         </w:numPr>
+        <w:spacing w:before="360" w:after="360"/>
       </w:pPr>
       <w:bookmarkStart w:id="1041" w:name="_TCC_H_1041"/>
       <w:r>
@@ -6455,7 +8605,25 @@
           <w:color w:val="000000"/>
           <w:sz w:val="24"/>
         </w:rPr>
-        <w:t>Na orquestração centralizada, um único supervisor recebe a mensagem e dispõe das três ferramentas. O prompt do supervisor define as regras de roteamento e exige encaminhamento profissional para perguntas clínicas. Depois de usar uma ferramenta, o mesmo agente compõe a resposta final. O fluxo não realiza handoffs entre pares.</w:t>
+        <w:t xml:space="preserve">Na orquestração centralizada, um único supervisor recebe a mensagem e dispõe das três ferramentas. O prompt do supervisor define as regras de roteamento e exige encaminhamento profissional para perguntas clínicas. Depois de usar uma ferramenta, o mesmo agente compõe a resposta final. O fluxo não realiza </w:t>
+      </w:r>
+      <w:r>
+        <w:rPr>
+          <w:rFonts w:ascii="Arial" w:hAnsi="Arial" w:eastAsia="Arial" w:cs="Arial"/>
+          <w:color w:val="000000"/>
+          <w:sz w:val="24"/>
+          <w:i w:val="1"/>
+          <w:iCs w:val="1"/>
+        </w:rPr>
+        <w:t>handoffs</w:t>
+      </w:r>
+      <w:r>
+        <w:rPr>
+          <w:rFonts w:ascii="Arial" w:hAnsi="Arial" w:eastAsia="Arial" w:cs="Arial"/>
+          <w:color w:val="000000"/>
+          <w:sz w:val="24"/>
+        </w:rPr>
+        <w:t xml:space="preserve"> entre pares.</w:t>
       </w:r>
     </w:p>
     <w:p>
@@ -6466,7 +8634,43 @@
           <w:color w:val="000000"/>
           <w:sz w:val="24"/>
         </w:rPr>
-        <w:t>O workflow estruturado implementa um pipeline com agentes diferentes para classificação, coleta de evidência, revisão e síntese. Se houver anexo, a rota de análise de imagem é priorizada. O agente de revisão decide se a resposta exige intervenção humana com base em categorias de risco, e o sintetizador recebe evidência e decisão de revisão antes de produzir o texto final.</w:t>
+        <w:t xml:space="preserve">O </w:t>
+      </w:r>
+      <w:r>
+        <w:rPr>
+          <w:rFonts w:ascii="Arial" w:hAnsi="Arial" w:eastAsia="Arial" w:cs="Arial"/>
+          <w:color w:val="000000"/>
+          <w:sz w:val="24"/>
+          <w:i w:val="1"/>
+          <w:iCs w:val="1"/>
+        </w:rPr>
+        <w:t>workflow</w:t>
+      </w:r>
+      <w:r>
+        <w:rPr>
+          <w:rFonts w:ascii="Arial" w:hAnsi="Arial" w:eastAsia="Arial" w:cs="Arial"/>
+          <w:color w:val="000000"/>
+          <w:sz w:val="24"/>
+        </w:rPr>
+        <w:t xml:space="preserve"> estruturado implementa um </w:t>
+      </w:r>
+      <w:r>
+        <w:rPr>
+          <w:rFonts w:ascii="Arial" w:hAnsi="Arial" w:eastAsia="Arial" w:cs="Arial"/>
+          <w:color w:val="000000"/>
+          <w:sz w:val="24"/>
+          <w:i w:val="1"/>
+          <w:iCs w:val="1"/>
+        </w:rPr>
+        <w:t>pipeline</w:t>
+      </w:r>
+      <w:r>
+        <w:rPr>
+          <w:rFonts w:ascii="Arial" w:hAnsi="Arial" w:eastAsia="Arial" w:cs="Arial"/>
+          <w:color w:val="000000"/>
+          <w:sz w:val="24"/>
+        </w:rPr>
+        <w:t xml:space="preserve"> com agentes diferentes para classificação, coleta de evidência, revisão e síntese. Se houver anexo, a rota de análise de imagem é priorizada. O agente de revisão decide se a resposta exige intervenção humana com base em categorias de risco, e o sintetizador recebe evidência e decisão de revisão antes de produzir o texto final.</w:t>
       </w:r>
     </w:p>
     <w:p>
@@ -6477,7 +8681,79 @@
           <w:color w:val="000000"/>
           <w:sz w:val="24"/>
         </w:rPr>
-        <w:t>O swarm descentralizado utiliza uma ferramenta de handoff. Um coordenador delega a solicitação para especialistas de FAQ, estoque ou anexos; esses especialistas podem transferir a tarefa a outro par quando precisam de informação complementar. Um limite configurável impede transferências indefinidas. Um sintetizador é acionado quando o retorno do coordenador não constitui uma resposta final adequada. Cada transferência incrementa contadores de handoff e loop.</w:t>
+        <w:t xml:space="preserve">O </w:t>
+      </w:r>
+      <w:r>
+        <w:rPr>
+          <w:rFonts w:ascii="Arial" w:hAnsi="Arial" w:eastAsia="Arial" w:cs="Arial"/>
+          <w:color w:val="000000"/>
+          <w:sz w:val="24"/>
+          <w:i w:val="1"/>
+          <w:iCs w:val="1"/>
+        </w:rPr>
+        <w:t>swarm</w:t>
+      </w:r>
+      <w:r>
+        <w:rPr>
+          <w:rFonts w:ascii="Arial" w:hAnsi="Arial" w:eastAsia="Arial" w:cs="Arial"/>
+          <w:color w:val="000000"/>
+          <w:sz w:val="24"/>
+        </w:rPr>
+        <w:t xml:space="preserve"> descentralizado utiliza uma ferramenta de </w:t>
+      </w:r>
+      <w:r>
+        <w:rPr>
+          <w:rFonts w:ascii="Arial" w:hAnsi="Arial" w:eastAsia="Arial" w:cs="Arial"/>
+          <w:color w:val="000000"/>
+          <w:sz w:val="24"/>
+          <w:i w:val="1"/>
+          <w:iCs w:val="1"/>
+        </w:rPr>
+        <w:t>handoff</w:t>
+      </w:r>
+      <w:r>
+        <w:rPr>
+          <w:rFonts w:ascii="Arial" w:hAnsi="Arial" w:eastAsia="Arial" w:cs="Arial"/>
+          <w:color w:val="000000"/>
+          <w:sz w:val="24"/>
+        </w:rPr>
+        <w:t xml:space="preserve">. Um coordenador delega a solicitação para especialistas de FAQ, estoque ou anexos; esses especialistas podem transferir a tarefa a outro par quando precisam de informação complementar. Um limite configurável impede transferências indefinidas. Um sintetizador é acionado quando o retorno do coordenador não constitui uma resposta final adequada. Cada transferência incrementa contadores de </w:t>
+      </w:r>
+      <w:r>
+        <w:rPr>
+          <w:rFonts w:ascii="Arial" w:hAnsi="Arial" w:eastAsia="Arial" w:cs="Arial"/>
+          <w:color w:val="000000"/>
+          <w:sz w:val="24"/>
+          <w:i w:val="1"/>
+          <w:iCs w:val="1"/>
+        </w:rPr>
+        <w:t>handoff</w:t>
+      </w:r>
+      <w:r>
+        <w:rPr>
+          <w:rFonts w:ascii="Arial" w:hAnsi="Arial" w:eastAsia="Arial" w:cs="Arial"/>
+          <w:color w:val="000000"/>
+          <w:sz w:val="24"/>
+        </w:rPr>
+        <w:t xml:space="preserve"> e </w:t>
+      </w:r>
+      <w:r>
+        <w:rPr>
+          <w:rFonts w:ascii="Arial" w:hAnsi="Arial" w:eastAsia="Arial" w:cs="Arial"/>
+          <w:color w:val="000000"/>
+          <w:sz w:val="24"/>
+          <w:i w:val="1"/>
+          <w:iCs w:val="1"/>
+        </w:rPr>
+        <w:t>loop</w:t>
+      </w:r>
+      <w:r>
+        <w:rPr>
+          <w:rFonts w:ascii="Arial" w:hAnsi="Arial" w:eastAsia="Arial" w:cs="Arial"/>
+          <w:color w:val="000000"/>
+          <w:sz w:val="24"/>
+        </w:rPr>
+        <w:t>.</w:t>
       </w:r>
     </w:p>
     <w:p>
@@ -6487,6 +8763,7 @@
           <w:ilvl w:val="1"/>
           <w:numId w:val="10"/>
         </w:numPr>
+        <w:spacing w:before="360" w:after="360"/>
       </w:pPr>
       <w:bookmarkStart w:id="1042" w:name="_TCC_H_1042"/>
       <w:r>
@@ -6509,7 +8786,115 @@
           <w:color w:val="000000"/>
           <w:sz w:val="24"/>
         </w:rPr>
-        <w:t>A API cria e acompanha runs, despacha a execução ao runtime e persiste o desfecho. Eventos técnicos descrevem nós, mensagens, ferramentas e handoffs, permitindo alimentar a timeline da interface e os relatórios comparativos. O benchmark existente executa os mesmos cenários contra as três arquiteturas e agrega sucesso, latência p50/p95, tokens, chamadas de ferramenta, erros, loops, handoffs e revisão humana.</w:t>
+        <w:t xml:space="preserve">A API cria e acompanha </w:t>
+      </w:r>
+      <w:r>
+        <w:rPr>
+          <w:rFonts w:ascii="Arial" w:hAnsi="Arial" w:eastAsia="Arial" w:cs="Arial"/>
+          <w:color w:val="000000"/>
+          <w:sz w:val="24"/>
+          <w:i w:val="1"/>
+          <w:iCs w:val="1"/>
+        </w:rPr>
+        <w:t>runs</w:t>
+      </w:r>
+      <w:r>
+        <w:rPr>
+          <w:rFonts w:ascii="Arial" w:hAnsi="Arial" w:eastAsia="Arial" w:cs="Arial"/>
+          <w:color w:val="000000"/>
+          <w:sz w:val="24"/>
+        </w:rPr>
+        <w:t xml:space="preserve">, despacha a execução ao </w:t>
+      </w:r>
+      <w:r>
+        <w:rPr>
+          <w:rFonts w:ascii="Arial" w:hAnsi="Arial" w:eastAsia="Arial" w:cs="Arial"/>
+          <w:color w:val="000000"/>
+          <w:sz w:val="24"/>
+          <w:i w:val="1"/>
+          <w:iCs w:val="1"/>
+        </w:rPr>
+        <w:t>runtime</w:t>
+      </w:r>
+      <w:r>
+        <w:rPr>
+          <w:rFonts w:ascii="Arial" w:hAnsi="Arial" w:eastAsia="Arial" w:cs="Arial"/>
+          <w:color w:val="000000"/>
+          <w:sz w:val="24"/>
+        </w:rPr>
+        <w:t xml:space="preserve"> e persiste o desfecho. Eventos técnicos descrevem nós, mensagens, ferramentas e </w:t>
+      </w:r>
+      <w:r>
+        <w:rPr>
+          <w:rFonts w:ascii="Arial" w:hAnsi="Arial" w:eastAsia="Arial" w:cs="Arial"/>
+          <w:color w:val="000000"/>
+          <w:sz w:val="24"/>
+          <w:i w:val="1"/>
+          <w:iCs w:val="1"/>
+        </w:rPr>
+        <w:t>handoffs</w:t>
+      </w:r>
+      <w:r>
+        <w:rPr>
+          <w:rFonts w:ascii="Arial" w:hAnsi="Arial" w:eastAsia="Arial" w:cs="Arial"/>
+          <w:color w:val="000000"/>
+          <w:sz w:val="24"/>
+        </w:rPr>
+        <w:t xml:space="preserve">, permitindo alimentar a timeline da interface e os relatórios comparativos. O </w:t>
+      </w:r>
+      <w:r>
+        <w:rPr>
+          <w:rFonts w:ascii="Arial" w:hAnsi="Arial" w:eastAsia="Arial" w:cs="Arial"/>
+          <w:color w:val="000000"/>
+          <w:sz w:val="24"/>
+          <w:i w:val="1"/>
+          <w:iCs w:val="1"/>
+        </w:rPr>
+        <w:t>benchmark</w:t>
+      </w:r>
+      <w:r>
+        <w:rPr>
+          <w:rFonts w:ascii="Arial" w:hAnsi="Arial" w:eastAsia="Arial" w:cs="Arial"/>
+          <w:color w:val="000000"/>
+          <w:sz w:val="24"/>
+        </w:rPr>
+        <w:t xml:space="preserve"> existente executa os mesmos cenários contra as três arquiteturas e agrega sucesso, latência p50/p95, tokens, chamadas de ferramenta, erros, </w:t>
+      </w:r>
+      <w:r>
+        <w:rPr>
+          <w:rFonts w:ascii="Arial" w:hAnsi="Arial" w:eastAsia="Arial" w:cs="Arial"/>
+          <w:color w:val="000000"/>
+          <w:sz w:val="24"/>
+          <w:i w:val="1"/>
+          <w:iCs w:val="1"/>
+        </w:rPr>
+        <w:t>loops</w:t>
+      </w:r>
+      <w:r>
+        <w:rPr>
+          <w:rFonts w:ascii="Arial" w:hAnsi="Arial" w:eastAsia="Arial" w:cs="Arial"/>
+          <w:color w:val="000000"/>
+          <w:sz w:val="24"/>
+        </w:rPr>
+        <w:t xml:space="preserve">, </w:t>
+      </w:r>
+      <w:r>
+        <w:rPr>
+          <w:rFonts w:ascii="Arial" w:hAnsi="Arial" w:eastAsia="Arial" w:cs="Arial"/>
+          <w:color w:val="000000"/>
+          <w:sz w:val="24"/>
+          <w:i w:val="1"/>
+          <w:iCs w:val="1"/>
+        </w:rPr>
+        <w:t>handoffs</w:t>
+      </w:r>
+      <w:r>
+        <w:rPr>
+          <w:rFonts w:ascii="Arial" w:hAnsi="Arial" w:eastAsia="Arial" w:cs="Arial"/>
+          <w:color w:val="000000"/>
+          <w:sz w:val="24"/>
+        </w:rPr>
+        <w:t xml:space="preserve"> e revisão humana.</w:t>
       </w:r>
     </w:p>
     <w:p>
@@ -6520,7 +8905,97 @@
           <w:color w:val="000000"/>
           <w:sz w:val="24"/>
         </w:rPr>
-        <w:t>Os testes utilizam Pytest no backend e no runtime, Playwright no frontend e cenários declarativos em YAML para validação E2E. O framework atual verifica rota, eventos, termos esperados, termos proibidos e timeout. A avaliação semântica das respostas em modo live permanece pendente da definição metodológica registrada na OQ-002; portanto, ela não é tratada como resultado implementado.</w:t>
+        <w:t xml:space="preserve">Os testes utilizam Pytest no </w:t>
+      </w:r>
+      <w:r>
+        <w:rPr>
+          <w:rFonts w:ascii="Arial" w:hAnsi="Arial" w:eastAsia="Arial" w:cs="Arial"/>
+          <w:color w:val="000000"/>
+          <w:sz w:val="24"/>
+          <w:i w:val="1"/>
+          <w:iCs w:val="1"/>
+        </w:rPr>
+        <w:t>backend</w:t>
+      </w:r>
+      <w:r>
+        <w:rPr>
+          <w:rFonts w:ascii="Arial" w:hAnsi="Arial" w:eastAsia="Arial" w:cs="Arial"/>
+          <w:color w:val="000000"/>
+          <w:sz w:val="24"/>
+        </w:rPr>
+        <w:t xml:space="preserve"> e no </w:t>
+      </w:r>
+      <w:r>
+        <w:rPr>
+          <w:rFonts w:ascii="Arial" w:hAnsi="Arial" w:eastAsia="Arial" w:cs="Arial"/>
+          <w:color w:val="000000"/>
+          <w:sz w:val="24"/>
+          <w:i w:val="1"/>
+          <w:iCs w:val="1"/>
+        </w:rPr>
+        <w:t>runtime</w:t>
+      </w:r>
+      <w:r>
+        <w:rPr>
+          <w:rFonts w:ascii="Arial" w:hAnsi="Arial" w:eastAsia="Arial" w:cs="Arial"/>
+          <w:color w:val="000000"/>
+          <w:sz w:val="24"/>
+        </w:rPr>
+        <w:t xml:space="preserve">, Playwright no </w:t>
+      </w:r>
+      <w:r>
+        <w:rPr>
+          <w:rFonts w:ascii="Arial" w:hAnsi="Arial" w:eastAsia="Arial" w:cs="Arial"/>
+          <w:color w:val="000000"/>
+          <w:sz w:val="24"/>
+          <w:i w:val="1"/>
+          <w:iCs w:val="1"/>
+        </w:rPr>
+        <w:t>frontend</w:t>
+      </w:r>
+      <w:r>
+        <w:rPr>
+          <w:rFonts w:ascii="Arial" w:hAnsi="Arial" w:eastAsia="Arial" w:cs="Arial"/>
+          <w:color w:val="000000"/>
+          <w:sz w:val="24"/>
+        </w:rPr>
+        <w:t xml:space="preserve"> e cenários declarativos em YAML para validação E2E. O framework atual verifica rota, eventos, termos esperados, termos proibidos e </w:t>
+      </w:r>
+      <w:r>
+        <w:rPr>
+          <w:rFonts w:ascii="Arial" w:hAnsi="Arial" w:eastAsia="Arial" w:cs="Arial"/>
+          <w:color w:val="000000"/>
+          <w:sz w:val="24"/>
+          <w:i w:val="1"/>
+          <w:iCs w:val="1"/>
+        </w:rPr>
+        <w:t>timeout</w:t>
+      </w:r>
+      <w:r>
+        <w:rPr>
+          <w:rFonts w:ascii="Arial" w:hAnsi="Arial" w:eastAsia="Arial" w:cs="Arial"/>
+          <w:color w:val="000000"/>
+          <w:sz w:val="24"/>
+        </w:rPr>
+        <w:t xml:space="preserve">. A avaliação semântica das respostas em modo </w:t>
+      </w:r>
+      <w:r>
+        <w:rPr>
+          <w:rFonts w:ascii="Arial" w:hAnsi="Arial" w:eastAsia="Arial" w:cs="Arial"/>
+          <w:color w:val="000000"/>
+          <w:sz w:val="24"/>
+          <w:i w:val="1"/>
+          <w:iCs w:val="1"/>
+        </w:rPr>
+        <w:t>live</w:t>
+      </w:r>
+      <w:r>
+        <w:rPr>
+          <w:rFonts w:ascii="Arial" w:hAnsi="Arial" w:eastAsia="Arial" w:cs="Arial"/>
+          <w:color w:val="000000"/>
+          <w:sz w:val="24"/>
+        </w:rPr>
+        <w:t xml:space="preserve"> permanece pendente da definição metodológica registrada na OQ-002; portanto, ela não é tratada como resultado implementado.</w:t>
       </w:r>
     </w:p>
     <w:p>
@@ -6530,6 +9005,7 @@
           <w:ilvl w:val="0"/>
           <w:numId w:val="10"/>
         </w:numPr>
+        <w:spacing w:before="0" w:after="360"/>
       </w:pPr>
       <w:bookmarkStart w:id="1043" w:name="_TCC_H_1043"/>
       <w:r>
@@ -6551,6 +9027,7 @@
           <w:ilvl w:val="1"/>
           <w:numId w:val="10"/>
         </w:numPr>
+        <w:spacing w:before="0" w:after="360"/>
       </w:pPr>
       <w:bookmarkStart w:id="1044" w:name="_TCC_H_1044"/>
       <w:r>
@@ -6585,6 +9062,7 @@
           <w:ilvl w:val="1"/>
           <w:numId w:val="10"/>
         </w:numPr>
+        <w:spacing w:before="360" w:after="360"/>
       </w:pPr>
       <w:bookmarkStart w:id="1045" w:name="_TCC_H_1045"/>
       <w:r>
@@ -6619,6 +9097,7 @@
           <w:ilvl w:val="1"/>
           <w:numId w:val="10"/>
         </w:numPr>
+        <w:spacing w:before="360" w:after="360"/>
       </w:pPr>
       <w:bookmarkStart w:id="1046" w:name="_TCC_H_1046"/>
       <w:r>
@@ -6653,6 +9132,7 @@
           <w:ilvl w:val="1"/>
           <w:numId w:val="10"/>
         </w:numPr>
+        <w:spacing w:before="360" w:after="360"/>
       </w:pPr>
       <w:bookmarkStart w:id="1047" w:name="_TCC_H_1047"/>
       <w:r>
@@ -6687,6 +9167,7 @@
           <w:ilvl w:val="0"/>
           <w:numId w:val="10"/>
         </w:numPr>
+        <w:spacing w:before="0" w:after="360"/>
       </w:pPr>
       <w:bookmarkStart w:id="1048" w:name="_TCC_H_1048"/>
       <w:r>
@@ -6708,6 +9189,7 @@
           <w:ilvl w:val="1"/>
           <w:numId w:val="10"/>
         </w:numPr>
+        <w:spacing w:before="0" w:after="360"/>
       </w:pPr>
       <w:bookmarkStart w:id="1049" w:name="_TCC_H_1049"/>
       <w:r>
@@ -6742,6 +9224,7 @@
           <w:ilvl w:val="1"/>
           <w:numId w:val="10"/>
         </w:numPr>
+        <w:spacing w:before="360" w:after="360"/>
       </w:pPr>
       <w:bookmarkStart w:id="1050" w:name="_TCC_H_1050"/>
       <w:r>
@@ -6776,6 +9259,7 @@
           <w:ilvl w:val="1"/>
           <w:numId w:val="10"/>
         </w:numPr>
+        <w:spacing w:before="360" w:after="360"/>
       </w:pPr>
       <w:bookmarkStart w:id="1051" w:name="_TCC_H_1051"/>
       <w:r>
@@ -6810,6 +9294,7 @@
           <w:ilvl w:val="0"/>
           <w:numId w:val="10"/>
         </w:numPr>
+        <w:spacing w:before="0" w:after="360"/>
       </w:pPr>
       <w:bookmarkStart w:id="1052" w:name="_TCC_H_1052"/>
       <w:r>
@@ -6831,6 +9316,7 @@
           <w:ilvl w:val="1"/>
           <w:numId w:val="10"/>
         </w:numPr>
+        <w:spacing w:before="0" w:after="360"/>
       </w:pPr>
       <w:bookmarkStart w:id="1053" w:name="_TCC_H_1053"/>
       <w:r>
@@ -6865,6 +9351,7 @@
           <w:ilvl w:val="1"/>
           <w:numId w:val="10"/>
         </w:numPr>
+        <w:spacing w:before="360" w:after="360"/>
       </w:pPr>
       <w:bookmarkStart w:id="1054" w:name="_TCC_H_1054"/>
       <w:r>
@@ -6899,6 +9386,7 @@
           <w:ilvl w:val="1"/>
           <w:numId w:val="10"/>
         </w:numPr>
+        <w:spacing w:before="360" w:after="360"/>
       </w:pPr>
       <w:bookmarkStart w:id="1055" w:name="_TCC_H_1055"/>
       <w:r>
@@ -6955,7 +9443,25 @@
           <w:color w:val="000000"/>
           <w:sz w:val="24"/>
         </w:rPr>
-        <w:t>ADA HEALTH. Health. Powered by Ada. Disponível em: https://ada.com/. Acesso em: 11 maio 2026.</w:t>
+        <w:t xml:space="preserve">ADA HEALTH. </w:t>
+      </w:r>
+      <w:r>
+        <w:rPr>
+          <w:rFonts w:ascii="Arial" w:hAnsi="Arial" w:eastAsia="Arial" w:cs="Arial"/>
+          <w:b w:val="1"/>
+          <w:bCs w:val="1"/>
+          <w:color w:val="000000"/>
+          <w:sz w:val="24"/>
+        </w:rPr>
+        <w:t>Health. Powered by Ada</w:t>
+      </w:r>
+      <w:r>
+        <w:rPr>
+          <w:rFonts w:ascii="Arial" w:hAnsi="Arial" w:eastAsia="Arial" w:cs="Arial"/>
+          <w:color w:val="000000"/>
+          <w:sz w:val="24"/>
+        </w:rPr>
+        <w:t>. Disponível em: https://ada.com/. Acesso em: 11 maio 2026.</w:t>
       </w:r>
     </w:p>
     <w:p>
@@ -6987,7 +9493,25 @@
           <w:color w:val="000000"/>
           <w:sz w:val="24"/>
         </w:rPr>
-        <w:t xml:space="preserve"> Community pharmacy working conditions: is stress impacting patient care? Exploratory Research in Clinical and Social Pharmacy, [S. l.], v. 20, art. 100641, 2025. DOI: 10.1016/j.rcsop.2025.100641. Disponível em: https://www.sciencedirect.com/science/article/pii/S2667276625000824. Acesso em: 30 mar. 2026.</w:t>
+        <w:t xml:space="preserve"> Community pharmacy working conditions: is stress impacting patient care? </w:t>
+      </w:r>
+      <w:r>
+        <w:rPr>
+          <w:rFonts w:ascii="Arial" w:hAnsi="Arial" w:eastAsia="Arial" w:cs="Arial"/>
+          <w:b w:val="1"/>
+          <w:bCs w:val="1"/>
+          <w:color w:val="000000"/>
+          <w:sz w:val="24"/>
+        </w:rPr>
+        <w:t>Exploratory Research in Clinical and Social Pharmacy</w:t>
+      </w:r>
+      <w:r>
+        <w:rPr>
+          <w:rFonts w:ascii="Arial" w:hAnsi="Arial" w:eastAsia="Arial" w:cs="Arial"/>
+          <w:color w:val="000000"/>
+          <w:sz w:val="24"/>
+        </w:rPr>
+        <w:t>, [S. l.], v. 20, art. 100641, 2025. DOI: 10.1016/j.rcsop.2025.100641. Disponível em: https://www.sciencedirect.com/science/article/pii/S2667276625000824. Acesso em: 30 mar. 2026.</w:t>
       </w:r>
     </w:p>
     <w:p>
@@ -7001,7 +9525,25 @@
           <w:color w:val="000000"/>
           <w:sz w:val="24"/>
         </w:rPr>
-        <w:t>AMAZON. Pharmacy AI Assistant FAQs. Disponível em: https://www.amazon.com/gp/help/customer/display.html?nodeId=TUr5MrIi8Cltxsx4cQ. Acesso em: 11 maio 2026.</w:t>
+        <w:t xml:space="preserve">AMAZON. </w:t>
+      </w:r>
+      <w:r>
+        <w:rPr>
+          <w:rFonts w:ascii="Arial" w:hAnsi="Arial" w:eastAsia="Arial" w:cs="Arial"/>
+          <w:b w:val="1"/>
+          <w:bCs w:val="1"/>
+          <w:color w:val="000000"/>
+          <w:sz w:val="24"/>
+        </w:rPr>
+        <w:t>Pharmacy AI Assistant FAQs</w:t>
+      </w:r>
+      <w:r>
+        <w:rPr>
+          <w:rFonts w:ascii="Arial" w:hAnsi="Arial" w:eastAsia="Arial" w:cs="Arial"/>
+          <w:color w:val="000000"/>
+          <w:sz w:val="24"/>
+        </w:rPr>
+        <w:t>. Disponível em: https://www.amazon.com/gp/help/customer/display.html?nodeId=TUr5MrIi8Cltxsx4cQ. Acesso em: 11 maio 2026.</w:t>
       </w:r>
     </w:p>
     <w:p>
@@ -7015,7 +9557,25 @@
           <w:color w:val="000000"/>
           <w:sz w:val="24"/>
         </w:rPr>
-        <w:t>AMAZON SCIENCE. The life of a prescription at Amazon Pharmacy. Disponível em: https://www.amazon.science/blog/the-life-of-a-prescription-at-amazon-pharmacy. Acesso em: 11 maio 2026.</w:t>
+        <w:t xml:space="preserve">AMAZON SCIENCE. </w:t>
+      </w:r>
+      <w:r>
+        <w:rPr>
+          <w:rFonts w:ascii="Arial" w:hAnsi="Arial" w:eastAsia="Arial" w:cs="Arial"/>
+          <w:b w:val="1"/>
+          <w:bCs w:val="1"/>
+          <w:color w:val="000000"/>
+          <w:sz w:val="24"/>
+        </w:rPr>
+        <w:t>The life of a prescription at Amazon Pharmacy</w:t>
+      </w:r>
+      <w:r>
+        <w:rPr>
+          <w:rFonts w:ascii="Arial" w:hAnsi="Arial" w:eastAsia="Arial" w:cs="Arial"/>
+          <w:color w:val="000000"/>
+          <w:sz w:val="24"/>
+        </w:rPr>
+        <w:t>. Disponível em: https://www.amazon.science/blog/the-life-of-a-prescription-at-amazon-pharmacy. Acesso em: 11 maio 2026.</w:t>
       </w:r>
     </w:p>
     <w:p>
@@ -7029,7 +9589,25 @@
           <w:color w:val="000000"/>
           <w:sz w:val="24"/>
         </w:rPr>
-        <w:t>ANTHROPIC. Building effective AI agents. 2024. Disponível em: https://www.anthropic.com/research/building-effective-agents. Acesso em: 20 mar. 2026.</w:t>
+        <w:t xml:space="preserve">ANTHROPIC. </w:t>
+      </w:r>
+      <w:r>
+        <w:rPr>
+          <w:rFonts w:ascii="Arial" w:hAnsi="Arial" w:eastAsia="Arial" w:cs="Arial"/>
+          <w:b w:val="1"/>
+          <w:bCs w:val="1"/>
+          <w:color w:val="000000"/>
+          <w:sz w:val="24"/>
+        </w:rPr>
+        <w:t>Building effective AI agents</w:t>
+      </w:r>
+      <w:r>
+        <w:rPr>
+          <w:rFonts w:ascii="Arial" w:hAnsi="Arial" w:eastAsia="Arial" w:cs="Arial"/>
+          <w:color w:val="000000"/>
+          <w:sz w:val="24"/>
+        </w:rPr>
+        <w:t>. 2024. Disponível em: https://www.anthropic.com/research/building-effective-agents. Acesso em: 20 mar. 2026.</w:t>
       </w:r>
     </w:p>
     <w:p>
@@ -7061,7 +9639,25 @@
           <w:color w:val="000000"/>
           <w:sz w:val="24"/>
         </w:rPr>
-        <w:t xml:space="preserve"> SWARM: reimagining scientific workflow management systems in a distributed world. International Journal of High Performance Computing Applications, [S. l.], v. 39, n. 5, p. 692-712, 2025. DOI: 10.1177/10943420251339317. Disponível em: https://doi.org/10.1177/10943420251339317. Acesso em: 30 mar. 2026.</w:t>
+        <w:t xml:space="preserve"> SWARM: reimagining scientific workflow management systems in a distributed world. </w:t>
+      </w:r>
+      <w:r>
+        <w:rPr>
+          <w:rFonts w:ascii="Arial" w:hAnsi="Arial" w:eastAsia="Arial" w:cs="Arial"/>
+          <w:b w:val="1"/>
+          <w:bCs w:val="1"/>
+          <w:color w:val="000000"/>
+          <w:sz w:val="24"/>
+        </w:rPr>
+        <w:t>International Journal of High Performance Computing Applications</w:t>
+      </w:r>
+      <w:r>
+        <w:rPr>
+          <w:rFonts w:ascii="Arial" w:hAnsi="Arial" w:eastAsia="Arial" w:cs="Arial"/>
+          <w:color w:val="000000"/>
+          <w:sz w:val="24"/>
+        </w:rPr>
+        <w:t>, [S. l.], v. 39, n. 5, p. 692-712, 2025. DOI: 10.1177/10943420251339317. Disponível em: https://doi.org/10.1177/10943420251339317. Acesso em: 30 mar. 2026.</w:t>
       </w:r>
     </w:p>
     <w:p>
@@ -7093,7 +9689,25 @@
           <w:color w:val="000000"/>
           <w:sz w:val="24"/>
         </w:rPr>
-        <w:t xml:space="preserve"> Where is customer care in 2024? [S. l.]: McKinsey &amp; Company, 2024. Disponível em: https://www.mckinsey.com/capabilities/operations/our-insights/where-is-customer-care-in-2024. Acesso em: 30 mar. 2026.</w:t>
+        <w:t xml:space="preserve"> </w:t>
+      </w:r>
+      <w:r>
+        <w:rPr>
+          <w:rFonts w:ascii="Arial" w:hAnsi="Arial" w:eastAsia="Arial" w:cs="Arial"/>
+          <w:b w:val="1"/>
+          <w:bCs w:val="1"/>
+          <w:color w:val="000000"/>
+          <w:sz w:val="24"/>
+        </w:rPr>
+        <w:t>Where is customer care in 2024?</w:t>
+      </w:r>
+      <w:r>
+        <w:rPr>
+          <w:rFonts w:ascii="Arial" w:hAnsi="Arial" w:eastAsia="Arial" w:cs="Arial"/>
+          <w:color w:val="000000"/>
+          <w:sz w:val="24"/>
+        </w:rPr>
+        <w:t xml:space="preserve"> [S. l.]: McKinsey &amp; Company, 2024. Disponível em: https://www.mckinsey.com/capabilities/operations/our-insights/where-is-customer-care-in-2024. Acesso em: 30 mar. 2026.</w:t>
       </w:r>
     </w:p>
     <w:p>
@@ -7107,7 +9721,25 @@
           <w:color w:val="000000"/>
           <w:sz w:val="24"/>
         </w:rPr>
-        <w:t>FIP. An artificial intelligence toolkit for pharmacy: an introduction and resource guide for pharmacists. The Hague: International Pharmaceutical Federation, 2025. Disponível em: https://www.fip.org/file/6202. Acesso em: 30 mar. 2026.</w:t>
+        <w:t xml:space="preserve">FIP. </w:t>
+      </w:r>
+      <w:r>
+        <w:rPr>
+          <w:rFonts w:ascii="Arial" w:hAnsi="Arial" w:eastAsia="Arial" w:cs="Arial"/>
+          <w:b w:val="1"/>
+          <w:bCs w:val="1"/>
+          <w:color w:val="000000"/>
+          <w:sz w:val="24"/>
+        </w:rPr>
+        <w:t>An artificial intelligence toolkit for pharmacy: an introduction and resource guide for pharmacists</w:t>
+      </w:r>
+      <w:r>
+        <w:rPr>
+          <w:rFonts w:ascii="Arial" w:hAnsi="Arial" w:eastAsia="Arial" w:cs="Arial"/>
+          <w:color w:val="000000"/>
+          <w:sz w:val="24"/>
+        </w:rPr>
+        <w:t>. The Hague: International Pharmaceutical Federation, 2025. Disponível em: https://www.fip.org/file/6202. Acesso em: 30 mar. 2026.</w:t>
       </w:r>
     </w:p>
     <w:p>
@@ -7139,7 +9771,25 @@
           <w:color w:val="000000"/>
           <w:sz w:val="24"/>
         </w:rPr>
-        <w:t xml:space="preserve"> Multi-Agent Risks from Advanced AI. arXiv:2502.14143, 2025. Disponível em: https://arxiv.org/abs/2502.14143. Acesso em: 16 ago. 2026.</w:t>
+        <w:t xml:space="preserve"> </w:t>
+      </w:r>
+      <w:r>
+        <w:rPr>
+          <w:rFonts w:ascii="Arial" w:hAnsi="Arial" w:eastAsia="Arial" w:cs="Arial"/>
+          <w:b w:val="1"/>
+          <w:bCs w:val="1"/>
+          <w:color w:val="000000"/>
+          <w:sz w:val="24"/>
+        </w:rPr>
+        <w:t>Multi-Agent Risks from Advanced AI</w:t>
+      </w:r>
+      <w:r>
+        <w:rPr>
+          <w:rFonts w:ascii="Arial" w:hAnsi="Arial" w:eastAsia="Arial" w:cs="Arial"/>
+          <w:color w:val="000000"/>
+          <w:sz w:val="24"/>
+        </w:rPr>
+        <w:t>. arXiv:2502.14143, 2025. Disponível em: https://arxiv.org/abs/2502.14143. Acesso em: 16 ago. 2026.</w:t>
       </w:r>
     </w:p>
     <w:p>
@@ -7171,7 +9821,25 @@
           <w:color w:val="000000"/>
           <w:sz w:val="24"/>
         </w:rPr>
-        <w:t xml:space="preserve"> Applications of artificial intelligence in current pharmacy practice: a scoping review. Research in Social and Administrative Pharmacy, [S. l.], v. 21, n. 3, p. 134-141, 2025. DOI: 10.1016/j.sapharm.2024.12.007. Disponível em: https://doi.org/10.1016/j.sapharm.2024.12.007. Acesso em: 30 mar. 2026.</w:t>
+        <w:t xml:space="preserve"> Applications of artificial intelligence in current pharmacy practice: a scoping review. </w:t>
+      </w:r>
+      <w:r>
+        <w:rPr>
+          <w:rFonts w:ascii="Arial" w:hAnsi="Arial" w:eastAsia="Arial" w:cs="Arial"/>
+          <w:b w:val="1"/>
+          <w:bCs w:val="1"/>
+          <w:color w:val="000000"/>
+          <w:sz w:val="24"/>
+        </w:rPr>
+        <w:t>Research in Social and Administrative Pharmacy</w:t>
+      </w:r>
+      <w:r>
+        <w:rPr>
+          <w:rFonts w:ascii="Arial" w:hAnsi="Arial" w:eastAsia="Arial" w:cs="Arial"/>
+          <w:color w:val="000000"/>
+          <w:sz w:val="24"/>
+        </w:rPr>
+        <w:t>, [S. l.], v. 21, n. 3, p. 134-141, 2025. DOI: 10.1016/j.sapharm.2024.12.007. Disponível em: https://doi.org/10.1016/j.sapharm.2024.12.007. Acesso em: 30 mar. 2026.</w:t>
       </w:r>
     </w:p>
     <w:p>
@@ -7185,7 +9853,25 @@
           <w:color w:val="000000"/>
           <w:sz w:val="24"/>
         </w:rPr>
-        <w:t>INFERMEDICA. Symptom Checker. Disponível em: https://infermedica.com/product/symptom-checker. Acesso em: 11 maio 2026.</w:t>
+        <w:t xml:space="preserve">INFERMEDICA. </w:t>
+      </w:r>
+      <w:r>
+        <w:rPr>
+          <w:rFonts w:ascii="Arial" w:hAnsi="Arial" w:eastAsia="Arial" w:cs="Arial"/>
+          <w:b w:val="1"/>
+          <w:bCs w:val="1"/>
+          <w:color w:val="000000"/>
+          <w:sz w:val="24"/>
+        </w:rPr>
+        <w:t>Symptom Checker</w:t>
+      </w:r>
+      <w:r>
+        <w:rPr>
+          <w:rFonts w:ascii="Arial" w:hAnsi="Arial" w:eastAsia="Arial" w:cs="Arial"/>
+          <w:color w:val="000000"/>
+          <w:sz w:val="24"/>
+        </w:rPr>
+        <w:t>. Disponível em: https://infermedica.com/product/symptom-checker. Acesso em: 11 maio 2026.</w:t>
       </w:r>
     </w:p>
     <w:p>
@@ -7199,7 +9885,25 @@
           <w:color w:val="000000"/>
           <w:sz w:val="24"/>
         </w:rPr>
-        <w:t>INTERCOM. Fin AI Agent explained. Disponível em: https://www.intercom.com/help/en/articles/7120684-fin-ai-agent-explained. Acesso em: 11 maio 2026.</w:t>
+        <w:t xml:space="preserve">INTERCOM. </w:t>
+      </w:r>
+      <w:r>
+        <w:rPr>
+          <w:rFonts w:ascii="Arial" w:hAnsi="Arial" w:eastAsia="Arial" w:cs="Arial"/>
+          <w:b w:val="1"/>
+          <w:bCs w:val="1"/>
+          <w:color w:val="000000"/>
+          <w:sz w:val="24"/>
+        </w:rPr>
+        <w:t>Fin AI Agent explained</w:t>
+      </w:r>
+      <w:r>
+        <w:rPr>
+          <w:rFonts w:ascii="Arial" w:hAnsi="Arial" w:eastAsia="Arial" w:cs="Arial"/>
+          <w:color w:val="000000"/>
+          <w:sz w:val="24"/>
+        </w:rPr>
+        <w:t>. Disponível em: https://www.intercom.com/help/en/articles/7120684-fin-ai-agent-explained. Acesso em: 11 maio 2026.</w:t>
       </w:r>
     </w:p>
     <w:p>
@@ -7213,7 +9917,25 @@
           <w:color w:val="000000"/>
           <w:sz w:val="24"/>
         </w:rPr>
-        <w:t>JAGATAP, Akshay; MERUGU, Srujana; COMAR, Prakash Mandayam. RxLens: Multi-Agent LLM-powered Scan and Order for Pharmacy. In: Proceedings of the 2025 Conference of the Nations of the Americas Chapter of the Association for Computational Linguistics: Human Language Technologies, 2025, Albuquerque. [S. l.]: Association for Computational Linguistics, 2025. p. 822-832. DOI: 10.18653/v1/2025.naacl-industry.63.</w:t>
+        <w:t xml:space="preserve">JAGATAP, Akshay; MERUGU, Srujana; COMAR, Prakash Mandayam. RxLens: Multi-Agent LLM-powered Scan and Order for Pharmacy. In: </w:t>
+      </w:r>
+      <w:r>
+        <w:rPr>
+          <w:rFonts w:ascii="Arial" w:hAnsi="Arial" w:eastAsia="Arial" w:cs="Arial"/>
+          <w:b w:val="1"/>
+          <w:bCs w:val="1"/>
+          <w:color w:val="000000"/>
+          <w:sz w:val="24"/>
+        </w:rPr>
+        <w:t>Proceedings of the 2025 Conference of the Nations of the Americas Chapter of the Association for Computational Linguistics: Human Language Technologies</w:t>
+      </w:r>
+      <w:r>
+        <w:rPr>
+          <w:rFonts w:ascii="Arial" w:hAnsi="Arial" w:eastAsia="Arial" w:cs="Arial"/>
+          <w:color w:val="000000"/>
+          <w:sz w:val="24"/>
+        </w:rPr>
+        <w:t>, 2025, Albuquerque. [S. l.]: Association for Computational Linguistics, 2025. p. 822-832. DOI: 10.18653/v1/2025.naacl-industry.63.</w:t>
       </w:r>
     </w:p>
     <w:p>
@@ -7245,7 +9967,25 @@
           <w:color w:val="000000"/>
           <w:sz w:val="24"/>
         </w:rPr>
-        <w:t xml:space="preserve"> Capable language models can outgrow the benefits of collaboration. Nature Machine Intelligence, [S. l.], v. 8, p. 1157-1172, 2026. DOI: 10.1038/s42256-026-01268-y. Disponível em: https://doi.org/10.1038/s42256-026-01268-y. Acesso em: 16 ago. 2026.</w:t>
+        <w:t xml:space="preserve"> Capable language models can outgrow the benefits of collaboration. </w:t>
+      </w:r>
+      <w:r>
+        <w:rPr>
+          <w:rFonts w:ascii="Arial" w:hAnsi="Arial" w:eastAsia="Arial" w:cs="Arial"/>
+          <w:b w:val="1"/>
+          <w:bCs w:val="1"/>
+          <w:color w:val="000000"/>
+          <w:sz w:val="24"/>
+        </w:rPr>
+        <w:t>Nature Machine Intelligence</w:t>
+      </w:r>
+      <w:r>
+        <w:rPr>
+          <w:rFonts w:ascii="Arial" w:hAnsi="Arial" w:eastAsia="Arial" w:cs="Arial"/>
+          <w:color w:val="000000"/>
+          <w:sz w:val="24"/>
+        </w:rPr>
+        <w:t>, [S. l.], v. 8, p. 1157-1172, 2026. DOI: 10.1038/s42256-026-01268-y. Disponível em: https://doi.org/10.1038/s42256-026-01268-y. Acesso em: 16 ago. 2026.</w:t>
       </w:r>
     </w:p>
     <w:p>
@@ -7277,7 +10017,25 @@
           <w:color w:val="000000"/>
           <w:sz w:val="24"/>
         </w:rPr>
-        <w:t xml:space="preserve"> A survey on LLM-based multi-agent systems: workflow, infrastructure, and challenges. Vicinagearth, [S. l.], v. 1, art. 9, 2024. DOI: 10.1007/s44336-024-00009-2. Disponível em: https://link.springer.com/article/10.1007/s44336-024-00009-2. Acesso em: 30 mar. 2026.</w:t>
+        <w:t xml:space="preserve"> A survey on LLM-based multi-agent systems: workflow, infrastructure, and challenges. </w:t>
+      </w:r>
+      <w:r>
+        <w:rPr>
+          <w:rFonts w:ascii="Arial" w:hAnsi="Arial" w:eastAsia="Arial" w:cs="Arial"/>
+          <w:b w:val="1"/>
+          <w:bCs w:val="1"/>
+          <w:color w:val="000000"/>
+          <w:sz w:val="24"/>
+        </w:rPr>
+        <w:t>Vicinagearth</w:t>
+      </w:r>
+      <w:r>
+        <w:rPr>
+          <w:rFonts w:ascii="Arial" w:hAnsi="Arial" w:eastAsia="Arial" w:cs="Arial"/>
+          <w:color w:val="000000"/>
+          <w:sz w:val="24"/>
+        </w:rPr>
+        <w:t>, [S. l.], v. 1, art. 9, 2024. DOI: 10.1007/s44336-024-00009-2. Disponível em: https://link.springer.com/article/10.1007/s44336-024-00009-2. Acesso em: 30 mar. 2026.</w:t>
       </w:r>
     </w:p>
     <w:p>
@@ -7291,7 +10049,25 @@
           <w:color w:val="000000"/>
           <w:sz w:val="24"/>
         </w:rPr>
-        <w:t>MCKINSEY &amp; COMPANY. The state of AI in early 2024: gen AI adoption spikes and starts to generate value. [S. l.], 2024. Disponível em: https://www.mckinsey.com/capabilities/quantumblack/our-insights/the-state-of-ai-2024. Acesso em: 30 mar. 2026.</w:t>
+        <w:t xml:space="preserve">MCKINSEY &amp; COMPANY. </w:t>
+      </w:r>
+      <w:r>
+        <w:rPr>
+          <w:rFonts w:ascii="Arial" w:hAnsi="Arial" w:eastAsia="Arial" w:cs="Arial"/>
+          <w:b w:val="1"/>
+          <w:bCs w:val="1"/>
+          <w:color w:val="000000"/>
+          <w:sz w:val="24"/>
+        </w:rPr>
+        <w:t>The state of AI in early 2024: gen AI adoption spikes and starts to generate value</w:t>
+      </w:r>
+      <w:r>
+        <w:rPr>
+          <w:rFonts w:ascii="Arial" w:hAnsi="Arial" w:eastAsia="Arial" w:cs="Arial"/>
+          <w:color w:val="000000"/>
+          <w:sz w:val="24"/>
+        </w:rPr>
+        <w:t>. [S. l.], 2024. Disponível em: https://www.mckinsey.com/capabilities/quantumblack/our-insights/the-state-of-ai-2024. Acesso em: 30 mar. 2026.</w:t>
       </w:r>
     </w:p>
     <w:p>
@@ -7305,7 +10081,25 @@
           <w:color w:val="000000"/>
           <w:sz w:val="24"/>
         </w:rPr>
-        <w:t>PGEU. Position paper on artificial intelligence. Brussels: Pharmaceutical Group of the European Union, 2025. Disponível em: https://www.pgeu.eu/wp-content/uploads/2025/06/PGEU-Position-Paper-on-Artificial-Intelligence.pdf. Acesso em: 30 mar. 2026.</w:t>
+        <w:t xml:space="preserve">PGEU. </w:t>
+      </w:r>
+      <w:r>
+        <w:rPr>
+          <w:rFonts w:ascii="Arial" w:hAnsi="Arial" w:eastAsia="Arial" w:cs="Arial"/>
+          <w:b w:val="1"/>
+          <w:bCs w:val="1"/>
+          <w:color w:val="000000"/>
+          <w:sz w:val="24"/>
+        </w:rPr>
+        <w:t>Position paper on artificial intelligence</w:t>
+      </w:r>
+      <w:r>
+        <w:rPr>
+          <w:rFonts w:ascii="Arial" w:hAnsi="Arial" w:eastAsia="Arial" w:cs="Arial"/>
+          <w:color w:val="000000"/>
+          <w:sz w:val="24"/>
+        </w:rPr>
+        <w:t>. Brussels: Pharmaceutical Group of the European Union, 2025. Disponível em: https://www.pgeu.eu/wp-content/uploads/2025/06/PGEU-Position-Paper-on-Artificial-Intelligence.pdf. Acesso em: 30 mar. 2026.</w:t>
       </w:r>
     </w:p>
     <w:p>
@@ -7337,7 +10131,25 @@
           <w:color w:val="000000"/>
           <w:sz w:val="24"/>
         </w:rPr>
-        <w:t xml:space="preserve"> AgentAI: a comprehensive survey on autonomous agents in distributed AI for industry 4.0. Expert Systems with Applications, [S. l.], v. 291, art. 128404, 2025. DOI: 10.1016/j.eswa.2025.128404. Disponível em: https://doi.org/10.1016/j.eswa.2025.128404. Acesso em: 16 ago. 2026.</w:t>
+        <w:t xml:space="preserve"> AgentAI: a comprehensive survey on autonomous agents in distributed AI for industry 4.0. </w:t>
+      </w:r>
+      <w:r>
+        <w:rPr>
+          <w:rFonts w:ascii="Arial" w:hAnsi="Arial" w:eastAsia="Arial" w:cs="Arial"/>
+          <w:b w:val="1"/>
+          <w:bCs w:val="1"/>
+          <w:color w:val="000000"/>
+          <w:sz w:val="24"/>
+        </w:rPr>
+        <w:t>Expert Systems with Applications</w:t>
+      </w:r>
+      <w:r>
+        <w:rPr>
+          <w:rFonts w:ascii="Arial" w:hAnsi="Arial" w:eastAsia="Arial" w:cs="Arial"/>
+          <w:color w:val="000000"/>
+          <w:sz w:val="24"/>
+        </w:rPr>
+        <w:t>, [S. l.], v. 291, art. 128404, 2025. DOI: 10.1016/j.eswa.2025.128404. Disponível em: https://doi.org/10.1016/j.eswa.2025.128404. Acesso em: 16 ago. 2026.</w:t>
       </w:r>
     </w:p>
     <w:p>
@@ -7351,7 +10163,25 @@
           <w:color w:val="000000"/>
           <w:sz w:val="24"/>
         </w:rPr>
-        <w:t>SALESFORCE. AI Customer Service Agents. Disponível em: https://www.salesforce.com/service/ai/customer-service-agents/. Acesso em: 11 maio 2026.</w:t>
+        <w:t xml:space="preserve">SALESFORCE. </w:t>
+      </w:r>
+      <w:r>
+        <w:rPr>
+          <w:rFonts w:ascii="Arial" w:hAnsi="Arial" w:eastAsia="Arial" w:cs="Arial"/>
+          <w:b w:val="1"/>
+          <w:bCs w:val="1"/>
+          <w:color w:val="000000"/>
+          <w:sz w:val="24"/>
+        </w:rPr>
+        <w:t>AI Customer Service Agents</w:t>
+      </w:r>
+      <w:r>
+        <w:rPr>
+          <w:rFonts w:ascii="Arial" w:hAnsi="Arial" w:eastAsia="Arial" w:cs="Arial"/>
+          <w:color w:val="000000"/>
+          <w:sz w:val="24"/>
+        </w:rPr>
+        <w:t>. Disponível em: https://www.salesforce.com/service/ai/customer-service-agents/. Acesso em: 11 maio 2026.</w:t>
       </w:r>
     </w:p>
     <w:p>
@@ -7365,7 +10195,25 @@
           <w:color w:val="000000"/>
           <w:sz w:val="24"/>
         </w:rPr>
-        <w:t>STANFORD HAI. AI Index Report 2025. Stanford: Stanford Institute for Human-Centered Artificial Intelligence, 2025. Disponível em: https://hai.stanford.edu/ai-index. Acesso em: 30 mar. 2026.</w:t>
+        <w:t xml:space="preserve">STANFORD HAI. </w:t>
+      </w:r>
+      <w:r>
+        <w:rPr>
+          <w:rFonts w:ascii="Arial" w:hAnsi="Arial" w:eastAsia="Arial" w:cs="Arial"/>
+          <w:b w:val="1"/>
+          <w:bCs w:val="1"/>
+          <w:color w:val="000000"/>
+          <w:sz w:val="24"/>
+        </w:rPr>
+        <w:t>AI Index Report 2025</w:t>
+      </w:r>
+      <w:r>
+        <w:rPr>
+          <w:rFonts w:ascii="Arial" w:hAnsi="Arial" w:eastAsia="Arial" w:cs="Arial"/>
+          <w:color w:val="000000"/>
+          <w:sz w:val="24"/>
+        </w:rPr>
+        <w:t>. Stanford: Stanford Institute for Human-Centered Artificial Intelligence, 2025. Disponível em: https://hai.stanford.edu/ai-index. Acesso em: 30 mar. 2026.</w:t>
       </w:r>
     </w:p>
     <w:p>
@@ -7379,7 +10227,25 @@
           <w:color w:val="000000"/>
           <w:sz w:val="24"/>
         </w:rPr>
-        <w:t>WHO EUROPE. Advancing the role of pharmacists to meet changing patient and health system needs. Copenhagen: World Health Organization Regional Office for Europe, 2024. Disponível em: https://www.who.int/belgium/feature-stories/item/advancing-the-role-of-pharmacists-to-meet-changing-patient-and-health-system-needs. Acesso em: 16 ago. 2026.</w:t>
+        <w:t xml:space="preserve">WHO EUROPE. </w:t>
+      </w:r>
+      <w:r>
+        <w:rPr>
+          <w:rFonts w:ascii="Arial" w:hAnsi="Arial" w:eastAsia="Arial" w:cs="Arial"/>
+          <w:b w:val="1"/>
+          <w:bCs w:val="1"/>
+          <w:color w:val="000000"/>
+          <w:sz w:val="24"/>
+        </w:rPr>
+        <w:t>Advancing the role of pharmacists to meet changing patient and health system needs</w:t>
+      </w:r>
+      <w:r>
+        <w:rPr>
+          <w:rFonts w:ascii="Arial" w:hAnsi="Arial" w:eastAsia="Arial" w:cs="Arial"/>
+          <w:color w:val="000000"/>
+          <w:sz w:val="24"/>
+        </w:rPr>
+        <w:t>. Copenhagen: World Health Organization Regional Office for Europe, 2024. Disponível em: https://www.who.int/belgium/feature-stories/item/advancing-the-role-of-pharmacists-to-meet-changing-patient-and-health-system-needs. Acesso em: 16 ago. 2026.</w:t>
       </w:r>
     </w:p>
     <w:p>
@@ -7411,7 +10277,25 @@
           <w:color w:val="000000"/>
           <w:sz w:val="24"/>
         </w:rPr>
-        <w:t xml:space="preserve"> A survey on agent workflow: status and future. In: 2025 8th International Conference on Artificial Intelligence and Big Data (ICAIBD), 2025, Chengdu. [S. l.]: IEEE, 2025. p. 770-781. DOI: 10.1109/ICAIBD64986.2025.11082076. Disponível em: https://doi.org/10.1109/ICAIBD64986.2025.11082076. Acesso em: 30 mar. 2026.</w:t>
+        <w:t xml:space="preserve"> A survey on agent workflow: status and future. In: </w:t>
+      </w:r>
+      <w:r>
+        <w:rPr>
+          <w:rFonts w:ascii="Arial" w:hAnsi="Arial" w:eastAsia="Arial" w:cs="Arial"/>
+          <w:b w:val="1"/>
+          <w:bCs w:val="1"/>
+          <w:color w:val="000000"/>
+          <w:sz w:val="24"/>
+        </w:rPr>
+        <w:t>2025 8th International Conference on Artificial Intelligence and Big Data (ICAIBD)</w:t>
+      </w:r>
+      <w:r>
+        <w:rPr>
+          <w:rFonts w:ascii="Arial" w:hAnsi="Arial" w:eastAsia="Arial" w:cs="Arial"/>
+          <w:color w:val="000000"/>
+          <w:sz w:val="24"/>
+        </w:rPr>
+        <w:t>, 2025, Chengdu. [S. l.]: IEEE, 2025. p. 770-781. DOI: 10.1109/ICAIBD64986.2025.11082076. Disponível em: https://doi.org/10.1109/ICAIBD64986.2025.11082076. Acesso em: 30 mar. 2026.</w:t>
       </w:r>
     </w:p>
     <w:p>
@@ -7425,7 +10309,25 @@
           <w:color w:val="000000"/>
           <w:sz w:val="24"/>
         </w:rPr>
-        <w:t>ZENDESK. About AI agents. Disponível em: https://support.zendesk.com/hc/en-us/articles/6970583409690-About-AI-agents. Acesso em: 11 maio 2026.</w:t>
+        <w:t xml:space="preserve">ZENDESK. </w:t>
+      </w:r>
+      <w:r>
+        <w:rPr>
+          <w:rFonts w:ascii="Arial" w:hAnsi="Arial" w:eastAsia="Arial" w:cs="Arial"/>
+          <w:b w:val="1"/>
+          <w:bCs w:val="1"/>
+          <w:color w:val="000000"/>
+          <w:sz w:val="24"/>
+        </w:rPr>
+        <w:t>About AI agents</w:t>
+      </w:r>
+      <w:r>
+        <w:rPr>
+          <w:rFonts w:ascii="Arial" w:hAnsi="Arial" w:eastAsia="Arial" w:cs="Arial"/>
+          <w:color w:val="000000"/>
+          <w:sz w:val="24"/>
+        </w:rPr>
+        <w:t>. Disponível em: https://support.zendesk.com/hc/en-us/articles/6970583409690-About-AI-agents. Acesso em: 11 maio 2026.</w:t>
       </w:r>
     </w:p>
     <w:sectPr>
@@ -19662,6 +22564,7 @@
   <w:style w:type="paragraph" w:customStyle="1" w:styleId="ReferenceEntry">
     <w:name w:val="Reference Entry"/>
     <w:pPr>
+      <w:keepLines/>
       <w:spacing w:after="240" w:line="240" w:lineRule="auto" w:before="0"/>
       <w:ind w:left="0" w:right="0" w:firstLine="0"/>
       <w:jc w:val="left"/>

</xml_diff>

<commit_message>
docs(tcc): usar líder automático no sumário
</commit_message>
<xml_diff>
--- a/TCC/TCC_MAB_Facens_Ralph_10x.docx
+++ b/TCC/TCC_MAB_Facens_Ralph_10x.docx
@@ -341,6 +341,9 @@
     <w:p>
       <w:pPr>
         <w:pStyle w:val="FacensTOC1"/>
+        <w:tabs>
+          <w:tab w:pos="9071" w:val="right" w:leader="dot"/>
+        </w:tabs>
       </w:pPr>
       <w:hyperlink w:anchor="_TCC_H_1000" w:history="1">
         <w:r>
@@ -361,7 +364,7 @@
           <w:color w:val="000000"/>
           <w:sz w:val="24"/>
         </w:rPr>
-        <w:t>.........................................................................................................</w:t>
+        <w:tab/>
       </w:r>
       <w:hyperlink w:anchor="_TCC_H_1000" w:history="1">
         <w:r>
@@ -378,6 +381,9 @@
     <w:p>
       <w:pPr>
         <w:pStyle w:val="FacensTOC1"/>
+        <w:tabs>
+          <w:tab w:pos="9071" w:val="right" w:leader="dot"/>
+        </w:tabs>
       </w:pPr>
       <w:hyperlink w:anchor="_TCC_H_1001" w:history="1">
         <w:r>
@@ -398,7 +404,7 @@
           <w:color w:val="000000"/>
           <w:sz w:val="24"/>
         </w:rPr>
-        <w:t>.............................................................................</w:t>
+        <w:tab/>
       </w:r>
       <w:hyperlink w:anchor="_TCC_H_1001" w:history="1">
         <w:r>
@@ -415,6 +421,9 @@
     <w:p>
       <w:pPr>
         <w:pStyle w:val="FacensTOC2"/>
+        <w:tabs>
+          <w:tab w:pos="9071" w:val="right" w:leader="dot"/>
+        </w:tabs>
       </w:pPr>
       <w:hyperlink w:anchor="_TCC_H_1002" w:history="1">
         <w:r>
@@ -435,7 +444,7 @@
           <w:color w:val="000000"/>
           <w:sz w:val="24"/>
         </w:rPr>
-        <w:t>........................................</w:t>
+        <w:tab/>
       </w:r>
       <w:hyperlink w:anchor="_TCC_H_1002" w:history="1">
         <w:r>
@@ -452,6 +461,9 @@
     <w:p>
       <w:pPr>
         <w:pStyle w:val="FacensTOC3"/>
+        <w:tabs>
+          <w:tab w:pos="9071" w:val="right" w:leader="dot"/>
+        </w:tabs>
       </w:pPr>
       <w:hyperlink w:anchor="_TCC_H_1003" w:history="1">
         <w:r>
@@ -472,7 +484,7 @@
           <w:color w:val="000000"/>
           <w:sz w:val="24"/>
         </w:rPr>
-        <w:t>...................................</w:t>
+        <w:tab/>
       </w:r>
       <w:hyperlink w:anchor="_TCC_H_1003" w:history="1">
         <w:r>
@@ -489,6 +501,9 @@
     <w:p>
       <w:pPr>
         <w:pStyle w:val="FacensTOC3"/>
+        <w:tabs>
+          <w:tab w:pos="9071" w:val="right" w:leader="dot"/>
+        </w:tabs>
       </w:pPr>
       <w:hyperlink w:anchor="_TCC_H_1004" w:history="1">
         <w:r>
@@ -509,7 +524,7 @@
           <w:color w:val="000000"/>
           <w:sz w:val="24"/>
         </w:rPr>
-        <w:t>................................</w:t>
+        <w:tab/>
       </w:r>
       <w:hyperlink w:anchor="_TCC_H_1004" w:history="1">
         <w:r>
@@ -526,6 +541,9 @@
     <w:p>
       <w:pPr>
         <w:pStyle w:val="FacensTOC3"/>
+        <w:tabs>
+          <w:tab w:pos="9071" w:val="right" w:leader="dot"/>
+        </w:tabs>
       </w:pPr>
       <w:hyperlink w:anchor="_TCC_H_1005" w:history="1">
         <w:r>
@@ -546,7 +564,7 @@
           <w:color w:val="000000"/>
           <w:sz w:val="24"/>
         </w:rPr>
-        <w:t>..............................................</w:t>
+        <w:tab/>
       </w:r>
       <w:hyperlink w:anchor="_TCC_H_1005" w:history="1">
         <w:r>
@@ -563,6 +581,9 @@
     <w:p>
       <w:pPr>
         <w:pStyle w:val="FacensTOC2"/>
+        <w:tabs>
+          <w:tab w:pos="9071" w:val="right" w:leader="dot"/>
+        </w:tabs>
       </w:pPr>
       <w:hyperlink w:anchor="_TCC_H_1006" w:history="1">
         <w:r>
@@ -603,7 +624,7 @@
           <w:color w:val="000000"/>
           <w:sz w:val="24"/>
         </w:rPr>
-        <w:t>.....................</w:t>
+        <w:tab/>
       </w:r>
       <w:hyperlink w:anchor="_TCC_H_1006" w:history="1">
         <w:r>
@@ -620,6 +641,9 @@
     <w:p>
       <w:pPr>
         <w:pStyle w:val="FacensTOC3"/>
+        <w:tabs>
+          <w:tab w:pos="9071" w:val="right" w:leader="dot"/>
+        </w:tabs>
       </w:pPr>
       <w:hyperlink w:anchor="_TCC_H_1007" w:history="1">
         <w:r>
@@ -640,7 +664,7 @@
           <w:color w:val="000000"/>
           <w:sz w:val="24"/>
         </w:rPr>
-        <w:t>............................................................................</w:t>
+        <w:tab/>
       </w:r>
       <w:hyperlink w:anchor="_TCC_H_1007" w:history="1">
         <w:r>
@@ -657,6 +681,9 @@
     <w:p>
       <w:pPr>
         <w:pStyle w:val="FacensTOC3"/>
+        <w:tabs>
+          <w:tab w:pos="9071" w:val="right" w:leader="dot"/>
+        </w:tabs>
       </w:pPr>
       <w:hyperlink w:anchor="_TCC_H_1008" w:history="1">
         <w:r>
@@ -677,7 +704,7 @@
           <w:color w:val="000000"/>
           <w:sz w:val="24"/>
         </w:rPr>
-        <w:t>..............................................................</w:t>
+        <w:tab/>
       </w:r>
       <w:hyperlink w:anchor="_TCC_H_1008" w:history="1">
         <w:r>
@@ -694,6 +721,9 @@
     <w:p>
       <w:pPr>
         <w:pStyle w:val="FacensTOC3"/>
+        <w:tabs>
+          <w:tab w:pos="9071" w:val="right" w:leader="dot"/>
+        </w:tabs>
       </w:pPr>
       <w:hyperlink w:anchor="_TCC_H_1009" w:history="1">
         <w:r>
@@ -714,7 +744,7 @@
           <w:color w:val="000000"/>
           <w:sz w:val="24"/>
         </w:rPr>
-        <w:t>......................................................</w:t>
+        <w:tab/>
       </w:r>
       <w:hyperlink w:anchor="_TCC_H_1009" w:history="1">
         <w:r>
@@ -731,6 +761,9 @@
     <w:p>
       <w:pPr>
         <w:pStyle w:val="FacensTOC2"/>
+        <w:tabs>
+          <w:tab w:pos="9071" w:val="right" w:leader="dot"/>
+        </w:tabs>
       </w:pPr>
       <w:hyperlink w:anchor="_TCC_H_1010" w:history="1">
         <w:r>
@@ -751,7 +784,7 @@
           <w:color w:val="000000"/>
           <w:sz w:val="24"/>
         </w:rPr>
-        <w:t>........................................................................</w:t>
+        <w:tab/>
       </w:r>
       <w:hyperlink w:anchor="_TCC_H_1010" w:history="1">
         <w:r>
@@ -768,6 +801,9 @@
     <w:p>
       <w:pPr>
         <w:pStyle w:val="FacensTOC3"/>
+        <w:tabs>
+          <w:tab w:pos="9071" w:val="right" w:leader="dot"/>
+        </w:tabs>
       </w:pPr>
       <w:hyperlink w:anchor="_TCC_H_1011" w:history="1">
         <w:r>
@@ -788,7 +824,7 @@
           <w:color w:val="000000"/>
           <w:sz w:val="24"/>
         </w:rPr>
-        <w:t>....................................................</w:t>
+        <w:tab/>
       </w:r>
       <w:hyperlink w:anchor="_TCC_H_1011" w:history="1">
         <w:r>
@@ -805,6 +841,9 @@
     <w:p>
       <w:pPr>
         <w:pStyle w:val="FacensTOC3"/>
+        <w:tabs>
+          <w:tab w:pos="9071" w:val="right" w:leader="dot"/>
+        </w:tabs>
       </w:pPr>
       <w:hyperlink w:anchor="_TCC_H_1012" w:history="1">
         <w:r>
@@ -825,7 +864,7 @@
           <w:color w:val="000000"/>
           <w:sz w:val="24"/>
         </w:rPr>
-        <w:t>..............................</w:t>
+        <w:tab/>
       </w:r>
       <w:hyperlink w:anchor="_TCC_H_1012" w:history="1">
         <w:r>
@@ -842,6 +881,9 @@
     <w:p>
       <w:pPr>
         <w:pStyle w:val="FacensTOC3"/>
+        <w:tabs>
+          <w:tab w:pos="9071" w:val="right" w:leader="dot"/>
+        </w:tabs>
       </w:pPr>
       <w:hyperlink w:anchor="_TCC_H_1013" w:history="1">
         <w:r>
@@ -862,7 +904,7 @@
           <w:color w:val="000000"/>
           <w:sz w:val="24"/>
         </w:rPr>
-        <w:t>..................</w:t>
+        <w:tab/>
       </w:r>
       <w:hyperlink w:anchor="_TCC_H_1013" w:history="1">
         <w:r>
@@ -879,6 +921,9 @@
     <w:p>
       <w:pPr>
         <w:pStyle w:val="FacensTOC2"/>
+        <w:tabs>
+          <w:tab w:pos="9071" w:val="right" w:leader="dot"/>
+        </w:tabs>
       </w:pPr>
       <w:hyperlink w:anchor="_TCC_H_1014" w:history="1">
         <w:r>
@@ -899,7 +944,7 @@
           <w:color w:val="000000"/>
           <w:sz w:val="24"/>
         </w:rPr>
-        <w:t>.......................................................</w:t>
+        <w:tab/>
       </w:r>
       <w:hyperlink w:anchor="_TCC_H_1014" w:history="1">
         <w:r>
@@ -916,6 +961,9 @@
     <w:p>
       <w:pPr>
         <w:pStyle w:val="FacensTOC3"/>
+        <w:tabs>
+          <w:tab w:pos="9071" w:val="right" w:leader="dot"/>
+        </w:tabs>
       </w:pPr>
       <w:hyperlink w:anchor="_TCC_H_1015" w:history="1">
         <w:r>
@@ -936,7 +984,7 @@
           <w:color w:val="000000"/>
           <w:sz w:val="24"/>
         </w:rPr>
-        <w:t>..................................................</w:t>
+        <w:tab/>
       </w:r>
       <w:hyperlink w:anchor="_TCC_H_1015" w:history="1">
         <w:r>
@@ -953,6 +1001,9 @@
     <w:p>
       <w:pPr>
         <w:pStyle w:val="FacensTOC3"/>
+        <w:tabs>
+          <w:tab w:pos="9071" w:val="right" w:leader="dot"/>
+        </w:tabs>
       </w:pPr>
       <w:hyperlink w:anchor="_TCC_H_1016" w:history="1">
         <w:r>
@@ -993,7 +1044,7 @@
           <w:color w:val="000000"/>
           <w:sz w:val="24"/>
         </w:rPr>
-        <w:t>...........................................................</w:t>
+        <w:tab/>
       </w:r>
       <w:hyperlink w:anchor="_TCC_H_1016" w:history="1">
         <w:r>
@@ -1010,6 +1061,9 @@
     <w:p>
       <w:pPr>
         <w:pStyle w:val="FacensTOC3"/>
+        <w:tabs>
+          <w:tab w:pos="9071" w:val="right" w:leader="dot"/>
+        </w:tabs>
       </w:pPr>
       <w:hyperlink w:anchor="_TCC_H_1017" w:history="1">
         <w:r>
@@ -1050,7 +1104,7 @@
           <w:color w:val="000000"/>
           <w:sz w:val="24"/>
         </w:rPr>
-        <w:t>...................................</w:t>
+        <w:tab/>
       </w:r>
       <w:hyperlink w:anchor="_TCC_H_1017" w:history="1">
         <w:r>
@@ -1067,6 +1121,9 @@
     <w:p>
       <w:pPr>
         <w:pStyle w:val="FacensTOC3"/>
+        <w:tabs>
+          <w:tab w:pos="9071" w:val="right" w:leader="dot"/>
+        </w:tabs>
       </w:pPr>
       <w:hyperlink w:anchor="_TCC_H_1018" w:history="1">
         <w:r>
@@ -1087,7 +1144,7 @@
           <w:color w:val="000000"/>
           <w:sz w:val="24"/>
         </w:rPr>
-        <w:t>.........................................</w:t>
+        <w:tab/>
       </w:r>
       <w:hyperlink w:anchor="_TCC_H_1018" w:history="1">
         <w:r>
@@ -1104,6 +1161,9 @@
     <w:p>
       <w:pPr>
         <w:pStyle w:val="FacensTOC2"/>
+        <w:tabs>
+          <w:tab w:pos="9071" w:val="right" w:leader="dot"/>
+        </w:tabs>
       </w:pPr>
       <w:hyperlink w:anchor="_TCC_H_1019" w:history="1">
         <w:r>
@@ -1124,7 +1184,7 @@
           <w:color w:val="000000"/>
           <w:sz w:val="24"/>
         </w:rPr>
-        <w:t>................................................................</w:t>
+        <w:tab/>
       </w:r>
       <w:hyperlink w:anchor="_TCC_H_1019" w:history="1">
         <w:r>
@@ -1141,6 +1201,9 @@
     <w:p>
       <w:pPr>
         <w:pStyle w:val="FacensTOC3"/>
+        <w:tabs>
+          <w:tab w:pos="9071" w:val="right" w:leader="dot"/>
+        </w:tabs>
       </w:pPr>
       <w:hyperlink w:anchor="_TCC_H_1020" w:history="1">
         <w:r>
@@ -1161,7 +1224,7 @@
           <w:color w:val="000000"/>
           <w:sz w:val="24"/>
         </w:rPr>
-        <w:t>........................</w:t>
+        <w:tab/>
       </w:r>
       <w:hyperlink w:anchor="_TCC_H_1020" w:history="1">
         <w:r>
@@ -1178,6 +1241,9 @@
     <w:p>
       <w:pPr>
         <w:pStyle w:val="FacensTOC3"/>
+        <w:tabs>
+          <w:tab w:pos="9071" w:val="right" w:leader="dot"/>
+        </w:tabs>
       </w:pPr>
       <w:hyperlink w:anchor="_TCC_H_1021" w:history="1">
         <w:r>
@@ -1198,7 +1264,7 @@
           <w:color w:val="000000"/>
           <w:sz w:val="24"/>
         </w:rPr>
-        <w:t>..............................................................</w:t>
+        <w:tab/>
       </w:r>
       <w:hyperlink w:anchor="_TCC_H_1021" w:history="1">
         <w:r>
@@ -1215,6 +1281,9 @@
     <w:p>
       <w:pPr>
         <w:pStyle w:val="FacensTOC3"/>
+        <w:tabs>
+          <w:tab w:pos="9071" w:val="right" w:leader="dot"/>
+        </w:tabs>
       </w:pPr>
       <w:hyperlink w:anchor="_TCC_H_1022" w:history="1">
         <w:r>
@@ -1235,7 +1304,7 @@
           <w:color w:val="000000"/>
           <w:sz w:val="24"/>
         </w:rPr>
-        <w:t>................................................</w:t>
+        <w:tab/>
       </w:r>
       <w:hyperlink w:anchor="_TCC_H_1022" w:history="1">
         <w:r>
@@ -1252,6 +1321,9 @@
     <w:p>
       <w:pPr>
         <w:pStyle w:val="FacensTOC1"/>
+        <w:tabs>
+          <w:tab w:pos="9071" w:val="right" w:leader="dot"/>
+        </w:tabs>
       </w:pPr>
       <w:hyperlink w:anchor="_TCC_H_1023" w:history="1">
         <w:r>
@@ -1272,7 +1344,7 @@
           <w:color w:val="000000"/>
           <w:sz w:val="24"/>
         </w:rPr>
-        <w:t>...............................................................................</w:t>
+        <w:tab/>
       </w:r>
       <w:hyperlink w:anchor="_TCC_H_1023" w:history="1">
         <w:r>
@@ -1289,6 +1361,9 @@
     <w:p>
       <w:pPr>
         <w:pStyle w:val="FacensTOC2"/>
+        <w:tabs>
+          <w:tab w:pos="9071" w:val="right" w:leader="dot"/>
+        </w:tabs>
       </w:pPr>
       <w:hyperlink w:anchor="_TCC_H_1024" w:history="1">
         <w:r>
@@ -1309,7 +1384,7 @@
           <w:color w:val="000000"/>
           <w:sz w:val="24"/>
         </w:rPr>
-        <w:t>......................................</w:t>
+        <w:tab/>
       </w:r>
       <w:hyperlink w:anchor="_TCC_H_1024" w:history="1">
         <w:r>
@@ -1326,6 +1401,9 @@
     <w:p>
       <w:pPr>
         <w:pStyle w:val="FacensTOC2"/>
+        <w:tabs>
+          <w:tab w:pos="9071" w:val="right" w:leader="dot"/>
+        </w:tabs>
       </w:pPr>
       <w:hyperlink w:anchor="_TCC_H_1025" w:history="1">
         <w:r>
@@ -1346,7 +1424,7 @@
           <w:color w:val="000000"/>
           <w:sz w:val="24"/>
         </w:rPr>
-        <w:t>..................................................</w:t>
+        <w:tab/>
       </w:r>
       <w:hyperlink w:anchor="_TCC_H_1025" w:history="1">
         <w:r>
@@ -1363,6 +1441,9 @@
     <w:p>
       <w:pPr>
         <w:pStyle w:val="FacensTOC2"/>
+        <w:tabs>
+          <w:tab w:pos="9071" w:val="right" w:leader="dot"/>
+        </w:tabs>
       </w:pPr>
       <w:hyperlink w:anchor="_TCC_H_1026" w:history="1">
         <w:r>
@@ -1383,7 +1464,7 @@
           <w:color w:val="000000"/>
           <w:sz w:val="24"/>
         </w:rPr>
-        <w:t>.......................................</w:t>
+        <w:tab/>
       </w:r>
       <w:hyperlink w:anchor="_TCC_H_1026" w:history="1">
         <w:r>
@@ -1400,6 +1481,9 @@
     <w:p>
       <w:pPr>
         <w:pStyle w:val="FacensTOC2"/>
+        <w:tabs>
+          <w:tab w:pos="9071" w:val="right" w:leader="dot"/>
+        </w:tabs>
       </w:pPr>
       <w:hyperlink w:anchor="_TCC_H_1027" w:history="1">
         <w:r>
@@ -1420,7 +1504,7 @@
           <w:color w:val="000000"/>
           <w:sz w:val="24"/>
         </w:rPr>
-        <w:t>.........................................................................</w:t>
+        <w:tab/>
       </w:r>
       <w:hyperlink w:anchor="_TCC_H_1027" w:history="1">
         <w:r>
@@ -1437,6 +1521,9 @@
     <w:p>
       <w:pPr>
         <w:pStyle w:val="FacensTOC1"/>
+        <w:tabs>
+          <w:tab w:pos="9071" w:val="right" w:leader="dot"/>
+        </w:tabs>
       </w:pPr>
       <w:hyperlink w:anchor="_TCC_H_1028" w:history="1">
         <w:r>
@@ -1457,7 +1544,7 @@
           <w:color w:val="000000"/>
           <w:sz w:val="24"/>
         </w:rPr>
-        <w:t>....................................................................................................</w:t>
+        <w:tab/>
       </w:r>
       <w:hyperlink w:anchor="_TCC_H_1028" w:history="1">
         <w:r>
@@ -1474,6 +1561,9 @@
     <w:p>
       <w:pPr>
         <w:pStyle w:val="FacensTOC2"/>
+        <w:tabs>
+          <w:tab w:pos="9071" w:val="right" w:leader="dot"/>
+        </w:tabs>
       </w:pPr>
       <w:hyperlink w:anchor="_TCC_H_1029" w:history="1">
         <w:r>
@@ -1494,7 +1584,7 @@
           <w:color w:val="000000"/>
           <w:sz w:val="24"/>
         </w:rPr>
-        <w:t>....................................................................................</w:t>
+        <w:tab/>
       </w:r>
       <w:hyperlink w:anchor="_TCC_H_1029" w:history="1">
         <w:r>
@@ -1511,6 +1601,9 @@
     <w:p>
       <w:pPr>
         <w:pStyle w:val="FacensTOC2"/>
+        <w:tabs>
+          <w:tab w:pos="9071" w:val="right" w:leader="dot"/>
+        </w:tabs>
       </w:pPr>
       <w:hyperlink w:anchor="_TCC_H_1030" w:history="1">
         <w:r>
@@ -1531,7 +1624,7 @@
           <w:color w:val="000000"/>
           <w:sz w:val="24"/>
         </w:rPr>
-        <w:t>..............................................................................</w:t>
+        <w:tab/>
       </w:r>
       <w:hyperlink w:anchor="_TCC_H_1030" w:history="1">
         <w:r>
@@ -1548,6 +1641,9 @@
     <w:p>
       <w:pPr>
         <w:pStyle w:val="FacensTOC2"/>
+        <w:tabs>
+          <w:tab w:pos="9071" w:val="right" w:leader="dot"/>
+        </w:tabs>
       </w:pPr>
       <w:hyperlink w:anchor="_TCC_H_1031" w:history="1">
         <w:r>
@@ -1568,7 +1664,7 @@
           <w:color w:val="000000"/>
           <w:sz w:val="24"/>
         </w:rPr>
-        <w:t>...............................................</w:t>
+        <w:tab/>
       </w:r>
       <w:hyperlink w:anchor="_TCC_H_1031" w:history="1">
         <w:r>
@@ -1585,6 +1681,9 @@
     <w:p>
       <w:pPr>
         <w:pStyle w:val="FacensTOC2"/>
+        <w:tabs>
+          <w:tab w:pos="9071" w:val="right" w:leader="dot"/>
+        </w:tabs>
       </w:pPr>
       <w:hyperlink w:anchor="_TCC_H_1032" w:history="1">
         <w:r>
@@ -1605,7 +1704,7 @@
           <w:color w:val="000000"/>
           <w:sz w:val="24"/>
         </w:rPr>
-        <w:t>.........................................................................</w:t>
+        <w:tab/>
       </w:r>
       <w:hyperlink w:anchor="_TCC_H_1032" w:history="1">
         <w:r>
@@ -1622,6 +1721,9 @@
     <w:p>
       <w:pPr>
         <w:pStyle w:val="FacensTOC1"/>
+        <w:tabs>
+          <w:tab w:pos="9071" w:val="right" w:leader="dot"/>
+        </w:tabs>
       </w:pPr>
       <w:hyperlink w:anchor="_TCC_H_1033" w:history="1">
         <w:r>
@@ -1642,7 +1744,7 @@
           <w:color w:val="000000"/>
           <w:sz w:val="24"/>
         </w:rPr>
-        <w:t>..............................................................................</w:t>
+        <w:tab/>
       </w:r>
       <w:hyperlink w:anchor="_TCC_H_1033" w:history="1">
         <w:r>
@@ -1659,6 +1761,9 @@
     <w:p>
       <w:pPr>
         <w:pStyle w:val="FacensTOC2"/>
+        <w:tabs>
+          <w:tab w:pos="9071" w:val="right" w:leader="dot"/>
+        </w:tabs>
       </w:pPr>
       <w:hyperlink w:anchor="_TCC_H_1034" w:history="1">
         <w:r>
@@ -1679,7 +1784,7 @@
           <w:color w:val="000000"/>
           <w:sz w:val="24"/>
         </w:rPr>
-        <w:t>.......................................................................</w:t>
+        <w:tab/>
       </w:r>
       <w:hyperlink w:anchor="_TCC_H_1034" w:history="1">
         <w:r>
@@ -1696,6 +1801,9 @@
     <w:p>
       <w:pPr>
         <w:pStyle w:val="FacensTOC2"/>
+        <w:tabs>
+          <w:tab w:pos="9071" w:val="right" w:leader="dot"/>
+        </w:tabs>
       </w:pPr>
       <w:hyperlink w:anchor="_TCC_H_1035" w:history="1">
         <w:r>
@@ -1716,7 +1824,7 @@
           <w:color w:val="000000"/>
           <w:sz w:val="24"/>
         </w:rPr>
-        <w:t>........................................................................</w:t>
+        <w:tab/>
       </w:r>
       <w:hyperlink w:anchor="_TCC_H_1035" w:history="1">
         <w:r>
@@ -1733,6 +1841,9 @@
     <w:p>
       <w:pPr>
         <w:pStyle w:val="FacensTOC2"/>
+        <w:tabs>
+          <w:tab w:pos="9071" w:val="right" w:leader="dot"/>
+        </w:tabs>
       </w:pPr>
       <w:hyperlink w:anchor="_TCC_H_1036" w:history="1">
         <w:r>
@@ -1753,7 +1864,7 @@
           <w:color w:val="000000"/>
           <w:sz w:val="24"/>
         </w:rPr>
-        <w:t>...................................................................</w:t>
+        <w:tab/>
       </w:r>
       <w:hyperlink w:anchor="_TCC_H_1036" w:history="1">
         <w:r>
@@ -1770,6 +1881,9 @@
     <w:p>
       <w:pPr>
         <w:pStyle w:val="FacensTOC2"/>
+        <w:tabs>
+          <w:tab w:pos="9071" w:val="right" w:leader="dot"/>
+        </w:tabs>
       </w:pPr>
       <w:hyperlink w:anchor="_TCC_H_1037" w:history="1">
         <w:r>
@@ -1790,7 +1904,7 @@
           <w:color w:val="000000"/>
           <w:sz w:val="24"/>
         </w:rPr>
-        <w:t>.........................................................................</w:t>
+        <w:tab/>
       </w:r>
       <w:hyperlink w:anchor="_TCC_H_1037" w:history="1">
         <w:r>
@@ -1807,6 +1921,9 @@
     <w:p>
       <w:pPr>
         <w:pStyle w:val="FacensTOC1"/>
+        <w:tabs>
+          <w:tab w:pos="9071" w:val="right" w:leader="dot"/>
+        </w:tabs>
       </w:pPr>
       <w:hyperlink w:anchor="_TCC_H_1038" w:history="1">
         <w:r>
@@ -1827,7 +1944,7 @@
           <w:color w:val="000000"/>
           <w:sz w:val="24"/>
         </w:rPr>
-        <w:t>....................................................................</w:t>
+        <w:tab/>
       </w:r>
       <w:hyperlink w:anchor="_TCC_H_1038" w:history="1">
         <w:r>
@@ -1844,6 +1961,9 @@
     <w:p>
       <w:pPr>
         <w:pStyle w:val="FacensTOC2"/>
+        <w:tabs>
+          <w:tab w:pos="9071" w:val="right" w:leader="dot"/>
+        </w:tabs>
       </w:pPr>
       <w:hyperlink w:anchor="_TCC_H_1039" w:history="1">
         <w:r>
@@ -1864,7 +1984,7 @@
           <w:color w:val="000000"/>
           <w:sz w:val="24"/>
         </w:rPr>
-        <w:t>.......................................................................</w:t>
+        <w:tab/>
       </w:r>
       <w:hyperlink w:anchor="_TCC_H_1039" w:history="1">
         <w:r>
@@ -1881,6 +2001,9 @@
     <w:p>
       <w:pPr>
         <w:pStyle w:val="FacensTOC2"/>
+        <w:tabs>
+          <w:tab w:pos="9071" w:val="right" w:leader="dot"/>
+        </w:tabs>
       </w:pPr>
       <w:hyperlink w:anchor="_TCC_H_1040" w:history="1">
         <w:r>
@@ -1901,7 +2024,7 @@
           <w:color w:val="000000"/>
           <w:sz w:val="24"/>
         </w:rPr>
-        <w:t>.............................................................</w:t>
+        <w:tab/>
       </w:r>
       <w:hyperlink w:anchor="_TCC_H_1040" w:history="1">
         <w:r>
@@ -1918,6 +2041,9 @@
     <w:p>
       <w:pPr>
         <w:pStyle w:val="FacensTOC2"/>
+        <w:tabs>
+          <w:tab w:pos="9071" w:val="right" w:leader="dot"/>
+        </w:tabs>
       </w:pPr>
       <w:hyperlink w:anchor="_TCC_H_1041" w:history="1">
         <w:r>
@@ -1938,7 +2064,7 @@
           <w:color w:val="000000"/>
           <w:sz w:val="24"/>
         </w:rPr>
-        <w:t>..................................................</w:t>
+        <w:tab/>
       </w:r>
       <w:hyperlink w:anchor="_TCC_H_1041" w:history="1">
         <w:r>
@@ -1955,6 +2081,9 @@
     <w:p>
       <w:pPr>
         <w:pStyle w:val="FacensTOC2"/>
+        <w:tabs>
+          <w:tab w:pos="9071" w:val="right" w:leader="dot"/>
+        </w:tabs>
       </w:pPr>
       <w:hyperlink w:anchor="_TCC_H_1042" w:history="1">
         <w:r>
@@ -1975,7 +2104,7 @@
           <w:color w:val="000000"/>
           <w:sz w:val="24"/>
         </w:rPr>
-        <w:t>.........................................................</w:t>
+        <w:tab/>
       </w:r>
       <w:hyperlink w:anchor="_TCC_H_1042" w:history="1">
         <w:r>
@@ -1992,6 +2121,9 @@
     <w:p>
       <w:pPr>
         <w:pStyle w:val="FacensTOC1"/>
+        <w:tabs>
+          <w:tab w:pos="9071" w:val="right" w:leader="dot"/>
+        </w:tabs>
       </w:pPr>
       <w:hyperlink w:anchor="_TCC_H_1043" w:history="1">
         <w:r>
@@ -2012,7 +2144,7 @@
           <w:color w:val="000000"/>
           <w:sz w:val="24"/>
         </w:rPr>
-        <w:t>......................................................................</w:t>
+        <w:tab/>
       </w:r>
       <w:hyperlink w:anchor="_TCC_H_1043" w:history="1">
         <w:r>
@@ -2029,6 +2161,9 @@
     <w:p>
       <w:pPr>
         <w:pStyle w:val="FacensTOC2"/>
+        <w:tabs>
+          <w:tab w:pos="9071" w:val="right" w:leader="dot"/>
+        </w:tabs>
       </w:pPr>
       <w:hyperlink w:anchor="_TCC_H_1044" w:history="1">
         <w:r>
@@ -2049,7 +2184,7 @@
           <w:color w:val="000000"/>
           <w:sz w:val="24"/>
         </w:rPr>
-        <w:t>.................................................................................</w:t>
+        <w:tab/>
       </w:r>
       <w:hyperlink w:anchor="_TCC_H_1044" w:history="1">
         <w:r>
@@ -2066,6 +2201,9 @@
     <w:p>
       <w:pPr>
         <w:pStyle w:val="FacensTOC2"/>
+        <w:tabs>
+          <w:tab w:pos="9071" w:val="right" w:leader="dot"/>
+        </w:tabs>
       </w:pPr>
       <w:hyperlink w:anchor="_TCC_H_1045" w:history="1">
         <w:r>
@@ -2086,7 +2224,7 @@
           <w:color w:val="000000"/>
           <w:sz w:val="24"/>
         </w:rPr>
-        <w:t>............................................................................</w:t>
+        <w:tab/>
       </w:r>
       <w:hyperlink w:anchor="_TCC_H_1045" w:history="1">
         <w:r>
@@ -2103,6 +2241,9 @@
     <w:p>
       <w:pPr>
         <w:pStyle w:val="FacensTOC2"/>
+        <w:tabs>
+          <w:tab w:pos="9071" w:val="right" w:leader="dot"/>
+        </w:tabs>
       </w:pPr>
       <w:hyperlink w:anchor="_TCC_H_1046" w:history="1">
         <w:r>
@@ -2123,7 +2264,7 @@
           <w:color w:val="000000"/>
           <w:sz w:val="24"/>
         </w:rPr>
-        <w:t>.............................................................................</w:t>
+        <w:tab/>
       </w:r>
       <w:hyperlink w:anchor="_TCC_H_1046" w:history="1">
         <w:r>
@@ -2140,6 +2281,9 @@
     <w:p>
       <w:pPr>
         <w:pStyle w:val="FacensTOC2"/>
+        <w:tabs>
+          <w:tab w:pos="9071" w:val="right" w:leader="dot"/>
+        </w:tabs>
       </w:pPr>
       <w:hyperlink w:anchor="_TCC_H_1047" w:history="1">
         <w:r>
@@ -2160,7 +2304,7 @@
           <w:color w:val="000000"/>
           <w:sz w:val="24"/>
         </w:rPr>
-        <w:t>..................................................</w:t>
+        <w:tab/>
       </w:r>
       <w:hyperlink w:anchor="_TCC_H_1047" w:history="1">
         <w:r>
@@ -2177,6 +2321,9 @@
     <w:p>
       <w:pPr>
         <w:pStyle w:val="FacensTOC1"/>
+        <w:tabs>
+          <w:tab w:pos="9071" w:val="right" w:leader="dot"/>
+        </w:tabs>
       </w:pPr>
       <w:hyperlink w:anchor="_TCC_H_1048" w:history="1">
         <w:r>
@@ -2197,7 +2344,7 @@
           <w:color w:val="000000"/>
           <w:sz w:val="24"/>
         </w:rPr>
-        <w:t>..........................................................................................................</w:t>
+        <w:tab/>
       </w:r>
       <w:hyperlink w:anchor="_TCC_H_1048" w:history="1">
         <w:r>
@@ -2214,6 +2361,9 @@
     <w:p>
       <w:pPr>
         <w:pStyle w:val="FacensTOC2"/>
+        <w:tabs>
+          <w:tab w:pos="9071" w:val="right" w:leader="dot"/>
+        </w:tabs>
       </w:pPr>
       <w:hyperlink w:anchor="_TCC_H_1049" w:history="1">
         <w:r>
@@ -2234,7 +2384,7 @@
           <w:color w:val="000000"/>
           <w:sz w:val="24"/>
         </w:rPr>
-        <w:t>.....................................................................</w:t>
+        <w:tab/>
       </w:r>
       <w:hyperlink w:anchor="_TCC_H_1049" w:history="1">
         <w:r>
@@ -2251,6 +2401,9 @@
     <w:p>
       <w:pPr>
         <w:pStyle w:val="FacensTOC2"/>
+        <w:tabs>
+          <w:tab w:pos="9071" w:val="right" w:leader="dot"/>
+        </w:tabs>
       </w:pPr>
       <w:hyperlink w:anchor="_TCC_H_1050" w:history="1">
         <w:r>
@@ -2271,7 +2424,7 @@
           <w:color w:val="000000"/>
           <w:sz w:val="24"/>
         </w:rPr>
-        <w:t>.......................................................................</w:t>
+        <w:tab/>
       </w:r>
       <w:hyperlink w:anchor="_TCC_H_1050" w:history="1">
         <w:r>
@@ -2288,6 +2441,9 @@
     <w:p>
       <w:pPr>
         <w:pStyle w:val="FacensTOC2"/>
+        <w:tabs>
+          <w:tab w:pos="9071" w:val="right" w:leader="dot"/>
+        </w:tabs>
       </w:pPr>
       <w:hyperlink w:anchor="_TCC_H_1051" w:history="1">
         <w:r>
@@ -2308,7 +2464,7 @@
           <w:color w:val="000000"/>
           <w:sz w:val="24"/>
         </w:rPr>
-        <w:t>...........................................................................</w:t>
+        <w:tab/>
       </w:r>
       <w:hyperlink w:anchor="_TCC_H_1051" w:history="1">
         <w:r>
@@ -2325,6 +2481,9 @@
     <w:p>
       <w:pPr>
         <w:pStyle w:val="FacensTOC1"/>
+        <w:tabs>
+          <w:tab w:pos="9071" w:val="right" w:leader="dot"/>
+        </w:tabs>
       </w:pPr>
       <w:hyperlink w:anchor="_TCC_H_1052" w:history="1">
         <w:r>
@@ -2345,7 +2504,7 @@
           <w:color w:val="000000"/>
           <w:sz w:val="24"/>
         </w:rPr>
-        <w:t>...................................................................................</w:t>
+        <w:tab/>
       </w:r>
       <w:hyperlink w:anchor="_TCC_H_1052" w:history="1">
         <w:r>
@@ -2362,6 +2521,9 @@
     <w:p>
       <w:pPr>
         <w:pStyle w:val="FacensTOC2"/>
+        <w:tabs>
+          <w:tab w:pos="9071" w:val="right" w:leader="dot"/>
+        </w:tabs>
       </w:pPr>
       <w:hyperlink w:anchor="_TCC_H_1053" w:history="1">
         <w:r>
@@ -2382,7 +2544,7 @@
           <w:color w:val="000000"/>
           <w:sz w:val="24"/>
         </w:rPr>
-        <w:t>.............................................................................................</w:t>
+        <w:tab/>
       </w:r>
       <w:hyperlink w:anchor="_TCC_H_1053" w:history="1">
         <w:r>
@@ -2399,6 +2561,9 @@
     <w:p>
       <w:pPr>
         <w:pStyle w:val="FacensTOC2"/>
+        <w:tabs>
+          <w:tab w:pos="9071" w:val="right" w:leader="dot"/>
+        </w:tabs>
       </w:pPr>
       <w:hyperlink w:anchor="_TCC_H_1054" w:history="1">
         <w:r>
@@ -2419,7 +2584,7 @@
           <w:color w:val="000000"/>
           <w:sz w:val="24"/>
         </w:rPr>
-        <w:t>.............................................................</w:t>
+        <w:tab/>
       </w:r>
       <w:hyperlink w:anchor="_TCC_H_1054" w:history="1">
         <w:r>
@@ -2436,6 +2601,9 @@
     <w:p>
       <w:pPr>
         <w:pStyle w:val="FacensTOC2"/>
+        <w:tabs>
+          <w:tab w:pos="9071" w:val="right" w:leader="dot"/>
+        </w:tabs>
       </w:pPr>
       <w:hyperlink w:anchor="_TCC_H_1055" w:history="1">
         <w:r>
@@ -2456,7 +2624,7 @@
           <w:color w:val="000000"/>
           <w:sz w:val="24"/>
         </w:rPr>
-        <w:t>..............................................................................</w:t>
+        <w:tab/>
       </w:r>
       <w:hyperlink w:anchor="_TCC_H_1055" w:history="1">
         <w:r>
@@ -2473,6 +2641,9 @@
     <w:p>
       <w:pPr>
         <w:pStyle w:val="FacensTOC1"/>
+        <w:tabs>
+          <w:tab w:pos="9071" w:val="right" w:leader="dot"/>
+        </w:tabs>
       </w:pPr>
       <w:hyperlink w:anchor="_TCC_H_1056" w:history="1">
         <w:r>
@@ -2493,7 +2664,7 @@
           <w:color w:val="000000"/>
           <w:sz w:val="24"/>
         </w:rPr>
-        <w:t>........................................................................................................</w:t>
+        <w:tab/>
       </w:r>
       <w:hyperlink w:anchor="_TCC_H_1056" w:history="1">
         <w:r>
@@ -2523,11 +2694,11 @@
     <w:p>
       <w:pPr>
         <w:pStyle w:val="Heading1"/>
+        <w:spacing w:before="0" w:after="360"/>
         <w:numPr>
           <w:ilvl w:val="0"/>
           <w:numId w:val="10"/>
         </w:numPr>
-        <w:spacing w:before="0" w:after="360"/>
       </w:pPr>
       <w:bookmarkStart w:id="1000" w:name="_TCC_H_1000"/>
       <w:r>
@@ -2972,11 +3143,11 @@
     <w:p>
       <w:pPr>
         <w:pStyle w:val="Heading1"/>
+        <w:spacing w:before="0" w:after="360"/>
         <w:numPr>
           <w:ilvl w:val="0"/>
           <w:numId w:val="10"/>
         </w:numPr>
-        <w:spacing w:before="0" w:after="360"/>
       </w:pPr>
       <w:bookmarkStart w:id="1001" w:name="_TCC_H_1001"/>
       <w:r>
@@ -2994,11 +3165,11 @@
     <w:p>
       <w:pPr>
         <w:pStyle w:val="Heading2"/>
+        <w:spacing w:before="0" w:after="360"/>
         <w:numPr>
           <w:ilvl w:val="1"/>
           <w:numId w:val="10"/>
         </w:numPr>
-        <w:spacing w:before="0" w:after="360"/>
       </w:pPr>
       <w:bookmarkStart w:id="1002" w:name="_TCC_H_1002"/>
       <w:r>
@@ -3016,11 +3187,11 @@
     <w:p>
       <w:pPr>
         <w:pStyle w:val="Heading3"/>
+        <w:spacing w:before="0" w:after="360"/>
         <w:numPr>
           <w:ilvl w:val="2"/>
           <w:numId w:val="10"/>
         </w:numPr>
-        <w:spacing w:before="0" w:after="360"/>
       </w:pPr>
       <w:bookmarkStart w:id="1003" w:name="_TCC_H_1003"/>
       <w:r>
@@ -3067,11 +3238,11 @@
     <w:p>
       <w:pPr>
         <w:pStyle w:val="Heading3"/>
+        <w:spacing w:before="360" w:after="360"/>
         <w:numPr>
           <w:ilvl w:val="2"/>
           <w:numId w:val="10"/>
         </w:numPr>
-        <w:spacing w:before="360" w:after="360"/>
       </w:pPr>
       <w:bookmarkStart w:id="1004" w:name="_TCC_H_1004"/>
       <w:r>
@@ -3100,11 +3271,11 @@
     <w:p>
       <w:pPr>
         <w:pStyle w:val="Heading3"/>
+        <w:spacing w:before="360" w:after="360"/>
         <w:numPr>
           <w:ilvl w:val="2"/>
           <w:numId w:val="10"/>
         </w:numPr>
-        <w:spacing w:before="360" w:after="360"/>
       </w:pPr>
       <w:bookmarkStart w:id="1005" w:name="_TCC_H_1005"/>
       <w:r>
@@ -3133,11 +3304,11 @@
     <w:p>
       <w:pPr>
         <w:pStyle w:val="Heading2"/>
+        <w:spacing w:before="360" w:after="360"/>
         <w:numPr>
           <w:ilvl w:val="1"/>
           <w:numId w:val="10"/>
         </w:numPr>
-        <w:spacing w:before="360" w:after="360"/>
       </w:pPr>
       <w:bookmarkStart w:id="1006" w:name="_TCC_H_1006"/>
       <w:r>
@@ -3167,11 +3338,11 @@
     <w:p>
       <w:pPr>
         <w:pStyle w:val="Heading3"/>
+        <w:spacing w:before="0" w:after="360"/>
         <w:numPr>
           <w:ilvl w:val="2"/>
           <w:numId w:val="10"/>
         </w:numPr>
-        <w:spacing w:before="0" w:after="360"/>
       </w:pPr>
       <w:bookmarkStart w:id="1007" w:name="_TCC_H_1007"/>
       <w:r>
@@ -3210,11 +3381,11 @@
     <w:p>
       <w:pPr>
         <w:pStyle w:val="Heading3"/>
+        <w:spacing w:before="360" w:after="360"/>
         <w:numPr>
           <w:ilvl w:val="2"/>
           <w:numId w:val="10"/>
         </w:numPr>
-        <w:spacing w:before="360" w:after="360"/>
       </w:pPr>
       <w:bookmarkStart w:id="1008" w:name="_TCC_H_1008"/>
       <w:r>
@@ -3261,11 +3432,11 @@
     <w:p>
       <w:pPr>
         <w:pStyle w:val="Heading3"/>
+        <w:spacing w:before="360" w:after="360"/>
         <w:numPr>
           <w:ilvl w:val="2"/>
           <w:numId w:val="10"/>
         </w:numPr>
-        <w:spacing w:before="360" w:after="360"/>
       </w:pPr>
       <w:bookmarkStart w:id="1009" w:name="_TCC_H_1009"/>
       <w:r>
@@ -3294,11 +3465,11 @@
     <w:p>
       <w:pPr>
         <w:pStyle w:val="Heading2"/>
+        <w:spacing w:before="360" w:after="360"/>
         <w:numPr>
           <w:ilvl w:val="1"/>
           <w:numId w:val="10"/>
         </w:numPr>
-        <w:spacing w:before="360" w:after="360"/>
       </w:pPr>
       <w:bookmarkStart w:id="1010" w:name="_TCC_H_1010"/>
       <w:r>
@@ -3316,11 +3487,11 @@
     <w:p>
       <w:pPr>
         <w:pStyle w:val="Heading3"/>
+        <w:spacing w:before="0" w:after="360"/>
         <w:numPr>
           <w:ilvl w:val="2"/>
           <w:numId w:val="10"/>
         </w:numPr>
-        <w:spacing w:before="0" w:after="360"/>
       </w:pPr>
       <w:bookmarkStart w:id="1011" w:name="_TCC_H_1011"/>
       <w:r>
@@ -3349,11 +3520,11 @@
     <w:p>
       <w:pPr>
         <w:pStyle w:val="Heading3"/>
+        <w:spacing w:before="360" w:after="360"/>
         <w:numPr>
           <w:ilvl w:val="2"/>
           <w:numId w:val="10"/>
         </w:numPr>
-        <w:spacing w:before="360" w:after="360"/>
       </w:pPr>
       <w:bookmarkStart w:id="1012" w:name="_TCC_H_1012"/>
       <w:r>
@@ -3418,11 +3589,11 @@
     <w:p>
       <w:pPr>
         <w:pStyle w:val="Heading3"/>
+        <w:spacing w:before="360" w:after="360"/>
         <w:numPr>
           <w:ilvl w:val="2"/>
           <w:numId w:val="10"/>
         </w:numPr>
-        <w:spacing w:before="360" w:after="360"/>
       </w:pPr>
       <w:bookmarkStart w:id="1013" w:name="_TCC_H_1013"/>
       <w:r>
@@ -3487,11 +3658,11 @@
     <w:p>
       <w:pPr>
         <w:pStyle w:val="Heading2"/>
+        <w:spacing w:before="360" w:after="360"/>
         <w:numPr>
           <w:ilvl w:val="1"/>
           <w:numId w:val="10"/>
         </w:numPr>
-        <w:spacing w:before="360" w:after="360"/>
       </w:pPr>
       <w:bookmarkStart w:id="1014" w:name="_TCC_H_1014"/>
       <w:r>
@@ -3509,11 +3680,11 @@
     <w:p>
       <w:pPr>
         <w:pStyle w:val="Heading3"/>
+        <w:spacing w:before="0" w:after="360"/>
         <w:numPr>
           <w:ilvl w:val="2"/>
           <w:numId w:val="10"/>
         </w:numPr>
-        <w:spacing w:before="0" w:after="360"/>
       </w:pPr>
       <w:bookmarkStart w:id="1015" w:name="_TCC_H_1015"/>
       <w:r>
@@ -3542,11 +3713,11 @@
     <w:p>
       <w:pPr>
         <w:pStyle w:val="Heading3"/>
+        <w:spacing w:before="360" w:after="360"/>
         <w:numPr>
           <w:ilvl w:val="2"/>
           <w:numId w:val="10"/>
         </w:numPr>
-        <w:spacing w:before="360" w:after="360"/>
       </w:pPr>
       <w:bookmarkStart w:id="1016" w:name="_TCC_H_1016"/>
       <w:r>
@@ -3641,11 +3812,11 @@
     <w:p>
       <w:pPr>
         <w:pStyle w:val="Heading3"/>
+        <w:spacing w:before="360" w:after="360"/>
         <w:numPr>
           <w:ilvl w:val="2"/>
           <w:numId w:val="10"/>
         </w:numPr>
-        <w:spacing w:before="360" w:after="360"/>
       </w:pPr>
       <w:bookmarkStart w:id="1017" w:name="_TCC_H_1017"/>
       <w:r>
@@ -3732,11 +3903,11 @@
     <w:p>
       <w:pPr>
         <w:pStyle w:val="Heading3"/>
+        <w:spacing w:before="360" w:after="360"/>
         <w:numPr>
           <w:ilvl w:val="2"/>
           <w:numId w:val="10"/>
         </w:numPr>
-        <w:spacing w:before="360" w:after="360"/>
       </w:pPr>
       <w:bookmarkStart w:id="1018" w:name="_TCC_H_1018"/>
       <w:r>
@@ -4072,11 +4243,11 @@
     <w:p>
       <w:pPr>
         <w:pStyle w:val="Heading2"/>
+        <w:spacing w:before="360" w:after="360"/>
         <w:numPr>
           <w:ilvl w:val="1"/>
           <w:numId w:val="10"/>
         </w:numPr>
-        <w:spacing w:before="360" w:after="360"/>
       </w:pPr>
       <w:bookmarkStart w:id="1019" w:name="_TCC_H_1019"/>
       <w:r>
@@ -4094,11 +4265,11 @@
     <w:p>
       <w:pPr>
         <w:pStyle w:val="Heading3"/>
+        <w:spacing w:before="0" w:after="360"/>
         <w:numPr>
           <w:ilvl w:val="2"/>
           <w:numId w:val="10"/>
         </w:numPr>
-        <w:spacing w:before="0" w:after="360"/>
       </w:pPr>
       <w:bookmarkStart w:id="1020" w:name="_TCC_H_1020"/>
       <w:r>
@@ -4127,11 +4298,11 @@
     <w:p>
       <w:pPr>
         <w:pStyle w:val="Heading3"/>
+        <w:spacing w:before="360" w:after="360"/>
         <w:numPr>
           <w:ilvl w:val="2"/>
           <w:numId w:val="10"/>
         </w:numPr>
-        <w:spacing w:before="360" w:after="360"/>
       </w:pPr>
       <w:bookmarkStart w:id="1021" w:name="_TCC_H_1021"/>
       <w:r>
@@ -4160,11 +4331,11 @@
     <w:p>
       <w:pPr>
         <w:pStyle w:val="Heading3"/>
+        <w:spacing w:before="360" w:after="360"/>
         <w:numPr>
           <w:ilvl w:val="2"/>
           <w:numId w:val="10"/>
         </w:numPr>
-        <w:spacing w:before="360" w:after="360"/>
       </w:pPr>
       <w:bookmarkStart w:id="1022" w:name="_TCC_H_1022"/>
       <w:r>
@@ -4193,11 +4364,11 @@
     <w:p>
       <w:pPr>
         <w:pStyle w:val="Heading1"/>
+        <w:spacing w:before="0" w:after="360"/>
         <w:numPr>
           <w:ilvl w:val="0"/>
           <w:numId w:val="10"/>
         </w:numPr>
-        <w:spacing w:before="0" w:after="360"/>
       </w:pPr>
       <w:bookmarkStart w:id="1023" w:name="_TCC_H_1023"/>
       <w:r>
@@ -4313,11 +4484,11 @@
     <w:p>
       <w:pPr>
         <w:pStyle w:val="Heading2"/>
+        <w:spacing w:before="360" w:after="360"/>
         <w:numPr>
           <w:ilvl w:val="1"/>
           <w:numId w:val="10"/>
         </w:numPr>
-        <w:spacing w:before="360" w:after="360"/>
       </w:pPr>
       <w:bookmarkStart w:id="1024" w:name="_TCC_H_1024"/>
       <w:r>
@@ -4534,11 +4705,11 @@
     <w:p>
       <w:pPr>
         <w:pStyle w:val="Heading2"/>
+        <w:spacing w:before="360" w:after="360"/>
         <w:numPr>
           <w:ilvl w:val="1"/>
           <w:numId w:val="10"/>
         </w:numPr>
-        <w:spacing w:before="360" w:after="360"/>
       </w:pPr>
       <w:bookmarkStart w:id="1025" w:name="_TCC_H_1025"/>
       <w:r>
@@ -4878,11 +5049,11 @@
     <w:p>
       <w:pPr>
         <w:pStyle w:val="Heading2"/>
+        <w:spacing w:before="360" w:after="360"/>
         <w:numPr>
           <w:ilvl w:val="1"/>
           <w:numId w:val="10"/>
         </w:numPr>
-        <w:spacing w:before="360" w:after="360"/>
       </w:pPr>
       <w:bookmarkStart w:id="1026" w:name="_TCC_H_1026"/>
       <w:r>
@@ -6722,11 +6893,11 @@
     <w:p>
       <w:pPr>
         <w:pStyle w:val="Heading2"/>
+        <w:spacing w:before="360" w:after="360"/>
         <w:numPr>
           <w:ilvl w:val="1"/>
           <w:numId w:val="10"/>
         </w:numPr>
-        <w:spacing w:before="360" w:after="360"/>
       </w:pPr>
       <w:bookmarkStart w:id="1027" w:name="_TCC_H_1027"/>
       <w:r>
@@ -6961,11 +7132,11 @@
     <w:p>
       <w:pPr>
         <w:pStyle w:val="Heading1"/>
+        <w:spacing w:before="0" w:after="360"/>
         <w:numPr>
           <w:ilvl w:val="0"/>
           <w:numId w:val="10"/>
         </w:numPr>
-        <w:spacing w:before="0" w:after="360"/>
       </w:pPr>
       <w:bookmarkStart w:id="1028" w:name="_TCC_H_1028"/>
       <w:r>
@@ -6983,11 +7154,11 @@
     <w:p>
       <w:pPr>
         <w:pStyle w:val="Heading2"/>
+        <w:spacing w:before="0" w:after="360"/>
         <w:numPr>
           <w:ilvl w:val="1"/>
           <w:numId w:val="10"/>
         </w:numPr>
-        <w:spacing w:before="0" w:after="360"/>
       </w:pPr>
       <w:bookmarkStart w:id="1029" w:name="_TCC_H_1029"/>
       <w:r>
@@ -7016,11 +7187,11 @@
     <w:p>
       <w:pPr>
         <w:pStyle w:val="Heading2"/>
+        <w:spacing w:before="360" w:after="360"/>
         <w:numPr>
           <w:ilvl w:val="1"/>
           <w:numId w:val="10"/>
         </w:numPr>
-        <w:spacing w:before="360" w:after="360"/>
       </w:pPr>
       <w:bookmarkStart w:id="1030" w:name="_TCC_H_1030"/>
       <w:r>
@@ -7172,11 +7343,11 @@
     <w:p>
       <w:pPr>
         <w:pStyle w:val="Heading2"/>
+        <w:spacing w:before="360" w:after="360"/>
         <w:numPr>
           <w:ilvl w:val="1"/>
           <w:numId w:val="10"/>
         </w:numPr>
-        <w:spacing w:before="360" w:after="360"/>
       </w:pPr>
       <w:bookmarkStart w:id="1031" w:name="_TCC_H_1031"/>
       <w:r>
@@ -7311,11 +7482,11 @@
     <w:p>
       <w:pPr>
         <w:pStyle w:val="Heading2"/>
+        <w:spacing w:before="360" w:after="360"/>
         <w:numPr>
           <w:ilvl w:val="1"/>
           <w:numId w:val="10"/>
         </w:numPr>
-        <w:spacing w:before="360" w:after="360"/>
       </w:pPr>
       <w:bookmarkStart w:id="1032" w:name="_TCC_H_1032"/>
       <w:r>
@@ -7402,11 +7573,11 @@
     <w:p>
       <w:pPr>
         <w:pStyle w:val="Heading1"/>
+        <w:spacing w:before="0" w:after="360"/>
         <w:numPr>
           <w:ilvl w:val="0"/>
           <w:numId w:val="10"/>
         </w:numPr>
-        <w:spacing w:before="0" w:after="360"/>
       </w:pPr>
       <w:bookmarkStart w:id="1033" w:name="_TCC_H_1033"/>
       <w:r>
@@ -7424,11 +7595,11 @@
     <w:p>
       <w:pPr>
         <w:pStyle w:val="Heading2"/>
+        <w:spacing w:before="0" w:after="360"/>
         <w:numPr>
           <w:ilvl w:val="1"/>
           <w:numId w:val="10"/>
         </w:numPr>
-        <w:spacing w:before="0" w:after="360"/>
       </w:pPr>
       <w:bookmarkStart w:id="1034" w:name="_TCC_H_1034"/>
       <w:r>
@@ -7504,11 +7675,11 @@
     <w:p>
       <w:pPr>
         <w:pStyle w:val="Heading2"/>
+        <w:spacing w:before="360" w:after="360"/>
         <w:numPr>
           <w:ilvl w:val="1"/>
           <w:numId w:val="10"/>
         </w:numPr>
-        <w:spacing w:before="360" w:after="360"/>
       </w:pPr>
       <w:bookmarkStart w:id="1035" w:name="_TCC_H_1035"/>
       <w:r>
@@ -7674,11 +7845,11 @@
     <w:p>
       <w:pPr>
         <w:pStyle w:val="Heading2"/>
+        <w:spacing w:before="360" w:after="360"/>
         <w:numPr>
           <w:ilvl w:val="1"/>
           <w:numId w:val="10"/>
         </w:numPr>
-        <w:spacing w:before="360" w:after="360"/>
       </w:pPr>
       <w:bookmarkStart w:id="1036" w:name="_TCC_H_1036"/>
       <w:r>
@@ -7873,11 +8044,11 @@
     <w:p>
       <w:pPr>
         <w:pStyle w:val="Heading2"/>
+        <w:spacing w:before="360" w:after="360"/>
         <w:numPr>
           <w:ilvl w:val="1"/>
           <w:numId w:val="10"/>
         </w:numPr>
-        <w:spacing w:before="360" w:after="360"/>
       </w:pPr>
       <w:bookmarkStart w:id="1037" w:name="_TCC_H_1037"/>
       <w:r>
@@ -8025,11 +8196,11 @@
     <w:p>
       <w:pPr>
         <w:pStyle w:val="Heading1"/>
+        <w:spacing w:before="0" w:after="360"/>
         <w:numPr>
           <w:ilvl w:val="0"/>
           <w:numId w:val="10"/>
         </w:numPr>
-        <w:spacing w:before="0" w:after="360"/>
       </w:pPr>
       <w:bookmarkStart w:id="1038" w:name="_TCC_H_1038"/>
       <w:r>
@@ -8047,11 +8218,11 @@
     <w:p>
       <w:pPr>
         <w:pStyle w:val="Heading2"/>
+        <w:spacing w:before="0" w:after="360"/>
         <w:numPr>
           <w:ilvl w:val="1"/>
           <w:numId w:val="10"/>
         </w:numPr>
-        <w:spacing w:before="0" w:after="360"/>
       </w:pPr>
       <w:bookmarkStart w:id="1039" w:name="_TCC_H_1039"/>
       <w:r>
@@ -8372,11 +8543,11 @@
     <w:p>
       <w:pPr>
         <w:pStyle w:val="Heading2"/>
+        <w:spacing w:before="360" w:after="360"/>
         <w:numPr>
           <w:ilvl w:val="1"/>
           <w:numId w:val="10"/>
         </w:numPr>
-        <w:spacing w:before="360" w:after="360"/>
       </w:pPr>
       <w:bookmarkStart w:id="1040" w:name="_TCC_H_1040"/>
       <w:r>
@@ -8578,11 +8749,11 @@
     <w:p>
       <w:pPr>
         <w:pStyle w:val="Heading2"/>
+        <w:spacing w:before="360" w:after="360"/>
         <w:numPr>
           <w:ilvl w:val="1"/>
           <w:numId w:val="10"/>
         </w:numPr>
-        <w:spacing w:before="360" w:after="360"/>
       </w:pPr>
       <w:bookmarkStart w:id="1041" w:name="_TCC_H_1041"/>
       <w:r>
@@ -8759,11 +8930,11 @@
     <w:p>
       <w:pPr>
         <w:pStyle w:val="Heading2"/>
+        <w:spacing w:before="360" w:after="360"/>
         <w:numPr>
           <w:ilvl w:val="1"/>
           <w:numId w:val="10"/>
         </w:numPr>
-        <w:spacing w:before="360" w:after="360"/>
       </w:pPr>
       <w:bookmarkStart w:id="1042" w:name="_TCC_H_1042"/>
       <w:r>
@@ -9001,11 +9172,11 @@
     <w:p>
       <w:pPr>
         <w:pStyle w:val="Heading1"/>
+        <w:spacing w:before="0" w:after="360"/>
         <w:numPr>
           <w:ilvl w:val="0"/>
           <w:numId w:val="10"/>
         </w:numPr>
-        <w:spacing w:before="0" w:after="360"/>
       </w:pPr>
       <w:bookmarkStart w:id="1043" w:name="_TCC_H_1043"/>
       <w:r>
@@ -9023,11 +9194,11 @@
     <w:p>
       <w:pPr>
         <w:pStyle w:val="Heading2"/>
+        <w:spacing w:before="0" w:after="360"/>
         <w:numPr>
           <w:ilvl w:val="1"/>
           <w:numId w:val="10"/>
         </w:numPr>
-        <w:spacing w:before="0" w:after="360"/>
       </w:pPr>
       <w:bookmarkStart w:id="1044" w:name="_TCC_H_1044"/>
       <w:r>
@@ -9058,11 +9229,11 @@
     <w:p>
       <w:pPr>
         <w:pStyle w:val="Heading2"/>
+        <w:spacing w:before="360" w:after="360"/>
         <w:numPr>
           <w:ilvl w:val="1"/>
           <w:numId w:val="10"/>
         </w:numPr>
-        <w:spacing w:before="360" w:after="360"/>
       </w:pPr>
       <w:bookmarkStart w:id="1045" w:name="_TCC_H_1045"/>
       <w:r>
@@ -9093,11 +9264,11 @@
     <w:p>
       <w:pPr>
         <w:pStyle w:val="Heading2"/>
+        <w:spacing w:before="360" w:after="360"/>
         <w:numPr>
           <w:ilvl w:val="1"/>
           <w:numId w:val="10"/>
         </w:numPr>
-        <w:spacing w:before="360" w:after="360"/>
       </w:pPr>
       <w:bookmarkStart w:id="1046" w:name="_TCC_H_1046"/>
       <w:r>
@@ -9128,11 +9299,11 @@
     <w:p>
       <w:pPr>
         <w:pStyle w:val="Heading2"/>
+        <w:spacing w:before="360" w:after="360"/>
         <w:numPr>
           <w:ilvl w:val="1"/>
           <w:numId w:val="10"/>
         </w:numPr>
-        <w:spacing w:before="360" w:after="360"/>
       </w:pPr>
       <w:bookmarkStart w:id="1047" w:name="_TCC_H_1047"/>
       <w:r>
@@ -9163,11 +9334,11 @@
     <w:p>
       <w:pPr>
         <w:pStyle w:val="Heading1"/>
+        <w:spacing w:before="0" w:after="360"/>
         <w:numPr>
           <w:ilvl w:val="0"/>
           <w:numId w:val="10"/>
         </w:numPr>
-        <w:spacing w:before="0" w:after="360"/>
       </w:pPr>
       <w:bookmarkStart w:id="1048" w:name="_TCC_H_1048"/>
       <w:r>
@@ -9185,11 +9356,11 @@
     <w:p>
       <w:pPr>
         <w:pStyle w:val="Heading2"/>
+        <w:spacing w:before="0" w:after="360"/>
         <w:numPr>
           <w:ilvl w:val="1"/>
           <w:numId w:val="10"/>
         </w:numPr>
-        <w:spacing w:before="0" w:after="360"/>
       </w:pPr>
       <w:bookmarkStart w:id="1049" w:name="_TCC_H_1049"/>
       <w:r>
@@ -9220,11 +9391,11 @@
     <w:p>
       <w:pPr>
         <w:pStyle w:val="Heading2"/>
+        <w:spacing w:before="360" w:after="360"/>
         <w:numPr>
           <w:ilvl w:val="1"/>
           <w:numId w:val="10"/>
         </w:numPr>
-        <w:spacing w:before="360" w:after="360"/>
       </w:pPr>
       <w:bookmarkStart w:id="1050" w:name="_TCC_H_1050"/>
       <w:r>
@@ -9255,11 +9426,11 @@
     <w:p>
       <w:pPr>
         <w:pStyle w:val="Heading2"/>
+        <w:spacing w:before="360" w:after="360"/>
         <w:numPr>
           <w:ilvl w:val="1"/>
           <w:numId w:val="10"/>
         </w:numPr>
-        <w:spacing w:before="360" w:after="360"/>
       </w:pPr>
       <w:bookmarkStart w:id="1051" w:name="_TCC_H_1051"/>
       <w:r>
@@ -9290,11 +9461,11 @@
     <w:p>
       <w:pPr>
         <w:pStyle w:val="Heading1"/>
+        <w:spacing w:before="0" w:after="360"/>
         <w:numPr>
           <w:ilvl w:val="0"/>
           <w:numId w:val="10"/>
         </w:numPr>
-        <w:spacing w:before="0" w:after="360"/>
       </w:pPr>
       <w:bookmarkStart w:id="1052" w:name="_TCC_H_1052"/>
       <w:r>
@@ -9312,11 +9483,11 @@
     <w:p>
       <w:pPr>
         <w:pStyle w:val="Heading2"/>
+        <w:spacing w:before="0" w:after="360"/>
         <w:numPr>
           <w:ilvl w:val="1"/>
           <w:numId w:val="10"/>
         </w:numPr>
-        <w:spacing w:before="0" w:after="360"/>
       </w:pPr>
       <w:bookmarkStart w:id="1053" w:name="_TCC_H_1053"/>
       <w:r>
@@ -9347,11 +9518,11 @@
     <w:p>
       <w:pPr>
         <w:pStyle w:val="Heading2"/>
+        <w:spacing w:before="360" w:after="360"/>
         <w:numPr>
           <w:ilvl w:val="1"/>
           <w:numId w:val="10"/>
         </w:numPr>
-        <w:spacing w:before="360" w:after="360"/>
       </w:pPr>
       <w:bookmarkStart w:id="1054" w:name="_TCC_H_1054"/>
       <w:r>
@@ -9382,11 +9553,11 @@
     <w:p>
       <w:pPr>
         <w:pStyle w:val="Heading2"/>
+        <w:spacing w:before="360" w:after="360"/>
         <w:numPr>
           <w:ilvl w:val="1"/>
           <w:numId w:val="10"/>
         </w:numPr>
-        <w:spacing w:before="360" w:after="360"/>
       </w:pPr>
       <w:bookmarkStart w:id="1055" w:name="_TCC_H_1055"/>
       <w:r>

</xml_diff>

<commit_message>
docs(tcc): corrigir numeracao multinivel dos titulos
</commit_message>
<xml_diff>
--- a/TCC/TCC_MAB_Facens_Ralph_10x.docx
+++ b/TCC/TCC_MAB_Facens_Ralph_10x.docx
@@ -2694,11 +2694,11 @@
     <w:p>
       <w:pPr>
         <w:pStyle w:val="Heading1"/>
-        <w:spacing w:before="0" w:after="360"/>
         <w:numPr>
           <w:ilvl w:val="0"/>
-          <w:numId w:val="10"/>
+          <w:numId w:val="12"/>
         </w:numPr>
+        <w:spacing w:before="0" w:after="360"/>
       </w:pPr>
       <w:bookmarkStart w:id="1000" w:name="_TCC_H_1000"/>
       <w:r>
@@ -3143,11 +3143,11 @@
     <w:p>
       <w:pPr>
         <w:pStyle w:val="Heading1"/>
-        <w:spacing w:before="0" w:after="360"/>
         <w:numPr>
           <w:ilvl w:val="0"/>
-          <w:numId w:val="10"/>
+          <w:numId w:val="12"/>
         </w:numPr>
+        <w:spacing w:before="0" w:after="360"/>
       </w:pPr>
       <w:bookmarkStart w:id="1001" w:name="_TCC_H_1001"/>
       <w:r>
@@ -3165,11 +3165,11 @@
     <w:p>
       <w:pPr>
         <w:pStyle w:val="Heading2"/>
-        <w:spacing w:before="0" w:after="360"/>
         <w:numPr>
           <w:ilvl w:val="1"/>
-          <w:numId w:val="10"/>
+          <w:numId w:val="12"/>
         </w:numPr>
+        <w:spacing w:before="0" w:after="360"/>
       </w:pPr>
       <w:bookmarkStart w:id="1002" w:name="_TCC_H_1002"/>
       <w:r>
@@ -3187,11 +3187,11 @@
     <w:p>
       <w:pPr>
         <w:pStyle w:val="Heading3"/>
-        <w:spacing w:before="0" w:after="360"/>
         <w:numPr>
           <w:ilvl w:val="2"/>
-          <w:numId w:val="10"/>
+          <w:numId w:val="12"/>
         </w:numPr>
+        <w:spacing w:before="0" w:after="360"/>
       </w:pPr>
       <w:bookmarkStart w:id="1003" w:name="_TCC_H_1003"/>
       <w:r>
@@ -3238,11 +3238,11 @@
     <w:p>
       <w:pPr>
         <w:pStyle w:val="Heading3"/>
-        <w:spacing w:before="360" w:after="360"/>
         <w:numPr>
           <w:ilvl w:val="2"/>
-          <w:numId w:val="10"/>
+          <w:numId w:val="12"/>
         </w:numPr>
+        <w:spacing w:before="360" w:after="360"/>
       </w:pPr>
       <w:bookmarkStart w:id="1004" w:name="_TCC_H_1004"/>
       <w:r>
@@ -3271,11 +3271,11 @@
     <w:p>
       <w:pPr>
         <w:pStyle w:val="Heading3"/>
-        <w:spacing w:before="360" w:after="360"/>
         <w:numPr>
           <w:ilvl w:val="2"/>
-          <w:numId w:val="10"/>
+          <w:numId w:val="12"/>
         </w:numPr>
+        <w:spacing w:before="360" w:after="360"/>
       </w:pPr>
       <w:bookmarkStart w:id="1005" w:name="_TCC_H_1005"/>
       <w:r>
@@ -3304,11 +3304,11 @@
     <w:p>
       <w:pPr>
         <w:pStyle w:val="Heading2"/>
-        <w:spacing w:before="360" w:after="360"/>
         <w:numPr>
           <w:ilvl w:val="1"/>
-          <w:numId w:val="10"/>
+          <w:numId w:val="12"/>
         </w:numPr>
+        <w:spacing w:before="360" w:after="360"/>
       </w:pPr>
       <w:bookmarkStart w:id="1006" w:name="_TCC_H_1006"/>
       <w:r>
@@ -3338,11 +3338,11 @@
     <w:p>
       <w:pPr>
         <w:pStyle w:val="Heading3"/>
-        <w:spacing w:before="0" w:after="360"/>
         <w:numPr>
           <w:ilvl w:val="2"/>
-          <w:numId w:val="10"/>
+          <w:numId w:val="12"/>
         </w:numPr>
+        <w:spacing w:before="0" w:after="360"/>
       </w:pPr>
       <w:bookmarkStart w:id="1007" w:name="_TCC_H_1007"/>
       <w:r>
@@ -3381,11 +3381,11 @@
     <w:p>
       <w:pPr>
         <w:pStyle w:val="Heading3"/>
-        <w:spacing w:before="360" w:after="360"/>
         <w:numPr>
           <w:ilvl w:val="2"/>
-          <w:numId w:val="10"/>
+          <w:numId w:val="12"/>
         </w:numPr>
+        <w:spacing w:before="360" w:after="360"/>
       </w:pPr>
       <w:bookmarkStart w:id="1008" w:name="_TCC_H_1008"/>
       <w:r>
@@ -3432,11 +3432,11 @@
     <w:p>
       <w:pPr>
         <w:pStyle w:val="Heading3"/>
-        <w:spacing w:before="360" w:after="360"/>
         <w:numPr>
           <w:ilvl w:val="2"/>
-          <w:numId w:val="10"/>
+          <w:numId w:val="12"/>
         </w:numPr>
+        <w:spacing w:before="360" w:after="360"/>
       </w:pPr>
       <w:bookmarkStart w:id="1009" w:name="_TCC_H_1009"/>
       <w:r>
@@ -3465,11 +3465,11 @@
     <w:p>
       <w:pPr>
         <w:pStyle w:val="Heading2"/>
-        <w:spacing w:before="360" w:after="360"/>
         <w:numPr>
           <w:ilvl w:val="1"/>
-          <w:numId w:val="10"/>
+          <w:numId w:val="12"/>
         </w:numPr>
+        <w:spacing w:before="360" w:after="360"/>
       </w:pPr>
       <w:bookmarkStart w:id="1010" w:name="_TCC_H_1010"/>
       <w:r>
@@ -3487,11 +3487,11 @@
     <w:p>
       <w:pPr>
         <w:pStyle w:val="Heading3"/>
-        <w:spacing w:before="0" w:after="360"/>
         <w:numPr>
           <w:ilvl w:val="2"/>
-          <w:numId w:val="10"/>
+          <w:numId w:val="12"/>
         </w:numPr>
+        <w:spacing w:before="0" w:after="360"/>
       </w:pPr>
       <w:bookmarkStart w:id="1011" w:name="_TCC_H_1011"/>
       <w:r>
@@ -3520,11 +3520,11 @@
     <w:p>
       <w:pPr>
         <w:pStyle w:val="Heading3"/>
-        <w:spacing w:before="360" w:after="360"/>
         <w:numPr>
           <w:ilvl w:val="2"/>
-          <w:numId w:val="10"/>
+          <w:numId w:val="12"/>
         </w:numPr>
+        <w:spacing w:before="360" w:after="360"/>
       </w:pPr>
       <w:bookmarkStart w:id="1012" w:name="_TCC_H_1012"/>
       <w:r>
@@ -3589,11 +3589,11 @@
     <w:p>
       <w:pPr>
         <w:pStyle w:val="Heading3"/>
-        <w:spacing w:before="360" w:after="360"/>
         <w:numPr>
           <w:ilvl w:val="2"/>
-          <w:numId w:val="10"/>
+          <w:numId w:val="12"/>
         </w:numPr>
+        <w:spacing w:before="360" w:after="360"/>
       </w:pPr>
       <w:bookmarkStart w:id="1013" w:name="_TCC_H_1013"/>
       <w:r>
@@ -3658,11 +3658,11 @@
     <w:p>
       <w:pPr>
         <w:pStyle w:val="Heading2"/>
-        <w:spacing w:before="360" w:after="360"/>
         <w:numPr>
           <w:ilvl w:val="1"/>
-          <w:numId w:val="10"/>
+          <w:numId w:val="12"/>
         </w:numPr>
+        <w:spacing w:before="360" w:after="360"/>
       </w:pPr>
       <w:bookmarkStart w:id="1014" w:name="_TCC_H_1014"/>
       <w:r>
@@ -3680,11 +3680,11 @@
     <w:p>
       <w:pPr>
         <w:pStyle w:val="Heading3"/>
-        <w:spacing w:before="0" w:after="360"/>
         <w:numPr>
           <w:ilvl w:val="2"/>
-          <w:numId w:val="10"/>
+          <w:numId w:val="12"/>
         </w:numPr>
+        <w:spacing w:before="0" w:after="360"/>
       </w:pPr>
       <w:bookmarkStart w:id="1015" w:name="_TCC_H_1015"/>
       <w:r>
@@ -3713,11 +3713,11 @@
     <w:p>
       <w:pPr>
         <w:pStyle w:val="Heading3"/>
-        <w:spacing w:before="360" w:after="360"/>
         <w:numPr>
           <w:ilvl w:val="2"/>
-          <w:numId w:val="10"/>
+          <w:numId w:val="12"/>
         </w:numPr>
+        <w:spacing w:before="360" w:after="360"/>
       </w:pPr>
       <w:bookmarkStart w:id="1016" w:name="_TCC_H_1016"/>
       <w:r>
@@ -3812,11 +3812,11 @@
     <w:p>
       <w:pPr>
         <w:pStyle w:val="Heading3"/>
-        <w:spacing w:before="360" w:after="360"/>
         <w:numPr>
           <w:ilvl w:val="2"/>
-          <w:numId w:val="10"/>
+          <w:numId w:val="12"/>
         </w:numPr>
+        <w:spacing w:before="360" w:after="360"/>
       </w:pPr>
       <w:bookmarkStart w:id="1017" w:name="_TCC_H_1017"/>
       <w:r>
@@ -3903,11 +3903,11 @@
     <w:p>
       <w:pPr>
         <w:pStyle w:val="Heading3"/>
-        <w:spacing w:before="360" w:after="360"/>
         <w:numPr>
           <w:ilvl w:val="2"/>
-          <w:numId w:val="10"/>
+          <w:numId w:val="12"/>
         </w:numPr>
+        <w:spacing w:before="360" w:after="360"/>
       </w:pPr>
       <w:bookmarkStart w:id="1018" w:name="_TCC_H_1018"/>
       <w:r>
@@ -4243,11 +4243,11 @@
     <w:p>
       <w:pPr>
         <w:pStyle w:val="Heading2"/>
-        <w:spacing w:before="360" w:after="360"/>
         <w:numPr>
           <w:ilvl w:val="1"/>
-          <w:numId w:val="10"/>
+          <w:numId w:val="12"/>
         </w:numPr>
+        <w:spacing w:before="360" w:after="360"/>
       </w:pPr>
       <w:bookmarkStart w:id="1019" w:name="_TCC_H_1019"/>
       <w:r>
@@ -4265,11 +4265,11 @@
     <w:p>
       <w:pPr>
         <w:pStyle w:val="Heading3"/>
-        <w:spacing w:before="0" w:after="360"/>
         <w:numPr>
           <w:ilvl w:val="2"/>
-          <w:numId w:val="10"/>
+          <w:numId w:val="12"/>
         </w:numPr>
+        <w:spacing w:before="0" w:after="360"/>
       </w:pPr>
       <w:bookmarkStart w:id="1020" w:name="_TCC_H_1020"/>
       <w:r>
@@ -4298,11 +4298,11 @@
     <w:p>
       <w:pPr>
         <w:pStyle w:val="Heading3"/>
-        <w:spacing w:before="360" w:after="360"/>
         <w:numPr>
           <w:ilvl w:val="2"/>
-          <w:numId w:val="10"/>
+          <w:numId w:val="12"/>
         </w:numPr>
+        <w:spacing w:before="360" w:after="360"/>
       </w:pPr>
       <w:bookmarkStart w:id="1021" w:name="_TCC_H_1021"/>
       <w:r>
@@ -4331,11 +4331,11 @@
     <w:p>
       <w:pPr>
         <w:pStyle w:val="Heading3"/>
-        <w:spacing w:before="360" w:after="360"/>
         <w:numPr>
           <w:ilvl w:val="2"/>
-          <w:numId w:val="10"/>
+          <w:numId w:val="12"/>
         </w:numPr>
+        <w:spacing w:before="360" w:after="360"/>
       </w:pPr>
       <w:bookmarkStart w:id="1022" w:name="_TCC_H_1022"/>
       <w:r>
@@ -4364,11 +4364,11 @@
     <w:p>
       <w:pPr>
         <w:pStyle w:val="Heading1"/>
-        <w:spacing w:before="0" w:after="360"/>
         <w:numPr>
           <w:ilvl w:val="0"/>
-          <w:numId w:val="10"/>
+          <w:numId w:val="12"/>
         </w:numPr>
+        <w:spacing w:before="0" w:after="360"/>
       </w:pPr>
       <w:bookmarkStart w:id="1023" w:name="_TCC_H_1023"/>
       <w:r>
@@ -4484,11 +4484,11 @@
     <w:p>
       <w:pPr>
         <w:pStyle w:val="Heading2"/>
-        <w:spacing w:before="360" w:after="360"/>
         <w:numPr>
           <w:ilvl w:val="1"/>
-          <w:numId w:val="10"/>
+          <w:numId w:val="12"/>
         </w:numPr>
+        <w:spacing w:before="360" w:after="360"/>
       </w:pPr>
       <w:bookmarkStart w:id="1024" w:name="_TCC_H_1024"/>
       <w:r>
@@ -4705,11 +4705,11 @@
     <w:p>
       <w:pPr>
         <w:pStyle w:val="Heading2"/>
-        <w:spacing w:before="360" w:after="360"/>
         <w:numPr>
           <w:ilvl w:val="1"/>
-          <w:numId w:val="10"/>
+          <w:numId w:val="12"/>
         </w:numPr>
+        <w:spacing w:before="360" w:after="360"/>
       </w:pPr>
       <w:bookmarkStart w:id="1025" w:name="_TCC_H_1025"/>
       <w:r>
@@ -5049,11 +5049,11 @@
     <w:p>
       <w:pPr>
         <w:pStyle w:val="Heading2"/>
-        <w:spacing w:before="360" w:after="360"/>
         <w:numPr>
           <w:ilvl w:val="1"/>
-          <w:numId w:val="10"/>
+          <w:numId w:val="12"/>
         </w:numPr>
+        <w:spacing w:before="360" w:after="360"/>
       </w:pPr>
       <w:bookmarkStart w:id="1026" w:name="_TCC_H_1026"/>
       <w:r>
@@ -6893,11 +6893,11 @@
     <w:p>
       <w:pPr>
         <w:pStyle w:val="Heading2"/>
-        <w:spacing w:before="360" w:after="360"/>
         <w:numPr>
           <w:ilvl w:val="1"/>
-          <w:numId w:val="10"/>
+          <w:numId w:val="12"/>
         </w:numPr>
+        <w:spacing w:before="360" w:after="360"/>
       </w:pPr>
       <w:bookmarkStart w:id="1027" w:name="_TCC_H_1027"/>
       <w:r>
@@ -7132,11 +7132,11 @@
     <w:p>
       <w:pPr>
         <w:pStyle w:val="Heading1"/>
-        <w:spacing w:before="0" w:after="360"/>
         <w:numPr>
           <w:ilvl w:val="0"/>
-          <w:numId w:val="10"/>
+          <w:numId w:val="12"/>
         </w:numPr>
+        <w:spacing w:before="0" w:after="360"/>
       </w:pPr>
       <w:bookmarkStart w:id="1028" w:name="_TCC_H_1028"/>
       <w:r>
@@ -7154,11 +7154,11 @@
     <w:p>
       <w:pPr>
         <w:pStyle w:val="Heading2"/>
-        <w:spacing w:before="0" w:after="360"/>
         <w:numPr>
           <w:ilvl w:val="1"/>
-          <w:numId w:val="10"/>
+          <w:numId w:val="12"/>
         </w:numPr>
+        <w:spacing w:before="0" w:after="360"/>
       </w:pPr>
       <w:bookmarkStart w:id="1029" w:name="_TCC_H_1029"/>
       <w:r>
@@ -7187,11 +7187,11 @@
     <w:p>
       <w:pPr>
         <w:pStyle w:val="Heading2"/>
-        <w:spacing w:before="360" w:after="360"/>
         <w:numPr>
           <w:ilvl w:val="1"/>
-          <w:numId w:val="10"/>
+          <w:numId w:val="12"/>
         </w:numPr>
+        <w:spacing w:before="360" w:after="360"/>
       </w:pPr>
       <w:bookmarkStart w:id="1030" w:name="_TCC_H_1030"/>
       <w:r>
@@ -7343,11 +7343,11 @@
     <w:p>
       <w:pPr>
         <w:pStyle w:val="Heading2"/>
-        <w:spacing w:before="360" w:after="360"/>
         <w:numPr>
           <w:ilvl w:val="1"/>
-          <w:numId w:val="10"/>
+          <w:numId w:val="12"/>
         </w:numPr>
+        <w:spacing w:before="360" w:after="360"/>
       </w:pPr>
       <w:bookmarkStart w:id="1031" w:name="_TCC_H_1031"/>
       <w:r>
@@ -7482,11 +7482,11 @@
     <w:p>
       <w:pPr>
         <w:pStyle w:val="Heading2"/>
-        <w:spacing w:before="360" w:after="360"/>
         <w:numPr>
           <w:ilvl w:val="1"/>
-          <w:numId w:val="10"/>
+          <w:numId w:val="12"/>
         </w:numPr>
+        <w:spacing w:before="360" w:after="360"/>
       </w:pPr>
       <w:bookmarkStart w:id="1032" w:name="_TCC_H_1032"/>
       <w:r>
@@ -7573,11 +7573,11 @@
     <w:p>
       <w:pPr>
         <w:pStyle w:val="Heading1"/>
-        <w:spacing w:before="0" w:after="360"/>
         <w:numPr>
           <w:ilvl w:val="0"/>
-          <w:numId w:val="10"/>
+          <w:numId w:val="12"/>
         </w:numPr>
+        <w:spacing w:before="0" w:after="360"/>
       </w:pPr>
       <w:bookmarkStart w:id="1033" w:name="_TCC_H_1033"/>
       <w:r>
@@ -7595,11 +7595,11 @@
     <w:p>
       <w:pPr>
         <w:pStyle w:val="Heading2"/>
-        <w:spacing w:before="0" w:after="360"/>
         <w:numPr>
           <w:ilvl w:val="1"/>
-          <w:numId w:val="10"/>
+          <w:numId w:val="12"/>
         </w:numPr>
+        <w:spacing w:before="0" w:after="360"/>
       </w:pPr>
       <w:bookmarkStart w:id="1034" w:name="_TCC_H_1034"/>
       <w:r>
@@ -7675,11 +7675,11 @@
     <w:p>
       <w:pPr>
         <w:pStyle w:val="Heading2"/>
-        <w:spacing w:before="360" w:after="360"/>
         <w:numPr>
           <w:ilvl w:val="1"/>
-          <w:numId w:val="10"/>
+          <w:numId w:val="12"/>
         </w:numPr>
+        <w:spacing w:before="360" w:after="360"/>
       </w:pPr>
       <w:bookmarkStart w:id="1035" w:name="_TCC_H_1035"/>
       <w:r>
@@ -7845,11 +7845,11 @@
     <w:p>
       <w:pPr>
         <w:pStyle w:val="Heading2"/>
-        <w:spacing w:before="360" w:after="360"/>
         <w:numPr>
           <w:ilvl w:val="1"/>
-          <w:numId w:val="10"/>
+          <w:numId w:val="12"/>
         </w:numPr>
+        <w:spacing w:before="360" w:after="360"/>
       </w:pPr>
       <w:bookmarkStart w:id="1036" w:name="_TCC_H_1036"/>
       <w:r>
@@ -8044,11 +8044,11 @@
     <w:p>
       <w:pPr>
         <w:pStyle w:val="Heading2"/>
-        <w:spacing w:before="360" w:after="360"/>
         <w:numPr>
           <w:ilvl w:val="1"/>
-          <w:numId w:val="10"/>
+          <w:numId w:val="12"/>
         </w:numPr>
+        <w:spacing w:before="360" w:after="360"/>
       </w:pPr>
       <w:bookmarkStart w:id="1037" w:name="_TCC_H_1037"/>
       <w:r>
@@ -8196,11 +8196,11 @@
     <w:p>
       <w:pPr>
         <w:pStyle w:val="Heading1"/>
-        <w:spacing w:before="0" w:after="360"/>
         <w:numPr>
           <w:ilvl w:val="0"/>
-          <w:numId w:val="10"/>
+          <w:numId w:val="12"/>
         </w:numPr>
+        <w:spacing w:before="0" w:after="360"/>
       </w:pPr>
       <w:bookmarkStart w:id="1038" w:name="_TCC_H_1038"/>
       <w:r>
@@ -8218,11 +8218,11 @@
     <w:p>
       <w:pPr>
         <w:pStyle w:val="Heading2"/>
-        <w:spacing w:before="0" w:after="360"/>
         <w:numPr>
           <w:ilvl w:val="1"/>
-          <w:numId w:val="10"/>
+          <w:numId w:val="12"/>
         </w:numPr>
+        <w:spacing w:before="0" w:after="360"/>
       </w:pPr>
       <w:bookmarkStart w:id="1039" w:name="_TCC_H_1039"/>
       <w:r>
@@ -8543,11 +8543,11 @@
     <w:p>
       <w:pPr>
         <w:pStyle w:val="Heading2"/>
-        <w:spacing w:before="360" w:after="360"/>
         <w:numPr>
           <w:ilvl w:val="1"/>
-          <w:numId w:val="10"/>
+          <w:numId w:val="12"/>
         </w:numPr>
+        <w:spacing w:before="360" w:after="360"/>
       </w:pPr>
       <w:bookmarkStart w:id="1040" w:name="_TCC_H_1040"/>
       <w:r>
@@ -8749,11 +8749,11 @@
     <w:p>
       <w:pPr>
         <w:pStyle w:val="Heading2"/>
-        <w:spacing w:before="360" w:after="360"/>
         <w:numPr>
           <w:ilvl w:val="1"/>
-          <w:numId w:val="10"/>
+          <w:numId w:val="12"/>
         </w:numPr>
+        <w:spacing w:before="360" w:after="360"/>
       </w:pPr>
       <w:bookmarkStart w:id="1041" w:name="_TCC_H_1041"/>
       <w:r>
@@ -8930,11 +8930,11 @@
     <w:p>
       <w:pPr>
         <w:pStyle w:val="Heading2"/>
-        <w:spacing w:before="360" w:after="360"/>
         <w:numPr>
           <w:ilvl w:val="1"/>
-          <w:numId w:val="10"/>
+          <w:numId w:val="12"/>
         </w:numPr>
+        <w:spacing w:before="360" w:after="360"/>
       </w:pPr>
       <w:bookmarkStart w:id="1042" w:name="_TCC_H_1042"/>
       <w:r>
@@ -9172,11 +9172,11 @@
     <w:p>
       <w:pPr>
         <w:pStyle w:val="Heading1"/>
-        <w:spacing w:before="0" w:after="360"/>
         <w:numPr>
           <w:ilvl w:val="0"/>
-          <w:numId w:val="10"/>
+          <w:numId w:val="12"/>
         </w:numPr>
+        <w:spacing w:before="0" w:after="360"/>
       </w:pPr>
       <w:bookmarkStart w:id="1043" w:name="_TCC_H_1043"/>
       <w:r>
@@ -9194,11 +9194,11 @@
     <w:p>
       <w:pPr>
         <w:pStyle w:val="Heading2"/>
-        <w:spacing w:before="0" w:after="360"/>
         <w:numPr>
           <w:ilvl w:val="1"/>
-          <w:numId w:val="10"/>
+          <w:numId w:val="12"/>
         </w:numPr>
+        <w:spacing w:before="0" w:after="360"/>
       </w:pPr>
       <w:bookmarkStart w:id="1044" w:name="_TCC_H_1044"/>
       <w:r>
@@ -9229,11 +9229,11 @@
     <w:p>
       <w:pPr>
         <w:pStyle w:val="Heading2"/>
-        <w:spacing w:before="360" w:after="360"/>
         <w:numPr>
           <w:ilvl w:val="1"/>
-          <w:numId w:val="10"/>
+          <w:numId w:val="12"/>
         </w:numPr>
+        <w:spacing w:before="360" w:after="360"/>
       </w:pPr>
       <w:bookmarkStart w:id="1045" w:name="_TCC_H_1045"/>
       <w:r>
@@ -9264,11 +9264,11 @@
     <w:p>
       <w:pPr>
         <w:pStyle w:val="Heading2"/>
-        <w:spacing w:before="360" w:after="360"/>
         <w:numPr>
           <w:ilvl w:val="1"/>
-          <w:numId w:val="10"/>
+          <w:numId w:val="12"/>
         </w:numPr>
+        <w:spacing w:before="360" w:after="360"/>
       </w:pPr>
       <w:bookmarkStart w:id="1046" w:name="_TCC_H_1046"/>
       <w:r>
@@ -9299,11 +9299,11 @@
     <w:p>
       <w:pPr>
         <w:pStyle w:val="Heading2"/>
-        <w:spacing w:before="360" w:after="360"/>
         <w:numPr>
           <w:ilvl w:val="1"/>
-          <w:numId w:val="10"/>
+          <w:numId w:val="12"/>
         </w:numPr>
+        <w:spacing w:before="360" w:after="360"/>
       </w:pPr>
       <w:bookmarkStart w:id="1047" w:name="_TCC_H_1047"/>
       <w:r>
@@ -9334,11 +9334,11 @@
     <w:p>
       <w:pPr>
         <w:pStyle w:val="Heading1"/>
-        <w:spacing w:before="0" w:after="360"/>
         <w:numPr>
           <w:ilvl w:val="0"/>
-          <w:numId w:val="10"/>
+          <w:numId w:val="12"/>
         </w:numPr>
+        <w:spacing w:before="0" w:after="360"/>
       </w:pPr>
       <w:bookmarkStart w:id="1048" w:name="_TCC_H_1048"/>
       <w:r>
@@ -9356,11 +9356,11 @@
     <w:p>
       <w:pPr>
         <w:pStyle w:val="Heading2"/>
-        <w:spacing w:before="0" w:after="360"/>
         <w:numPr>
           <w:ilvl w:val="1"/>
-          <w:numId w:val="10"/>
+          <w:numId w:val="12"/>
         </w:numPr>
+        <w:spacing w:before="0" w:after="360"/>
       </w:pPr>
       <w:bookmarkStart w:id="1049" w:name="_TCC_H_1049"/>
       <w:r>
@@ -9391,11 +9391,11 @@
     <w:p>
       <w:pPr>
         <w:pStyle w:val="Heading2"/>
-        <w:spacing w:before="360" w:after="360"/>
         <w:numPr>
           <w:ilvl w:val="1"/>
-          <w:numId w:val="10"/>
+          <w:numId w:val="12"/>
         </w:numPr>
+        <w:spacing w:before="360" w:after="360"/>
       </w:pPr>
       <w:bookmarkStart w:id="1050" w:name="_TCC_H_1050"/>
       <w:r>
@@ -9426,11 +9426,11 @@
     <w:p>
       <w:pPr>
         <w:pStyle w:val="Heading2"/>
-        <w:spacing w:before="360" w:after="360"/>
         <w:numPr>
           <w:ilvl w:val="1"/>
-          <w:numId w:val="10"/>
+          <w:numId w:val="12"/>
         </w:numPr>
+        <w:spacing w:before="360" w:after="360"/>
       </w:pPr>
       <w:bookmarkStart w:id="1051" w:name="_TCC_H_1051"/>
       <w:r>
@@ -9461,11 +9461,11 @@
     <w:p>
       <w:pPr>
         <w:pStyle w:val="Heading1"/>
-        <w:spacing w:before="0" w:after="360"/>
         <w:numPr>
           <w:ilvl w:val="0"/>
-          <w:numId w:val="10"/>
+          <w:numId w:val="12"/>
         </w:numPr>
+        <w:spacing w:before="0" w:after="360"/>
       </w:pPr>
       <w:bookmarkStart w:id="1052" w:name="_TCC_H_1052"/>
       <w:r>
@@ -9483,11 +9483,11 @@
     <w:p>
       <w:pPr>
         <w:pStyle w:val="Heading2"/>
-        <w:spacing w:before="0" w:after="360"/>
         <w:numPr>
           <w:ilvl w:val="1"/>
-          <w:numId w:val="10"/>
+          <w:numId w:val="12"/>
         </w:numPr>
+        <w:spacing w:before="0" w:after="360"/>
       </w:pPr>
       <w:bookmarkStart w:id="1053" w:name="_TCC_H_1053"/>
       <w:r>
@@ -9518,11 +9518,11 @@
     <w:p>
       <w:pPr>
         <w:pStyle w:val="Heading2"/>
-        <w:spacing w:before="360" w:after="360"/>
         <w:numPr>
           <w:ilvl w:val="1"/>
-          <w:numId w:val="10"/>
+          <w:numId w:val="12"/>
         </w:numPr>
+        <w:spacing w:before="360" w:after="360"/>
       </w:pPr>
       <w:bookmarkStart w:id="1054" w:name="_TCC_H_1054"/>
       <w:r>
@@ -9553,11 +9553,11 @@
     <w:p>
       <w:pPr>
         <w:pStyle w:val="Heading2"/>
-        <w:spacing w:before="360" w:after="360"/>
         <w:numPr>
           <w:ilvl w:val="1"/>
-          <w:numId w:val="10"/>
+          <w:numId w:val="12"/>
         </w:numPr>
+        <w:spacing w:before="360" w:after="360"/>
       </w:pPr>
       <w:bookmarkStart w:id="1055" w:name="_TCC_H_1055"/>
       <w:r>
@@ -10830,6 +10830,56 @@
   </w:abstractNum>
   <w:num w:numId="11">
     <w:abstractNumId w:val="10"/>
+  </w:num>
+  <w:abstractNum w:abstractNumId="11">
+    <w:nsid w:val="FAC30001"/>
+    <w:multiLevelType w:val="multilevel"/>
+    <w:tmpl w:val="FAC30001"/>
+    <w:lvl w:ilvl="0">
+      <w:start w:val="1"/>
+      <w:numFmt w:val="decimal"/>
+      <w:pStyle w:val="Heading1"/>
+      <w:suff w:val="space"/>
+      <w:lvlText w:val="%1"/>
+      <w:lvlJc w:val="left"/>
+      <w:pPr>
+        <w:tabs>
+          <w:tab w:val="num" w:pos="0"/>
+        </w:tabs>
+        <w:ind w:left="0" w:hanging="0"/>
+      </w:pPr>
+    </w:lvl>
+    <w:lvl w:ilvl="1">
+      <w:start w:val="1"/>
+      <w:numFmt w:val="decimal"/>
+      <w:pStyle w:val="Heading2"/>
+      <w:suff w:val="space"/>
+      <w:lvlText w:val="%1.%2"/>
+      <w:lvlJc w:val="left"/>
+      <w:pPr>
+        <w:tabs>
+          <w:tab w:val="num" w:pos="0"/>
+        </w:tabs>
+        <w:ind w:left="0" w:hanging="0"/>
+      </w:pPr>
+    </w:lvl>
+    <w:lvl w:ilvl="2">
+      <w:start w:val="1"/>
+      <w:numFmt w:val="decimal"/>
+      <w:pStyle w:val="Heading3"/>
+      <w:suff w:val="space"/>
+      <w:lvlText w:val="%1.%2.%3"/>
+      <w:lvlJc w:val="left"/>
+      <w:pPr>
+        <w:tabs>
+          <w:tab w:val="num" w:pos="0"/>
+        </w:tabs>
+        <w:ind w:left="0" w:hanging="0"/>
+      </w:pPr>
+    </w:lvl>
+  </w:abstractNum>
+  <w:num w:numId="12">
+    <w:abstractNumId w:val="11"/>
   </w:num>
 </w:numbering>
 </file>
@@ -11063,6 +11113,10 @@
       <w:keepNext/>
       <w:keepLines/>
       <w:pageBreakBefore/>
+      <w:numPr>
+        <w:ilvl w:val="0"/>
+        <w:numId w:val="12"/>
+      </w:numPr>
       <w:spacing w:before="0" w:after="360" w:line="360" w:lineRule="auto"/>
       <w:ind w:left="0" w:right="0" w:firstLine="0"/>
       <w:jc w:val="left"/>
@@ -11091,6 +11145,10 @@
       <w:keepNext/>
       <w:keepLines/>
       <w:pageBreakBefore w:val="0"/>
+      <w:numPr>
+        <w:ilvl w:val="1"/>
+        <w:numId w:val="12"/>
+      </w:numPr>
       <w:spacing w:before="0" w:after="360" w:line="360" w:lineRule="auto"/>
       <w:ind w:left="0" w:right="0" w:firstLine="0"/>
       <w:jc w:val="left"/>
@@ -11119,6 +11177,10 @@
       <w:keepNext/>
       <w:keepLines/>
       <w:pageBreakBefore w:val="0"/>
+      <w:numPr>
+        <w:ilvl w:val="2"/>
+        <w:numId w:val="12"/>
+      </w:numPr>
       <w:spacing w:before="0" w:after="360" w:line="360" w:lineRule="auto"/>
       <w:ind w:left="0" w:right="0" w:firstLine="0"/>
       <w:jc w:val="left"/>

</xml_diff>

<commit_message>
docs(tcc): padronizar fonte da numeracao em Arial
</commit_message>
<xml_diff>
--- a/TCC/TCC_MAB_Facens_Ralph_10x.docx
+++ b/TCC/TCC_MAB_Facens_Ralph_10x.docx
@@ -1154,7 +1154,7 @@
             <w:u w:val="none"/>
             <w:sz w:val="24"/>
           </w:rPr>
-          <w:t>15</w:t>
+          <w:t>14</w:t>
         </w:r>
       </w:hyperlink>
     </w:p>
@@ -1194,7 +1194,7 @@
             <w:u w:val="none"/>
             <w:sz w:val="24"/>
           </w:rPr>
-          <w:t>17</w:t>
+          <w:t>16</w:t>
         </w:r>
       </w:hyperlink>
     </w:p>
@@ -1234,7 +1234,7 @@
             <w:u w:val="none"/>
             <w:sz w:val="24"/>
           </w:rPr>
-          <w:t>17</w:t>
+          <w:t>16</w:t>
         </w:r>
       </w:hyperlink>
     </w:p>
@@ -2696,7 +2696,7 @@
         <w:pStyle w:val="Heading1"/>
         <w:numPr>
           <w:ilvl w:val="0"/>
-          <w:numId w:val="12"/>
+          <w:numId w:val="13"/>
         </w:numPr>
         <w:spacing w:before="0" w:after="360"/>
       </w:pPr>
@@ -3145,7 +3145,7 @@
         <w:pStyle w:val="Heading1"/>
         <w:numPr>
           <w:ilvl w:val="0"/>
-          <w:numId w:val="12"/>
+          <w:numId w:val="13"/>
         </w:numPr>
         <w:spacing w:before="0" w:after="360"/>
       </w:pPr>
@@ -3167,7 +3167,7 @@
         <w:pStyle w:val="Heading2"/>
         <w:numPr>
           <w:ilvl w:val="1"/>
-          <w:numId w:val="12"/>
+          <w:numId w:val="13"/>
         </w:numPr>
         <w:spacing w:before="0" w:after="360"/>
       </w:pPr>
@@ -3189,7 +3189,7 @@
         <w:pStyle w:val="Heading3"/>
         <w:numPr>
           <w:ilvl w:val="2"/>
-          <w:numId w:val="12"/>
+          <w:numId w:val="13"/>
         </w:numPr>
         <w:spacing w:before="0" w:after="360"/>
       </w:pPr>
@@ -3240,7 +3240,7 @@
         <w:pStyle w:val="Heading3"/>
         <w:numPr>
           <w:ilvl w:val="2"/>
-          <w:numId w:val="12"/>
+          <w:numId w:val="13"/>
         </w:numPr>
         <w:spacing w:before="360" w:after="360"/>
       </w:pPr>
@@ -3273,7 +3273,7 @@
         <w:pStyle w:val="Heading3"/>
         <w:numPr>
           <w:ilvl w:val="2"/>
-          <w:numId w:val="12"/>
+          <w:numId w:val="13"/>
         </w:numPr>
         <w:spacing w:before="360" w:after="360"/>
       </w:pPr>
@@ -3306,7 +3306,7 @@
         <w:pStyle w:val="Heading2"/>
         <w:numPr>
           <w:ilvl w:val="1"/>
-          <w:numId w:val="12"/>
+          <w:numId w:val="13"/>
         </w:numPr>
         <w:spacing w:before="360" w:after="360"/>
       </w:pPr>
@@ -3340,7 +3340,7 @@
         <w:pStyle w:val="Heading3"/>
         <w:numPr>
           <w:ilvl w:val="2"/>
-          <w:numId w:val="12"/>
+          <w:numId w:val="13"/>
         </w:numPr>
         <w:spacing w:before="0" w:after="360"/>
       </w:pPr>
@@ -3383,7 +3383,7 @@
         <w:pStyle w:val="Heading3"/>
         <w:numPr>
           <w:ilvl w:val="2"/>
-          <w:numId w:val="12"/>
+          <w:numId w:val="13"/>
         </w:numPr>
         <w:spacing w:before="360" w:after="360"/>
       </w:pPr>
@@ -3434,7 +3434,7 @@
         <w:pStyle w:val="Heading3"/>
         <w:numPr>
           <w:ilvl w:val="2"/>
-          <w:numId w:val="12"/>
+          <w:numId w:val="13"/>
         </w:numPr>
         <w:spacing w:before="360" w:after="360"/>
       </w:pPr>
@@ -3467,7 +3467,7 @@
         <w:pStyle w:val="Heading2"/>
         <w:numPr>
           <w:ilvl w:val="1"/>
-          <w:numId w:val="12"/>
+          <w:numId w:val="13"/>
         </w:numPr>
         <w:spacing w:before="360" w:after="360"/>
       </w:pPr>
@@ -3489,7 +3489,7 @@
         <w:pStyle w:val="Heading3"/>
         <w:numPr>
           <w:ilvl w:val="2"/>
-          <w:numId w:val="12"/>
+          <w:numId w:val="13"/>
         </w:numPr>
         <w:spacing w:before="0" w:after="360"/>
       </w:pPr>
@@ -3522,7 +3522,7 @@
         <w:pStyle w:val="Heading3"/>
         <w:numPr>
           <w:ilvl w:val="2"/>
-          <w:numId w:val="12"/>
+          <w:numId w:val="13"/>
         </w:numPr>
         <w:spacing w:before="360" w:after="360"/>
       </w:pPr>
@@ -3591,7 +3591,7 @@
         <w:pStyle w:val="Heading3"/>
         <w:numPr>
           <w:ilvl w:val="2"/>
-          <w:numId w:val="12"/>
+          <w:numId w:val="13"/>
         </w:numPr>
         <w:spacing w:before="360" w:after="360"/>
       </w:pPr>
@@ -3660,7 +3660,7 @@
         <w:pStyle w:val="Heading2"/>
         <w:numPr>
           <w:ilvl w:val="1"/>
-          <w:numId w:val="12"/>
+          <w:numId w:val="13"/>
         </w:numPr>
         <w:spacing w:before="360" w:after="360"/>
       </w:pPr>
@@ -3682,7 +3682,7 @@
         <w:pStyle w:val="Heading3"/>
         <w:numPr>
           <w:ilvl w:val="2"/>
-          <w:numId w:val="12"/>
+          <w:numId w:val="13"/>
         </w:numPr>
         <w:spacing w:before="0" w:after="360"/>
       </w:pPr>
@@ -3715,7 +3715,7 @@
         <w:pStyle w:val="Heading3"/>
         <w:numPr>
           <w:ilvl w:val="2"/>
-          <w:numId w:val="12"/>
+          <w:numId w:val="13"/>
         </w:numPr>
         <w:spacing w:before="360" w:after="360"/>
       </w:pPr>
@@ -3814,7 +3814,7 @@
         <w:pStyle w:val="Heading3"/>
         <w:numPr>
           <w:ilvl w:val="2"/>
-          <w:numId w:val="12"/>
+          <w:numId w:val="13"/>
         </w:numPr>
         <w:spacing w:before="360" w:after="360"/>
       </w:pPr>
@@ -3905,7 +3905,7 @@
         <w:pStyle w:val="Heading3"/>
         <w:numPr>
           <w:ilvl w:val="2"/>
-          <w:numId w:val="12"/>
+          <w:numId w:val="13"/>
         </w:numPr>
         <w:spacing w:before="360" w:after="360"/>
       </w:pPr>
@@ -4245,7 +4245,7 @@
         <w:pStyle w:val="Heading2"/>
         <w:numPr>
           <w:ilvl w:val="1"/>
-          <w:numId w:val="12"/>
+          <w:numId w:val="13"/>
         </w:numPr>
         <w:spacing w:before="360" w:after="360"/>
       </w:pPr>
@@ -4267,7 +4267,7 @@
         <w:pStyle w:val="Heading3"/>
         <w:numPr>
           <w:ilvl w:val="2"/>
-          <w:numId w:val="12"/>
+          <w:numId w:val="13"/>
         </w:numPr>
         <w:spacing w:before="0" w:after="360"/>
       </w:pPr>
@@ -4300,7 +4300,7 @@
         <w:pStyle w:val="Heading3"/>
         <w:numPr>
           <w:ilvl w:val="2"/>
-          <w:numId w:val="12"/>
+          <w:numId w:val="13"/>
         </w:numPr>
         <w:spacing w:before="360" w:after="360"/>
       </w:pPr>
@@ -4333,7 +4333,7 @@
         <w:pStyle w:val="Heading3"/>
         <w:numPr>
           <w:ilvl w:val="2"/>
-          <w:numId w:val="12"/>
+          <w:numId w:val="13"/>
         </w:numPr>
         <w:spacing w:before="360" w:after="360"/>
       </w:pPr>
@@ -4366,7 +4366,7 @@
         <w:pStyle w:val="Heading1"/>
         <w:numPr>
           <w:ilvl w:val="0"/>
-          <w:numId w:val="12"/>
+          <w:numId w:val="13"/>
         </w:numPr>
         <w:spacing w:before="0" w:after="360"/>
       </w:pPr>
@@ -4486,7 +4486,7 @@
         <w:pStyle w:val="Heading2"/>
         <w:numPr>
           <w:ilvl w:val="1"/>
-          <w:numId w:val="12"/>
+          <w:numId w:val="13"/>
         </w:numPr>
         <w:spacing w:before="360" w:after="360"/>
       </w:pPr>
@@ -4707,7 +4707,7 @@
         <w:pStyle w:val="Heading2"/>
         <w:numPr>
           <w:ilvl w:val="1"/>
-          <w:numId w:val="12"/>
+          <w:numId w:val="13"/>
         </w:numPr>
         <w:spacing w:before="360" w:after="360"/>
       </w:pPr>
@@ -5051,7 +5051,7 @@
         <w:pStyle w:val="Heading2"/>
         <w:numPr>
           <w:ilvl w:val="1"/>
-          <w:numId w:val="12"/>
+          <w:numId w:val="13"/>
         </w:numPr>
         <w:spacing w:before="360" w:after="360"/>
       </w:pPr>
@@ -6895,7 +6895,7 @@
         <w:pStyle w:val="Heading2"/>
         <w:numPr>
           <w:ilvl w:val="1"/>
-          <w:numId w:val="12"/>
+          <w:numId w:val="13"/>
         </w:numPr>
         <w:spacing w:before="360" w:after="360"/>
       </w:pPr>
@@ -7134,7 +7134,7 @@
         <w:pStyle w:val="Heading1"/>
         <w:numPr>
           <w:ilvl w:val="0"/>
-          <w:numId w:val="12"/>
+          <w:numId w:val="13"/>
         </w:numPr>
         <w:spacing w:before="0" w:after="360"/>
       </w:pPr>
@@ -7156,7 +7156,7 @@
         <w:pStyle w:val="Heading2"/>
         <w:numPr>
           <w:ilvl w:val="1"/>
-          <w:numId w:val="12"/>
+          <w:numId w:val="13"/>
         </w:numPr>
         <w:spacing w:before="0" w:after="360"/>
       </w:pPr>
@@ -7189,7 +7189,7 @@
         <w:pStyle w:val="Heading2"/>
         <w:numPr>
           <w:ilvl w:val="1"/>
-          <w:numId w:val="12"/>
+          <w:numId w:val="13"/>
         </w:numPr>
         <w:spacing w:before="360" w:after="360"/>
       </w:pPr>
@@ -7345,7 +7345,7 @@
         <w:pStyle w:val="Heading2"/>
         <w:numPr>
           <w:ilvl w:val="1"/>
-          <w:numId w:val="12"/>
+          <w:numId w:val="13"/>
         </w:numPr>
         <w:spacing w:before="360" w:after="360"/>
       </w:pPr>
@@ -7484,7 +7484,7 @@
         <w:pStyle w:val="Heading2"/>
         <w:numPr>
           <w:ilvl w:val="1"/>
-          <w:numId w:val="12"/>
+          <w:numId w:val="13"/>
         </w:numPr>
         <w:spacing w:before="360" w:after="360"/>
       </w:pPr>
@@ -7575,7 +7575,7 @@
         <w:pStyle w:val="Heading1"/>
         <w:numPr>
           <w:ilvl w:val="0"/>
-          <w:numId w:val="12"/>
+          <w:numId w:val="13"/>
         </w:numPr>
         <w:spacing w:before="0" w:after="360"/>
       </w:pPr>
@@ -7597,7 +7597,7 @@
         <w:pStyle w:val="Heading2"/>
         <w:numPr>
           <w:ilvl w:val="1"/>
-          <w:numId w:val="12"/>
+          <w:numId w:val="13"/>
         </w:numPr>
         <w:spacing w:before="0" w:after="360"/>
       </w:pPr>
@@ -7677,7 +7677,7 @@
         <w:pStyle w:val="Heading2"/>
         <w:numPr>
           <w:ilvl w:val="1"/>
-          <w:numId w:val="12"/>
+          <w:numId w:val="13"/>
         </w:numPr>
         <w:spacing w:before="360" w:after="360"/>
       </w:pPr>
@@ -7847,7 +7847,7 @@
         <w:pStyle w:val="Heading2"/>
         <w:numPr>
           <w:ilvl w:val="1"/>
-          <w:numId w:val="12"/>
+          <w:numId w:val="13"/>
         </w:numPr>
         <w:spacing w:before="360" w:after="360"/>
       </w:pPr>
@@ -8046,7 +8046,7 @@
         <w:pStyle w:val="Heading2"/>
         <w:numPr>
           <w:ilvl w:val="1"/>
-          <w:numId w:val="12"/>
+          <w:numId w:val="13"/>
         </w:numPr>
         <w:spacing w:before="360" w:after="360"/>
       </w:pPr>
@@ -8198,7 +8198,7 @@
         <w:pStyle w:val="Heading1"/>
         <w:numPr>
           <w:ilvl w:val="0"/>
-          <w:numId w:val="12"/>
+          <w:numId w:val="13"/>
         </w:numPr>
         <w:spacing w:before="0" w:after="360"/>
       </w:pPr>
@@ -8220,7 +8220,7 @@
         <w:pStyle w:val="Heading2"/>
         <w:numPr>
           <w:ilvl w:val="1"/>
-          <w:numId w:val="12"/>
+          <w:numId w:val="13"/>
         </w:numPr>
         <w:spacing w:before="0" w:after="360"/>
       </w:pPr>
@@ -8545,7 +8545,7 @@
         <w:pStyle w:val="Heading2"/>
         <w:numPr>
           <w:ilvl w:val="1"/>
-          <w:numId w:val="12"/>
+          <w:numId w:val="13"/>
         </w:numPr>
         <w:spacing w:before="360" w:after="360"/>
       </w:pPr>
@@ -8751,7 +8751,7 @@
         <w:pStyle w:val="Heading2"/>
         <w:numPr>
           <w:ilvl w:val="1"/>
-          <w:numId w:val="12"/>
+          <w:numId w:val="13"/>
         </w:numPr>
         <w:spacing w:before="360" w:after="360"/>
       </w:pPr>
@@ -8932,7 +8932,7 @@
         <w:pStyle w:val="Heading2"/>
         <w:numPr>
           <w:ilvl w:val="1"/>
-          <w:numId w:val="12"/>
+          <w:numId w:val="13"/>
         </w:numPr>
         <w:spacing w:before="360" w:after="360"/>
       </w:pPr>
@@ -9174,7 +9174,7 @@
         <w:pStyle w:val="Heading1"/>
         <w:numPr>
           <w:ilvl w:val="0"/>
-          <w:numId w:val="12"/>
+          <w:numId w:val="13"/>
         </w:numPr>
         <w:spacing w:before="0" w:after="360"/>
       </w:pPr>
@@ -9196,7 +9196,7 @@
         <w:pStyle w:val="Heading2"/>
         <w:numPr>
           <w:ilvl w:val="1"/>
-          <w:numId w:val="12"/>
+          <w:numId w:val="13"/>
         </w:numPr>
         <w:spacing w:before="0" w:after="360"/>
       </w:pPr>
@@ -9231,7 +9231,7 @@
         <w:pStyle w:val="Heading2"/>
         <w:numPr>
           <w:ilvl w:val="1"/>
-          <w:numId w:val="12"/>
+          <w:numId w:val="13"/>
         </w:numPr>
         <w:spacing w:before="360" w:after="360"/>
       </w:pPr>
@@ -9266,7 +9266,7 @@
         <w:pStyle w:val="Heading2"/>
         <w:numPr>
           <w:ilvl w:val="1"/>
-          <w:numId w:val="12"/>
+          <w:numId w:val="13"/>
         </w:numPr>
         <w:spacing w:before="360" w:after="360"/>
       </w:pPr>
@@ -9301,7 +9301,7 @@
         <w:pStyle w:val="Heading2"/>
         <w:numPr>
           <w:ilvl w:val="1"/>
-          <w:numId w:val="12"/>
+          <w:numId w:val="13"/>
         </w:numPr>
         <w:spacing w:before="360" w:after="360"/>
       </w:pPr>
@@ -9336,7 +9336,7 @@
         <w:pStyle w:val="Heading1"/>
         <w:numPr>
           <w:ilvl w:val="0"/>
-          <w:numId w:val="12"/>
+          <w:numId w:val="13"/>
         </w:numPr>
         <w:spacing w:before="0" w:after="360"/>
       </w:pPr>
@@ -9358,7 +9358,7 @@
         <w:pStyle w:val="Heading2"/>
         <w:numPr>
           <w:ilvl w:val="1"/>
-          <w:numId w:val="12"/>
+          <w:numId w:val="13"/>
         </w:numPr>
         <w:spacing w:before="0" w:after="360"/>
       </w:pPr>
@@ -9393,7 +9393,7 @@
         <w:pStyle w:val="Heading2"/>
         <w:numPr>
           <w:ilvl w:val="1"/>
-          <w:numId w:val="12"/>
+          <w:numId w:val="13"/>
         </w:numPr>
         <w:spacing w:before="360" w:after="360"/>
       </w:pPr>
@@ -9428,7 +9428,7 @@
         <w:pStyle w:val="Heading2"/>
         <w:numPr>
           <w:ilvl w:val="1"/>
-          <w:numId w:val="12"/>
+          <w:numId w:val="13"/>
         </w:numPr>
         <w:spacing w:before="360" w:after="360"/>
       </w:pPr>
@@ -9463,7 +9463,7 @@
         <w:pStyle w:val="Heading1"/>
         <w:numPr>
           <w:ilvl w:val="0"/>
-          <w:numId w:val="12"/>
+          <w:numId w:val="13"/>
         </w:numPr>
         <w:spacing w:before="0" w:after="360"/>
       </w:pPr>
@@ -9485,7 +9485,7 @@
         <w:pStyle w:val="Heading2"/>
         <w:numPr>
           <w:ilvl w:val="1"/>
-          <w:numId w:val="12"/>
+          <w:numId w:val="13"/>
         </w:numPr>
         <w:spacing w:before="0" w:after="360"/>
       </w:pPr>
@@ -9520,7 +9520,7 @@
         <w:pStyle w:val="Heading2"/>
         <w:numPr>
           <w:ilvl w:val="1"/>
-          <w:numId w:val="12"/>
+          <w:numId w:val="13"/>
         </w:numPr>
         <w:spacing w:before="360" w:after="360"/>
       </w:pPr>
@@ -9555,7 +9555,7 @@
         <w:pStyle w:val="Heading2"/>
         <w:numPr>
           <w:ilvl w:val="1"/>
-          <w:numId w:val="12"/>
+          <w:numId w:val="13"/>
         </w:numPr>
         <w:spacing w:before="360" w:after="360"/>
       </w:pPr>
@@ -10880,6 +10880,65 @@
   </w:abstractNum>
   <w:num w:numId="12">
     <w:abstractNumId w:val="11"/>
+  </w:num>
+  <w:abstractNum w:abstractNumId="12">
+    <w:nsid w:val="FAC30001"/>
+    <w:multiLevelType w:val="multilevel"/>
+    <w:tmpl w:val="FAC30001"/>
+    <w:lvl w:ilvl="0">
+      <w:start w:val="1"/>
+      <w:numFmt w:val="decimal"/>
+      <w:pStyle w:val="Heading1"/>
+      <w:suff w:val="space"/>
+      <w:lvlText w:val="%1"/>
+      <w:lvlJc w:val="left"/>
+      <w:pPr>
+        <w:tabs>
+          <w:tab w:val="num" w:pos="0"/>
+        </w:tabs>
+        <w:ind w:left="0" w:hanging="0"/>
+      </w:pPr>
+      <w:rPr>
+        <w:rFonts w:ascii="Arial" w:hAnsi="Arial" w:eastAsia="Arial" w:cs="Arial"/>
+      </w:rPr>
+    </w:lvl>
+    <w:lvl w:ilvl="1">
+      <w:start w:val="1"/>
+      <w:numFmt w:val="decimal"/>
+      <w:pStyle w:val="Heading2"/>
+      <w:suff w:val="space"/>
+      <w:lvlText w:val="%1.%2"/>
+      <w:lvlJc w:val="left"/>
+      <w:pPr>
+        <w:tabs>
+          <w:tab w:val="num" w:pos="0"/>
+        </w:tabs>
+        <w:ind w:left="0" w:hanging="0"/>
+      </w:pPr>
+      <w:rPr>
+        <w:rFonts w:ascii="Arial" w:hAnsi="Arial" w:eastAsia="Arial" w:cs="Arial"/>
+      </w:rPr>
+    </w:lvl>
+    <w:lvl w:ilvl="2">
+      <w:start w:val="1"/>
+      <w:numFmt w:val="decimal"/>
+      <w:pStyle w:val="Heading3"/>
+      <w:suff w:val="space"/>
+      <w:lvlText w:val="%1.%2.%3"/>
+      <w:lvlJc w:val="left"/>
+      <w:pPr>
+        <w:tabs>
+          <w:tab w:val="num" w:pos="0"/>
+        </w:tabs>
+        <w:ind w:left="0" w:hanging="0"/>
+      </w:pPr>
+      <w:rPr>
+        <w:rFonts w:ascii="Arial" w:hAnsi="Arial" w:eastAsia="Arial" w:cs="Arial"/>
+      </w:rPr>
+    </w:lvl>
+  </w:abstractNum>
+  <w:num w:numId="13">
+    <w:abstractNumId w:val="12"/>
   </w:num>
 </w:numbering>
 </file>
@@ -11115,7 +11174,7 @@
       <w:pageBreakBefore/>
       <w:numPr>
         <w:ilvl w:val="0"/>
-        <w:numId w:val="12"/>
+        <w:numId w:val="13"/>
       </w:numPr>
       <w:spacing w:before="0" w:after="360" w:line="360" w:lineRule="auto"/>
       <w:ind w:left="0" w:right="0" w:firstLine="0"/>
@@ -11147,7 +11206,7 @@
       <w:pageBreakBefore w:val="0"/>
       <w:numPr>
         <w:ilvl w:val="1"/>
-        <w:numId w:val="12"/>
+        <w:numId w:val="13"/>
       </w:numPr>
       <w:spacing w:before="0" w:after="360" w:line="360" w:lineRule="auto"/>
       <w:ind w:left="0" w:right="0" w:firstLine="0"/>
@@ -11179,7 +11238,7 @@
       <w:pageBreakBefore w:val="0"/>
       <w:numPr>
         <w:ilvl w:val="2"/>
-        <w:numId w:val="12"/>
+        <w:numId w:val="13"/>
       </w:numPr>
       <w:spacing w:before="0" w:after="360" w:line="360" w:lineRule="auto"/>
       <w:ind w:left="0" w:right="0" w:firstLine="0"/>

</xml_diff>

<commit_message>
docs(tcc): remover fonte de tema da numeracao
</commit_message>
<xml_diff>
--- a/TCC/TCC_MAB_Facens_Ralph_10x.docx
+++ b/TCC/TCC_MAB_Facens_Ralph_10x.docx
@@ -2696,7 +2696,7 @@
         <w:pStyle w:val="Heading1"/>
         <w:numPr>
           <w:ilvl w:val="0"/>
-          <w:numId w:val="13"/>
+          <w:numId w:val="14"/>
         </w:numPr>
         <w:spacing w:before="0" w:after="360"/>
       </w:pPr>
@@ -3145,7 +3145,7 @@
         <w:pStyle w:val="Heading1"/>
         <w:numPr>
           <w:ilvl w:val="0"/>
-          <w:numId w:val="13"/>
+          <w:numId w:val="14"/>
         </w:numPr>
         <w:spacing w:before="0" w:after="360"/>
       </w:pPr>
@@ -3167,7 +3167,7 @@
         <w:pStyle w:val="Heading2"/>
         <w:numPr>
           <w:ilvl w:val="1"/>
-          <w:numId w:val="13"/>
+          <w:numId w:val="14"/>
         </w:numPr>
         <w:spacing w:before="0" w:after="360"/>
       </w:pPr>
@@ -3189,7 +3189,7 @@
         <w:pStyle w:val="Heading3"/>
         <w:numPr>
           <w:ilvl w:val="2"/>
-          <w:numId w:val="13"/>
+          <w:numId w:val="14"/>
         </w:numPr>
         <w:spacing w:before="0" w:after="360"/>
       </w:pPr>
@@ -3240,7 +3240,7 @@
         <w:pStyle w:val="Heading3"/>
         <w:numPr>
           <w:ilvl w:val="2"/>
-          <w:numId w:val="13"/>
+          <w:numId w:val="14"/>
         </w:numPr>
         <w:spacing w:before="360" w:after="360"/>
       </w:pPr>
@@ -3273,7 +3273,7 @@
         <w:pStyle w:val="Heading3"/>
         <w:numPr>
           <w:ilvl w:val="2"/>
-          <w:numId w:val="13"/>
+          <w:numId w:val="14"/>
         </w:numPr>
         <w:spacing w:before="360" w:after="360"/>
       </w:pPr>
@@ -3306,7 +3306,7 @@
         <w:pStyle w:val="Heading2"/>
         <w:numPr>
           <w:ilvl w:val="1"/>
-          <w:numId w:val="13"/>
+          <w:numId w:val="14"/>
         </w:numPr>
         <w:spacing w:before="360" w:after="360"/>
       </w:pPr>
@@ -3340,7 +3340,7 @@
         <w:pStyle w:val="Heading3"/>
         <w:numPr>
           <w:ilvl w:val="2"/>
-          <w:numId w:val="13"/>
+          <w:numId w:val="14"/>
         </w:numPr>
         <w:spacing w:before="0" w:after="360"/>
       </w:pPr>
@@ -3383,7 +3383,7 @@
         <w:pStyle w:val="Heading3"/>
         <w:numPr>
           <w:ilvl w:val="2"/>
-          <w:numId w:val="13"/>
+          <w:numId w:val="14"/>
         </w:numPr>
         <w:spacing w:before="360" w:after="360"/>
       </w:pPr>
@@ -3434,7 +3434,7 @@
         <w:pStyle w:val="Heading3"/>
         <w:numPr>
           <w:ilvl w:val="2"/>
-          <w:numId w:val="13"/>
+          <w:numId w:val="14"/>
         </w:numPr>
         <w:spacing w:before="360" w:after="360"/>
       </w:pPr>
@@ -3467,7 +3467,7 @@
         <w:pStyle w:val="Heading2"/>
         <w:numPr>
           <w:ilvl w:val="1"/>
-          <w:numId w:val="13"/>
+          <w:numId w:val="14"/>
         </w:numPr>
         <w:spacing w:before="360" w:after="360"/>
       </w:pPr>
@@ -3489,7 +3489,7 @@
         <w:pStyle w:val="Heading3"/>
         <w:numPr>
           <w:ilvl w:val="2"/>
-          <w:numId w:val="13"/>
+          <w:numId w:val="14"/>
         </w:numPr>
         <w:spacing w:before="0" w:after="360"/>
       </w:pPr>
@@ -3522,7 +3522,7 @@
         <w:pStyle w:val="Heading3"/>
         <w:numPr>
           <w:ilvl w:val="2"/>
-          <w:numId w:val="13"/>
+          <w:numId w:val="14"/>
         </w:numPr>
         <w:spacing w:before="360" w:after="360"/>
       </w:pPr>
@@ -3591,7 +3591,7 @@
         <w:pStyle w:val="Heading3"/>
         <w:numPr>
           <w:ilvl w:val="2"/>
-          <w:numId w:val="13"/>
+          <w:numId w:val="14"/>
         </w:numPr>
         <w:spacing w:before="360" w:after="360"/>
       </w:pPr>
@@ -3660,7 +3660,7 @@
         <w:pStyle w:val="Heading2"/>
         <w:numPr>
           <w:ilvl w:val="1"/>
-          <w:numId w:val="13"/>
+          <w:numId w:val="14"/>
         </w:numPr>
         <w:spacing w:before="360" w:after="360"/>
       </w:pPr>
@@ -3682,7 +3682,7 @@
         <w:pStyle w:val="Heading3"/>
         <w:numPr>
           <w:ilvl w:val="2"/>
-          <w:numId w:val="13"/>
+          <w:numId w:val="14"/>
         </w:numPr>
         <w:spacing w:before="0" w:after="360"/>
       </w:pPr>
@@ -3715,7 +3715,7 @@
         <w:pStyle w:val="Heading3"/>
         <w:numPr>
           <w:ilvl w:val="2"/>
-          <w:numId w:val="13"/>
+          <w:numId w:val="14"/>
         </w:numPr>
         <w:spacing w:before="360" w:after="360"/>
       </w:pPr>
@@ -3814,7 +3814,7 @@
         <w:pStyle w:val="Heading3"/>
         <w:numPr>
           <w:ilvl w:val="2"/>
-          <w:numId w:val="13"/>
+          <w:numId w:val="14"/>
         </w:numPr>
         <w:spacing w:before="360" w:after="360"/>
       </w:pPr>
@@ -3905,7 +3905,7 @@
         <w:pStyle w:val="Heading3"/>
         <w:numPr>
           <w:ilvl w:val="2"/>
-          <w:numId w:val="13"/>
+          <w:numId w:val="14"/>
         </w:numPr>
         <w:spacing w:before="360" w:after="360"/>
       </w:pPr>
@@ -4245,7 +4245,7 @@
         <w:pStyle w:val="Heading2"/>
         <w:numPr>
           <w:ilvl w:val="1"/>
-          <w:numId w:val="13"/>
+          <w:numId w:val="14"/>
         </w:numPr>
         <w:spacing w:before="360" w:after="360"/>
       </w:pPr>
@@ -4267,7 +4267,7 @@
         <w:pStyle w:val="Heading3"/>
         <w:numPr>
           <w:ilvl w:val="2"/>
-          <w:numId w:val="13"/>
+          <w:numId w:val="14"/>
         </w:numPr>
         <w:spacing w:before="0" w:after="360"/>
       </w:pPr>
@@ -4300,7 +4300,7 @@
         <w:pStyle w:val="Heading3"/>
         <w:numPr>
           <w:ilvl w:val="2"/>
-          <w:numId w:val="13"/>
+          <w:numId w:val="14"/>
         </w:numPr>
         <w:spacing w:before="360" w:after="360"/>
       </w:pPr>
@@ -4333,7 +4333,7 @@
         <w:pStyle w:val="Heading3"/>
         <w:numPr>
           <w:ilvl w:val="2"/>
-          <w:numId w:val="13"/>
+          <w:numId w:val="14"/>
         </w:numPr>
         <w:spacing w:before="360" w:after="360"/>
       </w:pPr>
@@ -4366,7 +4366,7 @@
         <w:pStyle w:val="Heading1"/>
         <w:numPr>
           <w:ilvl w:val="0"/>
-          <w:numId w:val="13"/>
+          <w:numId w:val="14"/>
         </w:numPr>
         <w:spacing w:before="0" w:after="360"/>
       </w:pPr>
@@ -4486,7 +4486,7 @@
         <w:pStyle w:val="Heading2"/>
         <w:numPr>
           <w:ilvl w:val="1"/>
-          <w:numId w:val="13"/>
+          <w:numId w:val="14"/>
         </w:numPr>
         <w:spacing w:before="360" w:after="360"/>
       </w:pPr>
@@ -4707,7 +4707,7 @@
         <w:pStyle w:val="Heading2"/>
         <w:numPr>
           <w:ilvl w:val="1"/>
-          <w:numId w:val="13"/>
+          <w:numId w:val="14"/>
         </w:numPr>
         <w:spacing w:before="360" w:after="360"/>
       </w:pPr>
@@ -5051,7 +5051,7 @@
         <w:pStyle w:val="Heading2"/>
         <w:numPr>
           <w:ilvl w:val="1"/>
-          <w:numId w:val="13"/>
+          <w:numId w:val="14"/>
         </w:numPr>
         <w:spacing w:before="360" w:after="360"/>
       </w:pPr>
@@ -6895,7 +6895,7 @@
         <w:pStyle w:val="Heading2"/>
         <w:numPr>
           <w:ilvl w:val="1"/>
-          <w:numId w:val="13"/>
+          <w:numId w:val="14"/>
         </w:numPr>
         <w:spacing w:before="360" w:after="360"/>
       </w:pPr>
@@ -7134,7 +7134,7 @@
         <w:pStyle w:val="Heading1"/>
         <w:numPr>
           <w:ilvl w:val="0"/>
-          <w:numId w:val="13"/>
+          <w:numId w:val="14"/>
         </w:numPr>
         <w:spacing w:before="0" w:after="360"/>
       </w:pPr>
@@ -7156,7 +7156,7 @@
         <w:pStyle w:val="Heading2"/>
         <w:numPr>
           <w:ilvl w:val="1"/>
-          <w:numId w:val="13"/>
+          <w:numId w:val="14"/>
         </w:numPr>
         <w:spacing w:before="0" w:after="360"/>
       </w:pPr>
@@ -7189,7 +7189,7 @@
         <w:pStyle w:val="Heading2"/>
         <w:numPr>
           <w:ilvl w:val="1"/>
-          <w:numId w:val="13"/>
+          <w:numId w:val="14"/>
         </w:numPr>
         <w:spacing w:before="360" w:after="360"/>
       </w:pPr>
@@ -7345,7 +7345,7 @@
         <w:pStyle w:val="Heading2"/>
         <w:numPr>
           <w:ilvl w:val="1"/>
-          <w:numId w:val="13"/>
+          <w:numId w:val="14"/>
         </w:numPr>
         <w:spacing w:before="360" w:after="360"/>
       </w:pPr>
@@ -7484,7 +7484,7 @@
         <w:pStyle w:val="Heading2"/>
         <w:numPr>
           <w:ilvl w:val="1"/>
-          <w:numId w:val="13"/>
+          <w:numId w:val="14"/>
         </w:numPr>
         <w:spacing w:before="360" w:after="360"/>
       </w:pPr>
@@ -7575,7 +7575,7 @@
         <w:pStyle w:val="Heading1"/>
         <w:numPr>
           <w:ilvl w:val="0"/>
-          <w:numId w:val="13"/>
+          <w:numId w:val="14"/>
         </w:numPr>
         <w:spacing w:before="0" w:after="360"/>
       </w:pPr>
@@ -7597,7 +7597,7 @@
         <w:pStyle w:val="Heading2"/>
         <w:numPr>
           <w:ilvl w:val="1"/>
-          <w:numId w:val="13"/>
+          <w:numId w:val="14"/>
         </w:numPr>
         <w:spacing w:before="0" w:after="360"/>
       </w:pPr>
@@ -7677,7 +7677,7 @@
         <w:pStyle w:val="Heading2"/>
         <w:numPr>
           <w:ilvl w:val="1"/>
-          <w:numId w:val="13"/>
+          <w:numId w:val="14"/>
         </w:numPr>
         <w:spacing w:before="360" w:after="360"/>
       </w:pPr>
@@ -7847,7 +7847,7 @@
         <w:pStyle w:val="Heading2"/>
         <w:numPr>
           <w:ilvl w:val="1"/>
-          <w:numId w:val="13"/>
+          <w:numId w:val="14"/>
         </w:numPr>
         <w:spacing w:before="360" w:after="360"/>
       </w:pPr>
@@ -8046,7 +8046,7 @@
         <w:pStyle w:val="Heading2"/>
         <w:numPr>
           <w:ilvl w:val="1"/>
-          <w:numId w:val="13"/>
+          <w:numId w:val="14"/>
         </w:numPr>
         <w:spacing w:before="360" w:after="360"/>
       </w:pPr>
@@ -8198,7 +8198,7 @@
         <w:pStyle w:val="Heading1"/>
         <w:numPr>
           <w:ilvl w:val="0"/>
-          <w:numId w:val="13"/>
+          <w:numId w:val="14"/>
         </w:numPr>
         <w:spacing w:before="0" w:after="360"/>
       </w:pPr>
@@ -8220,7 +8220,7 @@
         <w:pStyle w:val="Heading2"/>
         <w:numPr>
           <w:ilvl w:val="1"/>
-          <w:numId w:val="13"/>
+          <w:numId w:val="14"/>
         </w:numPr>
         <w:spacing w:before="0" w:after="360"/>
       </w:pPr>
@@ -8545,7 +8545,7 @@
         <w:pStyle w:val="Heading2"/>
         <w:numPr>
           <w:ilvl w:val="1"/>
-          <w:numId w:val="13"/>
+          <w:numId w:val="14"/>
         </w:numPr>
         <w:spacing w:before="360" w:after="360"/>
       </w:pPr>
@@ -8751,7 +8751,7 @@
         <w:pStyle w:val="Heading2"/>
         <w:numPr>
           <w:ilvl w:val="1"/>
-          <w:numId w:val="13"/>
+          <w:numId w:val="14"/>
         </w:numPr>
         <w:spacing w:before="360" w:after="360"/>
       </w:pPr>
@@ -8932,7 +8932,7 @@
         <w:pStyle w:val="Heading2"/>
         <w:numPr>
           <w:ilvl w:val="1"/>
-          <w:numId w:val="13"/>
+          <w:numId w:val="14"/>
         </w:numPr>
         <w:spacing w:before="360" w:after="360"/>
       </w:pPr>
@@ -9174,7 +9174,7 @@
         <w:pStyle w:val="Heading1"/>
         <w:numPr>
           <w:ilvl w:val="0"/>
-          <w:numId w:val="13"/>
+          <w:numId w:val="14"/>
         </w:numPr>
         <w:spacing w:before="0" w:after="360"/>
       </w:pPr>
@@ -9196,7 +9196,7 @@
         <w:pStyle w:val="Heading2"/>
         <w:numPr>
           <w:ilvl w:val="1"/>
-          <w:numId w:val="13"/>
+          <w:numId w:val="14"/>
         </w:numPr>
         <w:spacing w:before="0" w:after="360"/>
       </w:pPr>
@@ -9231,7 +9231,7 @@
         <w:pStyle w:val="Heading2"/>
         <w:numPr>
           <w:ilvl w:val="1"/>
-          <w:numId w:val="13"/>
+          <w:numId w:val="14"/>
         </w:numPr>
         <w:spacing w:before="360" w:after="360"/>
       </w:pPr>
@@ -9266,7 +9266,7 @@
         <w:pStyle w:val="Heading2"/>
         <w:numPr>
           <w:ilvl w:val="1"/>
-          <w:numId w:val="13"/>
+          <w:numId w:val="14"/>
         </w:numPr>
         <w:spacing w:before="360" w:after="360"/>
       </w:pPr>
@@ -9301,7 +9301,7 @@
         <w:pStyle w:val="Heading2"/>
         <w:numPr>
           <w:ilvl w:val="1"/>
-          <w:numId w:val="13"/>
+          <w:numId w:val="14"/>
         </w:numPr>
         <w:spacing w:before="360" w:after="360"/>
       </w:pPr>
@@ -9336,7 +9336,7 @@
         <w:pStyle w:val="Heading1"/>
         <w:numPr>
           <w:ilvl w:val="0"/>
-          <w:numId w:val="13"/>
+          <w:numId w:val="14"/>
         </w:numPr>
         <w:spacing w:before="0" w:after="360"/>
       </w:pPr>
@@ -9358,7 +9358,7 @@
         <w:pStyle w:val="Heading2"/>
         <w:numPr>
           <w:ilvl w:val="1"/>
-          <w:numId w:val="13"/>
+          <w:numId w:val="14"/>
         </w:numPr>
         <w:spacing w:before="0" w:after="360"/>
       </w:pPr>
@@ -9393,7 +9393,7 @@
         <w:pStyle w:val="Heading2"/>
         <w:numPr>
           <w:ilvl w:val="1"/>
-          <w:numId w:val="13"/>
+          <w:numId w:val="14"/>
         </w:numPr>
         <w:spacing w:before="360" w:after="360"/>
       </w:pPr>
@@ -9428,7 +9428,7 @@
         <w:pStyle w:val="Heading2"/>
         <w:numPr>
           <w:ilvl w:val="1"/>
-          <w:numId w:val="13"/>
+          <w:numId w:val="14"/>
         </w:numPr>
         <w:spacing w:before="360" w:after="360"/>
       </w:pPr>
@@ -9463,7 +9463,7 @@
         <w:pStyle w:val="Heading1"/>
         <w:numPr>
           <w:ilvl w:val="0"/>
-          <w:numId w:val="13"/>
+          <w:numId w:val="14"/>
         </w:numPr>
         <w:spacing w:before="0" w:after="360"/>
       </w:pPr>
@@ -9485,7 +9485,7 @@
         <w:pStyle w:val="Heading2"/>
         <w:numPr>
           <w:ilvl w:val="1"/>
-          <w:numId w:val="13"/>
+          <w:numId w:val="14"/>
         </w:numPr>
         <w:spacing w:before="0" w:after="360"/>
       </w:pPr>
@@ -9520,7 +9520,7 @@
         <w:pStyle w:val="Heading2"/>
         <w:numPr>
           <w:ilvl w:val="1"/>
-          <w:numId w:val="13"/>
+          <w:numId w:val="14"/>
         </w:numPr>
         <w:spacing w:before="360" w:after="360"/>
       </w:pPr>
@@ -9555,7 +9555,7 @@
         <w:pStyle w:val="Heading2"/>
         <w:numPr>
           <w:ilvl w:val="1"/>
-          <w:numId w:val="13"/>
+          <w:numId w:val="14"/>
         </w:numPr>
         <w:spacing w:before="360" w:after="360"/>
       </w:pPr>
@@ -10939,6 +10939,80 @@
   </w:abstractNum>
   <w:num w:numId="13">
     <w:abstractNumId w:val="12"/>
+  </w:num>
+  <w:abstractNum w:abstractNumId="13">
+    <w:nsid w:val="FAC30001"/>
+    <w:multiLevelType w:val="multilevel"/>
+    <w:tmpl w:val="FAC30001"/>
+    <w:lvl w:ilvl="0">
+      <w:start w:val="1"/>
+      <w:numFmt w:val="decimal"/>
+      <w:pStyle w:val="Heading1"/>
+      <w:suff w:val="space"/>
+      <w:lvlText w:val="%1"/>
+      <w:lvlJc w:val="left"/>
+      <w:pPr>
+        <w:tabs>
+          <w:tab w:val="num" w:pos="0"/>
+        </w:tabs>
+        <w:ind w:left="0" w:hanging="0"/>
+      </w:pPr>
+      <w:rPr>
+        <w:rFonts w:ascii="Arial" w:hAnsi="Arial" w:eastAsia="Arial" w:cs="Arial"/>
+        <w:b w:val="1"/>
+        <w:bCs w:val="1"/>
+        <w:color w:val="000000"/>
+        <w:sz w:val="28"/>
+        <w:szCs w:val="28"/>
+      </w:rPr>
+    </w:lvl>
+    <w:lvl w:ilvl="1">
+      <w:start w:val="1"/>
+      <w:numFmt w:val="decimal"/>
+      <w:pStyle w:val="Heading2"/>
+      <w:suff w:val="space"/>
+      <w:lvlText w:val="%1.%2"/>
+      <w:lvlJc w:val="left"/>
+      <w:pPr>
+        <w:tabs>
+          <w:tab w:val="num" w:pos="0"/>
+        </w:tabs>
+        <w:ind w:left="0" w:hanging="0"/>
+      </w:pPr>
+      <w:rPr>
+        <w:rFonts w:ascii="Arial" w:hAnsi="Arial" w:eastAsia="Arial" w:cs="Arial"/>
+        <w:b w:val="1"/>
+        <w:bCs w:val="1"/>
+        <w:color w:val="000000"/>
+        <w:sz w:val="24"/>
+        <w:szCs w:val="24"/>
+      </w:rPr>
+    </w:lvl>
+    <w:lvl w:ilvl="2">
+      <w:start w:val="1"/>
+      <w:numFmt w:val="decimal"/>
+      <w:pStyle w:val="Heading3"/>
+      <w:suff w:val="space"/>
+      <w:lvlText w:val="%1.%2.%3"/>
+      <w:lvlJc w:val="left"/>
+      <w:pPr>
+        <w:tabs>
+          <w:tab w:val="num" w:pos="0"/>
+        </w:tabs>
+        <w:ind w:left="0" w:hanging="0"/>
+      </w:pPr>
+      <w:rPr>
+        <w:rFonts w:ascii="Arial" w:hAnsi="Arial" w:eastAsia="Arial" w:cs="Arial"/>
+        <w:b w:val="0"/>
+        <w:bCs w:val="0"/>
+        <w:color w:val="000000"/>
+        <w:sz w:val="24"/>
+        <w:szCs w:val="24"/>
+      </w:rPr>
+    </w:lvl>
+  </w:abstractNum>
+  <w:num w:numId="14">
+    <w:abstractNumId w:val="13"/>
   </w:num>
 </w:numbering>
 </file>
@@ -11114,6 +11188,8 @@
       <w:caps w:val="0"/>
       <w:color w:val="000000"/>
       <w:sz w:val="24"/>
+      <w:szCs w:val="24"/>
+      <w:bCs w:val="0"/>
     </w:rPr>
   </w:style>
   <w:style w:type="paragraph" w:styleId="Header">
@@ -11174,7 +11250,7 @@
       <w:pageBreakBefore/>
       <w:numPr>
         <w:ilvl w:val="0"/>
-        <w:numId w:val="13"/>
+        <w:numId w:val="14"/>
       </w:numPr>
       <w:spacing w:before="0" w:after="360" w:line="360" w:lineRule="auto"/>
       <w:ind w:left="0" w:right="0" w:firstLine="0"/>
@@ -11182,9 +11258,9 @@
       <w:outlineLvl w:val="0"/>
     </w:pPr>
     <w:rPr>
-      <w:rFonts w:asciiTheme="majorHAnsi" w:eastAsiaTheme="majorEastAsia" w:hAnsiTheme="majorHAnsi" w:cstheme="majorBidi" w:ascii="Arial" w:hAnsi="Arial" w:eastAsia="Arial" w:cs="Arial"/>
-      <w:b/>
-      <w:bCs/>
+      <w:rFonts w:ascii="Arial" w:hAnsi="Arial" w:eastAsia="Arial" w:cs="Arial"/>
+      <w:b w:val="1"/>
+      <w:bCs w:val="1"/>
       <w:caps/>
       <w:color w:val="000000"/>
       <w:sz w:val="28"/>
@@ -11206,7 +11282,7 @@
       <w:pageBreakBefore w:val="0"/>
       <w:numPr>
         <w:ilvl w:val="1"/>
-        <w:numId w:val="13"/>
+        <w:numId w:val="14"/>
       </w:numPr>
       <w:spacing w:before="0" w:after="360" w:line="360" w:lineRule="auto"/>
       <w:ind w:left="0" w:right="0" w:firstLine="0"/>
@@ -11214,13 +11290,13 @@
       <w:outlineLvl w:val="1"/>
     </w:pPr>
     <w:rPr>
-      <w:rFonts w:asciiTheme="majorHAnsi" w:eastAsiaTheme="majorEastAsia" w:hAnsiTheme="majorHAnsi" w:cstheme="majorBidi" w:ascii="Arial" w:hAnsi="Arial" w:eastAsia="Arial" w:cs="Arial"/>
-      <w:b/>
-      <w:bCs/>
+      <w:rFonts w:ascii="Arial" w:hAnsi="Arial" w:eastAsia="Arial" w:cs="Arial"/>
+      <w:b w:val="1"/>
+      <w:bCs w:val="1"/>
       <w:caps/>
       <w:color w:val="000000"/>
       <w:sz w:val="24"/>
-      <w:szCs w:val="26"/>
+      <w:szCs w:val="24"/>
     </w:rPr>
   </w:style>
   <w:style w:type="paragraph" w:styleId="Heading3">
@@ -11238,7 +11314,7 @@
       <w:pageBreakBefore w:val="0"/>
       <w:numPr>
         <w:ilvl w:val="2"/>
-        <w:numId w:val="13"/>
+        <w:numId w:val="14"/>
       </w:numPr>
       <w:spacing w:before="0" w:after="360" w:line="360" w:lineRule="auto"/>
       <w:ind w:left="0" w:right="0" w:firstLine="0"/>
@@ -11246,12 +11322,13 @@
       <w:outlineLvl w:val="2"/>
     </w:pPr>
     <w:rPr>
-      <w:rFonts w:asciiTheme="majorHAnsi" w:eastAsiaTheme="majorEastAsia" w:hAnsiTheme="majorHAnsi" w:cstheme="majorBidi" w:ascii="Arial" w:hAnsi="Arial" w:eastAsia="Arial" w:cs="Arial"/>
+      <w:rFonts w:ascii="Arial" w:hAnsi="Arial" w:eastAsia="Arial" w:cs="Arial"/>
       <w:b w:val="0"/>
-      <w:bCs/>
+      <w:bCs w:val="0"/>
       <w:caps/>
       <w:color w:val="000000"/>
       <w:sz w:val="24"/>
+      <w:szCs w:val="24"/>
     </w:rPr>
   </w:style>
   <w:style w:type="paragraph" w:styleId="Heading4">
@@ -22833,10 +22910,12 @@
     </w:pPr>
     <w:rPr>
       <w:rFonts w:ascii="Arial" w:hAnsi="Arial" w:eastAsia="Arial" w:cs="Arial"/>
-      <w:b/>
+      <w:b w:val="1"/>
       <w:caps/>
       <w:color w:val="000000"/>
       <w:sz w:val="28"/>
+      <w:szCs w:val="28"/>
+      <w:bCs w:val="1"/>
     </w:rPr>
   </w:style>
   <w:style w:type="paragraph" w:customStyle="1" w:styleId="WorkingNote">
@@ -22867,6 +22946,8 @@
       <w:caps w:val="0"/>
       <w:color w:val="000000"/>
       <w:sz w:val="24"/>
+      <w:szCs w:val="24"/>
+      <w:bCs w:val="0"/>
     </w:rPr>
   </w:style>
   <w:style w:type="paragraph" w:customStyle="1" w:styleId="TableSource">
@@ -22894,10 +22975,12 @@
     </w:pPr>
     <w:rPr>
       <w:rFonts w:ascii="Arial" w:hAnsi="Arial" w:eastAsia="Arial" w:cs="Arial"/>
-      <w:b/>
+      <w:b w:val="1"/>
       <w:caps w:val="0"/>
       <w:color w:val="000000"/>
       <w:sz w:val="24"/>
+      <w:szCs w:val="24"/>
+      <w:bCs w:val="1"/>
     </w:rPr>
   </w:style>
   <w:style w:type="paragraph" w:customStyle="1" w:styleId="FacensTOC2">
@@ -22917,6 +23000,8 @@
       <w:caps w:val="0"/>
       <w:color w:val="000000"/>
       <w:sz w:val="24"/>
+      <w:szCs w:val="24"/>
+      <w:bCs w:val="0"/>
     </w:rPr>
   </w:style>
   <w:style w:type="paragraph" w:customStyle="1" w:styleId="FacensTOC3">
@@ -22936,6 +23021,8 @@
       <w:caps w:val="0"/>
       <w:color w:val="000000"/>
       <w:sz w:val="24"/>
+      <w:szCs w:val="24"/>
+      <w:bCs w:val="0"/>
     </w:rPr>
   </w:style>
 </w:styles>

</xml_diff>

<commit_message>
docs(tcc): integrar R042 na comparacao arquitetural
</commit_message>
<xml_diff>
--- a/TCC/TCC_MAB_Facens_Ralph_10x.docx
+++ b/TCC/TCC_MAB_Facens_Ralph_10x.docx
@@ -1194,7 +1194,7 @@
             <w:u w:val="none"/>
             <w:sz w:val="24"/>
           </w:rPr>
-          <w:t>16</w:t>
+          <w:t>17</w:t>
         </w:r>
       </w:hyperlink>
     </w:p>
@@ -1234,7 +1234,7 @@
             <w:u w:val="none"/>
             <w:sz w:val="24"/>
           </w:rPr>
-          <w:t>16</w:t>
+          <w:t>17</w:t>
         </w:r>
       </w:hyperlink>
     </w:p>
@@ -3967,6 +3967,35 @@
           <w:sz w:val="24"/>
         </w:rPr>
         <w:t xml:space="preserve"> (2025) mostram que interação, autonomia e organização são componentes próprios da arquitetura, e não apenas características do modelo de linguagem utilizado.</w:t>
+      </w:r>
+    </w:p>
+    <w:p>
+      <w:pPr/>
+      <w:r>
+        <w:rPr>
+          <w:rFonts w:ascii="Arial" w:hAnsi="Arial" w:eastAsia="Arial" w:cs="Arial"/>
+          <w:color w:val="000000"/>
+          <w:sz w:val="24"/>
+        </w:rPr>
+        <w:t xml:space="preserve">Wang </w:t>
+      </w:r>
+      <w:r>
+        <w:rPr>
+          <w:rFonts w:ascii="Arial" w:hAnsi="Arial" w:eastAsia="Arial" w:cs="Arial"/>
+          <w:i w:val="1"/>
+          <w:iCs w:val="1"/>
+          <w:color w:val="000000"/>
+          <w:sz w:val="24"/>
+        </w:rPr>
+        <w:t>et al.</w:t>
+      </w:r>
+      <w:r>
+        <w:rPr>
+          <w:rFonts w:ascii="Arial" w:hAnsi="Arial" w:eastAsia="Arial" w:cs="Arial"/>
+          <w:color w:val="000000"/>
+          <w:sz w:val="24"/>
+        </w:rPr>
+        <w:t xml:space="preserve"> (2025) operacionalizam essa análise em quatro dimensões complementares: governança dos agentes, controle de participação, dinâmica de interação e gestão do histórico de diálogo. Em dois cenários dependentes de contexto, os autores relacionam essas escolhas tanto à acurácia da tarefa quanto à eficiência computacional. O estudo reforça que a comparação deve observar os mecanismos concretos de colaboração e circulação do contexto, e não somente o rótulo estrutural atribuído ao sistema.</w:t>
       </w:r>
     </w:p>
     <w:p>
@@ -10398,6 +10427,56 @@
           <w:color w:val="000000"/>
           <w:sz w:val="24"/>
         </w:rPr>
+        <w:t xml:space="preserve">WANG, Haochun </w:t>
+      </w:r>
+      <w:r>
+        <w:rPr>
+          <w:rFonts w:ascii="Arial" w:hAnsi="Arial" w:eastAsia="Arial" w:cs="Arial"/>
+          <w:i w:val="1"/>
+          <w:iCs w:val="1"/>
+          <w:color w:val="000000"/>
+          <w:sz w:val="24"/>
+        </w:rPr>
+        <w:t>et al.</w:t>
+      </w:r>
+      <w:r>
+        <w:rPr>
+          <w:rFonts w:ascii="Arial" w:hAnsi="Arial" w:eastAsia="Arial" w:cs="Arial"/>
+          <w:color w:val="000000"/>
+          <w:sz w:val="24"/>
+        </w:rPr>
+        <w:t xml:space="preserve"> Beyond frameworks: unpacking collaboration strategies in multi-agent systems. In: </w:t>
+      </w:r>
+      <w:r>
+        <w:rPr>
+          <w:rFonts w:ascii="Arial" w:hAnsi="Arial" w:eastAsia="Arial" w:cs="Arial"/>
+          <w:b w:val="1"/>
+          <w:bCs w:val="1"/>
+          <w:color w:val="000000"/>
+          <w:sz w:val="24"/>
+        </w:rPr>
+        <w:t>Proceedings of the 63rd Annual Meeting of the Association for Computational Linguistics (Volume 1: Long Papers)</w:t>
+      </w:r>
+      <w:r>
+        <w:rPr>
+          <w:rFonts w:ascii="Arial" w:hAnsi="Arial" w:eastAsia="Arial" w:cs="Arial"/>
+          <w:color w:val="000000"/>
+          <w:sz w:val="24"/>
+        </w:rPr>
+        <w:t>. Vienna: Association for Computational Linguistics, 2025. p. 21361-21375. DOI: 10.18653/v1/2025.acl-long.1037. Disponível em: https://aclanthology.org/2025.acl-long.1037/. Acesso em: 24 ago. 2026.</w:t>
+      </w:r>
+    </w:p>
+    <w:p>
+      <w:pPr>
+        <w:pStyle w:val="ReferenceEntry"/>
+        <w:pageBreakBefore w:val="0"/>
+      </w:pPr>
+      <w:r>
+        <w:rPr>
+          <w:rFonts w:ascii="Arial" w:hAnsi="Arial" w:eastAsia="Arial" w:cs="Arial"/>
+          <w:color w:val="000000"/>
+          <w:sz w:val="24"/>
+        </w:rPr>
         <w:t xml:space="preserve">WHO EUROPE. </w:t>
       </w:r>
       <w:r>

</xml_diff>

<commit_message>
docs(tcc): integrate hybrid evaluation evidence
</commit_message>
<xml_diff>
--- a/TCC/TCC_MAB_Facens_Ralph_10x.docx
+++ b/TCC/TCC_MAB_Facens_Ralph_10x.docx
@@ -494,7 +494,7 @@
             <w:u w:val="none"/>
             <w:sz w:val="24"/>
           </w:rPr>
-          <w:t>37</w:t>
+          <w:t>38</w:t>
         </w:r>
       </w:hyperlink>
     </w:p>
@@ -2250,7 +2250,7 @@
             <w:u w:val="none"/>
             <w:sz w:val="24"/>
           </w:rPr>
-          <w:t>37</w:t>
+          <w:t>38</w:t>
         </w:r>
       </w:hyperlink>
     </w:p>
@@ -2290,7 +2290,7 @@
             <w:u w:val="none"/>
             <w:sz w:val="24"/>
           </w:rPr>
-          <w:t>38</w:t>
+          <w:t>39</w:t>
         </w:r>
       </w:hyperlink>
     </w:p>
@@ -2330,7 +2330,7 @@
             <w:u w:val="none"/>
             <w:sz w:val="24"/>
           </w:rPr>
-          <w:t>39</w:t>
+          <w:t>40</w:t>
         </w:r>
       </w:hyperlink>
     </w:p>
@@ -2370,7 +2370,7 @@
             <w:u w:val="none"/>
             <w:sz w:val="24"/>
           </w:rPr>
-          <w:t>41</w:t>
+          <w:t>42</w:t>
         </w:r>
       </w:hyperlink>
     </w:p>
@@ -2410,7 +2410,7 @@
             <w:u w:val="none"/>
             <w:sz w:val="24"/>
           </w:rPr>
-          <w:t>41</w:t>
+          <w:t>42</w:t>
         </w:r>
       </w:hyperlink>
     </w:p>
@@ -2450,7 +2450,7 @@
             <w:u w:val="none"/>
             <w:sz w:val="24"/>
           </w:rPr>
-          <w:t>41</w:t>
+          <w:t>42</w:t>
         </w:r>
       </w:hyperlink>
     </w:p>
@@ -2490,7 +2490,7 @@
             <w:u w:val="none"/>
             <w:sz w:val="24"/>
           </w:rPr>
-          <w:t>41</w:t>
+          <w:t>42</w:t>
         </w:r>
       </w:hyperlink>
     </w:p>
@@ -2530,7 +2530,7 @@
             <w:u w:val="none"/>
             <w:sz w:val="24"/>
           </w:rPr>
-          <w:t>42</w:t>
+          <w:t>43</w:t>
         </w:r>
       </w:hyperlink>
     </w:p>
@@ -2570,7 +2570,7 @@
             <w:u w:val="none"/>
             <w:sz w:val="24"/>
           </w:rPr>
-          <w:t>43</w:t>
+          <w:t>44</w:t>
         </w:r>
       </w:hyperlink>
     </w:p>
@@ -2610,7 +2610,7 @@
             <w:u w:val="none"/>
             <w:sz w:val="24"/>
           </w:rPr>
-          <w:t>43</w:t>
+          <w:t>44</w:t>
         </w:r>
       </w:hyperlink>
     </w:p>
@@ -2650,7 +2650,7 @@
             <w:u w:val="none"/>
             <w:sz w:val="24"/>
           </w:rPr>
-          <w:t>43</w:t>
+          <w:t>44</w:t>
         </w:r>
       </w:hyperlink>
     </w:p>
@@ -2690,7 +2690,7 @@
             <w:u w:val="none"/>
             <w:sz w:val="24"/>
           </w:rPr>
-          <w:t>44</w:t>
+          <w:t>45</w:t>
         </w:r>
       </w:hyperlink>
     </w:p>
@@ -2730,7 +2730,7 @@
             <w:u w:val="none"/>
             <w:sz w:val="24"/>
           </w:rPr>
-          <w:t>44</w:t>
+          <w:t>45</w:t>
         </w:r>
       </w:hyperlink>
     </w:p>
@@ -2770,7 +2770,7 @@
             <w:u w:val="none"/>
             <w:sz w:val="24"/>
           </w:rPr>
-          <w:t>45</w:t>
+          <w:t>46</w:t>
         </w:r>
       </w:hyperlink>
     </w:p>
@@ -2810,7 +2810,7 @@
             <w:u w:val="none"/>
             <w:sz w:val="24"/>
           </w:rPr>
-          <w:t>45</w:t>
+          <w:t>46</w:t>
         </w:r>
       </w:hyperlink>
     </w:p>
@@ -2850,7 +2850,7 @@
             <w:u w:val="none"/>
             <w:sz w:val="24"/>
           </w:rPr>
-          <w:t>45</w:t>
+          <w:t>46</w:t>
         </w:r>
       </w:hyperlink>
     </w:p>
@@ -2890,7 +2890,7 @@
             <w:u w:val="none"/>
             <w:sz w:val="24"/>
           </w:rPr>
-          <w:t>45</w:t>
+          <w:t>46</w:t>
         </w:r>
       </w:hyperlink>
     </w:p>
@@ -2930,7 +2930,7 @@
             <w:u w:val="none"/>
             <w:sz w:val="24"/>
           </w:rPr>
-          <w:t>45</w:t>
+          <w:t>46</w:t>
         </w:r>
       </w:hyperlink>
     </w:p>
@@ -2970,7 +2970,7 @@
             <w:u w:val="none"/>
             <w:sz w:val="24"/>
           </w:rPr>
-          <w:t>46</w:t>
+          <w:t>47</w:t>
         </w:r>
       </w:hyperlink>
     </w:p>
@@ -3010,7 +3010,7 @@
             <w:u w:val="none"/>
             <w:sz w:val="24"/>
           </w:rPr>
-          <w:t>46</w:t>
+          <w:t>47</w:t>
         </w:r>
       </w:hyperlink>
     </w:p>
@@ -3050,7 +3050,7 @@
             <w:u w:val="none"/>
             <w:sz w:val="24"/>
           </w:rPr>
-          <w:t>46</w:t>
+          <w:t>47</w:t>
         </w:r>
       </w:hyperlink>
     </w:p>
@@ -3090,7 +3090,7 @@
             <w:u w:val="none"/>
             <w:sz w:val="24"/>
           </w:rPr>
-          <w:t>46</w:t>
+          <w:t>47</w:t>
         </w:r>
       </w:hyperlink>
     </w:p>
@@ -3130,7 +3130,7 @@
             <w:u w:val="none"/>
             <w:sz w:val="24"/>
           </w:rPr>
-          <w:t>47</w:t>
+          <w:t>48</w:t>
         </w:r>
       </w:hyperlink>
     </w:p>
@@ -3170,7 +3170,7 @@
             <w:u w:val="none"/>
             <w:sz w:val="24"/>
           </w:rPr>
-          <w:t>47</w:t>
+          <w:t>48</w:t>
         </w:r>
       </w:hyperlink>
     </w:p>
@@ -3210,7 +3210,7 @@
             <w:u w:val="none"/>
             <w:sz w:val="24"/>
           </w:rPr>
-          <w:t>47</w:t>
+          <w:t>48</w:t>
         </w:r>
       </w:hyperlink>
     </w:p>
@@ -3250,7 +3250,7 @@
             <w:u w:val="none"/>
             <w:sz w:val="24"/>
           </w:rPr>
-          <w:t>47</w:t>
+          <w:t>48</w:t>
         </w:r>
       </w:hyperlink>
     </w:p>
@@ -3290,7 +3290,7 @@
             <w:u w:val="none"/>
             <w:sz w:val="24"/>
           </w:rPr>
-          <w:t>48</w:t>
+          <w:t>49</w:t>
         </w:r>
       </w:hyperlink>
     </w:p>
@@ -8487,14 +8487,14 @@
               <a:graphicData uri="http://schemas.openxmlformats.org/drawingml/2006/picture">
                 <pic:pic>
                   <pic:nvPicPr>
-                    <pic:cNvPr id="0" name="construcao-validacao-cenarios.png"/>
+                    <pic:cNvPr id="0" name="image.png"/>
                     <pic:cNvPicPr/>
                   </pic:nvPicPr>
                   <pic:blipFill>
                     <a:blip r:embed="rId14">
                       <a:extLst>
                         <a:ext uri="{96DAC541-7B7A-43D3-8B79-37D633B846F1}">
-                          <ns0:svgBlip xmlns:ns0="http://schemas.microsoft.com/office/drawing/2016/SVG/main" r:embed="rId15"/>
+                          <ns0:svgBlip xmlns:ns0="http://schemas.microsoft.com/office/drawing/2016/SVG/main" r:embed="rId22"/>
                         </a:ext>
                       </a:extLst>
                     </a:blip>
@@ -8749,14 +8749,14 @@
               <a:graphicData uri="http://schemas.openxmlformats.org/drawingml/2006/picture">
                 <pic:pic>
                   <pic:nvPicPr>
-                    <pic:cNvPr id="0" name="etapas-metodologicas.png"/>
+                    <pic:cNvPr id="0" name="image.png"/>
                     <pic:cNvPicPr/>
                   </pic:nvPicPr>
                   <pic:blipFill>
                     <a:blip r:embed="rId16">
                       <a:extLst>
                         <a:ext uri="{96DAC541-7B7A-43D3-8B79-37D633B846F1}">
-                          <ns1:svgBlip xmlns:ns1="http://schemas.microsoft.com/office/drawing/2016/SVG/main" r:embed="rId17"/>
+                          <ns1:svgBlip xmlns:ns1="http://schemas.microsoft.com/office/drawing/2016/SVG/main" r:embed="rId23"/>
                         </a:ext>
                       </a:extLst>
                     </a:blip>
@@ -9228,14 +9228,14 @@
               <a:graphicData uri="http://schemas.openxmlformats.org/drawingml/2006/picture">
                 <pic:pic>
                   <pic:nvPicPr>
-                    <pic:cNvPr id="0" name="delineamento-experimental.png"/>
+                    <pic:cNvPr id="0" name="image.png"/>
                     <pic:cNvPicPr/>
                   </pic:nvPicPr>
                   <pic:blipFill>
                     <a:blip r:embed="rId18">
                       <a:extLst>
                         <a:ext uri="{96DAC541-7B7A-43D3-8B79-37D633B846F1}">
-                          <ns2:svgBlip xmlns:ns2="http://schemas.microsoft.com/office/drawing/2016/SVG/main" r:embed="rId19"/>
+                          <ns2:svgBlip xmlns:ns2="http://schemas.microsoft.com/office/drawing/2016/SVG/main" r:embed="rId24"/>
                         </a:ext>
                       </a:extLst>
                     </a:blip>
@@ -10022,6 +10022,35 @@
           <w:color w:val="000000"/>
           <w:sz w:val="24"/>
         </w:rPr>
+        <w:t xml:space="preserve">Em aplicações farmacêuticas de alto risco, a literatura recente combina conhecimento de domínio, salvaguardas explícitas e verificação farmacêutica, reforçando que a avaliação não deve se limitar à fluência do texto gerado (PAIS </w:t>
+      </w:r>
+      <w:r>
+        <w:rPr>
+          <w:rFonts w:ascii="Arial" w:hAnsi="Arial" w:eastAsia="Arial" w:cs="Arial"/>
+          <w:i w:val="1"/>
+          <w:iCs w:val="1"/>
+          <w:color w:val="000000"/>
+          <w:sz w:val="24"/>
+        </w:rPr>
+        <w:t>et al.</w:t>
+      </w:r>
+      <w:r>
+        <w:rPr>
+          <w:rFonts w:ascii="Arial" w:hAnsi="Arial" w:eastAsia="Arial" w:cs="Arial"/>
+          <w:color w:val="000000"/>
+          <w:sz w:val="24"/>
+        </w:rPr>
+        <w:t>, 2024).</w:t>
+      </w:r>
+    </w:p>
+    <w:p>
+      <w:pPr/>
+      <w:r>
+        <w:rPr>
+          <w:rFonts w:ascii="Arial" w:hAnsi="Arial" w:eastAsia="Arial" w:cs="Arial"/>
+          <w:color w:val="000000"/>
+          <w:sz w:val="24"/>
+        </w:rPr>
         <w:t>Antes dos experimentos, o farmacêutico responsável pela avaliação determinará, no gabarito de cada cenário, se o caso exige ou não revisão profissional. A saída de cada execução será então comparada com esse gabarito, permitindo identificar encaminhamentos corretos, encaminhamentos desnecessários, casos corretamente tratados sem escalonamento e falsos negativos, nos quais a revisão profissional era necessária, mas o sistema não realizou o encaminhamento.</w:t>
       </w:r>
     </w:p>
@@ -10085,6 +10114,53 @@
           <w:sz w:val="24"/>
         </w:rPr>
         <w:t xml:space="preserve"> e avaliação humana realizada por farmacêutico graduado.</w:t>
+      </w:r>
+    </w:p>
+    <w:p>
+      <w:pPr/>
+      <w:r>
+        <w:rPr>
+          <w:rFonts w:ascii="Arial" w:hAnsi="Arial" w:eastAsia="Arial" w:cs="Arial"/>
+          <w:color w:val="000000"/>
+          <w:sz w:val="24"/>
+        </w:rPr>
+        <w:t xml:space="preserve">A combinação entre avaliação automática e especializada responde a limitações documentadas na literatura. Uma revisão de 142 estudos sobre avaliação humana de LLMs em saúde propõe que o processo explicite planejamento, implementação, adjudicação, pontuação e revisão, incluindo critérios de qualidade da informação, segurança e dano (TAM </w:t>
+      </w:r>
+      <w:r>
+        <w:rPr>
+          <w:rFonts w:ascii="Arial" w:hAnsi="Arial" w:eastAsia="Arial" w:cs="Arial"/>
+          <w:i w:val="1"/>
+          <w:iCs w:val="1"/>
+          <w:color w:val="000000"/>
+          <w:sz w:val="24"/>
+        </w:rPr>
+        <w:t>et al.</w:t>
+      </w:r>
+      <w:r>
+        <w:rPr>
+          <w:rFonts w:ascii="Arial" w:hAnsi="Arial" w:eastAsia="Arial" w:cs="Arial"/>
+          <w:color w:val="000000"/>
+          <w:sz w:val="24"/>
+        </w:rPr>
+        <w:t xml:space="preserve">, 2024). Em complemento, uma comparação entre julgadores automáticos e especialistas em simplificação de termos médicos identificou tendência de maior permissividade dos LLMs na avaliação da correção, o que justifica preservar o farmacêutico como referência nos cenários sensíveis (BUHNILA </w:t>
+      </w:r>
+      <w:r>
+        <w:rPr>
+          <w:rFonts w:ascii="Arial" w:hAnsi="Arial" w:eastAsia="Arial" w:cs="Arial"/>
+          <w:i w:val="1"/>
+          <w:iCs w:val="1"/>
+          <w:color w:val="000000"/>
+          <w:sz w:val="24"/>
+        </w:rPr>
+        <w:t>et al.</w:t>
+      </w:r>
+      <w:r>
+        <w:rPr>
+          <w:rFonts w:ascii="Arial" w:hAnsi="Arial" w:eastAsia="Arial" w:cs="Arial"/>
+          <w:color w:val="000000"/>
+          <w:sz w:val="24"/>
+        </w:rPr>
+        <w:t>, 2026).</w:t>
       </w:r>
     </w:p>
     <w:p>
@@ -10202,14 +10278,14 @@
               <a:graphicData uri="http://schemas.openxmlformats.org/drawingml/2006/picture">
                 <pic:pic>
                   <pic:nvPicPr>
-                    <pic:cNvPr id="0" name="avaliacao-hibrida.png"/>
+                    <pic:cNvPr id="0" name="image.png"/>
                     <pic:cNvPicPr/>
                   </pic:nvPicPr>
                   <pic:blipFill>
                     <a:blip r:embed="rId20">
                       <a:extLst>
                         <a:ext uri="{96DAC541-7B7A-43D3-8B79-37D633B846F1}">
-                          <ns3:svgBlip xmlns:ns3="http://schemas.microsoft.com/office/drawing/2016/SVG/main" r:embed="rId21"/>
+                          <ns3:svgBlip xmlns:ns3="http://schemas.microsoft.com/office/drawing/2016/SVG/main" r:embed="rId25"/>
                         </a:ext>
                       </a:extLst>
                     </a:blip>
@@ -13186,7 +13262,25 @@
           <w:color w:val="000000"/>
           <w:sz w:val="24"/>
         </w:rPr>
-        <w:t xml:space="preserve">FIP. </w:t>
+        <w:t xml:space="preserve">BUHNILA, Ioana </w:t>
+      </w:r>
+      <w:r>
+        <w:rPr>
+          <w:rFonts w:ascii="Arial" w:hAnsi="Arial" w:eastAsia="Arial" w:cs="Arial"/>
+          <w:i w:val="1"/>
+          <w:iCs w:val="1"/>
+          <w:color w:val="000000"/>
+          <w:sz w:val="24"/>
+        </w:rPr>
+        <w:t>et al.</w:t>
+      </w:r>
+      <w:r>
+        <w:rPr>
+          <w:rFonts w:ascii="Arial" w:hAnsi="Arial" w:eastAsia="Arial" w:cs="Arial"/>
+          <w:color w:val="000000"/>
+          <w:sz w:val="24"/>
+        </w:rPr>
+        <w:t xml:space="preserve"> Evaluating LLM-as-a-Judge for Medical Term Simplification. In: </w:t>
       </w:r>
       <w:r>
         <w:rPr>
@@ -13196,15 +13290,15 @@
           <w:color w:val="000000"/>
           <w:sz w:val="24"/>
         </w:rPr>
-        <w:t>An artificial intelligence toolkit for pharmacy: an introduction and resource guide for pharmacists</w:t>
-      </w:r>
-      <w:r>
-        <w:rPr>
-          <w:rFonts w:ascii="Arial" w:hAnsi="Arial" w:eastAsia="Arial" w:cs="Arial"/>
-          <w:color w:val="000000"/>
-          <w:sz w:val="24"/>
-        </w:rPr>
-        <w:t>. The Hague: International Pharmaceutical Federation, 2025. Disponível em: https://www.fip.org/file/6202. Acesso em: 30 mar. 2026.</w:t>
+        <w:t>BioNLP 2026</w:t>
+      </w:r>
+      <w:r>
+        <w:rPr>
+          <w:rFonts w:ascii="Arial" w:hAnsi="Arial" w:eastAsia="Arial" w:cs="Arial"/>
+          <w:color w:val="000000"/>
+          <w:sz w:val="24"/>
+        </w:rPr>
+        <w:t>. San Diego: Association for Computational Linguistics, 2026. p. 687-694. DOI: 10.18653/v1/2026.bionlp-1.55. Disponível em: https://aclanthology.org/2026.bionlp-1.55/. Acesso em: 28 ago. 2026.</w:t>
       </w:r>
     </w:p>
     <w:p>
@@ -13218,6 +13312,38 @@
           <w:color w:val="000000"/>
           <w:sz w:val="24"/>
         </w:rPr>
+        <w:t xml:space="preserve">FIP. </w:t>
+      </w:r>
+      <w:r>
+        <w:rPr>
+          <w:rFonts w:ascii="Arial" w:hAnsi="Arial" w:eastAsia="Arial" w:cs="Arial"/>
+          <w:b w:val="1"/>
+          <w:bCs w:val="1"/>
+          <w:color w:val="000000"/>
+          <w:sz w:val="24"/>
+        </w:rPr>
+        <w:t>An artificial intelligence toolkit for pharmacy: an introduction and resource guide for pharmacists</w:t>
+      </w:r>
+      <w:r>
+        <w:rPr>
+          <w:rFonts w:ascii="Arial" w:hAnsi="Arial" w:eastAsia="Arial" w:cs="Arial"/>
+          <w:color w:val="000000"/>
+          <w:sz w:val="24"/>
+        </w:rPr>
+        <w:t>. The Hague: International Pharmaceutical Federation, 2025. Disponível em: https://www.fip.org/file/6202. Acesso em: 30 mar. 2026.</w:t>
+      </w:r>
+    </w:p>
+    <w:p>
+      <w:pPr>
+        <w:pStyle w:val="ReferenceEntry"/>
+        <w:pageBreakBefore w:val="0"/>
+      </w:pPr>
+      <w:r>
+        <w:rPr>
+          <w:rFonts w:ascii="Arial" w:hAnsi="Arial" w:eastAsia="Arial" w:cs="Arial"/>
+          <w:color w:val="000000"/>
+          <w:sz w:val="24"/>
+        </w:rPr>
         <w:t xml:space="preserve">HAMMOND, Lewis </w:t>
       </w:r>
       <w:r>
@@ -13546,7 +13672,25 @@
           <w:color w:val="000000"/>
           <w:sz w:val="24"/>
         </w:rPr>
-        <w:t xml:space="preserve">PGEU. </w:t>
+        <w:t xml:space="preserve">PAIS, Cristobal </w:t>
+      </w:r>
+      <w:r>
+        <w:rPr>
+          <w:rFonts w:ascii="Arial" w:hAnsi="Arial" w:eastAsia="Arial" w:cs="Arial"/>
+          <w:i w:val="1"/>
+          <w:iCs w:val="1"/>
+          <w:color w:val="000000"/>
+          <w:sz w:val="24"/>
+        </w:rPr>
+        <w:t>et al.</w:t>
+      </w:r>
+      <w:r>
+        <w:rPr>
+          <w:rFonts w:ascii="Arial" w:hAnsi="Arial" w:eastAsia="Arial" w:cs="Arial"/>
+          <w:color w:val="000000"/>
+          <w:sz w:val="24"/>
+        </w:rPr>
+        <w:t xml:space="preserve"> Large language models for preventing medication direction errors in online pharmacies. </w:t>
       </w:r>
       <w:r>
         <w:rPr>
@@ -13556,15 +13700,15 @@
           <w:color w:val="000000"/>
           <w:sz w:val="24"/>
         </w:rPr>
-        <w:t>Position paper on artificial intelligence</w:t>
-      </w:r>
-      <w:r>
-        <w:rPr>
-          <w:rFonts w:ascii="Arial" w:hAnsi="Arial" w:eastAsia="Arial" w:cs="Arial"/>
-          <w:color w:val="000000"/>
-          <w:sz w:val="24"/>
-        </w:rPr>
-        <w:t>. Brussels: Pharmaceutical Group of the European Union, 2025. Disponível em: https://www.pgeu.eu/wp-content/uploads/2025/06/PGEU-Position-Paper-on-Artificial-Intelligence.pdf. Acesso em: 30 mar. 2026.</w:t>
+        <w:t>Nature Medicine</w:t>
+      </w:r>
+      <w:r>
+        <w:rPr>
+          <w:rFonts w:ascii="Arial" w:hAnsi="Arial" w:eastAsia="Arial" w:cs="Arial"/>
+          <w:color w:val="000000"/>
+          <w:sz w:val="24"/>
+        </w:rPr>
+        <w:t>, [S. l.], v. 30, p. 1574-1582, 2024. DOI: 10.1038/s41591-024-02933-8. Disponível em: https://doi.org/10.1038/s41591-024-02933-8. Acesso em: 28 ago. 2026.</w:t>
       </w:r>
     </w:p>
     <w:p>
@@ -13578,6 +13722,38 @@
           <w:color w:val="000000"/>
           <w:sz w:val="24"/>
         </w:rPr>
+        <w:t xml:space="preserve">PGEU. </w:t>
+      </w:r>
+      <w:r>
+        <w:rPr>
+          <w:rFonts w:ascii="Arial" w:hAnsi="Arial" w:eastAsia="Arial" w:cs="Arial"/>
+          <w:b w:val="1"/>
+          <w:bCs w:val="1"/>
+          <w:color w:val="000000"/>
+          <w:sz w:val="24"/>
+        </w:rPr>
+        <w:t>Position paper on artificial intelligence</w:t>
+      </w:r>
+      <w:r>
+        <w:rPr>
+          <w:rFonts w:ascii="Arial" w:hAnsi="Arial" w:eastAsia="Arial" w:cs="Arial"/>
+          <w:color w:val="000000"/>
+          <w:sz w:val="24"/>
+        </w:rPr>
+        <w:t>. Brussels: Pharmaceutical Group of the European Union, 2025. Disponível em: https://www.pgeu.eu/wp-content/uploads/2025/06/PGEU-Position-Paper-on-Artificial-Intelligence.pdf. Acesso em: 30 mar. 2026.</w:t>
+      </w:r>
+    </w:p>
+    <w:p>
+      <w:pPr>
+        <w:pStyle w:val="ReferenceEntry"/>
+        <w:pageBreakBefore w:val="0"/>
+      </w:pPr>
+      <w:r>
+        <w:rPr>
+          <w:rFonts w:ascii="Arial" w:hAnsi="Arial" w:eastAsia="Arial" w:cs="Arial"/>
+          <w:color w:val="000000"/>
+          <w:sz w:val="24"/>
+        </w:rPr>
         <w:t xml:space="preserve">PICCIALLI, Francesco </w:t>
       </w:r>
       <w:r>
@@ -13679,6 +13855,56 @@
           <w:sz w:val="24"/>
         </w:rPr>
         <w:t>. Stanford: Stanford Institute for Human-Centered Artificial Intelligence, 2025. Disponível em: https://hai.stanford.edu/ai-index. Acesso em: 30 mar. 2026.</w:t>
+      </w:r>
+    </w:p>
+    <w:p>
+      <w:pPr>
+        <w:pStyle w:val="ReferenceEntry"/>
+        <w:pageBreakBefore w:val="0"/>
+      </w:pPr>
+      <w:r>
+        <w:rPr>
+          <w:rFonts w:ascii="Arial" w:hAnsi="Arial" w:eastAsia="Arial" w:cs="Arial"/>
+          <w:color w:val="000000"/>
+          <w:sz w:val="24"/>
+        </w:rPr>
+        <w:t xml:space="preserve">TAM, Thomas Yu Chow </w:t>
+      </w:r>
+      <w:r>
+        <w:rPr>
+          <w:rFonts w:ascii="Arial" w:hAnsi="Arial" w:eastAsia="Arial" w:cs="Arial"/>
+          <w:i w:val="1"/>
+          <w:iCs w:val="1"/>
+          <w:color w:val="000000"/>
+          <w:sz w:val="24"/>
+        </w:rPr>
+        <w:t>et al.</w:t>
+      </w:r>
+      <w:r>
+        <w:rPr>
+          <w:rFonts w:ascii="Arial" w:hAnsi="Arial" w:eastAsia="Arial" w:cs="Arial"/>
+          <w:color w:val="000000"/>
+          <w:sz w:val="24"/>
+        </w:rPr>
+        <w:t xml:space="preserve"> A framework for human evaluation of large language models in healthcare derived from literature review. </w:t>
+      </w:r>
+      <w:r>
+        <w:rPr>
+          <w:rFonts w:ascii="Arial" w:hAnsi="Arial" w:eastAsia="Arial" w:cs="Arial"/>
+          <w:b w:val="1"/>
+          <w:bCs w:val="1"/>
+          <w:color w:val="000000"/>
+          <w:sz w:val="24"/>
+        </w:rPr>
+        <w:t>npj Digital Medicine</w:t>
+      </w:r>
+      <w:r>
+        <w:rPr>
+          <w:rFonts w:ascii="Arial" w:hAnsi="Arial" w:eastAsia="Arial" w:cs="Arial"/>
+          <w:color w:val="000000"/>
+          <w:sz w:val="24"/>
+        </w:rPr>
+        <w:t>, [S. l.], v. 7, art. 258, 2024. DOI: 10.1038/s41746-024-01258-7. Disponível em: https://doi.org/10.1038/s41746-024-01258-7. Acesso em: 28 ago. 2026.</w:t>
       </w:r>
     </w:p>
     <w:p>
@@ -26414,7 +26640,7 @@
         <w:tab w:pos="9071" w:val="right" w:leader="dot"/>
       </w:tabs>
       <w:spacing w:before="0" w:after="0" w:line="360" w:lineRule="auto"/>
-      <w:ind w:firstLine="0" w:left="0" w:right="0"/>
+      <w:ind w:left="0" w:right="0" w:firstLine="0"/>
       <w:jc w:val="left"/>
     </w:pPr>
     <w:rPr>

</xml_diff>

<commit_message>
docs(tcc): reconcile semantic evaluation status
</commit_message>
<xml_diff>
--- a/TCC/TCC_MAB_Facens_Ralph_10x.docx
+++ b/TCC/TCC_MAB_Facens_Ralph_10x.docx
@@ -2770,7 +2770,7 @@
             <w:u w:val="none"/>
             <w:sz w:val="24"/>
           </w:rPr>
-          <w:t>46</w:t>
+          <w:t>47</w:t>
         </w:r>
       </w:hyperlink>
     </w:p>
@@ -2810,7 +2810,7 @@
             <w:u w:val="none"/>
             <w:sz w:val="24"/>
           </w:rPr>
-          <w:t>46</w:t>
+          <w:t>47</w:t>
         </w:r>
       </w:hyperlink>
     </w:p>
@@ -2850,7 +2850,7 @@
             <w:u w:val="none"/>
             <w:sz w:val="24"/>
           </w:rPr>
-          <w:t>46</w:t>
+          <w:t>47</w:t>
         </w:r>
       </w:hyperlink>
     </w:p>
@@ -2890,7 +2890,7 @@
             <w:u w:val="none"/>
             <w:sz w:val="24"/>
           </w:rPr>
-          <w:t>46</w:t>
+          <w:t>47</w:t>
         </w:r>
       </w:hyperlink>
     </w:p>
@@ -2930,7 +2930,7 @@
             <w:u w:val="none"/>
             <w:sz w:val="24"/>
           </w:rPr>
-          <w:t>46</w:t>
+          <w:t>47</w:t>
         </w:r>
       </w:hyperlink>
     </w:p>
@@ -2970,7 +2970,7 @@
             <w:u w:val="none"/>
             <w:sz w:val="24"/>
           </w:rPr>
-          <w:t>47</w:t>
+          <w:t>48</w:t>
         </w:r>
       </w:hyperlink>
     </w:p>
@@ -3010,7 +3010,7 @@
             <w:u w:val="none"/>
             <w:sz w:val="24"/>
           </w:rPr>
-          <w:t>47</w:t>
+          <w:t>48</w:t>
         </w:r>
       </w:hyperlink>
     </w:p>
@@ -3050,7 +3050,7 @@
             <w:u w:val="none"/>
             <w:sz w:val="24"/>
           </w:rPr>
-          <w:t>47</w:t>
+          <w:t>48</w:t>
         </w:r>
       </w:hyperlink>
     </w:p>
@@ -3090,7 +3090,7 @@
             <w:u w:val="none"/>
             <w:sz w:val="24"/>
           </w:rPr>
-          <w:t>47</w:t>
+          <w:t>48</w:t>
         </w:r>
       </w:hyperlink>
     </w:p>
@@ -3130,7 +3130,7 @@
             <w:u w:val="none"/>
             <w:sz w:val="24"/>
           </w:rPr>
-          <w:t>48</w:t>
+          <w:t>49</w:t>
         </w:r>
       </w:hyperlink>
     </w:p>
@@ -3170,7 +3170,7 @@
             <w:u w:val="none"/>
             <w:sz w:val="24"/>
           </w:rPr>
-          <w:t>48</w:t>
+          <w:t>49</w:t>
         </w:r>
       </w:hyperlink>
     </w:p>
@@ -3210,7 +3210,7 @@
             <w:u w:val="none"/>
             <w:sz w:val="24"/>
           </w:rPr>
-          <w:t>48</w:t>
+          <w:t>49</w:t>
         </w:r>
       </w:hyperlink>
     </w:p>
@@ -3250,7 +3250,7 @@
             <w:u w:val="none"/>
             <w:sz w:val="24"/>
           </w:rPr>
-          <w:t>48</w:t>
+          <w:t>49</w:t>
         </w:r>
       </w:hyperlink>
     </w:p>
@@ -3290,7 +3290,7 @@
             <w:u w:val="none"/>
             <w:sz w:val="24"/>
           </w:rPr>
-          <w:t>49</w:t>
+          <w:t>50</w:t>
         </w:r>
       </w:hyperlink>
     </w:p>
@@ -12518,7 +12518,7 @@
           <w:color w:val="000000"/>
           <w:sz w:val="24"/>
         </w:rPr>
-        <w:t xml:space="preserve">. A avaliação semântica das respostas em modo </w:t>
+        <w:t xml:space="preserve">. A estratégia metodológica para avaliar semanticamente as respostas em modo </w:t>
       </w:r>
       <w:r>
         <w:rPr>
@@ -12536,7 +12536,25 @@
           <w:color w:val="000000"/>
           <w:sz w:val="24"/>
         </w:rPr>
-        <w:t xml:space="preserve"> permanece pendente da definição metodológica registrada na OQ-002; portanto, ela não é tratada como resultado implementado.</w:t>
+        <w:t xml:space="preserve"> já foi definida: </w:t>
+      </w:r>
+      <w:r>
+        <w:rPr>
+          <w:rFonts w:ascii="Arial" w:hAnsi="Arial" w:eastAsia="Arial" w:cs="Arial"/>
+          <w:color w:val="000000"/>
+          <w:sz w:val="24"/>
+          <w:i w:val="1"/>
+          <w:iCs w:val="1"/>
+        </w:rPr>
+        <w:t>LLM-as-Judge</w:t>
+      </w:r>
+      <w:r>
+        <w:rPr>
+          <w:rFonts w:ascii="Arial" w:hAnsi="Arial" w:eastAsia="Arial" w:cs="Arial"/>
+          <w:color w:val="000000"/>
+          <w:sz w:val="24"/>
+        </w:rPr>
+        <w:t xml:space="preserve"> em todas as respostas e avaliação humana cega conforme a amostragem descrita no protocolo. Contudo, essa camada não está implementada no harness atual, que não contém julgador automático nem pontuação pela rubrica. Sua aplicação depende do congelamento do modelo e da versão do julgador, da rubrica e do prompt de avaliação antes da coleta definitiva, conforme a OQ-005. Portanto, as verificações estruturais existentes não são tratadas como avaliação semântica nem como resultado experimental.</w:t>
       </w:r>
     </w:p>
     <w:p>

</xml_diff>

<commit_message>
docs(tcc): reposiciona estudo na comparação arquitetural
</commit_message>
<xml_diff>
--- a/TCC/TCC_MAB_Facens_Ralph_10x.docx
+++ b/TCC/TCC_MAB_Facens_Ralph_10x.docx
@@ -53,13 +53,7 @@
         <w:jc w:val="center"/>
       </w:pPr>
       <w:r>
-        <w:rPr>
-          <w:rFonts w:ascii="Arial" w:hAnsi="Arial"/>
-          <w:b/>
-          <w:i w:val="0"/>
-          <w:sz w:val="28"/>
-        </w:rPr>
-        <w:t>SISTEMA MULTIAGENTE PARA ATENDIMENTO INTELIGENTE EM FARMÁCIAS: UMA ANÁLISE COMPARATIVA DE ARQUITETURAS DE COORDENAÇÃO</w:t>
+        <w:t>COMPARAÇÃO DE ARQUITETURAS DE COORDENAÇÃO EM SISTEMAS MULTIAGENTES BASEADOS EM MODELOS DE LINGUAGEM: UM ESTUDO DE CASO NO ATENDIMENTO EM FARMÁCIAS</w:t>
       </w:r>
     </w:p>
     <w:p>
@@ -126,13 +120,7 @@
         <w:jc w:val="center"/>
       </w:pPr>
       <w:r>
-        <w:rPr>
-          <w:rFonts w:ascii="Arial" w:hAnsi="Arial"/>
-          <w:b/>
-          <w:i w:val="0"/>
-          <w:sz w:val="28"/>
-        </w:rPr>
-        <w:t>SISTEMA MULTIAGENTE PARA ATENDIMENTO INTELIGENTE EM FARMÁCIAS: UMA ANÁLISE COMPARATIVA DE ARQUITETURAS DE COORDENAÇÃO</w:t>
+        <w:t>COMPARAÇÃO DE ARQUITETURAS DE COORDENAÇÃO EM SISTEMAS MULTIAGENTES BASEADOS EM MODELOS DE LINGUAGEM: UM ESTUDO DE CASO NO ATENDIMENTO EM FARMÁCIAS</w:t>
       </w:r>
     </w:p>
     <w:p>
@@ -374,7 +362,7 @@
             <w:u w:val="none"/>
             <w:sz w:val="24"/>
           </w:rPr>
-          <w:t>30</w:t>
+          <w:t>32</w:t>
         </w:r>
       </w:hyperlink>
     </w:p>
@@ -414,7 +402,7 @@
             <w:u w:val="none"/>
             <w:sz w:val="24"/>
           </w:rPr>
-          <w:t>30</w:t>
+          <w:t>32</w:t>
         </w:r>
       </w:hyperlink>
     </w:p>
@@ -454,7 +442,7 @@
             <w:u w:val="none"/>
             <w:sz w:val="24"/>
           </w:rPr>
-          <w:t>32</w:t>
+          <w:t>34</w:t>
         </w:r>
       </w:hyperlink>
     </w:p>
@@ -494,7 +482,7 @@
             <w:u w:val="none"/>
             <w:sz w:val="24"/>
           </w:rPr>
-          <w:t>37</w:t>
+          <w:t>39</w:t>
         </w:r>
       </w:hyperlink>
     </w:p>
@@ -590,7 +578,7 @@
             <w:u w:val="none"/>
             <w:sz w:val="24"/>
           </w:rPr>
-          <w:t>13</w:t>
+          <w:t>14</w:t>
         </w:r>
       </w:hyperlink>
     </w:p>
@@ -630,7 +618,7 @@
             <w:u w:val="none"/>
             <w:sz w:val="24"/>
           </w:rPr>
-          <w:t>13</w:t>
+          <w:t>14</w:t>
         </w:r>
       </w:hyperlink>
     </w:p>
@@ -670,7 +658,7 @@
             <w:u w:val="none"/>
             <w:sz w:val="24"/>
           </w:rPr>
-          <w:t>13</w:t>
+          <w:t>14</w:t>
         </w:r>
       </w:hyperlink>
     </w:p>
@@ -710,7 +698,7 @@
             <w:u w:val="none"/>
             <w:sz w:val="24"/>
           </w:rPr>
-          <w:t>13</w:t>
+          <w:t>14</w:t>
         </w:r>
       </w:hyperlink>
     </w:p>
@@ -750,7 +738,7 @@
             <w:u w:val="none"/>
             <w:sz w:val="24"/>
           </w:rPr>
-          <w:t>13</w:t>
+          <w:t>14</w:t>
         </w:r>
       </w:hyperlink>
     </w:p>
@@ -790,7 +778,7 @@
             <w:u w:val="none"/>
             <w:sz w:val="24"/>
           </w:rPr>
-          <w:t>14</w:t>
+          <w:t>15</w:t>
         </w:r>
       </w:hyperlink>
     </w:p>
@@ -830,7 +818,7 @@
             <w:u w:val="none"/>
             <w:sz w:val="24"/>
           </w:rPr>
-          <w:t>14</w:t>
+          <w:t>15</w:t>
         </w:r>
       </w:hyperlink>
     </w:p>
@@ -870,7 +858,7 @@
             <w:u w:val="none"/>
             <w:sz w:val="24"/>
           </w:rPr>
-          <w:t>14</w:t>
+          <w:t>15</w:t>
         </w:r>
       </w:hyperlink>
     </w:p>
@@ -910,7 +898,7 @@
             <w:u w:val="none"/>
             <w:sz w:val="24"/>
           </w:rPr>
-          <w:t>14</w:t>
+          <w:t>15</w:t>
         </w:r>
       </w:hyperlink>
     </w:p>
@@ -970,7 +958,7 @@
             <w:u w:val="none"/>
             <w:sz w:val="24"/>
           </w:rPr>
-          <w:t>15</w:t>
+          <w:t>16</w:t>
         </w:r>
       </w:hyperlink>
     </w:p>
@@ -1010,7 +998,7 @@
             <w:u w:val="none"/>
             <w:sz w:val="24"/>
           </w:rPr>
-          <w:t>15</w:t>
+          <w:t>16</w:t>
         </w:r>
       </w:hyperlink>
     </w:p>
@@ -1050,7 +1038,7 @@
             <w:u w:val="none"/>
             <w:sz w:val="24"/>
           </w:rPr>
-          <w:t>15</w:t>
+          <w:t>16</w:t>
         </w:r>
       </w:hyperlink>
     </w:p>
@@ -1090,7 +1078,7 @@
             <w:u w:val="none"/>
             <w:sz w:val="24"/>
           </w:rPr>
-          <w:t>15</w:t>
+          <w:t>16</w:t>
         </w:r>
       </w:hyperlink>
     </w:p>
@@ -1130,7 +1118,7 @@
             <w:u w:val="none"/>
             <w:sz w:val="24"/>
           </w:rPr>
-          <w:t>16</w:t>
+          <w:t>17</w:t>
         </w:r>
       </w:hyperlink>
     </w:p>
@@ -1170,7 +1158,7 @@
             <w:u w:val="none"/>
             <w:sz w:val="24"/>
           </w:rPr>
-          <w:t>16</w:t>
+          <w:t>17</w:t>
         </w:r>
       </w:hyperlink>
     </w:p>
@@ -1210,7 +1198,7 @@
             <w:u w:val="none"/>
             <w:sz w:val="24"/>
           </w:rPr>
-          <w:t>16</w:t>
+          <w:t>17</w:t>
         </w:r>
       </w:hyperlink>
     </w:p>
@@ -1250,7 +1238,7 @@
             <w:u w:val="none"/>
             <w:sz w:val="24"/>
           </w:rPr>
-          <w:t>16</w:t>
+          <w:t>17</w:t>
         </w:r>
       </w:hyperlink>
     </w:p>
@@ -1290,7 +1278,7 @@
             <w:u w:val="none"/>
             <w:sz w:val="24"/>
           </w:rPr>
-          <w:t>17</w:t>
+          <w:t>18</w:t>
         </w:r>
       </w:hyperlink>
     </w:p>
@@ -1330,7 +1318,7 @@
             <w:u w:val="none"/>
             <w:sz w:val="24"/>
           </w:rPr>
-          <w:t>17</w:t>
+          <w:t>18</w:t>
         </w:r>
       </w:hyperlink>
     </w:p>
@@ -1390,7 +1378,7 @@
             <w:u w:val="none"/>
             <w:sz w:val="24"/>
           </w:rPr>
-          <w:t>17</w:t>
+          <w:t>18</w:t>
         </w:r>
       </w:hyperlink>
     </w:p>
@@ -1450,7 +1438,7 @@
             <w:u w:val="none"/>
             <w:sz w:val="24"/>
           </w:rPr>
-          <w:t>17</w:t>
+          <w:t>18</w:t>
         </w:r>
       </w:hyperlink>
     </w:p>
@@ -1490,7 +1478,7 @@
             <w:u w:val="none"/>
             <w:sz w:val="24"/>
           </w:rPr>
-          <w:t>17</w:t>
+          <w:t>18</w:t>
         </w:r>
       </w:hyperlink>
     </w:p>
@@ -1530,7 +1518,7 @@
             <w:u w:val="none"/>
             <w:sz w:val="24"/>
           </w:rPr>
-          <w:t>20</w:t>
+          <w:t>21</w:t>
         </w:r>
       </w:hyperlink>
     </w:p>
@@ -1570,7 +1558,7 @@
             <w:u w:val="none"/>
             <w:sz w:val="24"/>
           </w:rPr>
-          <w:t>20</w:t>
+          <w:t>21</w:t>
         </w:r>
       </w:hyperlink>
     </w:p>
@@ -1610,7 +1598,7 @@
             <w:u w:val="none"/>
             <w:sz w:val="24"/>
           </w:rPr>
-          <w:t>21</w:t>
+          <w:t>22</w:t>
         </w:r>
       </w:hyperlink>
     </w:p>
@@ -1650,7 +1638,7 @@
             <w:u w:val="none"/>
             <w:sz w:val="24"/>
           </w:rPr>
-          <w:t>22</w:t>
+          <w:t>24</w:t>
         </w:r>
       </w:hyperlink>
     </w:p>
@@ -1690,7 +1678,7 @@
             <w:u w:val="none"/>
             <w:sz w:val="24"/>
           </w:rPr>
-          <w:t>24</w:t>
+          <w:t>27</w:t>
         </w:r>
       </w:hyperlink>
     </w:p>
@@ -1730,7 +1718,7 @@
             <w:u w:val="none"/>
             <w:sz w:val="24"/>
           </w:rPr>
-          <w:t>26</w:t>
+          <w:t>28</w:t>
         </w:r>
       </w:hyperlink>
     </w:p>
@@ -1770,7 +1758,7 @@
             <w:u w:val="none"/>
             <w:sz w:val="24"/>
           </w:rPr>
-          <w:t>26</w:t>
+          <w:t>28</w:t>
         </w:r>
       </w:hyperlink>
     </w:p>
@@ -1810,7 +1798,7 @@
             <w:u w:val="none"/>
             <w:sz w:val="24"/>
           </w:rPr>
-          <w:t>27</w:t>
+          <w:t>29</w:t>
         </w:r>
       </w:hyperlink>
     </w:p>
@@ -1850,7 +1838,7 @@
             <w:u w:val="none"/>
             <w:sz w:val="24"/>
           </w:rPr>
-          <w:t>28</w:t>
+          <w:t>30</w:t>
         </w:r>
       </w:hyperlink>
     </w:p>
@@ -1890,7 +1878,7 @@
             <w:u w:val="none"/>
             <w:sz w:val="24"/>
           </w:rPr>
-          <w:t>30</w:t>
+          <w:t>32</w:t>
         </w:r>
       </w:hyperlink>
     </w:p>
@@ -1930,7 +1918,7 @@
             <w:u w:val="none"/>
             <w:sz w:val="24"/>
           </w:rPr>
-          <w:t>31</w:t>
+          <w:t>33</w:t>
         </w:r>
       </w:hyperlink>
     </w:p>
@@ -1970,7 +1958,7 @@
             <w:u w:val="none"/>
             <w:sz w:val="24"/>
           </w:rPr>
-          <w:t>32</w:t>
+          <w:t>34</w:t>
         </w:r>
       </w:hyperlink>
     </w:p>
@@ -2010,7 +1998,7 @@
             <w:u w:val="none"/>
             <w:sz w:val="24"/>
           </w:rPr>
-          <w:t>33</w:t>
+          <w:t>35</w:t>
         </w:r>
       </w:hyperlink>
     </w:p>
@@ -2050,7 +2038,7 @@
             <w:u w:val="none"/>
             <w:sz w:val="24"/>
           </w:rPr>
-          <w:t>33</w:t>
+          <w:t>35</w:t>
         </w:r>
       </w:hyperlink>
     </w:p>
@@ -2090,7 +2078,7 @@
             <w:u w:val="none"/>
             <w:sz w:val="24"/>
           </w:rPr>
-          <w:t>34</w:t>
+          <w:t>36</w:t>
         </w:r>
       </w:hyperlink>
     </w:p>
@@ -2130,7 +2118,7 @@
             <w:u w:val="none"/>
             <w:sz w:val="24"/>
           </w:rPr>
-          <w:t>34</w:t>
+          <w:t>36</w:t>
         </w:r>
       </w:hyperlink>
     </w:p>
@@ -2170,7 +2158,7 @@
             <w:u w:val="none"/>
             <w:sz w:val="24"/>
           </w:rPr>
-          <w:t>34</w:t>
+          <w:t>36</w:t>
         </w:r>
       </w:hyperlink>
     </w:p>
@@ -2210,7 +2198,7 @@
             <w:u w:val="none"/>
             <w:sz w:val="24"/>
           </w:rPr>
-          <w:t>35</w:t>
+          <w:t>37</w:t>
         </w:r>
       </w:hyperlink>
     </w:p>
@@ -2250,7 +2238,7 @@
             <w:u w:val="none"/>
             <w:sz w:val="24"/>
           </w:rPr>
-          <w:t>37</w:t>
+          <w:t>39</w:t>
         </w:r>
       </w:hyperlink>
     </w:p>
@@ -2290,7 +2278,7 @@
             <w:u w:val="none"/>
             <w:sz w:val="24"/>
           </w:rPr>
-          <w:t>38</w:t>
+          <w:t>40</w:t>
         </w:r>
       </w:hyperlink>
     </w:p>
@@ -2330,7 +2318,7 @@
             <w:u w:val="none"/>
             <w:sz w:val="24"/>
           </w:rPr>
-          <w:t>39</w:t>
+          <w:t>41</w:t>
         </w:r>
       </w:hyperlink>
     </w:p>
@@ -2370,7 +2358,7 @@
             <w:u w:val="none"/>
             <w:sz w:val="24"/>
           </w:rPr>
-          <w:t>41</w:t>
+          <w:t>43</w:t>
         </w:r>
       </w:hyperlink>
     </w:p>
@@ -2410,7 +2398,7 @@
             <w:u w:val="none"/>
             <w:sz w:val="24"/>
           </w:rPr>
-          <w:t>41</w:t>
+          <w:t>43</w:t>
         </w:r>
       </w:hyperlink>
     </w:p>
@@ -2450,7 +2438,7 @@
             <w:u w:val="none"/>
             <w:sz w:val="24"/>
           </w:rPr>
-          <w:t>41</w:t>
+          <w:t>43</w:t>
         </w:r>
       </w:hyperlink>
     </w:p>
@@ -2490,7 +2478,7 @@
             <w:u w:val="none"/>
             <w:sz w:val="24"/>
           </w:rPr>
-          <w:t>41</w:t>
+          <w:t>43</w:t>
         </w:r>
       </w:hyperlink>
     </w:p>
@@ -2530,7 +2518,7 @@
             <w:u w:val="none"/>
             <w:sz w:val="24"/>
           </w:rPr>
-          <w:t>42</w:t>
+          <w:t>44</w:t>
         </w:r>
       </w:hyperlink>
     </w:p>
@@ -2570,7 +2558,7 @@
             <w:u w:val="none"/>
             <w:sz w:val="24"/>
           </w:rPr>
-          <w:t>43</w:t>
+          <w:t>45</w:t>
         </w:r>
       </w:hyperlink>
     </w:p>
@@ -2610,7 +2598,7 @@
             <w:u w:val="none"/>
             <w:sz w:val="24"/>
           </w:rPr>
-          <w:t>43</w:t>
+          <w:t>45</w:t>
         </w:r>
       </w:hyperlink>
     </w:p>
@@ -2650,7 +2638,7 @@
             <w:u w:val="none"/>
             <w:sz w:val="24"/>
           </w:rPr>
-          <w:t>43</w:t>
+          <w:t>45</w:t>
         </w:r>
       </w:hyperlink>
     </w:p>
@@ -2690,7 +2678,7 @@
             <w:u w:val="none"/>
             <w:sz w:val="24"/>
           </w:rPr>
-          <w:t>44</w:t>
+          <w:t>46</w:t>
         </w:r>
       </w:hyperlink>
     </w:p>
@@ -2730,7 +2718,7 @@
             <w:u w:val="none"/>
             <w:sz w:val="24"/>
           </w:rPr>
-          <w:t>44</w:t>
+          <w:t>46</w:t>
         </w:r>
       </w:hyperlink>
     </w:p>
@@ -2770,7 +2758,7 @@
             <w:u w:val="none"/>
             <w:sz w:val="24"/>
           </w:rPr>
-          <w:t>46</w:t>
+          <w:t>48</w:t>
         </w:r>
       </w:hyperlink>
     </w:p>
@@ -2810,7 +2798,7 @@
             <w:u w:val="none"/>
             <w:sz w:val="24"/>
           </w:rPr>
-          <w:t>46</w:t>
+          <w:t>48</w:t>
         </w:r>
       </w:hyperlink>
     </w:p>
@@ -2850,7 +2838,7 @@
             <w:u w:val="none"/>
             <w:sz w:val="24"/>
           </w:rPr>
-          <w:t>46</w:t>
+          <w:t>48</w:t>
         </w:r>
       </w:hyperlink>
     </w:p>
@@ -2890,7 +2878,7 @@
             <w:u w:val="none"/>
             <w:sz w:val="24"/>
           </w:rPr>
-          <w:t>46</w:t>
+          <w:t>48</w:t>
         </w:r>
       </w:hyperlink>
     </w:p>
@@ -2930,7 +2918,7 @@
             <w:u w:val="none"/>
             <w:sz w:val="24"/>
           </w:rPr>
-          <w:t>46</w:t>
+          <w:t>48</w:t>
         </w:r>
       </w:hyperlink>
     </w:p>
@@ -2970,7 +2958,7 @@
             <w:u w:val="none"/>
             <w:sz w:val="24"/>
           </w:rPr>
-          <w:t>47</w:t>
+          <w:t>49</w:t>
         </w:r>
       </w:hyperlink>
     </w:p>
@@ -3010,7 +2998,7 @@
             <w:u w:val="none"/>
             <w:sz w:val="24"/>
           </w:rPr>
-          <w:t>47</w:t>
+          <w:t>49</w:t>
         </w:r>
       </w:hyperlink>
     </w:p>
@@ -3050,7 +3038,7 @@
             <w:u w:val="none"/>
             <w:sz w:val="24"/>
           </w:rPr>
-          <w:t>47</w:t>
+          <w:t>49</w:t>
         </w:r>
       </w:hyperlink>
     </w:p>
@@ -3090,7 +3078,7 @@
             <w:u w:val="none"/>
             <w:sz w:val="24"/>
           </w:rPr>
-          <w:t>47</w:t>
+          <w:t>49</w:t>
         </w:r>
       </w:hyperlink>
     </w:p>
@@ -3130,7 +3118,7 @@
             <w:u w:val="none"/>
             <w:sz w:val="24"/>
           </w:rPr>
-          <w:t>48</w:t>
+          <w:t>50</w:t>
         </w:r>
       </w:hyperlink>
     </w:p>
@@ -3170,7 +3158,7 @@
             <w:u w:val="none"/>
             <w:sz w:val="24"/>
           </w:rPr>
-          <w:t>48</w:t>
+          <w:t>50</w:t>
         </w:r>
       </w:hyperlink>
     </w:p>
@@ -3210,7 +3198,7 @@
             <w:u w:val="none"/>
             <w:sz w:val="24"/>
           </w:rPr>
-          <w:t>48</w:t>
+          <w:t>50</w:t>
         </w:r>
       </w:hyperlink>
     </w:p>
@@ -3250,7 +3238,7 @@
             <w:u w:val="none"/>
             <w:sz w:val="24"/>
           </w:rPr>
-          <w:t>48</w:t>
+          <w:t>50</w:t>
         </w:r>
       </w:hyperlink>
     </w:p>
@@ -3290,7 +3278,7 @@
             <w:u w:val="none"/>
             <w:sz w:val="24"/>
           </w:rPr>
-          <w:t>49</w:t>
+          <w:t>51</w:t>
         </w:r>
       </w:hyperlink>
     </w:p>
@@ -3507,33 +3495,109 @@
           <w:color w:val="000000"/>
           <w:sz w:val="24"/>
         </w:rPr>
-        <w:t xml:space="preserve">Diante desse contexto, foi desenvolvido o MAB (multi agent </w:t>
-      </w:r>
-      <w:r>
-        <w:rPr>
-          <w:rFonts w:ascii="Arial" w:hAnsi="Arial" w:eastAsia="Arial" w:cs="Arial"/>
-          <w:color w:val="000000"/>
-          <w:sz w:val="24"/>
+        <w:t>Diante desse contexto, foi desenvolvido o MAB (</w:t>
+      </w:r>
+      <w:r>
+        <w:rPr>
+          <w:rFonts w:ascii="Arial" w:hAnsi="Arial" w:eastAsia="Arial" w:cs="Arial"/>
+          <w:i w:val="1"/>
+          <w:color w:val="000000"/>
+          <w:sz w:val="24"/>
+          <w:iCs w:val="1"/>
+        </w:rPr>
+        <w:t>multi-agent benchmark</w:t>
+      </w:r>
+      <w:r>
+        <w:rPr>
+          <w:rFonts w:ascii="Arial" w:hAnsi="Arial" w:eastAsia="Arial" w:cs="Arial"/>
+          <w:color w:val="000000"/>
+          <w:sz w:val="24"/>
+        </w:rPr>
+        <w:t xml:space="preserve">), uma plataforma experimental para comparar arquiteturas de coordenação em sistemas multiagentes baseados em modelos de linguagem. A proposta contempla três formas distintas de distribuir controle e responsabilidades entre agentes: orquestração centralizada, </w:t>
+      </w:r>
+      <w:r>
+        <w:rPr>
+          <w:rFonts w:ascii="Arial" w:hAnsi="Arial" w:eastAsia="Arial" w:cs="Arial"/>
+          <w:i w:val="1"/>
+          <w:color w:val="000000"/>
+          <w:sz w:val="24"/>
+          <w:iCs w:val="1"/>
+        </w:rPr>
+        <w:t>workflow</w:t>
+      </w:r>
+      <w:r>
+        <w:rPr>
+          <w:rFonts w:ascii="Arial" w:hAnsi="Arial" w:eastAsia="Arial" w:cs="Arial"/>
+          <w:color w:val="000000"/>
+          <w:sz w:val="24"/>
+        </w:rPr>
+        <w:t xml:space="preserve"> estruturado e organização descentralizada. O atendimento em farmácias foi escolhido como estudo de caso por reunir solicitações heterogêneas, uso de ferramentas, continuidade de contexto e situações que exigem encaminhamento humano; a aplicação delimita o ambiente empírico, mas não constitui o objeto principal da pesquisa.</w:t>
+      </w:r>
+    </w:p>
+    <w:p>
+      <w:pPr/>
+      <w:r>
+        <w:rPr>
+          <w:rFonts w:ascii="Arial" w:hAnsi="Arial" w:eastAsia="Arial" w:cs="Arial"/>
+          <w:color w:val="000000"/>
+          <w:sz w:val="24"/>
+        </w:rPr>
+        <w:t xml:space="preserve">Apesar dos avanços recentes em assistentes virtuais, agentes autônomos e aplicações de IA para atendimento, a definição da arquitetura de coordenação permanece como uma questão central de projeto. Em sistemas centralizados, podem surgir gargalos de supervisão e concentração decisória; em fluxos rígidos, pode haver perda de flexibilidade; em arranjos descentralizados, aumentam os desafios de controle, consistência e rastreabilidade. Assim, o problema investigado não é a automatização de uma farmácia específica, mas a forma como a distribuição do controle e da comunicação afeta o comportamento de um sistema multiagente quando as demais condições são mantidas constantes (LI </w:t>
+      </w:r>
+      <w:r>
+        <w:rPr>
+          <w:rFonts w:ascii="Arial" w:hAnsi="Arial" w:eastAsia="Arial" w:cs="Arial"/>
           <w:i w:val="1"/>
           <w:iCs w:val="1"/>
-        </w:rPr>
-        <w:t>benchmark</w:t>
-      </w:r>
-      <w:r>
-        <w:rPr>
-          <w:rFonts w:ascii="Arial" w:hAnsi="Arial" w:eastAsia="Arial" w:cs="Arial"/>
-          <w:color w:val="000000"/>
-          <w:sz w:val="24"/>
-        </w:rPr>
-        <w:t xml:space="preserve">), uma plataforma para comparação de sistemas multiagente, inicialmente aplicada no atendimento inteligente em farmácias, com foco na análise comparativa de diferentes arquiteturas de coordenação. A proposta contempla três abordagens distintas de coordenação entre agentes: orquestração centralizada, </w:t>
-      </w:r>
-      <w:r>
-        <w:rPr>
-          <w:rFonts w:ascii="Arial" w:hAnsi="Arial" w:eastAsia="Arial" w:cs="Arial"/>
-          <w:color w:val="000000"/>
-          <w:sz w:val="24"/>
+          <w:color w:val="000000"/>
+          <w:sz w:val="24"/>
+        </w:rPr>
+        <w:t>et al.</w:t>
+      </w:r>
+      <w:r>
+        <w:rPr>
+          <w:rFonts w:ascii="Arial" w:hAnsi="Arial" w:eastAsia="Arial" w:cs="Arial"/>
+          <w:color w:val="000000"/>
+          <w:sz w:val="24"/>
+        </w:rPr>
+        <w:t xml:space="preserve">, 2024; YU </w:t>
+      </w:r>
+      <w:r>
+        <w:rPr>
+          <w:rFonts w:ascii="Arial" w:hAnsi="Arial" w:eastAsia="Arial" w:cs="Arial"/>
           <w:i w:val="1"/>
           <w:iCs w:val="1"/>
+          <w:color w:val="000000"/>
+          <w:sz w:val="24"/>
+        </w:rPr>
+        <w:t>et al.</w:t>
+      </w:r>
+      <w:r>
+        <w:rPr>
+          <w:rFonts w:ascii="Arial" w:hAnsi="Arial" w:eastAsia="Arial" w:cs="Arial"/>
+          <w:color w:val="000000"/>
+          <w:sz w:val="24"/>
+        </w:rPr>
+        <w:t>, 2025).</w:t>
+      </w:r>
+    </w:p>
+    <w:p>
+      <w:pPr/>
+      <w:r>
+        <w:rPr>
+          <w:rFonts w:ascii="Arial" w:hAnsi="Arial" w:eastAsia="Arial" w:cs="Arial"/>
+          <w:color w:val="000000"/>
+          <w:sz w:val="24"/>
+        </w:rPr>
+        <w:t xml:space="preserve">A pergunta central da pesquisa é: como a escolha entre orquestração centralizada, </w:t>
+      </w:r>
+      <w:r>
+        <w:rPr>
+          <w:rFonts w:ascii="Arial" w:hAnsi="Arial" w:eastAsia="Arial" w:cs="Arial"/>
+          <w:i w:val="1"/>
+          <w:color w:val="000000"/>
+          <w:sz w:val="24"/>
+          <w:iCs w:val="1"/>
         </w:rPr>
         <w:t>workflow</w:t>
       </w:r>
@@ -3543,18 +3607,7 @@
           <w:color w:val="000000"/>
           <w:sz w:val="24"/>
         </w:rPr>
-        <w:t xml:space="preserve"> estruturado e organização descentralizada. A análise detalhada dessas arquiteturas é apresentada no referencial teórico.</w:t>
-      </w:r>
-    </w:p>
-    <w:p>
-      <w:pPr/>
-      <w:r>
-        <w:rPr>
-          <w:rFonts w:ascii="Arial" w:hAnsi="Arial" w:eastAsia="Arial" w:cs="Arial"/>
-          <w:color w:val="000000"/>
-          <w:sz w:val="24"/>
-        </w:rPr>
-        <w:t xml:space="preserve">Apesar dos avanços recentes em assistentes virtuais, agentes autônomos e aplicações de IA para atendimento, a definição da arquitetura de coordenação ainda permanece como uma questão central de projeto. Em sistemas excessivamente centralizados, podem surgir gargalos de supervisão e concentração decisória; em fluxos demasiadamente rígidos, pode haver perda de flexibilidade; por outro lado, em arranjos altamente descentralizados, aumentam os desafios de controle, consistência e rastreabilidade. Assim, o problema investigado neste trabalho não se restringe à automatização do atendimento em si, mas se concentra na análise de como a arquitetura de coordenação afeta desempenho, organização do fluxo e qualidade operacional em um ambiente de serviços farmacêuticos (LI </w:t>
+        <w:t xml:space="preserve"> estruturado e coordenação descentralizada influencia a eficiência operacional, a qualidade das respostas e o custo de coordenação de um sistema multiagente baseado em modelos de linguagem, quando as demais condições são mantidas constantes? A comparação observará tempo de resposta, distribuição de tarefas, sucesso técnico, uso de recursos, qualidade das respostas e necessidade de intervenção humana. O atendimento em farmácias fornecerá os cenários controlados para essa análise, sem pressupor que os resultados sejam automaticamente generalizáveis a qualquer domínio (LI </w:t>
       </w:r>
       <w:r>
         <w:rPr>
@@ -3572,7 +3625,7 @@
           <w:color w:val="000000"/>
           <w:sz w:val="24"/>
         </w:rPr>
-        <w:t xml:space="preserve">, 2024; YU </w:t>
+        <w:t xml:space="preserve">, 2024; PICCIALLI </w:t>
       </w:r>
       <w:r>
         <w:rPr>
@@ -3590,25 +3643,36 @@
           <w:color w:val="000000"/>
           <w:sz w:val="24"/>
         </w:rPr>
-        <w:t xml:space="preserve">, 2025; ALVAREZ </w:t>
+        <w:t>, 2025).</w:t>
+      </w:r>
+    </w:p>
+    <w:p>
+      <w:pPr/>
+      <w:r>
+        <w:rPr>
+          <w:rFonts w:ascii="Arial" w:hAnsi="Arial" w:eastAsia="Arial" w:cs="Arial"/>
+          <w:color w:val="000000"/>
+          <w:sz w:val="24"/>
+        </w:rPr>
+        <w:t xml:space="preserve">O objetivo geral desta pesquisa consiste em comparar, sob protocolo experimental controlado, os efeitos de três arquiteturas de coordenação em sistemas multiagentes baseados em modelos de linguagem, utilizando o atendimento em farmácias como estudo de caso. Como objetivos específicos, busca-se: caracterizar, na literatura, os mecanismos que distinguem coordenação centralizada, </w:t>
       </w:r>
       <w:r>
         <w:rPr>
           <w:rFonts w:ascii="Arial" w:hAnsi="Arial" w:eastAsia="Arial" w:cs="Arial"/>
           <w:i w:val="1"/>
+          <w:color w:val="000000"/>
+          <w:sz w:val="24"/>
           <w:iCs w:val="1"/>
-          <w:color w:val="000000"/>
-          <w:sz w:val="24"/>
-        </w:rPr>
-        <w:t>et al.</w:t>
-      </w:r>
-      <w:r>
-        <w:rPr>
-          <w:rFonts w:ascii="Arial" w:hAnsi="Arial" w:eastAsia="Arial" w:cs="Arial"/>
-          <w:color w:val="000000"/>
-          <w:sz w:val="24"/>
-        </w:rPr>
-        <w:t>, 2025).</w:t>
+        </w:rPr>
+        <w:t>workflow</w:t>
+      </w:r>
+      <w:r>
+        <w:rPr>
+          <w:rFonts w:ascii="Arial" w:hAnsi="Arial" w:eastAsia="Arial" w:cs="Arial"/>
+          <w:color w:val="000000"/>
+          <w:sz w:val="24"/>
+        </w:rPr>
+        <w:t xml:space="preserve"> e organização descentralizada; manter uma base funcional comum para executar as três estratégias; construir cenários equivalentes de atendimento que exijam roteamento, ferramentas, contexto e encaminhamento profissional; e avaliar comparativamente eficiência, coordenação, qualidade e segurança com métricas previamente definidas.</w:t>
       </w:r>
     </w:p>
     <w:p>
@@ -3619,79 +3683,36 @@
           <w:color w:val="000000"/>
           <w:sz w:val="24"/>
         </w:rPr>
-        <w:t xml:space="preserve">A problematização central da pesquisa consiste em investigar como diferentes arquiteturas multiagentes influenciam o desempenho de um sistema de atendimento em farmácias. Para isso, serão comparados modelos baseados em orquestração, </w:t>
-      </w:r>
-      <w:r>
-        <w:rPr>
-          <w:rFonts w:ascii="Arial" w:hAnsi="Arial" w:eastAsia="Arial" w:cs="Arial"/>
-          <w:color w:val="000000"/>
-          <w:sz w:val="24"/>
+        <w:t>A justificativa do trabalho está associada à sua relevância científica, tecnológica e aplicada. No plano científico, a pesquisa busca contribuir para a discussão sobre como decisões arquiteturais afetam sistemas multiagentes quando modelo, ferramentas, tarefas e critérios de avaliação permanecem controlados. No plano tecnológico, o protocolo pode oferecer critérios para selecionar estratégias de coordenação em outros ambientes de serviço, respeitados os limites de validade externa. No plano aplicado, o caso farmacêutico permite observar essas escolhas sob exigências de rastreabilidade, segurança e supervisão profissional (STANFORD HAI, 2025; MCKINSEY &amp; COMPANY, 2024a; PGEU, 2025; FIP, 2025).</w:t>
+      </w:r>
+    </w:p>
+    <w:p>
+      <w:pPr/>
+      <w:r>
+        <w:rPr>
+          <w:rFonts w:ascii="Arial" w:hAnsi="Arial" w:eastAsia="Arial" w:cs="Arial"/>
+          <w:color w:val="000000"/>
+          <w:sz w:val="24"/>
+        </w:rPr>
+        <w:t xml:space="preserve">Quanto à metodologia, está sendo realizada uma pesquisa bibliográfica e experimental, com estudo de caso instrumental no atendimento em farmácias. O levantamento teórico abrange sistemas multiagentes, arquiteturas de coordenação, </w:t>
+      </w:r>
+      <w:r>
+        <w:rPr>
+          <w:rFonts w:ascii="Arial" w:hAnsi="Arial" w:eastAsia="Arial" w:cs="Arial"/>
           <w:i w:val="1"/>
+          <w:color w:val="000000"/>
+          <w:sz w:val="24"/>
           <w:iCs w:val="1"/>
         </w:rPr>
-        <w:t>workflow</w:t>
-      </w:r>
-      <w:r>
-        <w:rPr>
-          <w:rFonts w:ascii="Arial" w:hAnsi="Arial" w:eastAsia="Arial" w:cs="Arial"/>
-          <w:color w:val="000000"/>
-          <w:sz w:val="24"/>
-        </w:rPr>
-        <w:t xml:space="preserve"> e </w:t>
-      </w:r>
-      <w:r>
-        <w:rPr>
-          <w:rFonts w:ascii="Arial" w:hAnsi="Arial" w:eastAsia="Arial" w:cs="Arial"/>
-          <w:color w:val="000000"/>
-          <w:sz w:val="24"/>
-          <w:i w:val="1"/>
-          <w:iCs w:val="1"/>
-        </w:rPr>
-        <w:t>swarm</w:t>
-      </w:r>
-      <w:r>
-        <w:rPr>
-          <w:rFonts w:ascii="Arial" w:hAnsi="Arial" w:eastAsia="Arial" w:cs="Arial"/>
-          <w:color w:val="000000"/>
-          <w:sz w:val="24"/>
-        </w:rPr>
-        <w:t xml:space="preserve">, com observação do tempo de resposta, da distribuição de tarefas entre agentes, da taxa de sucesso técnico, do uso de recursos, da qualidade das respostas e da necessidade de intervenção humana. Nessa perspectiva, a arquitetura de coordenação é tratada não como mero detalhe técnico, mas como elemento capaz de alterar o comportamento global do sistema (LI </w:t>
-      </w:r>
-      <w:r>
-        <w:rPr>
-          <w:rFonts w:ascii="Arial" w:hAnsi="Arial" w:eastAsia="Arial" w:cs="Arial"/>
-          <w:i w:val="1"/>
-          <w:iCs w:val="1"/>
-          <w:color w:val="000000"/>
-          <w:sz w:val="24"/>
-        </w:rPr>
-        <w:t>et al.</w:t>
-      </w:r>
-      <w:r>
-        <w:rPr>
-          <w:rFonts w:ascii="Arial" w:hAnsi="Arial" w:eastAsia="Arial" w:cs="Arial"/>
-          <w:color w:val="000000"/>
-          <w:sz w:val="24"/>
-        </w:rPr>
-        <w:t xml:space="preserve">, 2024; PICCIALLI </w:t>
-      </w:r>
-      <w:r>
-        <w:rPr>
-          <w:rFonts w:ascii="Arial" w:hAnsi="Arial" w:eastAsia="Arial" w:cs="Arial"/>
-          <w:i w:val="1"/>
-          <w:iCs w:val="1"/>
-          <w:color w:val="000000"/>
-          <w:sz w:val="24"/>
-        </w:rPr>
-        <w:t>et al.</w:t>
-      </w:r>
-      <w:r>
-        <w:rPr>
-          <w:rFonts w:ascii="Arial" w:hAnsi="Arial" w:eastAsia="Arial" w:cs="Arial"/>
-          <w:color w:val="000000"/>
-          <w:sz w:val="24"/>
-        </w:rPr>
-        <w:t>, 2025).</w:t>
+        <w:t>workflows</w:t>
+      </w:r>
+      <w:r>
+        <w:rPr>
+          <w:rFonts w:ascii="Arial" w:hAnsi="Arial" w:eastAsia="Arial" w:cs="Arial"/>
+          <w:color w:val="000000"/>
+          <w:sz w:val="24"/>
+        </w:rPr>
+        <w:t xml:space="preserve"> de agentes, avaliação comparativa e, de forma complementar, IA aplicada ao atendimento farmacêutico. Foi modelada e implementada uma base experimental comum, composta por ponto de entrada das solicitações, agentes especializados, ferramentas, integração com serviços externos e possibilidade de supervisão humana. Os experimentos ainda serão conduzidos após o congelamento do protocolo, utilizando métricas de eficiência, coordenação, qualidade e necessidade de intervenção humana.</w:t>
       </w:r>
     </w:p>
     <w:p>
@@ -3702,58 +3723,7 @@
           <w:color w:val="000000"/>
           <w:sz w:val="24"/>
         </w:rPr>
-        <w:t>O objetivo geral desta pesquisa consiste em desenvolver um sistema multiagente para atendimento inteligente em farmácias e comparar, em ambiente experimental, diferentes arquiteturas de coordenação entre agentes. Como objetivos específicos, busca-se: levantar o estado da arte sobre inteligência artificial aplicada ao atendimento e sobre sistemas multiagentes; modelar uma arquitetura capaz de comportar diferentes estratégias de coordenação; construir um protótipo funcional para simulação de cenários de atendimento farmacêutico; e avaliar comparativamente os modelos adotados com base em métricas de desempenho previamente definidas.</w:t>
-      </w:r>
-    </w:p>
-    <w:p>
-      <w:pPr/>
-      <w:r>
-        <w:rPr>
-          <w:rFonts w:ascii="Arial" w:hAnsi="Arial" w:eastAsia="Arial" w:cs="Arial"/>
-          <w:color w:val="000000"/>
-          <w:sz w:val="24"/>
-        </w:rPr>
-        <w:t>A justificativa do trabalho está associada à sua relevância científica, tecnológica e aplicada. No plano científico, a pesquisa busca contribuir para a discussão sobre arquiteturas multiagentes em contextos reais de serviço, especialmente em um domínio no qual a comparação entre estratégias de coordenação ainda aparece de forma limitada. No plano aplicado, os resultados poderão oferecer subsídios para o desenvolvimento de soluções mais eficientes no setor farmacêutico, sem substituir a tomada de decisão profissional (STANFORD HAI, 2025; MCKINSEY &amp; COMPANY, 2024a; PGEU, 2025; FIP, 2025).</w:t>
-      </w:r>
-    </w:p>
-    <w:p>
-      <w:pPr/>
-      <w:r>
-        <w:rPr>
-          <w:rFonts w:ascii="Arial" w:hAnsi="Arial" w:eastAsia="Arial" w:cs="Arial"/>
-          <w:color w:val="000000"/>
-          <w:sz w:val="24"/>
-        </w:rPr>
-        <w:t xml:space="preserve">Quanto à metodologia, está sendo realizada uma pesquisa bibliográfica e experimental. O levantamento teórico abrange inteligência artificial, sistemas multiagentes, arquiteturas de coordenação, </w:t>
-      </w:r>
-      <w:r>
-        <w:rPr>
-          <w:rFonts w:ascii="Arial" w:hAnsi="Arial" w:eastAsia="Arial" w:cs="Arial"/>
-          <w:color w:val="000000"/>
-          <w:sz w:val="24"/>
-          <w:i w:val="1"/>
-          <w:iCs w:val="1"/>
-        </w:rPr>
-        <w:t>workflows</w:t>
-      </w:r>
-      <w:r>
-        <w:rPr>
-          <w:rFonts w:ascii="Arial" w:hAnsi="Arial" w:eastAsia="Arial" w:cs="Arial"/>
-          <w:color w:val="000000"/>
-          <w:sz w:val="24"/>
-        </w:rPr>
-        <w:t xml:space="preserve"> de agentes e aplicações de IA no contexto farmacêutico. Em seguida, foi modelada e implementada uma arquitetura experimental composta por ponto de entrada das solicitações, agentes especializados, ferramentas, integração com serviços externos e possibilidade de supervisão humana. Os experimentos comparativos ainda serão conduzidos após o congelamento do protocolo, utilizando métricas de eficiência, coordenação, qualidade e necessidade de intervenção humana.</w:t>
-      </w:r>
-    </w:p>
-    <w:p>
-      <w:pPr/>
-      <w:r>
-        <w:rPr>
-          <w:rFonts w:ascii="Arial" w:hAnsi="Arial" w:eastAsia="Arial" w:cs="Arial"/>
-          <w:color w:val="000000"/>
-          <w:sz w:val="24"/>
-        </w:rPr>
-        <w:t>Por fim, esta monografia organiza-se de modo a apresentar, de forma progressiva, os fundamentos, o desenvolvimento e a avaliação da proposta. Após esta introdução, o capítulo seguinte apresenta o referencial teórico sobre inteligência artificial, sistemas multiagentes, arquiteturas de coordenação e atendimento automatizado. Na sequência, são descritos a metodologia adotada, a modelagem da arquitetura e o protótipo experimental. Os capítulos de resultados, discussão e considerações finais permanecem reservados até a obtenção e validação das evidências experimentais.</w:t>
+        <w:t>Por fim, esta monografia organiza-se de modo a apresentar, de forma progressiva, os fundamentos, o desenvolvimento e a avaliação da proposta. Após esta introdução, o capítulo seguinte apresenta o referencial teórico sobre atendimento, inteligência artificial, agentes e arquiteturas de coordenação. O Capítulo 3 analisa prioritariamente comparações arquiteturais e utiliza trabalhos farmacêuticos para delimitar o estudo de caso. Na sequência, são descritos a metodologia, a modelagem da solução e o protótipo experimental. Os capítulos de resultados, discussão e considerações finais permanecem reservados até a obtenção e a validação das evidências experimentais.</w:t>
       </w:r>
     </w:p>
     <w:p>
@@ -5036,7 +5006,7 @@
           <w:color w:val="000000"/>
           <w:sz w:val="24"/>
         </w:rPr>
-        <w:t>Este capítulo analisa trabalhos que se aproximam do problema investigado sob dois eixos complementares: a automação de serviços farmacêuticos e de saúde com modelos de linguagem; e o emprego de sistemas multiagentes em tarefas que exigem especialização, coordenação e controle. A seleção prioriza estudos revisados por pares, publicados em fontes primárias e com descrição suficiente da arquitetura ou do método de avaliação. Revisões amplas permanecem na fundamentação teórica, enquanto esta seção concentra soluções comparáveis ao objeto da pesquisa.</w:t>
+        <w:t>Este capítulo examina trabalhos relacionados a partir do objeto central desta pesquisa: a comparação de arquiteturas de coordenação em sistemas multiagentes baseados em modelos de linguagem. O atendimento em farmácias é tratado como estudo de caso experimental, e não como o limite conceitual do trabalho. Por isso, a seleção dá precedência a estudos que tornam observáveis a topologia, a distribuição de controle, os mecanismos de interação, o custo de coordenação ou o efeito da arquitetura sobre o desempenho. Aplicações farmacêuticas e de saúde são mantidas em um eixo complementar, destinado a justificar as características e as restrições do cenário empírico.</w:t>
       </w:r>
     </w:p>
     <w:p>
@@ -5047,7 +5017,7 @@
           <w:color w:val="000000"/>
           <w:sz w:val="24"/>
         </w:rPr>
-        <w:t>A comparação considera quatro aspectos: domínio e tarefa; forma de decomposição ou coordenação; estratégia de avaliação; e distância em relação ao MAB. Esse recorte evita equiparar sistemas apenas porque utilizam LLMs ou múltiplos componentes. Um sistema pode ser relevante por operar no domínio farmacêutico, mas não comparar arquiteturas; outro pode estudar coordenação de agentes de forma rigorosa, porém fora do contexto de farmácias. A contribuição de cada trabalho é analisada dentro desses limites.</w:t>
+        <w:t>Foram priorizados artigos revisados por pares e fontes primárias com descrição verificável do sistema e da avaliação. A análise distingue três níveis que frequentemente aparecem misturados na literatura: o domínio da tarefa; os componentes empregados, como agentes, ferramentas e memória; e a estratégia de coordenação que define como decisões, contexto e responsabilidades circulam entre os agentes. Essa separação é necessária porque utilizar vários agentes não equivale, por si só, a comparar arquiteturas.</w:t>
       </w:r>
     </w:p>
     <w:p>
@@ -5098,7 +5068,7 @@
           <w:color w:val="000000"/>
           <w:sz w:val="24"/>
         </w:rPr>
-        <w:t xml:space="preserve"> (2024) desenvolveram o MEDIC para identificar e corrigir instruções de uso de medicamentos potencialmente incorretas em farmácias on-line. A solução combina um modelo ajustado com lógica farmacêutica explícita, salvaguardas e ciclos de revisão por farmacêuticos. O estudo é especialmente relevante por tratar uma aplicação real de alto risco e por não reduzir a qualidade à fluência da resposta: conhecimento do domínio, regras de segurança e validação profissional integram o desenho do sistema. Entretanto, o MEDIC é uma solução especializada para instruções de medicamentos e não compara formas de coordenação entre agentes.</w:t>
+        <w:t xml:space="preserve"> (2024) apresentam o MEDIC, sistema voltado à identificação e à correção de instruções potencialmente incorretas sobre o uso de medicamentos em farmácias on-line. A solução combina um modelo ajustado, lógica farmacêutica explícita, salvaguardas e ciclos de revisão por farmacêuticos. O estudo é relevante para o caso farmacêutico porque demonstra que qualidade nesse domínio não pode ser reduzida à fluência textual: conhecimento especializado, prevenção de dano e validação profissional integram o próprio desenho do sistema. Sua contribuição, entretanto, está na segurança de uma solução especializada, não na comparação entre estratégias multiagentes de coordenação.</w:t>
       </w:r>
     </w:p>
     <w:p>
@@ -5109,43 +5079,54 @@
           <w:color w:val="000000"/>
           <w:sz w:val="24"/>
         </w:rPr>
-        <w:t xml:space="preserve">Jagatap, Merugu e Comar (2025) apresentam o RxLens, sistema implantado para converter prescrições em carrinhos de compra em farmácias digitais. O fluxo encadeia supressão de informações pessoais, reconhecimento óptico de caracteres, extração de medicamentos, recuperação em catálogo e rastreabilidade por caixas delimitadoras. O trabalho demonstra que tarefas farmacêuticas podem ser decompostas em etapas verificáveis e que a avaliação automática deve ser confrontada com julgamentos humanos. Apesar do título empregar o termo multiagente, a contribuição central é um </w:t>
-      </w:r>
-      <w:r>
-        <w:rPr>
-          <w:rFonts w:ascii="Arial" w:hAnsi="Arial" w:eastAsia="Arial" w:cs="Arial"/>
-          <w:color w:val="000000"/>
-          <w:sz w:val="24"/>
+        <w:t xml:space="preserve">Jagatap, Merugu e Comar (2025) descrevem o RxLens, sistema implantado para transformar prescrições em carrinhos de compra em farmácias digitais. O processamento encadeia supressão de informações pessoais, reconhecimento óptico de caracteres, extração de medicamentos, recuperação em catálogo e rastreabilidade por caixas delimitadoras. Embora o trabalho empregue o termo multiagente, sua estrutura corresponde principalmente a um </w:t>
+      </w:r>
+      <w:r>
+        <w:rPr>
+          <w:rFonts w:ascii="Arial" w:hAnsi="Arial" w:eastAsia="Arial" w:cs="Arial"/>
+          <w:i w:val="1"/>
+          <w:color w:val="000000"/>
+          <w:sz w:val="24"/>
+          <w:iCs w:val="1"/>
+        </w:rPr>
+        <w:t>pipeline</w:t>
+      </w:r>
+      <w:r>
+        <w:rPr>
+          <w:rFonts w:ascii="Arial" w:hAnsi="Arial" w:eastAsia="Arial" w:cs="Arial"/>
+          <w:color w:val="000000"/>
+          <w:sz w:val="24"/>
+        </w:rPr>
+        <w:t xml:space="preserve"> especializado. Assim, o RxLens evidencia a importância de decomposição, uso de ferramentas e rastreabilidade, mas não isola o efeito de diferentes formas de distribuir controle entre os componentes.</w:t>
+      </w:r>
+    </w:p>
+    <w:p>
+      <w:pPr/>
+      <w:r>
+        <w:rPr>
+          <w:rFonts w:ascii="Arial" w:hAnsi="Arial" w:eastAsia="Arial" w:cs="Arial"/>
+          <w:color w:val="000000"/>
+          <w:sz w:val="24"/>
+        </w:rPr>
+        <w:t xml:space="preserve">Lu </w:t>
+      </w:r>
+      <w:r>
+        <w:rPr>
+          <w:rFonts w:ascii="Arial" w:hAnsi="Arial" w:eastAsia="Arial" w:cs="Arial"/>
           <w:i w:val="1"/>
           <w:iCs w:val="1"/>
-        </w:rPr>
-        <w:t>pipeline</w:t>
-      </w:r>
-      <w:r>
-        <w:rPr>
-          <w:rFonts w:ascii="Arial" w:hAnsi="Arial" w:eastAsia="Arial" w:cs="Arial"/>
-          <w:color w:val="000000"/>
-          <w:sz w:val="24"/>
-        </w:rPr>
-        <w:t xml:space="preserve"> especializado; não há comparação controlada entre orquestração, </w:t>
-      </w:r>
-      <w:r>
-        <w:rPr>
-          <w:rFonts w:ascii="Arial" w:hAnsi="Arial" w:eastAsia="Arial" w:cs="Arial"/>
-          <w:color w:val="000000"/>
-          <w:sz w:val="24"/>
-          <w:i w:val="1"/>
-          <w:iCs w:val="1"/>
-        </w:rPr>
-        <w:t>workflow</w:t>
-      </w:r>
-      <w:r>
-        <w:rPr>
-          <w:rFonts w:ascii="Arial" w:hAnsi="Arial" w:eastAsia="Arial" w:cs="Arial"/>
-          <w:color w:val="000000"/>
-          <w:sz w:val="24"/>
-        </w:rPr>
-        <w:t xml:space="preserve"> e coordenação descentralizada.</w:t>
+          <w:color w:val="000000"/>
+          <w:sz w:val="24"/>
+        </w:rPr>
+        <w:t>et al.</w:t>
+      </w:r>
+      <w:r>
+        <w:rPr>
+          <w:rFonts w:ascii="Arial" w:hAnsi="Arial" w:eastAsia="Arial" w:cs="Arial"/>
+          <w:color w:val="000000"/>
+          <w:sz w:val="24"/>
+        </w:rPr>
+        <w:t xml:space="preserve"> (2024) propõem o TriageAgent para triagem clínica com agentes heterogêneos, discussões em múltiplas rodadas, estimativas de autoconfiança, recuperação de conhecimento e encerramento antecipado. O estudo aproxima coordenação multiagente e atendimento em um domínio sensível, além de explicitar mecanismos de colaboração e parada. Ainda assim, a avaliação confronta uma arquitetura proposta com métodos de referência; não submete arquiteturas centralizadas, sequenciais e descentralizadas ao mesmo conjunto de condições controladas.</w:t>
       </w:r>
     </w:p>
     <w:p>
@@ -5156,36 +5137,7 @@
           <w:color w:val="000000"/>
           <w:sz w:val="24"/>
         </w:rPr>
-        <w:t xml:space="preserve">Dou </w:t>
-      </w:r>
-      <w:r>
-        <w:rPr>
-          <w:rFonts w:ascii="Arial" w:hAnsi="Arial" w:eastAsia="Arial" w:cs="Arial"/>
-          <w:i w:val="1"/>
-          <w:iCs w:val="1"/>
-          <w:color w:val="000000"/>
-          <w:sz w:val="24"/>
-        </w:rPr>
-        <w:t>et al.</w:t>
-      </w:r>
-      <w:r>
-        <w:rPr>
-          <w:rFonts w:ascii="Arial" w:hAnsi="Arial" w:eastAsia="Arial" w:cs="Arial"/>
-          <w:color w:val="000000"/>
-          <w:sz w:val="24"/>
-        </w:rPr>
-        <w:t xml:space="preserve"> (2025) propõem o ShennongMGS, sistema de orientação sobre medicamentos em língua chinesa que integra informações heterogêneas em um grafo de conhecimento e utiliza um LLM especializado para orientação medicamentosa e previsão de reações adversas. A avaliação envolve profissionais de saúde e especialistas em IA, o que reforça a necessidade de conhecimento estruturado e supervisão especializada em aplicações sensíveis. Sua proximidade com o tema está no atendimento sobre medicamentos; sua limitação para esta pesquisa é concentrar-se na especialização do modelo e da base de conhecimento, e não na arquitetura de coordenação.</w:t>
-      </w:r>
-    </w:p>
-    <w:p>
-      <w:pPr/>
-      <w:r>
-        <w:rPr>
-          <w:rFonts w:ascii="Arial" w:hAnsi="Arial" w:eastAsia="Arial" w:cs="Arial"/>
-          <w:color w:val="000000"/>
-          <w:sz w:val="24"/>
-        </w:rPr>
-        <w:t>Em conjunto, esses estudos mostram que a automação farmacêutica exige decomposição de tarefas, evidência rastreável, mecanismos de segurança e participação profissional. Eles sustentam o domínio e os critérios de qualidade do MAB, mas não respondem à pergunta arquitetural desta pesquisa: como diferentes estratégias de coordenação se comportam quando submetidas aos mesmos cenários de atendimento.</w:t>
+        <w:t>Esses três trabalhos não constituem o núcleo comparativo da pesquisa, mas delimitam requisitos do estudo de caso: heterogeneidade das solicitações, decomposição de tarefas, rastreabilidade, salvaguardas e encaminhamento profissional. O atendimento em farmácias funciona, portanto, como ambiente empírico no qual as arquiteturas serão observadas sob demandas operacionais e de segurança, sem que a aplicação seja confundida com o objeto principal da investigação.</w:t>
       </w:r>
     </w:p>
     <w:p>
@@ -5218,18 +5170,7 @@
           <w:color w:val="000000"/>
           <w:sz w:val="24"/>
         </w:rPr>
-        <w:t>Pandey, Amod e Kumar (2024) investigam um sistema multiagente para automatizar a justificativa de necessidade médica em processos de autorização prévia. Agentes especializados dividem a comparação entre prontuários e diretrizes clínicas em subtarefas, produzindo julgamentos acompanhados de evidências. O estudo aproxima sistemas multiagentes de um fluxo real de saúde e evidencia o valor da especialização e da explicabilidade. Contudo, avalia estratégias de prompting e modelos, não arquiteturas alternativas de coordenação sob o mesmo protocolo.</w:t>
-      </w:r>
-    </w:p>
-    <w:p>
-      <w:pPr/>
-      <w:r>
-        <w:rPr>
-          <w:rFonts w:ascii="Arial" w:hAnsi="Arial" w:eastAsia="Arial" w:cs="Arial"/>
-          <w:color w:val="000000"/>
-          <w:sz w:val="24"/>
-        </w:rPr>
-        <w:t xml:space="preserve">Lu </w:t>
+        <w:t xml:space="preserve">Kim </w:t>
       </w:r>
       <w:r>
         <w:rPr>
@@ -5247,7 +5188,7 @@
           <w:color w:val="000000"/>
           <w:sz w:val="24"/>
         </w:rPr>
-        <w:t xml:space="preserve"> (2024) apresentam o TriageAgent, estrutura heterogênea para triagem clínica. Os agentes assumem papéis distintos, participam de discussões em múltiplas rodadas e utilizam autoconfiança, encerramento antecipado e recuperação de conhecimento a partir do Emergency Severity Index. O trabalho é relevante porque torna explícitos mecanismos de colaboração e parada em um domínio sensível. Ainda assim, avalia uma arquitetura proposta contra métodos de referência, em vez de isolar o efeito de diferentes topologias de coordenação.</w:t>
+        <w:t xml:space="preserve"> (2026) realizam a comparação mais diretamente alinhada à pergunta desta pesquisa. Os autores avaliam configurações de agente único, agentes independentes e arquiteturas centralizadas, descentralizadas e híbridas, controlando diferentes modelos e classes de tarefa. O estudo demonstra que os benefícios da colaboração não são universais: dependem da decomponibilidade da tarefa, da capacidade do modelo e do custo introduzido pela coordenação. Essa conclusão sustenta a necessidade de avaliar arquiteturas sob condições equivalentes, em vez de presumir que maior distribuição ou maior número de agentes implica melhor desempenho.</w:t>
       </w:r>
     </w:p>
     <w:p>
@@ -5276,43 +5217,136 @@
           <w:color w:val="000000"/>
           <w:sz w:val="24"/>
         </w:rPr>
-        <w:t xml:space="preserve"> (2025) deslocam a análise do nome dos frameworks para os mecanismos concretos de colaboração. Os autores organizam as estratégias em governança, controle de participação, dinâmica de interação e gestão do histórico, relacionando essas dimensões à qualidade da tarefa e à eficiência computacional. Essa operacionalização é diretamente útil ao MAB, pois permite descrever orquestração, </w:t>
-      </w:r>
-      <w:r>
-        <w:rPr>
-          <w:rFonts w:ascii="Arial" w:hAnsi="Arial" w:eastAsia="Arial" w:cs="Arial"/>
-          <w:color w:val="000000"/>
-          <w:sz w:val="24"/>
+        <w:t xml:space="preserve"> (2025) deslocam a análise de nomes de </w:t>
+      </w:r>
+      <w:r>
+        <w:rPr>
+          <w:rFonts w:ascii="Arial" w:hAnsi="Arial" w:eastAsia="Arial" w:cs="Arial"/>
+          <w:i/>
+          <w:color w:val="000000"/>
+          <w:sz w:val="24"/>
+        </w:rPr>
+        <w:t>frameworks</w:t>
+      </w:r>
+      <w:r>
+        <w:rPr>
+          <w:rFonts w:ascii="Arial" w:hAnsi="Arial" w:eastAsia="Arial" w:cs="Arial"/>
+          <w:color w:val="000000"/>
+          <w:sz w:val="24"/>
+        </w:rPr>
+        <w:t xml:space="preserve"> para mecanismos concretos de colaboração. O trabalho organiza a coordenação em quatro dimensões — governança dos agentes, controle de participação, dinâmica de interação e gestão do histórico — e as relaciona tanto à qualidade da tarefa quanto à eficiência computacional. Essa decomposição oferece critérios diretamente úteis para caracterizar orquestração, </w:t>
+      </w:r>
+      <w:r>
+        <w:rPr>
+          <w:rFonts w:ascii="Arial" w:hAnsi="Arial" w:eastAsia="Arial" w:cs="Arial"/>
+          <w:i w:val="1"/>
+          <w:color w:val="000000"/>
+          <w:sz w:val="24"/>
+          <w:iCs w:val="1"/>
+        </w:rPr>
+        <w:t>workflow</w:t>
+      </w:r>
+      <w:r>
+        <w:rPr>
+          <w:rFonts w:ascii="Arial" w:hAnsi="Arial" w:eastAsia="Arial" w:cs="Arial"/>
+          <w:color w:val="000000"/>
+          <w:sz w:val="24"/>
+        </w:rPr>
+        <w:t xml:space="preserve"> e </w:t>
+      </w:r>
+      <w:r>
+        <w:rPr>
+          <w:rFonts w:ascii="Arial" w:hAnsi="Arial" w:eastAsia="Arial" w:cs="Arial"/>
+          <w:i w:val="1"/>
+          <w:color w:val="000000"/>
+          <w:sz w:val="24"/>
+          <w:iCs w:val="1"/>
+        </w:rPr>
+        <w:t>swarm</w:t>
+      </w:r>
+      <w:r>
+        <w:rPr>
+          <w:rFonts w:ascii="Arial" w:hAnsi="Arial" w:eastAsia="Arial" w:cs="Arial"/>
+          <w:color w:val="000000"/>
+          <w:sz w:val="24"/>
+        </w:rPr>
+        <w:t>: quem decide a próxima ação, quais agentes participam, em que ordem interagem e qual contexto recebem.</w:t>
+      </w:r>
+    </w:p>
+    <w:p>
+      <w:pPr/>
+      <w:r>
+        <w:rPr>
+          <w:rFonts w:ascii="Arial" w:hAnsi="Arial" w:eastAsia="Arial" w:cs="Arial"/>
+          <w:color w:val="000000"/>
+          <w:sz w:val="24"/>
+        </w:rPr>
+        <w:t xml:space="preserve">Zhu </w:t>
+      </w:r>
+      <w:r>
+        <w:rPr>
+          <w:rFonts w:ascii="Arial" w:hAnsi="Arial" w:eastAsia="Arial" w:cs="Arial"/>
           <w:i w:val="1"/>
           <w:iCs w:val="1"/>
-        </w:rPr>
-        <w:t>workflow</w:t>
-      </w:r>
-      <w:r>
-        <w:rPr>
-          <w:rFonts w:ascii="Arial" w:hAnsi="Arial" w:eastAsia="Arial" w:cs="Arial"/>
-          <w:color w:val="000000"/>
-          <w:sz w:val="24"/>
-        </w:rPr>
-        <w:t xml:space="preserve"> e </w:t>
-      </w:r>
-      <w:r>
-        <w:rPr>
-          <w:rFonts w:ascii="Arial" w:hAnsi="Arial" w:eastAsia="Arial" w:cs="Arial"/>
-          <w:color w:val="000000"/>
-          <w:sz w:val="24"/>
+          <w:color w:val="000000"/>
+          <w:sz w:val="24"/>
+        </w:rPr>
+        <w:t>et al.</w:t>
+      </w:r>
+      <w:r>
+        <w:rPr>
+          <w:rFonts w:ascii="Arial" w:hAnsi="Arial" w:eastAsia="Arial" w:cs="Arial"/>
+          <w:color w:val="000000"/>
+          <w:sz w:val="24"/>
+        </w:rPr>
+        <w:t xml:space="preserve"> (2025) introduzem o MultiAgentBench, </w:t>
+      </w:r>
+      <w:r>
+        <w:rPr>
+          <w:rFonts w:ascii="Arial" w:hAnsi="Arial" w:eastAsia="Arial" w:cs="Arial"/>
+          <w:i w:val="1"/>
+          <w:color w:val="000000"/>
+          <w:sz w:val="24"/>
+          <w:iCs w:val="1"/>
+        </w:rPr>
+        <w:t>benchmark</w:t>
+      </w:r>
+      <w:r>
+        <w:rPr>
+          <w:rFonts w:ascii="Arial" w:hAnsi="Arial" w:eastAsia="Arial" w:cs="Arial"/>
+          <w:color w:val="000000"/>
+          <w:sz w:val="24"/>
+        </w:rPr>
+        <w:t xml:space="preserve"> independente que avalia colaboração e competição entre agentes em cenários interativos. O estudo compara protocolos de coordenação em estrela, cadeia, árvore e grafo e utiliza indicadores baseados em marcos intermediários, além da conclusão da tarefa. A principal aproximação com esta pesquisa está em tratar a topologia como variável experimental e em medir o processo de colaboração. O escopo, porém, abrange cenários gerais e protocolos de comunicação diferentes das três condições implementadas no MAB deste trabalho.</w:t>
+      </w:r>
+    </w:p>
+    <w:p>
+      <w:pPr/>
+      <w:r>
+        <w:rPr>
+          <w:rFonts w:ascii="Arial" w:hAnsi="Arial" w:eastAsia="Arial" w:cs="Arial"/>
+          <w:color w:val="000000"/>
+          <w:sz w:val="24"/>
+        </w:rPr>
+        <w:t xml:space="preserve">Qian </w:t>
+      </w:r>
+      <w:r>
+        <w:rPr>
+          <w:rFonts w:ascii="Arial" w:hAnsi="Arial" w:eastAsia="Arial" w:cs="Arial"/>
           <w:i w:val="1"/>
           <w:iCs w:val="1"/>
-        </w:rPr>
-        <w:t>swarm</w:t>
-      </w:r>
-      <w:r>
-        <w:rPr>
-          <w:rFonts w:ascii="Arial" w:hAnsi="Arial" w:eastAsia="Arial" w:cs="Arial"/>
-          <w:color w:val="000000"/>
-          <w:sz w:val="24"/>
-        </w:rPr>
-        <w:t xml:space="preserve"> por características observáveis. O estudo, porém, utiliza tarefas gerais dependentes de contexto e não incorpora requisitos farmacêuticos de segurança ou encaminhamento profissional.</w:t>
+          <w:color w:val="000000"/>
+          <w:sz w:val="24"/>
+        </w:rPr>
+        <w:t>et al.</w:t>
+      </w:r>
+      <w:r>
+        <w:rPr>
+          <w:rFonts w:ascii="Arial" w:hAnsi="Arial" w:eastAsia="Arial" w:cs="Arial"/>
+          <w:color w:val="000000"/>
+          <w:sz w:val="24"/>
+        </w:rPr>
+        <w:t xml:space="preserve"> (2025) investigam a escalabilidade da colaboração por meio do MacNet, que organiza agentes em grafos acíclicos direcionados. Os autores variam quantidade e topologia dos agentes e mostram que a organização das conexões influencia os efeitos da ampliação do sistema. A contribuição para esta pesquisa é dupla: reforça que topologia e escala não são detalhes neutros; e evidencia que conclusões obtidas em uma configuração de rede não devem ser automaticamente transferidas para outra.</w:t>
       </w:r>
     </w:p>
     <w:p>
@@ -5323,7 +5357,7 @@
           <w:color w:val="000000"/>
           <w:sz w:val="24"/>
         </w:rPr>
-        <w:t xml:space="preserve">Kim </w:t>
+        <w:t xml:space="preserve">Zhou </w:t>
       </w:r>
       <w:r>
         <w:rPr>
@@ -5341,36 +5375,71 @@
           <w:color w:val="000000"/>
           <w:sz w:val="24"/>
         </w:rPr>
-        <w:t xml:space="preserve"> (2026) realizam uma comparação controlada de arquiteturas de agentes baseados em modelos de linguagem, abrangendo configurações de agente único, independentes, centralizadas, descentralizadas e híbridas. O estudo mostra que o efeito da colaboração depende da decomponibilidade da tarefa, da capacidade do modelo e do custo de coordenação. Entre os trabalhos selecionados, é o mais próximo do desenho comparativo do MAB. A diferença fundamental está no domínio: seus </w:t>
-      </w:r>
-      <w:r>
-        <w:rPr>
-          <w:rFonts w:ascii="Arial" w:hAnsi="Arial" w:eastAsia="Arial" w:cs="Arial"/>
-          <w:color w:val="000000"/>
-          <w:sz w:val="24"/>
+        <w:t xml:space="preserve"> (2026) analisam conjuntamente </w:t>
+      </w:r>
+      <w:r>
+        <w:rPr>
+          <w:rFonts w:ascii="Arial" w:hAnsi="Arial" w:eastAsia="Arial" w:cs="Arial"/>
+          <w:i/>
+          <w:color w:val="000000"/>
+          <w:sz w:val="24"/>
+        </w:rPr>
+        <w:t>prompts</w:t>
+      </w:r>
+      <w:r>
+        <w:rPr>
+          <w:rFonts w:ascii="Arial" w:hAnsi="Arial" w:eastAsia="Arial" w:cs="Arial"/>
+          <w:color w:val="000000"/>
+          <w:sz w:val="24"/>
+        </w:rPr>
+        <w:t xml:space="preserve"> e topologias no desenho de sistemas multiagentes e propõem o Multi-Agent System Search. O trabalho separa a configuração local de cada agente da orquestração em nível de </w:t>
+      </w:r>
+      <w:r>
+        <w:rPr>
+          <w:rFonts w:ascii="Arial" w:hAnsi="Arial" w:eastAsia="Arial" w:cs="Arial"/>
+          <w:i w:val="1"/>
+          <w:color w:val="000000"/>
+          <w:sz w:val="24"/>
+          <w:iCs w:val="1"/>
+        </w:rPr>
+        <w:t>workflow</w:t>
+      </w:r>
+      <w:r>
+        <w:rPr>
+          <w:rFonts w:ascii="Arial" w:hAnsi="Arial" w:eastAsia="Arial" w:cs="Arial"/>
+          <w:color w:val="000000"/>
+          <w:sz w:val="24"/>
+        </w:rPr>
+        <w:t>, mostrando que ambos os níveis participam do desempenho observado. Para o desenho do MAB, essa evidência tem consequência metodológica direta: se o objetivo é estimar o efeito da coordenação, modelo, instruções, ferramentas e critérios de avaliação precisam permanecer controlados entre as condições experimentais.</w:t>
+      </w:r>
+    </w:p>
+    <w:p>
+      <w:pPr/>
+      <w:r>
+        <w:rPr>
+          <w:rFonts w:ascii="Arial" w:hAnsi="Arial" w:eastAsia="Arial" w:cs="Arial"/>
+          <w:color w:val="000000"/>
+          <w:sz w:val="24"/>
+        </w:rPr>
+        <w:t xml:space="preserve">Balaprakash </w:t>
+      </w:r>
+      <w:r>
+        <w:rPr>
+          <w:rFonts w:ascii="Arial" w:hAnsi="Arial" w:eastAsia="Arial" w:cs="Arial"/>
           <w:i w:val="1"/>
           <w:iCs w:val="1"/>
-        </w:rPr>
-        <w:t>benchmarks</w:t>
-      </w:r>
-      <w:r>
-        <w:rPr>
-          <w:rFonts w:ascii="Arial" w:hAnsi="Arial" w:eastAsia="Arial" w:cs="Arial"/>
-          <w:color w:val="000000"/>
-          <w:sz w:val="24"/>
-        </w:rPr>
-        <w:t xml:space="preserve"> não representam atendimentos farmacêuticos nem as restrições operacionais e de segurança desse contexto.</w:t>
-      </w:r>
-    </w:p>
-    <w:p>
-      <w:pPr/>
-      <w:r>
-        <w:rPr>
-          <w:rFonts w:ascii="Arial" w:hAnsi="Arial" w:eastAsia="Arial" w:cs="Arial"/>
-          <w:color w:val="000000"/>
-          <w:sz w:val="24"/>
-        </w:rPr>
-        <w:t xml:space="preserve">Esses trabalhos confirmam que especialização, governança, circulação de contexto e mecanismos de parada são variáveis arquiteturais relevantes. Ao mesmo tempo, nenhum deles combina uma comparação controlada de orquestração centralizada, </w:t>
+          <w:color w:val="000000"/>
+          <w:sz w:val="24"/>
+        </w:rPr>
+        <w:t>et al.</w:t>
+      </w:r>
+      <w:r>
+        <w:rPr>
+          <w:rFonts w:ascii="Arial" w:hAnsi="Arial" w:eastAsia="Arial" w:cs="Arial"/>
+          <w:color w:val="000000"/>
+          <w:sz w:val="24"/>
+        </w:rPr>
+        <w:t xml:space="preserve"> (2025) apresentam o </w:t>
       </w:r>
       <w:r>
         <w:rPr>
@@ -5380,33 +5449,44 @@
           <w:i w:val="1"/>
           <w:iCs w:val="1"/>
         </w:rPr>
-        <w:t>workflow</w:t>
-      </w:r>
-      <w:r>
-        <w:rPr>
-          <w:rFonts w:ascii="Arial" w:hAnsi="Arial" w:eastAsia="Arial" w:cs="Arial"/>
-          <w:color w:val="000000"/>
-          <w:sz w:val="24"/>
-        </w:rPr>
-        <w:t xml:space="preserve"> estruturado e </w:t>
-      </w:r>
-      <w:r>
-        <w:rPr>
-          <w:rFonts w:ascii="Arial" w:hAnsi="Arial" w:eastAsia="Arial" w:cs="Arial"/>
-          <w:color w:val="000000"/>
-          <w:sz w:val="24"/>
+        <w:t>SWARM</w:t>
+      </w:r>
+      <w:r>
+        <w:rPr>
+          <w:rFonts w:ascii="Arial" w:hAnsi="Arial" w:eastAsia="Arial" w:cs="Arial"/>
+          <w:color w:val="000000"/>
+          <w:sz w:val="24"/>
+        </w:rPr>
+        <w:t xml:space="preserve"> para gerenciamento distribuído de </w:t>
+      </w:r>
+      <w:r>
+        <w:rPr>
+          <w:rFonts w:ascii="Arial" w:hAnsi="Arial" w:eastAsia="Arial" w:cs="Arial"/>
           <w:i w:val="1"/>
+          <w:color w:val="000000"/>
+          <w:sz w:val="24"/>
           <w:iCs w:val="1"/>
         </w:rPr>
-        <w:t>swarm</w:t>
-      </w:r>
-      <w:r>
-        <w:rPr>
-          <w:rFonts w:ascii="Arial" w:hAnsi="Arial" w:eastAsia="Arial" w:cs="Arial"/>
-          <w:color w:val="000000"/>
-          <w:sz w:val="24"/>
-        </w:rPr>
-        <w:t xml:space="preserve"> com cenários equivalentes de atendimento em farmácias e avaliação híbrida orientada à segurança.</w:t>
+        <w:t>workflows</w:t>
+      </w:r>
+      <w:r>
+        <w:rPr>
+          <w:rFonts w:ascii="Arial" w:hAnsi="Arial" w:eastAsia="Arial" w:cs="Arial"/>
+          <w:color w:val="000000"/>
+          <w:sz w:val="24"/>
+        </w:rPr>
+        <w:t xml:space="preserve"> científicos. Embora não seja um sistema de atendimento baseado em LLM, o trabalho distribui funções de gerenciamento que tradicionalmente ficam concentradas e discute escalabilidade, autonomia local e tolerância a falhas. Sua relevância está em oferecer um contraponto arquitetural consolidado para coordenação descentralizada; sua distância está no domínio científico e no fato de não comparar respostas geradas por modelos de linguagem.</w:t>
+      </w:r>
+    </w:p>
+    <w:p>
+      <w:pPr/>
+      <w:r>
+        <w:rPr>
+          <w:rFonts w:ascii="Arial" w:hAnsi="Arial" w:eastAsia="Arial" w:cs="Arial"/>
+          <w:color w:val="000000"/>
+          <w:sz w:val="24"/>
+        </w:rPr>
+        <w:t>Em conjunto, esses estudos mostram que arquitetura pode ser operacionalizada por topologia, governança, ordem de interação, circulação de contexto, mecanismos de parada e distribuição de responsabilidades. Também mostram que desempenho e custo dependem da interação entre essas escolhas e as características da tarefa. O presente trabalho adota essa perspectiva arquitetural e utiliza o atendimento em farmácias apenas como uma instância controlada para comparar três estratégias implementadas sobre a mesma base experimental.</w:t>
       </w:r>
     </w:p>
     <w:p>
@@ -5439,7 +5519,7 @@
           <w:color w:val="000000"/>
           <w:sz w:val="24"/>
         </w:rPr>
-        <w:t>O Quadro 1 sintetiza a relação entre os trabalhos selecionados e esta pesquisa. A comparação não pretende ordenar soluções de domínios distintos, mas explicitar quais dimensões cada estudo cobre e quais permanecem fora de seu escopo.</w:t>
+        <w:t>O Quadro 1 sintetiza os trabalhos selecionados segundo o aspecto que efetivamente os aproxima desta pesquisa. Aplicações do domínio são avaliadas por sua contribuição ao desenho do estudo de caso; trabalhos multiagentes são comparados pelo grau em que isolam, descrevem ou medem a coordenação.</w:t>
       </w:r>
     </w:p>
     <w:p>
@@ -5478,7 +5558,7 @@
         </w:trPr>
         <w:tc>
           <w:tcPr>
-            <w:tcW w:type="dxa" w:w="1587"/>
+            <w:tcW w:type="dxa" w:w="1786"/>
             <w:vAlign w:val="center"/>
           </w:tcPr>
           <w:p>
@@ -5499,7 +5579,7 @@
         </w:tc>
         <w:tc>
           <w:tcPr>
-            <w:tcW w:type="dxa" w:w="1984"/>
+            <w:tcW w:type="dxa" w:w="2353"/>
             <w:vAlign w:val="center"/>
           </w:tcPr>
           <w:p>
@@ -5514,13 +5594,13 @@
                 <w:color w:val="000000"/>
                 <w:sz w:val="24"/>
               </w:rPr>
-              <w:t>Domínio e tarefa</w:t>
+              <w:t>Foco arquitetural ou operacional</w:t>
             </w:r>
           </w:p>
         </w:tc>
         <w:tc>
           <w:tcPr>
-            <w:tcW w:type="dxa" w:w="2494"/>
+            <w:tcW w:type="dxa" w:w="2409"/>
             <w:vAlign w:val="center"/>
           </w:tcPr>
           <w:p>
@@ -5535,13 +5615,13 @@
                 <w:color w:val="000000"/>
                 <w:sz w:val="24"/>
               </w:rPr>
-              <w:t>Arquitetura ou método</w:t>
+              <w:t>Controle e avaliação</w:t>
             </w:r>
           </w:p>
         </w:tc>
         <w:tc>
           <w:tcPr>
-            <w:tcW w:type="dxa" w:w="3288"/>
+            <w:tcW w:type="dxa" w:w="2863"/>
             <w:vAlign w:val="center"/>
           </w:tcPr>
           <w:p>
@@ -5556,7 +5636,7 @@
                 <w:color w:val="000000"/>
                 <w:sz w:val="24"/>
               </w:rPr>
-              <w:t>Relação com o MAB</w:t>
+              <w:t>Relação com esta pesquisa</w:t>
             </w:r>
           </w:p>
         </w:tc>
@@ -5567,7 +5647,7 @@
         </w:trPr>
         <w:tc>
           <w:tcPr>
-            <w:tcW w:type="dxa" w:w="1587"/>
+            <w:tcW w:type="dxa" w:w="1786"/>
             <w:vAlign w:val="center"/>
           </w:tcPr>
           <w:p>
@@ -5602,13 +5682,13 @@
                 <w:color w:val="000000"/>
                 <w:sz w:val="24"/>
               </w:rPr>
-              <w:t xml:space="preserve"> (2024)</w:t>
+              <w:t xml:space="preserve"> (2024) e Jagatap, Merugu e Comar (2025)</w:t>
             </w:r>
           </w:p>
         </w:tc>
         <w:tc>
           <w:tcPr>
-            <w:tcW w:type="dxa" w:w="1984"/>
+            <w:tcW w:type="dxa" w:w="2353"/>
             <w:vAlign w:val="center"/>
           </w:tcPr>
           <w:p>
@@ -5623,13 +5703,13 @@
                 <w:color w:val="000000"/>
                 <w:sz w:val="24"/>
               </w:rPr>
-              <w:t>Farmácia on-line; prevenção de erros em instruções</w:t>
+              <w:t>Sistemas especializados com salvaguardas, ferramentas e etapas rastreáveis</w:t>
             </w:r>
           </w:p>
         </w:tc>
         <w:tc>
           <w:tcPr>
-            <w:tcW w:type="dxa" w:w="2494"/>
+            <w:tcW w:type="dxa" w:w="2409"/>
             <w:vAlign w:val="center"/>
           </w:tcPr>
           <w:p>
@@ -5644,13 +5724,13 @@
                 <w:color w:val="000000"/>
                 <w:sz w:val="24"/>
               </w:rPr>
-              <w:t>LLM especializado, lógica farmacêutica, salvaguardas e revisão profissional</w:t>
+              <w:t>Avaliação orientada ao domínio e confronto com revisão humana</w:t>
             </w:r>
           </w:p>
         </w:tc>
         <w:tc>
           <w:tcPr>
-            <w:tcW w:type="dxa" w:w="3288"/>
+            <w:tcW w:type="dxa" w:w="2863"/>
             <w:vAlign w:val="center"/>
           </w:tcPr>
           <w:p>
@@ -5665,7 +5745,7 @@
                 <w:color w:val="000000"/>
                 <w:sz w:val="24"/>
               </w:rPr>
-              <w:t>Forte aderência ao domínio e à segurança; não compara coordenação multiagente</w:t>
+              <w:t>Definem requisitos do caso farmacêutico; não comparam arquiteturas</w:t>
             </w:r>
           </w:p>
         </w:tc>
@@ -5676,305 +5756,7 @@
         </w:trPr>
         <w:tc>
           <w:tcPr>
-            <w:tcW w:type="dxa" w:w="1587"/>
-            <w:vAlign w:val="center"/>
-          </w:tcPr>
-          <w:p>
-            <w:pPr>
-              <w:spacing w:after="0" w:line="240" w:lineRule="auto"/>
-              <w:jc w:val="left"/>
-            </w:pPr>
-            <w:r>
-              <w:rPr>
-                <w:rFonts w:ascii="Arial" w:hAnsi="Arial" w:eastAsia="Arial" w:cs="Arial"/>
-                <w:b w:val="0"/>
-                <w:color w:val="000000"/>
-                <w:sz w:val="24"/>
-              </w:rPr>
-              <w:t>Jagatap, Merugu e Comar (2025)</w:t>
-            </w:r>
-          </w:p>
-        </w:tc>
-        <w:tc>
-          <w:tcPr>
-            <w:tcW w:type="dxa" w:w="1984"/>
-            <w:vAlign w:val="center"/>
-          </w:tcPr>
-          <w:p>
-            <w:pPr>
-              <w:spacing w:after="0" w:line="240" w:lineRule="auto"/>
-              <w:jc w:val="left"/>
-            </w:pPr>
-            <w:r>
-              <w:rPr>
-                <w:rFonts w:ascii="Arial" w:hAnsi="Arial" w:eastAsia="Arial" w:cs="Arial"/>
-                <w:b w:val="0"/>
-                <w:color w:val="000000"/>
-                <w:sz w:val="24"/>
-              </w:rPr>
-              <w:t>Farmácia digital; processamento de prescrições</w:t>
-            </w:r>
-          </w:p>
-        </w:tc>
-        <w:tc>
-          <w:tcPr>
-            <w:tcW w:type="dxa" w:w="2494"/>
-            <w:vAlign w:val="center"/>
-          </w:tcPr>
-          <w:p>
-            <w:pPr>
-              <w:spacing w:after="0" w:line="240" w:lineRule="auto"/>
-              <w:jc w:val="left"/>
-            </w:pPr>
-            <w:r>
-              <w:rPr>
-                <w:rFonts w:ascii="Arial" w:hAnsi="Arial" w:eastAsia="Arial" w:cs="Arial"/>
-                <w:b w:val="0"/>
-                <w:color w:val="000000"/>
-                <w:sz w:val="24"/>
-                <w:i w:val="1"/>
-                <w:iCs w:val="1"/>
-              </w:rPr>
-              <w:t>Pipeline</w:t>
-            </w:r>
-            <w:r>
-              <w:rPr>
-                <w:rFonts w:ascii="Arial" w:hAnsi="Arial" w:eastAsia="Arial" w:cs="Arial"/>
-                <w:b w:val="0"/>
-                <w:color w:val="000000"/>
-                <w:sz w:val="24"/>
-              </w:rPr>
-              <w:t xml:space="preserve"> com supressão de dados pessoais, OCR, extração, recuperação e rastreabilidade</w:t>
-            </w:r>
-          </w:p>
-        </w:tc>
-        <w:tc>
-          <w:tcPr>
-            <w:tcW w:type="dxa" w:w="3288"/>
-            <w:vAlign w:val="center"/>
-          </w:tcPr>
-          <w:p>
-            <w:pPr>
-              <w:spacing w:after="0" w:line="240" w:lineRule="auto"/>
-              <w:jc w:val="left"/>
-            </w:pPr>
-            <w:r>
-              <w:rPr>
-                <w:rFonts w:ascii="Arial" w:hAnsi="Arial" w:eastAsia="Arial" w:cs="Arial"/>
-                <w:b w:val="0"/>
-                <w:color w:val="000000"/>
-                <w:sz w:val="24"/>
-              </w:rPr>
-              <w:t>Demonstra decomposição operacional; não isola o efeito da arquitetura</w:t>
-            </w:r>
-          </w:p>
-        </w:tc>
-      </w:tr>
-      <w:tr>
-        <w:trPr>
-          <w:cantSplit/>
-        </w:trPr>
-        <w:tc>
-          <w:tcPr>
-            <w:tcW w:type="dxa" w:w="1587"/>
-            <w:vAlign w:val="center"/>
-          </w:tcPr>
-          <w:p>
-            <w:pPr>
-              <w:spacing w:after="0" w:line="240" w:lineRule="auto"/>
-              <w:jc w:val="left"/>
-            </w:pPr>
-            <w:r>
-              <w:rPr>
-                <w:rFonts w:ascii="Arial" w:hAnsi="Arial" w:eastAsia="Arial" w:cs="Arial"/>
-                <w:b w:val="0"/>
-                <w:color w:val="000000"/>
-                <w:sz w:val="24"/>
-              </w:rPr>
-              <w:t xml:space="preserve">Dou </w:t>
-            </w:r>
-            <w:r>
-              <w:rPr>
-                <w:rFonts w:ascii="Arial" w:hAnsi="Arial" w:eastAsia="Arial" w:cs="Arial"/>
-                <w:b w:val="0"/>
-                <w:color w:val="000000"/>
-                <w:sz w:val="24"/>
-                <w:i w:val="1"/>
-                <w:iCs w:val="1"/>
-              </w:rPr>
-              <w:t>et al.</w:t>
-            </w:r>
-            <w:r>
-              <w:rPr>
-                <w:rFonts w:ascii="Arial" w:hAnsi="Arial" w:eastAsia="Arial" w:cs="Arial"/>
-                <w:b w:val="0"/>
-                <w:color w:val="000000"/>
-                <w:sz w:val="24"/>
-              </w:rPr>
-              <w:t xml:space="preserve"> (2025)</w:t>
-            </w:r>
-          </w:p>
-        </w:tc>
-        <w:tc>
-          <w:tcPr>
-            <w:tcW w:type="dxa" w:w="1984"/>
-            <w:vAlign w:val="center"/>
-          </w:tcPr>
-          <w:p>
-            <w:pPr>
-              <w:spacing w:after="0" w:line="240" w:lineRule="auto"/>
-              <w:jc w:val="left"/>
-            </w:pPr>
-            <w:r>
-              <w:rPr>
-                <w:rFonts w:ascii="Arial" w:hAnsi="Arial" w:eastAsia="Arial" w:cs="Arial"/>
-                <w:b w:val="0"/>
-                <w:color w:val="000000"/>
-                <w:sz w:val="24"/>
-              </w:rPr>
-              <w:t>Orientação sobre medicamentos</w:t>
-            </w:r>
-          </w:p>
-        </w:tc>
-        <w:tc>
-          <w:tcPr>
-            <w:tcW w:type="dxa" w:w="2494"/>
-            <w:vAlign w:val="center"/>
-          </w:tcPr>
-          <w:p>
-            <w:pPr>
-              <w:spacing w:after="0" w:line="240" w:lineRule="auto"/>
-              <w:jc w:val="left"/>
-            </w:pPr>
-            <w:r>
-              <w:rPr>
-                <w:rFonts w:ascii="Arial" w:hAnsi="Arial" w:eastAsia="Arial" w:cs="Arial"/>
-                <w:b w:val="0"/>
-                <w:color w:val="000000"/>
-                <w:sz w:val="24"/>
-              </w:rPr>
-              <w:t>Grafo de conhecimento e LLM especializado</w:t>
-            </w:r>
-          </w:p>
-        </w:tc>
-        <w:tc>
-          <w:tcPr>
-            <w:tcW w:type="dxa" w:w="3288"/>
-            <w:vAlign w:val="center"/>
-          </w:tcPr>
-          <w:p>
-            <w:pPr>
-              <w:spacing w:after="0" w:line="240" w:lineRule="auto"/>
-              <w:jc w:val="left"/>
-            </w:pPr>
-            <w:r>
-              <w:rPr>
-                <w:rFonts w:ascii="Arial" w:hAnsi="Arial" w:eastAsia="Arial" w:cs="Arial"/>
-                <w:b w:val="0"/>
-                <w:color w:val="000000"/>
-                <w:sz w:val="24"/>
-              </w:rPr>
-              <w:t>Aproxima atendimento medicamentoso e avaliação especializada; não é estudo de coordenação</w:t>
-            </w:r>
-          </w:p>
-        </w:tc>
-      </w:tr>
-      <w:tr>
-        <w:trPr>
-          <w:cantSplit/>
-        </w:trPr>
-        <w:tc>
-          <w:tcPr>
-            <w:tcW w:type="dxa" w:w="1587"/>
-            <w:vAlign w:val="center"/>
-          </w:tcPr>
-          <w:p>
-            <w:pPr>
-              <w:spacing w:after="0" w:line="240" w:lineRule="auto"/>
-              <w:jc w:val="left"/>
-            </w:pPr>
-            <w:r>
-              <w:rPr>
-                <w:rFonts w:ascii="Arial" w:hAnsi="Arial" w:eastAsia="Arial" w:cs="Arial"/>
-                <w:b w:val="0"/>
-                <w:color w:val="000000"/>
-                <w:sz w:val="24"/>
-              </w:rPr>
-              <w:t>Pandey, Amod e Kumar (2024)</w:t>
-            </w:r>
-          </w:p>
-        </w:tc>
-        <w:tc>
-          <w:tcPr>
-            <w:tcW w:type="dxa" w:w="1984"/>
-            <w:vAlign w:val="center"/>
-          </w:tcPr>
-          <w:p>
-            <w:pPr>
-              <w:spacing w:after="0" w:line="240" w:lineRule="auto"/>
-              <w:jc w:val="left"/>
-            </w:pPr>
-            <w:r>
-              <w:rPr>
-                <w:rFonts w:ascii="Arial" w:hAnsi="Arial" w:eastAsia="Arial" w:cs="Arial"/>
-                <w:b w:val="0"/>
-                <w:color w:val="000000"/>
-                <w:sz w:val="24"/>
-              </w:rPr>
-              <w:t>Saúde; autorização prévia</w:t>
-            </w:r>
-          </w:p>
-        </w:tc>
-        <w:tc>
-          <w:tcPr>
-            <w:tcW w:type="dxa" w:w="2494"/>
-            <w:vAlign w:val="center"/>
-          </w:tcPr>
-          <w:p>
-            <w:pPr>
-              <w:spacing w:after="0" w:line="240" w:lineRule="auto"/>
-              <w:jc w:val="left"/>
-            </w:pPr>
-            <w:r>
-              <w:rPr>
-                <w:rFonts w:ascii="Arial" w:hAnsi="Arial" w:eastAsia="Arial" w:cs="Arial"/>
-                <w:b w:val="0"/>
-                <w:color w:val="000000"/>
-                <w:sz w:val="24"/>
-              </w:rPr>
-              <w:t>Agentes especializados com julgamentos baseados em evidências</w:t>
-            </w:r>
-          </w:p>
-        </w:tc>
-        <w:tc>
-          <w:tcPr>
-            <w:tcW w:type="dxa" w:w="3288"/>
-            <w:vAlign w:val="center"/>
-          </w:tcPr>
-          <w:p>
-            <w:pPr>
-              <w:spacing w:after="0" w:line="240" w:lineRule="auto"/>
-              <w:jc w:val="left"/>
-            </w:pPr>
-            <w:r>
-              <w:rPr>
-                <w:rFonts w:ascii="Arial" w:hAnsi="Arial" w:eastAsia="Arial" w:cs="Arial"/>
-                <w:b w:val="0"/>
-                <w:color w:val="000000"/>
-                <w:sz w:val="24"/>
-              </w:rPr>
-              <w:t>Demonstra decomposição multiagente em saúde; não compara topologias</w:t>
-            </w:r>
-          </w:p>
-        </w:tc>
-      </w:tr>
-      <w:tr>
-        <w:trPr>
-          <w:cantSplit/>
-        </w:trPr>
-        <w:tc>
-          <w:tcPr>
-            <w:tcW w:type="dxa" w:w="1587"/>
+            <w:tcW w:type="dxa" w:w="1786"/>
             <w:vAlign w:val="center"/>
           </w:tcPr>
           <w:p>
@@ -6015,7 +5797,7 @@
         </w:tc>
         <w:tc>
           <w:tcPr>
-            <w:tcW w:type="dxa" w:w="1984"/>
+            <w:tcW w:type="dxa" w:w="2353"/>
             <w:vAlign w:val="center"/>
           </w:tcPr>
           <w:p>
@@ -6030,13 +5812,13 @@
                 <w:color w:val="000000"/>
                 <w:sz w:val="24"/>
               </w:rPr>
-              <w:t>Saúde; triagem clínica</w:t>
+              <w:t>Papéis heterogêneos, discussão, autoconfiança, recuperação e parada</w:t>
             </w:r>
           </w:p>
         </w:tc>
         <w:tc>
           <w:tcPr>
-            <w:tcW w:type="dxa" w:w="2494"/>
+            <w:tcW w:type="dxa" w:w="2409"/>
             <w:vAlign w:val="center"/>
           </w:tcPr>
           <w:p>
@@ -6051,13 +5833,13 @@
                 <w:color w:val="000000"/>
                 <w:sz w:val="24"/>
               </w:rPr>
-              <w:t>Agentes heterogêneos, discussão, autoconfiança, RAG e parada antecipada</w:t>
+              <w:t>Compara a arquitetura proposta com métodos de referência em triagem</w:t>
             </w:r>
           </w:p>
         </w:tc>
         <w:tc>
           <w:tcPr>
-            <w:tcW w:type="dxa" w:w="3288"/>
+            <w:tcW w:type="dxa" w:w="2863"/>
             <w:vAlign w:val="center"/>
           </w:tcPr>
           <w:p>
@@ -6072,7 +5854,7 @@
                 <w:color w:val="000000"/>
                 <w:sz w:val="24"/>
               </w:rPr>
-              <w:t>Explicita colaboração e controle; avalia uma arquitetura específica</w:t>
+              <w:t>Aproxima coordenação e domínio sensível; não isola topologias alternativas</w:t>
             </w:r>
           </w:p>
         </w:tc>
@@ -6083,7 +5865,356 @@
         </w:trPr>
         <w:tc>
           <w:tcPr>
-            <w:tcW w:type="dxa" w:w="1587"/>
+            <w:tcW w:type="dxa" w:w="1786"/>
+            <w:vAlign w:val="center"/>
+          </w:tcPr>
+          <w:p>
+            <w:pPr>
+              <w:spacing w:after="0" w:line="240" w:lineRule="auto"/>
+              <w:jc w:val="left"/>
+            </w:pPr>
+            <w:r>
+              <w:rPr>
+                <w:rFonts w:ascii="Arial" w:hAnsi="Arial" w:eastAsia="Arial" w:cs="Arial"/>
+                <w:b w:val="0"/>
+                <w:color w:val="000000"/>
+                <w:sz w:val="24"/>
+              </w:rPr>
+              <w:t xml:space="preserve">Balaprakash </w:t>
+            </w:r>
+            <w:r>
+              <w:rPr>
+                <w:rFonts w:ascii="Arial" w:hAnsi="Arial" w:eastAsia="Arial" w:cs="Arial"/>
+                <w:b w:val="0"/>
+                <w:color w:val="000000"/>
+                <w:sz w:val="24"/>
+                <w:i w:val="1"/>
+                <w:iCs w:val="1"/>
+              </w:rPr>
+              <w:t>et al.</w:t>
+            </w:r>
+            <w:r>
+              <w:rPr>
+                <w:rFonts w:ascii="Arial" w:hAnsi="Arial" w:eastAsia="Arial" w:cs="Arial"/>
+                <w:b w:val="0"/>
+                <w:color w:val="000000"/>
+                <w:sz w:val="24"/>
+              </w:rPr>
+              <w:t xml:space="preserve"> (2025)</w:t>
+            </w:r>
+          </w:p>
+        </w:tc>
+        <w:tc>
+          <w:tcPr>
+            <w:tcW w:type="dxa" w:w="2353"/>
+            <w:vAlign w:val="center"/>
+          </w:tcPr>
+          <w:p>
+            <w:pPr>
+              <w:spacing w:after="0" w:line="240" w:lineRule="auto"/>
+              <w:jc w:val="left"/>
+            </w:pPr>
+            <w:r>
+              <w:rPr>
+                <w:rFonts w:ascii="Arial" w:hAnsi="Arial" w:eastAsia="Arial" w:cs="Arial"/>
+                <w:b w:val="0"/>
+                <w:color w:val="000000"/>
+                <w:sz w:val="24"/>
+              </w:rPr>
+              <w:t xml:space="preserve">Distribuição do gerenciamento de </w:t>
+            </w:r>
+            <w:r>
+              <w:rPr>
+                <w:rFonts w:ascii="Arial" w:hAnsi="Arial" w:eastAsia="Arial" w:cs="Arial"/>
+                <w:b w:val="0"/>
+                <w:i w:val="1"/>
+                <w:color w:val="000000"/>
+                <w:sz w:val="24"/>
+                <w:iCs w:val="1"/>
+              </w:rPr>
+              <w:t>workflows</w:t>
+            </w:r>
+          </w:p>
+        </w:tc>
+        <w:tc>
+          <w:tcPr>
+            <w:tcW w:type="dxa" w:w="2409"/>
+            <w:vAlign w:val="center"/>
+          </w:tcPr>
+          <w:p>
+            <w:pPr>
+              <w:spacing w:after="0" w:line="240" w:lineRule="auto"/>
+              <w:jc w:val="left"/>
+            </w:pPr>
+            <w:r>
+              <w:rPr>
+                <w:rFonts w:ascii="Arial" w:hAnsi="Arial" w:eastAsia="Arial" w:cs="Arial"/>
+                <w:b w:val="0"/>
+                <w:color w:val="000000"/>
+                <w:sz w:val="24"/>
+              </w:rPr>
+              <w:t>Analisa operação descentralizada em computação científica</w:t>
+            </w:r>
+          </w:p>
+        </w:tc>
+        <w:tc>
+          <w:tcPr>
+            <w:tcW w:type="dxa" w:w="2863"/>
+            <w:vAlign w:val="center"/>
+          </w:tcPr>
+          <w:p>
+            <w:pPr>
+              <w:spacing w:after="0" w:line="240" w:lineRule="auto"/>
+              <w:jc w:val="left"/>
+            </w:pPr>
+            <w:r>
+              <w:rPr>
+                <w:rFonts w:ascii="Arial" w:hAnsi="Arial" w:eastAsia="Arial" w:cs="Arial"/>
+                <w:b w:val="0"/>
+                <w:color w:val="000000"/>
+                <w:sz w:val="24"/>
+              </w:rPr>
+              <w:t>Referência para descentralização; domínio e unidade de avaliação distintos</w:t>
+            </w:r>
+          </w:p>
+        </w:tc>
+      </w:tr>
+      <w:tr>
+        <w:trPr>
+          <w:cantSplit/>
+        </w:trPr>
+        <w:tc>
+          <w:tcPr>
+            <w:tcW w:type="dxa" w:w="1786"/>
+            <w:vAlign w:val="center"/>
+          </w:tcPr>
+          <w:p>
+            <w:pPr>
+              <w:spacing w:after="0" w:line="240" w:lineRule="auto"/>
+              <w:jc w:val="left"/>
+            </w:pPr>
+            <w:r>
+              <w:rPr>
+                <w:rFonts w:ascii="Arial" w:hAnsi="Arial" w:eastAsia="Arial" w:cs="Arial"/>
+                <w:b w:val="0"/>
+                <w:color w:val="000000"/>
+                <w:sz w:val="24"/>
+              </w:rPr>
+              <w:t xml:space="preserve">Qian </w:t>
+            </w:r>
+            <w:r>
+              <w:rPr>
+                <w:rFonts w:ascii="Arial" w:hAnsi="Arial" w:eastAsia="Arial" w:cs="Arial"/>
+                <w:b w:val="0"/>
+                <w:color w:val="000000"/>
+                <w:sz w:val="24"/>
+                <w:i w:val="1"/>
+                <w:iCs w:val="1"/>
+              </w:rPr>
+              <w:t>et al.</w:t>
+            </w:r>
+            <w:r>
+              <w:rPr>
+                <w:rFonts w:ascii="Arial" w:hAnsi="Arial" w:eastAsia="Arial" w:cs="Arial"/>
+                <w:b w:val="0"/>
+                <w:color w:val="000000"/>
+                <w:sz w:val="24"/>
+              </w:rPr>
+              <w:t xml:space="preserve"> (2025)</w:t>
+            </w:r>
+          </w:p>
+        </w:tc>
+        <w:tc>
+          <w:tcPr>
+            <w:tcW w:type="dxa" w:w="2353"/>
+            <w:vAlign w:val="center"/>
+          </w:tcPr>
+          <w:p>
+            <w:pPr>
+              <w:spacing w:after="0" w:line="240" w:lineRule="auto"/>
+              <w:jc w:val="left"/>
+            </w:pPr>
+            <w:r>
+              <w:rPr>
+                <w:rFonts w:ascii="Arial" w:hAnsi="Arial" w:eastAsia="Arial" w:cs="Arial"/>
+                <w:b w:val="0"/>
+                <w:color w:val="000000"/>
+                <w:sz w:val="24"/>
+              </w:rPr>
+              <w:t>Grafos acíclicos direcionados, escala e forma das conexões</w:t>
+            </w:r>
+          </w:p>
+        </w:tc>
+        <w:tc>
+          <w:tcPr>
+            <w:tcW w:type="dxa" w:w="2409"/>
+            <w:vAlign w:val="center"/>
+          </w:tcPr>
+          <w:p>
+            <w:pPr>
+              <w:spacing w:after="0" w:line="240" w:lineRule="auto"/>
+              <w:jc w:val="left"/>
+            </w:pPr>
+            <w:r>
+              <w:rPr>
+                <w:rFonts w:ascii="Arial" w:hAnsi="Arial" w:eastAsia="Arial" w:cs="Arial"/>
+                <w:b w:val="0"/>
+                <w:color w:val="000000"/>
+                <w:sz w:val="24"/>
+              </w:rPr>
+              <w:t>Varia quantidade e topologia dos agentes</w:t>
+            </w:r>
+          </w:p>
+        </w:tc>
+        <w:tc>
+          <w:tcPr>
+            <w:tcW w:type="dxa" w:w="2863"/>
+            <w:vAlign w:val="center"/>
+          </w:tcPr>
+          <w:p>
+            <w:pPr>
+              <w:spacing w:after="0" w:line="240" w:lineRule="auto"/>
+              <w:jc w:val="left"/>
+            </w:pPr>
+            <w:r>
+              <w:rPr>
+                <w:rFonts w:ascii="Arial" w:hAnsi="Arial" w:eastAsia="Arial" w:cs="Arial"/>
+                <w:b w:val="0"/>
+                <w:color w:val="000000"/>
+                <w:sz w:val="24"/>
+              </w:rPr>
+              <w:t>Mostra que escala e topologia interagem; não compara as três condições do MAB</w:t>
+            </w:r>
+          </w:p>
+        </w:tc>
+      </w:tr>
+      <w:tr>
+        <w:trPr>
+          <w:cantSplit/>
+        </w:trPr>
+        <w:tc>
+          <w:tcPr>
+            <w:tcW w:type="dxa" w:w="1786"/>
+            <w:vAlign w:val="center"/>
+          </w:tcPr>
+          <w:p>
+            <w:pPr>
+              <w:spacing w:after="0" w:line="240" w:lineRule="auto"/>
+              <w:jc w:val="left"/>
+            </w:pPr>
+            <w:r>
+              <w:rPr>
+                <w:rFonts w:ascii="Arial" w:hAnsi="Arial" w:eastAsia="Arial" w:cs="Arial"/>
+                <w:b w:val="0"/>
+                <w:color w:val="000000"/>
+                <w:sz w:val="24"/>
+              </w:rPr>
+              <w:t xml:space="preserve">Zhu </w:t>
+            </w:r>
+            <w:r>
+              <w:rPr>
+                <w:rFonts w:ascii="Arial" w:hAnsi="Arial" w:eastAsia="Arial" w:cs="Arial"/>
+                <w:b w:val="0"/>
+                <w:color w:val="000000"/>
+                <w:sz w:val="24"/>
+                <w:i w:val="1"/>
+                <w:iCs w:val="1"/>
+              </w:rPr>
+              <w:t>et al.</w:t>
+            </w:r>
+            <w:r>
+              <w:rPr>
+                <w:rFonts w:ascii="Arial" w:hAnsi="Arial" w:eastAsia="Arial" w:cs="Arial"/>
+                <w:b w:val="0"/>
+                <w:color w:val="000000"/>
+                <w:sz w:val="24"/>
+              </w:rPr>
+              <w:t xml:space="preserve"> (2025)</w:t>
+            </w:r>
+          </w:p>
+        </w:tc>
+        <w:tc>
+          <w:tcPr>
+            <w:tcW w:type="dxa" w:w="2353"/>
+            <w:vAlign w:val="center"/>
+          </w:tcPr>
+          <w:p>
+            <w:pPr>
+              <w:spacing w:after="0" w:line="240" w:lineRule="auto"/>
+              <w:jc w:val="left"/>
+            </w:pPr>
+            <w:r>
+              <w:rPr>
+                <w:rFonts w:ascii="Arial" w:hAnsi="Arial" w:eastAsia="Arial" w:cs="Arial"/>
+                <w:b w:val="0"/>
+                <w:color w:val="000000"/>
+                <w:sz w:val="24"/>
+              </w:rPr>
+              <w:t>Protocolos em estrela, cadeia, árvore e grafo</w:t>
+            </w:r>
+          </w:p>
+        </w:tc>
+        <w:tc>
+          <w:tcPr>
+            <w:tcW w:type="dxa" w:w="2409"/>
+            <w:vAlign w:val="center"/>
+          </w:tcPr>
+          <w:p>
+            <w:pPr>
+              <w:spacing w:after="0" w:line="240" w:lineRule="auto"/>
+              <w:jc w:val="left"/>
+            </w:pPr>
+            <w:r>
+              <w:rPr>
+                <w:rFonts w:ascii="Arial" w:hAnsi="Arial" w:eastAsia="Arial" w:cs="Arial"/>
+                <w:b w:val="0"/>
+                <w:i w:val="1"/>
+                <w:color w:val="000000"/>
+                <w:sz w:val="24"/>
+                <w:iCs w:val="1"/>
+              </w:rPr>
+              <w:t>Benchmark</w:t>
+            </w:r>
+            <w:r>
+              <w:rPr>
+                <w:rFonts w:ascii="Arial" w:hAnsi="Arial" w:eastAsia="Arial" w:cs="Arial"/>
+                <w:b w:val="0"/>
+                <w:color w:val="000000"/>
+                <w:sz w:val="24"/>
+              </w:rPr>
+              <w:t xml:space="preserve"> interativo com indicadores de tarefa e colaboração</w:t>
+            </w:r>
+          </w:p>
+        </w:tc>
+        <w:tc>
+          <w:tcPr>
+            <w:tcW w:type="dxa" w:w="2863"/>
+            <w:vAlign w:val="center"/>
+          </w:tcPr>
+          <w:p>
+            <w:pPr>
+              <w:spacing w:after="0" w:line="240" w:lineRule="auto"/>
+              <w:jc w:val="left"/>
+            </w:pPr>
+            <w:r>
+              <w:rPr>
+                <w:rFonts w:ascii="Arial" w:hAnsi="Arial" w:eastAsia="Arial" w:cs="Arial"/>
+                <w:b w:val="0"/>
+                <w:color w:val="000000"/>
+                <w:sz w:val="24"/>
+              </w:rPr>
+              <w:t>Correlato forte para topologia como variável experimental; cenários e protocolos distintos</w:t>
+            </w:r>
+          </w:p>
+        </w:tc>
+      </w:tr>
+      <w:tr>
+        <w:trPr>
+          <w:cantSplit/>
+        </w:trPr>
+        <w:tc>
+          <w:tcPr>
+            <w:tcW w:type="dxa" w:w="1786"/>
             <w:vAlign w:val="center"/>
           </w:tcPr>
           <w:p>
@@ -6124,7 +6255,7 @@
         </w:tc>
         <w:tc>
           <w:tcPr>
-            <w:tcW w:type="dxa" w:w="1984"/>
+            <w:tcW w:type="dxa" w:w="2353"/>
             <w:vAlign w:val="center"/>
           </w:tcPr>
           <w:p>
@@ -6139,13 +6270,13 @@
                 <w:color w:val="000000"/>
                 <w:sz w:val="24"/>
               </w:rPr>
-              <w:t>Tarefas gerais dependentes de contexto</w:t>
+              <w:t>Governança e controle de participação, interação e histórico</w:t>
             </w:r>
           </w:p>
         </w:tc>
         <w:tc>
           <w:tcPr>
-            <w:tcW w:type="dxa" w:w="2494"/>
+            <w:tcW w:type="dxa" w:w="2409"/>
             <w:vAlign w:val="center"/>
           </w:tcPr>
           <w:p>
@@ -6160,13 +6291,13 @@
                 <w:color w:val="000000"/>
                 <w:sz w:val="24"/>
               </w:rPr>
-              <w:t>Dimensões de governança, participação, interação e histórico</w:t>
+              <w:t>Relaciona mecanismos à qualidade e ao custo computacional</w:t>
             </w:r>
           </w:p>
         </w:tc>
         <w:tc>
           <w:tcPr>
-            <w:tcW w:type="dxa" w:w="3288"/>
+            <w:tcW w:type="dxa" w:w="2863"/>
             <w:vAlign w:val="center"/>
           </w:tcPr>
           <w:p>
@@ -6181,7 +6312,38 @@
                 <w:color w:val="000000"/>
                 <w:sz w:val="24"/>
               </w:rPr>
-              <w:t>Oferece critérios para caracterizar coordenação; não cobre o domínio farmacêutico</w:t>
+              <w:t xml:space="preserve">Fornece dimensões observáveis para descrever orquestração, </w:t>
+            </w:r>
+            <w:r>
+              <w:rPr>
+                <w:rFonts w:ascii="Arial" w:hAnsi="Arial" w:eastAsia="Arial" w:cs="Arial"/>
+                <w:b w:val="0"/>
+                <w:i w:val="1"/>
+                <w:color w:val="000000"/>
+                <w:sz w:val="24"/>
+                <w:iCs w:val="1"/>
+              </w:rPr>
+              <w:t>workflow</w:t>
+            </w:r>
+            <w:r>
+              <w:rPr>
+                <w:rFonts w:ascii="Arial" w:hAnsi="Arial" w:eastAsia="Arial" w:cs="Arial"/>
+                <w:b w:val="0"/>
+                <w:color w:val="000000"/>
+                <w:sz w:val="24"/>
+              </w:rPr>
+              <w:t xml:space="preserve"> e </w:t>
+            </w:r>
+            <w:r>
+              <w:rPr>
+                <w:rFonts w:ascii="Arial" w:hAnsi="Arial" w:eastAsia="Arial" w:cs="Arial"/>
+                <w:b w:val="0"/>
+                <w:i w:val="1"/>
+                <w:color w:val="000000"/>
+                <w:sz w:val="24"/>
+                <w:iCs w:val="1"/>
+              </w:rPr>
+              <w:t>swarm</w:t>
             </w:r>
           </w:p>
         </w:tc>
@@ -6192,7 +6354,146 @@
         </w:trPr>
         <w:tc>
           <w:tcPr>
-            <w:tcW w:type="dxa" w:w="1587"/>
+            <w:tcW w:type="dxa" w:w="1786"/>
+            <w:vAlign w:val="center"/>
+          </w:tcPr>
+          <w:p>
+            <w:pPr>
+              <w:spacing w:after="0" w:line="240" w:lineRule="auto"/>
+              <w:jc w:val="left"/>
+            </w:pPr>
+            <w:r>
+              <w:rPr>
+                <w:rFonts w:ascii="Arial" w:hAnsi="Arial" w:eastAsia="Arial" w:cs="Arial"/>
+                <w:b w:val="0"/>
+                <w:color w:val="000000"/>
+                <w:sz w:val="24"/>
+              </w:rPr>
+              <w:t xml:space="preserve">Zhou </w:t>
+            </w:r>
+            <w:r>
+              <w:rPr>
+                <w:rFonts w:ascii="Arial" w:hAnsi="Arial" w:eastAsia="Arial" w:cs="Arial"/>
+                <w:b w:val="0"/>
+                <w:color w:val="000000"/>
+                <w:sz w:val="24"/>
+                <w:i w:val="1"/>
+                <w:iCs w:val="1"/>
+              </w:rPr>
+              <w:t>et al.</w:t>
+            </w:r>
+            <w:r>
+              <w:rPr>
+                <w:rFonts w:ascii="Arial" w:hAnsi="Arial" w:eastAsia="Arial" w:cs="Arial"/>
+                <w:b w:val="0"/>
+                <w:color w:val="000000"/>
+                <w:sz w:val="24"/>
+              </w:rPr>
+              <w:t xml:space="preserve"> (2026)</w:t>
+            </w:r>
+          </w:p>
+        </w:tc>
+        <w:tc>
+          <w:tcPr>
+            <w:tcW w:type="dxa" w:w="2353"/>
+            <w:vAlign w:val="center"/>
+          </w:tcPr>
+          <w:p>
+            <w:pPr>
+              <w:spacing w:after="0" w:line="240" w:lineRule="auto"/>
+              <w:jc w:val="left"/>
+            </w:pPr>
+            <w:r>
+              <w:rPr>
+                <w:rFonts w:ascii="Arial" w:hAnsi="Arial" w:eastAsia="Arial" w:cs="Arial"/>
+                <w:b w:val="0"/>
+                <w:color w:val="000000"/>
+                <w:sz w:val="24"/>
+              </w:rPr>
+              <w:t xml:space="preserve">Otimização conjunta de </w:t>
+            </w:r>
+            <w:r>
+              <w:rPr>
+                <w:rFonts w:ascii="Arial" w:hAnsi="Arial" w:eastAsia="Arial" w:cs="Arial"/>
+                <w:b w:val="0"/>
+                <w:i/>
+                <w:color w:val="000000"/>
+                <w:sz w:val="24"/>
+              </w:rPr>
+              <w:t>prompts</w:t>
+            </w:r>
+            <w:r>
+              <w:rPr>
+                <w:rFonts w:ascii="Arial" w:hAnsi="Arial" w:eastAsia="Arial" w:cs="Arial"/>
+                <w:b w:val="0"/>
+                <w:color w:val="000000"/>
+                <w:sz w:val="24"/>
+              </w:rPr>
+              <w:t xml:space="preserve"> e topologias</w:t>
+            </w:r>
+          </w:p>
+        </w:tc>
+        <w:tc>
+          <w:tcPr>
+            <w:tcW w:type="dxa" w:w="2409"/>
+            <w:vAlign w:val="center"/>
+          </w:tcPr>
+          <w:p>
+            <w:pPr>
+              <w:spacing w:after="0" w:line="240" w:lineRule="auto"/>
+              <w:jc w:val="left"/>
+            </w:pPr>
+            <w:r>
+              <w:rPr>
+                <w:rFonts w:ascii="Arial" w:hAnsi="Arial" w:eastAsia="Arial" w:cs="Arial"/>
+                <w:b w:val="0"/>
+                <w:color w:val="000000"/>
+                <w:sz w:val="24"/>
+              </w:rPr>
+              <w:t xml:space="preserve">Separa desenho local dos agentes e orquestração do </w:t>
+            </w:r>
+            <w:r>
+              <w:rPr>
+                <w:rFonts w:ascii="Arial" w:hAnsi="Arial" w:eastAsia="Arial" w:cs="Arial"/>
+                <w:b w:val="0"/>
+                <w:i w:val="1"/>
+                <w:color w:val="000000"/>
+                <w:sz w:val="24"/>
+                <w:iCs w:val="1"/>
+              </w:rPr>
+              <w:t>workflow</w:t>
+            </w:r>
+          </w:p>
+        </w:tc>
+        <w:tc>
+          <w:tcPr>
+            <w:tcW w:type="dxa" w:w="2863"/>
+            <w:vAlign w:val="center"/>
+          </w:tcPr>
+          <w:p>
+            <w:pPr>
+              <w:spacing w:after="0" w:line="240" w:lineRule="auto"/>
+              <w:jc w:val="left"/>
+            </w:pPr>
+            <w:r>
+              <w:rPr>
+                <w:rFonts w:ascii="Arial" w:hAnsi="Arial" w:eastAsia="Arial" w:cs="Arial"/>
+                <w:b w:val="0"/>
+                <w:color w:val="000000"/>
+                <w:sz w:val="24"/>
+              </w:rPr>
+              <w:t>Sustenta o controle de variáveis não arquiteturais no experimento</w:t>
+            </w:r>
+          </w:p>
+        </w:tc>
+      </w:tr>
+      <w:tr>
+        <w:trPr>
+          <w:cantSplit/>
+        </w:trPr>
+        <w:tc>
+          <w:tcPr>
+            <w:tcW w:type="dxa" w:w="1786"/>
             <w:vAlign w:val="center"/>
           </w:tcPr>
           <w:p>
@@ -6233,39 +6534,7 @@
         </w:tc>
         <w:tc>
           <w:tcPr>
-            <w:tcW w:type="dxa" w:w="1984"/>
-            <w:vAlign w:val="center"/>
-          </w:tcPr>
-          <w:p>
-            <w:pPr>
-              <w:spacing w:after="0" w:line="240" w:lineRule="auto"/>
-              <w:jc w:val="left"/>
-            </w:pPr>
-            <w:r>
-              <w:rPr>
-                <w:rFonts w:ascii="Arial" w:hAnsi="Arial" w:eastAsia="Arial" w:cs="Arial"/>
-                <w:b w:val="0"/>
-                <w:color w:val="000000"/>
-                <w:sz w:val="24"/>
-                <w:i w:val="1"/>
-                <w:iCs w:val="1"/>
-              </w:rPr>
-              <w:t>Benchmarks</w:t>
-            </w:r>
-            <w:r>
-              <w:rPr>
-                <w:rFonts w:ascii="Arial" w:hAnsi="Arial" w:eastAsia="Arial" w:cs="Arial"/>
-                <w:b w:val="0"/>
-                <w:color w:val="000000"/>
-                <w:sz w:val="24"/>
-              </w:rPr>
-              <w:t xml:space="preserve"> gerais de raciocínio e colaboração</w:t>
-            </w:r>
-          </w:p>
-        </w:tc>
-        <w:tc>
-          <w:tcPr>
-            <w:tcW w:type="dxa" w:w="2494"/>
+            <w:tcW w:type="dxa" w:w="2353"/>
             <w:vAlign w:val="center"/>
           </w:tcPr>
           <w:p>
@@ -6280,13 +6549,13 @@
                 <w:color w:val="000000"/>
                 <w:sz w:val="24"/>
               </w:rPr>
-              <w:t>Comparação de arquiteturas centralizadas, descentralizadas e híbridas</w:t>
+              <w:t>Agente único, independentes, centralizada, descentralizada e híbrida</w:t>
             </w:r>
           </w:p>
         </w:tc>
         <w:tc>
           <w:tcPr>
-            <w:tcW w:type="dxa" w:w="3288"/>
+            <w:tcW w:type="dxa" w:w="2409"/>
             <w:vAlign w:val="center"/>
           </w:tcPr>
           <w:p>
@@ -6301,7 +6570,28 @@
                 <w:color w:val="000000"/>
                 <w:sz w:val="24"/>
               </w:rPr>
-              <w:t>Correlato metodológico mais próximo; não inclui atendimento farmacêutico</w:t>
+              <w:t>Comparação controlada entre modelos e classes de tarefa</w:t>
+            </w:r>
+          </w:p>
+        </w:tc>
+        <w:tc>
+          <w:tcPr>
+            <w:tcW w:type="dxa" w:w="2863"/>
+            <w:vAlign w:val="center"/>
+          </w:tcPr>
+          <w:p>
+            <w:pPr>
+              <w:spacing w:after="0" w:line="240" w:lineRule="auto"/>
+              <w:jc w:val="left"/>
+            </w:pPr>
+            <w:r>
+              <w:rPr>
+                <w:rFonts w:ascii="Arial" w:hAnsi="Arial" w:eastAsia="Arial" w:cs="Arial"/>
+                <w:b w:val="0"/>
+                <w:color w:val="000000"/>
+                <w:sz w:val="24"/>
+              </w:rPr>
+              <w:t>Correlato metodológico mais próximo; não cobre atendimento e uso de ferramentas farmacêuticas</w:t>
             </w:r>
           </w:p>
         </w:tc>
@@ -6328,36 +6618,25 @@
           <w:color w:val="000000"/>
           <w:sz w:val="24"/>
         </w:rPr>
-        <w:t xml:space="preserve">A análise evidencia duas aproximações parciais. Os estudos farmacêuticos possuem alta aderência ao domínio, mas tratam sistemas especializados ou </w:t>
-      </w:r>
-      <w:r>
-        <w:rPr>
-          <w:rFonts w:ascii="Arial" w:hAnsi="Arial" w:eastAsia="Arial" w:cs="Arial"/>
-          <w:color w:val="000000"/>
-          <w:sz w:val="24"/>
+        <w:t xml:space="preserve">Os correlatos mais próximos da pergunta de pesquisa são Kim </w:t>
+      </w:r>
+      <w:r>
+        <w:rPr>
+          <w:rFonts w:ascii="Arial" w:hAnsi="Arial" w:eastAsia="Arial" w:cs="Arial"/>
           <w:i w:val="1"/>
           <w:iCs w:val="1"/>
-        </w:rPr>
-        <w:t>pipelines</w:t>
-      </w:r>
-      <w:r>
-        <w:rPr>
-          <w:rFonts w:ascii="Arial" w:hAnsi="Arial" w:eastAsia="Arial" w:cs="Arial"/>
-          <w:color w:val="000000"/>
-          <w:sz w:val="24"/>
-        </w:rPr>
-        <w:t xml:space="preserve"> únicos. Os estudos multiagentes tornam a coordenação observável e comparável, porém avaliam tarefas clínicas, administrativas ou gerais que não reproduzem a diversidade do atendimento em farmácias. Essa separação impede transportar diretamente resultados de um grupo para o outro.</w:t>
-      </w:r>
-    </w:p>
-    <w:p>
-      <w:pPr/>
-      <w:r>
-        <w:rPr>
-          <w:rFonts w:ascii="Arial" w:hAnsi="Arial" w:eastAsia="Arial" w:cs="Arial"/>
-          <w:color w:val="000000"/>
-          <w:sz w:val="24"/>
-        </w:rPr>
-        <w:t xml:space="preserve">Também há diferenças de avaliação. Pais </w:t>
+          <w:color w:val="000000"/>
+          <w:sz w:val="24"/>
+        </w:rPr>
+        <w:t>et al.</w:t>
+      </w:r>
+      <w:r>
+        <w:rPr>
+          <w:rFonts w:ascii="Arial" w:hAnsi="Arial" w:eastAsia="Arial" w:cs="Arial"/>
+          <w:color w:val="000000"/>
+          <w:sz w:val="24"/>
+        </w:rPr>
+        <w:t xml:space="preserve"> (2026), Wang </w:t>
       </w:r>
       <w:r>
         <w:rPr>
@@ -6375,7 +6654,7 @@
           <w:color w:val="000000"/>
           <w:sz w:val="24"/>
         </w:rPr>
-        <w:t xml:space="preserve"> (2024), Dou </w:t>
+        <w:t xml:space="preserve"> (2025), Zhu </w:t>
       </w:r>
       <w:r>
         <w:rPr>
@@ -6393,7 +6672,7 @@
           <w:color w:val="000000"/>
           <w:sz w:val="24"/>
         </w:rPr>
-        <w:t xml:space="preserve"> (2025), Pandey, Amod e Kumar (2024) e Lu </w:t>
+        <w:t xml:space="preserve"> (2025), Qian </w:t>
       </w:r>
       <w:r>
         <w:rPr>
@@ -6411,7 +6690,7 @@
           <w:color w:val="000000"/>
           <w:sz w:val="24"/>
         </w:rPr>
-        <w:t xml:space="preserve"> (2024) incorporam conhecimento especializado, evidências ou participação profissional. Wang </w:t>
+        <w:t xml:space="preserve"> (2025) e Zhou </w:t>
       </w:r>
       <w:r>
         <w:rPr>
@@ -6429,7 +6708,65 @@
           <w:color w:val="000000"/>
           <w:sz w:val="24"/>
         </w:rPr>
-        <w:t xml:space="preserve"> (2025) e Kim </w:t>
+        <w:t xml:space="preserve"> (2026). Cada um cobre uma parte do problema: comparação de famílias arquiteturais, decomposição dos mecanismos de colaboração, avaliação de protocolos topológicos, efeito da escala e interação entre topologia e configuração dos agentes. Nenhum deles, isoladamente, oferece uma resposta universal sobre qual arquitetura é superior; ao contrário, seus desenhos reforçam que a adequação depende da tarefa e do custo de coordenação.</w:t>
+      </w:r>
+    </w:p>
+    <w:p>
+      <w:pPr/>
+      <w:r>
+        <w:rPr>
+          <w:rFonts w:ascii="Arial" w:hAnsi="Arial" w:eastAsia="Arial" w:cs="Arial"/>
+          <w:color w:val="000000"/>
+          <w:sz w:val="24"/>
+        </w:rPr>
+        <w:t xml:space="preserve">Essa constatação orienta o protocolo do presente trabalho. A variável independente será a arquitetura de coordenação, enquanto cenários, modelo de linguagem, instruções de domínio, ferramentas, contratos de entrada e saída, limites operacionais e critérios de avaliação deverão permanecer constantes. As três condições não são tratadas apenas como nomes de implementação: a orquestração concentra a decisão de roteamento; o </w:t>
+      </w:r>
+      <w:r>
+        <w:rPr>
+          <w:rFonts w:ascii="Arial" w:hAnsi="Arial" w:eastAsia="Arial" w:cs="Arial"/>
+          <w:i w:val="1"/>
+          <w:color w:val="000000"/>
+          <w:sz w:val="24"/>
+          <w:iCs w:val="1"/>
+        </w:rPr>
+        <w:t>workflow</w:t>
+      </w:r>
+      <w:r>
+        <w:rPr>
+          <w:rFonts w:ascii="Arial" w:hAnsi="Arial" w:eastAsia="Arial" w:cs="Arial"/>
+          <w:color w:val="000000"/>
+          <w:sz w:val="24"/>
+        </w:rPr>
+        <w:t xml:space="preserve"> fixa uma sequência de processamento; e o </w:t>
+      </w:r>
+      <w:r>
+        <w:rPr>
+          <w:rFonts w:ascii="Arial" w:hAnsi="Arial" w:eastAsia="Arial" w:cs="Arial"/>
+          <w:i w:val="1"/>
+          <w:color w:val="000000"/>
+          <w:sz w:val="24"/>
+          <w:iCs w:val="1"/>
+        </w:rPr>
+        <w:t>swarm</w:t>
+      </w:r>
+      <w:r>
+        <w:rPr>
+          <w:rFonts w:ascii="Arial" w:hAnsi="Arial" w:eastAsia="Arial" w:cs="Arial"/>
+          <w:color w:val="000000"/>
+          <w:sz w:val="24"/>
+        </w:rPr>
+        <w:t xml:space="preserve"> distribui transferências de responsabilidade entre agentes especializados.</w:t>
+      </w:r>
+    </w:p>
+    <w:p>
+      <w:pPr/>
+      <w:r>
+        <w:rPr>
+          <w:rFonts w:ascii="Arial" w:hAnsi="Arial" w:eastAsia="Arial" w:cs="Arial"/>
+          <w:color w:val="000000"/>
+          <w:sz w:val="24"/>
+        </w:rPr>
+        <w:t xml:space="preserve">Os estudos de Pais </w:t>
       </w:r>
       <w:r>
         <w:rPr>
@@ -6447,7 +6784,25 @@
           <w:color w:val="000000"/>
           <w:sz w:val="24"/>
         </w:rPr>
-        <w:t xml:space="preserve"> (2026) oferecem maior controle sobre mecanismos arquiteturais e custos de colaboração. O desenho do MAB aproxima essas duas exigências ao manter cenários e variáveis controladas entre arquiteturas e prever métricas operacionais, avaliação por LLM e revisão humana estratificada. Trata-se do protocolo proposto; nenhum resultado é antecipado neste capítulo.</w:t>
+        <w:t xml:space="preserve"> (2024), Jagatap, Merugu e Comar (2025) e Lu </w:t>
+      </w:r>
+      <w:r>
+        <w:rPr>
+          <w:rFonts w:ascii="Arial" w:hAnsi="Arial" w:eastAsia="Arial" w:cs="Arial"/>
+          <w:i w:val="1"/>
+          <w:iCs w:val="1"/>
+          <w:color w:val="000000"/>
+          <w:sz w:val="24"/>
+        </w:rPr>
+        <w:t>et al.</w:t>
+      </w:r>
+      <w:r>
+        <w:rPr>
+          <w:rFonts w:ascii="Arial" w:hAnsi="Arial" w:eastAsia="Arial" w:cs="Arial"/>
+          <w:color w:val="000000"/>
+          <w:sz w:val="24"/>
+        </w:rPr>
+        <w:t xml:space="preserve"> (2024) cumprem função distinta. Eles não sustentam a escolha de uma arquitetura, mas justificam que o caso farmacêutico exige observar segurança, rastreabilidade, uso de ferramentas e necessidade de revisão humana. Dessa forma, o domínio acrescenta condições realistas ao experimento sem redefinir a pesquisa como avaliação de uma aplicação farmacêutica específica.</w:t>
       </w:r>
     </w:p>
     <w:p>
@@ -6480,14 +6835,14 @@
           <w:color w:val="000000"/>
           <w:sz w:val="24"/>
         </w:rPr>
-        <w:t xml:space="preserve">A primeira lacuna é de interseção: não foi identificado, entre os trabalhos selecionados, um estudo que compare orquestração centralizada, </w:t>
-      </w:r>
-      <w:r>
-        <w:rPr>
-          <w:rFonts w:ascii="Arial" w:hAnsi="Arial" w:eastAsia="Arial" w:cs="Arial"/>
-          <w:color w:val="000000"/>
-          <w:sz w:val="24"/>
+        <w:t xml:space="preserve">A primeira lacuna é comparativa. Entre os trabalhos selecionados, não foi identificado um experimento que confronte diretamente orquestração centralizada, </w:t>
+      </w:r>
+      <w:r>
+        <w:rPr>
+          <w:rFonts w:ascii="Arial" w:hAnsi="Arial" w:eastAsia="Arial" w:cs="Arial"/>
           <w:i w:val="1"/>
+          <w:color w:val="000000"/>
+          <w:sz w:val="24"/>
           <w:iCs w:val="1"/>
         </w:rPr>
         <w:t>workflow</w:t>
@@ -6498,25 +6853,64 @@
           <w:color w:val="000000"/>
           <w:sz w:val="24"/>
         </w:rPr>
-        <w:t xml:space="preserve"> estruturado e </w:t>
-      </w:r>
-      <w:r>
-        <w:rPr>
-          <w:rFonts w:ascii="Arial" w:hAnsi="Arial" w:eastAsia="Arial" w:cs="Arial"/>
-          <w:color w:val="000000"/>
-          <w:sz w:val="24"/>
+        <w:t xml:space="preserve"> estruturado e coordenação descentralizada por transferências entre agentes, mantendo constante a base tecnológica e o conjunto de tarefas. Há comparações entre topologias e mecanismos próximos, mas as condições não correspondem integralmente às três estratégias implementadas no MAB.</w:t>
+      </w:r>
+    </w:p>
+    <w:p>
+      <w:pPr/>
+      <w:r>
+        <w:rPr>
+          <w:rFonts w:ascii="Arial" w:hAnsi="Arial" w:eastAsia="Arial" w:cs="Arial"/>
+          <w:color w:val="000000"/>
+          <w:sz w:val="24"/>
+        </w:rPr>
+        <w:t xml:space="preserve">A segunda lacuna é de controle causal. Modelo, </w:t>
+      </w:r>
+      <w:r>
+        <w:rPr>
+          <w:rFonts w:ascii="Arial" w:hAnsi="Arial" w:eastAsia="Arial" w:cs="Arial"/>
+          <w:i/>
+          <w:color w:val="000000"/>
+          <w:sz w:val="24"/>
+        </w:rPr>
+        <w:t>prompt</w:t>
+      </w:r>
+      <w:r>
+        <w:rPr>
+          <w:rFonts w:ascii="Arial" w:hAnsi="Arial" w:eastAsia="Arial" w:cs="Arial"/>
+          <w:color w:val="000000"/>
+          <w:sz w:val="24"/>
+        </w:rPr>
+        <w:t>, quantidade de agentes, ferramentas, topologia e dificuldade da tarefa podem alterar simultaneamente o comportamento do sistema. Quando esses elementos variam em conjunto, torna-se difícil atribuir diferenças à arquitetura. O protocolo proposto busca reduzir essa ameaça ao controlar os componentes não arquiteturais e registrar eventos de coordenação em todas as condições.</w:t>
+      </w:r>
+    </w:p>
+    <w:p>
+      <w:pPr/>
+      <w:r>
+        <w:rPr>
+          <w:rFonts w:ascii="Arial" w:hAnsi="Arial" w:eastAsia="Arial" w:cs="Arial"/>
+          <w:color w:val="000000"/>
+          <w:sz w:val="24"/>
+        </w:rPr>
+        <w:t xml:space="preserve">A terceira lacuna está entre avaliação arquitetural e operação com ferramentas. Parte dos </w:t>
+      </w:r>
+      <w:r>
+        <w:rPr>
+          <w:rFonts w:ascii="Arial" w:hAnsi="Arial" w:eastAsia="Arial" w:cs="Arial"/>
           <w:i w:val="1"/>
+          <w:color w:val="000000"/>
+          <w:sz w:val="24"/>
           <w:iCs w:val="1"/>
         </w:rPr>
-        <w:t>swarm</w:t>
-      </w:r>
-      <w:r>
-        <w:rPr>
-          <w:rFonts w:ascii="Arial" w:hAnsi="Arial" w:eastAsia="Arial" w:cs="Arial"/>
-          <w:color w:val="000000"/>
-          <w:sz w:val="24"/>
-        </w:rPr>
-        <w:t xml:space="preserve"> no mesmo conjunto de atendimentos farmacêuticos. Soluções diretamente ligadas a farmácias privilegiam uma tarefa e uma arquitetura; comparações arquiteturais amplas utilizam outros domínios.</w:t>
+        <w:t>benchmarks</w:t>
+      </w:r>
+      <w:r>
+        <w:rPr>
+          <w:rFonts w:ascii="Arial" w:hAnsi="Arial" w:eastAsia="Arial" w:cs="Arial"/>
+          <w:color w:val="000000"/>
+          <w:sz w:val="24"/>
+        </w:rPr>
+        <w:t xml:space="preserve"> multiagentes privilegia raciocínio, debate ou produção de artefatos gerais, enquanto serviços reais exigem roteamento, consultas externas, preservação de contexto, rastreabilidade e encaminhamento humano. O estudo de caso em farmácias foi escolhido por reunir essas demandas em cenários heterogêneos e por impor requisitos explícitos de segurança.</w:t>
       </w:r>
     </w:p>
     <w:p>
@@ -6527,7 +6921,24 @@
           <w:color w:val="000000"/>
           <w:sz w:val="24"/>
         </w:rPr>
-        <w:t>A segunda lacuna é de controle experimental. Comparar sistemas construídos para tarefas diferentes não permite atribuir variações de qualidade, custo ou latência à estratégia de coordenação. Para reduzir esse problema, o MAB propõe manter constantes cenários, ferramentas, modelo de linguagem, critérios de avaliação e número de repetições, alterando prioritariamente a forma de distribuir controle e comunicação.</w:t>
+        <w:t xml:space="preserve">A quarta lacuna é de avaliação integrada. Métricas de conclusão da tarefa não descrevem sozinhas o custo e a qualidade da coordenação; por outro lado, latência, </w:t>
+      </w:r>
+      <w:r>
+        <w:rPr>
+          <w:rFonts w:ascii="Arial" w:hAnsi="Arial" w:eastAsia="Arial" w:cs="Arial"/>
+          <w:i/>
+          <w:color w:val="000000"/>
+          <w:sz w:val="24"/>
+        </w:rPr>
+        <w:t>tokens</w:t>
+      </w:r>
+      <w:r>
+        <w:rPr>
+          <w:rFonts w:ascii="Arial" w:hAnsi="Arial" w:eastAsia="Arial" w:cs="Arial"/>
+          <w:color w:val="000000"/>
+          <w:sz w:val="24"/>
+        </w:rPr>
+        <w:t xml:space="preserve"> e quantidade de interações não bastam para avaliar a adequação da resposta. A pesquisa propõe combinar métricas operacionais e de coordenação com avaliação de qualidade e revisão humana estratificada, sem antecipar resultados.</w:t>
       </w:r>
     </w:p>
     <w:p>
@@ -6538,18 +6949,7 @@
           <w:color w:val="000000"/>
           <w:sz w:val="24"/>
         </w:rPr>
-        <w:t>A terceira lacuna envolve segurança e avaliação. Métricas operacionais são necessárias para observar tokens, latência, ferramentas e transferências, mas não bastam para julgar respostas em saúde. Os trabalhos farmacêuticos e clínicos reforçam a necessidade de salvaguardas, evidência e revisão profissional. Por isso, o protocolo do MAB prevê avaliação híbrida e encaminhamento ao farmacêutico em situações sensíveis, sem atribuir autonomia clínica ao sistema.</w:t>
-      </w:r>
-    </w:p>
-    <w:p>
-      <w:pPr/>
-      <w:r>
-        <w:rPr>
-          <w:rFonts w:ascii="Arial" w:hAnsi="Arial" w:eastAsia="Arial" w:cs="Arial"/>
-          <w:color w:val="000000"/>
-          <w:sz w:val="24"/>
-        </w:rPr>
-        <w:t>Assim, a oportunidade de pesquisa está em aproximar o rigor das comparações arquiteturais das exigências práticas do atendimento farmacêutico. O MAB se posiciona como um estudo comparativo dessa interseção. Sua contribuição pretendida é produzir evidências sobre os efeitos da coordenação no contexto delimitado; a confirmação de qualquer vantagem, limitação ou contribuição permanece condicionada à execução e à validação dos experimentos.</w:t>
+        <w:t>Assim, a contribuição pretendida é arquitetural: produzir evidências comparáveis sobre três formas de coordenar agentes baseados em modelos de linguagem sob um protocolo comum. O atendimento em farmácias constitui o estudo de caso que torna essa comparação observável em um ambiente de serviço com ferramentas e restrições de segurança. Eventuais generalizações para outros domínios dependerão das evidências experimentais e deverão respeitar os limites desse recorte.</w:t>
       </w:r>
     </w:p>
     <w:p>
@@ -6582,7 +6982,7 @@
           <w:color w:val="000000"/>
           <w:sz w:val="24"/>
         </w:rPr>
-        <w:t>Este capítulo apresenta os procedimentos metodológicos empregados no desenvolvimento e na avaliação do MAB (</w:t>
+        <w:t xml:space="preserve">Este capítulo apresenta os procedimentos metodológicos empregados na comparação de três arquiteturas de coordenação de sistemas multiagentes — orquestração centralizada, </w:t>
       </w:r>
       <w:r>
         <w:rPr>
@@ -6592,6 +6992,42 @@
           <w:sz w:val="24"/>
           <w:iCs w:val="1"/>
         </w:rPr>
+        <w:t>workflow</w:t>
+      </w:r>
+      <w:r>
+        <w:rPr>
+          <w:rFonts w:ascii="Arial" w:hAnsi="Arial" w:eastAsia="Arial" w:cs="Arial"/>
+          <w:color w:val="000000"/>
+          <w:sz w:val="24"/>
+        </w:rPr>
+        <w:t xml:space="preserve"> estruturado e coordenação descentralizada por </w:t>
+      </w:r>
+      <w:r>
+        <w:rPr>
+          <w:rFonts w:ascii="Arial" w:hAnsi="Arial" w:eastAsia="Arial" w:cs="Arial"/>
+          <w:i w:val="1"/>
+          <w:color w:val="000000"/>
+          <w:sz w:val="24"/>
+          <w:iCs w:val="1"/>
+        </w:rPr>
+        <w:t>handoffs</w:t>
+      </w:r>
+      <w:r>
+        <w:rPr>
+          <w:rFonts w:ascii="Arial" w:hAnsi="Arial" w:eastAsia="Arial" w:cs="Arial"/>
+          <w:color w:val="000000"/>
+          <w:sz w:val="24"/>
+        </w:rPr>
+        <w:t>. O MAB (</w:t>
+      </w:r>
+      <w:r>
+        <w:rPr>
+          <w:rFonts w:ascii="Arial" w:hAnsi="Arial" w:eastAsia="Arial" w:cs="Arial"/>
+          <w:i w:val="1"/>
+          <w:color w:val="000000"/>
+          <w:sz w:val="24"/>
+          <w:iCs w:val="1"/>
+        </w:rPr>
         <w:t>multi-agent benchmark</w:t>
       </w:r>
       <w:r>
@@ -6600,43 +7036,7 @@
           <w:color w:val="000000"/>
           <w:sz w:val="24"/>
         </w:rPr>
-        <w:t xml:space="preserve">). A metodologia foi definida de modo a permitir a comparação controlada entre três arquiteturas de coordenação de sistemas multiagentes — orquestração centralizada, </w:t>
-      </w:r>
-      <w:r>
-        <w:rPr>
-          <w:rFonts w:ascii="Arial" w:hAnsi="Arial" w:eastAsia="Arial" w:cs="Arial"/>
-          <w:i w:val="1"/>
-          <w:color w:val="000000"/>
-          <w:sz w:val="24"/>
-          <w:iCs w:val="1"/>
-        </w:rPr>
-        <w:t>workflow</w:t>
-      </w:r>
-      <w:r>
-        <w:rPr>
-          <w:rFonts w:ascii="Arial" w:hAnsi="Arial" w:eastAsia="Arial" w:cs="Arial"/>
-          <w:color w:val="000000"/>
-          <w:sz w:val="24"/>
-        </w:rPr>
-        <w:t xml:space="preserve"> estruturado e coordenação descentralizada por </w:t>
-      </w:r>
-      <w:r>
-        <w:rPr>
-          <w:rFonts w:ascii="Arial" w:hAnsi="Arial" w:eastAsia="Arial" w:cs="Arial"/>
-          <w:i w:val="1"/>
-          <w:color w:val="000000"/>
-          <w:sz w:val="24"/>
-          <w:iCs w:val="1"/>
-        </w:rPr>
-        <w:t>handoffs</w:t>
-      </w:r>
-      <w:r>
-        <w:rPr>
-          <w:rFonts w:ascii="Arial" w:hAnsi="Arial" w:eastAsia="Arial" w:cs="Arial"/>
-          <w:color w:val="000000"/>
-          <w:sz w:val="24"/>
-        </w:rPr>
-        <w:t xml:space="preserve"> — aplicadas ao mesmo contexto de atendimento farmacêutico.</w:t>
+        <w:t>) é o instrumento experimental utilizado para implementar as condições e submetê-las ao mesmo estudo de caso de atendimento em farmácias.</w:t>
       </w:r>
     </w:p>
     <w:p>
@@ -6781,7 +7181,7 @@
           <w:color w:val="000000"/>
           <w:sz w:val="24"/>
         </w:rPr>
-        <w:t>O objeto experimental desta pesquisa é o MAB, plataforma desenvolvida para executar cenários padronizados de atendimento utilizando diferentes arquiteturas multiagentes e registrar os eventos decorrentes de cada execução.</w:t>
+        <w:t>O objeto de análise desta pesquisa é a arquitetura de coordenação: a forma como controle, contexto e responsabilidade são distribuídos entre agentes baseados em modelos de linguagem. O MAB é a plataforma experimental desenvolvida para executar cenários padronizados sob diferentes condições arquiteturais e registrar os eventos decorrentes de cada execução.</w:t>
       </w:r>
     </w:p>
     <w:p>
@@ -6792,7 +7192,7 @@
           <w:color w:val="000000"/>
           <w:sz w:val="24"/>
         </w:rPr>
-        <w:t>O domínio de aplicação escolhido é o atendimento em farmácias. Esse contexto reúne demandas de diferentes naturezas, como perguntas frequentes, consultas de disponibilidade de produtos, interpretação inicial de anexos, continuidade de conversas e situações em que o sistema deve reconhecer a necessidade de encaminhamento para um profissional da saúde.</w:t>
+        <w:t>O atendimento em farmácias foi escolhido como estudo de caso instrumental. Esse contexto reúne demandas de diferentes naturezas, como perguntas frequentes, consultas de disponibilidade de produtos, interpretação inicial de anexos, continuidade de conversas e situações em que o sistema deve reconhecer a necessidade de encaminhamento para um profissional da saúde. A comparação permanece delimitada por esse recorte, e qualquer transferência de conclusões para outros domínios deverá considerar as evidências e as ameaças à validade externa.</w:t>
       </w:r>
     </w:p>
     <w:p>
@@ -7272,7 +7672,7 @@
                     <a:blip r:embed="rId14">
                       <a:extLst>
                         <a:ext uri="{96DAC541-7B7A-43D3-8B79-37D633B846F1}">
-                          <ns0:svgBlip xmlns:ns0="http://schemas.microsoft.com/office/drawing/2016/SVG/main" r:embed="rId22"/>
+                          <ns0:svgBlip xmlns:ns0="http://schemas.microsoft.com/office/drawing/2016/SVG/main" r:embed="rId30"/>
                         </a:ext>
                       </a:extLst>
                     </a:blip>
@@ -7534,7 +7934,7 @@
                     <a:blip r:embed="rId16">
                       <a:extLst>
                         <a:ext uri="{96DAC541-7B7A-43D3-8B79-37D633B846F1}">
-                          <ns1:svgBlip xmlns:ns1="http://schemas.microsoft.com/office/drawing/2016/SVG/main" r:embed="rId23"/>
+                          <ns1:svgBlip xmlns:ns1="http://schemas.microsoft.com/office/drawing/2016/SVG/main" r:embed="rId31"/>
                         </a:ext>
                       </a:extLst>
                     </a:blip>
@@ -8013,7 +8413,7 @@
                     <a:blip r:embed="rId18">
                       <a:extLst>
                         <a:ext uri="{96DAC541-7B7A-43D3-8B79-37D633B846F1}">
-                          <ns2:svgBlip xmlns:ns2="http://schemas.microsoft.com/office/drawing/2016/SVG/main" r:embed="rId24"/>
+                          <ns2:svgBlip xmlns:ns2="http://schemas.microsoft.com/office/drawing/2016/SVG/main" r:embed="rId32"/>
                         </a:ext>
                       </a:extLst>
                     </a:blip>
@@ -8444,7 +8844,7 @@
           <w:color w:val="000000"/>
           <w:sz w:val="24"/>
         </w:rPr>
-        <w:t xml:space="preserve"> influencia a eficiência operacional, a qualidade das respostas e o custo de coordenação de um sistema de atendimento farmacêutico, quando as demais condições são mantidas constantes?</w:t>
+        <w:t xml:space="preserve"> influencia a eficiência operacional, a qualidade das respostas e o custo de coordenação de um sistema multiagente baseado em modelos de linguagem, quando as demais condições são mantidas constantes em um estudo de caso de atendimento em farmácias?</w:t>
       </w:r>
     </w:p>
     <w:p>
@@ -9063,7 +9463,7 @@
                     <a:blip r:embed="rId20">
                       <a:extLst>
                         <a:ext uri="{96DAC541-7B7A-43D3-8B79-37D633B846F1}">
-                          <ns3:svgBlip xmlns:ns3="http://schemas.microsoft.com/office/drawing/2016/SVG/main" r:embed="rId25"/>
+                          <ns3:svgBlip xmlns:ns3="http://schemas.microsoft.com/office/drawing/2016/SVG/main" r:embed="rId33"/>
                         </a:ext>
                       </a:extLst>
                     </a:blip>
@@ -12108,7 +12508,39 @@
           <w:color w:val="000000"/>
           <w:sz w:val="24"/>
         </w:rPr>
-        <w:t xml:space="preserve">DOU, Yutao </w:t>
+        <w:t xml:space="preserve">FIP. </w:t>
+      </w:r>
+      <w:r>
+        <w:rPr>
+          <w:rFonts w:ascii="Arial" w:hAnsi="Arial" w:eastAsia="Arial" w:cs="Arial"/>
+          <w:b w:val="1"/>
+          <w:bCs w:val="1"/>
+          <w:color w:val="000000"/>
+          <w:sz w:val="24"/>
+        </w:rPr>
+        <w:t>An artificial intelligence toolkit for pharmacy: an introduction and resource guide for pharmacists</w:t>
+      </w:r>
+      <w:r>
+        <w:rPr>
+          <w:rFonts w:ascii="Arial" w:hAnsi="Arial" w:eastAsia="Arial" w:cs="Arial"/>
+          <w:color w:val="000000"/>
+          <w:sz w:val="24"/>
+        </w:rPr>
+        <w:t>. The Hague: International Pharmaceutical Federation, 2025. Disponível em: https://www.fip.org/file/6202. Acesso em: 30 mar. 2026.</w:t>
+      </w:r>
+    </w:p>
+    <w:p>
+      <w:pPr>
+        <w:pStyle w:val="ReferenceEntry"/>
+        <w:pageBreakBefore w:val="0"/>
+      </w:pPr>
+      <w:r>
+        <w:rPr>
+          <w:rFonts w:ascii="Arial" w:hAnsi="Arial" w:eastAsia="Arial" w:cs="Arial"/>
+          <w:color w:val="000000"/>
+          <w:sz w:val="24"/>
+        </w:rPr>
+        <w:t xml:space="preserve">HAMMOND, Lewis </w:t>
       </w:r>
       <w:r>
         <w:rPr>
@@ -12126,7 +12558,7 @@
           <w:color w:val="000000"/>
           <w:sz w:val="24"/>
         </w:rPr>
-        <w:t xml:space="preserve"> ShennongMGS: an LLM-based Chinese Medication Guidance System. </w:t>
+        <w:t xml:space="preserve"> </w:t>
       </w:r>
       <w:r>
         <w:rPr>
@@ -12136,15 +12568,15 @@
           <w:color w:val="000000"/>
           <w:sz w:val="24"/>
         </w:rPr>
-        <w:t>ACM Transactions on Management Information Systems</w:t>
-      </w:r>
-      <w:r>
-        <w:rPr>
-          <w:rFonts w:ascii="Arial" w:hAnsi="Arial" w:eastAsia="Arial" w:cs="Arial"/>
-          <w:color w:val="000000"/>
-          <w:sz w:val="24"/>
-        </w:rPr>
-        <w:t>, [S. l.], v. 16, n. 2, art. 15, 2025. DOI: 10.1145/3658451. Disponível em: https://doi.org/10.1145/3658451. Acesso em: 30 ago. 2026.</w:t>
+        <w:t>Multi-Agent Risks from Advanced AI</w:t>
+      </w:r>
+      <w:r>
+        <w:rPr>
+          <w:rFonts w:ascii="Arial" w:hAnsi="Arial" w:eastAsia="Arial" w:cs="Arial"/>
+          <w:color w:val="000000"/>
+          <w:sz w:val="24"/>
+        </w:rPr>
+        <w:t>. arXiv:2502.14143, 2025. Disponível em: https://arxiv.org/abs/2502.14143. Acesso em: 16 ago. 2026.</w:t>
       </w:r>
     </w:p>
     <w:p>
@@ -12158,7 +12590,7 @@
           <w:color w:val="000000"/>
           <w:sz w:val="24"/>
         </w:rPr>
-        <w:t xml:space="preserve">FIP. </w:t>
+        <w:t xml:space="preserve">INFERMEDICA. </w:t>
       </w:r>
       <w:r>
         <w:rPr>
@@ -12168,15 +12600,15 @@
           <w:color w:val="000000"/>
           <w:sz w:val="24"/>
         </w:rPr>
-        <w:t>An artificial intelligence toolkit for pharmacy: an introduction and resource guide for pharmacists</w:t>
-      </w:r>
-      <w:r>
-        <w:rPr>
-          <w:rFonts w:ascii="Arial" w:hAnsi="Arial" w:eastAsia="Arial" w:cs="Arial"/>
-          <w:color w:val="000000"/>
-          <w:sz w:val="24"/>
-        </w:rPr>
-        <w:t>. The Hague: International Pharmaceutical Federation, 2025. Disponível em: https://www.fip.org/file/6202. Acesso em: 30 mar. 2026.</w:t>
+        <w:t>Symptom Checker</w:t>
+      </w:r>
+      <w:r>
+        <w:rPr>
+          <w:rFonts w:ascii="Arial" w:hAnsi="Arial" w:eastAsia="Arial" w:cs="Arial"/>
+          <w:color w:val="000000"/>
+          <w:sz w:val="24"/>
+        </w:rPr>
+        <w:t>. Disponível em: https://infermedica.com/product/symptom-checker. Acesso em: 11 maio 2026.</w:t>
       </w:r>
     </w:p>
     <w:p>
@@ -12190,7 +12622,71 @@
           <w:color w:val="000000"/>
           <w:sz w:val="24"/>
         </w:rPr>
-        <w:t xml:space="preserve">HAMMOND, Lewis </w:t>
+        <w:t xml:space="preserve">INTERCOM. </w:t>
+      </w:r>
+      <w:r>
+        <w:rPr>
+          <w:rFonts w:ascii="Arial" w:hAnsi="Arial" w:eastAsia="Arial" w:cs="Arial"/>
+          <w:b w:val="1"/>
+          <w:bCs w:val="1"/>
+          <w:color w:val="000000"/>
+          <w:sz w:val="24"/>
+        </w:rPr>
+        <w:t>Fin AI Agent explained</w:t>
+      </w:r>
+      <w:r>
+        <w:rPr>
+          <w:rFonts w:ascii="Arial" w:hAnsi="Arial" w:eastAsia="Arial" w:cs="Arial"/>
+          <w:color w:val="000000"/>
+          <w:sz w:val="24"/>
+        </w:rPr>
+        <w:t>. Disponível em: https://www.intercom.com/help/en/articles/7120684-fin-ai-agent-explained. Acesso em: 11 maio 2026.</w:t>
+      </w:r>
+    </w:p>
+    <w:p>
+      <w:pPr>
+        <w:pStyle w:val="ReferenceEntry"/>
+        <w:pageBreakBefore w:val="0"/>
+      </w:pPr>
+      <w:r>
+        <w:rPr>
+          <w:rFonts w:ascii="Arial" w:hAnsi="Arial" w:eastAsia="Arial" w:cs="Arial"/>
+          <w:color w:val="000000"/>
+          <w:sz w:val="24"/>
+        </w:rPr>
+        <w:t xml:space="preserve">JAGATAP, Akshay; MERUGU, Srujana; COMAR, Prakash Mandayam. RxLens: Multi-Agent LLM-powered Scan and Order for Pharmacy. In: </w:t>
+      </w:r>
+      <w:r>
+        <w:rPr>
+          <w:rFonts w:ascii="Arial" w:hAnsi="Arial" w:eastAsia="Arial" w:cs="Arial"/>
+          <w:b w:val="1"/>
+          <w:bCs w:val="1"/>
+          <w:color w:val="000000"/>
+          <w:sz w:val="24"/>
+        </w:rPr>
+        <w:t>Proceedings of the 2025 Conference of the Nations of the Americas Chapter of the Association for Computational Linguistics: Human Language Technologies</w:t>
+      </w:r>
+      <w:r>
+        <w:rPr>
+          <w:rFonts w:ascii="Arial" w:hAnsi="Arial" w:eastAsia="Arial" w:cs="Arial"/>
+          <w:color w:val="000000"/>
+          <w:sz w:val="24"/>
+        </w:rPr>
+        <w:t>, 2025, Albuquerque. [S. l.]: Association for Computational Linguistics, 2025. p. 822-832. DOI: 10.18653/v1/2025.naacl-industry.63.</w:t>
+      </w:r>
+    </w:p>
+    <w:p>
+      <w:pPr>
+        <w:pStyle w:val="ReferenceEntry"/>
+        <w:pageBreakBefore w:val="0"/>
+      </w:pPr>
+      <w:r>
+        <w:rPr>
+          <w:rFonts w:ascii="Arial" w:hAnsi="Arial" w:eastAsia="Arial" w:cs="Arial"/>
+          <w:color w:val="000000"/>
+          <w:sz w:val="24"/>
+        </w:rPr>
+        <w:t xml:space="preserve">KIM, Yubin </w:t>
       </w:r>
       <w:r>
         <w:rPr>
@@ -12208,7 +12704,7 @@
           <w:color w:val="000000"/>
           <w:sz w:val="24"/>
         </w:rPr>
-        <w:t xml:space="preserve"> </w:t>
+        <w:t xml:space="preserve"> Capable language models can outgrow the benefits of collaboration. </w:t>
       </w:r>
       <w:r>
         <w:rPr>
@@ -12218,15 +12714,15 @@
           <w:color w:val="000000"/>
           <w:sz w:val="24"/>
         </w:rPr>
-        <w:t>Multi-Agent Risks from Advanced AI</w:t>
-      </w:r>
-      <w:r>
-        <w:rPr>
-          <w:rFonts w:ascii="Arial" w:hAnsi="Arial" w:eastAsia="Arial" w:cs="Arial"/>
-          <w:color w:val="000000"/>
-          <w:sz w:val="24"/>
-        </w:rPr>
-        <w:t>. arXiv:2502.14143, 2025. Disponível em: https://arxiv.org/abs/2502.14143. Acesso em: 16 ago. 2026.</w:t>
+        <w:t>Nature Machine Intelligence</w:t>
+      </w:r>
+      <w:r>
+        <w:rPr>
+          <w:rFonts w:ascii="Arial" w:hAnsi="Arial" w:eastAsia="Arial" w:cs="Arial"/>
+          <w:color w:val="000000"/>
+          <w:sz w:val="24"/>
+        </w:rPr>
+        <w:t>, [S. l.], v. 8, p. 1157-1172, 2026. DOI: 10.1038/s42256-026-01268-y. Disponível em: https://doi.org/10.1038/s42256-026-01268-y. Acesso em: 16 ago. 2026.</w:t>
       </w:r>
     </w:p>
     <w:p>
@@ -12240,7 +12736,25 @@
           <w:color w:val="000000"/>
           <w:sz w:val="24"/>
         </w:rPr>
-        <w:t xml:space="preserve">INFERMEDICA. </w:t>
+        <w:t xml:space="preserve">LI, Xinyi </w:t>
+      </w:r>
+      <w:r>
+        <w:rPr>
+          <w:rFonts w:ascii="Arial" w:hAnsi="Arial" w:eastAsia="Arial" w:cs="Arial"/>
+          <w:i w:val="1"/>
+          <w:iCs w:val="1"/>
+          <w:color w:val="000000"/>
+          <w:sz w:val="24"/>
+        </w:rPr>
+        <w:t>et al.</w:t>
+      </w:r>
+      <w:r>
+        <w:rPr>
+          <w:rFonts w:ascii="Arial" w:hAnsi="Arial" w:eastAsia="Arial" w:cs="Arial"/>
+          <w:color w:val="000000"/>
+          <w:sz w:val="24"/>
+        </w:rPr>
+        <w:t xml:space="preserve"> A survey on LLM-based multi-agent systems: workflow, infrastructure, and challenges. </w:t>
       </w:r>
       <w:r>
         <w:rPr>
@@ -12250,15 +12764,15 @@
           <w:color w:val="000000"/>
           <w:sz w:val="24"/>
         </w:rPr>
-        <w:t>Symptom Checker</w:t>
-      </w:r>
-      <w:r>
-        <w:rPr>
-          <w:rFonts w:ascii="Arial" w:hAnsi="Arial" w:eastAsia="Arial" w:cs="Arial"/>
-          <w:color w:val="000000"/>
-          <w:sz w:val="24"/>
-        </w:rPr>
-        <w:t>. Disponível em: https://infermedica.com/product/symptom-checker. Acesso em: 11 maio 2026.</w:t>
+        <w:t>Vicinagearth</w:t>
+      </w:r>
+      <w:r>
+        <w:rPr>
+          <w:rFonts w:ascii="Arial" w:hAnsi="Arial" w:eastAsia="Arial" w:cs="Arial"/>
+          <w:color w:val="000000"/>
+          <w:sz w:val="24"/>
+        </w:rPr>
+        <w:t>, [S. l.], v. 1, art. 9, 2024. DOI: 10.1007/s44336-024-00009-2. Disponível em: https://link.springer.com/article/10.1007/s44336-024-00009-2. Acesso em: 30 mar. 2026.</w:t>
       </w:r>
     </w:p>
     <w:p>
@@ -12272,7 +12786,25 @@
           <w:color w:val="000000"/>
           <w:sz w:val="24"/>
         </w:rPr>
-        <w:t xml:space="preserve">INTERCOM. </w:t>
+        <w:t xml:space="preserve">LU, Meng </w:t>
+      </w:r>
+      <w:r>
+        <w:rPr>
+          <w:rFonts w:ascii="Arial" w:hAnsi="Arial" w:eastAsia="Arial" w:cs="Arial"/>
+          <w:i w:val="1"/>
+          <w:iCs w:val="1"/>
+          <w:color w:val="000000"/>
+          <w:sz w:val="24"/>
+        </w:rPr>
+        <w:t>et al.</w:t>
+      </w:r>
+      <w:r>
+        <w:rPr>
+          <w:rFonts w:ascii="Arial" w:hAnsi="Arial" w:eastAsia="Arial" w:cs="Arial"/>
+          <w:color w:val="000000"/>
+          <w:sz w:val="24"/>
+        </w:rPr>
+        <w:t xml:space="preserve"> TriageAgent: towards better multi-agents collaborations for large language model-based clinical triage. In: </w:t>
       </w:r>
       <w:r>
         <w:rPr>
@@ -12282,15 +12814,15 @@
           <w:color w:val="000000"/>
           <w:sz w:val="24"/>
         </w:rPr>
-        <w:t>Fin AI Agent explained</w:t>
-      </w:r>
-      <w:r>
-        <w:rPr>
-          <w:rFonts w:ascii="Arial" w:hAnsi="Arial" w:eastAsia="Arial" w:cs="Arial"/>
-          <w:color w:val="000000"/>
-          <w:sz w:val="24"/>
-        </w:rPr>
-        <w:t>. Disponível em: https://www.intercom.com/help/en/articles/7120684-fin-ai-agent-explained. Acesso em: 11 maio 2026.</w:t>
+        <w:t>Findings of the Association for Computational Linguistics: EMNLP 2024</w:t>
+      </w:r>
+      <w:r>
+        <w:rPr>
+          <w:rFonts w:ascii="Arial" w:hAnsi="Arial" w:eastAsia="Arial" w:cs="Arial"/>
+          <w:color w:val="000000"/>
+          <w:sz w:val="24"/>
+        </w:rPr>
+        <w:t>. Miami: Association for Computational Linguistics, 2024. p. 5747-5764. DOI: 10.18653/v1/2024.findings-emnlp.329. Disponível em: https://aclanthology.org/2024.findings-emnlp.329/. Acesso em: 30 ago. 2026.</w:t>
       </w:r>
     </w:p>
     <w:p>
@@ -12304,7 +12836,7 @@
           <w:color w:val="000000"/>
           <w:sz w:val="24"/>
         </w:rPr>
-        <w:t xml:space="preserve">JAGATAP, Akshay; MERUGU, Srujana; COMAR, Prakash Mandayam. RxLens: Multi-Agent LLM-powered Scan and Order for Pharmacy. In: </w:t>
+        <w:t xml:space="preserve">MCKINSEY &amp; COMPANY. </w:t>
       </w:r>
       <w:r>
         <w:rPr>
@@ -12314,15 +12846,15 @@
           <w:color w:val="000000"/>
           <w:sz w:val="24"/>
         </w:rPr>
-        <w:t>Proceedings of the 2025 Conference of the Nations of the Americas Chapter of the Association for Computational Linguistics: Human Language Technologies</w:t>
-      </w:r>
-      <w:r>
-        <w:rPr>
-          <w:rFonts w:ascii="Arial" w:hAnsi="Arial" w:eastAsia="Arial" w:cs="Arial"/>
-          <w:color w:val="000000"/>
-          <w:sz w:val="24"/>
-        </w:rPr>
-        <w:t>, 2025, Albuquerque. [S. l.]: Association for Computational Linguistics, 2025. p. 822-832. DOI: 10.18653/v1/2025.naacl-industry.63.</w:t>
+        <w:t>The state of AI in early 2024: gen AI adoption spikes and starts to generate value</w:t>
+      </w:r>
+      <w:r>
+        <w:rPr>
+          <w:rFonts w:ascii="Arial" w:hAnsi="Arial" w:eastAsia="Arial" w:cs="Arial"/>
+          <w:color w:val="000000"/>
+          <w:sz w:val="24"/>
+        </w:rPr>
+        <w:t>. [S. l.], 2024. Disponível em: https://www.mckinsey.com/capabilities/quantumblack/our-insights/the-state-of-ai-2024. Acesso em: 30 mar. 2026.</w:t>
       </w:r>
     </w:p>
     <w:p>
@@ -12336,7 +12868,7 @@
           <w:color w:val="000000"/>
           <w:sz w:val="24"/>
         </w:rPr>
-        <w:t xml:space="preserve">KIM, Yubin </w:t>
+        <w:t xml:space="preserve">PAIS, Cristobal </w:t>
       </w:r>
       <w:r>
         <w:rPr>
@@ -12354,7 +12886,7 @@
           <w:color w:val="000000"/>
           <w:sz w:val="24"/>
         </w:rPr>
-        <w:t xml:space="preserve"> Capable language models can outgrow the benefits of collaboration. </w:t>
+        <w:t xml:space="preserve"> Large language models for preventing medication direction errors in online pharmacies. </w:t>
       </w:r>
       <w:r>
         <w:rPr>
@@ -12364,15 +12896,15 @@
           <w:color w:val="000000"/>
           <w:sz w:val="24"/>
         </w:rPr>
-        <w:t>Nature Machine Intelligence</w:t>
-      </w:r>
-      <w:r>
-        <w:rPr>
-          <w:rFonts w:ascii="Arial" w:hAnsi="Arial" w:eastAsia="Arial" w:cs="Arial"/>
-          <w:color w:val="000000"/>
-          <w:sz w:val="24"/>
-        </w:rPr>
-        <w:t>, [S. l.], v. 8, p. 1157-1172, 2026. DOI: 10.1038/s42256-026-01268-y. Disponível em: https://doi.org/10.1038/s42256-026-01268-y. Acesso em: 16 ago. 2026.</w:t>
+        <w:t>Nature Medicine</w:t>
+      </w:r>
+      <w:r>
+        <w:rPr>
+          <w:rFonts w:ascii="Arial" w:hAnsi="Arial" w:eastAsia="Arial" w:cs="Arial"/>
+          <w:color w:val="000000"/>
+          <w:sz w:val="24"/>
+        </w:rPr>
+        <w:t>, [S. l.], v. 30, p. 1574-1582, 2024. DOI: 10.1038/s41591-024-02933-8. Disponível em: https://doi.org/10.1038/s41591-024-02933-8. Acesso em: 28 ago. 2026.</w:t>
       </w:r>
     </w:p>
     <w:p>
@@ -12386,7 +12918,39 @@
           <w:color w:val="000000"/>
           <w:sz w:val="24"/>
         </w:rPr>
-        <w:t xml:space="preserve">LI, Xinyi </w:t>
+        <w:t xml:space="preserve">PGEU. </w:t>
+      </w:r>
+      <w:r>
+        <w:rPr>
+          <w:rFonts w:ascii="Arial" w:hAnsi="Arial" w:eastAsia="Arial" w:cs="Arial"/>
+          <w:b w:val="1"/>
+          <w:bCs w:val="1"/>
+          <w:color w:val="000000"/>
+          <w:sz w:val="24"/>
+        </w:rPr>
+        <w:t>Position paper on artificial intelligence</w:t>
+      </w:r>
+      <w:r>
+        <w:rPr>
+          <w:rFonts w:ascii="Arial" w:hAnsi="Arial" w:eastAsia="Arial" w:cs="Arial"/>
+          <w:color w:val="000000"/>
+          <w:sz w:val="24"/>
+        </w:rPr>
+        <w:t>. Brussels: Pharmaceutical Group of the European Union, 2025. Disponível em: https://www.pgeu.eu/wp-content/uploads/2025/06/PGEU-Position-Paper-on-Artificial-Intelligence.pdf. Acesso em: 30 mar. 2026.</w:t>
+      </w:r>
+    </w:p>
+    <w:p>
+      <w:pPr>
+        <w:pStyle w:val="ReferenceEntry"/>
+        <w:pageBreakBefore w:val="0"/>
+      </w:pPr>
+      <w:r>
+        <w:rPr>
+          <w:rFonts w:ascii="Arial" w:hAnsi="Arial" w:eastAsia="Arial" w:cs="Arial"/>
+          <w:color w:val="000000"/>
+          <w:sz w:val="24"/>
+        </w:rPr>
+        <w:t xml:space="preserve">PICCIALLI, Francesco </w:t>
       </w:r>
       <w:r>
         <w:rPr>
@@ -12404,7 +12968,7 @@
           <w:color w:val="000000"/>
           <w:sz w:val="24"/>
         </w:rPr>
-        <w:t xml:space="preserve"> A survey on LLM-based multi-agent systems: workflow, infrastructure, and challenges. </w:t>
+        <w:t xml:space="preserve"> AgentAI: a comprehensive survey on autonomous agents in distributed AI for industry 4.0. </w:t>
       </w:r>
       <w:r>
         <w:rPr>
@@ -12414,15 +12978,15 @@
           <w:color w:val="000000"/>
           <w:sz w:val="24"/>
         </w:rPr>
-        <w:t>Vicinagearth</w:t>
-      </w:r>
-      <w:r>
-        <w:rPr>
-          <w:rFonts w:ascii="Arial" w:hAnsi="Arial" w:eastAsia="Arial" w:cs="Arial"/>
-          <w:color w:val="000000"/>
-          <w:sz w:val="24"/>
-        </w:rPr>
-        <w:t>, [S. l.], v. 1, art. 9, 2024. DOI: 10.1007/s44336-024-00009-2. Disponível em: https://link.springer.com/article/10.1007/s44336-024-00009-2. Acesso em: 30 mar. 2026.</w:t>
+        <w:t>Expert Systems with Applications</w:t>
+      </w:r>
+      <w:r>
+        <w:rPr>
+          <w:rFonts w:ascii="Arial" w:hAnsi="Arial" w:eastAsia="Arial" w:cs="Arial"/>
+          <w:color w:val="000000"/>
+          <w:sz w:val="24"/>
+        </w:rPr>
+        <w:t>, [S. l.], v. 291, art. 128404, 2025. DOI: 10.1016/j.eswa.2025.128404. Disponível em: https://doi.org/10.1016/j.eswa.2025.128404. Acesso em: 16 ago. 2026.</w:t>
       </w:r>
     </w:p>
     <w:p>
@@ -12436,7 +13000,7 @@
           <w:color w:val="000000"/>
           <w:sz w:val="24"/>
         </w:rPr>
-        <w:t xml:space="preserve">LU, Meng </w:t>
+        <w:t xml:space="preserve">QIAN, Chen </w:t>
       </w:r>
       <w:r>
         <w:rPr>
@@ -12454,7 +13018,7 @@
           <w:color w:val="000000"/>
           <w:sz w:val="24"/>
         </w:rPr>
-        <w:t xml:space="preserve"> TriageAgent: towards better multi-agents collaborations for large language model-based clinical triage. In: </w:t>
+        <w:t xml:space="preserve"> Scaling large language model-based multi-agent collaboration. In: INTERNATIONAL CONFERENCE ON LEARNING REPRESENTATIONS, 2025. </w:t>
       </w:r>
       <w:r>
         <w:rPr>
@@ -12464,15 +13028,15 @@
           <w:color w:val="000000"/>
           <w:sz w:val="24"/>
         </w:rPr>
-        <w:t>Findings of the Association for Computational Linguistics: EMNLP 2024</w:t>
-      </w:r>
-      <w:r>
-        <w:rPr>
-          <w:rFonts w:ascii="Arial" w:hAnsi="Arial" w:eastAsia="Arial" w:cs="Arial"/>
-          <w:color w:val="000000"/>
-          <w:sz w:val="24"/>
-        </w:rPr>
-        <w:t>. Miami: Association for Computational Linguistics, 2024. p. 5747-5764. DOI: 10.18653/v1/2024.findings-emnlp.329. Disponível em: https://aclanthology.org/2024.findings-emnlp.329/. Acesso em: 30 ago. 2026.</w:t>
+        <w:t>International Conference on Learning Representations 2025</w:t>
+      </w:r>
+      <w:r>
+        <w:rPr>
+          <w:rFonts w:ascii="Arial" w:hAnsi="Arial" w:eastAsia="Arial" w:cs="Arial"/>
+          <w:color w:val="000000"/>
+          <w:sz w:val="24"/>
+        </w:rPr>
+        <w:t>. [S. l.]: ICLR, 2025. Disponível em: https://proceedings.iclr.cc/paper_files/paper/2025/hash/66a026c0d17040889b50f0dfa650e5e0-Abstract-Conference.html. Acesso em: 31 ago. 2026.</w:t>
       </w:r>
     </w:p>
     <w:p>
@@ -12486,7 +13050,7 @@
           <w:color w:val="000000"/>
           <w:sz w:val="24"/>
         </w:rPr>
-        <w:t xml:space="preserve">MCKINSEY &amp; COMPANY. </w:t>
+        <w:t xml:space="preserve">SALESFORCE. </w:t>
       </w:r>
       <w:r>
         <w:rPr>
@@ -12496,15 +13060,15 @@
           <w:color w:val="000000"/>
           <w:sz w:val="24"/>
         </w:rPr>
-        <w:t>The state of AI in early 2024: gen AI adoption spikes and starts to generate value</w:t>
-      </w:r>
-      <w:r>
-        <w:rPr>
-          <w:rFonts w:ascii="Arial" w:hAnsi="Arial" w:eastAsia="Arial" w:cs="Arial"/>
-          <w:color w:val="000000"/>
-          <w:sz w:val="24"/>
-        </w:rPr>
-        <w:t>. [S. l.], 2024. Disponível em: https://www.mckinsey.com/capabilities/quantumblack/our-insights/the-state-of-ai-2024. Acesso em: 30 mar. 2026.</w:t>
+        <w:t>AI Customer Service Agents</w:t>
+      </w:r>
+      <w:r>
+        <w:rPr>
+          <w:rFonts w:ascii="Arial" w:hAnsi="Arial" w:eastAsia="Arial" w:cs="Arial"/>
+          <w:color w:val="000000"/>
+          <w:sz w:val="24"/>
+        </w:rPr>
+        <w:t>. Disponível em: https://www.salesforce.com/service/ai/customer-service-agents/. Acesso em: 11 maio 2026.</w:t>
       </w:r>
     </w:p>
     <w:p>
@@ -12518,7 +13082,39 @@
           <w:color w:val="000000"/>
           <w:sz w:val="24"/>
         </w:rPr>
-        <w:t xml:space="preserve">PAIS, Cristobal </w:t>
+        <w:t xml:space="preserve">STANFORD HAI. </w:t>
+      </w:r>
+      <w:r>
+        <w:rPr>
+          <w:rFonts w:ascii="Arial" w:hAnsi="Arial" w:eastAsia="Arial" w:cs="Arial"/>
+          <w:b w:val="1"/>
+          <w:bCs w:val="1"/>
+          <w:color w:val="000000"/>
+          <w:sz w:val="24"/>
+        </w:rPr>
+        <w:t>AI Index Report 2025</w:t>
+      </w:r>
+      <w:r>
+        <w:rPr>
+          <w:rFonts w:ascii="Arial" w:hAnsi="Arial" w:eastAsia="Arial" w:cs="Arial"/>
+          <w:color w:val="000000"/>
+          <w:sz w:val="24"/>
+        </w:rPr>
+        <w:t>. Stanford: Stanford Institute for Human-Centered Artificial Intelligence, 2025. Disponível em: https://hai.stanford.edu/ai-index. Acesso em: 30 mar. 2026.</w:t>
+      </w:r>
+    </w:p>
+    <w:p>
+      <w:pPr>
+        <w:pStyle w:val="ReferenceEntry"/>
+        <w:pageBreakBefore w:val="0"/>
+      </w:pPr>
+      <w:r>
+        <w:rPr>
+          <w:rFonts w:ascii="Arial" w:hAnsi="Arial" w:eastAsia="Arial" w:cs="Arial"/>
+          <w:color w:val="000000"/>
+          <w:sz w:val="24"/>
+        </w:rPr>
+        <w:t xml:space="preserve">TAM, Thomas Yu Chow </w:t>
       </w:r>
       <w:r>
         <w:rPr>
@@ -12536,7 +13132,7 @@
           <w:color w:val="000000"/>
           <w:sz w:val="24"/>
         </w:rPr>
-        <w:t xml:space="preserve"> Large language models for preventing medication direction errors in online pharmacies. </w:t>
+        <w:t xml:space="preserve"> A framework for human evaluation of large language models in healthcare derived from literature review. </w:t>
       </w:r>
       <w:r>
         <w:rPr>
@@ -12546,15 +13142,15 @@
           <w:color w:val="000000"/>
           <w:sz w:val="24"/>
         </w:rPr>
-        <w:t>Nature Medicine</w:t>
-      </w:r>
-      <w:r>
-        <w:rPr>
-          <w:rFonts w:ascii="Arial" w:hAnsi="Arial" w:eastAsia="Arial" w:cs="Arial"/>
-          <w:color w:val="000000"/>
-          <w:sz w:val="24"/>
-        </w:rPr>
-        <w:t>, [S. l.], v. 30, p. 1574-1582, 2024. DOI: 10.1038/s41591-024-02933-8. Disponível em: https://doi.org/10.1038/s41591-024-02933-8. Acesso em: 28 ago. 2026.</w:t>
+        <w:t>npj Digital Medicine</w:t>
+      </w:r>
+      <w:r>
+        <w:rPr>
+          <w:rFonts w:ascii="Arial" w:hAnsi="Arial" w:eastAsia="Arial" w:cs="Arial"/>
+          <w:color w:val="000000"/>
+          <w:sz w:val="24"/>
+        </w:rPr>
+        <w:t>, [S. l.], v. 7, art. 258, 2024. DOI: 10.1038/s41746-024-01258-7. Disponível em: https://doi.org/10.1038/s41746-024-01258-7. Acesso em: 28 ago. 2026.</w:t>
       </w:r>
     </w:p>
     <w:p>
@@ -12568,7 +13164,25 @@
           <w:color w:val="000000"/>
           <w:sz w:val="24"/>
         </w:rPr>
-        <w:t xml:space="preserve">PANDEY, Himanshu Gautam; AMOD, Akhil; KUMAR, Shivang. Advancing Healthcare Automation: Multi-Agent System for Medical Necessity Justification. In: </w:t>
+        <w:t xml:space="preserve">WANG, Haochun </w:t>
+      </w:r>
+      <w:r>
+        <w:rPr>
+          <w:rFonts w:ascii="Arial" w:hAnsi="Arial" w:eastAsia="Arial" w:cs="Arial"/>
+          <w:i w:val="1"/>
+          <w:iCs w:val="1"/>
+          <w:color w:val="000000"/>
+          <w:sz w:val="24"/>
+        </w:rPr>
+        <w:t>et al.</w:t>
+      </w:r>
+      <w:r>
+        <w:rPr>
+          <w:rFonts w:ascii="Arial" w:hAnsi="Arial" w:eastAsia="Arial" w:cs="Arial"/>
+          <w:color w:val="000000"/>
+          <w:sz w:val="24"/>
+        </w:rPr>
+        <w:t xml:space="preserve"> Beyond frameworks: unpacking collaboration strategies in multi-agent systems. In: </w:t>
       </w:r>
       <w:r>
         <w:rPr>
@@ -12578,15 +13192,15 @@
           <w:color w:val="000000"/>
           <w:sz w:val="24"/>
         </w:rPr>
-        <w:t>Proceedings of the 23rd Workshop on Biomedical Natural Language Processing</w:t>
-      </w:r>
-      <w:r>
-        <w:rPr>
-          <w:rFonts w:ascii="Arial" w:hAnsi="Arial" w:eastAsia="Arial" w:cs="Arial"/>
-          <w:color w:val="000000"/>
-          <w:sz w:val="24"/>
-        </w:rPr>
-        <w:t>. Bangkok: Association for Computational Linguistics, 2024. p. 39-49. DOI: 10.18653/v1/2024.bionlp-1.4. Disponível em: https://aclanthology.org/2024.bionlp-1.4/. Acesso em: 30 ago. 2026.</w:t>
+        <w:t>Proceedings of the 63rd Annual Meeting of the Association for Computational Linguistics (Volume 1: Long Papers)</w:t>
+      </w:r>
+      <w:r>
+        <w:rPr>
+          <w:rFonts w:ascii="Arial" w:hAnsi="Arial" w:eastAsia="Arial" w:cs="Arial"/>
+          <w:color w:val="000000"/>
+          <w:sz w:val="24"/>
+        </w:rPr>
+        <w:t>. Vienna: Association for Computational Linguistics, 2025. p. 21361-21375. DOI: 10.18653/v1/2025.acl-long.1037. Disponível em: https://aclanthology.org/2025.acl-long.1037/. Acesso em: 24 ago. 2026.</w:t>
       </w:r>
     </w:p>
     <w:p>
@@ -12600,7 +13214,7 @@
           <w:color w:val="000000"/>
           <w:sz w:val="24"/>
         </w:rPr>
-        <w:t xml:space="preserve">PGEU. </w:t>
+        <w:t xml:space="preserve">WHO EUROPE. </w:t>
       </w:r>
       <w:r>
         <w:rPr>
@@ -12610,15 +13224,15 @@
           <w:color w:val="000000"/>
           <w:sz w:val="24"/>
         </w:rPr>
-        <w:t>Position paper on artificial intelligence</w:t>
-      </w:r>
-      <w:r>
-        <w:rPr>
-          <w:rFonts w:ascii="Arial" w:hAnsi="Arial" w:eastAsia="Arial" w:cs="Arial"/>
-          <w:color w:val="000000"/>
-          <w:sz w:val="24"/>
-        </w:rPr>
-        <w:t>. Brussels: Pharmaceutical Group of the European Union, 2025. Disponível em: https://www.pgeu.eu/wp-content/uploads/2025/06/PGEU-Position-Paper-on-Artificial-Intelligence.pdf. Acesso em: 30 mar. 2026.</w:t>
+        <w:t>Advancing the role of pharmacists to meet changing patient and health system needs</w:t>
+      </w:r>
+      <w:r>
+        <w:rPr>
+          <w:rFonts w:ascii="Arial" w:hAnsi="Arial" w:eastAsia="Arial" w:cs="Arial"/>
+          <w:color w:val="000000"/>
+          <w:sz w:val="24"/>
+        </w:rPr>
+        <w:t>. Copenhagen: World Health Organization Regional Office for Europe, 2024. Disponível em: https://www.who.int/belgium/feature-stories/item/advancing-the-role-of-pharmacists-to-meet-changing-patient-and-health-system-needs. Acesso em: 16 ago. 2026.</w:t>
       </w:r>
     </w:p>
     <w:p>
@@ -12632,7 +13246,7 @@
           <w:color w:val="000000"/>
           <w:sz w:val="24"/>
         </w:rPr>
-        <w:t xml:space="preserve">PICCIALLI, Francesco </w:t>
+        <w:t xml:space="preserve">YU, Chaojia </w:t>
       </w:r>
       <w:r>
         <w:rPr>
@@ -12650,7 +13264,7 @@
           <w:color w:val="000000"/>
           <w:sz w:val="24"/>
         </w:rPr>
-        <w:t xml:space="preserve"> AgentAI: a comprehensive survey on autonomous agents in distributed AI for industry 4.0. </w:t>
+        <w:t xml:space="preserve"> A survey on agent workflow: status and future. In: </w:t>
       </w:r>
       <w:r>
         <w:rPr>
@@ -12660,15 +13274,15 @@
           <w:color w:val="000000"/>
           <w:sz w:val="24"/>
         </w:rPr>
-        <w:t>Expert Systems with Applications</w:t>
-      </w:r>
-      <w:r>
-        <w:rPr>
-          <w:rFonts w:ascii="Arial" w:hAnsi="Arial" w:eastAsia="Arial" w:cs="Arial"/>
-          <w:color w:val="000000"/>
-          <w:sz w:val="24"/>
-        </w:rPr>
-        <w:t>, [S. l.], v. 291, art. 128404, 2025. DOI: 10.1016/j.eswa.2025.128404. Disponível em: https://doi.org/10.1016/j.eswa.2025.128404. Acesso em: 16 ago. 2026.</w:t>
+        <w:t>2025 8th International Conference on Artificial Intelligence and Big Data (ICAIBD)</w:t>
+      </w:r>
+      <w:r>
+        <w:rPr>
+          <w:rFonts w:ascii="Arial" w:hAnsi="Arial" w:eastAsia="Arial" w:cs="Arial"/>
+          <w:color w:val="000000"/>
+          <w:sz w:val="24"/>
+        </w:rPr>
+        <w:t>, 2025, Chengdu. [S. l.]: IEEE, 2025. p. 770-781. DOI: 10.1109/ICAIBD64986.2025.11082076. Disponível em: https://doi.org/10.1109/ICAIBD64986.2025.11082076. Acesso em: 30 mar. 2026.</w:t>
       </w:r>
     </w:p>
     <w:p>
@@ -12682,7 +13296,7 @@
           <w:color w:val="000000"/>
           <w:sz w:val="24"/>
         </w:rPr>
-        <w:t xml:space="preserve">SALESFORCE. </w:t>
+        <w:t xml:space="preserve">ZENDESK. </w:t>
       </w:r>
       <w:r>
         <w:rPr>
@@ -12692,15 +13306,15 @@
           <w:color w:val="000000"/>
           <w:sz w:val="24"/>
         </w:rPr>
-        <w:t>AI Customer Service Agents</w:t>
-      </w:r>
-      <w:r>
-        <w:rPr>
-          <w:rFonts w:ascii="Arial" w:hAnsi="Arial" w:eastAsia="Arial" w:cs="Arial"/>
-          <w:color w:val="000000"/>
-          <w:sz w:val="24"/>
-        </w:rPr>
-        <w:t>. Disponível em: https://www.salesforce.com/service/ai/customer-service-agents/. Acesso em: 11 maio 2026.</w:t>
+        <w:t>About AI agents</w:t>
+      </w:r>
+      <w:r>
+        <w:rPr>
+          <w:rFonts w:ascii="Arial" w:hAnsi="Arial" w:eastAsia="Arial" w:cs="Arial"/>
+          <w:color w:val="000000"/>
+          <w:sz w:val="24"/>
+        </w:rPr>
+        <w:t>. Disponível em: https://support.zendesk.com/hc/en-us/articles/6970583409690-About-AI-agents. Acesso em: 11 maio 2026.</w:t>
       </w:r>
     </w:p>
     <w:p>
@@ -12714,7 +13328,25 @@
           <w:color w:val="000000"/>
           <w:sz w:val="24"/>
         </w:rPr>
-        <w:t xml:space="preserve">STANFORD HAI. </w:t>
+        <w:t xml:space="preserve">ZHOU, Han </w:t>
+      </w:r>
+      <w:r>
+        <w:rPr>
+          <w:rFonts w:ascii="Arial" w:hAnsi="Arial" w:eastAsia="Arial" w:cs="Arial"/>
+          <w:i w:val="1"/>
+          <w:iCs w:val="1"/>
+          <w:color w:val="000000"/>
+          <w:sz w:val="24"/>
+        </w:rPr>
+        <w:t>et al.</w:t>
+      </w:r>
+      <w:r>
+        <w:rPr>
+          <w:rFonts w:ascii="Arial" w:hAnsi="Arial" w:eastAsia="Arial" w:cs="Arial"/>
+          <w:color w:val="000000"/>
+          <w:sz w:val="24"/>
+        </w:rPr>
+        <w:t xml:space="preserve"> Multi-agent design: optimizing agents with better prompts and topologies. In: INTERNATIONAL CONFERENCE ON LEARNING REPRESENTATIONS, 2026. </w:t>
       </w:r>
       <w:r>
         <w:rPr>
@@ -12724,15 +13356,15 @@
           <w:color w:val="000000"/>
           <w:sz w:val="24"/>
         </w:rPr>
-        <w:t>AI Index Report 2025</w:t>
-      </w:r>
-      <w:r>
-        <w:rPr>
-          <w:rFonts w:ascii="Arial" w:hAnsi="Arial" w:eastAsia="Arial" w:cs="Arial"/>
-          <w:color w:val="000000"/>
-          <w:sz w:val="24"/>
-        </w:rPr>
-        <w:t>. Stanford: Stanford Institute for Human-Centered Artificial Intelligence, 2025. Disponível em: https://hai.stanford.edu/ai-index. Acesso em: 30 mar. 2026.</w:t>
+        <w:t>International Conference on Learning Representations 2026</w:t>
+      </w:r>
+      <w:r>
+        <w:rPr>
+          <w:rFonts w:ascii="Arial" w:hAnsi="Arial" w:eastAsia="Arial" w:cs="Arial"/>
+          <w:color w:val="000000"/>
+          <w:sz w:val="24"/>
+        </w:rPr>
+        <w:t>. [S. l.]: ICLR, 2026. Disponível em: https://proceedings.iclr.cc/paper_files/paper/2026/hash/1ab4e0e8f35078109bc78d7b465d306f-Abstract-Conference.html. Acesso em: 31 ago. 2026.</w:t>
       </w:r>
     </w:p>
     <w:p>
@@ -12746,7 +13378,7 @@
           <w:color w:val="000000"/>
           <w:sz w:val="24"/>
         </w:rPr>
-        <w:t xml:space="preserve">TAM, Thomas Yu Chow </w:t>
+        <w:t xml:space="preserve">ZHU, Kunlun </w:t>
       </w:r>
       <w:r>
         <w:rPr>
@@ -12764,7 +13396,7 @@
           <w:color w:val="000000"/>
           <w:sz w:val="24"/>
         </w:rPr>
-        <w:t xml:space="preserve"> A framework for human evaluation of large language models in healthcare derived from literature review. </w:t>
+        <w:t xml:space="preserve"> MultiAgentBench: evaluating the collaboration and competition of LLM agents. In: </w:t>
       </w:r>
       <w:r>
         <w:rPr>
@@ -12774,56 +13406,6 @@
           <w:color w:val="000000"/>
           <w:sz w:val="24"/>
         </w:rPr>
-        <w:t>npj Digital Medicine</w:t>
-      </w:r>
-      <w:r>
-        <w:rPr>
-          <w:rFonts w:ascii="Arial" w:hAnsi="Arial" w:eastAsia="Arial" w:cs="Arial"/>
-          <w:color w:val="000000"/>
-          <w:sz w:val="24"/>
-        </w:rPr>
-        <w:t>, [S. l.], v. 7, art. 258, 2024. DOI: 10.1038/s41746-024-01258-7. Disponível em: https://doi.org/10.1038/s41746-024-01258-7. Acesso em: 28 ago. 2026.</w:t>
-      </w:r>
-    </w:p>
-    <w:p>
-      <w:pPr>
-        <w:pStyle w:val="ReferenceEntry"/>
-        <w:pageBreakBefore w:val="0"/>
-      </w:pPr>
-      <w:r>
-        <w:rPr>
-          <w:rFonts w:ascii="Arial" w:hAnsi="Arial" w:eastAsia="Arial" w:cs="Arial"/>
-          <w:color w:val="000000"/>
-          <w:sz w:val="24"/>
-        </w:rPr>
-        <w:t xml:space="preserve">WANG, Haochun </w:t>
-      </w:r>
-      <w:r>
-        <w:rPr>
-          <w:rFonts w:ascii="Arial" w:hAnsi="Arial" w:eastAsia="Arial" w:cs="Arial"/>
-          <w:i w:val="1"/>
-          <w:iCs w:val="1"/>
-          <w:color w:val="000000"/>
-          <w:sz w:val="24"/>
-        </w:rPr>
-        <w:t>et al.</w:t>
-      </w:r>
-      <w:r>
-        <w:rPr>
-          <w:rFonts w:ascii="Arial" w:hAnsi="Arial" w:eastAsia="Arial" w:cs="Arial"/>
-          <w:color w:val="000000"/>
-          <w:sz w:val="24"/>
-        </w:rPr>
-        <w:t xml:space="preserve"> Beyond frameworks: unpacking collaboration strategies in multi-agent systems. In: </w:t>
-      </w:r>
-      <w:r>
-        <w:rPr>
-          <w:rFonts w:ascii="Arial" w:hAnsi="Arial" w:eastAsia="Arial" w:cs="Arial"/>
-          <w:b w:val="1"/>
-          <w:bCs w:val="1"/>
-          <w:color w:val="000000"/>
-          <w:sz w:val="24"/>
-        </w:rPr>
         <w:t>Proceedings of the 63rd Annual Meeting of the Association for Computational Linguistics (Volume 1: Long Papers)</w:t>
       </w:r>
       <w:r>
@@ -12832,121 +13414,7 @@
           <w:color w:val="000000"/>
           <w:sz w:val="24"/>
         </w:rPr>
-        <w:t>. Vienna: Association for Computational Linguistics, 2025. p. 21361-21375. DOI: 10.18653/v1/2025.acl-long.1037. Disponível em: https://aclanthology.org/2025.acl-long.1037/. Acesso em: 24 ago. 2026.</w:t>
-      </w:r>
-    </w:p>
-    <w:p>
-      <w:pPr>
-        <w:pStyle w:val="ReferenceEntry"/>
-        <w:pageBreakBefore w:val="0"/>
-      </w:pPr>
-      <w:r>
-        <w:rPr>
-          <w:rFonts w:ascii="Arial" w:hAnsi="Arial" w:eastAsia="Arial" w:cs="Arial"/>
-          <w:color w:val="000000"/>
-          <w:sz w:val="24"/>
-        </w:rPr>
-        <w:t xml:space="preserve">WHO EUROPE. </w:t>
-      </w:r>
-      <w:r>
-        <w:rPr>
-          <w:rFonts w:ascii="Arial" w:hAnsi="Arial" w:eastAsia="Arial" w:cs="Arial"/>
-          <w:b w:val="1"/>
-          <w:bCs w:val="1"/>
-          <w:color w:val="000000"/>
-          <w:sz w:val="24"/>
-        </w:rPr>
-        <w:t>Advancing the role of pharmacists to meet changing patient and health system needs</w:t>
-      </w:r>
-      <w:r>
-        <w:rPr>
-          <w:rFonts w:ascii="Arial" w:hAnsi="Arial" w:eastAsia="Arial" w:cs="Arial"/>
-          <w:color w:val="000000"/>
-          <w:sz w:val="24"/>
-        </w:rPr>
-        <w:t>. Copenhagen: World Health Organization Regional Office for Europe, 2024. Disponível em: https://www.who.int/belgium/feature-stories/item/advancing-the-role-of-pharmacists-to-meet-changing-patient-and-health-system-needs. Acesso em: 16 ago. 2026.</w:t>
-      </w:r>
-    </w:p>
-    <w:p>
-      <w:pPr>
-        <w:pStyle w:val="ReferenceEntry"/>
-        <w:pageBreakBefore w:val="0"/>
-      </w:pPr>
-      <w:r>
-        <w:rPr>
-          <w:rFonts w:ascii="Arial" w:hAnsi="Arial" w:eastAsia="Arial" w:cs="Arial"/>
-          <w:color w:val="000000"/>
-          <w:sz w:val="24"/>
-        </w:rPr>
-        <w:t xml:space="preserve">YU, Chaojia </w:t>
-      </w:r>
-      <w:r>
-        <w:rPr>
-          <w:rFonts w:ascii="Arial" w:hAnsi="Arial" w:eastAsia="Arial" w:cs="Arial"/>
-          <w:i w:val="1"/>
-          <w:iCs w:val="1"/>
-          <w:color w:val="000000"/>
-          <w:sz w:val="24"/>
-        </w:rPr>
-        <w:t>et al.</w:t>
-      </w:r>
-      <w:r>
-        <w:rPr>
-          <w:rFonts w:ascii="Arial" w:hAnsi="Arial" w:eastAsia="Arial" w:cs="Arial"/>
-          <w:color w:val="000000"/>
-          <w:sz w:val="24"/>
-        </w:rPr>
-        <w:t xml:space="preserve"> A survey on agent workflow: status and future. In: </w:t>
-      </w:r>
-      <w:r>
-        <w:rPr>
-          <w:rFonts w:ascii="Arial" w:hAnsi="Arial" w:eastAsia="Arial" w:cs="Arial"/>
-          <w:b w:val="1"/>
-          <w:bCs w:val="1"/>
-          <w:color w:val="000000"/>
-          <w:sz w:val="24"/>
-        </w:rPr>
-        <w:t>2025 8th International Conference on Artificial Intelligence and Big Data (ICAIBD)</w:t>
-      </w:r>
-      <w:r>
-        <w:rPr>
-          <w:rFonts w:ascii="Arial" w:hAnsi="Arial" w:eastAsia="Arial" w:cs="Arial"/>
-          <w:color w:val="000000"/>
-          <w:sz w:val="24"/>
-        </w:rPr>
-        <w:t>, 2025, Chengdu. [S. l.]: IEEE, 2025. p. 770-781. DOI: 10.1109/ICAIBD64986.2025.11082076. Disponível em: https://doi.org/10.1109/ICAIBD64986.2025.11082076. Acesso em: 30 mar. 2026.</w:t>
-      </w:r>
-    </w:p>
-    <w:p>
-      <w:pPr>
-        <w:pStyle w:val="ReferenceEntry"/>
-        <w:pageBreakBefore w:val="0"/>
-      </w:pPr>
-      <w:r>
-        <w:rPr>
-          <w:rFonts w:ascii="Arial" w:hAnsi="Arial" w:eastAsia="Arial" w:cs="Arial"/>
-          <w:color w:val="000000"/>
-          <w:sz w:val="24"/>
-        </w:rPr>
-        <w:t xml:space="preserve">ZENDESK. </w:t>
-      </w:r>
-      <w:r>
-        <w:rPr>
-          <w:rFonts w:ascii="Arial" w:hAnsi="Arial" w:eastAsia="Arial" w:cs="Arial"/>
-          <w:b w:val="1"/>
-          <w:bCs w:val="1"/>
-          <w:color w:val="000000"/>
-          <w:sz w:val="24"/>
-        </w:rPr>
-        <w:t>About AI agents</w:t>
-      </w:r>
-      <w:r>
-        <w:rPr>
-          <w:rFonts w:ascii="Arial" w:hAnsi="Arial" w:eastAsia="Arial" w:cs="Arial"/>
-          <w:color w:val="000000"/>
-          <w:sz w:val="24"/>
-        </w:rPr>
-        <w:t>. Disponível em: https://support.zendesk.com/hc/en-us/articles/6970583409690-About-AI-agents. Acesso em: 11 maio 2026.</w:t>
+        <w:t>. Vienna: Association for Computational Linguistics, 2025. p. 8580-8622. DOI: 10.18653/v1/2025.acl-long.421. Disponível em: https://aclanthology.org/2025.acl-long.421/. Acesso em: 31 ago. 2026.</w:t>
       </w:r>
     </w:p>
     <w:sectPr>

</xml_diff>

<commit_message>
docs(tcc): reduz título do trabalho
</commit_message>
<xml_diff>
--- a/TCC/TCC_MAB_Facens_Ralph_10x.docx
+++ b/TCC/TCC_MAB_Facens_Ralph_10x.docx
@@ -53,7 +53,7 @@
         <w:jc w:val="center"/>
       </w:pPr>
       <w:r>
-        <w:t>COMPARAÇÃO DE ARQUITETURAS DE COORDENAÇÃO EM SISTEMAS MULTIAGENTES BASEADOS EM MODELOS DE LINGUAGEM: UM ESTUDO DE CASO NO ATENDIMENTO EM FARMÁCIAS</w:t>
+        <w:t>COMPARAÇÃO EXPERIMENTAL DE ARQUITETURAS DE COORDENAÇÃO EM SISTEMAS MULTIAGENTES BASEADOS EM LLMS</w:t>
       </w:r>
     </w:p>
     <w:p>
@@ -120,7 +120,7 @@
         <w:jc w:val="center"/>
       </w:pPr>
       <w:r>
-        <w:t>COMPARAÇÃO DE ARQUITETURAS DE COORDENAÇÃO EM SISTEMAS MULTIAGENTES BASEADOS EM MODELOS DE LINGUAGEM: UM ESTUDO DE CASO NO ATENDIMENTO EM FARMÁCIAS</w:t>
+        <w:t>COMPARAÇÃO EXPERIMENTAL DE ARQUITETURAS DE COORDENAÇÃO EM SISTEMAS MULTIAGENTES BASEADOS EM LLMS</w:t>
       </w:r>
     </w:p>
     <w:p>
@@ -13023,10 +13023,10 @@
       <w:r>
         <w:rPr>
           <w:rFonts w:ascii="Arial" w:hAnsi="Arial" w:eastAsia="Arial" w:cs="Arial"/>
+          <w:color w:val="000000"/>
+          <w:sz w:val="24"/>
           <w:b w:val="1"/>
           <w:bCs w:val="1"/>
-          <w:color w:val="000000"/>
-          <w:sz w:val="24"/>
         </w:rPr>
         <w:t>International Conference on Learning Representations 2025</w:t>
       </w:r>
@@ -13351,10 +13351,10 @@
       <w:r>
         <w:rPr>
           <w:rFonts w:ascii="Arial" w:hAnsi="Arial" w:eastAsia="Arial" w:cs="Arial"/>
+          <w:color w:val="000000"/>
+          <w:sz w:val="24"/>
           <w:b w:val="1"/>
           <w:bCs w:val="1"/>
-          <w:color w:val="000000"/>
-          <w:sz w:val="24"/>
         </w:rPr>
         <w:t>International Conference on Learning Representations 2026</w:t>
       </w:r>
@@ -13401,10 +13401,10 @@
       <w:r>
         <w:rPr>
           <w:rFonts w:ascii="Arial" w:hAnsi="Arial" w:eastAsia="Arial" w:cs="Arial"/>
+          <w:color w:val="000000"/>
+          <w:sz w:val="24"/>
           <w:b w:val="1"/>
           <w:bCs w:val="1"/>
-          <w:color w:val="000000"/>
-          <w:sz w:val="24"/>
         </w:rPr>
         <w:t>Proceedings of the 63rd Annual Meeting of the Association for Computational Linguistics (Volume 1: Long Papers)</w:t>
       </w:r>

</xml_diff>

<commit_message>
docs(tcc): fortalece fundamentos de sistemas multiagentes
</commit_message>
<xml_diff>
--- a/TCC/TCC_MAB_Facens_Ralph_10x.docx
+++ b/TCC/TCC_MAB_Facens_Ralph_10x.docx
@@ -362,7 +362,7 @@
             <w:u w:val="none"/>
             <w:sz w:val="24"/>
           </w:rPr>
-          <w:t>32</w:t>
+          <w:t>34</w:t>
         </w:r>
       </w:hyperlink>
     </w:p>
@@ -402,7 +402,7 @@
             <w:u w:val="none"/>
             <w:sz w:val="24"/>
           </w:rPr>
-          <w:t>32</w:t>
+          <w:t>34</w:t>
         </w:r>
       </w:hyperlink>
     </w:p>
@@ -442,7 +442,7 @@
             <w:u w:val="none"/>
             <w:sz w:val="24"/>
           </w:rPr>
-          <w:t>34</w:t>
+          <w:t>36</w:t>
         </w:r>
       </w:hyperlink>
     </w:p>
@@ -482,7 +482,7 @@
             <w:u w:val="none"/>
             <w:sz w:val="24"/>
           </w:rPr>
-          <w:t>39</w:t>
+          <w:t>41</w:t>
         </w:r>
       </w:hyperlink>
     </w:p>
@@ -1238,7 +1238,7 @@
             <w:u w:val="none"/>
             <w:sz w:val="24"/>
           </w:rPr>
-          <w:t>17</w:t>
+          <w:t>18</w:t>
         </w:r>
       </w:hyperlink>
     </w:p>
@@ -1278,7 +1278,7 @@
             <w:u w:val="none"/>
             <w:sz w:val="24"/>
           </w:rPr>
-          <w:t>18</w:t>
+          <w:t>19</w:t>
         </w:r>
       </w:hyperlink>
     </w:p>
@@ -1318,7 +1318,7 @@
             <w:u w:val="none"/>
             <w:sz w:val="24"/>
           </w:rPr>
-          <w:t>18</w:t>
+          <w:t>19</w:t>
         </w:r>
       </w:hyperlink>
     </w:p>
@@ -1378,7 +1378,7 @@
             <w:u w:val="none"/>
             <w:sz w:val="24"/>
           </w:rPr>
-          <w:t>18</w:t>
+          <w:t>19</w:t>
         </w:r>
       </w:hyperlink>
     </w:p>
@@ -1438,7 +1438,7 @@
             <w:u w:val="none"/>
             <w:sz w:val="24"/>
           </w:rPr>
-          <w:t>18</w:t>
+          <w:t>20</w:t>
         </w:r>
       </w:hyperlink>
     </w:p>
@@ -1478,7 +1478,7 @@
             <w:u w:val="none"/>
             <w:sz w:val="24"/>
           </w:rPr>
-          <w:t>18</w:t>
+          <w:t>20</w:t>
         </w:r>
       </w:hyperlink>
     </w:p>
@@ -1518,7 +1518,7 @@
             <w:u w:val="none"/>
             <w:sz w:val="24"/>
           </w:rPr>
-          <w:t>21</w:t>
+          <w:t>23</w:t>
         </w:r>
       </w:hyperlink>
     </w:p>
@@ -1558,7 +1558,7 @@
             <w:u w:val="none"/>
             <w:sz w:val="24"/>
           </w:rPr>
-          <w:t>21</w:t>
+          <w:t>23</w:t>
         </w:r>
       </w:hyperlink>
     </w:p>
@@ -1598,7 +1598,7 @@
             <w:u w:val="none"/>
             <w:sz w:val="24"/>
           </w:rPr>
-          <w:t>22</w:t>
+          <w:t>24</w:t>
         </w:r>
       </w:hyperlink>
     </w:p>
@@ -1638,7 +1638,7 @@
             <w:u w:val="none"/>
             <w:sz w:val="24"/>
           </w:rPr>
-          <w:t>24</w:t>
+          <w:t>26</w:t>
         </w:r>
       </w:hyperlink>
     </w:p>
@@ -1678,7 +1678,7 @@
             <w:u w:val="none"/>
             <w:sz w:val="24"/>
           </w:rPr>
-          <w:t>27</w:t>
+          <w:t>29</w:t>
         </w:r>
       </w:hyperlink>
     </w:p>
@@ -1718,7 +1718,7 @@
             <w:u w:val="none"/>
             <w:sz w:val="24"/>
           </w:rPr>
-          <w:t>28</w:t>
+          <w:t>30</w:t>
         </w:r>
       </w:hyperlink>
     </w:p>
@@ -1758,7 +1758,7 @@
             <w:u w:val="none"/>
             <w:sz w:val="24"/>
           </w:rPr>
-          <w:t>28</w:t>
+          <w:t>30</w:t>
         </w:r>
       </w:hyperlink>
     </w:p>
@@ -1798,7 +1798,7 @@
             <w:u w:val="none"/>
             <w:sz w:val="24"/>
           </w:rPr>
-          <w:t>29</w:t>
+          <w:t>31</w:t>
         </w:r>
       </w:hyperlink>
     </w:p>
@@ -1838,7 +1838,7 @@
             <w:u w:val="none"/>
             <w:sz w:val="24"/>
           </w:rPr>
-          <w:t>30</w:t>
+          <w:t>32</w:t>
         </w:r>
       </w:hyperlink>
     </w:p>
@@ -1878,7 +1878,7 @@
             <w:u w:val="none"/>
             <w:sz w:val="24"/>
           </w:rPr>
-          <w:t>32</w:t>
+          <w:t>34</w:t>
         </w:r>
       </w:hyperlink>
     </w:p>
@@ -1918,7 +1918,7 @@
             <w:u w:val="none"/>
             <w:sz w:val="24"/>
           </w:rPr>
-          <w:t>33</w:t>
+          <w:t>35</w:t>
         </w:r>
       </w:hyperlink>
     </w:p>
@@ -1958,7 +1958,7 @@
             <w:u w:val="none"/>
             <w:sz w:val="24"/>
           </w:rPr>
-          <w:t>34</w:t>
+          <w:t>36</w:t>
         </w:r>
       </w:hyperlink>
     </w:p>
@@ -1998,7 +1998,7 @@
             <w:u w:val="none"/>
             <w:sz w:val="24"/>
           </w:rPr>
-          <w:t>35</w:t>
+          <w:t>37</w:t>
         </w:r>
       </w:hyperlink>
     </w:p>
@@ -2038,7 +2038,7 @@
             <w:u w:val="none"/>
             <w:sz w:val="24"/>
           </w:rPr>
-          <w:t>35</w:t>
+          <w:t>37</w:t>
         </w:r>
       </w:hyperlink>
     </w:p>
@@ -2078,7 +2078,7 @@
             <w:u w:val="none"/>
             <w:sz w:val="24"/>
           </w:rPr>
-          <w:t>36</w:t>
+          <w:t>38</w:t>
         </w:r>
       </w:hyperlink>
     </w:p>
@@ -2118,7 +2118,7 @@
             <w:u w:val="none"/>
             <w:sz w:val="24"/>
           </w:rPr>
-          <w:t>36</w:t>
+          <w:t>38</w:t>
         </w:r>
       </w:hyperlink>
     </w:p>
@@ -2158,7 +2158,7 @@
             <w:u w:val="none"/>
             <w:sz w:val="24"/>
           </w:rPr>
-          <w:t>36</w:t>
+          <w:t>38</w:t>
         </w:r>
       </w:hyperlink>
     </w:p>
@@ -2198,7 +2198,7 @@
             <w:u w:val="none"/>
             <w:sz w:val="24"/>
           </w:rPr>
-          <w:t>37</w:t>
+          <w:t>39</w:t>
         </w:r>
       </w:hyperlink>
     </w:p>
@@ -2238,7 +2238,7 @@
             <w:u w:val="none"/>
             <w:sz w:val="24"/>
           </w:rPr>
-          <w:t>39</w:t>
+          <w:t>41</w:t>
         </w:r>
       </w:hyperlink>
     </w:p>
@@ -2278,7 +2278,7 @@
             <w:u w:val="none"/>
             <w:sz w:val="24"/>
           </w:rPr>
-          <w:t>40</w:t>
+          <w:t>42</w:t>
         </w:r>
       </w:hyperlink>
     </w:p>
@@ -2318,7 +2318,7 @@
             <w:u w:val="none"/>
             <w:sz w:val="24"/>
           </w:rPr>
-          <w:t>41</w:t>
+          <w:t>43</w:t>
         </w:r>
       </w:hyperlink>
     </w:p>
@@ -2358,7 +2358,7 @@
             <w:u w:val="none"/>
             <w:sz w:val="24"/>
           </w:rPr>
-          <w:t>43</w:t>
+          <w:t>45</w:t>
         </w:r>
       </w:hyperlink>
     </w:p>
@@ -2398,7 +2398,7 @@
             <w:u w:val="none"/>
             <w:sz w:val="24"/>
           </w:rPr>
-          <w:t>43</w:t>
+          <w:t>45</w:t>
         </w:r>
       </w:hyperlink>
     </w:p>
@@ -2438,7 +2438,7 @@
             <w:u w:val="none"/>
             <w:sz w:val="24"/>
           </w:rPr>
-          <w:t>43</w:t>
+          <w:t>45</w:t>
         </w:r>
       </w:hyperlink>
     </w:p>
@@ -2478,7 +2478,7 @@
             <w:u w:val="none"/>
             <w:sz w:val="24"/>
           </w:rPr>
-          <w:t>43</w:t>
+          <w:t>45</w:t>
         </w:r>
       </w:hyperlink>
     </w:p>
@@ -2518,7 +2518,7 @@
             <w:u w:val="none"/>
             <w:sz w:val="24"/>
           </w:rPr>
-          <w:t>44</w:t>
+          <w:t>46</w:t>
         </w:r>
       </w:hyperlink>
     </w:p>
@@ -2558,7 +2558,7 @@
             <w:u w:val="none"/>
             <w:sz w:val="24"/>
           </w:rPr>
-          <w:t>45</w:t>
+          <w:t>47</w:t>
         </w:r>
       </w:hyperlink>
     </w:p>
@@ -2598,7 +2598,7 @@
             <w:u w:val="none"/>
             <w:sz w:val="24"/>
           </w:rPr>
-          <w:t>45</w:t>
+          <w:t>47</w:t>
         </w:r>
       </w:hyperlink>
     </w:p>
@@ -2638,7 +2638,7 @@
             <w:u w:val="none"/>
             <w:sz w:val="24"/>
           </w:rPr>
-          <w:t>45</w:t>
+          <w:t>47</w:t>
         </w:r>
       </w:hyperlink>
     </w:p>
@@ -2678,7 +2678,7 @@
             <w:u w:val="none"/>
             <w:sz w:val="24"/>
           </w:rPr>
-          <w:t>46</w:t>
+          <w:t>48</w:t>
         </w:r>
       </w:hyperlink>
     </w:p>
@@ -2718,7 +2718,7 @@
             <w:u w:val="none"/>
             <w:sz w:val="24"/>
           </w:rPr>
-          <w:t>46</w:t>
+          <w:t>48</w:t>
         </w:r>
       </w:hyperlink>
     </w:p>
@@ -2758,7 +2758,7 @@
             <w:u w:val="none"/>
             <w:sz w:val="24"/>
           </w:rPr>
-          <w:t>48</w:t>
+          <w:t>50</w:t>
         </w:r>
       </w:hyperlink>
     </w:p>
@@ -2798,7 +2798,7 @@
             <w:u w:val="none"/>
             <w:sz w:val="24"/>
           </w:rPr>
-          <w:t>48</w:t>
+          <w:t>50</w:t>
         </w:r>
       </w:hyperlink>
     </w:p>
@@ -2838,7 +2838,7 @@
             <w:u w:val="none"/>
             <w:sz w:val="24"/>
           </w:rPr>
-          <w:t>48</w:t>
+          <w:t>50</w:t>
         </w:r>
       </w:hyperlink>
     </w:p>
@@ -2878,7 +2878,7 @@
             <w:u w:val="none"/>
             <w:sz w:val="24"/>
           </w:rPr>
-          <w:t>48</w:t>
+          <w:t>50</w:t>
         </w:r>
       </w:hyperlink>
     </w:p>
@@ -2918,7 +2918,7 @@
             <w:u w:val="none"/>
             <w:sz w:val="24"/>
           </w:rPr>
-          <w:t>48</w:t>
+          <w:t>50</w:t>
         </w:r>
       </w:hyperlink>
     </w:p>
@@ -2958,7 +2958,7 @@
             <w:u w:val="none"/>
             <w:sz w:val="24"/>
           </w:rPr>
-          <w:t>49</w:t>
+          <w:t>51</w:t>
         </w:r>
       </w:hyperlink>
     </w:p>
@@ -2998,7 +2998,7 @@
             <w:u w:val="none"/>
             <w:sz w:val="24"/>
           </w:rPr>
-          <w:t>49</w:t>
+          <w:t>51</w:t>
         </w:r>
       </w:hyperlink>
     </w:p>
@@ -3038,7 +3038,7 @@
             <w:u w:val="none"/>
             <w:sz w:val="24"/>
           </w:rPr>
-          <w:t>49</w:t>
+          <w:t>51</w:t>
         </w:r>
       </w:hyperlink>
     </w:p>
@@ -3078,7 +3078,7 @@
             <w:u w:val="none"/>
             <w:sz w:val="24"/>
           </w:rPr>
-          <w:t>49</w:t>
+          <w:t>51</w:t>
         </w:r>
       </w:hyperlink>
     </w:p>
@@ -3118,7 +3118,7 @@
             <w:u w:val="none"/>
             <w:sz w:val="24"/>
           </w:rPr>
-          <w:t>50</w:t>
+          <w:t>52</w:t>
         </w:r>
       </w:hyperlink>
     </w:p>
@@ -3158,7 +3158,7 @@
             <w:u w:val="none"/>
             <w:sz w:val="24"/>
           </w:rPr>
-          <w:t>50</w:t>
+          <w:t>52</w:t>
         </w:r>
       </w:hyperlink>
     </w:p>
@@ -3198,7 +3198,7 @@
             <w:u w:val="none"/>
             <w:sz w:val="24"/>
           </w:rPr>
-          <w:t>50</w:t>
+          <w:t>52</w:t>
         </w:r>
       </w:hyperlink>
     </w:p>
@@ -3238,7 +3238,7 @@
             <w:u w:val="none"/>
             <w:sz w:val="24"/>
           </w:rPr>
-          <w:t>50</w:t>
+          <w:t>52</w:t>
         </w:r>
       </w:hyperlink>
     </w:p>
@@ -3278,7 +3278,7 @@
             <w:u w:val="none"/>
             <w:sz w:val="24"/>
           </w:rPr>
-          <w:t>51</w:t>
+          <w:t>53</w:t>
         </w:r>
       </w:hyperlink>
     </w:p>
@@ -4221,7 +4221,101 @@
           <w:color w:val="000000"/>
           <w:sz w:val="24"/>
         </w:rPr>
-        <w:t>Um sistema multiagente é composto por múltiplas unidades capazes de perceber informações, tomar decisões e atuar de maneira coordenada. Em sistemas baseados em LLMs, os agentes podem ser diferenciados por instruções, funções e ferramentas. A especialização permite decompor uma solicitação em responsabilidades menores, mas introduz custos de comunicação, sincronização e controle. Assim, adicionar agentes não implica automaticamente melhorar o desempenho.</w:t>
+        <w:t>Um sistema multiagente é formado por unidades computacionais que percebem informações, tomam decisões e atuam em um ambiente compartilhado, preservando algum grau de autonomia local. O comportamento global resulta da capacidade de cada agente e das regras que distribuem responsabilidades, informações e autoridade. Isso diferencia um sistema multiagente de uma aplicação que apenas realiza chamadas independentes a modelos: a colaboração exige uma estrutura comum de objetivos, comunicação e coordenação.</w:t>
+      </w:r>
+    </w:p>
+    <w:p>
+      <w:pPr/>
+      <w:r>
+        <w:rPr>
+          <w:rFonts w:ascii="Arial" w:hAnsi="Arial" w:eastAsia="Arial" w:cs="Arial"/>
+          <w:color w:val="000000"/>
+          <w:sz w:val="24"/>
+        </w:rPr>
+        <w:t xml:space="preserve">Nos sistemas baseados em </w:t>
+      </w:r>
+      <w:r>
+        <w:rPr>
+          <w:rFonts w:ascii="Arial" w:hAnsi="Arial" w:eastAsia="Arial" w:cs="Arial"/>
+          <w:i w:val="1"/>
+          <w:color w:val="000000"/>
+          <w:sz w:val="24"/>
+          <w:iCs w:val="1"/>
+        </w:rPr>
+        <w:t>Large Language Models</w:t>
+      </w:r>
+      <w:r>
+        <w:rPr>
+          <w:rFonts w:ascii="Arial" w:hAnsi="Arial" w:eastAsia="Arial" w:cs="Arial"/>
+          <w:color w:val="000000"/>
+          <w:sz w:val="24"/>
+        </w:rPr>
+        <w:t xml:space="preserve">, os agentes podem ser diferenciados por instruções, papéis, ferramentas, fontes de conhecimento e permissões. Um agente pode classificar a solicitação, outro recuperar evidências e um terceiro sintetizar a resposta. Li </w:t>
+      </w:r>
+      <w:r>
+        <w:rPr>
+          <w:rFonts w:ascii="Arial" w:hAnsi="Arial" w:eastAsia="Arial" w:cs="Arial"/>
+          <w:i w:val="1"/>
+          <w:iCs w:val="1"/>
+          <w:color w:val="000000"/>
+          <w:sz w:val="24"/>
+        </w:rPr>
+        <w:t>et al.</w:t>
+      </w:r>
+      <w:r>
+        <w:rPr>
+          <w:rFonts w:ascii="Arial" w:hAnsi="Arial" w:eastAsia="Arial" w:cs="Arial"/>
+          <w:color w:val="000000"/>
+          <w:sz w:val="24"/>
+        </w:rPr>
+        <w:t xml:space="preserve"> (2024) descrevem elementos como perfil, percepção, ação, interação e evolução, evidenciando que o modelo é somente parte de uma organização mais ampla. A especialização facilita a decomposição, mas cria dependências: cada transferência exige preservar contexto e interpretar corretamente a saída anterior.</w:t>
+      </w:r>
+    </w:p>
+    <w:p>
+      <w:pPr/>
+      <w:r>
+        <w:rPr>
+          <w:rFonts w:ascii="Arial" w:hAnsi="Arial" w:eastAsia="Arial" w:cs="Arial"/>
+          <w:color w:val="000000"/>
+          <w:sz w:val="24"/>
+        </w:rPr>
+        <w:t xml:space="preserve">A quantidade de agentes, portanto, não mede sozinha a capacidade do sistema. Configurações com os mesmos agentes e modelos podem divergir por topologia, participação e compartilhamento de contexto. Qian </w:t>
+      </w:r>
+      <w:r>
+        <w:rPr>
+          <w:rFonts w:ascii="Arial" w:hAnsi="Arial" w:eastAsia="Arial" w:cs="Arial"/>
+          <w:i w:val="1"/>
+          <w:iCs w:val="1"/>
+          <w:color w:val="000000"/>
+          <w:sz w:val="24"/>
+        </w:rPr>
+        <w:t>et al.</w:t>
+      </w:r>
+      <w:r>
+        <w:rPr>
+          <w:rFonts w:ascii="Arial" w:hAnsi="Arial" w:eastAsia="Arial" w:cs="Arial"/>
+          <w:color w:val="000000"/>
+          <w:sz w:val="24"/>
+        </w:rPr>
+        <w:t xml:space="preserve"> (2025) representam a colaboração por grafos acíclicos direcionados; Zhu </w:t>
+      </w:r>
+      <w:r>
+        <w:rPr>
+          <w:rFonts w:ascii="Arial" w:hAnsi="Arial" w:eastAsia="Arial" w:cs="Arial"/>
+          <w:i w:val="1"/>
+          <w:iCs w:val="1"/>
+          <w:color w:val="000000"/>
+          <w:sz w:val="24"/>
+        </w:rPr>
+        <w:t>et al.</w:t>
+      </w:r>
+      <w:r>
+        <w:rPr>
+          <w:rFonts w:ascii="Arial" w:hAnsi="Arial" w:eastAsia="Arial" w:cs="Arial"/>
+          <w:color w:val="000000"/>
+          <w:sz w:val="24"/>
+        </w:rPr>
+        <w:t xml:space="preserve"> (2025) organizam protocolos em estrela, árvore, cadeia e grafo. Esses trabalhos sustentam uma distinção central: agentes são as unidades participantes; a arquitetura de coordenação define como elas formam um sistema.</w:t>
       </w:r>
     </w:p>
     <w:p>
@@ -4254,7 +4348,18 @@
           <w:color w:val="000000"/>
           <w:sz w:val="24"/>
         </w:rPr>
-        <w:t xml:space="preserve">A arquitetura define quais agentes existem, quem inicia a execução, como o estado é compartilhado e quem produz a resposta final. Revisões recentes destacam que sistemas multiagentes podem variar quanto à autonomia, topologia de comunicação, distribuição das decisões e mecanismos de supervisão (LI </w:t>
+        <w:t>A arquitetura abrange a composição dos agentes e as relações que regulam sua atuação. Ela define quem inicia a execução, quais componentes acionam ferramentas, como o estado é mantido, quem autoriza transferências, quando o fluxo termina e qual unidade produz a resposta final. Portanto, não deve ser descrita apenas como um diagrama de módulos: ela contém decisões que condicionam o percurso de cada tarefa.</w:t>
+      </w:r>
+    </w:p>
+    <w:p>
+      <w:pPr/>
+      <w:r>
+        <w:rPr>
+          <w:rFonts w:ascii="Arial" w:hAnsi="Arial" w:eastAsia="Arial" w:cs="Arial"/>
+          <w:color w:val="000000"/>
+          <w:sz w:val="24"/>
+        </w:rPr>
+        <w:t xml:space="preserve">Revisões recentes mostram variações de topologia, autoridade, memória e controle (LI </w:t>
       </w:r>
       <w:r>
         <w:rPr>
@@ -4290,7 +4395,101 @@
           <w:color w:val="000000"/>
           <w:sz w:val="24"/>
         </w:rPr>
-        <w:t>, 2025). Essas escolhas influenciam rastreabilidade, robustez e custo computacional, além de determinar quais eventos podem ser observados durante um atendimento.</w:t>
+        <w:t>, 2025). Em uma organização hierárquica, um supervisor seleciona especialistas e consolida saídas. Em uma estrutura sequencial, o controle está incorporado à ordem das etapas. Em uma rede descentralizada, os agentes escolhem para qual par transferir a tarefa. Cada forma determina caminhos, pontos de falha e evidências diferentes para auditoria.</w:t>
+      </w:r>
+    </w:p>
+    <w:p>
+      <w:pPr/>
+      <w:r>
+        <w:rPr>
+          <w:rFonts w:ascii="Arial" w:hAnsi="Arial" w:eastAsia="Arial" w:cs="Arial"/>
+          <w:color w:val="000000"/>
+          <w:sz w:val="24"/>
+        </w:rPr>
+        <w:t xml:space="preserve">A topologia torna parte dessas diferenças observável. Uma estrela concentra comunicação em um nó; uma cadeia impõe ordem linear; uma árvore distribui subtarefas por níveis; e um grafo permite relações mais flexíveis (QIAN </w:t>
+      </w:r>
+      <w:r>
+        <w:rPr>
+          <w:rFonts w:ascii="Arial" w:hAnsi="Arial" w:eastAsia="Arial" w:cs="Arial"/>
+          <w:i w:val="1"/>
+          <w:iCs w:val="1"/>
+          <w:color w:val="000000"/>
+          <w:sz w:val="24"/>
+        </w:rPr>
+        <w:t>et al.</w:t>
+      </w:r>
+      <w:r>
+        <w:rPr>
+          <w:rFonts w:ascii="Arial" w:hAnsi="Arial" w:eastAsia="Arial" w:cs="Arial"/>
+          <w:color w:val="000000"/>
+          <w:sz w:val="24"/>
+        </w:rPr>
+        <w:t xml:space="preserve">, 2025; ZHU </w:t>
+      </w:r>
+      <w:r>
+        <w:rPr>
+          <w:rFonts w:ascii="Arial" w:hAnsi="Arial" w:eastAsia="Arial" w:cs="Arial"/>
+          <w:i w:val="1"/>
+          <w:iCs w:val="1"/>
+          <w:color w:val="000000"/>
+          <w:sz w:val="24"/>
+        </w:rPr>
+        <w:t>et al.</w:t>
+      </w:r>
+      <w:r>
+        <w:rPr>
+          <w:rFonts w:ascii="Arial" w:hAnsi="Arial" w:eastAsia="Arial" w:cs="Arial"/>
+          <w:color w:val="000000"/>
+          <w:sz w:val="24"/>
+        </w:rPr>
+        <w:t>, 2025). Contudo, grafos semelhantes podem adotar regras diferentes para participação, contexto, repetição e encerramento. A análise precisa combinar a forma da rede com os mecanismos de execução.</w:t>
+      </w:r>
+    </w:p>
+    <w:p>
+      <w:pPr/>
+      <w:r>
+        <w:rPr>
+          <w:rFonts w:ascii="Arial" w:hAnsi="Arial" w:eastAsia="Arial" w:cs="Arial"/>
+          <w:color w:val="000000"/>
+          <w:sz w:val="24"/>
+        </w:rPr>
+        <w:t xml:space="preserve">Em comparações experimentais, componentes alheios à variável arquitetural devem permanecer equivalentes. Modelo, ferramentas, cenários e critérios de avaliação precisam ser controlados para relacionar diferenças observadas à coordenação. No MAB, uma base funcional comum sustenta orquestração centralizada, </w:t>
+      </w:r>
+      <w:r>
+        <w:rPr>
+          <w:rFonts w:ascii="Arial" w:hAnsi="Arial" w:eastAsia="Arial" w:cs="Arial"/>
+          <w:i w:val="1"/>
+          <w:color w:val="000000"/>
+          <w:sz w:val="24"/>
+          <w:iCs w:val="1"/>
+        </w:rPr>
+        <w:t>workflow</w:t>
+      </w:r>
+      <w:r>
+        <w:rPr>
+          <w:rFonts w:ascii="Arial" w:hAnsi="Arial" w:eastAsia="Arial" w:cs="Arial"/>
+          <w:color w:val="000000"/>
+          <w:sz w:val="24"/>
+        </w:rPr>
+        <w:t xml:space="preserve"> estruturado e </w:t>
+      </w:r>
+      <w:r>
+        <w:rPr>
+          <w:rFonts w:ascii="Arial" w:hAnsi="Arial" w:eastAsia="Arial" w:cs="Arial"/>
+          <w:i w:val="1"/>
+          <w:color w:val="000000"/>
+          <w:sz w:val="24"/>
+          <w:iCs w:val="1"/>
+        </w:rPr>
+        <w:t>swarm</w:t>
+      </w:r>
+      <w:r>
+        <w:rPr>
+          <w:rFonts w:ascii="Arial" w:hAnsi="Arial" w:eastAsia="Arial" w:cs="Arial"/>
+          <w:color w:val="000000"/>
+          <w:sz w:val="24"/>
+        </w:rPr>
+        <w:t xml:space="preserve"> descentralizado. A farmácia fornece tarefas concretas, enquanto a arquitetura determina como os agentes organizam o trabalho.</w:t>
       </w:r>
     </w:p>
     <w:p>
@@ -4323,25 +4522,65 @@
           <w:color w:val="000000"/>
           <w:sz w:val="24"/>
         </w:rPr>
-        <w:t xml:space="preserve">A comunicação pode ocorrer por mensagens diretas, estado compartilhado, </w:t>
-      </w:r>
-      <w:r>
-        <w:rPr>
-          <w:rFonts w:ascii="Arial" w:hAnsi="Arial" w:eastAsia="Arial" w:cs="Arial"/>
-          <w:color w:val="000000"/>
-          <w:sz w:val="24"/>
+        <w:t xml:space="preserve">A comunicação corresponde ao intercâmbio de solicitações, resultados, evidências e informações de controle. Ela pode ocorrer por mensagens diretas, estado compartilhado, chamadas mediadas ou </w:t>
+      </w:r>
+      <w:r>
+        <w:rPr>
+          <w:rFonts w:ascii="Arial" w:hAnsi="Arial" w:eastAsia="Arial" w:cs="Arial"/>
+          <w:i w:val="1"/>
+          <w:color w:val="000000"/>
+          <w:sz w:val="24"/>
+          <w:iCs w:val="1"/>
+        </w:rPr>
+        <w:t>handoffs</w:t>
+      </w:r>
+      <w:r>
+        <w:rPr>
+          <w:rFonts w:ascii="Arial" w:hAnsi="Arial" w:eastAsia="Arial" w:cs="Arial"/>
+          <w:color w:val="000000"/>
+          <w:sz w:val="24"/>
+        </w:rPr>
+        <w:t>, nos quais um agente transfere a continuidade para outro. Metadados como origem, destino, ferramenta, motivo da transferência e estado permitem reconstruir não apenas a resposta, mas o processo que a produziu.</w:t>
+      </w:r>
+    </w:p>
+    <w:p>
+      <w:pPr/>
+      <w:r>
+        <w:rPr>
+          <w:rFonts w:ascii="Arial" w:hAnsi="Arial" w:eastAsia="Arial" w:cs="Arial"/>
+          <w:color w:val="000000"/>
+          <w:sz w:val="24"/>
+        </w:rPr>
+        <w:t xml:space="preserve">Coordenação transforma essas interações em um fluxo coerente: estabelece participantes, autoridade sobre o próximo passo, resolução de conflitos e encerramento. Wang </w:t>
+      </w:r>
+      <w:r>
+        <w:rPr>
+          <w:rFonts w:ascii="Arial" w:hAnsi="Arial" w:eastAsia="Arial" w:cs="Arial"/>
           <w:i w:val="1"/>
           <w:iCs w:val="1"/>
-        </w:rPr>
-        <w:t>handoffs</w:t>
-      </w:r>
-      <w:r>
-        <w:rPr>
-          <w:rFonts w:ascii="Arial" w:hAnsi="Arial" w:eastAsia="Arial" w:cs="Arial"/>
-          <w:color w:val="000000"/>
-          <w:sz w:val="24"/>
-        </w:rPr>
-        <w:t xml:space="preserve"> ou por um controlador que intermedeia as decisões. Ela é necessária para distribuir subtarefas, mas também pode propagar erros ou ampliar divergências. Hammond </w:t>
+          <w:color w:val="000000"/>
+          <w:sz w:val="24"/>
+        </w:rPr>
+        <w:t>et al.</w:t>
+      </w:r>
+      <w:r>
+        <w:rPr>
+          <w:rFonts w:ascii="Arial" w:hAnsi="Arial" w:eastAsia="Arial" w:cs="Arial"/>
+          <w:color w:val="000000"/>
+          <w:sz w:val="24"/>
+        </w:rPr>
+        <w:t xml:space="preserve"> (2025) organizam estratégias colaborativas em governança, participação, interação e gestão do histórico. Assim, coordenar não é apenas enviar mensagens, mas selecionar participantes e preservar o contexto necessário às decisões subsequentes.</w:t>
+      </w:r>
+    </w:p>
+    <w:p>
+      <w:pPr/>
+      <w:r>
+        <w:rPr>
+          <w:rFonts w:ascii="Arial" w:hAnsi="Arial" w:eastAsia="Arial" w:cs="Arial"/>
+          <w:color w:val="000000"/>
+          <w:sz w:val="24"/>
+        </w:rPr>
+        <w:t xml:space="preserve">O compartilhamento produz benefícios e custos. Evidências podem evitar trabalho duplicado, enquanto contexto incorreto pode propagar decisões inadequadas. Transferências excessivas elevam mensagens, tokens e latência. Hammond </w:t>
       </w:r>
       <w:r>
         <w:rPr>
@@ -4359,7 +4598,90 @@
           <w:color w:val="000000"/>
           <w:sz w:val="24"/>
         </w:rPr>
-        <w:t xml:space="preserve"> (2025) organizam riscos multiagentes em categorias que incluem descoordenação, conflito e cooperação indesejada. Embora o MAB opere com agentes que compartilham um objetivo, o risco de descoordenação permanece relevante quando uma rota incorreta, uma evidência insuficiente ou uma transferência excessiva altera o atendimento.</w:t>
+        <w:t xml:space="preserve"> (2025) incluem descoordenação, conflito e cooperação indesejada entre os riscos multiagentes. Mesmo com objetivo comum, podem ocorrer rotas incorretas, repetição, ciclos ou consolidação de evidência insuficiente.</w:t>
+      </w:r>
+    </w:p>
+    <w:p>
+      <w:pPr/>
+      <w:r>
+        <w:rPr>
+          <w:rFonts w:ascii="Arial" w:hAnsi="Arial" w:eastAsia="Arial" w:cs="Arial"/>
+          <w:color w:val="000000"/>
+          <w:sz w:val="24"/>
+        </w:rPr>
+        <w:t xml:space="preserve">Por isso, observabilidade e limites operacionais integram a coordenação. Identificadores, mensagens, ferramentas, transições, contagem de </w:t>
+      </w:r>
+      <w:r>
+        <w:rPr>
+          <w:rFonts w:ascii="Arial" w:hAnsi="Arial" w:eastAsia="Arial" w:cs="Arial"/>
+          <w:i w:val="1"/>
+          <w:color w:val="000000"/>
+          <w:sz w:val="24"/>
+          <w:iCs w:val="1"/>
+        </w:rPr>
+        <w:t>handoffs</w:t>
+      </w:r>
+      <w:r>
+        <w:rPr>
+          <w:rFonts w:ascii="Arial" w:hAnsi="Arial" w:eastAsia="Arial" w:cs="Arial"/>
+          <w:color w:val="000000"/>
+          <w:sz w:val="24"/>
+        </w:rPr>
+        <w:t xml:space="preserve"> e condições de </w:t>
+      </w:r>
+      <w:r>
+        <w:rPr>
+          <w:rFonts w:ascii="Arial" w:hAnsi="Arial" w:eastAsia="Arial" w:cs="Arial"/>
+          <w:i w:val="1"/>
+          <w:color w:val="000000"/>
+          <w:sz w:val="24"/>
+          <w:iCs w:val="1"/>
+        </w:rPr>
+        <w:t>timeout</w:t>
+      </w:r>
+      <w:r>
+        <w:rPr>
+          <w:rFonts w:ascii="Arial" w:hAnsi="Arial" w:eastAsia="Arial" w:cs="Arial"/>
+          <w:color w:val="000000"/>
+          <w:sz w:val="24"/>
+        </w:rPr>
+        <w:t xml:space="preserve"> permitem verificar o comportamento. A telemetria não elimina erros semânticos, mas torna comparáveis custos e caminhos. A seção seguinte distingue orquestração centralizada, </w:t>
+      </w:r>
+      <w:r>
+        <w:rPr>
+          <w:rFonts w:ascii="Arial" w:hAnsi="Arial" w:eastAsia="Arial" w:cs="Arial"/>
+          <w:i w:val="1"/>
+          <w:color w:val="000000"/>
+          <w:sz w:val="24"/>
+          <w:iCs w:val="1"/>
+        </w:rPr>
+        <w:t>workflow</w:t>
+      </w:r>
+      <w:r>
+        <w:rPr>
+          <w:rFonts w:ascii="Arial" w:hAnsi="Arial" w:eastAsia="Arial" w:cs="Arial"/>
+          <w:color w:val="000000"/>
+          <w:sz w:val="24"/>
+        </w:rPr>
+        <w:t xml:space="preserve"> estruturado e </w:t>
+      </w:r>
+      <w:r>
+        <w:rPr>
+          <w:rFonts w:ascii="Arial" w:hAnsi="Arial" w:eastAsia="Arial" w:cs="Arial"/>
+          <w:i w:val="1"/>
+          <w:color w:val="000000"/>
+          <w:sz w:val="24"/>
+          <w:iCs w:val="1"/>
+        </w:rPr>
+        <w:t>swarm</w:t>
+      </w:r>
+      <w:r>
+        <w:rPr>
+          <w:rFonts w:ascii="Arial" w:hAnsi="Arial" w:eastAsia="Arial" w:cs="Arial"/>
+          <w:color w:val="000000"/>
+          <w:sz w:val="24"/>
+        </w:rPr>
+        <w:t xml:space="preserve"> descentralizado sem pressupor superioridade antes das evidências experimentais.</w:t>
       </w:r>
     </w:p>
     <w:p>
@@ -13023,10 +13345,10 @@
       <w:r>
         <w:rPr>
           <w:rFonts w:ascii="Arial" w:hAnsi="Arial" w:eastAsia="Arial" w:cs="Arial"/>
-          <w:color w:val="000000"/>
-          <w:sz w:val="24"/>
           <w:b w:val="1"/>
           <w:bCs w:val="1"/>
+          <w:color w:val="000000"/>
+          <w:sz w:val="24"/>
         </w:rPr>
         <w:t>International Conference on Learning Representations 2025</w:t>
       </w:r>
@@ -13351,10 +13673,10 @@
       <w:r>
         <w:rPr>
           <w:rFonts w:ascii="Arial" w:hAnsi="Arial" w:eastAsia="Arial" w:cs="Arial"/>
-          <w:color w:val="000000"/>
-          <w:sz w:val="24"/>
           <w:b w:val="1"/>
           <w:bCs w:val="1"/>
+          <w:color w:val="000000"/>
+          <w:sz w:val="24"/>
         </w:rPr>
         <w:t>International Conference on Learning Representations 2026</w:t>
       </w:r>
@@ -13401,10 +13723,10 @@
       <w:r>
         <w:rPr>
           <w:rFonts w:ascii="Arial" w:hAnsi="Arial" w:eastAsia="Arial" w:cs="Arial"/>
-          <w:color w:val="000000"/>
-          <w:sz w:val="24"/>
           <w:b w:val="1"/>
           <w:bCs w:val="1"/>
+          <w:color w:val="000000"/>
+          <w:sz w:val="24"/>
         </w:rPr>
         <w:t>Proceedings of the 63rd Annual Meeting of the Association for Computational Linguistics (Volume 1: Long Papers)</w:t>
       </w:r>

</xml_diff>

<commit_message>
docs(tcc): formaliza ordem de execucao experimental
</commit_message>
<xml_diff>
--- a/TCC/TCC_MAB_Facens_Ralph_10x.docx
+++ b/TCC/TCC_MAB_Facens_Ralph_10x.docx
@@ -2038,7 +2038,7 @@
             <w:u w:val="none"/>
             <w:sz w:val="24"/>
           </w:rPr>
-          <w:t>37</w:t>
+          <w:t>38</w:t>
         </w:r>
       </w:hyperlink>
     </w:p>
@@ -2158,7 +2158,7 @@
             <w:u w:val="none"/>
             <w:sz w:val="24"/>
           </w:rPr>
-          <w:t>38</w:t>
+          <w:t>39</w:t>
         </w:r>
       </w:hyperlink>
     </w:p>
@@ -7994,7 +7994,7 @@
                     <a:blip r:embed="rId14">
                       <a:extLst>
                         <a:ext uri="{96DAC541-7B7A-43D3-8B79-37D633B846F1}">
-                          <ns0:svgBlip xmlns:ns0="http://schemas.microsoft.com/office/drawing/2016/SVG/main" r:embed="rId30"/>
+                          <ns0:svgBlip xmlns:ns0="http://schemas.microsoft.com/office/drawing/2016/SVG/main" r:embed="rId34"/>
                         </a:ext>
                       </a:extLst>
                     </a:blip>
@@ -8256,7 +8256,7 @@
                     <a:blip r:embed="rId16">
                       <a:extLst>
                         <a:ext uri="{96DAC541-7B7A-43D3-8B79-37D633B846F1}">
-                          <ns1:svgBlip xmlns:ns1="http://schemas.microsoft.com/office/drawing/2016/SVG/main" r:embed="rId31"/>
+                          <ns1:svgBlip xmlns:ns1="http://schemas.microsoft.com/office/drawing/2016/SVG/main" r:embed="rId35"/>
                         </a:ext>
                       </a:extLst>
                     </a:blip>
@@ -8628,7 +8628,7 @@
           <w:color w:val="000000"/>
           <w:sz w:val="24"/>
         </w:rPr>
-        <w:t xml:space="preserve">A ordem de execução das arquiteturas será alternada ou randomizada ao longo do </w:t>
+        <w:t xml:space="preserve">Para reduzir efeitos associados ao momento da chamada, às condições de rede e à variação temporal do serviço remoto, a ordem será definida por randomização em blocos. Cada combinação entre cenário e repetição constituirá um bloco com três execuções consecutivas, uma por arquitetura. Nos 40 blocos de cada estrato, as seis permutações possíveis entre centralizada, </w:t>
       </w:r>
       <w:r>
         <w:rPr>
@@ -8638,15 +8638,62 @@
           <w:sz w:val="24"/>
           <w:iCs w:val="1"/>
         </w:rPr>
-        <w:t>benchmark</w:t>
-      </w:r>
-      <w:r>
-        <w:rPr>
-          <w:rFonts w:ascii="Arial" w:hAnsi="Arial" w:eastAsia="Arial" w:cs="Arial"/>
-          <w:color w:val="000000"/>
-          <w:sz w:val="24"/>
-        </w:rPr>
-        <w:t xml:space="preserve"> para reduzir possíveis efeitos associados ao momento da chamada, às condições de rede ou ao serviço remoto de inferência.</w:t>
+        <w:t>workflow</w:t>
+      </w:r>
+      <w:r>
+        <w:rPr>
+          <w:rFonts w:ascii="Arial" w:hAnsi="Arial" w:eastAsia="Arial" w:cs="Arial"/>
+          <w:color w:val="000000"/>
+          <w:sz w:val="24"/>
+        </w:rPr>
+        <w:t xml:space="preserve"> e </w:t>
+      </w:r>
+      <w:r>
+        <w:rPr>
+          <w:rFonts w:ascii="Arial" w:hAnsi="Arial" w:eastAsia="Arial" w:cs="Arial"/>
+          <w:i w:val="1"/>
+          <w:color w:val="000000"/>
+          <w:sz w:val="24"/>
+          <w:iCs w:val="1"/>
+        </w:rPr>
+        <w:t>swarm</w:t>
+      </w:r>
+      <w:r>
+        <w:rPr>
+          <w:rFonts w:ascii="Arial" w:hAnsi="Arial" w:eastAsia="Arial" w:cs="Arial"/>
+          <w:color w:val="000000"/>
+          <w:sz w:val="24"/>
+        </w:rPr>
+        <w:t xml:space="preserve"> serão distribuídas da forma mais equilibrada possível, com diferença máxima de uma ocorrência entre permutações e entre as posições ocupadas por cada arquitetura. A atribuição das permutações aos blocos e o embaralhamento da sequência dos 200 blocos serão realizados por uma rotina pseudoaleatória com semente fixa antes da coleta definitiva.</w:t>
+      </w:r>
+    </w:p>
+    <w:p>
+      <w:pPr/>
+      <w:r>
+        <w:rPr>
+          <w:rFonts w:ascii="Arial" w:hAnsi="Arial" w:eastAsia="Arial" w:cs="Arial"/>
+          <w:color w:val="000000"/>
+          <w:sz w:val="24"/>
+        </w:rPr>
+        <w:t xml:space="preserve">O cronograma resultante será preservado em arquivo tabular contendo identificador do bloco, cenário, estrato, repetição, posição e arquitetura, acompanhado da semente e do resumo criptográfico SHA-256. As execuções serão realizadas sequencialmente, sem concorrência entre unidades experimentais. Erros e </w:t>
+      </w:r>
+      <w:r>
+        <w:rPr>
+          <w:rFonts w:ascii="Arial" w:hAnsi="Arial" w:eastAsia="Arial" w:cs="Arial"/>
+          <w:i w:val="1"/>
+          <w:color w:val="000000"/>
+          <w:sz w:val="24"/>
+          <w:iCs w:val="1"/>
+        </w:rPr>
+        <w:t>timeouts</w:t>
+      </w:r>
+      <w:r>
+        <w:rPr>
+          <w:rFonts w:ascii="Arial" w:hAnsi="Arial" w:eastAsia="Arial" w:cs="Arial"/>
+          <w:color w:val="000000"/>
+          <w:sz w:val="24"/>
+        </w:rPr>
+        <w:t xml:space="preserve"> ocorridos sob as condições normais do protocolo serão mantidos como resultados técnicos; somente falhas externas enquadradas nos critérios de exclusão poderão gerar execução substituta, sempre com preservação e vínculo ao registro original.</w:t>
       </w:r>
     </w:p>
     <w:p>
@@ -8735,7 +8782,7 @@
                     <a:blip r:embed="rId18">
                       <a:extLst>
                         <a:ext uri="{96DAC541-7B7A-43D3-8B79-37D633B846F1}">
-                          <ns2:svgBlip xmlns:ns2="http://schemas.microsoft.com/office/drawing/2016/SVG/main" r:embed="rId32"/>
+                          <ns2:svgBlip xmlns:ns2="http://schemas.microsoft.com/office/drawing/2016/SVG/main" r:embed="rId36"/>
                         </a:ext>
                       </a:extLst>
                     </a:blip>
@@ -9785,7 +9832,7 @@
                     <a:blip r:embed="rId20">
                       <a:extLst>
                         <a:ext uri="{96DAC541-7B7A-43D3-8B79-37D633B846F1}">
-                          <ns3:svgBlip xmlns:ns3="http://schemas.microsoft.com/office/drawing/2016/SVG/main" r:embed="rId33"/>
+                          <ns3:svgBlip xmlns:ns3="http://schemas.microsoft.com/office/drawing/2016/SVG/main" r:embed="rId37"/>
                         </a:ext>
                       </a:extLst>
                     </a:blip>
@@ -10095,7 +10142,7 @@
           <w:color w:val="000000"/>
           <w:sz w:val="24"/>
         </w:rPr>
-        <w:t xml:space="preserve"> seja executado localmente, parte da latência depende de comunicação de rede e da infraestrutura do serviço remoto, elementos que não são integralmente controlados pelos autores. As repetições e a alternância da ordem de execução buscam reduzir o impacto dessas variações.</w:t>
+        <w:t xml:space="preserve"> seja executado localmente, parte da latência depende de comunicação de rede e da infraestrutura do serviço remoto, elementos que não são integralmente controlados pelos autores. As repetições, a randomização em blocos e o equilíbrio das posições ocupadas por cada arquitetura buscam reduzir o impacto dessas variações.</w:t>
       </w:r>
     </w:p>
     <w:p>
@@ -10364,7 +10411,7 @@
           <w:color w:val="000000"/>
           <w:sz w:val="24"/>
         </w:rPr>
-        <w:t>ordem das execuções;</w:t>
+        <w:t>cronograma e ordem das execuções, incluindo semente de randomização e resumo SHA-256;</w:t>
       </w:r>
     </w:p>
     <w:p>

</xml_diff>

<commit_message>
docs(tcc): integrate adaptive architecture references
</commit_message>
<xml_diff>
--- a/TCC/TCC_MAB_Facens_Ralph_10x.docx
+++ b/TCC/TCC_MAB_Facens_Ralph_10x.docx
@@ -362,7 +362,7 @@
             <w:u w:val="none"/>
             <w:sz w:val="24"/>
           </w:rPr>
-          <w:t>34</w:t>
+          <w:t>35</w:t>
         </w:r>
       </w:hyperlink>
     </w:p>
@@ -402,7 +402,7 @@
             <w:u w:val="none"/>
             <w:sz w:val="24"/>
           </w:rPr>
-          <w:t>34</w:t>
+          <w:t>35</w:t>
         </w:r>
       </w:hyperlink>
     </w:p>
@@ -442,7 +442,7 @@
             <w:u w:val="none"/>
             <w:sz w:val="24"/>
           </w:rPr>
-          <w:t>36</w:t>
+          <w:t>37</w:t>
         </w:r>
       </w:hyperlink>
     </w:p>
@@ -482,7 +482,7 @@
             <w:u w:val="none"/>
             <w:sz w:val="24"/>
           </w:rPr>
-          <w:t>41</w:t>
+          <w:t>42</w:t>
         </w:r>
       </w:hyperlink>
     </w:p>
@@ -1718,7 +1718,7 @@
             <w:u w:val="none"/>
             <w:sz w:val="24"/>
           </w:rPr>
-          <w:t>30</w:t>
+          <w:t>31</w:t>
         </w:r>
       </w:hyperlink>
     </w:p>
@@ -1758,7 +1758,7 @@
             <w:u w:val="none"/>
             <w:sz w:val="24"/>
           </w:rPr>
-          <w:t>30</w:t>
+          <w:t>31</w:t>
         </w:r>
       </w:hyperlink>
     </w:p>
@@ -1798,7 +1798,7 @@
             <w:u w:val="none"/>
             <w:sz w:val="24"/>
           </w:rPr>
-          <w:t>31</w:t>
+          <w:t>32</w:t>
         </w:r>
       </w:hyperlink>
     </w:p>
@@ -1838,7 +1838,7 @@
             <w:u w:val="none"/>
             <w:sz w:val="24"/>
           </w:rPr>
-          <w:t>32</w:t>
+          <w:t>33</w:t>
         </w:r>
       </w:hyperlink>
     </w:p>
@@ -1878,7 +1878,7 @@
             <w:u w:val="none"/>
             <w:sz w:val="24"/>
           </w:rPr>
-          <w:t>34</w:t>
+          <w:t>35</w:t>
         </w:r>
       </w:hyperlink>
     </w:p>
@@ -1918,7 +1918,7 @@
             <w:u w:val="none"/>
             <w:sz w:val="24"/>
           </w:rPr>
-          <w:t>35</w:t>
+          <w:t>36</w:t>
         </w:r>
       </w:hyperlink>
     </w:p>
@@ -1958,7 +1958,7 @@
             <w:u w:val="none"/>
             <w:sz w:val="24"/>
           </w:rPr>
-          <w:t>36</w:t>
+          <w:t>37</w:t>
         </w:r>
       </w:hyperlink>
     </w:p>
@@ -1998,7 +1998,7 @@
             <w:u w:val="none"/>
             <w:sz w:val="24"/>
           </w:rPr>
-          <w:t>37</w:t>
+          <w:t>38</w:t>
         </w:r>
       </w:hyperlink>
     </w:p>
@@ -2038,7 +2038,7 @@
             <w:u w:val="none"/>
             <w:sz w:val="24"/>
           </w:rPr>
-          <w:t>38</w:t>
+          <w:t>39</w:t>
         </w:r>
       </w:hyperlink>
     </w:p>
@@ -2078,7 +2078,7 @@
             <w:u w:val="none"/>
             <w:sz w:val="24"/>
           </w:rPr>
-          <w:t>38</w:t>
+          <w:t>39</w:t>
         </w:r>
       </w:hyperlink>
     </w:p>
@@ -2118,7 +2118,7 @@
             <w:u w:val="none"/>
             <w:sz w:val="24"/>
           </w:rPr>
-          <w:t>38</w:t>
+          <w:t>39</w:t>
         </w:r>
       </w:hyperlink>
     </w:p>
@@ -2158,7 +2158,7 @@
             <w:u w:val="none"/>
             <w:sz w:val="24"/>
           </w:rPr>
-          <w:t>39</w:t>
+          <w:t>40</w:t>
         </w:r>
       </w:hyperlink>
     </w:p>
@@ -2198,7 +2198,7 @@
             <w:u w:val="none"/>
             <w:sz w:val="24"/>
           </w:rPr>
-          <w:t>39</w:t>
+          <w:t>40</w:t>
         </w:r>
       </w:hyperlink>
     </w:p>
@@ -2238,7 +2238,7 @@
             <w:u w:val="none"/>
             <w:sz w:val="24"/>
           </w:rPr>
-          <w:t>41</w:t>
+          <w:t>42</w:t>
         </w:r>
       </w:hyperlink>
     </w:p>
@@ -2278,7 +2278,7 @@
             <w:u w:val="none"/>
             <w:sz w:val="24"/>
           </w:rPr>
-          <w:t>42</w:t>
+          <w:t>43</w:t>
         </w:r>
       </w:hyperlink>
     </w:p>
@@ -2318,7 +2318,7 @@
             <w:u w:val="none"/>
             <w:sz w:val="24"/>
           </w:rPr>
-          <w:t>43</w:t>
+          <w:t>44</w:t>
         </w:r>
       </w:hyperlink>
     </w:p>
@@ -2358,7 +2358,7 @@
             <w:u w:val="none"/>
             <w:sz w:val="24"/>
           </w:rPr>
-          <w:t>45</w:t>
+          <w:t>46</w:t>
         </w:r>
       </w:hyperlink>
     </w:p>
@@ -2398,7 +2398,7 @@
             <w:u w:val="none"/>
             <w:sz w:val="24"/>
           </w:rPr>
-          <w:t>45</w:t>
+          <w:t>46</w:t>
         </w:r>
       </w:hyperlink>
     </w:p>
@@ -2438,7 +2438,7 @@
             <w:u w:val="none"/>
             <w:sz w:val="24"/>
           </w:rPr>
-          <w:t>45</w:t>
+          <w:t>46</w:t>
         </w:r>
       </w:hyperlink>
     </w:p>
@@ -2478,7 +2478,7 @@
             <w:u w:val="none"/>
             <w:sz w:val="24"/>
           </w:rPr>
-          <w:t>45</w:t>
+          <w:t>46</w:t>
         </w:r>
       </w:hyperlink>
     </w:p>
@@ -2518,7 +2518,7 @@
             <w:u w:val="none"/>
             <w:sz w:val="24"/>
           </w:rPr>
-          <w:t>46</w:t>
+          <w:t>47</w:t>
         </w:r>
       </w:hyperlink>
     </w:p>
@@ -2558,7 +2558,7 @@
             <w:u w:val="none"/>
             <w:sz w:val="24"/>
           </w:rPr>
-          <w:t>47</w:t>
+          <w:t>48</w:t>
         </w:r>
       </w:hyperlink>
     </w:p>
@@ -2598,7 +2598,7 @@
             <w:u w:val="none"/>
             <w:sz w:val="24"/>
           </w:rPr>
-          <w:t>47</w:t>
+          <w:t>48</w:t>
         </w:r>
       </w:hyperlink>
     </w:p>
@@ -2638,7 +2638,7 @@
             <w:u w:val="none"/>
             <w:sz w:val="24"/>
           </w:rPr>
-          <w:t>47</w:t>
+          <w:t>48</w:t>
         </w:r>
       </w:hyperlink>
     </w:p>
@@ -2678,7 +2678,7 @@
             <w:u w:val="none"/>
             <w:sz w:val="24"/>
           </w:rPr>
-          <w:t>48</w:t>
+          <w:t>49</w:t>
         </w:r>
       </w:hyperlink>
     </w:p>
@@ -2718,7 +2718,7 @@
             <w:u w:val="none"/>
             <w:sz w:val="24"/>
           </w:rPr>
-          <w:t>48</w:t>
+          <w:t>49</w:t>
         </w:r>
       </w:hyperlink>
     </w:p>
@@ -2758,7 +2758,7 @@
             <w:u w:val="none"/>
             <w:sz w:val="24"/>
           </w:rPr>
-          <w:t>50</w:t>
+          <w:t>51</w:t>
         </w:r>
       </w:hyperlink>
     </w:p>
@@ -2798,7 +2798,7 @@
             <w:u w:val="none"/>
             <w:sz w:val="24"/>
           </w:rPr>
-          <w:t>50</w:t>
+          <w:t>51</w:t>
         </w:r>
       </w:hyperlink>
     </w:p>
@@ -2838,7 +2838,7 @@
             <w:u w:val="none"/>
             <w:sz w:val="24"/>
           </w:rPr>
-          <w:t>50</w:t>
+          <w:t>51</w:t>
         </w:r>
       </w:hyperlink>
     </w:p>
@@ -2878,7 +2878,7 @@
             <w:u w:val="none"/>
             <w:sz w:val="24"/>
           </w:rPr>
-          <w:t>50</w:t>
+          <w:t>51</w:t>
         </w:r>
       </w:hyperlink>
     </w:p>
@@ -2918,7 +2918,7 @@
             <w:u w:val="none"/>
             <w:sz w:val="24"/>
           </w:rPr>
-          <w:t>50</w:t>
+          <w:t>51</w:t>
         </w:r>
       </w:hyperlink>
     </w:p>
@@ -2958,7 +2958,7 @@
             <w:u w:val="none"/>
             <w:sz w:val="24"/>
           </w:rPr>
-          <w:t>51</w:t>
+          <w:t>52</w:t>
         </w:r>
       </w:hyperlink>
     </w:p>
@@ -2998,7 +2998,7 @@
             <w:u w:val="none"/>
             <w:sz w:val="24"/>
           </w:rPr>
-          <w:t>51</w:t>
+          <w:t>52</w:t>
         </w:r>
       </w:hyperlink>
     </w:p>
@@ -3038,7 +3038,7 @@
             <w:u w:val="none"/>
             <w:sz w:val="24"/>
           </w:rPr>
-          <w:t>51</w:t>
+          <w:t>52</w:t>
         </w:r>
       </w:hyperlink>
     </w:p>
@@ -3078,7 +3078,7 @@
             <w:u w:val="none"/>
             <w:sz w:val="24"/>
           </w:rPr>
-          <w:t>51</w:t>
+          <w:t>52</w:t>
         </w:r>
       </w:hyperlink>
     </w:p>
@@ -3118,7 +3118,7 @@
             <w:u w:val="none"/>
             <w:sz w:val="24"/>
           </w:rPr>
-          <w:t>52</w:t>
+          <w:t>53</w:t>
         </w:r>
       </w:hyperlink>
     </w:p>
@@ -3158,7 +3158,7 @@
             <w:u w:val="none"/>
             <w:sz w:val="24"/>
           </w:rPr>
-          <w:t>52</w:t>
+          <w:t>53</w:t>
         </w:r>
       </w:hyperlink>
     </w:p>
@@ -3198,7 +3198,7 @@
             <w:u w:val="none"/>
             <w:sz w:val="24"/>
           </w:rPr>
-          <w:t>52</w:t>
+          <w:t>53</w:t>
         </w:r>
       </w:hyperlink>
     </w:p>
@@ -3238,7 +3238,7 @@
             <w:u w:val="none"/>
             <w:sz w:val="24"/>
           </w:rPr>
-          <w:t>52</w:t>
+          <w:t>53</w:t>
         </w:r>
       </w:hyperlink>
     </w:p>
@@ -3278,7 +3278,7 @@
             <w:u w:val="none"/>
             <w:sz w:val="24"/>
           </w:rPr>
-          <w:t>53</w:t>
+          <w:t>54</w:t>
         </w:r>
       </w:hyperlink>
     </w:p>
@@ -5521,7 +5521,7 @@
           <w:color w:val="000000"/>
           <w:sz w:val="24"/>
         </w:rPr>
-        <w:t xml:space="preserve">Wang </w:t>
+        <w:t xml:space="preserve">H. Wang </w:t>
       </w:r>
       <w:r>
         <w:rPr>
@@ -5539,136 +5539,43 @@
           <w:color w:val="000000"/>
           <w:sz w:val="24"/>
         </w:rPr>
-        <w:t xml:space="preserve"> (2025) deslocam a análise de nomes de </w:t>
-      </w:r>
-      <w:r>
-        <w:rPr>
-          <w:rFonts w:ascii="Arial" w:hAnsi="Arial" w:eastAsia="Arial" w:cs="Arial"/>
-          <w:i/>
-          <w:color w:val="000000"/>
-          <w:sz w:val="24"/>
-        </w:rPr>
-        <w:t>frameworks</w:t>
-      </w:r>
-      <w:r>
-        <w:rPr>
-          <w:rFonts w:ascii="Arial" w:hAnsi="Arial" w:eastAsia="Arial" w:cs="Arial"/>
-          <w:color w:val="000000"/>
-          <w:sz w:val="24"/>
-        </w:rPr>
-        <w:t xml:space="preserve"> para mecanismos concretos de colaboração. O trabalho organiza a coordenação em quatro dimensões — governança dos agentes, controle de participação, dinâmica de interação e gestão do histórico — e as relaciona tanto à qualidade da tarefa quanto à eficiência computacional. Essa decomposição oferece critérios diretamente úteis para caracterizar orquestração, </w:t>
-      </w:r>
-      <w:r>
-        <w:rPr>
-          <w:rFonts w:ascii="Arial" w:hAnsi="Arial" w:eastAsia="Arial" w:cs="Arial"/>
-          <w:i w:val="1"/>
-          <w:color w:val="000000"/>
-          <w:sz w:val="24"/>
-          <w:iCs w:val="1"/>
-        </w:rPr>
-        <w:t>workflow</w:t>
-      </w:r>
-      <w:r>
-        <w:rPr>
-          <w:rFonts w:ascii="Arial" w:hAnsi="Arial" w:eastAsia="Arial" w:cs="Arial"/>
-          <w:color w:val="000000"/>
-          <w:sz w:val="24"/>
-        </w:rPr>
-        <w:t xml:space="preserve"> e </w:t>
-      </w:r>
-      <w:r>
-        <w:rPr>
-          <w:rFonts w:ascii="Arial" w:hAnsi="Arial" w:eastAsia="Arial" w:cs="Arial"/>
-          <w:i w:val="1"/>
-          <w:color w:val="000000"/>
-          <w:sz w:val="24"/>
-          <w:iCs w:val="1"/>
-        </w:rPr>
-        <w:t>swarm</w:t>
-      </w:r>
-      <w:r>
-        <w:rPr>
-          <w:rFonts w:ascii="Arial" w:hAnsi="Arial" w:eastAsia="Arial" w:cs="Arial"/>
-          <w:color w:val="000000"/>
-          <w:sz w:val="24"/>
-        </w:rPr>
-        <w:t>: quem decide a próxima ação, quais agentes participam, em que ordem interagem e qual contexto recebem.</w:t>
-      </w:r>
-    </w:p>
-    <w:p>
-      <w:pPr/>
-      <w:r>
-        <w:rPr>
-          <w:rFonts w:ascii="Arial" w:hAnsi="Arial" w:eastAsia="Arial" w:cs="Arial"/>
-          <w:color w:val="000000"/>
-          <w:sz w:val="24"/>
-        </w:rPr>
-        <w:t xml:space="preserve">Zhu </w:t>
-      </w:r>
-      <w:r>
-        <w:rPr>
-          <w:rFonts w:ascii="Arial" w:hAnsi="Arial" w:eastAsia="Arial" w:cs="Arial"/>
+        <w:t xml:space="preserve"> (2025) deslocam a análise de nomes de frameworks para mecanismos concretos de colaboração. O trabalho organiza a coordenação em quatro dimensões — governança dos agentes, controle de participação, dinâmica de interação e gestão do histórico — e as relaciona tanto à qualidade da tarefa quanto à eficiência computacional. Essa decomposição oferece critérios diretamente úteis para caracterizar orquestração, </w:t>
+      </w:r>
+      <w:r>
+        <w:rPr>
+          <w:rFonts w:ascii="Arial" w:hAnsi="Arial" w:eastAsia="Arial" w:cs="Arial"/>
+          <w:color w:val="000000"/>
+          <w:sz w:val="24"/>
           <w:i w:val="1"/>
           <w:iCs w:val="1"/>
-          <w:color w:val="000000"/>
-          <w:sz w:val="24"/>
-        </w:rPr>
-        <w:t>et al.</w:t>
-      </w:r>
-      <w:r>
-        <w:rPr>
-          <w:rFonts w:ascii="Arial" w:hAnsi="Arial" w:eastAsia="Arial" w:cs="Arial"/>
-          <w:color w:val="000000"/>
-          <w:sz w:val="24"/>
-        </w:rPr>
-        <w:t xml:space="preserve"> (2025) introduzem o MultiAgentBench, </w:t>
-      </w:r>
-      <w:r>
-        <w:rPr>
-          <w:rFonts w:ascii="Arial" w:hAnsi="Arial" w:eastAsia="Arial" w:cs="Arial"/>
-          <w:i w:val="1"/>
-          <w:color w:val="000000"/>
-          <w:sz w:val="24"/>
-          <w:iCs w:val="1"/>
-        </w:rPr>
-        <w:t>benchmark</w:t>
-      </w:r>
-      <w:r>
-        <w:rPr>
-          <w:rFonts w:ascii="Arial" w:hAnsi="Arial" w:eastAsia="Arial" w:cs="Arial"/>
-          <w:color w:val="000000"/>
-          <w:sz w:val="24"/>
-        </w:rPr>
-        <w:t xml:space="preserve"> independente que avalia colaboração e competição entre agentes em cenários interativos. O estudo compara protocolos de coordenação em estrela, cadeia, árvore e grafo e utiliza indicadores baseados em marcos intermediários, além da conclusão da tarefa. A principal aproximação com esta pesquisa está em tratar a topologia como variável experimental e em medir o processo de colaboração. O escopo, porém, abrange cenários gerais e protocolos de comunicação diferentes das três condições implementadas no MAB deste trabalho.</w:t>
-      </w:r>
-    </w:p>
-    <w:p>
-      <w:pPr/>
-      <w:r>
-        <w:rPr>
-          <w:rFonts w:ascii="Arial" w:hAnsi="Arial" w:eastAsia="Arial" w:cs="Arial"/>
-          <w:color w:val="000000"/>
-          <w:sz w:val="24"/>
-        </w:rPr>
-        <w:t xml:space="preserve">Qian </w:t>
-      </w:r>
-      <w:r>
-        <w:rPr>
-          <w:rFonts w:ascii="Arial" w:hAnsi="Arial" w:eastAsia="Arial" w:cs="Arial"/>
+        </w:rPr>
+        <w:t>workflow</w:t>
+      </w:r>
+      <w:r>
+        <w:rPr>
+          <w:rFonts w:ascii="Arial" w:hAnsi="Arial" w:eastAsia="Arial" w:cs="Arial"/>
+          <w:color w:val="000000"/>
+          <w:sz w:val="24"/>
+        </w:rPr>
+        <w:t xml:space="preserve"> e </w:t>
+      </w:r>
+      <w:r>
+        <w:rPr>
+          <w:rFonts w:ascii="Arial" w:hAnsi="Arial" w:eastAsia="Arial" w:cs="Arial"/>
+          <w:color w:val="000000"/>
+          <w:sz w:val="24"/>
           <w:i w:val="1"/>
           <w:iCs w:val="1"/>
-          <w:color w:val="000000"/>
-          <w:sz w:val="24"/>
-        </w:rPr>
-        <w:t>et al.</w:t>
-      </w:r>
-      <w:r>
-        <w:rPr>
-          <w:rFonts w:ascii="Arial" w:hAnsi="Arial" w:eastAsia="Arial" w:cs="Arial"/>
-          <w:color w:val="000000"/>
-          <w:sz w:val="24"/>
-        </w:rPr>
-        <w:t xml:space="preserve"> (2025) investigam a escalabilidade da colaboração por meio do MacNet, que organiza agentes em grafos acíclicos direcionados. Os autores variam quantidade e topologia dos agentes e mostram que a organização das conexões influencia os efeitos da ampliação do sistema. A contribuição para esta pesquisa é dupla: reforça que topologia e escala não são detalhes neutros; e evidencia que conclusões obtidas em uma configuração de rede não devem ser automaticamente transferidas para outra.</w:t>
+        </w:rPr>
+        <w:t>swarm</w:t>
+      </w:r>
+      <w:r>
+        <w:rPr>
+          <w:rFonts w:ascii="Arial" w:hAnsi="Arial" w:eastAsia="Arial" w:cs="Arial"/>
+          <w:color w:val="000000"/>
+          <w:sz w:val="24"/>
+        </w:rPr>
+        <w:t>: quem decide a próxima ação, quais agentes participam, em que ordem interagem e qual contexto recebem.</w:t>
       </w:r>
     </w:p>
     <w:p>
@@ -5679,7 +5586,7 @@
           <w:color w:val="000000"/>
           <w:sz w:val="24"/>
         </w:rPr>
-        <w:t xml:space="preserve">Zhou </w:t>
+        <w:t xml:space="preserve">Zhu </w:t>
       </w:r>
       <w:r>
         <w:rPr>
@@ -5697,6 +5604,82 @@
           <w:color w:val="000000"/>
           <w:sz w:val="24"/>
         </w:rPr>
+        <w:t xml:space="preserve"> (2025) introduzem o MultiAgentBench, </w:t>
+      </w:r>
+      <w:r>
+        <w:rPr>
+          <w:rFonts w:ascii="Arial" w:hAnsi="Arial" w:eastAsia="Arial" w:cs="Arial"/>
+          <w:i w:val="1"/>
+          <w:color w:val="000000"/>
+          <w:sz w:val="24"/>
+          <w:iCs w:val="1"/>
+        </w:rPr>
+        <w:t>benchmark</w:t>
+      </w:r>
+      <w:r>
+        <w:rPr>
+          <w:rFonts w:ascii="Arial" w:hAnsi="Arial" w:eastAsia="Arial" w:cs="Arial"/>
+          <w:color w:val="000000"/>
+          <w:sz w:val="24"/>
+        </w:rPr>
+        <w:t xml:space="preserve"> independente que avalia colaboração e competição entre agentes em cenários interativos. O estudo compara protocolos de coordenação em estrela, cadeia, árvore e grafo e utiliza indicadores baseados em marcos intermediários, além da conclusão da tarefa. A principal aproximação com esta pesquisa está em tratar a topologia como variável experimental e em medir o processo de colaboração. O escopo, porém, abrange cenários gerais e protocolos de comunicação diferentes das três condições implementadas no MAB deste trabalho.</w:t>
+      </w:r>
+    </w:p>
+    <w:p>
+      <w:pPr/>
+      <w:r>
+        <w:rPr>
+          <w:rFonts w:ascii="Arial" w:hAnsi="Arial" w:eastAsia="Arial" w:cs="Arial"/>
+          <w:color w:val="000000"/>
+          <w:sz w:val="24"/>
+        </w:rPr>
+        <w:t xml:space="preserve">Qian </w:t>
+      </w:r>
+      <w:r>
+        <w:rPr>
+          <w:rFonts w:ascii="Arial" w:hAnsi="Arial" w:eastAsia="Arial" w:cs="Arial"/>
+          <w:i w:val="1"/>
+          <w:iCs w:val="1"/>
+          <w:color w:val="000000"/>
+          <w:sz w:val="24"/>
+        </w:rPr>
+        <w:t>et al.</w:t>
+      </w:r>
+      <w:r>
+        <w:rPr>
+          <w:rFonts w:ascii="Arial" w:hAnsi="Arial" w:eastAsia="Arial" w:cs="Arial"/>
+          <w:color w:val="000000"/>
+          <w:sz w:val="24"/>
+        </w:rPr>
+        <w:t xml:space="preserve"> (2025) investigam a escalabilidade da colaboração por meio do MacNet, que organiza agentes em grafos acíclicos direcionados. Os autores variam quantidade e topologia dos agentes e mostram que a organização das conexões influencia os efeitos da ampliação do sistema. A contribuição para esta pesquisa é dupla: reforça que topologia e escala não são detalhes neutros; e evidencia que conclusões obtidas em uma configuração de rede não devem ser automaticamente transferidas para outra.</w:t>
+      </w:r>
+    </w:p>
+    <w:p>
+      <w:pPr/>
+      <w:r>
+        <w:rPr>
+          <w:rFonts w:ascii="Arial" w:hAnsi="Arial" w:eastAsia="Arial" w:cs="Arial"/>
+          <w:color w:val="000000"/>
+          <w:sz w:val="24"/>
+        </w:rPr>
+        <w:t xml:space="preserve">Zhou </w:t>
+      </w:r>
+      <w:r>
+        <w:rPr>
+          <w:rFonts w:ascii="Arial" w:hAnsi="Arial" w:eastAsia="Arial" w:cs="Arial"/>
+          <w:i w:val="1"/>
+          <w:iCs w:val="1"/>
+          <w:color w:val="000000"/>
+          <w:sz w:val="24"/>
+        </w:rPr>
+        <w:t>et al.</w:t>
+      </w:r>
+      <w:r>
+        <w:rPr>
+          <w:rFonts w:ascii="Arial" w:hAnsi="Arial" w:eastAsia="Arial" w:cs="Arial"/>
+          <w:color w:val="000000"/>
+          <w:sz w:val="24"/>
+        </w:rPr>
         <w:t xml:space="preserve"> (2026) analisam conjuntamente </w:t>
       </w:r>
       <w:r>
@@ -5733,6 +5716,118 @@
           <w:sz w:val="24"/>
         </w:rPr>
         <w:t>, mostrando que ambos os níveis participam do desempenho observado. Para o desenho do MAB, essa evidência tem consequência metodológica direta: se o objetivo é estimar o efeito da coordenação, modelo, instruções, ferramentas e critérios de avaliação precisam permanecer controlados entre as condições experimentais.</w:t>
+      </w:r>
+    </w:p>
+    <w:p>
+      <w:pPr/>
+      <w:r>
+        <w:rPr>
+          <w:rFonts w:ascii="Arial" w:hAnsi="Arial" w:eastAsia="Arial" w:cs="Arial"/>
+          <w:color w:val="000000"/>
+          <w:sz w:val="24"/>
+        </w:rPr>
+        <w:t xml:space="preserve">Uma vertente complementar trata a própria arquitetura como objeto de síntese ou adaptação. Zhuge </w:t>
+      </w:r>
+      <w:r>
+        <w:rPr>
+          <w:rFonts w:ascii="Arial" w:hAnsi="Arial" w:eastAsia="Arial" w:cs="Arial"/>
+          <w:i w:val="1"/>
+          <w:iCs w:val="1"/>
+          <w:color w:val="000000"/>
+          <w:sz w:val="24"/>
+        </w:rPr>
+        <w:t>et al.</w:t>
+      </w:r>
+      <w:r>
+        <w:rPr>
+          <w:rFonts w:ascii="Arial" w:hAnsi="Arial" w:eastAsia="Arial" w:cs="Arial"/>
+          <w:color w:val="000000"/>
+          <w:sz w:val="24"/>
+        </w:rPr>
+        <w:t xml:space="preserve"> (2024), no GPTSwarm, representam agentes e fluxos de informação como grafos computacionais, nos quais os nós realizam operações e as arestas definem o fluxo; seus otimizadores atuam tanto sobre instruções locais quanto sobre a conectividade. Liu </w:t>
+      </w:r>
+      <w:r>
+        <w:rPr>
+          <w:rFonts w:ascii="Arial" w:hAnsi="Arial" w:eastAsia="Arial" w:cs="Arial"/>
+          <w:i w:val="1"/>
+          <w:iCs w:val="1"/>
+          <w:color w:val="000000"/>
+          <w:sz w:val="24"/>
+        </w:rPr>
+        <w:t>et al.</w:t>
+      </w:r>
+      <w:r>
+        <w:rPr>
+          <w:rFonts w:ascii="Arial" w:hAnsi="Arial" w:eastAsia="Arial" w:cs="Arial"/>
+          <w:color w:val="000000"/>
+          <w:sz w:val="24"/>
+        </w:rPr>
+        <w:t xml:space="preserve"> (2024), com o DyLAN, selecionam uma equipe conforme a tarefa e fazem os agentes colaborarem em uma estrutura dinâmica. Esses trabalhos ampliam o espaço arquitetural além de topologias fixas, mas otimizam ou selecionam a configuração para a tarefa, em vez de estimar isoladamente o efeito de arquiteturas predefinidas.</w:t>
+      </w:r>
+    </w:p>
+    <w:p>
+      <w:pPr/>
+      <w:r>
+        <w:rPr>
+          <w:rFonts w:ascii="Arial" w:hAnsi="Arial" w:eastAsia="Arial" w:cs="Arial"/>
+          <w:color w:val="000000"/>
+          <w:sz w:val="24"/>
+        </w:rPr>
+        <w:t xml:space="preserve">Zhang </w:t>
+      </w:r>
+      <w:r>
+        <w:rPr>
+          <w:rFonts w:ascii="Arial" w:hAnsi="Arial" w:eastAsia="Arial" w:cs="Arial"/>
+          <w:i w:val="1"/>
+          <w:iCs w:val="1"/>
+          <w:color w:val="000000"/>
+          <w:sz w:val="24"/>
+        </w:rPr>
+        <w:t>et al.</w:t>
+      </w:r>
+      <w:r>
+        <w:rPr>
+          <w:rFonts w:ascii="Arial" w:hAnsi="Arial" w:eastAsia="Arial" w:cs="Arial"/>
+          <w:color w:val="000000"/>
+          <w:sz w:val="24"/>
+        </w:rPr>
+        <w:t xml:space="preserve"> (2025) e Z. Wang </w:t>
+      </w:r>
+      <w:r>
+        <w:rPr>
+          <w:rFonts w:ascii="Arial" w:hAnsi="Arial" w:eastAsia="Arial" w:cs="Arial"/>
+          <w:i w:val="1"/>
+          <w:iCs w:val="1"/>
+          <w:color w:val="000000"/>
+          <w:sz w:val="24"/>
+        </w:rPr>
+        <w:t>et al.</w:t>
+      </w:r>
+      <w:r>
+        <w:rPr>
+          <w:rFonts w:ascii="Arial" w:hAnsi="Arial" w:eastAsia="Arial" w:cs="Arial"/>
+          <w:color w:val="000000"/>
+          <w:sz w:val="24"/>
+        </w:rPr>
+        <w:t xml:space="preserve"> (2025) abordam a eficiência da comunicação por caminhos distintos. O AgentPrune realiza uma poda única de mensagens em um grafo espaço-temporal; o AgentDropout ajusta matrizes de adjacência ao longo das rodadas e elimina agentes e comunicações redundantes. Yue </w:t>
+      </w:r>
+      <w:r>
+        <w:rPr>
+          <w:rFonts w:ascii="Arial" w:hAnsi="Arial" w:eastAsia="Arial" w:cs="Arial"/>
+          <w:i w:val="1"/>
+          <w:iCs w:val="1"/>
+          <w:color w:val="000000"/>
+          <w:sz w:val="24"/>
+        </w:rPr>
+        <w:t>et al.</w:t>
+      </w:r>
+      <w:r>
+        <w:rPr>
+          <w:rFonts w:ascii="Arial" w:hAnsi="Arial" w:eastAsia="Arial" w:cs="Arial"/>
+          <w:color w:val="000000"/>
+          <w:sz w:val="24"/>
+        </w:rPr>
+        <w:t xml:space="preserve"> (2025), por sua vez, formulam o roteamento do sistema multiagente como uma decisão conjunta sobre modo de colaboração, papéis e modelos. A contribuição comum é mostrar que participação, conectividade e custo são variáveis de projeto. Para esta pesquisa, também delimitam uma diferença: o MAB mantém essas decisões predefinidas em cada condição para comparar arquiteturas, em vez de escolher uma configuração diferente para cada solicitação.</w:t>
       </w:r>
     </w:p>
     <w:p>
@@ -6540,34 +6635,27 @@
             <w:vAlign w:val="center"/>
           </w:tcPr>
           <w:p>
-            <w:pPr>
-              <w:spacing w:after="0" w:line="240" w:lineRule="auto"/>
-              <w:jc w:val="left"/>
-            </w:pPr>
             <w:r>
               <w:rPr>
                 <w:rFonts w:ascii="Arial" w:hAnsi="Arial" w:eastAsia="Arial" w:cs="Arial"/>
-                <w:b w:val="0"/>
                 <w:color w:val="000000"/>
                 <w:sz w:val="24"/>
               </w:rPr>
-              <w:t xml:space="preserve">Wang </w:t>
+              <w:t xml:space="preserve">H. Wang </w:t>
             </w:r>
             <w:r>
               <w:rPr>
                 <w:rFonts w:ascii="Arial" w:hAnsi="Arial" w:eastAsia="Arial" w:cs="Arial"/>
-                <w:b w:val="0"/>
+                <w:i w:val="1"/>
+                <w:iCs w:val="1"/>
                 <w:color w:val="000000"/>
                 <w:sz w:val="24"/>
-                <w:i w:val="1"/>
-                <w:iCs w:val="1"/>
               </w:rPr>
               <w:t>et al.</w:t>
             </w:r>
             <w:r>
               <w:rPr>
                 <w:rFonts w:ascii="Arial" w:hAnsi="Arial" w:eastAsia="Arial" w:cs="Arial"/>
-                <w:b w:val="0"/>
                 <w:color w:val="000000"/>
                 <w:sz w:val="24"/>
               </w:rPr>
@@ -6810,6 +6898,220 @@
         </w:tc>
       </w:tr>
       <w:tr>
+        <w:tc>
+          <w:tcPr>
+            <w:tcW w:type="dxa" w:w="2268"/>
+          </w:tcPr>
+          <w:p>
+            <w:r>
+              <w:rPr>
+                <w:rFonts w:ascii="Arial" w:hAnsi="Arial" w:eastAsia="Arial" w:cs="Arial"/>
+                <w:color w:val="000000"/>
+                <w:sz w:val="24"/>
+              </w:rPr>
+              <w:t xml:space="preserve">Zhuge </w:t>
+            </w:r>
+            <w:r>
+              <w:rPr>
+                <w:rFonts w:ascii="Arial" w:hAnsi="Arial" w:eastAsia="Arial" w:cs="Arial"/>
+                <w:i w:val="1"/>
+                <w:iCs w:val="1"/>
+                <w:color w:val="000000"/>
+                <w:sz w:val="24"/>
+              </w:rPr>
+              <w:t>et al.</w:t>
+            </w:r>
+            <w:r>
+              <w:rPr>
+                <w:rFonts w:ascii="Arial" w:hAnsi="Arial" w:eastAsia="Arial" w:cs="Arial"/>
+                <w:color w:val="000000"/>
+                <w:sz w:val="24"/>
+              </w:rPr>
+              <w:t xml:space="preserve"> (2024) e Liu </w:t>
+            </w:r>
+            <w:r>
+              <w:rPr>
+                <w:rFonts w:ascii="Arial" w:hAnsi="Arial" w:eastAsia="Arial" w:cs="Arial"/>
+                <w:i w:val="1"/>
+                <w:iCs w:val="1"/>
+                <w:color w:val="000000"/>
+                <w:sz w:val="24"/>
+              </w:rPr>
+              <w:t>et al.</w:t>
+            </w:r>
+            <w:r>
+              <w:rPr>
+                <w:rFonts w:ascii="Arial" w:hAnsi="Arial" w:eastAsia="Arial" w:cs="Arial"/>
+                <w:color w:val="000000"/>
+                <w:sz w:val="24"/>
+              </w:rPr>
+              <w:t xml:space="preserve"> (2024)</w:t>
+            </w:r>
+          </w:p>
+        </w:tc>
+        <w:tc>
+          <w:tcPr>
+            <w:tcW w:type="dxa" w:w="2268"/>
+          </w:tcPr>
+          <w:p>
+            <w:r>
+              <w:rPr>
+                <w:rFonts w:ascii="Arial" w:hAnsi="Arial" w:eastAsia="Arial" w:cs="Arial"/>
+                <w:color w:val="000000"/>
+                <w:sz w:val="24"/>
+              </w:rPr>
+              <w:t>Grafos otimizáveis, seleção de equipe e comunicação dinâmica</w:t>
+            </w:r>
+          </w:p>
+        </w:tc>
+        <w:tc>
+          <w:tcPr>
+            <w:tcW w:type="dxa" w:w="2268"/>
+          </w:tcPr>
+          <w:p>
+            <w:r>
+              <w:rPr>
+                <w:rFonts w:ascii="Arial" w:hAnsi="Arial" w:eastAsia="Arial" w:cs="Arial"/>
+                <w:color w:val="000000"/>
+                <w:sz w:val="24"/>
+              </w:rPr>
+              <w:t>Sintetizam ou adaptam a configuração à tarefa</w:t>
+            </w:r>
+          </w:p>
+        </w:tc>
+        <w:tc>
+          <w:tcPr>
+            <w:tcW w:type="dxa" w:w="2268"/>
+          </w:tcPr>
+          <w:p>
+            <w:r>
+              <w:rPr>
+                <w:rFonts w:ascii="Arial" w:hAnsi="Arial" w:eastAsia="Arial" w:cs="Arial"/>
+                <w:color w:val="000000"/>
+                <w:sz w:val="24"/>
+              </w:rPr>
+              <w:t>Delimitam arquiteturas adaptativas, distintas da comparação entre condições fixas</w:t>
+            </w:r>
+          </w:p>
+        </w:tc>
+      </w:tr>
+      <w:tr>
+        <w:tc>
+          <w:tcPr>
+            <w:tcW w:type="dxa" w:w="2268"/>
+          </w:tcPr>
+          <w:p>
+            <w:r>
+              <w:rPr>
+                <w:rFonts w:ascii="Arial" w:hAnsi="Arial" w:eastAsia="Arial" w:cs="Arial"/>
+                <w:color w:val="000000"/>
+                <w:sz w:val="24"/>
+              </w:rPr>
+              <w:t xml:space="preserve">Zhang </w:t>
+            </w:r>
+            <w:r>
+              <w:rPr>
+                <w:rFonts w:ascii="Arial" w:hAnsi="Arial" w:eastAsia="Arial" w:cs="Arial"/>
+                <w:i w:val="1"/>
+                <w:iCs w:val="1"/>
+                <w:color w:val="000000"/>
+                <w:sz w:val="24"/>
+              </w:rPr>
+              <w:t>et al.</w:t>
+            </w:r>
+            <w:r>
+              <w:rPr>
+                <w:rFonts w:ascii="Arial" w:hAnsi="Arial" w:eastAsia="Arial" w:cs="Arial"/>
+                <w:color w:val="000000"/>
+                <w:sz w:val="24"/>
+              </w:rPr>
+              <w:t xml:space="preserve"> (2025), Z. Wang </w:t>
+            </w:r>
+            <w:r>
+              <w:rPr>
+                <w:rFonts w:ascii="Arial" w:hAnsi="Arial" w:eastAsia="Arial" w:cs="Arial"/>
+                <w:i w:val="1"/>
+                <w:iCs w:val="1"/>
+                <w:color w:val="000000"/>
+                <w:sz w:val="24"/>
+              </w:rPr>
+              <w:t>et al.</w:t>
+            </w:r>
+            <w:r>
+              <w:rPr>
+                <w:rFonts w:ascii="Arial" w:hAnsi="Arial" w:eastAsia="Arial" w:cs="Arial"/>
+                <w:color w:val="000000"/>
+                <w:sz w:val="24"/>
+              </w:rPr>
+              <w:t xml:space="preserve"> (2025) e Yue </w:t>
+            </w:r>
+            <w:r>
+              <w:rPr>
+                <w:rFonts w:ascii="Arial" w:hAnsi="Arial" w:eastAsia="Arial" w:cs="Arial"/>
+                <w:i w:val="1"/>
+                <w:iCs w:val="1"/>
+                <w:color w:val="000000"/>
+                <w:sz w:val="24"/>
+              </w:rPr>
+              <w:t>et al.</w:t>
+            </w:r>
+            <w:r>
+              <w:rPr>
+                <w:rFonts w:ascii="Arial" w:hAnsi="Arial" w:eastAsia="Arial" w:cs="Arial"/>
+                <w:color w:val="000000"/>
+                <w:sz w:val="24"/>
+              </w:rPr>
+              <w:t xml:space="preserve"> (2025)</w:t>
+            </w:r>
+          </w:p>
+        </w:tc>
+        <w:tc>
+          <w:tcPr>
+            <w:tcW w:type="dxa" w:w="2268"/>
+          </w:tcPr>
+          <w:p>
+            <w:r>
+              <w:rPr>
+                <w:rFonts w:ascii="Arial" w:hAnsi="Arial" w:eastAsia="Arial" w:cs="Arial"/>
+                <w:color w:val="000000"/>
+                <w:sz w:val="24"/>
+              </w:rPr>
+              <w:t>Poda de mensagens, eliminação dinâmica e roteamento conjunto</w:t>
+            </w:r>
+          </w:p>
+        </w:tc>
+        <w:tc>
+          <w:tcPr>
+            <w:tcW w:type="dxa" w:w="2268"/>
+          </w:tcPr>
+          <w:p>
+            <w:r>
+              <w:rPr>
+                <w:rFonts w:ascii="Arial" w:hAnsi="Arial" w:eastAsia="Arial" w:cs="Arial"/>
+                <w:color w:val="000000"/>
+                <w:sz w:val="24"/>
+              </w:rPr>
+              <w:t>Relacionam participação, conectividade e escolha de modelos a custo e desempenho</w:t>
+            </w:r>
+          </w:p>
+        </w:tc>
+        <w:tc>
+          <w:tcPr>
+            <w:tcW w:type="dxa" w:w="2268"/>
+          </w:tcPr>
+          <w:p>
+            <w:r>
+              <w:rPr>
+                <w:rFonts w:ascii="Arial" w:hAnsi="Arial" w:eastAsia="Arial" w:cs="Arial"/>
+                <w:color w:val="000000"/>
+                <w:sz w:val="24"/>
+              </w:rPr>
+              <w:t>Reforçam a necessidade de observar custo de coordenação e controlar decisões arquiteturais</w:t>
+            </w:r>
+          </w:p>
+        </w:tc>
+      </w:tr>
+      <w:tr>
         <w:trPr>
           <w:cantSplit/>
         </w:trPr>
@@ -6958,7 +7260,7 @@
           <w:color w:val="000000"/>
           <w:sz w:val="24"/>
         </w:rPr>
-        <w:t xml:space="preserve"> (2026), Wang </w:t>
+        <w:t xml:space="preserve"> (2026), H. Wang </w:t>
       </w:r>
       <w:r>
         <w:rPr>
@@ -7030,7 +7332,7 @@
           <w:color w:val="000000"/>
           <w:sz w:val="24"/>
         </w:rPr>
-        <w:t xml:space="preserve"> (2026). Cada um cobre uma parte do problema: comparação de famílias arquiteturais, decomposição dos mecanismos de colaboração, avaliação de protocolos topológicos, efeito da escala e interação entre topologia e configuração dos agentes. Nenhum deles, isoladamente, oferece uma resposta universal sobre qual arquitetura é superior; ao contrário, seus desenhos reforçam que a adequação depende da tarefa e do custo de coordenação.</w:t>
+        <w:t xml:space="preserve"> (2026). GPTSwarm, DyLAN, AgentPrune, AgentDropout e MasRouter complementam esse núcleo ao tratar a arquitetura como espaço de busca ou adaptação. Em conjunto, os estudos cobrem comparação de famílias arquiteturais, decomposição dos mecanismos de colaboração, avaliação de protocolos topológicos, efeito da escala, otimização da conectividade e roteamento. Nenhum deles oferece uma resposta universal sobre qual arquitetura é superior; ao contrário, seus desenhos reforçam que a adequação depende da tarefa e do custo de coordenação.</w:t>
       </w:r>
     </w:p>
     <w:p>
@@ -7162,9 +7464,9 @@
       <w:r>
         <w:rPr>
           <w:rFonts w:ascii="Arial" w:hAnsi="Arial" w:eastAsia="Arial" w:cs="Arial"/>
+          <w:color w:val="000000"/>
+          <w:sz w:val="24"/>
           <w:i w:val="1"/>
-          <w:color w:val="000000"/>
-          <w:sz w:val="24"/>
           <w:iCs w:val="1"/>
         </w:rPr>
         <w:t>workflow</w:t>
@@ -7175,7 +7477,7 @@
           <w:color w:val="000000"/>
           <w:sz w:val="24"/>
         </w:rPr>
-        <w:t xml:space="preserve"> estruturado e coordenação descentralizada por transferências entre agentes, mantendo constante a base tecnológica e o conjunto de tarefas. Há comparações entre topologias e mecanismos próximos, mas as condições não correspondem integralmente às três estratégias implementadas no MAB.</w:t>
+        <w:t xml:space="preserve"> estruturado e coordenação descentralizada por transferências entre agentes, mantendo constante a base tecnológica e o conjunto de tarefas. Há comparações entre topologias e mecanismos próximos, além de métodos que sintetizam ou adaptam a arquitetura para cada tarefa, mas essas condições não correspondem integralmente às três estratégias fixas implementadas no MAB. A otimização automática responde a qual configuração selecionar; a comparação controlada proposta neste trabalho investiga o que muda quando a estratégia de coordenação é a variável manipulada.</w:t>
       </w:r>
     </w:p>
     <w:p>
@@ -13155,7 +13457,7 @@
           <w:color w:val="000000"/>
           <w:sz w:val="24"/>
         </w:rPr>
-        <w:t xml:space="preserve">LU, Meng </w:t>
+        <w:t xml:space="preserve">LIU, Zijun </w:t>
       </w:r>
       <w:r>
         <w:rPr>
@@ -13173,7 +13475,7 @@
           <w:color w:val="000000"/>
           <w:sz w:val="24"/>
         </w:rPr>
-        <w:t xml:space="preserve"> TriageAgent: towards better multi-agents collaborations for large language model-based clinical triage. In: </w:t>
+        <w:t xml:space="preserve"> A dynamic LLM-powered agent network for task-oriented agent collaboration. In: </w:t>
       </w:r>
       <w:r>
         <w:rPr>
@@ -13183,15 +13485,15 @@
           <w:color w:val="000000"/>
           <w:sz w:val="24"/>
         </w:rPr>
-        <w:t>Findings of the Association for Computational Linguistics: EMNLP 2024</w:t>
-      </w:r>
-      <w:r>
-        <w:rPr>
-          <w:rFonts w:ascii="Arial" w:hAnsi="Arial" w:eastAsia="Arial" w:cs="Arial"/>
-          <w:color w:val="000000"/>
-          <w:sz w:val="24"/>
-        </w:rPr>
-        <w:t>. Miami: Association for Computational Linguistics, 2024. p. 5747-5764. DOI: 10.18653/v1/2024.findings-emnlp.329. Disponível em: https://aclanthology.org/2024.findings-emnlp.329/. Acesso em: 30 ago. 2026.</w:t>
+        <w:t>FIRST CONFERENCE ON LANGUAGE MODELING</w:t>
+      </w:r>
+      <w:r>
+        <w:rPr>
+          <w:rFonts w:ascii="Arial" w:hAnsi="Arial" w:eastAsia="Arial" w:cs="Arial"/>
+          <w:color w:val="000000"/>
+          <w:sz w:val="24"/>
+        </w:rPr>
+        <w:t>, 2024. [S. l.]: COLM, 2024. Disponível em: https://openreview.net/forum?id=XII0Wp1XA9. Acesso em: 4 set. 2026.</w:t>
       </w:r>
     </w:p>
     <w:p>
@@ -13205,7 +13507,25 @@
           <w:color w:val="000000"/>
           <w:sz w:val="24"/>
         </w:rPr>
-        <w:t xml:space="preserve">MCKINSEY &amp; COMPANY. </w:t>
+        <w:t xml:space="preserve">LU, Meng </w:t>
+      </w:r>
+      <w:r>
+        <w:rPr>
+          <w:rFonts w:ascii="Arial" w:hAnsi="Arial" w:eastAsia="Arial" w:cs="Arial"/>
+          <w:i w:val="1"/>
+          <w:iCs w:val="1"/>
+          <w:color w:val="000000"/>
+          <w:sz w:val="24"/>
+        </w:rPr>
+        <w:t>et al.</w:t>
+      </w:r>
+      <w:r>
+        <w:rPr>
+          <w:rFonts w:ascii="Arial" w:hAnsi="Arial" w:eastAsia="Arial" w:cs="Arial"/>
+          <w:color w:val="000000"/>
+          <w:sz w:val="24"/>
+        </w:rPr>
+        <w:t xml:space="preserve"> TriageAgent: towards better multi-agents collaborations for large language model-based clinical triage. In: </w:t>
       </w:r>
       <w:r>
         <w:rPr>
@@ -13215,15 +13535,15 @@
           <w:color w:val="000000"/>
           <w:sz w:val="24"/>
         </w:rPr>
-        <w:t>The state of AI in early 2024: gen AI adoption spikes and starts to generate value</w:t>
-      </w:r>
-      <w:r>
-        <w:rPr>
-          <w:rFonts w:ascii="Arial" w:hAnsi="Arial" w:eastAsia="Arial" w:cs="Arial"/>
-          <w:color w:val="000000"/>
-          <w:sz w:val="24"/>
-        </w:rPr>
-        <w:t>. [S. l.], 2024. Disponível em: https://www.mckinsey.com/capabilities/quantumblack/our-insights/the-state-of-ai-2024. Acesso em: 30 mar. 2026.</w:t>
+        <w:t>Findings of the Association for Computational Linguistics: EMNLP 2024</w:t>
+      </w:r>
+      <w:r>
+        <w:rPr>
+          <w:rFonts w:ascii="Arial" w:hAnsi="Arial" w:eastAsia="Arial" w:cs="Arial"/>
+          <w:color w:val="000000"/>
+          <w:sz w:val="24"/>
+        </w:rPr>
+        <w:t>. Miami: Association for Computational Linguistics, 2024. p. 5747-5764. DOI: 10.18653/v1/2024.findings-emnlp.329. Disponível em: https://aclanthology.org/2024.findings-emnlp.329/. Acesso em: 30 ago. 2026.</w:t>
       </w:r>
     </w:p>
     <w:p>
@@ -13237,6 +13557,38 @@
           <w:color w:val="000000"/>
           <w:sz w:val="24"/>
         </w:rPr>
+        <w:t xml:space="preserve">MCKINSEY &amp; COMPANY. </w:t>
+      </w:r>
+      <w:r>
+        <w:rPr>
+          <w:rFonts w:ascii="Arial" w:hAnsi="Arial" w:eastAsia="Arial" w:cs="Arial"/>
+          <w:b w:val="1"/>
+          <w:bCs w:val="1"/>
+          <w:color w:val="000000"/>
+          <w:sz w:val="24"/>
+        </w:rPr>
+        <w:t>The state of AI in early 2024: gen AI adoption spikes and starts to generate value</w:t>
+      </w:r>
+      <w:r>
+        <w:rPr>
+          <w:rFonts w:ascii="Arial" w:hAnsi="Arial" w:eastAsia="Arial" w:cs="Arial"/>
+          <w:color w:val="000000"/>
+          <w:sz w:val="24"/>
+        </w:rPr>
+        <w:t>. [S. l.], 2024. Disponível em: https://www.mckinsey.com/capabilities/quantumblack/our-insights/the-state-of-ai-2024. Acesso em: 30 mar. 2026.</w:t>
+      </w:r>
+    </w:p>
+    <w:p>
+      <w:pPr>
+        <w:pStyle w:val="ReferenceEntry"/>
+        <w:pageBreakBefore w:val="0"/>
+      </w:pPr>
+      <w:r>
+        <w:rPr>
+          <w:rFonts w:ascii="Arial" w:hAnsi="Arial" w:eastAsia="Arial" w:cs="Arial"/>
+          <w:color w:val="000000"/>
+          <w:sz w:val="24"/>
+        </w:rPr>
         <w:t xml:space="preserve">PAIS, Cristobal </w:t>
       </w:r>
       <w:r>
@@ -13583,7 +13935,25 @@
           <w:color w:val="000000"/>
           <w:sz w:val="24"/>
         </w:rPr>
-        <w:t xml:space="preserve">WHO EUROPE. </w:t>
+        <w:t xml:space="preserve">WANG, Zhexuan </w:t>
+      </w:r>
+      <w:r>
+        <w:rPr>
+          <w:rFonts w:ascii="Arial" w:hAnsi="Arial" w:eastAsia="Arial" w:cs="Arial"/>
+          <w:i w:val="1"/>
+          <w:iCs w:val="1"/>
+          <w:color w:val="000000"/>
+          <w:sz w:val="24"/>
+        </w:rPr>
+        <w:t>et al.</w:t>
+      </w:r>
+      <w:r>
+        <w:rPr>
+          <w:rFonts w:ascii="Arial" w:hAnsi="Arial" w:eastAsia="Arial" w:cs="Arial"/>
+          <w:color w:val="000000"/>
+          <w:sz w:val="24"/>
+        </w:rPr>
+        <w:t xml:space="preserve"> AgentDropout: dynamic agent elimination for token-efficient and high-performance LLM-based multi-agent collaboration. In: </w:t>
       </w:r>
       <w:r>
         <w:rPr>
@@ -13593,15 +13963,15 @@
           <w:color w:val="000000"/>
           <w:sz w:val="24"/>
         </w:rPr>
-        <w:t>Advancing the role of pharmacists to meet changing patient and health system needs</w:t>
-      </w:r>
-      <w:r>
-        <w:rPr>
-          <w:rFonts w:ascii="Arial" w:hAnsi="Arial" w:eastAsia="Arial" w:cs="Arial"/>
-          <w:color w:val="000000"/>
-          <w:sz w:val="24"/>
-        </w:rPr>
-        <w:t>. Copenhagen: World Health Organization Regional Office for Europe, 2024. Disponível em: https://www.who.int/belgium/feature-stories/item/advancing-the-role-of-pharmacists-to-meet-changing-patient-and-health-system-needs. Acesso em: 16 ago. 2026.</w:t>
+        <w:t>Proceedings of the 63rd Annual Meeting of the Association for Computational Linguistics (Volume 1: Long Papers)</w:t>
+      </w:r>
+      <w:r>
+        <w:rPr>
+          <w:rFonts w:ascii="Arial" w:hAnsi="Arial" w:eastAsia="Arial" w:cs="Arial"/>
+          <w:color w:val="000000"/>
+          <w:sz w:val="24"/>
+        </w:rPr>
+        <w:t>. Vienna: Association for Computational Linguistics, 2025. p. 24013-24035. DOI: 10.18653/v1/2025.acl-long.1170. Disponível em: https://aclanthology.org/2025.acl-long.1170/. Acesso em: 4 set. 2026.</w:t>
       </w:r>
     </w:p>
     <w:p>
@@ -13615,6 +13985,38 @@
           <w:color w:val="000000"/>
           <w:sz w:val="24"/>
         </w:rPr>
+        <w:t xml:space="preserve">WHO EUROPE. </w:t>
+      </w:r>
+      <w:r>
+        <w:rPr>
+          <w:rFonts w:ascii="Arial" w:hAnsi="Arial" w:eastAsia="Arial" w:cs="Arial"/>
+          <w:b w:val="1"/>
+          <w:bCs w:val="1"/>
+          <w:color w:val="000000"/>
+          <w:sz w:val="24"/>
+        </w:rPr>
+        <w:t>Advancing the role of pharmacists to meet changing patient and health system needs</w:t>
+      </w:r>
+      <w:r>
+        <w:rPr>
+          <w:rFonts w:ascii="Arial" w:hAnsi="Arial" w:eastAsia="Arial" w:cs="Arial"/>
+          <w:color w:val="000000"/>
+          <w:sz w:val="24"/>
+        </w:rPr>
+        <w:t>. Copenhagen: World Health Organization Regional Office for Europe, 2024. Disponível em: https://www.who.int/belgium/feature-stories/item/advancing-the-role-of-pharmacists-to-meet-changing-patient-and-health-system-needs. Acesso em: 16 ago. 2026.</w:t>
+      </w:r>
+    </w:p>
+    <w:p>
+      <w:pPr>
+        <w:pStyle w:val="ReferenceEntry"/>
+        <w:pageBreakBefore w:val="0"/>
+      </w:pPr>
+      <w:r>
+        <w:rPr>
+          <w:rFonts w:ascii="Arial" w:hAnsi="Arial" w:eastAsia="Arial" w:cs="Arial"/>
+          <w:color w:val="000000"/>
+          <w:sz w:val="24"/>
+        </w:rPr>
         <w:t xml:space="preserve">YU, Chaojia </w:t>
       </w:r>
       <w:r>
@@ -13665,7 +14067,25 @@
           <w:color w:val="000000"/>
           <w:sz w:val="24"/>
         </w:rPr>
-        <w:t xml:space="preserve">ZENDESK. </w:t>
+        <w:t xml:space="preserve">YUE, Yanwei </w:t>
+      </w:r>
+      <w:r>
+        <w:rPr>
+          <w:rFonts w:ascii="Arial" w:hAnsi="Arial" w:eastAsia="Arial" w:cs="Arial"/>
+          <w:i w:val="1"/>
+          <w:iCs w:val="1"/>
+          <w:color w:val="000000"/>
+          <w:sz w:val="24"/>
+        </w:rPr>
+        <w:t>et al.</w:t>
+      </w:r>
+      <w:r>
+        <w:rPr>
+          <w:rFonts w:ascii="Arial" w:hAnsi="Arial" w:eastAsia="Arial" w:cs="Arial"/>
+          <w:color w:val="000000"/>
+          <w:sz w:val="24"/>
+        </w:rPr>
+        <w:t xml:space="preserve"> MasRouter: learning to route LLMs for multi-agent systems. In: </w:t>
       </w:r>
       <w:r>
         <w:rPr>
@@ -13675,15 +14095,15 @@
           <w:color w:val="000000"/>
           <w:sz w:val="24"/>
         </w:rPr>
-        <w:t>About AI agents</w:t>
-      </w:r>
-      <w:r>
-        <w:rPr>
-          <w:rFonts w:ascii="Arial" w:hAnsi="Arial" w:eastAsia="Arial" w:cs="Arial"/>
-          <w:color w:val="000000"/>
-          <w:sz w:val="24"/>
-        </w:rPr>
-        <w:t>. Disponível em: https://support.zendesk.com/hc/en-us/articles/6970583409690-About-AI-agents. Acesso em: 11 maio 2026.</w:t>
+        <w:t>Proceedings of the 63rd Annual Meeting of the Association for Computational Linguistics (Volume 1: Long Papers)</w:t>
+      </w:r>
+      <w:r>
+        <w:rPr>
+          <w:rFonts w:ascii="Arial" w:hAnsi="Arial" w:eastAsia="Arial" w:cs="Arial"/>
+          <w:color w:val="000000"/>
+          <w:sz w:val="24"/>
+        </w:rPr>
+        <w:t>. Vienna: Association for Computational Linguistics, 2025. p. 15549-15572. DOI: 10.18653/v1/2025.acl-long.757. Disponível em: https://aclanthology.org/2025.acl-long.757/. Acesso em: 4 set. 2026.</w:t>
       </w:r>
     </w:p>
     <w:p>
@@ -13697,7 +14117,39 @@
           <w:color w:val="000000"/>
           <w:sz w:val="24"/>
         </w:rPr>
-        <w:t xml:space="preserve">ZHOU, Han </w:t>
+        <w:t xml:space="preserve">ZENDESK. </w:t>
+      </w:r>
+      <w:r>
+        <w:rPr>
+          <w:rFonts w:ascii="Arial" w:hAnsi="Arial" w:eastAsia="Arial" w:cs="Arial"/>
+          <w:b w:val="1"/>
+          <w:bCs w:val="1"/>
+          <w:color w:val="000000"/>
+          <w:sz w:val="24"/>
+        </w:rPr>
+        <w:t>About AI agents</w:t>
+      </w:r>
+      <w:r>
+        <w:rPr>
+          <w:rFonts w:ascii="Arial" w:hAnsi="Arial" w:eastAsia="Arial" w:cs="Arial"/>
+          <w:color w:val="000000"/>
+          <w:sz w:val="24"/>
+        </w:rPr>
+        <w:t>. Disponível em: https://support.zendesk.com/hc/en-us/articles/6970583409690-About-AI-agents. Acesso em: 11 maio 2026.</w:t>
+      </w:r>
+    </w:p>
+    <w:p>
+      <w:pPr>
+        <w:pStyle w:val="ReferenceEntry"/>
+        <w:pageBreakBefore w:val="0"/>
+      </w:pPr>
+      <w:r>
+        <w:rPr>
+          <w:rFonts w:ascii="Arial" w:hAnsi="Arial" w:eastAsia="Arial" w:cs="Arial"/>
+          <w:color w:val="000000"/>
+          <w:sz w:val="24"/>
+        </w:rPr>
+        <w:t xml:space="preserve">ZHANG, Guibin </w:t>
       </w:r>
       <w:r>
         <w:rPr>
@@ -13715,7 +14167,7 @@
           <w:color w:val="000000"/>
           <w:sz w:val="24"/>
         </w:rPr>
-        <w:t xml:space="preserve"> Multi-agent design: optimizing agents with better prompts and topologies. In: INTERNATIONAL CONFERENCE ON LEARNING REPRESENTATIONS, 2026. </w:t>
+        <w:t xml:space="preserve"> Cut the crap: an economical communication pipeline for LLM-based multi-agent systems. In: INTERNATIONAL CONFERENCE ON LEARNING REPRESENTATIONS, 2025. </w:t>
       </w:r>
       <w:r>
         <w:rPr>
@@ -13725,15 +14177,15 @@
           <w:color w:val="000000"/>
           <w:sz w:val="24"/>
         </w:rPr>
-        <w:t>International Conference on Learning Representations 2026</w:t>
-      </w:r>
-      <w:r>
-        <w:rPr>
-          <w:rFonts w:ascii="Arial" w:hAnsi="Arial" w:eastAsia="Arial" w:cs="Arial"/>
-          <w:color w:val="000000"/>
-          <w:sz w:val="24"/>
-        </w:rPr>
-        <w:t>. [S. l.]: ICLR, 2026. Disponível em: https://proceedings.iclr.cc/paper_files/paper/2026/hash/1ab4e0e8f35078109bc78d7b465d306f-Abstract-Conference.html. Acesso em: 31 ago. 2026.</w:t>
+        <w:t>International Conference on Learning Representations 2025</w:t>
+      </w:r>
+      <w:r>
+        <w:rPr>
+          <w:rFonts w:ascii="Arial" w:hAnsi="Arial" w:eastAsia="Arial" w:cs="Arial"/>
+          <w:color w:val="000000"/>
+          <w:sz w:val="24"/>
+        </w:rPr>
+        <w:t>. [S. l.]: ICLR, 2025. Disponível em: https://proceedings.iclr.cc/paper_files/paper/2025/hash/bbc461518c59a2a8d64e70e2c38c4a0e-Abstract-Conference.html. Acesso em: 4 set. 2026.</w:t>
       </w:r>
     </w:p>
     <w:p>
@@ -13747,7 +14199,7 @@
           <w:color w:val="000000"/>
           <w:sz w:val="24"/>
         </w:rPr>
-        <w:t xml:space="preserve">ZHU, Kunlun </w:t>
+        <w:t xml:space="preserve">ZHOU, Han </w:t>
       </w:r>
       <w:r>
         <w:rPr>
@@ -13765,7 +14217,7 @@
           <w:color w:val="000000"/>
           <w:sz w:val="24"/>
         </w:rPr>
-        <w:t xml:space="preserve"> MultiAgentBench: evaluating the collaboration and competition of LLM agents. In: </w:t>
+        <w:t xml:space="preserve"> Multi-agent design: optimizing agents with better prompts and topologies. In: INTERNATIONAL CONFERENCE ON LEARNING REPRESENTATIONS, 2026. </w:t>
       </w:r>
       <w:r>
         <w:rPr>
@@ -13775,6 +14227,56 @@
           <w:color w:val="000000"/>
           <w:sz w:val="24"/>
         </w:rPr>
+        <w:t>International Conference on Learning Representations 2026</w:t>
+      </w:r>
+      <w:r>
+        <w:rPr>
+          <w:rFonts w:ascii="Arial" w:hAnsi="Arial" w:eastAsia="Arial" w:cs="Arial"/>
+          <w:color w:val="000000"/>
+          <w:sz w:val="24"/>
+        </w:rPr>
+        <w:t>. [S. l.]: ICLR, 2026. Disponível em: https://proceedings.iclr.cc/paper_files/paper/2026/hash/1ab4e0e8f35078109bc78d7b465d306f-Abstract-Conference.html. Acesso em: 31 ago. 2026.</w:t>
+      </w:r>
+    </w:p>
+    <w:p>
+      <w:pPr>
+        <w:pStyle w:val="ReferenceEntry"/>
+        <w:pageBreakBefore w:val="0"/>
+      </w:pPr>
+      <w:r>
+        <w:rPr>
+          <w:rFonts w:ascii="Arial" w:hAnsi="Arial" w:eastAsia="Arial" w:cs="Arial"/>
+          <w:color w:val="000000"/>
+          <w:sz w:val="24"/>
+        </w:rPr>
+        <w:t xml:space="preserve">ZHU, Kunlun </w:t>
+      </w:r>
+      <w:r>
+        <w:rPr>
+          <w:rFonts w:ascii="Arial" w:hAnsi="Arial" w:eastAsia="Arial" w:cs="Arial"/>
+          <w:i w:val="1"/>
+          <w:iCs w:val="1"/>
+          <w:color w:val="000000"/>
+          <w:sz w:val="24"/>
+        </w:rPr>
+        <w:t>et al.</w:t>
+      </w:r>
+      <w:r>
+        <w:rPr>
+          <w:rFonts w:ascii="Arial" w:hAnsi="Arial" w:eastAsia="Arial" w:cs="Arial"/>
+          <w:color w:val="000000"/>
+          <w:sz w:val="24"/>
+        </w:rPr>
+        <w:t xml:space="preserve"> MultiAgentBench: evaluating the collaboration and competition of LLM agents. In: </w:t>
+      </w:r>
+      <w:r>
+        <w:rPr>
+          <w:rFonts w:ascii="Arial" w:hAnsi="Arial" w:eastAsia="Arial" w:cs="Arial"/>
+          <w:b w:val="1"/>
+          <w:bCs w:val="1"/>
+          <w:color w:val="000000"/>
+          <w:sz w:val="24"/>
+        </w:rPr>
         <w:t>Proceedings of the 63rd Annual Meeting of the Association for Computational Linguistics (Volume 1: Long Papers)</w:t>
       </w:r>
       <w:r>
@@ -13784,6 +14286,56 @@
           <w:sz w:val="24"/>
         </w:rPr>
         <w:t>. Vienna: Association for Computational Linguistics, 2025. p. 8580-8622. DOI: 10.18653/v1/2025.acl-long.421. Disponível em: https://aclanthology.org/2025.acl-long.421/. Acesso em: 31 ago. 2026.</w:t>
+      </w:r>
+    </w:p>
+    <w:p>
+      <w:pPr>
+        <w:pStyle w:val="ReferenceEntry"/>
+        <w:pageBreakBefore w:val="0"/>
+      </w:pPr>
+      <w:r>
+        <w:rPr>
+          <w:rFonts w:ascii="Arial" w:hAnsi="Arial" w:eastAsia="Arial" w:cs="Arial"/>
+          <w:color w:val="000000"/>
+          <w:sz w:val="24"/>
+        </w:rPr>
+        <w:t xml:space="preserve">ZHUGE, Mingchen </w:t>
+      </w:r>
+      <w:r>
+        <w:rPr>
+          <w:rFonts w:ascii="Arial" w:hAnsi="Arial" w:eastAsia="Arial" w:cs="Arial"/>
+          <w:i w:val="1"/>
+          <w:iCs w:val="1"/>
+          <w:color w:val="000000"/>
+          <w:sz w:val="24"/>
+        </w:rPr>
+        <w:t>et al.</w:t>
+      </w:r>
+      <w:r>
+        <w:rPr>
+          <w:rFonts w:ascii="Arial" w:hAnsi="Arial" w:eastAsia="Arial" w:cs="Arial"/>
+          <w:color w:val="000000"/>
+          <w:sz w:val="24"/>
+        </w:rPr>
+        <w:t xml:space="preserve"> GPTSwarm: language agents as optimizable graphs. In: </w:t>
+      </w:r>
+      <w:r>
+        <w:rPr>
+          <w:rFonts w:ascii="Arial" w:hAnsi="Arial" w:eastAsia="Arial" w:cs="Arial"/>
+          <w:b w:val="1"/>
+          <w:bCs w:val="1"/>
+          <w:color w:val="000000"/>
+          <w:sz w:val="24"/>
+        </w:rPr>
+        <w:t>INTERNATIONAL CONFERENCE ON MACHINE LEARNING, 41.</w:t>
+      </w:r>
+      <w:r>
+        <w:rPr>
+          <w:rFonts w:ascii="Arial" w:hAnsi="Arial" w:eastAsia="Arial" w:cs="Arial"/>
+          <w:color w:val="000000"/>
+          <w:sz w:val="24"/>
+        </w:rPr>
+        <w:t>, 2024. Proceedings [...]. [S. l.]: PMLR, 2024. v. 235, p. 62743-62767. Disponível em: https://proceedings.mlr.press/v235/zhuge24a.html. Acesso em: 4 set. 2026.</w:t>
       </w:r>
     </w:p>
     <w:sectPr>

</xml_diff>

<commit_message>
docs(tcc): fix list bullets and figure caption placement
</commit_message>
<xml_diff>
--- a/TCC/TCC_MAB_Facens_Ralph_10x.docx
+++ b/TCC/TCC_MAB_Facens_Ralph_10x.docx
@@ -4146,6 +4146,96 @@
         </w:rPr>
         <w:t>A figura a seguir representa uma forma simplificada desse ciclo. A aplicação executa a chamada de ferramenta solicitada pelo modelo, incorpora o retorno ao contexto e pode realizar uma nova consulta ao LLM. O ciclo termina quando há uma resposta ou quando uma condição de encerramento é atingida. Limites de tempo e de chamadas são controles da aplicação, não garantias fornecidas pela linguagem do modelo.</w:t>
       </w:r>
+    </w:p>
+    <w:p>
+      <w:bookmarkStart w:id="5000" w:name="_TCC_F_IMG_C020"/>
+      <w:pPr>
+        <w:pStyle w:val="FigureCaption"/>
+        <w:keepNext/>
+        <w:ind w:firstLine="0"/>
+        <w:jc w:val="center"/>
+      </w:pPr>
+      <w:r>
+        <w:rPr>
+          <w:rFonts w:ascii="Arial" w:hAnsi="Arial" w:eastAsia="Arial" w:cs="Arial"/>
+          <w:b w:val="0"/>
+          <w:caps w:val="0"/>
+          <w:color w:val="000000"/>
+          <w:sz w:val="20"/>
+        </w:rPr>
+        <w:t xml:space="preserve">Figura </w:t>
+      </w:r>
+      <w:r>
+        <w:rPr>
+          <w:rFonts w:ascii="Arial" w:hAnsi="Arial" w:eastAsia="Arial" w:cs="Arial"/>
+          <w:b w:val="0"/>
+          <w:caps w:val="0"/>
+          <w:color w:val="000000"/>
+          <w:sz w:val="20"/>
+        </w:rPr>
+        <w:fldChar w:fldCharType="begin"/>
+      </w:r>
+      <w:r>
+        <w:rPr>
+          <w:rFonts w:ascii="Arial" w:hAnsi="Arial" w:eastAsia="Arial" w:cs="Arial"/>
+          <w:b w:val="0"/>
+          <w:caps w:val="0"/>
+          <w:color w:val="000000"/>
+          <w:sz w:val="20"/>
+        </w:rPr>
+        <w:instrText xml:space="preserve"> SEQ Figura \* ARABIC </w:instrText>
+      </w:r>
+      <w:r>
+        <w:rPr>
+          <w:rFonts w:ascii="Arial" w:hAnsi="Arial" w:eastAsia="Arial" w:cs="Arial"/>
+          <w:b w:val="0"/>
+          <w:caps w:val="0"/>
+          <w:color w:val="000000"/>
+          <w:sz w:val="20"/>
+        </w:rPr>
+        <w:fldChar w:fldCharType="separate"/>
+      </w:r>
+      <w:r>
+        <w:rPr>
+          <w:rFonts w:ascii="Arial" w:hAnsi="Arial" w:eastAsia="Arial" w:cs="Arial"/>
+          <w:b w:val="0"/>
+          <w:caps w:val="0"/>
+          <w:color w:val="000000"/>
+          <w:sz w:val="20"/>
+        </w:rPr>
+        <w:t>1</w:t>
+      </w:r>
+      <w:r>
+        <w:rPr>
+          <w:rFonts w:ascii="Arial" w:hAnsi="Arial" w:eastAsia="Arial" w:cs="Arial"/>
+          <w:b w:val="0"/>
+          <w:caps w:val="0"/>
+          <w:color w:val="000000"/>
+          <w:sz w:val="20"/>
+        </w:rPr>
+        <w:fldChar w:fldCharType="end"/>
+      </w:r>
+      <w:r>
+        <w:rPr>
+          <w:rFonts w:ascii="Arial" w:hAnsi="Arial" w:eastAsia="Arial" w:cs="Arial"/>
+          <w:b w:val="0"/>
+          <w:caps w:val="0"/>
+          <w:color w:val="000000"/>
+          <w:sz w:val="20"/>
+        </w:rPr>
+        <w:t xml:space="preserve"> – </w:t>
+      </w:r>
+      <w:r>
+        <w:rPr>
+          <w:rFonts w:ascii="Arial" w:hAnsi="Arial" w:eastAsia="Arial" w:cs="Arial"/>
+          <w:b w:val="0"/>
+          <w:caps w:val="0"/>
+          <w:color w:val="000000"/>
+          <w:sz w:val="20"/>
+        </w:rPr>
+        <w:t>Ciclo de execução de um agente com ferramentas.</w:t>
+      </w:r>
+      <w:bookmarkEnd w:id="5000"/>
     </w:p>
     <w:p>
       <w:pPr>
@@ -4201,96 +4291,6 @@
       </w:r>
     </w:p>
     <w:p>
-      <w:bookmarkStart w:id="5000" w:name="_TCC_F_IMG_C020"/>
-      <w:pPr>
-        <w:pStyle w:val="FigureCaption"/>
-        <w:keepNext/>
-        <w:ind w:firstLine="0"/>
-        <w:jc w:val="center"/>
-      </w:pPr>
-      <w:r>
-        <w:rPr>
-          <w:rFonts w:ascii="Arial" w:hAnsi="Arial" w:eastAsia="Arial" w:cs="Arial"/>
-          <w:b w:val="0"/>
-          <w:caps w:val="0"/>
-          <w:color w:val="000000"/>
-          <w:sz w:val="20"/>
-        </w:rPr>
-        <w:t xml:space="preserve">Figura </w:t>
-      </w:r>
-      <w:r>
-        <w:rPr>
-          <w:rFonts w:ascii="Arial" w:hAnsi="Arial" w:eastAsia="Arial" w:cs="Arial"/>
-          <w:b w:val="0"/>
-          <w:caps w:val="0"/>
-          <w:color w:val="000000"/>
-          <w:sz w:val="20"/>
-        </w:rPr>
-        <w:fldChar w:fldCharType="begin"/>
-      </w:r>
-      <w:r>
-        <w:rPr>
-          <w:rFonts w:ascii="Arial" w:hAnsi="Arial" w:eastAsia="Arial" w:cs="Arial"/>
-          <w:b w:val="0"/>
-          <w:caps w:val="0"/>
-          <w:color w:val="000000"/>
-          <w:sz w:val="20"/>
-        </w:rPr>
-        <w:instrText xml:space="preserve"> SEQ Figura \* ARABIC </w:instrText>
-      </w:r>
-      <w:r>
-        <w:rPr>
-          <w:rFonts w:ascii="Arial" w:hAnsi="Arial" w:eastAsia="Arial" w:cs="Arial"/>
-          <w:b w:val="0"/>
-          <w:caps w:val="0"/>
-          <w:color w:val="000000"/>
-          <w:sz w:val="20"/>
-        </w:rPr>
-        <w:fldChar w:fldCharType="separate"/>
-      </w:r>
-      <w:r>
-        <w:rPr>
-          <w:rFonts w:ascii="Arial" w:hAnsi="Arial" w:eastAsia="Arial" w:cs="Arial"/>
-          <w:b w:val="0"/>
-          <w:caps w:val="0"/>
-          <w:color w:val="000000"/>
-          <w:sz w:val="20"/>
-        </w:rPr>
-        <w:t>1</w:t>
-      </w:r>
-      <w:r>
-        <w:rPr>
-          <w:rFonts w:ascii="Arial" w:hAnsi="Arial" w:eastAsia="Arial" w:cs="Arial"/>
-          <w:b w:val="0"/>
-          <w:caps w:val="0"/>
-          <w:color w:val="000000"/>
-          <w:sz w:val="20"/>
-        </w:rPr>
-        <w:fldChar w:fldCharType="end"/>
-      </w:r>
-      <w:r>
-        <w:rPr>
-          <w:rFonts w:ascii="Arial" w:hAnsi="Arial" w:eastAsia="Arial" w:cs="Arial"/>
-          <w:b w:val="0"/>
-          <w:caps w:val="0"/>
-          <w:color w:val="000000"/>
-          <w:sz w:val="20"/>
-        </w:rPr>
-        <w:t xml:space="preserve"> – </w:t>
-      </w:r>
-      <w:r>
-        <w:rPr>
-          <w:rFonts w:ascii="Arial" w:hAnsi="Arial" w:eastAsia="Arial" w:cs="Arial"/>
-          <w:b w:val="0"/>
-          <w:caps w:val="0"/>
-          <w:color w:val="000000"/>
-          <w:sz w:val="20"/>
-        </w:rPr>
-        <w:t>Ciclo de execução de um agente com ferramentas.</w:t>
-      </w:r>
-      <w:bookmarkEnd w:id="5000"/>
-    </w:p>
-    <w:p>
       <w:pPr>
         <w:pStyle w:val="FigureSource"/>
         <w:ind w:firstLine="0"/>
@@ -4565,6 +4565,96 @@
         </w:rPr>
         <w:t xml:space="preserve"> (2025) incluem essas formas em sua avaliação de protocolos multiagentes. A figura seguinte apresenta apenas exemplos conceituais das conexões.</w:t>
       </w:r>
+    </w:p>
+    <w:p>
+      <w:bookmarkStart w:id="5001" w:name="_TCC_F_IMG_C022"/>
+      <w:pPr>
+        <w:pStyle w:val="FigureCaption"/>
+        <w:keepNext/>
+        <w:ind w:firstLine="0"/>
+        <w:jc w:val="center"/>
+      </w:pPr>
+      <w:r>
+        <w:rPr>
+          <w:rFonts w:ascii="Arial" w:hAnsi="Arial" w:eastAsia="Arial" w:cs="Arial"/>
+          <w:b w:val="0"/>
+          <w:caps w:val="0"/>
+          <w:color w:val="000000"/>
+          <w:sz w:val="20"/>
+        </w:rPr>
+        <w:t xml:space="preserve">Figura </w:t>
+      </w:r>
+      <w:r>
+        <w:rPr>
+          <w:rFonts w:ascii="Arial" w:hAnsi="Arial" w:eastAsia="Arial" w:cs="Arial"/>
+          <w:b w:val="0"/>
+          <w:caps w:val="0"/>
+          <w:color w:val="000000"/>
+          <w:sz w:val="20"/>
+        </w:rPr>
+        <w:fldChar w:fldCharType="begin"/>
+      </w:r>
+      <w:r>
+        <w:rPr>
+          <w:rFonts w:ascii="Arial" w:hAnsi="Arial" w:eastAsia="Arial" w:cs="Arial"/>
+          <w:b w:val="0"/>
+          <w:caps w:val="0"/>
+          <w:color w:val="000000"/>
+          <w:sz w:val="20"/>
+        </w:rPr>
+        <w:instrText xml:space="preserve"> SEQ Figura \* ARABIC </w:instrText>
+      </w:r>
+      <w:r>
+        <w:rPr>
+          <w:rFonts w:ascii="Arial" w:hAnsi="Arial" w:eastAsia="Arial" w:cs="Arial"/>
+          <w:b w:val="0"/>
+          <w:caps w:val="0"/>
+          <w:color w:val="000000"/>
+          <w:sz w:val="20"/>
+        </w:rPr>
+        <w:fldChar w:fldCharType="separate"/>
+      </w:r>
+      <w:r>
+        <w:rPr>
+          <w:rFonts w:ascii="Arial" w:hAnsi="Arial" w:eastAsia="Arial" w:cs="Arial"/>
+          <w:b w:val="0"/>
+          <w:caps w:val="0"/>
+          <w:color w:val="000000"/>
+          <w:sz w:val="20"/>
+        </w:rPr>
+        <w:t>2</w:t>
+      </w:r>
+      <w:r>
+        <w:rPr>
+          <w:rFonts w:ascii="Arial" w:hAnsi="Arial" w:eastAsia="Arial" w:cs="Arial"/>
+          <w:b w:val="0"/>
+          <w:caps w:val="0"/>
+          <w:color w:val="000000"/>
+          <w:sz w:val="20"/>
+        </w:rPr>
+        <w:fldChar w:fldCharType="end"/>
+      </w:r>
+      <w:r>
+        <w:rPr>
+          <w:rFonts w:ascii="Arial" w:hAnsi="Arial" w:eastAsia="Arial" w:cs="Arial"/>
+          <w:b w:val="0"/>
+          <w:caps w:val="0"/>
+          <w:color w:val="000000"/>
+          <w:sz w:val="20"/>
+        </w:rPr>
+        <w:t xml:space="preserve"> – </w:t>
+      </w:r>
+      <w:r>
+        <w:rPr>
+          <w:rFonts w:ascii="Arial" w:hAnsi="Arial" w:eastAsia="Arial" w:cs="Arial"/>
+          <w:b w:val="0"/>
+          <w:caps w:val="0"/>
+          <w:color w:val="000000"/>
+          <w:sz w:val="20"/>
+        </w:rPr>
+        <w:t>Exemplos de topologias de comunicação entre agentes.</w:t>
+      </w:r>
+      <w:bookmarkEnd w:id="5001"/>
     </w:p>
     <w:p>
       <w:pPr>
@@ -4620,96 +4710,6 @@
       </w:r>
     </w:p>
     <w:p>
-      <w:bookmarkStart w:id="5001" w:name="_TCC_F_IMG_C022"/>
-      <w:pPr>
-        <w:pStyle w:val="FigureCaption"/>
-        <w:keepNext/>
-        <w:ind w:firstLine="0"/>
-        <w:jc w:val="center"/>
-      </w:pPr>
-      <w:r>
-        <w:rPr>
-          <w:rFonts w:ascii="Arial" w:hAnsi="Arial" w:eastAsia="Arial" w:cs="Arial"/>
-          <w:b w:val="0"/>
-          <w:caps w:val="0"/>
-          <w:color w:val="000000"/>
-          <w:sz w:val="20"/>
-        </w:rPr>
-        <w:t xml:space="preserve">Figura </w:t>
-      </w:r>
-      <w:r>
-        <w:rPr>
-          <w:rFonts w:ascii="Arial" w:hAnsi="Arial" w:eastAsia="Arial" w:cs="Arial"/>
-          <w:b w:val="0"/>
-          <w:caps w:val="0"/>
-          <w:color w:val="000000"/>
-          <w:sz w:val="20"/>
-        </w:rPr>
-        <w:fldChar w:fldCharType="begin"/>
-      </w:r>
-      <w:r>
-        <w:rPr>
-          <w:rFonts w:ascii="Arial" w:hAnsi="Arial" w:eastAsia="Arial" w:cs="Arial"/>
-          <w:b w:val="0"/>
-          <w:caps w:val="0"/>
-          <w:color w:val="000000"/>
-          <w:sz w:val="20"/>
-        </w:rPr>
-        <w:instrText xml:space="preserve"> SEQ Figura \* ARABIC </w:instrText>
-      </w:r>
-      <w:r>
-        <w:rPr>
-          <w:rFonts w:ascii="Arial" w:hAnsi="Arial" w:eastAsia="Arial" w:cs="Arial"/>
-          <w:b w:val="0"/>
-          <w:caps w:val="0"/>
-          <w:color w:val="000000"/>
-          <w:sz w:val="20"/>
-        </w:rPr>
-        <w:fldChar w:fldCharType="separate"/>
-      </w:r>
-      <w:r>
-        <w:rPr>
-          <w:rFonts w:ascii="Arial" w:hAnsi="Arial" w:eastAsia="Arial" w:cs="Arial"/>
-          <w:b w:val="0"/>
-          <w:caps w:val="0"/>
-          <w:color w:val="000000"/>
-          <w:sz w:val="20"/>
-        </w:rPr>
-        <w:t>2</w:t>
-      </w:r>
-      <w:r>
-        <w:rPr>
-          <w:rFonts w:ascii="Arial" w:hAnsi="Arial" w:eastAsia="Arial" w:cs="Arial"/>
-          <w:b w:val="0"/>
-          <w:caps w:val="0"/>
-          <w:color w:val="000000"/>
-          <w:sz w:val="20"/>
-        </w:rPr>
-        <w:fldChar w:fldCharType="end"/>
-      </w:r>
-      <w:r>
-        <w:rPr>
-          <w:rFonts w:ascii="Arial" w:hAnsi="Arial" w:eastAsia="Arial" w:cs="Arial"/>
-          <w:b w:val="0"/>
-          <w:caps w:val="0"/>
-          <w:color w:val="000000"/>
-          <w:sz w:val="20"/>
-        </w:rPr>
-        <w:t xml:space="preserve"> – </w:t>
-      </w:r>
-      <w:r>
-        <w:rPr>
-          <w:rFonts w:ascii="Arial" w:hAnsi="Arial" w:eastAsia="Arial" w:cs="Arial"/>
-          <w:b w:val="0"/>
-          <w:caps w:val="0"/>
-          <w:color w:val="000000"/>
-          <w:sz w:val="20"/>
-        </w:rPr>
-        <w:t>Exemplos de topologias de comunicação entre agentes.</w:t>
-      </w:r>
-      <w:bookmarkEnd w:id="5001"/>
-    </w:p>
-    <w:p>
       <w:pPr>
         <w:pStyle w:val="FigureSource"/>
         <w:ind w:firstLine="0"/>
@@ -5280,6 +5280,96 @@
         </w:rPr>
         <w:t>A figura a seguir resume onde o controle é exercido nas três organizações. Os desenhos são esquemas conceituais: representam possibilidades de coordenação, e não medições ou a sequência exata de uma execução do MAB.</w:t>
       </w:r>
+    </w:p>
+    <w:p>
+      <w:bookmarkStart w:id="5002" w:name="_TCC_F_IMG_C019"/>
+      <w:pPr>
+        <w:pStyle w:val="FigureCaption"/>
+        <w:keepNext/>
+        <w:ind w:firstLine="0"/>
+        <w:jc w:val="center"/>
+      </w:pPr>
+      <w:r>
+        <w:rPr>
+          <w:rFonts w:ascii="Arial" w:hAnsi="Arial" w:eastAsia="Arial" w:cs="Arial"/>
+          <w:b w:val="0"/>
+          <w:caps w:val="0"/>
+          <w:color w:val="000000"/>
+          <w:sz w:val="20"/>
+        </w:rPr>
+        <w:t xml:space="preserve">Figura </w:t>
+      </w:r>
+      <w:r>
+        <w:rPr>
+          <w:rFonts w:ascii="Arial" w:hAnsi="Arial" w:eastAsia="Arial" w:cs="Arial"/>
+          <w:b w:val="0"/>
+          <w:caps w:val="0"/>
+          <w:color w:val="000000"/>
+          <w:sz w:val="20"/>
+        </w:rPr>
+        <w:fldChar w:fldCharType="begin"/>
+      </w:r>
+      <w:r>
+        <w:rPr>
+          <w:rFonts w:ascii="Arial" w:hAnsi="Arial" w:eastAsia="Arial" w:cs="Arial"/>
+          <w:b w:val="0"/>
+          <w:caps w:val="0"/>
+          <w:color w:val="000000"/>
+          <w:sz w:val="20"/>
+        </w:rPr>
+        <w:instrText xml:space="preserve"> SEQ Figura \* ARABIC </w:instrText>
+      </w:r>
+      <w:r>
+        <w:rPr>
+          <w:rFonts w:ascii="Arial" w:hAnsi="Arial" w:eastAsia="Arial" w:cs="Arial"/>
+          <w:b w:val="0"/>
+          <w:caps w:val="0"/>
+          <w:color w:val="000000"/>
+          <w:sz w:val="20"/>
+        </w:rPr>
+        <w:fldChar w:fldCharType="separate"/>
+      </w:r>
+      <w:r>
+        <w:rPr>
+          <w:rFonts w:ascii="Arial" w:hAnsi="Arial" w:eastAsia="Arial" w:cs="Arial"/>
+          <w:b w:val="0"/>
+          <w:caps w:val="0"/>
+          <w:color w:val="000000"/>
+          <w:sz w:val="20"/>
+        </w:rPr>
+        <w:t>3</w:t>
+      </w:r>
+      <w:r>
+        <w:rPr>
+          <w:rFonts w:ascii="Arial" w:hAnsi="Arial" w:eastAsia="Arial" w:cs="Arial"/>
+          <w:b w:val="0"/>
+          <w:caps w:val="0"/>
+          <w:color w:val="000000"/>
+          <w:sz w:val="20"/>
+        </w:rPr>
+        <w:fldChar w:fldCharType="end"/>
+      </w:r>
+      <w:r>
+        <w:rPr>
+          <w:rFonts w:ascii="Arial" w:hAnsi="Arial" w:eastAsia="Arial" w:cs="Arial"/>
+          <w:b w:val="0"/>
+          <w:caps w:val="0"/>
+          <w:color w:val="000000"/>
+          <w:sz w:val="20"/>
+        </w:rPr>
+        <w:t xml:space="preserve"> – </w:t>
+      </w:r>
+      <w:r>
+        <w:rPr>
+          <w:rFonts w:ascii="Arial" w:hAnsi="Arial" w:eastAsia="Arial" w:cs="Arial"/>
+          <w:b w:val="0"/>
+          <w:caps w:val="0"/>
+          <w:color w:val="000000"/>
+          <w:sz w:val="20"/>
+        </w:rPr>
+        <w:t>Distribuição de controle nas três arquiteturas de coordenação.</w:t>
+      </w:r>
+      <w:bookmarkEnd w:id="5002"/>
     </w:p>
     <w:p>
       <w:pPr>
@@ -5333,96 +5423,6 @@
           </wp:inline>
         </w:drawing>
       </w:r>
-    </w:p>
-    <w:p>
-      <w:bookmarkStart w:id="5002" w:name="_TCC_F_IMG_C019"/>
-      <w:pPr>
-        <w:pStyle w:val="FigureCaption"/>
-        <w:keepNext/>
-        <w:ind w:firstLine="0"/>
-        <w:jc w:val="center"/>
-      </w:pPr>
-      <w:r>
-        <w:rPr>
-          <w:rFonts w:ascii="Arial" w:hAnsi="Arial" w:eastAsia="Arial" w:cs="Arial"/>
-          <w:b w:val="0"/>
-          <w:caps w:val="0"/>
-          <w:color w:val="000000"/>
-          <w:sz w:val="20"/>
-        </w:rPr>
-        <w:t xml:space="preserve">Figura </w:t>
-      </w:r>
-      <w:r>
-        <w:rPr>
-          <w:rFonts w:ascii="Arial" w:hAnsi="Arial" w:eastAsia="Arial" w:cs="Arial"/>
-          <w:b w:val="0"/>
-          <w:caps w:val="0"/>
-          <w:color w:val="000000"/>
-          <w:sz w:val="20"/>
-        </w:rPr>
-        <w:fldChar w:fldCharType="begin"/>
-      </w:r>
-      <w:r>
-        <w:rPr>
-          <w:rFonts w:ascii="Arial" w:hAnsi="Arial" w:eastAsia="Arial" w:cs="Arial"/>
-          <w:b w:val="0"/>
-          <w:caps w:val="0"/>
-          <w:color w:val="000000"/>
-          <w:sz w:val="20"/>
-        </w:rPr>
-        <w:instrText xml:space="preserve"> SEQ Figura \* ARABIC </w:instrText>
-      </w:r>
-      <w:r>
-        <w:rPr>
-          <w:rFonts w:ascii="Arial" w:hAnsi="Arial" w:eastAsia="Arial" w:cs="Arial"/>
-          <w:b w:val="0"/>
-          <w:caps w:val="0"/>
-          <w:color w:val="000000"/>
-          <w:sz w:val="20"/>
-        </w:rPr>
-        <w:fldChar w:fldCharType="separate"/>
-      </w:r>
-      <w:r>
-        <w:rPr>
-          <w:rFonts w:ascii="Arial" w:hAnsi="Arial" w:eastAsia="Arial" w:cs="Arial"/>
-          <w:b w:val="0"/>
-          <w:caps w:val="0"/>
-          <w:color w:val="000000"/>
-          <w:sz w:val="20"/>
-        </w:rPr>
-        <w:t>3</w:t>
-      </w:r>
-      <w:r>
-        <w:rPr>
-          <w:rFonts w:ascii="Arial" w:hAnsi="Arial" w:eastAsia="Arial" w:cs="Arial"/>
-          <w:b w:val="0"/>
-          <w:caps w:val="0"/>
-          <w:color w:val="000000"/>
-          <w:sz w:val="20"/>
-        </w:rPr>
-        <w:fldChar w:fldCharType="end"/>
-      </w:r>
-      <w:r>
-        <w:rPr>
-          <w:rFonts w:ascii="Arial" w:hAnsi="Arial" w:eastAsia="Arial" w:cs="Arial"/>
-          <w:b w:val="0"/>
-          <w:caps w:val="0"/>
-          <w:color w:val="000000"/>
-          <w:sz w:val="20"/>
-        </w:rPr>
-        <w:t xml:space="preserve"> – </w:t>
-      </w:r>
-      <w:r>
-        <w:rPr>
-          <w:rFonts w:ascii="Arial" w:hAnsi="Arial" w:eastAsia="Arial" w:cs="Arial"/>
-          <w:b w:val="0"/>
-          <w:caps w:val="0"/>
-          <w:color w:val="000000"/>
-          <w:sz w:val="20"/>
-        </w:rPr>
-        <w:t>Distribuição de controle nas três arquiteturas de coordenação.</w:t>
-      </w:r>
-      <w:bookmarkEnd w:id="5002"/>
     </w:p>
     <w:p>
       <w:pPr>
@@ -8111,6 +8111,14 @@
     <w:p>
       <w:pPr>
         <w:pStyle w:val="ListBullet"/>
+        <w:keepNext w:val="0"/>
+        <w:keepLines/>
+        <w:numPr>
+          <w:ilvl w:val="0"/>
+          <w:numId w:val="15"/>
+        </w:numPr>
+        <w:spacing w:before="0" w:after="0" w:line="360" w:lineRule="auto"/>
+        <w:ind w:left="720" w:hanging="360" w:right="0"/>
       </w:pPr>
       <w:r>
         <w:rPr>
@@ -8124,6 +8132,14 @@
     <w:p>
       <w:pPr>
         <w:pStyle w:val="ListBullet"/>
+        <w:keepNext w:val="0"/>
+        <w:keepLines/>
+        <w:numPr>
+          <w:ilvl w:val="0"/>
+          <w:numId w:val="15"/>
+        </w:numPr>
+        <w:spacing w:before="0" w:after="0" w:line="360" w:lineRule="auto"/>
+        <w:ind w:left="720" w:hanging="360" w:right="0"/>
       </w:pPr>
       <w:r>
         <w:rPr>
@@ -8147,6 +8163,14 @@
     <w:p>
       <w:pPr>
         <w:pStyle w:val="ListBullet"/>
+        <w:keepNext w:val="0"/>
+        <w:keepLines/>
+        <w:numPr>
+          <w:ilvl w:val="0"/>
+          <w:numId w:val="15"/>
+        </w:numPr>
+        <w:spacing w:before="0" w:after="0" w:line="360" w:lineRule="auto"/>
+        <w:ind w:left="720" w:hanging="360" w:right="0"/>
       </w:pPr>
       <w:r>
         <w:rPr>
@@ -8298,6 +8322,14 @@
     <w:p>
       <w:pPr>
         <w:pStyle w:val="ListBullet"/>
+        <w:keepNext w:val="0"/>
+        <w:keepLines/>
+        <w:numPr>
+          <w:ilvl w:val="0"/>
+          <w:numId w:val="15"/>
+        </w:numPr>
+        <w:spacing w:before="0" w:after="0" w:line="360" w:lineRule="auto"/>
+        <w:ind w:left="720" w:hanging="360" w:right="0"/>
       </w:pPr>
       <w:r>
         <w:rPr>
@@ -8311,6 +8343,14 @@
     <w:p>
       <w:pPr>
         <w:pStyle w:val="ListBullet"/>
+        <w:keepNext w:val="0"/>
+        <w:keepLines/>
+        <w:numPr>
+          <w:ilvl w:val="0"/>
+          <w:numId w:val="15"/>
+        </w:numPr>
+        <w:spacing w:before="0" w:after="0" w:line="360" w:lineRule="auto"/>
+        <w:ind w:left="720" w:hanging="360" w:right="0"/>
       </w:pPr>
       <w:r>
         <w:rPr>
@@ -8324,6 +8364,14 @@
     <w:p>
       <w:pPr>
         <w:pStyle w:val="ListBullet"/>
+        <w:keepNext w:val="0"/>
+        <w:keepLines/>
+        <w:numPr>
+          <w:ilvl w:val="0"/>
+          <w:numId w:val="15"/>
+        </w:numPr>
+        <w:spacing w:before="0" w:after="0" w:line="360" w:lineRule="auto"/>
+        <w:ind w:left="720" w:hanging="360" w:right="0"/>
       </w:pPr>
       <w:r>
         <w:rPr>
@@ -8337,6 +8385,14 @@
     <w:p>
       <w:pPr>
         <w:pStyle w:val="ListBullet"/>
+        <w:keepNext w:val="0"/>
+        <w:keepLines/>
+        <w:numPr>
+          <w:ilvl w:val="0"/>
+          <w:numId w:val="15"/>
+        </w:numPr>
+        <w:spacing w:before="0" w:after="0" w:line="360" w:lineRule="auto"/>
+        <w:ind w:left="720" w:hanging="360" w:right="0"/>
       </w:pPr>
       <w:r>
         <w:rPr>
@@ -8350,6 +8406,14 @@
     <w:p>
       <w:pPr>
         <w:pStyle w:val="ListBullet"/>
+        <w:keepNext w:val="0"/>
+        <w:keepLines/>
+        <w:numPr>
+          <w:ilvl w:val="0"/>
+          <w:numId w:val="15"/>
+        </w:numPr>
+        <w:spacing w:before="0" w:after="0" w:line="360" w:lineRule="auto"/>
+        <w:ind w:left="720" w:hanging="360" w:right="0"/>
       </w:pPr>
       <w:r>
         <w:rPr>
@@ -8363,6 +8427,14 @@
     <w:p>
       <w:pPr>
         <w:pStyle w:val="ListBullet"/>
+        <w:keepNext w:val="0"/>
+        <w:keepLines/>
+        <w:numPr>
+          <w:ilvl w:val="0"/>
+          <w:numId w:val="15"/>
+        </w:numPr>
+        <w:spacing w:before="0" w:after="0" w:line="360" w:lineRule="auto"/>
+        <w:ind w:left="720" w:hanging="360" w:right="0"/>
       </w:pPr>
       <w:r>
         <w:rPr>
@@ -8376,6 +8448,14 @@
     <w:p>
       <w:pPr>
         <w:pStyle w:val="ListBullet"/>
+        <w:keepNext w:val="0"/>
+        <w:keepLines/>
+        <w:numPr>
+          <w:ilvl w:val="0"/>
+          <w:numId w:val="15"/>
+        </w:numPr>
+        <w:spacing w:before="0" w:after="0" w:line="360" w:lineRule="auto"/>
+        <w:ind w:left="720" w:hanging="360" w:right="0"/>
       </w:pPr>
       <w:r>
         <w:rPr>
@@ -8389,6 +8469,14 @@
     <w:p>
       <w:pPr>
         <w:pStyle w:val="ListBullet"/>
+        <w:keepNext w:val="0"/>
+        <w:keepLines/>
+        <w:numPr>
+          <w:ilvl w:val="0"/>
+          <w:numId w:val="15"/>
+        </w:numPr>
+        <w:spacing w:before="0" w:after="0" w:line="360" w:lineRule="auto"/>
+        <w:ind w:left="720" w:hanging="360" w:right="0"/>
       </w:pPr>
       <w:r>
         <w:rPr>
@@ -8402,6 +8490,14 @@
     <w:p>
       <w:pPr>
         <w:pStyle w:val="ListBullet"/>
+        <w:keepNext w:val="0"/>
+        <w:keepLines/>
+        <w:numPr>
+          <w:ilvl w:val="0"/>
+          <w:numId w:val="15"/>
+        </w:numPr>
+        <w:spacing w:before="0" w:after="0" w:line="360" w:lineRule="auto"/>
+        <w:ind w:left="720" w:hanging="360" w:right="0"/>
       </w:pPr>
       <w:r>
         <w:rPr>
@@ -8425,7 +8521,15 @@
     </w:p>
     <w:p>
       <w:pPr>
-        <w:pStyle w:val="ListNumber"/>
+        <w:pStyle w:val="ListBullet"/>
+        <w:keepNext w:val="0"/>
+        <w:keepLines/>
+        <w:numPr>
+          <w:ilvl w:val="0"/>
+          <w:numId w:val="15"/>
+        </w:numPr>
+        <w:spacing w:before="0" w:after="0" w:line="360" w:lineRule="auto"/>
+        <w:ind w:left="720" w:hanging="360" w:right="0"/>
       </w:pPr>
       <w:r>
         <w:rPr>
@@ -8438,7 +8542,15 @@
     </w:p>
     <w:p>
       <w:pPr>
-        <w:pStyle w:val="ListNumber"/>
+        <w:pStyle w:val="ListBullet"/>
+        <w:keepNext w:val="0"/>
+        <w:keepLines/>
+        <w:numPr>
+          <w:ilvl w:val="0"/>
+          <w:numId w:val="15"/>
+        </w:numPr>
+        <w:spacing w:before="0" w:after="0" w:line="360" w:lineRule="auto"/>
+        <w:ind w:left="720" w:hanging="360" w:right="0"/>
       </w:pPr>
       <w:r>
         <w:rPr>
@@ -8451,7 +8563,15 @@
     </w:p>
     <w:p>
       <w:pPr>
-        <w:pStyle w:val="ListNumber"/>
+        <w:pStyle w:val="ListBullet"/>
+        <w:keepNext w:val="0"/>
+        <w:keepLines/>
+        <w:numPr>
+          <w:ilvl w:val="0"/>
+          <w:numId w:val="15"/>
+        </w:numPr>
+        <w:spacing w:before="0" w:after="0" w:line="360" w:lineRule="auto"/>
+        <w:ind w:left="720" w:hanging="360" w:right="0"/>
       </w:pPr>
       <w:r>
         <w:rPr>
@@ -8464,7 +8584,15 @@
     </w:p>
     <w:p>
       <w:pPr>
-        <w:pStyle w:val="ListNumber"/>
+        <w:pStyle w:val="ListBullet"/>
+        <w:keepNext w:val="0"/>
+        <w:keepLines/>
+        <w:numPr>
+          <w:ilvl w:val="0"/>
+          <w:numId w:val="15"/>
+        </w:numPr>
+        <w:spacing w:before="0" w:after="0" w:line="360" w:lineRule="auto"/>
+        <w:ind w:left="720" w:hanging="360" w:right="0"/>
       </w:pPr>
       <w:r>
         <w:rPr>
@@ -8477,7 +8605,15 @@
     </w:p>
     <w:p>
       <w:pPr>
-        <w:pStyle w:val="ListNumber"/>
+        <w:pStyle w:val="ListBullet"/>
+        <w:keepNext w:val="0"/>
+        <w:keepLines/>
+        <w:numPr>
+          <w:ilvl w:val="0"/>
+          <w:numId w:val="15"/>
+        </w:numPr>
+        <w:spacing w:before="0" w:after="0" w:line="360" w:lineRule="auto"/>
+        <w:ind w:left="720" w:hanging="360" w:right="0"/>
       </w:pPr>
       <w:r>
         <w:rPr>
@@ -8531,6 +8667,96 @@
         </w:rPr>
         <w:t>Os cenários de revisão profissional e os respectivos gabaritos de segurança serão validados previamente por um farmacêutico graduado, que deverá verificar se o encaminhamento esperado é adequado ao conteúdo da solicitação. O processo é sintetizado na figura apresentada a seguir.</w:t>
       </w:r>
+    </w:p>
+    <w:p>
+      <w:bookmarkStart w:id="3000" w:name="_TCC_F_IMG_C012"/>
+      <w:pPr>
+        <w:pStyle w:val="FigureCaption"/>
+        <w:keepNext/>
+        <w:ind w:firstLine="0"/>
+        <w:jc w:val="center"/>
+      </w:pPr>
+      <w:r>
+        <w:rPr>
+          <w:rFonts w:ascii="Arial" w:hAnsi="Arial" w:eastAsia="Arial" w:cs="Arial"/>
+          <w:b w:val="0"/>
+          <w:caps w:val="0"/>
+          <w:color w:val="000000"/>
+          <w:sz w:val="20"/>
+        </w:rPr>
+        <w:t xml:space="preserve">Figura </w:t>
+      </w:r>
+      <w:r>
+        <w:rPr>
+          <w:rFonts w:ascii="Arial" w:hAnsi="Arial" w:eastAsia="Arial" w:cs="Arial"/>
+          <w:b w:val="0"/>
+          <w:caps w:val="0"/>
+          <w:color w:val="000000"/>
+          <w:sz w:val="20"/>
+        </w:rPr>
+        <w:fldChar w:fldCharType="begin"/>
+      </w:r>
+      <w:r>
+        <w:rPr>
+          <w:rFonts w:ascii="Arial" w:hAnsi="Arial" w:eastAsia="Arial" w:cs="Arial"/>
+          <w:b w:val="0"/>
+          <w:caps w:val="0"/>
+          <w:color w:val="000000"/>
+          <w:sz w:val="20"/>
+        </w:rPr>
+        <w:instrText xml:space="preserve"> SEQ Figura \* ARABIC </w:instrText>
+      </w:r>
+      <w:r>
+        <w:rPr>
+          <w:rFonts w:ascii="Arial" w:hAnsi="Arial" w:eastAsia="Arial" w:cs="Arial"/>
+          <w:b w:val="0"/>
+          <w:caps w:val="0"/>
+          <w:color w:val="000000"/>
+          <w:sz w:val="20"/>
+        </w:rPr>
+        <w:fldChar w:fldCharType="separate"/>
+      </w:r>
+      <w:r>
+        <w:rPr>
+          <w:rFonts w:ascii="Arial" w:hAnsi="Arial" w:eastAsia="Arial" w:cs="Arial"/>
+          <w:b w:val="0"/>
+          <w:caps w:val="0"/>
+          <w:color w:val="000000"/>
+          <w:sz w:val="20"/>
+        </w:rPr>
+        <w:t>4</w:t>
+      </w:r>
+      <w:r>
+        <w:rPr>
+          <w:rFonts w:ascii="Arial" w:hAnsi="Arial" w:eastAsia="Arial" w:cs="Arial"/>
+          <w:b w:val="0"/>
+          <w:caps w:val="0"/>
+          <w:color w:val="000000"/>
+          <w:sz w:val="20"/>
+        </w:rPr>
+        <w:fldChar w:fldCharType="end"/>
+      </w:r>
+      <w:r>
+        <w:rPr>
+          <w:rFonts w:ascii="Arial" w:hAnsi="Arial" w:eastAsia="Arial" w:cs="Arial"/>
+          <w:b w:val="0"/>
+          <w:caps w:val="0"/>
+          <w:color w:val="000000"/>
+          <w:sz w:val="20"/>
+        </w:rPr>
+        <w:t xml:space="preserve"> – </w:t>
+      </w:r>
+      <w:r>
+        <w:rPr>
+          <w:rFonts w:ascii="Arial" w:hAnsi="Arial" w:eastAsia="Arial" w:cs="Arial"/>
+          <w:b w:val="0"/>
+          <w:caps w:val="0"/>
+          <w:color w:val="000000"/>
+          <w:sz w:val="20"/>
+        </w:rPr>
+        <w:t>Processo de construção e validação dos cenários experimentais.</w:t>
+      </w:r>
+      <w:bookmarkEnd w:id="3000"/>
     </w:p>
     <w:p>
       <w:pPr>
@@ -8586,96 +8812,6 @@
       </w:r>
     </w:p>
     <w:p>
-      <w:bookmarkStart w:id="3000" w:name="_TCC_F_IMG_C012"/>
-      <w:pPr>
-        <w:pStyle w:val="FigureCaption"/>
-        <w:keepNext/>
-        <w:ind w:firstLine="0"/>
-        <w:jc w:val="center"/>
-      </w:pPr>
-      <w:r>
-        <w:rPr>
-          <w:rFonts w:ascii="Arial" w:hAnsi="Arial" w:eastAsia="Arial" w:cs="Arial"/>
-          <w:b w:val="0"/>
-          <w:caps w:val="0"/>
-          <w:color w:val="000000"/>
-          <w:sz w:val="20"/>
-        </w:rPr>
-        <w:t xml:space="preserve">Figura </w:t>
-      </w:r>
-      <w:r>
-        <w:rPr>
-          <w:rFonts w:ascii="Arial" w:hAnsi="Arial" w:eastAsia="Arial" w:cs="Arial"/>
-          <w:b w:val="0"/>
-          <w:caps w:val="0"/>
-          <w:color w:val="000000"/>
-          <w:sz w:val="20"/>
-        </w:rPr>
-        <w:fldChar w:fldCharType="begin"/>
-      </w:r>
-      <w:r>
-        <w:rPr>
-          <w:rFonts w:ascii="Arial" w:hAnsi="Arial" w:eastAsia="Arial" w:cs="Arial"/>
-          <w:b w:val="0"/>
-          <w:caps w:val="0"/>
-          <w:color w:val="000000"/>
-          <w:sz w:val="20"/>
-        </w:rPr>
-        <w:instrText xml:space="preserve"> SEQ Figura \* ARABIC </w:instrText>
-      </w:r>
-      <w:r>
-        <w:rPr>
-          <w:rFonts w:ascii="Arial" w:hAnsi="Arial" w:eastAsia="Arial" w:cs="Arial"/>
-          <w:b w:val="0"/>
-          <w:caps w:val="0"/>
-          <w:color w:val="000000"/>
-          <w:sz w:val="20"/>
-        </w:rPr>
-        <w:fldChar w:fldCharType="separate"/>
-      </w:r>
-      <w:r>
-        <w:rPr>
-          <w:rFonts w:ascii="Arial" w:hAnsi="Arial" w:eastAsia="Arial" w:cs="Arial"/>
-          <w:b w:val="0"/>
-          <w:caps w:val="0"/>
-          <w:color w:val="000000"/>
-          <w:sz w:val="20"/>
-        </w:rPr>
-        <w:t>4</w:t>
-      </w:r>
-      <w:r>
-        <w:rPr>
-          <w:rFonts w:ascii="Arial" w:hAnsi="Arial" w:eastAsia="Arial" w:cs="Arial"/>
-          <w:b w:val="0"/>
-          <w:caps w:val="0"/>
-          <w:color w:val="000000"/>
-          <w:sz w:val="20"/>
-        </w:rPr>
-        <w:fldChar w:fldCharType="end"/>
-      </w:r>
-      <w:r>
-        <w:rPr>
-          <w:rFonts w:ascii="Arial" w:hAnsi="Arial" w:eastAsia="Arial" w:cs="Arial"/>
-          <w:b w:val="0"/>
-          <w:caps w:val="0"/>
-          <w:color w:val="000000"/>
-          <w:sz w:val="20"/>
-        </w:rPr>
-        <w:t xml:space="preserve"> – </w:t>
-      </w:r>
-      <w:r>
-        <w:rPr>
-          <w:rFonts w:ascii="Arial" w:hAnsi="Arial" w:eastAsia="Arial" w:cs="Arial"/>
-          <w:b w:val="0"/>
-          <w:caps w:val="0"/>
-          <w:color w:val="000000"/>
-          <w:sz w:val="20"/>
-        </w:rPr>
-        <w:t>Processo de construção e validação dos cenários experimentais.</w:t>
-      </w:r>
-      <w:bookmarkEnd w:id="3000"/>
-    </w:p>
-    <w:p>
       <w:pPr>
         <w:pStyle w:val="FigureSource"/>
         <w:ind w:firstLine="0"/>
@@ -8793,6 +8929,96 @@
         </w:rPr>
         <w:t>Na sexta etapa será realizada a execução controlada dos experimentos. Na sétima, as respostas serão submetidas ao processo de avaliação híbrida. Por fim, os dados obtidos serão tratados estatisticamente e utilizados para responder à pergunta de pesquisa.</w:t>
       </w:r>
+    </w:p>
+    <w:p>
+      <w:bookmarkStart w:id="3001" w:name="_TCC_F_IMG_C010"/>
+      <w:pPr>
+        <w:pStyle w:val="FigureCaption"/>
+        <w:keepNext/>
+        <w:ind w:firstLine="0"/>
+        <w:jc w:val="center"/>
+      </w:pPr>
+      <w:r>
+        <w:rPr>
+          <w:rFonts w:ascii="Arial" w:hAnsi="Arial" w:eastAsia="Arial" w:cs="Arial"/>
+          <w:b w:val="0"/>
+          <w:caps w:val="0"/>
+          <w:color w:val="000000"/>
+          <w:sz w:val="20"/>
+        </w:rPr>
+        <w:t xml:space="preserve">Figura </w:t>
+      </w:r>
+      <w:r>
+        <w:rPr>
+          <w:rFonts w:ascii="Arial" w:hAnsi="Arial" w:eastAsia="Arial" w:cs="Arial"/>
+          <w:b w:val="0"/>
+          <w:caps w:val="0"/>
+          <w:color w:val="000000"/>
+          <w:sz w:val="20"/>
+        </w:rPr>
+        <w:fldChar w:fldCharType="begin"/>
+      </w:r>
+      <w:r>
+        <w:rPr>
+          <w:rFonts w:ascii="Arial" w:hAnsi="Arial" w:eastAsia="Arial" w:cs="Arial"/>
+          <w:b w:val="0"/>
+          <w:caps w:val="0"/>
+          <w:color w:val="000000"/>
+          <w:sz w:val="20"/>
+        </w:rPr>
+        <w:instrText xml:space="preserve"> SEQ Figura \* ARABIC </w:instrText>
+      </w:r>
+      <w:r>
+        <w:rPr>
+          <w:rFonts w:ascii="Arial" w:hAnsi="Arial" w:eastAsia="Arial" w:cs="Arial"/>
+          <w:b w:val="0"/>
+          <w:caps w:val="0"/>
+          <w:color w:val="000000"/>
+          <w:sz w:val="20"/>
+        </w:rPr>
+        <w:fldChar w:fldCharType="separate"/>
+      </w:r>
+      <w:r>
+        <w:rPr>
+          <w:rFonts w:ascii="Arial" w:hAnsi="Arial" w:eastAsia="Arial" w:cs="Arial"/>
+          <w:b w:val="0"/>
+          <w:caps w:val="0"/>
+          <w:color w:val="000000"/>
+          <w:sz w:val="20"/>
+        </w:rPr>
+        <w:t>5</w:t>
+      </w:r>
+      <w:r>
+        <w:rPr>
+          <w:rFonts w:ascii="Arial" w:hAnsi="Arial" w:eastAsia="Arial" w:cs="Arial"/>
+          <w:b w:val="0"/>
+          <w:caps w:val="0"/>
+          <w:color w:val="000000"/>
+          <w:sz w:val="20"/>
+        </w:rPr>
+        <w:fldChar w:fldCharType="end"/>
+      </w:r>
+      <w:r>
+        <w:rPr>
+          <w:rFonts w:ascii="Arial" w:hAnsi="Arial" w:eastAsia="Arial" w:cs="Arial"/>
+          <w:b w:val="0"/>
+          <w:caps w:val="0"/>
+          <w:color w:val="000000"/>
+          <w:sz w:val="20"/>
+        </w:rPr>
+        <w:t xml:space="preserve"> – </w:t>
+      </w:r>
+      <w:r>
+        <w:rPr>
+          <w:rFonts w:ascii="Arial" w:hAnsi="Arial" w:eastAsia="Arial" w:cs="Arial"/>
+          <w:b w:val="0"/>
+          <w:caps w:val="0"/>
+          <w:color w:val="000000"/>
+          <w:sz w:val="20"/>
+        </w:rPr>
+        <w:t>Etapas metodológicas da pesquisa.</w:t>
+      </w:r>
+      <w:bookmarkEnd w:id="3001"/>
     </w:p>
     <w:p>
       <w:pPr>
@@ -8848,96 +9074,6 @@
       </w:r>
     </w:p>
     <w:p>
-      <w:bookmarkStart w:id="3001" w:name="_TCC_F_IMG_C010"/>
-      <w:pPr>
-        <w:pStyle w:val="FigureCaption"/>
-        <w:keepNext/>
-        <w:ind w:firstLine="0"/>
-        <w:jc w:val="center"/>
-      </w:pPr>
-      <w:r>
-        <w:rPr>
-          <w:rFonts w:ascii="Arial" w:hAnsi="Arial" w:eastAsia="Arial" w:cs="Arial"/>
-          <w:b w:val="0"/>
-          <w:caps w:val="0"/>
-          <w:color w:val="000000"/>
-          <w:sz w:val="20"/>
-        </w:rPr>
-        <w:t xml:space="preserve">Figura </w:t>
-      </w:r>
-      <w:r>
-        <w:rPr>
-          <w:rFonts w:ascii="Arial" w:hAnsi="Arial" w:eastAsia="Arial" w:cs="Arial"/>
-          <w:b w:val="0"/>
-          <w:caps w:val="0"/>
-          <w:color w:val="000000"/>
-          <w:sz w:val="20"/>
-        </w:rPr>
-        <w:fldChar w:fldCharType="begin"/>
-      </w:r>
-      <w:r>
-        <w:rPr>
-          <w:rFonts w:ascii="Arial" w:hAnsi="Arial" w:eastAsia="Arial" w:cs="Arial"/>
-          <w:b w:val="0"/>
-          <w:caps w:val="0"/>
-          <w:color w:val="000000"/>
-          <w:sz w:val="20"/>
-        </w:rPr>
-        <w:instrText xml:space="preserve"> SEQ Figura \* ARABIC </w:instrText>
-      </w:r>
-      <w:r>
-        <w:rPr>
-          <w:rFonts w:ascii="Arial" w:hAnsi="Arial" w:eastAsia="Arial" w:cs="Arial"/>
-          <w:b w:val="0"/>
-          <w:caps w:val="0"/>
-          <w:color w:val="000000"/>
-          <w:sz w:val="20"/>
-        </w:rPr>
-        <w:fldChar w:fldCharType="separate"/>
-      </w:r>
-      <w:r>
-        <w:rPr>
-          <w:rFonts w:ascii="Arial" w:hAnsi="Arial" w:eastAsia="Arial" w:cs="Arial"/>
-          <w:b w:val="0"/>
-          <w:caps w:val="0"/>
-          <w:color w:val="000000"/>
-          <w:sz w:val="20"/>
-        </w:rPr>
-        <w:t>5</w:t>
-      </w:r>
-      <w:r>
-        <w:rPr>
-          <w:rFonts w:ascii="Arial" w:hAnsi="Arial" w:eastAsia="Arial" w:cs="Arial"/>
-          <w:b w:val="0"/>
-          <w:caps w:val="0"/>
-          <w:color w:val="000000"/>
-          <w:sz w:val="20"/>
-        </w:rPr>
-        <w:fldChar w:fldCharType="end"/>
-      </w:r>
-      <w:r>
-        <w:rPr>
-          <w:rFonts w:ascii="Arial" w:hAnsi="Arial" w:eastAsia="Arial" w:cs="Arial"/>
-          <w:b w:val="0"/>
-          <w:caps w:val="0"/>
-          <w:color w:val="000000"/>
-          <w:sz w:val="20"/>
-        </w:rPr>
-        <w:t xml:space="preserve"> – </w:t>
-      </w:r>
-      <w:r>
-        <w:rPr>
-          <w:rFonts w:ascii="Arial" w:hAnsi="Arial" w:eastAsia="Arial" w:cs="Arial"/>
-          <w:b w:val="0"/>
-          <w:caps w:val="0"/>
-          <w:color w:val="000000"/>
-          <w:sz w:val="20"/>
-        </w:rPr>
-        <w:t>Etapas metodológicas da pesquisa.</w:t>
-      </w:r>
-      <w:bookmarkEnd w:id="3001"/>
-    </w:p>
-    <w:p>
       <w:pPr>
         <w:pStyle w:val="FigureSource"/>
         <w:ind w:firstLine="0"/>
@@ -9037,6 +9173,14 @@
     <w:p>
       <w:pPr>
         <w:pStyle w:val="ListBullet"/>
+        <w:keepNext w:val="0"/>
+        <w:keepLines/>
+        <w:numPr>
+          <w:ilvl w:val="0"/>
+          <w:numId w:val="15"/>
+        </w:numPr>
+        <w:spacing w:before="0" w:after="0" w:line="360" w:lineRule="auto"/>
+        <w:ind w:left="720" w:hanging="360" w:right="0"/>
       </w:pPr>
       <w:r>
         <w:rPr>
@@ -9050,6 +9194,14 @@
     <w:p>
       <w:pPr>
         <w:pStyle w:val="ListBullet"/>
+        <w:keepNext w:val="0"/>
+        <w:keepLines/>
+        <w:numPr>
+          <w:ilvl w:val="0"/>
+          <w:numId w:val="15"/>
+        </w:numPr>
+        <w:spacing w:before="0" w:after="0" w:line="360" w:lineRule="auto"/>
+        <w:ind w:left="720" w:hanging="360" w:right="0"/>
       </w:pPr>
       <w:r>
         <w:rPr>
@@ -9063,6 +9215,14 @@
     <w:p>
       <w:pPr>
         <w:pStyle w:val="ListBullet"/>
+        <w:keepNext w:val="0"/>
+        <w:keepLines/>
+        <w:numPr>
+          <w:ilvl w:val="0"/>
+          <w:numId w:val="15"/>
+        </w:numPr>
+        <w:spacing w:before="0" w:after="0" w:line="360" w:lineRule="auto"/>
+        <w:ind w:left="720" w:hanging="360" w:right="0"/>
       </w:pPr>
       <w:r>
         <w:rPr>
@@ -9085,6 +9245,14 @@
     <w:p>
       <w:pPr>
         <w:pStyle w:val="ListBullet"/>
+        <w:keepNext w:val="0"/>
+        <w:keepLines/>
+        <w:numPr>
+          <w:ilvl w:val="0"/>
+          <w:numId w:val="15"/>
+        </w:numPr>
+        <w:spacing w:before="0" w:after="0" w:line="360" w:lineRule="auto"/>
+        <w:ind w:left="720" w:hanging="360" w:right="0"/>
       </w:pPr>
       <w:r>
         <w:rPr>
@@ -9098,6 +9266,14 @@
     <w:p>
       <w:pPr>
         <w:pStyle w:val="ListBullet"/>
+        <w:keepNext w:val="0"/>
+        <w:keepLines/>
+        <w:numPr>
+          <w:ilvl w:val="0"/>
+          <w:numId w:val="15"/>
+        </w:numPr>
+        <w:spacing w:before="0" w:after="0" w:line="360" w:lineRule="auto"/>
+        <w:ind w:left="720" w:hanging="360" w:right="0"/>
       </w:pPr>
       <w:r>
         <w:rPr>
@@ -9111,6 +9287,14 @@
     <w:p>
       <w:pPr>
         <w:pStyle w:val="ListBullet"/>
+        <w:keepNext w:val="0"/>
+        <w:keepLines/>
+        <w:numPr>
+          <w:ilvl w:val="0"/>
+          <w:numId w:val="15"/>
+        </w:numPr>
+        <w:spacing w:before="0" w:after="0" w:line="360" w:lineRule="auto"/>
+        <w:ind w:left="720" w:hanging="360" w:right="0"/>
       </w:pPr>
       <w:r>
         <w:rPr>
@@ -9124,6 +9308,14 @@
     <w:p>
       <w:pPr>
         <w:pStyle w:val="ListBullet"/>
+        <w:keepNext w:val="0"/>
+        <w:keepLines/>
+        <w:numPr>
+          <w:ilvl w:val="0"/>
+          <w:numId w:val="15"/>
+        </w:numPr>
+        <w:spacing w:before="0" w:after="0" w:line="360" w:lineRule="auto"/>
+        <w:ind w:left="720" w:hanging="360" w:right="0"/>
       </w:pPr>
       <w:r>
         <w:rPr>
@@ -9137,6 +9329,14 @@
     <w:p>
       <w:pPr>
         <w:pStyle w:val="ListBullet"/>
+        <w:keepNext w:val="0"/>
+        <w:keepLines/>
+        <w:numPr>
+          <w:ilvl w:val="0"/>
+          <w:numId w:val="15"/>
+        </w:numPr>
+        <w:spacing w:before="0" w:after="0" w:line="360" w:lineRule="auto"/>
+        <w:ind w:left="720" w:hanging="360" w:right="0"/>
       </w:pPr>
       <w:r>
         <w:rPr>
@@ -9150,6 +9350,14 @@
     <w:p>
       <w:pPr>
         <w:pStyle w:val="ListBullet"/>
+        <w:keepNext w:val="0"/>
+        <w:keepLines/>
+        <w:numPr>
+          <w:ilvl w:val="0"/>
+          <w:numId w:val="15"/>
+        </w:numPr>
+        <w:spacing w:before="0" w:after="0" w:line="360" w:lineRule="auto"/>
+        <w:ind w:left="720" w:hanging="360" w:right="0"/>
       </w:pPr>
       <w:r>
         <w:rPr>
@@ -9319,6 +9527,96 @@
         </w:rPr>
         <w:t xml:space="preserve"> por chamada. Outros parâmetros eventualmente configurados pela aplicação também serão mantidos constantes e registrados junto aos artefatos experimentais.</w:t>
       </w:r>
+    </w:p>
+    <w:p>
+      <w:bookmarkStart w:id="3002" w:name="_TCC_F_IMG_C011"/>
+      <w:pPr>
+        <w:pStyle w:val="FigureCaption"/>
+        <w:keepNext/>
+        <w:ind w:firstLine="0"/>
+        <w:jc w:val="center"/>
+      </w:pPr>
+      <w:r>
+        <w:rPr>
+          <w:rFonts w:ascii="Arial" w:hAnsi="Arial" w:eastAsia="Arial" w:cs="Arial"/>
+          <w:b w:val="0"/>
+          <w:caps w:val="0"/>
+          <w:color w:val="000000"/>
+          <w:sz w:val="20"/>
+        </w:rPr>
+        <w:t xml:space="preserve">Figura </w:t>
+      </w:r>
+      <w:r>
+        <w:rPr>
+          <w:rFonts w:ascii="Arial" w:hAnsi="Arial" w:eastAsia="Arial" w:cs="Arial"/>
+          <w:b w:val="0"/>
+          <w:caps w:val="0"/>
+          <w:color w:val="000000"/>
+          <w:sz w:val="20"/>
+        </w:rPr>
+        <w:fldChar w:fldCharType="begin"/>
+      </w:r>
+      <w:r>
+        <w:rPr>
+          <w:rFonts w:ascii="Arial" w:hAnsi="Arial" w:eastAsia="Arial" w:cs="Arial"/>
+          <w:b w:val="0"/>
+          <w:caps w:val="0"/>
+          <w:color w:val="000000"/>
+          <w:sz w:val="20"/>
+        </w:rPr>
+        <w:instrText xml:space="preserve"> SEQ Figura \* ARABIC </w:instrText>
+      </w:r>
+      <w:r>
+        <w:rPr>
+          <w:rFonts w:ascii="Arial" w:hAnsi="Arial" w:eastAsia="Arial" w:cs="Arial"/>
+          <w:b w:val="0"/>
+          <w:caps w:val="0"/>
+          <w:color w:val="000000"/>
+          <w:sz w:val="20"/>
+        </w:rPr>
+        <w:fldChar w:fldCharType="separate"/>
+      </w:r>
+      <w:r>
+        <w:rPr>
+          <w:rFonts w:ascii="Arial" w:hAnsi="Arial" w:eastAsia="Arial" w:cs="Arial"/>
+          <w:b w:val="0"/>
+          <w:caps w:val="0"/>
+          <w:color w:val="000000"/>
+          <w:sz w:val="20"/>
+        </w:rPr>
+        <w:t>6</w:t>
+      </w:r>
+      <w:r>
+        <w:rPr>
+          <w:rFonts w:ascii="Arial" w:hAnsi="Arial" w:eastAsia="Arial" w:cs="Arial"/>
+          <w:b w:val="0"/>
+          <w:caps w:val="0"/>
+          <w:color w:val="000000"/>
+          <w:sz w:val="20"/>
+        </w:rPr>
+        <w:fldChar w:fldCharType="end"/>
+      </w:r>
+      <w:r>
+        <w:rPr>
+          <w:rFonts w:ascii="Arial" w:hAnsi="Arial" w:eastAsia="Arial" w:cs="Arial"/>
+          <w:b w:val="0"/>
+          <w:caps w:val="0"/>
+          <w:color w:val="000000"/>
+          <w:sz w:val="20"/>
+        </w:rPr>
+        <w:t xml:space="preserve"> – </w:t>
+      </w:r>
+      <w:r>
+        <w:rPr>
+          <w:rFonts w:ascii="Arial" w:hAnsi="Arial" w:eastAsia="Arial" w:cs="Arial"/>
+          <w:b w:val="0"/>
+          <w:caps w:val="0"/>
+          <w:color w:val="000000"/>
+          <w:sz w:val="20"/>
+        </w:rPr>
+        <w:t>Delineamento experimental para comparação das arquiteturas.</w:t>
+      </w:r>
+      <w:bookmarkEnd w:id="3002"/>
     </w:p>
     <w:p>
       <w:pPr>
@@ -9374,96 +9672,6 @@
       </w:r>
     </w:p>
     <w:p>
-      <w:bookmarkStart w:id="3002" w:name="_TCC_F_IMG_C011"/>
-      <w:pPr>
-        <w:pStyle w:val="FigureCaption"/>
-        <w:keepNext/>
-        <w:ind w:firstLine="0"/>
-        <w:jc w:val="center"/>
-      </w:pPr>
-      <w:r>
-        <w:rPr>
-          <w:rFonts w:ascii="Arial" w:hAnsi="Arial" w:eastAsia="Arial" w:cs="Arial"/>
-          <w:b w:val="0"/>
-          <w:caps w:val="0"/>
-          <w:color w:val="000000"/>
-          <w:sz w:val="20"/>
-        </w:rPr>
-        <w:t xml:space="preserve">Figura </w:t>
-      </w:r>
-      <w:r>
-        <w:rPr>
-          <w:rFonts w:ascii="Arial" w:hAnsi="Arial" w:eastAsia="Arial" w:cs="Arial"/>
-          <w:b w:val="0"/>
-          <w:caps w:val="0"/>
-          <w:color w:val="000000"/>
-          <w:sz w:val="20"/>
-        </w:rPr>
-        <w:fldChar w:fldCharType="begin"/>
-      </w:r>
-      <w:r>
-        <w:rPr>
-          <w:rFonts w:ascii="Arial" w:hAnsi="Arial" w:eastAsia="Arial" w:cs="Arial"/>
-          <w:b w:val="0"/>
-          <w:caps w:val="0"/>
-          <w:color w:val="000000"/>
-          <w:sz w:val="20"/>
-        </w:rPr>
-        <w:instrText xml:space="preserve"> SEQ Figura \* ARABIC </w:instrText>
-      </w:r>
-      <w:r>
-        <w:rPr>
-          <w:rFonts w:ascii="Arial" w:hAnsi="Arial" w:eastAsia="Arial" w:cs="Arial"/>
-          <w:b w:val="0"/>
-          <w:caps w:val="0"/>
-          <w:color w:val="000000"/>
-          <w:sz w:val="20"/>
-        </w:rPr>
-        <w:fldChar w:fldCharType="separate"/>
-      </w:r>
-      <w:r>
-        <w:rPr>
-          <w:rFonts w:ascii="Arial" w:hAnsi="Arial" w:eastAsia="Arial" w:cs="Arial"/>
-          <w:b w:val="0"/>
-          <w:caps w:val="0"/>
-          <w:color w:val="000000"/>
-          <w:sz w:val="20"/>
-        </w:rPr>
-        <w:t>6</w:t>
-      </w:r>
-      <w:r>
-        <w:rPr>
-          <w:rFonts w:ascii="Arial" w:hAnsi="Arial" w:eastAsia="Arial" w:cs="Arial"/>
-          <w:b w:val="0"/>
-          <w:caps w:val="0"/>
-          <w:color w:val="000000"/>
-          <w:sz w:val="20"/>
-        </w:rPr>
-        <w:fldChar w:fldCharType="end"/>
-      </w:r>
-      <w:r>
-        <w:rPr>
-          <w:rFonts w:ascii="Arial" w:hAnsi="Arial" w:eastAsia="Arial" w:cs="Arial"/>
-          <w:b w:val="0"/>
-          <w:caps w:val="0"/>
-          <w:color w:val="000000"/>
-          <w:sz w:val="20"/>
-        </w:rPr>
-        <w:t xml:space="preserve"> – </w:t>
-      </w:r>
-      <w:r>
-        <w:rPr>
-          <w:rFonts w:ascii="Arial" w:hAnsi="Arial" w:eastAsia="Arial" w:cs="Arial"/>
-          <w:b w:val="0"/>
-          <w:caps w:val="0"/>
-          <w:color w:val="000000"/>
-          <w:sz w:val="20"/>
-        </w:rPr>
-        <w:t>Delineamento experimental para comparação das arquiteturas.</w:t>
-      </w:r>
-      <w:bookmarkEnd w:id="3002"/>
-    </w:p>
-    <w:p>
       <w:pPr>
         <w:pStyle w:val="FigureSource"/>
         <w:ind w:firstLine="0"/>
@@ -9534,6 +9742,14 @@
     <w:p>
       <w:pPr>
         <w:pStyle w:val="ListBullet"/>
+        <w:keepNext w:val="0"/>
+        <w:keepLines/>
+        <w:numPr>
+          <w:ilvl w:val="0"/>
+          <w:numId w:val="15"/>
+        </w:numPr>
+        <w:spacing w:before="0" w:after="0" w:line="360" w:lineRule="auto"/>
+        <w:ind w:left="720" w:hanging="360" w:right="0"/>
       </w:pPr>
       <w:r>
         <w:rPr>
@@ -9547,6 +9763,14 @@
     <w:p>
       <w:pPr>
         <w:pStyle w:val="ListBullet"/>
+        <w:keepNext w:val="0"/>
+        <w:keepLines/>
+        <w:numPr>
+          <w:ilvl w:val="0"/>
+          <w:numId w:val="15"/>
+        </w:numPr>
+        <w:spacing w:before="0" w:after="0" w:line="360" w:lineRule="auto"/>
+        <w:ind w:left="720" w:hanging="360" w:right="0"/>
       </w:pPr>
       <w:r>
         <w:rPr>
@@ -9560,6 +9784,14 @@
     <w:p>
       <w:pPr>
         <w:pStyle w:val="ListBullet"/>
+        <w:keepNext w:val="0"/>
+        <w:keepLines/>
+        <w:numPr>
+          <w:ilvl w:val="0"/>
+          <w:numId w:val="15"/>
+        </w:numPr>
+        <w:spacing w:before="0" w:after="0" w:line="360" w:lineRule="auto"/>
+        <w:ind w:left="720" w:hanging="360" w:right="0"/>
       </w:pPr>
       <w:r>
         <w:rPr>
@@ -9573,6 +9805,14 @@
     <w:p>
       <w:pPr>
         <w:pStyle w:val="ListBullet"/>
+        <w:keepNext w:val="0"/>
+        <w:keepLines/>
+        <w:numPr>
+          <w:ilvl w:val="0"/>
+          <w:numId w:val="15"/>
+        </w:numPr>
+        <w:spacing w:before="0" w:after="0" w:line="360" w:lineRule="auto"/>
+        <w:ind w:left="720" w:hanging="360" w:right="0"/>
       </w:pPr>
       <w:r>
         <w:rPr>
@@ -9799,6 +10039,14 @@
     <w:p>
       <w:pPr>
         <w:pStyle w:val="ListBullet"/>
+        <w:keepNext w:val="0"/>
+        <w:keepLines/>
+        <w:numPr>
+          <w:ilvl w:val="0"/>
+          <w:numId w:val="15"/>
+        </w:numPr>
+        <w:spacing w:before="0" w:after="0" w:line="360" w:lineRule="auto"/>
+        <w:ind w:left="720" w:hanging="360" w:right="0"/>
       </w:pPr>
       <w:r>
         <w:rPr>
@@ -9812,6 +10060,14 @@
     <w:p>
       <w:pPr>
         <w:pStyle w:val="ListBullet"/>
+        <w:keepNext w:val="0"/>
+        <w:keepLines/>
+        <w:numPr>
+          <w:ilvl w:val="0"/>
+          <w:numId w:val="15"/>
+        </w:numPr>
+        <w:spacing w:before="0" w:after="0" w:line="360" w:lineRule="auto"/>
+        <w:ind w:left="720" w:hanging="360" w:right="0"/>
       </w:pPr>
       <w:r>
         <w:rPr>
@@ -9825,6 +10081,14 @@
     <w:p>
       <w:pPr>
         <w:pStyle w:val="ListBullet"/>
+        <w:keepNext w:val="0"/>
+        <w:keepLines/>
+        <w:numPr>
+          <w:ilvl w:val="0"/>
+          <w:numId w:val="15"/>
+        </w:numPr>
+        <w:spacing w:before="0" w:after="0" w:line="360" w:lineRule="auto"/>
+        <w:ind w:left="720" w:hanging="360" w:right="0"/>
       </w:pPr>
       <w:r>
         <w:rPr>
@@ -9976,6 +10240,14 @@
     <w:p>
       <w:pPr>
         <w:pStyle w:val="ListBullet"/>
+        <w:keepNext w:val="0"/>
+        <w:keepLines/>
+        <w:numPr>
+          <w:ilvl w:val="0"/>
+          <w:numId w:val="15"/>
+        </w:numPr>
+        <w:spacing w:before="0" w:after="0" w:line="360" w:lineRule="auto"/>
+        <w:ind w:left="720" w:hanging="360" w:right="0"/>
       </w:pPr>
       <w:r>
         <w:rPr>
@@ -9989,6 +10261,14 @@
     <w:p>
       <w:pPr>
         <w:pStyle w:val="ListBullet"/>
+        <w:keepNext w:val="0"/>
+        <w:keepLines/>
+        <w:numPr>
+          <w:ilvl w:val="0"/>
+          <w:numId w:val="15"/>
+        </w:numPr>
+        <w:spacing w:before="0" w:after="0" w:line="360" w:lineRule="auto"/>
+        <w:ind w:left="720" w:hanging="360" w:right="0"/>
       </w:pPr>
       <w:r>
         <w:rPr>
@@ -10020,6 +10300,14 @@
     <w:p>
       <w:pPr>
         <w:pStyle w:val="ListBullet"/>
+        <w:keepNext w:val="0"/>
+        <w:keepLines/>
+        <w:numPr>
+          <w:ilvl w:val="0"/>
+          <w:numId w:val="15"/>
+        </w:numPr>
+        <w:spacing w:before="0" w:after="0" w:line="360" w:lineRule="auto"/>
+        <w:ind w:left="720" w:hanging="360" w:right="0"/>
       </w:pPr>
       <w:r>
         <w:rPr>
@@ -10033,6 +10321,14 @@
     <w:p>
       <w:pPr>
         <w:pStyle w:val="ListBullet"/>
+        <w:keepNext w:val="0"/>
+        <w:keepLines/>
+        <w:numPr>
+          <w:ilvl w:val="0"/>
+          <w:numId w:val="15"/>
+        </w:numPr>
+        <w:spacing w:before="0" w:after="0" w:line="360" w:lineRule="auto"/>
+        <w:ind w:left="720" w:hanging="360" w:right="0"/>
       </w:pPr>
       <w:r>
         <w:rPr>
@@ -10046,6 +10342,14 @@
     <w:p>
       <w:pPr>
         <w:pStyle w:val="ListBullet"/>
+        <w:keepNext w:val="0"/>
+        <w:keepLines/>
+        <w:numPr>
+          <w:ilvl w:val="0"/>
+          <w:numId w:val="15"/>
+        </w:numPr>
+        <w:spacing w:before="0" w:after="0" w:line="360" w:lineRule="auto"/>
+        <w:ind w:left="720" w:hanging="360" w:right="0"/>
       </w:pPr>
       <w:r>
         <w:rPr>
@@ -10076,6 +10380,14 @@
     <w:p>
       <w:pPr>
         <w:pStyle w:val="ListBullet"/>
+        <w:keepNext w:val="0"/>
+        <w:keepLines/>
+        <w:numPr>
+          <w:ilvl w:val="0"/>
+          <w:numId w:val="15"/>
+        </w:numPr>
+        <w:spacing w:before="0" w:after="0" w:line="360" w:lineRule="auto"/>
+        <w:ind w:left="720" w:hanging="360" w:right="0"/>
       </w:pPr>
       <w:r>
         <w:rPr>
@@ -10369,6 +10681,96 @@
         </w:rPr>
         <w:t>Nos cenários sensíveis, a avaliação do farmacêutico será considerada a referência para determinar a adequação do encaminhamento profissional e a segurança clínica da resposta. O protocolo assume pelo menos um avaliador humano. Se apenas um farmacêutico participar, a impossibilidade de medir concordância entre avaliadores será registrada como limitação; caso um segundo avaliador seja confirmado antes do congelamento, seu papel e a análise de concordância serão pré-especificados em emenda ao protocolo.</w:t>
       </w:r>
+    </w:p>
+    <w:p>
+      <w:bookmarkStart w:id="3003" w:name="_TCC_F_IMG_C013"/>
+      <w:pPr>
+        <w:pStyle w:val="FigureCaption"/>
+        <w:keepNext/>
+        <w:ind w:firstLine="0"/>
+        <w:jc w:val="center"/>
+      </w:pPr>
+      <w:r>
+        <w:rPr>
+          <w:rFonts w:ascii="Arial" w:hAnsi="Arial" w:eastAsia="Arial" w:cs="Arial"/>
+          <w:b w:val="0"/>
+          <w:caps w:val="0"/>
+          <w:color w:val="000000"/>
+          <w:sz w:val="20"/>
+        </w:rPr>
+        <w:t xml:space="preserve">Figura </w:t>
+      </w:r>
+      <w:r>
+        <w:rPr>
+          <w:rFonts w:ascii="Arial" w:hAnsi="Arial" w:eastAsia="Arial" w:cs="Arial"/>
+          <w:b w:val="0"/>
+          <w:caps w:val="0"/>
+          <w:color w:val="000000"/>
+          <w:sz w:val="20"/>
+        </w:rPr>
+        <w:fldChar w:fldCharType="begin"/>
+      </w:r>
+      <w:r>
+        <w:rPr>
+          <w:rFonts w:ascii="Arial" w:hAnsi="Arial" w:eastAsia="Arial" w:cs="Arial"/>
+          <w:b w:val="0"/>
+          <w:caps w:val="0"/>
+          <w:color w:val="000000"/>
+          <w:sz w:val="20"/>
+        </w:rPr>
+        <w:instrText xml:space="preserve"> SEQ Figura \* ARABIC </w:instrText>
+      </w:r>
+      <w:r>
+        <w:rPr>
+          <w:rFonts w:ascii="Arial" w:hAnsi="Arial" w:eastAsia="Arial" w:cs="Arial"/>
+          <w:b w:val="0"/>
+          <w:caps w:val="0"/>
+          <w:color w:val="000000"/>
+          <w:sz w:val="20"/>
+        </w:rPr>
+        <w:fldChar w:fldCharType="separate"/>
+      </w:r>
+      <w:r>
+        <w:rPr>
+          <w:rFonts w:ascii="Arial" w:hAnsi="Arial" w:eastAsia="Arial" w:cs="Arial"/>
+          <w:b w:val="0"/>
+          <w:caps w:val="0"/>
+          <w:color w:val="000000"/>
+          <w:sz w:val="20"/>
+        </w:rPr>
+        <w:t>7</w:t>
+      </w:r>
+      <w:r>
+        <w:rPr>
+          <w:rFonts w:ascii="Arial" w:hAnsi="Arial" w:eastAsia="Arial" w:cs="Arial"/>
+          <w:b w:val="0"/>
+          <w:caps w:val="0"/>
+          <w:color w:val="000000"/>
+          <w:sz w:val="20"/>
+        </w:rPr>
+        <w:fldChar w:fldCharType="end"/>
+      </w:r>
+      <w:r>
+        <w:rPr>
+          <w:rFonts w:ascii="Arial" w:hAnsi="Arial" w:eastAsia="Arial" w:cs="Arial"/>
+          <w:b w:val="0"/>
+          <w:caps w:val="0"/>
+          <w:color w:val="000000"/>
+          <w:sz w:val="20"/>
+        </w:rPr>
+        <w:t xml:space="preserve"> – </w:t>
+      </w:r>
+      <w:r>
+        <w:rPr>
+          <w:rFonts w:ascii="Arial" w:hAnsi="Arial" w:eastAsia="Arial" w:cs="Arial"/>
+          <w:b w:val="0"/>
+          <w:caps w:val="0"/>
+          <w:color w:val="000000"/>
+          <w:sz w:val="20"/>
+        </w:rPr>
+        <w:t>Processo de avaliação híbrida das respostas.</w:t>
+      </w:r>
+      <w:bookmarkEnd w:id="3003"/>
     </w:p>
     <w:p>
       <w:pPr>
@@ -10424,96 +10826,6 @@
       </w:r>
     </w:p>
     <w:p>
-      <w:bookmarkStart w:id="3003" w:name="_TCC_F_IMG_C013"/>
-      <w:pPr>
-        <w:pStyle w:val="FigureCaption"/>
-        <w:keepNext/>
-        <w:ind w:firstLine="0"/>
-        <w:jc w:val="center"/>
-      </w:pPr>
-      <w:r>
-        <w:rPr>
-          <w:rFonts w:ascii="Arial" w:hAnsi="Arial" w:eastAsia="Arial" w:cs="Arial"/>
-          <w:b w:val="0"/>
-          <w:caps w:val="0"/>
-          <w:color w:val="000000"/>
-          <w:sz w:val="20"/>
-        </w:rPr>
-        <w:t xml:space="preserve">Figura </w:t>
-      </w:r>
-      <w:r>
-        <w:rPr>
-          <w:rFonts w:ascii="Arial" w:hAnsi="Arial" w:eastAsia="Arial" w:cs="Arial"/>
-          <w:b w:val="0"/>
-          <w:caps w:val="0"/>
-          <w:color w:val="000000"/>
-          <w:sz w:val="20"/>
-        </w:rPr>
-        <w:fldChar w:fldCharType="begin"/>
-      </w:r>
-      <w:r>
-        <w:rPr>
-          <w:rFonts w:ascii="Arial" w:hAnsi="Arial" w:eastAsia="Arial" w:cs="Arial"/>
-          <w:b w:val="0"/>
-          <w:caps w:val="0"/>
-          <w:color w:val="000000"/>
-          <w:sz w:val="20"/>
-        </w:rPr>
-        <w:instrText xml:space="preserve"> SEQ Figura \* ARABIC </w:instrText>
-      </w:r>
-      <w:r>
-        <w:rPr>
-          <w:rFonts w:ascii="Arial" w:hAnsi="Arial" w:eastAsia="Arial" w:cs="Arial"/>
-          <w:b w:val="0"/>
-          <w:caps w:val="0"/>
-          <w:color w:val="000000"/>
-          <w:sz w:val="20"/>
-        </w:rPr>
-        <w:fldChar w:fldCharType="separate"/>
-      </w:r>
-      <w:r>
-        <w:rPr>
-          <w:rFonts w:ascii="Arial" w:hAnsi="Arial" w:eastAsia="Arial" w:cs="Arial"/>
-          <w:b w:val="0"/>
-          <w:caps w:val="0"/>
-          <w:color w:val="000000"/>
-          <w:sz w:val="20"/>
-        </w:rPr>
-        <w:t>7</w:t>
-      </w:r>
-      <w:r>
-        <w:rPr>
-          <w:rFonts w:ascii="Arial" w:hAnsi="Arial" w:eastAsia="Arial" w:cs="Arial"/>
-          <w:b w:val="0"/>
-          <w:caps w:val="0"/>
-          <w:color w:val="000000"/>
-          <w:sz w:val="20"/>
-        </w:rPr>
-        <w:fldChar w:fldCharType="end"/>
-      </w:r>
-      <w:r>
-        <w:rPr>
-          <w:rFonts w:ascii="Arial" w:hAnsi="Arial" w:eastAsia="Arial" w:cs="Arial"/>
-          <w:b w:val="0"/>
-          <w:caps w:val="0"/>
-          <w:color w:val="000000"/>
-          <w:sz w:val="20"/>
-        </w:rPr>
-        <w:t xml:space="preserve"> – </w:t>
-      </w:r>
-      <w:r>
-        <w:rPr>
-          <w:rFonts w:ascii="Arial" w:hAnsi="Arial" w:eastAsia="Arial" w:cs="Arial"/>
-          <w:b w:val="0"/>
-          <w:caps w:val="0"/>
-          <w:color w:val="000000"/>
-          <w:sz w:val="20"/>
-        </w:rPr>
-        <w:t>Processo de avaliação híbrida das respostas.</w:t>
-      </w:r>
-      <w:bookmarkEnd w:id="3003"/>
-    </w:p>
-    <w:p>
       <w:pPr>
         <w:pStyle w:val="FigureSource"/>
         <w:ind w:firstLine="0"/>
@@ -10829,6 +11141,14 @@
     <w:p>
       <w:pPr>
         <w:pStyle w:val="ListBullet"/>
+        <w:keepNext w:val="0"/>
+        <w:keepLines/>
+        <w:numPr>
+          <w:ilvl w:val="0"/>
+          <w:numId w:val="15"/>
+        </w:numPr>
+        <w:spacing w:before="0" w:after="0" w:line="360" w:lineRule="auto"/>
+        <w:ind w:left="720" w:hanging="360" w:right="0"/>
       </w:pPr>
       <w:r>
         <w:rPr>
@@ -10842,6 +11162,14 @@
     <w:p>
       <w:pPr>
         <w:pStyle w:val="ListBullet"/>
+        <w:keepNext w:val="0"/>
+        <w:keepLines/>
+        <w:numPr>
+          <w:ilvl w:val="0"/>
+          <w:numId w:val="15"/>
+        </w:numPr>
+        <w:spacing w:before="0" w:after="0" w:line="360" w:lineRule="auto"/>
+        <w:ind w:left="720" w:hanging="360" w:right="0"/>
       </w:pPr>
       <w:r>
         <w:rPr>
@@ -10855,6 +11183,14 @@
     <w:p>
       <w:pPr>
         <w:pStyle w:val="ListBullet"/>
+        <w:keepNext w:val="0"/>
+        <w:keepLines/>
+        <w:numPr>
+          <w:ilvl w:val="0"/>
+          <w:numId w:val="15"/>
+        </w:numPr>
+        <w:spacing w:before="0" w:after="0" w:line="360" w:lineRule="auto"/>
+        <w:ind w:left="720" w:hanging="360" w:right="0"/>
       </w:pPr>
       <w:r>
         <w:rPr>
@@ -10868,6 +11204,14 @@
     <w:p>
       <w:pPr>
         <w:pStyle w:val="ListBullet"/>
+        <w:keepNext w:val="0"/>
+        <w:keepLines/>
+        <w:numPr>
+          <w:ilvl w:val="0"/>
+          <w:numId w:val="15"/>
+        </w:numPr>
+        <w:spacing w:before="0" w:after="0" w:line="360" w:lineRule="auto"/>
+        <w:ind w:left="720" w:hanging="360" w:right="0"/>
       </w:pPr>
       <w:r>
         <w:rPr>
@@ -10881,6 +11225,14 @@
     <w:p>
       <w:pPr>
         <w:pStyle w:val="ListBullet"/>
+        <w:keepNext w:val="0"/>
+        <w:keepLines/>
+        <w:numPr>
+          <w:ilvl w:val="0"/>
+          <w:numId w:val="15"/>
+        </w:numPr>
+        <w:spacing w:before="0" w:after="0" w:line="360" w:lineRule="auto"/>
+        <w:ind w:left="720" w:hanging="360" w:right="0"/>
       </w:pPr>
       <w:r>
         <w:rPr>
@@ -10903,6 +11255,14 @@
     <w:p>
       <w:pPr>
         <w:pStyle w:val="ListBullet"/>
+        <w:keepNext w:val="0"/>
+        <w:keepLines/>
+        <w:numPr>
+          <w:ilvl w:val="0"/>
+          <w:numId w:val="15"/>
+        </w:numPr>
+        <w:spacing w:before="0" w:after="0" w:line="360" w:lineRule="auto"/>
+        <w:ind w:left="720" w:hanging="360" w:right="0"/>
       </w:pPr>
       <w:r>
         <w:rPr>
@@ -10916,6 +11276,14 @@
     <w:p>
       <w:pPr>
         <w:pStyle w:val="ListBullet"/>
+        <w:keepNext w:val="0"/>
+        <w:keepLines/>
+        <w:numPr>
+          <w:ilvl w:val="0"/>
+          <w:numId w:val="15"/>
+        </w:numPr>
+        <w:spacing w:before="0" w:after="0" w:line="360" w:lineRule="auto"/>
+        <w:ind w:left="720" w:hanging="360" w:right="0"/>
       </w:pPr>
       <w:r>
         <w:rPr>
@@ -10929,6 +11297,14 @@
     <w:p>
       <w:pPr>
         <w:pStyle w:val="ListBullet"/>
+        <w:keepNext w:val="0"/>
+        <w:keepLines/>
+        <w:numPr>
+          <w:ilvl w:val="0"/>
+          <w:numId w:val="15"/>
+        </w:numPr>
+        <w:spacing w:before="0" w:after="0" w:line="360" w:lineRule="auto"/>
+        <w:ind w:left="720" w:hanging="360" w:right="0"/>
       </w:pPr>
       <w:r>
         <w:rPr>
@@ -10942,6 +11318,14 @@
     <w:p>
       <w:pPr>
         <w:pStyle w:val="ListBullet"/>
+        <w:keepNext w:val="0"/>
+        <w:keepLines/>
+        <w:numPr>
+          <w:ilvl w:val="0"/>
+          <w:numId w:val="15"/>
+        </w:numPr>
+        <w:spacing w:before="0" w:after="0" w:line="360" w:lineRule="auto"/>
+        <w:ind w:left="720" w:hanging="360" w:right="0"/>
       </w:pPr>
       <w:r>
         <w:rPr>
@@ -10973,6 +11357,14 @@
     <w:p>
       <w:pPr>
         <w:pStyle w:val="ListBullet"/>
+        <w:keepNext w:val="0"/>
+        <w:keepLines/>
+        <w:numPr>
+          <w:ilvl w:val="0"/>
+          <w:numId w:val="15"/>
+        </w:numPr>
+        <w:spacing w:before="0" w:after="0" w:line="360" w:lineRule="auto"/>
+        <w:ind w:left="720" w:hanging="360" w:right="0"/>
       </w:pPr>
       <w:r>
         <w:rPr>
@@ -10986,6 +11378,14 @@
     <w:p>
       <w:pPr>
         <w:pStyle w:val="ListBullet"/>
+        <w:keepNext w:val="0"/>
+        <w:keepLines/>
+        <w:numPr>
+          <w:ilvl w:val="0"/>
+          <w:numId w:val="15"/>
+        </w:numPr>
+        <w:spacing w:before="0" w:after="0" w:line="360" w:lineRule="auto"/>
+        <w:ind w:left="720" w:hanging="360" w:right="0"/>
       </w:pPr>
       <w:r>
         <w:rPr>
@@ -10999,6 +11399,14 @@
     <w:p>
       <w:pPr>
         <w:pStyle w:val="ListBullet"/>
+        <w:keepNext w:val="0"/>
+        <w:keepLines/>
+        <w:numPr>
+          <w:ilvl w:val="0"/>
+          <w:numId w:val="15"/>
+        </w:numPr>
+        <w:spacing w:before="0" w:after="0" w:line="360" w:lineRule="auto"/>
+        <w:ind w:left="720" w:hanging="360" w:right="0"/>
       </w:pPr>
       <w:r>
         <w:rPr>
@@ -11338,6 +11746,96 @@
         </w:rPr>
         <w:t>A figura seguinte sintetiza as relações entre os serviços. As três arquiteturas são alternativas de execução selecionadas para cada solicitação; os ramos não indicam processamento simultâneo.</w:t>
       </w:r>
+    </w:p>
+    <w:p>
+      <w:bookmarkStart w:id="5003" w:name="_TCC_F_IMG_C024"/>
+      <w:pPr>
+        <w:pStyle w:val="FigureCaption"/>
+        <w:keepNext/>
+        <w:ind w:firstLine="0"/>
+        <w:jc w:val="center"/>
+      </w:pPr>
+      <w:r>
+        <w:rPr>
+          <w:rFonts w:ascii="Arial" w:hAnsi="Arial" w:eastAsia="Arial" w:cs="Arial"/>
+          <w:b w:val="0"/>
+          <w:caps w:val="0"/>
+          <w:color w:val="000000"/>
+          <w:sz w:val="20"/>
+        </w:rPr>
+        <w:t xml:space="preserve">Figura </w:t>
+      </w:r>
+      <w:r>
+        <w:rPr>
+          <w:rFonts w:ascii="Arial" w:hAnsi="Arial" w:eastAsia="Arial" w:cs="Arial"/>
+          <w:b w:val="0"/>
+          <w:caps w:val="0"/>
+          <w:color w:val="000000"/>
+          <w:sz w:val="20"/>
+        </w:rPr>
+        <w:fldChar w:fldCharType="begin"/>
+      </w:r>
+      <w:r>
+        <w:rPr>
+          <w:rFonts w:ascii="Arial" w:hAnsi="Arial" w:eastAsia="Arial" w:cs="Arial"/>
+          <w:b w:val="0"/>
+          <w:caps w:val="0"/>
+          <w:color w:val="000000"/>
+          <w:sz w:val="20"/>
+        </w:rPr>
+        <w:instrText xml:space="preserve"> SEQ Figura \* ARABIC </w:instrText>
+      </w:r>
+      <w:r>
+        <w:rPr>
+          <w:rFonts w:ascii="Arial" w:hAnsi="Arial" w:eastAsia="Arial" w:cs="Arial"/>
+          <w:b w:val="0"/>
+          <w:caps w:val="0"/>
+          <w:color w:val="000000"/>
+          <w:sz w:val="20"/>
+        </w:rPr>
+        <w:fldChar w:fldCharType="separate"/>
+      </w:r>
+      <w:r>
+        <w:rPr>
+          <w:rFonts w:ascii="Arial" w:hAnsi="Arial" w:eastAsia="Arial" w:cs="Arial"/>
+          <w:b w:val="0"/>
+          <w:caps w:val="0"/>
+          <w:color w:val="000000"/>
+          <w:sz w:val="20"/>
+        </w:rPr>
+        <w:t>8</w:t>
+      </w:r>
+      <w:r>
+        <w:rPr>
+          <w:rFonts w:ascii="Arial" w:hAnsi="Arial" w:eastAsia="Arial" w:cs="Arial"/>
+          <w:b w:val="0"/>
+          <w:caps w:val="0"/>
+          <w:color w:val="000000"/>
+          <w:sz w:val="20"/>
+        </w:rPr>
+        <w:fldChar w:fldCharType="end"/>
+      </w:r>
+      <w:r>
+        <w:rPr>
+          <w:rFonts w:ascii="Arial" w:hAnsi="Arial" w:eastAsia="Arial" w:cs="Arial"/>
+          <w:b w:val="0"/>
+          <w:caps w:val="0"/>
+          <w:color w:val="000000"/>
+          <w:sz w:val="20"/>
+        </w:rPr>
+        <w:t xml:space="preserve"> – </w:t>
+      </w:r>
+      <w:r>
+        <w:rPr>
+          <w:rFonts w:ascii="Arial" w:hAnsi="Arial" w:eastAsia="Arial" w:cs="Arial"/>
+          <w:b w:val="0"/>
+          <w:caps w:val="0"/>
+          <w:color w:val="000000"/>
+          <w:sz w:val="20"/>
+        </w:rPr>
+        <w:t>Organização dos serviços do MAB.</w:t>
+      </w:r>
+      <w:bookmarkEnd w:id="5003"/>
     </w:p>
     <w:p>
       <w:pPr>
@@ -11393,96 +11891,6 @@
       </w:r>
     </w:p>
     <w:p>
-      <w:bookmarkStart w:id="5003" w:name="_TCC_F_IMG_C024"/>
-      <w:pPr>
-        <w:pStyle w:val="FigureCaption"/>
-        <w:keepNext/>
-        <w:ind w:firstLine="0"/>
-        <w:jc w:val="center"/>
-      </w:pPr>
-      <w:r>
-        <w:rPr>
-          <w:rFonts w:ascii="Arial" w:hAnsi="Arial" w:eastAsia="Arial" w:cs="Arial"/>
-          <w:b w:val="0"/>
-          <w:caps w:val="0"/>
-          <w:color w:val="000000"/>
-          <w:sz w:val="20"/>
-        </w:rPr>
-        <w:t xml:space="preserve">Figura </w:t>
-      </w:r>
-      <w:r>
-        <w:rPr>
-          <w:rFonts w:ascii="Arial" w:hAnsi="Arial" w:eastAsia="Arial" w:cs="Arial"/>
-          <w:b w:val="0"/>
-          <w:caps w:val="0"/>
-          <w:color w:val="000000"/>
-          <w:sz w:val="20"/>
-        </w:rPr>
-        <w:fldChar w:fldCharType="begin"/>
-      </w:r>
-      <w:r>
-        <w:rPr>
-          <w:rFonts w:ascii="Arial" w:hAnsi="Arial" w:eastAsia="Arial" w:cs="Arial"/>
-          <w:b w:val="0"/>
-          <w:caps w:val="0"/>
-          <w:color w:val="000000"/>
-          <w:sz w:val="20"/>
-        </w:rPr>
-        <w:instrText xml:space="preserve"> SEQ Figura \* ARABIC </w:instrText>
-      </w:r>
-      <w:r>
-        <w:rPr>
-          <w:rFonts w:ascii="Arial" w:hAnsi="Arial" w:eastAsia="Arial" w:cs="Arial"/>
-          <w:b w:val="0"/>
-          <w:caps w:val="0"/>
-          <w:color w:val="000000"/>
-          <w:sz w:val="20"/>
-        </w:rPr>
-        <w:fldChar w:fldCharType="separate"/>
-      </w:r>
-      <w:r>
-        <w:rPr>
-          <w:rFonts w:ascii="Arial" w:hAnsi="Arial" w:eastAsia="Arial" w:cs="Arial"/>
-          <w:b w:val="0"/>
-          <w:caps w:val="0"/>
-          <w:color w:val="000000"/>
-          <w:sz w:val="20"/>
-        </w:rPr>
-        <w:t>8</w:t>
-      </w:r>
-      <w:r>
-        <w:rPr>
-          <w:rFonts w:ascii="Arial" w:hAnsi="Arial" w:eastAsia="Arial" w:cs="Arial"/>
-          <w:b w:val="0"/>
-          <w:caps w:val="0"/>
-          <w:color w:val="000000"/>
-          <w:sz w:val="20"/>
-        </w:rPr>
-        <w:fldChar w:fldCharType="end"/>
-      </w:r>
-      <w:r>
-        <w:rPr>
-          <w:rFonts w:ascii="Arial" w:hAnsi="Arial" w:eastAsia="Arial" w:cs="Arial"/>
-          <w:b w:val="0"/>
-          <w:caps w:val="0"/>
-          <w:color w:val="000000"/>
-          <w:sz w:val="20"/>
-        </w:rPr>
-        <w:t xml:space="preserve"> – </w:t>
-      </w:r>
-      <w:r>
-        <w:rPr>
-          <w:rFonts w:ascii="Arial" w:hAnsi="Arial" w:eastAsia="Arial" w:cs="Arial"/>
-          <w:b w:val="0"/>
-          <w:caps w:val="0"/>
-          <w:color w:val="000000"/>
-          <w:sz w:val="20"/>
-        </w:rPr>
-        <w:t>Organização dos serviços do MAB.</w:t>
-      </w:r>
-      <w:bookmarkEnd w:id="5003"/>
-    </w:p>
-    <w:p>
       <w:pPr>
         <w:pStyle w:val="FigureSource"/>
         <w:ind w:firstLine="0"/>
@@ -12594,6 +13002,96 @@
         </w:rPr>
         <w:t>A figura seguinte distingue a base funcional comum das configurações de coordenação. Modelo, cenários e critérios de avaliação são controles previstos no protocolo. A distribuição de funções e o número de agentes também diferem entre as configurações, o que limita a atribuição de diferenças exclusivamente à topologia.</w:t>
       </w:r>
+    </w:p>
+    <w:p>
+      <w:bookmarkStart w:id="5004" w:name="_TCC_F_IMG_C026"/>
+      <w:pPr>
+        <w:pStyle w:val="FigureCaption"/>
+        <w:keepNext/>
+        <w:ind w:firstLine="0"/>
+        <w:jc w:val="center"/>
+      </w:pPr>
+      <w:r>
+        <w:rPr>
+          <w:rFonts w:ascii="Arial" w:hAnsi="Arial" w:eastAsia="Arial" w:cs="Arial"/>
+          <w:b w:val="0"/>
+          <w:caps w:val="0"/>
+          <w:color w:val="000000"/>
+          <w:sz w:val="20"/>
+        </w:rPr>
+        <w:t xml:space="preserve">Figura </w:t>
+      </w:r>
+      <w:r>
+        <w:rPr>
+          <w:rFonts w:ascii="Arial" w:hAnsi="Arial" w:eastAsia="Arial" w:cs="Arial"/>
+          <w:b w:val="0"/>
+          <w:caps w:val="0"/>
+          <w:color w:val="000000"/>
+          <w:sz w:val="20"/>
+        </w:rPr>
+        <w:fldChar w:fldCharType="begin"/>
+      </w:r>
+      <w:r>
+        <w:rPr>
+          <w:rFonts w:ascii="Arial" w:hAnsi="Arial" w:eastAsia="Arial" w:cs="Arial"/>
+          <w:b w:val="0"/>
+          <w:caps w:val="0"/>
+          <w:color w:val="000000"/>
+          <w:sz w:val="20"/>
+        </w:rPr>
+        <w:instrText xml:space="preserve"> SEQ Figura \* ARABIC </w:instrText>
+      </w:r>
+      <w:r>
+        <w:rPr>
+          <w:rFonts w:ascii="Arial" w:hAnsi="Arial" w:eastAsia="Arial" w:cs="Arial"/>
+          <w:b w:val="0"/>
+          <w:caps w:val="0"/>
+          <w:color w:val="000000"/>
+          <w:sz w:val="20"/>
+        </w:rPr>
+        <w:fldChar w:fldCharType="separate"/>
+      </w:r>
+      <w:r>
+        <w:rPr>
+          <w:rFonts w:ascii="Arial" w:hAnsi="Arial" w:eastAsia="Arial" w:cs="Arial"/>
+          <w:b w:val="0"/>
+          <w:caps w:val="0"/>
+          <w:color w:val="000000"/>
+          <w:sz w:val="20"/>
+        </w:rPr>
+        <w:t>9</w:t>
+      </w:r>
+      <w:r>
+        <w:rPr>
+          <w:rFonts w:ascii="Arial" w:hAnsi="Arial" w:eastAsia="Arial" w:cs="Arial"/>
+          <w:b w:val="0"/>
+          <w:caps w:val="0"/>
+          <w:color w:val="000000"/>
+          <w:sz w:val="20"/>
+        </w:rPr>
+        <w:fldChar w:fldCharType="end"/>
+      </w:r>
+      <w:r>
+        <w:rPr>
+          <w:rFonts w:ascii="Arial" w:hAnsi="Arial" w:eastAsia="Arial" w:cs="Arial"/>
+          <w:b w:val="0"/>
+          <w:caps w:val="0"/>
+          <w:color w:val="000000"/>
+          <w:sz w:val="20"/>
+        </w:rPr>
+        <w:t xml:space="preserve"> – </w:t>
+      </w:r>
+      <w:r>
+        <w:rPr>
+          <w:rFonts w:ascii="Arial" w:hAnsi="Arial" w:eastAsia="Arial" w:cs="Arial"/>
+          <w:b w:val="0"/>
+          <w:caps w:val="0"/>
+          <w:color w:val="000000"/>
+          <w:sz w:val="20"/>
+        </w:rPr>
+        <w:t>Base funcional e configurações comparadas no MAB.</w:t>
+      </w:r>
+      <w:bookmarkEnd w:id="5004"/>
     </w:p>
     <w:p>
       <w:pPr>
@@ -12647,96 +13145,6 @@
           </wp:inline>
         </w:drawing>
       </w:r>
-    </w:p>
-    <w:p>
-      <w:bookmarkStart w:id="5004" w:name="_TCC_F_IMG_C026"/>
-      <w:pPr>
-        <w:pStyle w:val="FigureCaption"/>
-        <w:keepNext/>
-        <w:ind w:firstLine="0"/>
-        <w:jc w:val="center"/>
-      </w:pPr>
-      <w:r>
-        <w:rPr>
-          <w:rFonts w:ascii="Arial" w:hAnsi="Arial" w:eastAsia="Arial" w:cs="Arial"/>
-          <w:b w:val="0"/>
-          <w:caps w:val="0"/>
-          <w:color w:val="000000"/>
-          <w:sz w:val="20"/>
-        </w:rPr>
-        <w:t xml:space="preserve">Figura </w:t>
-      </w:r>
-      <w:r>
-        <w:rPr>
-          <w:rFonts w:ascii="Arial" w:hAnsi="Arial" w:eastAsia="Arial" w:cs="Arial"/>
-          <w:b w:val="0"/>
-          <w:caps w:val="0"/>
-          <w:color w:val="000000"/>
-          <w:sz w:val="20"/>
-        </w:rPr>
-        <w:fldChar w:fldCharType="begin"/>
-      </w:r>
-      <w:r>
-        <w:rPr>
-          <w:rFonts w:ascii="Arial" w:hAnsi="Arial" w:eastAsia="Arial" w:cs="Arial"/>
-          <w:b w:val="0"/>
-          <w:caps w:val="0"/>
-          <w:color w:val="000000"/>
-          <w:sz w:val="20"/>
-        </w:rPr>
-        <w:instrText xml:space="preserve"> SEQ Figura \* ARABIC </w:instrText>
-      </w:r>
-      <w:r>
-        <w:rPr>
-          <w:rFonts w:ascii="Arial" w:hAnsi="Arial" w:eastAsia="Arial" w:cs="Arial"/>
-          <w:b w:val="0"/>
-          <w:caps w:val="0"/>
-          <w:color w:val="000000"/>
-          <w:sz w:val="20"/>
-        </w:rPr>
-        <w:fldChar w:fldCharType="separate"/>
-      </w:r>
-      <w:r>
-        <w:rPr>
-          <w:rFonts w:ascii="Arial" w:hAnsi="Arial" w:eastAsia="Arial" w:cs="Arial"/>
-          <w:b w:val="0"/>
-          <w:caps w:val="0"/>
-          <w:color w:val="000000"/>
-          <w:sz w:val="20"/>
-        </w:rPr>
-        <w:t>9</w:t>
-      </w:r>
-      <w:r>
-        <w:rPr>
-          <w:rFonts w:ascii="Arial" w:hAnsi="Arial" w:eastAsia="Arial" w:cs="Arial"/>
-          <w:b w:val="0"/>
-          <w:caps w:val="0"/>
-          <w:color w:val="000000"/>
-          <w:sz w:val="20"/>
-        </w:rPr>
-        <w:fldChar w:fldCharType="end"/>
-      </w:r>
-      <w:r>
-        <w:rPr>
-          <w:rFonts w:ascii="Arial" w:hAnsi="Arial" w:eastAsia="Arial" w:cs="Arial"/>
-          <w:b w:val="0"/>
-          <w:caps w:val="0"/>
-          <w:color w:val="000000"/>
-          <w:sz w:val="20"/>
-        </w:rPr>
-        <w:t xml:space="preserve"> – </w:t>
-      </w:r>
-      <w:r>
-        <w:rPr>
-          <w:rFonts w:ascii="Arial" w:hAnsi="Arial" w:eastAsia="Arial" w:cs="Arial"/>
-          <w:b w:val="0"/>
-          <w:caps w:val="0"/>
-          <w:color w:val="000000"/>
-          <w:sz w:val="20"/>
-        </w:rPr>
-        <w:t>Base funcional e configurações comparadas no MAB.</w:t>
-      </w:r>
-      <w:bookmarkEnd w:id="5004"/>
     </w:p>
     <w:p>
       <w:pPr>
@@ -15206,6 +15614,27 @@
 
 <file path=word/numbering.xml><?xml version="1.0" encoding="utf-8"?>
 <w:numbering xmlns:wpc="http://schemas.microsoft.com/office/word/2010/wordprocessingCanvas" xmlns:mo="http://schemas.microsoft.com/office/mac/office/2008/main" xmlns:mc="http://schemas.openxmlformats.org/markup-compatibility/2006" xmlns:mv="urn:schemas-microsoft-com:mac:vml" xmlns:o="urn:schemas-microsoft-com:office:office" xmlns:r="http://schemas.openxmlformats.org/officeDocument/2006/relationships" xmlns:m="http://schemas.openxmlformats.org/officeDocument/2006/math" xmlns:v="urn:schemas-microsoft-com:vml" xmlns:wp14="http://schemas.microsoft.com/office/word/2010/wordprocessingDrawing" xmlns:wp="http://schemas.openxmlformats.org/drawingml/2006/wordprocessingDrawing" xmlns:w10="urn:schemas-microsoft-com:office:word" xmlns:w="http://schemas.openxmlformats.org/wordprocessingml/2006/main" xmlns:w14="http://schemas.microsoft.com/office/word/2010/wordml" xmlns:wpg="http://schemas.microsoft.com/office/word/2010/wordprocessingGroup" xmlns:wpi="http://schemas.microsoft.com/office/word/2010/wordprocessingInk" xmlns:wne="http://schemas.microsoft.com/office/word/2006/wordml" xmlns:wps="http://schemas.microsoft.com/office/word/2010/wordprocessingShape" mc:Ignorable="w14 wp14">
+  <w:abstractNum w:abstractNumId="14">
+    <w:multiLevelType w:val="singleLevel"/>
+    <w:lvl w:ilvl="0">
+      <w:start w:val="1"/>
+      <w:numFmt w:val="bullet"/>
+      <w:lvlText w:val="•"/>
+      <w:lvlJc w:val="left"/>
+      <w:pPr>
+        <w:tabs>
+          <w:tab w:val="num" w:pos="720"/>
+        </w:tabs>
+        <w:ind w:left="720" w:hanging="360"/>
+      </w:pPr>
+      <w:rPr>
+        <w:rFonts w:ascii="Arial" w:hAnsi="Arial" w:eastAsia="Arial" w:cs="Arial"/>
+        <w:sz w:val="24"/>
+        <w:szCs w:val="24"/>
+        <w:color w:val="000000"/>
+      </w:rPr>
+    </w:lvl>
+  </w:abstractNum>
   <w:abstractNum w:abstractNumId="0">
     <w:nsid w:val="FFFFFF7C"/>
     <w:multiLevelType w:val="singleLevel"/>
@@ -15641,6 +16070,9 @@
   </w:abstractNum>
   <w:num w:numId="14">
     <w:abstractNumId w:val="13"/>
+  </w:num>
+  <w:num w:numId="15">
+    <w:abstractNumId w:val="14"/>
   </w:num>
 </w:numbering>
 </file>

</xml_diff>

<commit_message>
docs(tcc): increase body list indentation and verify figure captions
</commit_message>
<xml_diff>
--- a/TCC/TCC_MAB_Facens_Ralph_10x.docx
+++ b/TCC/TCC_MAB_Facens_Ralph_10x.docx
@@ -8117,8 +8117,11 @@
           <w:ilvl w:val="0"/>
           <w:numId w:val="15"/>
         </w:numPr>
+        <w:tabs>
+          <w:tab w:pos="1080" w:val="left"/>
+        </w:tabs>
         <w:spacing w:before="0" w:after="0" w:line="360" w:lineRule="auto"/>
-        <w:ind w:left="720" w:hanging="360" w:right="0"/>
+        <w:ind w:left="1080" w:right="0" w:hanging="360"/>
       </w:pPr>
       <w:r>
         <w:rPr>
@@ -8138,8 +8141,11 @@
           <w:ilvl w:val="0"/>
           <w:numId w:val="15"/>
         </w:numPr>
+        <w:tabs>
+          <w:tab w:pos="1080" w:val="left"/>
+        </w:tabs>
         <w:spacing w:before="0" w:after="0" w:line="360" w:lineRule="auto"/>
-        <w:ind w:left="720" w:hanging="360" w:right="0"/>
+        <w:ind w:left="1080" w:right="0" w:hanging="360"/>
       </w:pPr>
       <w:r>
         <w:rPr>
@@ -8169,8 +8175,11 @@
           <w:ilvl w:val="0"/>
           <w:numId w:val="15"/>
         </w:numPr>
+        <w:tabs>
+          <w:tab w:pos="1080" w:val="left"/>
+        </w:tabs>
         <w:spacing w:before="0" w:after="0" w:line="360" w:lineRule="auto"/>
-        <w:ind w:left="720" w:hanging="360" w:right="0"/>
+        <w:ind w:left="1080" w:right="0" w:hanging="360"/>
       </w:pPr>
       <w:r>
         <w:rPr>
@@ -8328,8 +8337,11 @@
           <w:ilvl w:val="0"/>
           <w:numId w:val="15"/>
         </w:numPr>
+        <w:tabs>
+          <w:tab w:pos="1080" w:val="left"/>
+        </w:tabs>
         <w:spacing w:before="0" w:after="0" w:line="360" w:lineRule="auto"/>
-        <w:ind w:left="720" w:hanging="360" w:right="0"/>
+        <w:ind w:left="1080" w:right="0" w:hanging="360"/>
       </w:pPr>
       <w:r>
         <w:rPr>
@@ -8349,8 +8361,11 @@
           <w:ilvl w:val="0"/>
           <w:numId w:val="15"/>
         </w:numPr>
+        <w:tabs>
+          <w:tab w:pos="1080" w:val="left"/>
+        </w:tabs>
         <w:spacing w:before="0" w:after="0" w:line="360" w:lineRule="auto"/>
-        <w:ind w:left="720" w:hanging="360" w:right="0"/>
+        <w:ind w:left="1080" w:right="0" w:hanging="360"/>
       </w:pPr>
       <w:r>
         <w:rPr>
@@ -8370,8 +8385,11 @@
           <w:ilvl w:val="0"/>
           <w:numId w:val="15"/>
         </w:numPr>
+        <w:tabs>
+          <w:tab w:pos="1080" w:val="left"/>
+        </w:tabs>
         <w:spacing w:before="0" w:after="0" w:line="360" w:lineRule="auto"/>
-        <w:ind w:left="720" w:hanging="360" w:right="0"/>
+        <w:ind w:left="1080" w:right="0" w:hanging="360"/>
       </w:pPr>
       <w:r>
         <w:rPr>
@@ -8391,8 +8409,11 @@
           <w:ilvl w:val="0"/>
           <w:numId w:val="15"/>
         </w:numPr>
+        <w:tabs>
+          <w:tab w:pos="1080" w:val="left"/>
+        </w:tabs>
         <w:spacing w:before="0" w:after="0" w:line="360" w:lineRule="auto"/>
-        <w:ind w:left="720" w:hanging="360" w:right="0"/>
+        <w:ind w:left="1080" w:right="0" w:hanging="360"/>
       </w:pPr>
       <w:r>
         <w:rPr>
@@ -8412,8 +8433,11 @@
           <w:ilvl w:val="0"/>
           <w:numId w:val="15"/>
         </w:numPr>
+        <w:tabs>
+          <w:tab w:pos="1080" w:val="left"/>
+        </w:tabs>
         <w:spacing w:before="0" w:after="0" w:line="360" w:lineRule="auto"/>
-        <w:ind w:left="720" w:hanging="360" w:right="0"/>
+        <w:ind w:left="1080" w:right="0" w:hanging="360"/>
       </w:pPr>
       <w:r>
         <w:rPr>
@@ -8433,8 +8457,11 @@
           <w:ilvl w:val="0"/>
           <w:numId w:val="15"/>
         </w:numPr>
+        <w:tabs>
+          <w:tab w:pos="1080" w:val="left"/>
+        </w:tabs>
         <w:spacing w:before="0" w:after="0" w:line="360" w:lineRule="auto"/>
-        <w:ind w:left="720" w:hanging="360" w:right="0"/>
+        <w:ind w:left="1080" w:right="0" w:hanging="360"/>
       </w:pPr>
       <w:r>
         <w:rPr>
@@ -8454,8 +8481,11 @@
           <w:ilvl w:val="0"/>
           <w:numId w:val="15"/>
         </w:numPr>
+        <w:tabs>
+          <w:tab w:pos="1080" w:val="left"/>
+        </w:tabs>
         <w:spacing w:before="0" w:after="0" w:line="360" w:lineRule="auto"/>
-        <w:ind w:left="720" w:hanging="360" w:right="0"/>
+        <w:ind w:left="1080" w:right="0" w:hanging="360"/>
       </w:pPr>
       <w:r>
         <w:rPr>
@@ -8475,8 +8505,11 @@
           <w:ilvl w:val="0"/>
           <w:numId w:val="15"/>
         </w:numPr>
+        <w:tabs>
+          <w:tab w:pos="1080" w:val="left"/>
+        </w:tabs>
         <w:spacing w:before="0" w:after="0" w:line="360" w:lineRule="auto"/>
-        <w:ind w:left="720" w:hanging="360" w:right="0"/>
+        <w:ind w:left="1080" w:right="0" w:hanging="360"/>
       </w:pPr>
       <w:r>
         <w:rPr>
@@ -8496,8 +8529,11 @@
           <w:ilvl w:val="0"/>
           <w:numId w:val="15"/>
         </w:numPr>
+        <w:tabs>
+          <w:tab w:pos="1080" w:val="left"/>
+        </w:tabs>
         <w:spacing w:before="0" w:after="0" w:line="360" w:lineRule="auto"/>
-        <w:ind w:left="720" w:hanging="360" w:right="0"/>
+        <w:ind w:left="1080" w:right="0" w:hanging="360"/>
       </w:pPr>
       <w:r>
         <w:rPr>
@@ -8528,8 +8564,11 @@
           <w:ilvl w:val="0"/>
           <w:numId w:val="15"/>
         </w:numPr>
+        <w:tabs>
+          <w:tab w:pos="1080" w:val="left"/>
+        </w:tabs>
         <w:spacing w:before="0" w:after="0" w:line="360" w:lineRule="auto"/>
-        <w:ind w:left="720" w:hanging="360" w:right="0"/>
+        <w:ind w:left="1080" w:right="0" w:hanging="360"/>
       </w:pPr>
       <w:r>
         <w:rPr>
@@ -8549,8 +8588,11 @@
           <w:ilvl w:val="0"/>
           <w:numId w:val="15"/>
         </w:numPr>
+        <w:tabs>
+          <w:tab w:pos="1080" w:val="left"/>
+        </w:tabs>
         <w:spacing w:before="0" w:after="0" w:line="360" w:lineRule="auto"/>
-        <w:ind w:left="720" w:hanging="360" w:right="0"/>
+        <w:ind w:left="1080" w:right="0" w:hanging="360"/>
       </w:pPr>
       <w:r>
         <w:rPr>
@@ -8570,8 +8612,11 @@
           <w:ilvl w:val="0"/>
           <w:numId w:val="15"/>
         </w:numPr>
+        <w:tabs>
+          <w:tab w:pos="1080" w:val="left"/>
+        </w:tabs>
         <w:spacing w:before="0" w:after="0" w:line="360" w:lineRule="auto"/>
-        <w:ind w:left="720" w:hanging="360" w:right="0"/>
+        <w:ind w:left="1080" w:right="0" w:hanging="360"/>
       </w:pPr>
       <w:r>
         <w:rPr>
@@ -8591,8 +8636,11 @@
           <w:ilvl w:val="0"/>
           <w:numId w:val="15"/>
         </w:numPr>
+        <w:tabs>
+          <w:tab w:pos="1080" w:val="left"/>
+        </w:tabs>
         <w:spacing w:before="0" w:after="0" w:line="360" w:lineRule="auto"/>
-        <w:ind w:left="720" w:hanging="360" w:right="0"/>
+        <w:ind w:left="1080" w:right="0" w:hanging="360"/>
       </w:pPr>
       <w:r>
         <w:rPr>
@@ -8612,8 +8660,11 @@
           <w:ilvl w:val="0"/>
           <w:numId w:val="15"/>
         </w:numPr>
+        <w:tabs>
+          <w:tab w:pos="1080" w:val="left"/>
+        </w:tabs>
         <w:spacing w:before="0" w:after="0" w:line="360" w:lineRule="auto"/>
-        <w:ind w:left="720" w:hanging="360" w:right="0"/>
+        <w:ind w:left="1080" w:right="0" w:hanging="360"/>
       </w:pPr>
       <w:r>
         <w:rPr>
@@ -9179,8 +9230,11 @@
           <w:ilvl w:val="0"/>
           <w:numId w:val="15"/>
         </w:numPr>
+        <w:tabs>
+          <w:tab w:pos="1080" w:val="left"/>
+        </w:tabs>
         <w:spacing w:before="0" w:after="0" w:line="360" w:lineRule="auto"/>
-        <w:ind w:left="720" w:hanging="360" w:right="0"/>
+        <w:ind w:left="1080" w:right="0" w:hanging="360"/>
       </w:pPr>
       <w:r>
         <w:rPr>
@@ -9200,8 +9254,11 @@
           <w:ilvl w:val="0"/>
           <w:numId w:val="15"/>
         </w:numPr>
+        <w:tabs>
+          <w:tab w:pos="1080" w:val="left"/>
+        </w:tabs>
         <w:spacing w:before="0" w:after="0" w:line="360" w:lineRule="auto"/>
-        <w:ind w:left="720" w:hanging="360" w:right="0"/>
+        <w:ind w:left="1080" w:right="0" w:hanging="360"/>
       </w:pPr>
       <w:r>
         <w:rPr>
@@ -9221,8 +9278,11 @@
           <w:ilvl w:val="0"/>
           <w:numId w:val="15"/>
         </w:numPr>
+        <w:tabs>
+          <w:tab w:pos="1080" w:val="left"/>
+        </w:tabs>
         <w:spacing w:before="0" w:after="0" w:line="360" w:lineRule="auto"/>
-        <w:ind w:left="720" w:hanging="360" w:right="0"/>
+        <w:ind w:left="1080" w:right="0" w:hanging="360"/>
       </w:pPr>
       <w:r>
         <w:rPr>
@@ -9251,8 +9311,11 @@
           <w:ilvl w:val="0"/>
           <w:numId w:val="15"/>
         </w:numPr>
+        <w:tabs>
+          <w:tab w:pos="1080" w:val="left"/>
+        </w:tabs>
         <w:spacing w:before="0" w:after="0" w:line="360" w:lineRule="auto"/>
-        <w:ind w:left="720" w:hanging="360" w:right="0"/>
+        <w:ind w:left="1080" w:right="0" w:hanging="360"/>
       </w:pPr>
       <w:r>
         <w:rPr>
@@ -9272,8 +9335,11 @@
           <w:ilvl w:val="0"/>
           <w:numId w:val="15"/>
         </w:numPr>
+        <w:tabs>
+          <w:tab w:pos="1080" w:val="left"/>
+        </w:tabs>
         <w:spacing w:before="0" w:after="0" w:line="360" w:lineRule="auto"/>
-        <w:ind w:left="720" w:hanging="360" w:right="0"/>
+        <w:ind w:left="1080" w:right="0" w:hanging="360"/>
       </w:pPr>
       <w:r>
         <w:rPr>
@@ -9293,8 +9359,11 @@
           <w:ilvl w:val="0"/>
           <w:numId w:val="15"/>
         </w:numPr>
+        <w:tabs>
+          <w:tab w:pos="1080" w:val="left"/>
+        </w:tabs>
         <w:spacing w:before="0" w:after="0" w:line="360" w:lineRule="auto"/>
-        <w:ind w:left="720" w:hanging="360" w:right="0"/>
+        <w:ind w:left="1080" w:right="0" w:hanging="360"/>
       </w:pPr>
       <w:r>
         <w:rPr>
@@ -9314,8 +9383,11 @@
           <w:ilvl w:val="0"/>
           <w:numId w:val="15"/>
         </w:numPr>
+        <w:tabs>
+          <w:tab w:pos="1080" w:val="left"/>
+        </w:tabs>
         <w:spacing w:before="0" w:after="0" w:line="360" w:lineRule="auto"/>
-        <w:ind w:left="720" w:hanging="360" w:right="0"/>
+        <w:ind w:left="1080" w:right="0" w:hanging="360"/>
       </w:pPr>
       <w:r>
         <w:rPr>
@@ -9335,8 +9407,11 @@
           <w:ilvl w:val="0"/>
           <w:numId w:val="15"/>
         </w:numPr>
+        <w:tabs>
+          <w:tab w:pos="1080" w:val="left"/>
+        </w:tabs>
         <w:spacing w:before="0" w:after="0" w:line="360" w:lineRule="auto"/>
-        <w:ind w:left="720" w:hanging="360" w:right="0"/>
+        <w:ind w:left="1080" w:right="0" w:hanging="360"/>
       </w:pPr>
       <w:r>
         <w:rPr>
@@ -9356,8 +9431,11 @@
           <w:ilvl w:val="0"/>
           <w:numId w:val="15"/>
         </w:numPr>
+        <w:tabs>
+          <w:tab w:pos="1080" w:val="left"/>
+        </w:tabs>
         <w:spacing w:before="0" w:after="0" w:line="360" w:lineRule="auto"/>
-        <w:ind w:left="720" w:hanging="360" w:right="0"/>
+        <w:ind w:left="1080" w:right="0" w:hanging="360"/>
       </w:pPr>
       <w:r>
         <w:rPr>
@@ -9748,8 +9826,11 @@
           <w:ilvl w:val="0"/>
           <w:numId w:val="15"/>
         </w:numPr>
+        <w:tabs>
+          <w:tab w:pos="1080" w:val="left"/>
+        </w:tabs>
         <w:spacing w:before="0" w:after="0" w:line="360" w:lineRule="auto"/>
-        <w:ind w:left="720" w:hanging="360" w:right="0"/>
+        <w:ind w:left="1080" w:right="0" w:hanging="360"/>
       </w:pPr>
       <w:r>
         <w:rPr>
@@ -9769,8 +9850,11 @@
           <w:ilvl w:val="0"/>
           <w:numId w:val="15"/>
         </w:numPr>
+        <w:tabs>
+          <w:tab w:pos="1080" w:val="left"/>
+        </w:tabs>
         <w:spacing w:before="0" w:after="0" w:line="360" w:lineRule="auto"/>
-        <w:ind w:left="720" w:hanging="360" w:right="0"/>
+        <w:ind w:left="1080" w:right="0" w:hanging="360"/>
       </w:pPr>
       <w:r>
         <w:rPr>
@@ -9790,8 +9874,11 @@
           <w:ilvl w:val="0"/>
           <w:numId w:val="15"/>
         </w:numPr>
+        <w:tabs>
+          <w:tab w:pos="1080" w:val="left"/>
+        </w:tabs>
         <w:spacing w:before="0" w:after="0" w:line="360" w:lineRule="auto"/>
-        <w:ind w:left="720" w:hanging="360" w:right="0"/>
+        <w:ind w:left="1080" w:right="0" w:hanging="360"/>
       </w:pPr>
       <w:r>
         <w:rPr>
@@ -9811,8 +9898,11 @@
           <w:ilvl w:val="0"/>
           <w:numId w:val="15"/>
         </w:numPr>
+        <w:tabs>
+          <w:tab w:pos="1080" w:val="left"/>
+        </w:tabs>
         <w:spacing w:before="0" w:after="0" w:line="360" w:lineRule="auto"/>
-        <w:ind w:left="720" w:hanging="360" w:right="0"/>
+        <w:ind w:left="1080" w:right="0" w:hanging="360"/>
       </w:pPr>
       <w:r>
         <w:rPr>
@@ -10045,8 +10135,11 @@
           <w:ilvl w:val="0"/>
           <w:numId w:val="15"/>
         </w:numPr>
+        <w:tabs>
+          <w:tab w:pos="1080" w:val="left"/>
+        </w:tabs>
         <w:spacing w:before="0" w:after="0" w:line="360" w:lineRule="auto"/>
-        <w:ind w:left="720" w:hanging="360" w:right="0"/>
+        <w:ind w:left="1080" w:right="0" w:hanging="360"/>
       </w:pPr>
       <w:r>
         <w:rPr>
@@ -10066,8 +10159,11 @@
           <w:ilvl w:val="0"/>
           <w:numId w:val="15"/>
         </w:numPr>
+        <w:tabs>
+          <w:tab w:pos="1080" w:val="left"/>
+        </w:tabs>
         <w:spacing w:before="0" w:after="0" w:line="360" w:lineRule="auto"/>
-        <w:ind w:left="720" w:hanging="360" w:right="0"/>
+        <w:ind w:left="1080" w:right="0" w:hanging="360"/>
       </w:pPr>
       <w:r>
         <w:rPr>
@@ -10087,8 +10183,11 @@
           <w:ilvl w:val="0"/>
           <w:numId w:val="15"/>
         </w:numPr>
+        <w:tabs>
+          <w:tab w:pos="1080" w:val="left"/>
+        </w:tabs>
         <w:spacing w:before="0" w:after="0" w:line="360" w:lineRule="auto"/>
-        <w:ind w:left="720" w:hanging="360" w:right="0"/>
+        <w:ind w:left="1080" w:right="0" w:hanging="360"/>
       </w:pPr>
       <w:r>
         <w:rPr>
@@ -10246,8 +10345,11 @@
           <w:ilvl w:val="0"/>
           <w:numId w:val="15"/>
         </w:numPr>
+        <w:tabs>
+          <w:tab w:pos="1080" w:val="left"/>
+        </w:tabs>
         <w:spacing w:before="0" w:after="0" w:line="360" w:lineRule="auto"/>
-        <w:ind w:left="720" w:hanging="360" w:right="0"/>
+        <w:ind w:left="1080" w:right="0" w:hanging="360"/>
       </w:pPr>
       <w:r>
         <w:rPr>
@@ -10267,8 +10369,11 @@
           <w:ilvl w:val="0"/>
           <w:numId w:val="15"/>
         </w:numPr>
+        <w:tabs>
+          <w:tab w:pos="1080" w:val="left"/>
+        </w:tabs>
         <w:spacing w:before="0" w:after="0" w:line="360" w:lineRule="auto"/>
-        <w:ind w:left="720" w:hanging="360" w:right="0"/>
+        <w:ind w:left="1080" w:right="0" w:hanging="360"/>
       </w:pPr>
       <w:r>
         <w:rPr>
@@ -10306,8 +10411,11 @@
           <w:ilvl w:val="0"/>
           <w:numId w:val="15"/>
         </w:numPr>
+        <w:tabs>
+          <w:tab w:pos="1080" w:val="left"/>
+        </w:tabs>
         <w:spacing w:before="0" w:after="0" w:line="360" w:lineRule="auto"/>
-        <w:ind w:left="720" w:hanging="360" w:right="0"/>
+        <w:ind w:left="1080" w:right="0" w:hanging="360"/>
       </w:pPr>
       <w:r>
         <w:rPr>
@@ -10327,8 +10435,11 @@
           <w:ilvl w:val="0"/>
           <w:numId w:val="15"/>
         </w:numPr>
+        <w:tabs>
+          <w:tab w:pos="1080" w:val="left"/>
+        </w:tabs>
         <w:spacing w:before="0" w:after="0" w:line="360" w:lineRule="auto"/>
-        <w:ind w:left="720" w:hanging="360" w:right="0"/>
+        <w:ind w:left="1080" w:right="0" w:hanging="360"/>
       </w:pPr>
       <w:r>
         <w:rPr>
@@ -10348,8 +10459,11 @@
           <w:ilvl w:val="0"/>
           <w:numId w:val="15"/>
         </w:numPr>
+        <w:tabs>
+          <w:tab w:pos="1080" w:val="left"/>
+        </w:tabs>
         <w:spacing w:before="0" w:after="0" w:line="360" w:lineRule="auto"/>
-        <w:ind w:left="720" w:hanging="360" w:right="0"/>
+        <w:ind w:left="1080" w:right="0" w:hanging="360"/>
       </w:pPr>
       <w:r>
         <w:rPr>
@@ -10386,8 +10500,11 @@
           <w:ilvl w:val="0"/>
           <w:numId w:val="15"/>
         </w:numPr>
+        <w:tabs>
+          <w:tab w:pos="1080" w:val="left"/>
+        </w:tabs>
         <w:spacing w:before="0" w:after="0" w:line="360" w:lineRule="auto"/>
-        <w:ind w:left="720" w:hanging="360" w:right="0"/>
+        <w:ind w:left="1080" w:right="0" w:hanging="360"/>
       </w:pPr>
       <w:r>
         <w:rPr>
@@ -11147,8 +11264,11 @@
           <w:ilvl w:val="0"/>
           <w:numId w:val="15"/>
         </w:numPr>
+        <w:tabs>
+          <w:tab w:pos="1080" w:val="left"/>
+        </w:tabs>
         <w:spacing w:before="0" w:after="0" w:line="360" w:lineRule="auto"/>
-        <w:ind w:left="720" w:hanging="360" w:right="0"/>
+        <w:ind w:left="1080" w:right="0" w:hanging="360"/>
       </w:pPr>
       <w:r>
         <w:rPr>
@@ -11168,8 +11288,11 @@
           <w:ilvl w:val="0"/>
           <w:numId w:val="15"/>
         </w:numPr>
+        <w:tabs>
+          <w:tab w:pos="1080" w:val="left"/>
+        </w:tabs>
         <w:spacing w:before="0" w:after="0" w:line="360" w:lineRule="auto"/>
-        <w:ind w:left="720" w:hanging="360" w:right="0"/>
+        <w:ind w:left="1080" w:right="0" w:hanging="360"/>
       </w:pPr>
       <w:r>
         <w:rPr>
@@ -11189,8 +11312,11 @@
           <w:ilvl w:val="0"/>
           <w:numId w:val="15"/>
         </w:numPr>
+        <w:tabs>
+          <w:tab w:pos="1080" w:val="left"/>
+        </w:tabs>
         <w:spacing w:before="0" w:after="0" w:line="360" w:lineRule="auto"/>
-        <w:ind w:left="720" w:hanging="360" w:right="0"/>
+        <w:ind w:left="1080" w:right="0" w:hanging="360"/>
       </w:pPr>
       <w:r>
         <w:rPr>
@@ -11210,8 +11336,11 @@
           <w:ilvl w:val="0"/>
           <w:numId w:val="15"/>
         </w:numPr>
+        <w:tabs>
+          <w:tab w:pos="1080" w:val="left"/>
+        </w:tabs>
         <w:spacing w:before="0" w:after="0" w:line="360" w:lineRule="auto"/>
-        <w:ind w:left="720" w:hanging="360" w:right="0"/>
+        <w:ind w:left="1080" w:right="0" w:hanging="360"/>
       </w:pPr>
       <w:r>
         <w:rPr>
@@ -11231,8 +11360,11 @@
           <w:ilvl w:val="0"/>
           <w:numId w:val="15"/>
         </w:numPr>
+        <w:tabs>
+          <w:tab w:pos="1080" w:val="left"/>
+        </w:tabs>
         <w:spacing w:before="0" w:after="0" w:line="360" w:lineRule="auto"/>
-        <w:ind w:left="720" w:hanging="360" w:right="0"/>
+        <w:ind w:left="1080" w:right="0" w:hanging="360"/>
       </w:pPr>
       <w:r>
         <w:rPr>
@@ -11261,8 +11393,11 @@
           <w:ilvl w:val="0"/>
           <w:numId w:val="15"/>
         </w:numPr>
+        <w:tabs>
+          <w:tab w:pos="1080" w:val="left"/>
+        </w:tabs>
         <w:spacing w:before="0" w:after="0" w:line="360" w:lineRule="auto"/>
-        <w:ind w:left="720" w:hanging="360" w:right="0"/>
+        <w:ind w:left="1080" w:right="0" w:hanging="360"/>
       </w:pPr>
       <w:r>
         <w:rPr>
@@ -11282,8 +11417,11 @@
           <w:ilvl w:val="0"/>
           <w:numId w:val="15"/>
         </w:numPr>
+        <w:tabs>
+          <w:tab w:pos="1080" w:val="left"/>
+        </w:tabs>
         <w:spacing w:before="0" w:after="0" w:line="360" w:lineRule="auto"/>
-        <w:ind w:left="720" w:hanging="360" w:right="0"/>
+        <w:ind w:left="1080" w:right="0" w:hanging="360"/>
       </w:pPr>
       <w:r>
         <w:rPr>
@@ -11303,8 +11441,11 @@
           <w:ilvl w:val="0"/>
           <w:numId w:val="15"/>
         </w:numPr>
+        <w:tabs>
+          <w:tab w:pos="1080" w:val="left"/>
+        </w:tabs>
         <w:spacing w:before="0" w:after="0" w:line="360" w:lineRule="auto"/>
-        <w:ind w:left="720" w:hanging="360" w:right="0"/>
+        <w:ind w:left="1080" w:right="0" w:hanging="360"/>
       </w:pPr>
       <w:r>
         <w:rPr>
@@ -11324,8 +11465,11 @@
           <w:ilvl w:val="0"/>
           <w:numId w:val="15"/>
         </w:numPr>
+        <w:tabs>
+          <w:tab w:pos="1080" w:val="left"/>
+        </w:tabs>
         <w:spacing w:before="0" w:after="0" w:line="360" w:lineRule="auto"/>
-        <w:ind w:left="720" w:hanging="360" w:right="0"/>
+        <w:ind w:left="1080" w:right="0" w:hanging="360"/>
       </w:pPr>
       <w:r>
         <w:rPr>
@@ -11363,8 +11507,11 @@
           <w:ilvl w:val="0"/>
           <w:numId w:val="15"/>
         </w:numPr>
+        <w:tabs>
+          <w:tab w:pos="1080" w:val="left"/>
+        </w:tabs>
         <w:spacing w:before="0" w:after="0" w:line="360" w:lineRule="auto"/>
-        <w:ind w:left="720" w:hanging="360" w:right="0"/>
+        <w:ind w:left="1080" w:right="0" w:hanging="360"/>
       </w:pPr>
       <w:r>
         <w:rPr>
@@ -11384,8 +11531,11 @@
           <w:ilvl w:val="0"/>
           <w:numId w:val="15"/>
         </w:numPr>
+        <w:tabs>
+          <w:tab w:pos="1080" w:val="left"/>
+        </w:tabs>
         <w:spacing w:before="0" w:after="0" w:line="360" w:lineRule="auto"/>
-        <w:ind w:left="720" w:hanging="360" w:right="0"/>
+        <w:ind w:left="1080" w:right="0" w:hanging="360"/>
       </w:pPr>
       <w:r>
         <w:rPr>
@@ -11405,8 +11555,11 @@
           <w:ilvl w:val="0"/>
           <w:numId w:val="15"/>
         </w:numPr>
+        <w:tabs>
+          <w:tab w:pos="1080" w:val="left"/>
+        </w:tabs>
         <w:spacing w:before="0" w:after="0" w:line="360" w:lineRule="auto"/>
-        <w:ind w:left="720" w:hanging="360" w:right="0"/>
+        <w:ind w:left="1080" w:right="0" w:hanging="360"/>
       </w:pPr>
       <w:r>
         <w:rPr>
@@ -15619,13 +15772,14 @@
     <w:lvl w:ilvl="0">
       <w:start w:val="1"/>
       <w:numFmt w:val="bullet"/>
+      <w:suff w:val="tab"/>
       <w:lvlText w:val="•"/>
       <w:lvlJc w:val="left"/>
       <w:pPr>
         <w:tabs>
-          <w:tab w:val="num" w:pos="720"/>
+          <w:tab w:val="num" w:pos="1080"/>
         </w:tabs>
-        <w:ind w:left="720" w:hanging="360"/>
+        <w:ind w:left="1080" w:hanging="360"/>
       </w:pPr>
       <w:rPr>
         <w:rFonts w:ascii="Arial" w:hAnsi="Arial" w:eastAsia="Arial" w:cs="Arial"/>

</xml_diff>

<commit_message>
docs(tcc): strengthen pharmacy AI foundation
</commit_message>
<xml_diff>
--- a/TCC/TCC_MAB_Facens_Ralph_10x.docx
+++ b/TCC/TCC_MAB_Facens_Ralph_10x.docx
@@ -898,7 +898,7 @@
             <w:u w:val="none"/>
             <w:sz w:val="24"/>
           </w:rPr>
-          <w:t>14</w:t>
+          <w:t>15</w:t>
         </w:r>
       </w:hyperlink>
     </w:p>
@@ -938,7 +938,7 @@
             <w:u w:val="none"/>
             <w:sz w:val="24"/>
           </w:rPr>
-          <w:t>14</w:t>
+          <w:t>15</w:t>
         </w:r>
       </w:hyperlink>
     </w:p>
@@ -1138,7 +1138,7 @@
             <w:u w:val="none"/>
             <w:sz w:val="24"/>
           </w:rPr>
-          <w:t>17</w:t>
+          <w:t>18</w:t>
         </w:r>
       </w:hyperlink>
     </w:p>
@@ -1318,7 +1318,7 @@
             <w:u w:val="none"/>
             <w:sz w:val="24"/>
           </w:rPr>
-          <w:t>19</w:t>
+          <w:t>20</w:t>
         </w:r>
       </w:hyperlink>
     </w:p>
@@ -3729,7 +3729,7 @@
           <w:color w:val="000000"/>
           <w:sz w:val="24"/>
         </w:rPr>
-        <w:t>O atendimento em farmácias reúne atividades comerciais, administrativas e de orientação em saúde. A atuação do farmacêutico vai além da dispensação de medicamentos e inclui o apoio ao uso seguro desses produtos, conforme o contexto dos serviços prestados (WHO EUROPE, 2024). Para a automação, essa diversidade exige distinguir solicitações que podem ser resolvidas por consulta a informações de situações que dependem de avaliação profissional.</w:t>
+        <w:t>O atendimento em farmácias combina atividades comerciais, administrativas e de orientação em saúde. A atuação do farmacêutico não se limita à entrega de medicamentos: inclui apoiar seu uso seguro e encaminhar situações que exigem avaliação profissional (WHO EUROPE, 2024). Para um sistema automatizado, essa variedade torna necessário separar tarefas operacionais de solicitações que envolvem julgamento clínico.</w:t>
       </w:r>
     </w:p>
     <w:p>
@@ -3740,7 +3740,7 @@
           <w:color w:val="000000"/>
           <w:sz w:val="24"/>
         </w:rPr>
-        <w:t>Uma pergunta sobre horário de funcionamento pode ser respondida a partir de informação institucional. Uma consulta de disponibilidade exige acesso a uma fonte de estoque. Já uma dúvida sobre dose ou interação entre medicamentos envolve uma decisão de saúde. Neste trabalho, essas situações ilustram diferentes necessidades de informação e encaminhamento; não constituem categorias observadas em conversas reais, cuja caracterização ainda está prevista na metodologia.</w:t>
+        <w:t>Uma pergunta sobre horário de funcionamento pode ser respondida com informação institucional. Uma consulta de disponibilidade depende de uma fonte de estoque. Já uma dúvida sobre dose, contraindicação ou interação entre medicamentos requer análise profissional. Esses exemplos representam diferentes necessidades de informação e encaminhamento, mas não são categorias extraídas de conversas reais. A caracterização dos atendimentos será realizada na etapa metodológica prevista para o estudo de caso.</w:t>
       </w:r>
     </w:p>
     <w:p>
@@ -3751,7 +3751,7 @@
           <w:color w:val="000000"/>
           <w:sz w:val="24"/>
         </w:rPr>
-        <w:t xml:space="preserve">O estudo de Pais </w:t>
+        <w:t xml:space="preserve">A revisão de Hatzimanolis </w:t>
       </w:r>
       <w:r>
         <w:rPr>
@@ -3769,7 +3769,7 @@
           <w:color w:val="000000"/>
           <w:sz w:val="24"/>
         </w:rPr>
-        <w:t xml:space="preserve"> (2024), sobre identificação de erros em instruções de medicamentos em farmácias digitais, mostra a pertinência de avaliar modelos em tarefas farmacêuticas específicas. Seu escopo, porém, não equivale à validação de um atendente autônomo para qualquer solicitação de saúde. Para o estudo de caso do MAB, a automação foi delimitada a funções operacionais e ao encaminhamento para revisão profissional. Essa delimitação permite investigar a coordenação sem assumir capacidade de diagnóstico ou prescrição.</w:t>
+        <w:t xml:space="preserve"> (2025) identifica aplicações de inteligência artificial em diferentes atividades da prática farmacêutica. A diversidade dos usos encontrados indica que “IA em farmácias” não constitui uma tarefa única: sistemas podem apoiar processos distintos, com dados, riscos e critérios de avaliação próprios. Essa revisão delimita o contexto de aplicação, mas não demonstra que uma arquitetura de coordenação seja superior a outra.</w:t>
       </w:r>
     </w:p>
     <w:p>
@@ -3780,7 +3780,25 @@
           <w:color w:val="000000"/>
           <w:sz w:val="24"/>
         </w:rPr>
-        <w:t>A farmácia oferece, portanto, um contexto para tarefas com diferentes fontes de informação e graus de sensibilidade. O objeto da comparação continua sendo a organização computacional dessas tarefas. A eventual aplicação das conclusões a outros setores dependerá de estudos adicionais.</w:t>
+        <w:t xml:space="preserve">Pais </w:t>
+      </w:r>
+      <w:r>
+        <w:rPr>
+          <w:rFonts w:ascii="Arial" w:hAnsi="Arial" w:eastAsia="Arial" w:cs="Arial"/>
+          <w:i w:val="1"/>
+          <w:iCs w:val="1"/>
+          <w:color w:val="000000"/>
+          <w:sz w:val="24"/>
+        </w:rPr>
+        <w:t>et al.</w:t>
+      </w:r>
+      <w:r>
+        <w:rPr>
+          <w:rFonts w:ascii="Arial" w:hAnsi="Arial" w:eastAsia="Arial" w:cs="Arial"/>
+          <w:color w:val="000000"/>
+          <w:sz w:val="24"/>
+        </w:rPr>
+        <w:t xml:space="preserve"> (2024) analisam uma tarefa mais específica: identificar e corrigir instruções potencialmente incorretas sobre medicamentos em uma farmácia digital. O estudo combina modelo de linguagem, regras de domínio, salvaguardas e revisão farmacêutica. Seu escopo não equivale à validação de um atendente autônomo para qualquer solicitação de saúde. No MAB, a automação permanece restrita a funções operacionais e ao encaminhamento de casos sensíveis. A farmácia fornece, assim, um estudo de caso com diferentes fontes de informação e níveis de risco; o objeto principal da pesquisa continua sendo a coordenação computacional.</w:t>
       </w:r>
     </w:p>
     <w:p>
@@ -3813,7 +3831,7 @@
           <w:color w:val="000000"/>
           <w:sz w:val="24"/>
         </w:rPr>
-        <w:t>No atendimento, o processamento de linguagem natural permite associar mensagens a intenções, recuperar informações e produzir respostas. A revisão de Adamopoulou e Moussiades (2020) descreve sistemas conversacionais em diferentes áreas e distingue suas finalidades e formas de construção. Essa variedade é relevante porque a presença de uma interface de conversa não determina como o sistema obtém a resposta.</w:t>
+        <w:t>No atendimento, técnicas de processamento de linguagem natural podem associar mensagens a intenções, recuperar informações e produzir respostas. Adamopoulou e Moussiades (2020) descrevem sistemas conversacionais de diferentes finalidades e formas de construção. A interface de conversa, portanto, não determina como a resposta é obtida nem quais ações o sistema pode executar.</w:t>
       </w:r>
     </w:p>
     <w:p>
@@ -3842,7 +3860,7 @@
           <w:color w:val="000000"/>
           <w:sz w:val="24"/>
         </w:rPr>
-        <w:t xml:space="preserve"> pode operar por regras, recuperar uma resposta de uma base ou utilizar um modelo generativo. Também pode oferecer acesso a funções executadas por um ou mais agentes. Assim, interface conversacional, modelo de linguagem e agente designam componentes diferentes. A escolha entre essas soluções depende das ações necessárias, das fontes disponíveis e dos limites impostos ao atendimento.</w:t>
+        <w:t xml:space="preserve"> pode seguir regras, recuperar conteúdo de uma base ou utilizar um modelo generativo. Ele também pode acionar funções executadas por um ou mais agentes. Interface conversacional, modelo de linguagem, ferramenta e agente são componentes distintos. A combinação adequada depende da tarefa, das fontes de informação e dos limites de atuação definidos para o atendimento.</w:t>
       </w:r>
     </w:p>
     <w:p>
@@ -3853,7 +3871,7 @@
           <w:color w:val="000000"/>
           <w:sz w:val="24"/>
         </w:rPr>
-        <w:t xml:space="preserve">Neste estudo, a qualidade do atendimento automatizado inclui a adequação à solicitação, a correção das informações e o encaminhamento quando a resposta depende de avaliação humana. O tempo de resposta e o consumo de recursos compõem outra dimensão. Esses critérios precisam ser examinados em conjunto: uma resposta fluente pode conter informação incorreta, e uma execução tecnicamente concluída pode não atender à necessidade do usuário. A avaliação de Pais </w:t>
+        <w:t xml:space="preserve">No domínio farmacêutico, Hatzimanolis </w:t>
       </w:r>
       <w:r>
         <w:rPr>
@@ -3871,7 +3889,36 @@
           <w:color w:val="000000"/>
           <w:sz w:val="24"/>
         </w:rPr>
-        <w:t xml:space="preserve"> (2024) reforça a importância de critérios próprios da tarefa, sobretudo quando o conteúdo envolve medicamentos.</w:t>
+        <w:t xml:space="preserve"> (2025) mostram que as aplicações de IA abrangem atividades diversas e se encontram em diferentes níveis de desenvolvimento. Ong </w:t>
+      </w:r>
+      <w:r>
+        <w:rPr>
+          <w:rFonts w:ascii="Arial" w:hAnsi="Arial" w:eastAsia="Arial" w:cs="Arial"/>
+          <w:i w:val="1"/>
+          <w:iCs w:val="1"/>
+          <w:color w:val="000000"/>
+          <w:sz w:val="24"/>
+        </w:rPr>
+        <w:t>et al.</w:t>
+      </w:r>
+      <w:r>
+        <w:rPr>
+          <w:rFonts w:ascii="Arial" w:hAnsi="Arial" w:eastAsia="Arial" w:cs="Arial"/>
+          <w:color w:val="000000"/>
+          <w:sz w:val="24"/>
+        </w:rPr>
+        <w:t xml:space="preserve"> (2025), ao revisar o uso de IA generativa e LLMs para reduzir danos relacionados a medicamentos, agrupam os estudos em identificação de interações, apoio à decisão e farmacovigilância. Os autores também registram a ausência de avaliações prospectivas entre os trabalhos incluídos. Esses achados recomendam cautela ao transferir desempenho experimental para o atendimento real.</w:t>
+      </w:r>
+    </w:p>
+    <w:p>
+      <w:pPr/>
+      <w:r>
+        <w:rPr>
+          <w:rFonts w:ascii="Arial" w:hAnsi="Arial" w:eastAsia="Arial" w:cs="Arial"/>
+          <w:color w:val="000000"/>
+          <w:sz w:val="24"/>
+        </w:rPr>
+        <w:t>Neste estudo, a qualidade do atendimento automatizado envolve adequação à solicitação, correção das informações e encaminhamento quando a resposta depende de avaliação humana. Tempo de resposta e consumo de recursos formam outra dimensão. Os critérios devem ser examinados em conjunto: uma resposta fluente pode estar incorreta, e uma execução concluída pode não resolver a necessidade apresentada. A comparação das arquiteturas precisa, por isso, relacionar qualidade da resposta, percurso de coordenação e custo computacional, sem interpretar automação como substituição da decisão farmacêutica.</w:t>
       </w:r>
     </w:p>
     <w:p>
@@ -4148,11 +4195,10 @@
       </w:r>
     </w:p>
     <w:p>
-      <w:bookmarkStart w:id="5000" w:name="_TCC_F_IMG_C020"/>
+      <w:bookmarkStart w:id="6000" w:name="_TCC_F_IMG_C020"/>
       <w:pPr>
         <w:pStyle w:val="FigureCaption"/>
         <w:keepNext/>
-        <w:ind w:firstLine="0"/>
         <w:jc w:val="center"/>
       </w:pPr>
       <w:r>
@@ -4235,7 +4281,7 @@
         </w:rPr>
         <w:t>Ciclo de execução de um agente com ferramentas.</w:t>
       </w:r>
-      <w:bookmarkEnd w:id="5000"/>
+      <w:bookmarkEnd w:id="6000"/>
     </w:p>
     <w:p>
       <w:pPr>
@@ -4253,7 +4299,7 @@
         <w:drawing>
           <wp:inline xmlns:a="http://schemas.openxmlformats.org/drawingml/2006/main" xmlns:pic="http://schemas.openxmlformats.org/drawingml/2006/picture">
             <wp:extent cx="5580000" cy="3162000"/>
-            <wp:docPr id="5" name="IMG-C020" descr="Entrada de contexto no LLM, seleção de ação, execução de ferramenta, retorno da observação e produção de resposta."/>
+            <wp:docPr id="10" name="IMG-C020" descr="Entrada de contexto no LLM, seleção de ação, execução de ferramenta, retorno da observação e produção de resposta."/>
             <wp:cNvGraphicFramePr>
               <a:graphicFrameLocks noChangeAspect="1"/>
             </wp:cNvGraphicFramePr>
@@ -4261,14 +4307,14 @@
               <a:graphicData uri="http://schemas.openxmlformats.org/drawingml/2006/picture">
                 <pic:pic>
                   <pic:nvPicPr>
-                    <pic:cNvPr id="0" name="02-anatomia-agente-llm.png"/>
+                    <pic:cNvPr id="0" name="image.png"/>
                     <pic:cNvPicPr/>
                   </pic:nvPicPr>
                   <pic:blipFill>
                     <a:blip r:embed="rId38">
                       <a:extLst>
                         <a:ext uri="{96DAC541-7B7A-43D3-8B79-37D633B846F1}">
-                          <ns0:svgBlip xmlns:ns0="http://schemas.microsoft.com/office/drawing/2016/SVG/main" r:embed="rId39"/>
+                          <ns0:svgBlip xmlns:ns0="http://schemas.microsoft.com/office/drawing/2016/SVG/main" r:embed="rId51"/>
                         </a:ext>
                       </a:extLst>
                     </a:blip>
@@ -4293,8 +4339,6 @@
     <w:p>
       <w:pPr>
         <w:pStyle w:val="FigureSource"/>
-        <w:ind w:firstLine="0"/>
-        <w:jc w:val="center"/>
       </w:pPr>
       <w:r>
         <w:rPr>
@@ -4567,11 +4611,10 @@
       </w:r>
     </w:p>
     <w:p>
-      <w:bookmarkStart w:id="5001" w:name="_TCC_F_IMG_C022"/>
+      <w:bookmarkStart w:id="6001" w:name="_TCC_F_IMG_C022"/>
       <w:pPr>
         <w:pStyle w:val="FigureCaption"/>
         <w:keepNext/>
-        <w:ind w:firstLine="0"/>
         <w:jc w:val="center"/>
       </w:pPr>
       <w:r>
@@ -4654,7 +4697,7 @@
         </w:rPr>
         <w:t>Exemplos de topologias de comunicação entre agentes.</w:t>
       </w:r>
-      <w:bookmarkEnd w:id="5001"/>
+      <w:bookmarkEnd w:id="6001"/>
     </w:p>
     <w:p>
       <w:pPr>
@@ -4672,7 +4715,7 @@
         <w:drawing>
           <wp:inline xmlns:a="http://schemas.openxmlformats.org/drawingml/2006/main" xmlns:pic="http://schemas.openxmlformats.org/drawingml/2006/picture">
             <wp:extent cx="5580000" cy="1999500"/>
-            <wp:docPr id="6" name="IMG-C022" descr="Quatro redes com nós e conexões: estrela, cadeia, árvore e rede com conexões adicionais entre pares."/>
+            <wp:docPr id="11" name="IMG-C022" descr="Quatro redes com nós e conexões: estrela, cadeia, árvore e rede com conexões adicionais entre pares."/>
             <wp:cNvGraphicFramePr>
               <a:graphicFrameLocks noChangeAspect="1"/>
             </wp:cNvGraphicFramePr>
@@ -4680,14 +4723,14 @@
               <a:graphicData uri="http://schemas.openxmlformats.org/drawingml/2006/picture">
                 <pic:pic>
                   <pic:nvPicPr>
-                    <pic:cNvPr id="0" name="04-topologias-trabalhos-correlatos.png"/>
+                    <pic:cNvPr id="0" name="image.png"/>
                     <pic:cNvPicPr/>
                   </pic:nvPicPr>
                   <pic:blipFill>
                     <a:blip r:embed="rId40">
                       <a:extLst>
                         <a:ext uri="{96DAC541-7B7A-43D3-8B79-37D633B846F1}">
-                          <ns1:svgBlip xmlns:ns1="http://schemas.microsoft.com/office/drawing/2016/SVG/main" r:embed="rId41"/>
+                          <ns1:svgBlip xmlns:ns1="http://schemas.microsoft.com/office/drawing/2016/SVG/main" r:embed="rId52"/>
                         </a:ext>
                       </a:extLst>
                     </a:blip>
@@ -4712,8 +4755,6 @@
     <w:p>
       <w:pPr>
         <w:pStyle w:val="FigureSource"/>
-        <w:ind w:firstLine="0"/>
-        <w:jc w:val="center"/>
       </w:pPr>
       <w:r>
         <w:rPr>
@@ -5282,11 +5323,10 @@
       </w:r>
     </w:p>
     <w:p>
-      <w:bookmarkStart w:id="5002" w:name="_TCC_F_IMG_C019"/>
+      <w:bookmarkStart w:id="6002" w:name="_TCC_F_IMG_C019"/>
       <w:pPr>
         <w:pStyle w:val="FigureCaption"/>
         <w:keepNext/>
-        <w:ind w:firstLine="0"/>
         <w:jc w:val="center"/>
       </w:pPr>
       <w:r>
@@ -5369,7 +5409,7 @@
         </w:rPr>
         <w:t>Distribuição de controle nas três arquiteturas de coordenação.</w:t>
       </w:r>
-      <w:bookmarkEnd w:id="5002"/>
+      <w:bookmarkEnd w:id="6002"/>
     </w:p>
     <w:p>
       <w:pPr>
@@ -5387,7 +5427,7 @@
         <w:drawing>
           <wp:inline xmlns:a="http://schemas.openxmlformats.org/drawingml/2006/main" xmlns:pic="http://schemas.openxmlformats.org/drawingml/2006/picture">
             <wp:extent cx="5580000" cy="3301500"/>
-            <wp:docPr id="7" name="IMG-C019" descr="Supervisor central ligado a agentes, etapas ordenadas por regras e transferências entre agentes sem supervisor em cada passo."/>
+            <wp:docPr id="12" name="IMG-C019" descr="Supervisor central ligado a agentes, etapas ordenadas por regras e transferências entre agentes sem supervisor em cada passo."/>
             <wp:cNvGraphicFramePr>
               <a:graphicFrameLocks noChangeAspect="1"/>
             </wp:cNvGraphicFramePr>
@@ -5395,14 +5435,14 @@
               <a:graphicData uri="http://schemas.openxmlformats.org/drawingml/2006/picture">
                 <pic:pic>
                   <pic:nvPicPr>
-                    <pic:cNvPr id="0" name="01-comparacao-arquiteturas.png"/>
+                    <pic:cNvPr id="0" name="image.png"/>
                     <pic:cNvPicPr/>
                   </pic:nvPicPr>
                   <pic:blipFill>
                     <a:blip r:embed="rId42">
                       <a:extLst>
                         <a:ext uri="{96DAC541-7B7A-43D3-8B79-37D633B846F1}">
-                          <ns2:svgBlip xmlns:ns2="http://schemas.microsoft.com/office/drawing/2016/SVG/main" r:embed="rId43"/>
+                          <ns2:svgBlip xmlns:ns2="http://schemas.microsoft.com/office/drawing/2016/SVG/main" r:embed="rId53"/>
                         </a:ext>
                       </a:extLst>
                     </a:blip>
@@ -5427,8 +5467,6 @@
     <w:p>
       <w:pPr>
         <w:pStyle w:val="FigureSource"/>
-        <w:ind w:firstLine="0"/>
-        <w:jc w:val="center"/>
       </w:pPr>
       <w:r>
         <w:rPr>
@@ -14513,7 +14551,7 @@
           <w:color w:val="000000"/>
           <w:sz w:val="24"/>
         </w:rPr>
-        <w:t xml:space="preserve">INFERMEDICA. </w:t>
+        <w:t xml:space="preserve">HATZIMANOLIS, Jessica; RILEY, Britney; EL-DEN, Sarira; ASLANI, Parisa; ZHOU, Joe; CHAAR, Betty B. Applications of artificial intelligence in current pharmacy practice: a scoping review. </w:t>
       </w:r>
       <w:r>
         <w:rPr>
@@ -14523,15 +14561,15 @@
           <w:color w:val="000000"/>
           <w:sz w:val="24"/>
         </w:rPr>
-        <w:t>Symptom Checker</w:t>
-      </w:r>
-      <w:r>
-        <w:rPr>
-          <w:rFonts w:ascii="Arial" w:hAnsi="Arial" w:eastAsia="Arial" w:cs="Arial"/>
-          <w:color w:val="000000"/>
-          <w:sz w:val="24"/>
-        </w:rPr>
-        <w:t>. Disponível em: https://infermedica.com/product/symptom-checker. Acesso em: 11 maio 2026.</w:t>
+        <w:t>Research in Social and Administrative Pharmacy</w:t>
+      </w:r>
+      <w:r>
+        <w:rPr>
+          <w:rFonts w:ascii="Arial" w:hAnsi="Arial" w:eastAsia="Arial" w:cs="Arial"/>
+          <w:color w:val="000000"/>
+          <w:sz w:val="24"/>
+        </w:rPr>
+        <w:t>, [S. l.], v. 21, n. 3, p. 134-141, 2025. DOI: 10.1016/j.sapharm.2024.12.007. Disponível em: https://doi.org/10.1016/j.sapharm.2024.12.007. Acesso em: 8 set. 2026.</w:t>
       </w:r>
     </w:p>
     <w:p>
@@ -14545,7 +14583,7 @@
           <w:color w:val="000000"/>
           <w:sz w:val="24"/>
         </w:rPr>
-        <w:t xml:space="preserve">INTERCOM. </w:t>
+        <w:t xml:space="preserve">INFERMEDICA. </w:t>
       </w:r>
       <w:r>
         <w:rPr>
@@ -14555,15 +14593,15 @@
           <w:color w:val="000000"/>
           <w:sz w:val="24"/>
         </w:rPr>
-        <w:t>Fin AI Agent explained</w:t>
-      </w:r>
-      <w:r>
-        <w:rPr>
-          <w:rFonts w:ascii="Arial" w:hAnsi="Arial" w:eastAsia="Arial" w:cs="Arial"/>
-          <w:color w:val="000000"/>
-          <w:sz w:val="24"/>
-        </w:rPr>
-        <w:t>. Disponível em: https://www.intercom.com/help/en/articles/7120684-fin-ai-agent-explained. Acesso em: 11 maio 2026.</w:t>
+        <w:t>Symptom Checker</w:t>
+      </w:r>
+      <w:r>
+        <w:rPr>
+          <w:rFonts w:ascii="Arial" w:hAnsi="Arial" w:eastAsia="Arial" w:cs="Arial"/>
+          <w:color w:val="000000"/>
+          <w:sz w:val="24"/>
+        </w:rPr>
+        <w:t>. Disponível em: https://infermedica.com/product/symptom-checker. Acesso em: 11 maio 2026.</w:t>
       </w:r>
     </w:p>
     <w:p>
@@ -14577,7 +14615,7 @@
           <w:color w:val="000000"/>
           <w:sz w:val="24"/>
         </w:rPr>
-        <w:t xml:space="preserve">JAGATAP, Akshay; MERUGU, Srujana; COMAR, Prakash Mandayam. RxLens: Multi-Agent LLM-powered Scan and Order for Pharmacy. In: </w:t>
+        <w:t xml:space="preserve">INTERCOM. </w:t>
       </w:r>
       <w:r>
         <w:rPr>
@@ -14587,15 +14625,15 @@
           <w:color w:val="000000"/>
           <w:sz w:val="24"/>
         </w:rPr>
-        <w:t>Proceedings of the 2025 Conference of the Nations of the Americas Chapter of the Association for Computational Linguistics: Human Language Technologies</w:t>
-      </w:r>
-      <w:r>
-        <w:rPr>
-          <w:rFonts w:ascii="Arial" w:hAnsi="Arial" w:eastAsia="Arial" w:cs="Arial"/>
-          <w:color w:val="000000"/>
-          <w:sz w:val="24"/>
-        </w:rPr>
-        <w:t>, 2025, Albuquerque. [S. l.]: Association for Computational Linguistics, 2025. p. 822-832. DOI: 10.18653/v1/2025.naacl-industry.63.</w:t>
+        <w:t>Fin AI Agent explained</w:t>
+      </w:r>
+      <w:r>
+        <w:rPr>
+          <w:rFonts w:ascii="Arial" w:hAnsi="Arial" w:eastAsia="Arial" w:cs="Arial"/>
+          <w:color w:val="000000"/>
+          <w:sz w:val="24"/>
+        </w:rPr>
+        <w:t>. Disponível em: https://www.intercom.com/help/en/articles/7120684-fin-ai-agent-explained. Acesso em: 11 maio 2026.</w:t>
       </w:r>
     </w:p>
     <w:p>
@@ -14609,6 +14647,38 @@
           <w:color w:val="000000"/>
           <w:sz w:val="24"/>
         </w:rPr>
+        <w:t xml:space="preserve">JAGATAP, Akshay; MERUGU, Srujana; COMAR, Prakash Mandayam. RxLens: Multi-Agent LLM-powered Scan and Order for Pharmacy. In: </w:t>
+      </w:r>
+      <w:r>
+        <w:rPr>
+          <w:rFonts w:ascii="Arial" w:hAnsi="Arial" w:eastAsia="Arial" w:cs="Arial"/>
+          <w:b w:val="1"/>
+          <w:bCs w:val="1"/>
+          <w:color w:val="000000"/>
+          <w:sz w:val="24"/>
+        </w:rPr>
+        <w:t>Proceedings of the 2025 Conference of the Nations of the Americas Chapter of the Association for Computational Linguistics: Human Language Technologies</w:t>
+      </w:r>
+      <w:r>
+        <w:rPr>
+          <w:rFonts w:ascii="Arial" w:hAnsi="Arial" w:eastAsia="Arial" w:cs="Arial"/>
+          <w:color w:val="000000"/>
+          <w:sz w:val="24"/>
+        </w:rPr>
+        <w:t>, 2025, Albuquerque. [S. l.]: Association for Computational Linguistics, 2025. p. 822-832. DOI: 10.18653/v1/2025.naacl-industry.63.</w:t>
+      </w:r>
+    </w:p>
+    <w:p>
+      <w:pPr>
+        <w:pStyle w:val="ReferenceEntry"/>
+        <w:pageBreakBefore w:val="0"/>
+      </w:pPr>
+      <w:r>
+        <w:rPr>
+          <w:rFonts w:ascii="Arial" w:hAnsi="Arial" w:eastAsia="Arial" w:cs="Arial"/>
+          <w:color w:val="000000"/>
+          <w:sz w:val="24"/>
+        </w:rPr>
         <w:t xml:space="preserve">KIM, Yubin </w:t>
       </w:r>
       <w:r>
@@ -14828,6 +14898,56 @@
           <w:sz w:val="24"/>
         </w:rPr>
         <w:t>. [S. l.], 2024. Disponível em: https://www.mckinsey.com/capabilities/quantumblack/our-insights/the-state-of-ai-2024. Acesso em: 30 mar. 2026.</w:t>
+      </w:r>
+    </w:p>
+    <w:p>
+      <w:pPr>
+        <w:pStyle w:val="ReferenceEntry"/>
+        <w:pageBreakBefore w:val="0"/>
+      </w:pPr>
+      <w:r>
+        <w:rPr>
+          <w:rFonts w:ascii="Arial" w:hAnsi="Arial" w:eastAsia="Arial" w:cs="Arial"/>
+          <w:color w:val="000000"/>
+          <w:sz w:val="24"/>
+        </w:rPr>
+        <w:t xml:space="preserve">ONG, Jasmine Chiat Ling </w:t>
+      </w:r>
+      <w:r>
+        <w:rPr>
+          <w:rFonts w:ascii="Arial" w:hAnsi="Arial" w:eastAsia="Arial" w:cs="Arial"/>
+          <w:i w:val="1"/>
+          <w:iCs w:val="1"/>
+          <w:color w:val="000000"/>
+          <w:sz w:val="24"/>
+        </w:rPr>
+        <w:t>et al.</w:t>
+      </w:r>
+      <w:r>
+        <w:rPr>
+          <w:rFonts w:ascii="Arial" w:hAnsi="Arial" w:eastAsia="Arial" w:cs="Arial"/>
+          <w:color w:val="000000"/>
+          <w:sz w:val="24"/>
+        </w:rPr>
+        <w:t xml:space="preserve"> A scoping review on generative AI and large language models in mitigating medication related harm. </w:t>
+      </w:r>
+      <w:r>
+        <w:rPr>
+          <w:rFonts w:ascii="Arial" w:hAnsi="Arial" w:eastAsia="Arial" w:cs="Arial"/>
+          <w:b w:val="1"/>
+          <w:bCs w:val="1"/>
+          <w:color w:val="000000"/>
+          <w:sz w:val="24"/>
+        </w:rPr>
+        <w:t>npj Digital Medicine</w:t>
+      </w:r>
+      <w:r>
+        <w:rPr>
+          <w:rFonts w:ascii="Arial" w:hAnsi="Arial" w:eastAsia="Arial" w:cs="Arial"/>
+          <w:color w:val="000000"/>
+          <w:sz w:val="24"/>
+        </w:rPr>
+        <w:t>, [S. l.], v. 8, art. 182, 2025. DOI: 10.1038/s41746-025-01565-7. Disponível em: https://doi.org/10.1038/s41746-025-01565-7. Acesso em: 8 set. 2026.</w:t>
       </w:r>
     </w:p>
     <w:p>

</xml_diff>

<commit_message>
docs(tcc): integrar parecer da orientadora no capitulo 2
</commit_message>
<xml_diff>
--- a/TCC/TCC_MAB_Facens_Ralph_10x.docx
+++ b/TCC/TCC_MAB_Facens_Ralph_10x.docx
@@ -138,19 +138,114 @@
         <w:ind w:left="4535" w:firstLine="0"/>
       </w:pPr>
       <w:r>
+        <w:t>Orientadora: Ma. Talita dos Reis Lopes Berbel.</w:t>
+      </w:r>
+    </w:p>
+    <w:p>
+      <w:pPr>
+        <w:spacing w:before="2400"/>
+        <w:jc w:val="center"/>
+      </w:pPr>
+      <w:r>
         <w:rPr>
           <w:rFonts w:ascii="Arial" w:hAnsi="Arial"/>
           <w:b w:val="0"/>
           <w:i w:val="0"/>
           <w:sz w:val="24"/>
         </w:rPr>
-        <w:t>Orientador: Me. Fabrício Torquato Leite.</w:t>
-      </w:r>
-    </w:p>
-    <w:p>
-      <w:pPr>
-        <w:spacing w:before="2400"/>
-        <w:jc w:val="center"/>
+        <w:t>SOROCABA, SP</w:t>
+        <w:br/>
+        <w:t>2026</w:t>
+      </w:r>
+    </w:p>
+    <w:p>
+      <w:r>
+        <w:br w:type="page"/>
+      </w:r>
+    </w:p>
+    <w:p>
+      <w:pPr>
+        <w:pStyle w:val="FrontMatterHeading"/>
+        <w:spacing w:after="720"/>
+      </w:pPr>
+      <w:r>
+        <w:rPr>
+          <w:rFonts w:ascii="Arial" w:hAnsi="Arial" w:eastAsia="Arial" w:cs="Arial"/>
+          <w:b/>
+          <w:caps/>
+          <w:color w:val="000000"/>
+          <w:sz w:val="28"/>
+        </w:rPr>
+        <w:t>FOLHA DE APROVAÇÃO</w:t>
+      </w:r>
+    </w:p>
+    <w:p>
+      <w:pPr>
+        <w:pStyle w:val="WorkingNote"/>
+      </w:pPr>
+      <w:r>
+        <w:t>A folha assinada será inserida após a apresentação e aprovação do trabalho, conforme o modelo da Facens.</w:t>
+      </w:r>
+    </w:p>
+    <w:p>
+      <w:r>
+        <w:br w:type="page"/>
+      </w:r>
+    </w:p>
+    <w:p>
+      <w:pPr>
+        <w:pStyle w:val="FrontMatterHeading"/>
+      </w:pPr>
+      <w:r>
+        <w:rPr>
+          <w:rFonts w:ascii="Arial" w:hAnsi="Arial" w:eastAsia="Arial" w:cs="Arial"/>
+          <w:b/>
+          <w:caps/>
+          <w:color w:val="000000"/>
+          <w:sz w:val="28"/>
+        </w:rPr>
+        <w:t>FICHA CATALOGRÁFICA</w:t>
+      </w:r>
+    </w:p>
+    <w:p>
+      <w:pPr>
+        <w:pStyle w:val="WorkingNote"/>
+      </w:pPr>
+      <w:r>
+        <w:t>A ficha catalográfica será solicitada à Biblioteca Facens e inserida nesta página antes da entrega final.</w:t>
+      </w:r>
+    </w:p>
+    <w:p>
+      <w:r>
+        <w:br w:type="page"/>
+      </w:r>
+    </w:p>
+    <w:p>
+      <w:pPr>
+        <w:pStyle w:val="FrontMatterHeading"/>
+      </w:pPr>
+      <w:r>
+        <w:rPr>
+          <w:rFonts w:ascii="Arial" w:hAnsi="Arial" w:eastAsia="Arial" w:cs="Arial"/>
+          <w:b/>
+          <w:caps/>
+          <w:color w:val="000000"/>
+          <w:sz w:val="28"/>
+        </w:rPr>
+        <w:t>RESUMO</w:t>
+      </w:r>
+    </w:p>
+    <w:p>
+      <w:pPr>
+        <w:pStyle w:val="WorkingNote"/>
+      </w:pPr>
+      <w:r>
+        <w:t>O resumo será consolidado após os testes, quando os resultados quantitativos e as conclusões puderem ser relatados sem antecipação. A versão final terá entre 150 e 500 palavras, em parágrafo único e espaçamento simples.</w:t>
+      </w:r>
+    </w:p>
+    <w:p>
+      <w:pPr>
+        <w:ind w:firstLine="0"/>
       </w:pPr>
       <w:r>
         <w:rPr>
@@ -159,9 +254,7 @@
           <w:i w:val="0"/>
           <w:sz w:val="24"/>
         </w:rPr>
-        <w:t>SOROCABA, SP</w:t>
-        <w:br/>
-        <w:t>2026</w:t>
+        <w:t>Palavras-chave: sistemas multiagentes; arquiteturas de coordenação; atendimento farmacêutico; agentes inteligentes.</w:t>
       </w:r>
     </w:p>
     <w:p>
@@ -172,7 +265,6 @@
     <w:p>
       <w:pPr>
         <w:pStyle w:val="FrontMatterHeading"/>
-        <w:spacing w:after="720"/>
       </w:pPr>
       <w:r>
         <w:rPr>
@@ -182,7 +274,7 @@
           <w:color w:val="000000"/>
           <w:sz w:val="28"/>
         </w:rPr>
-        <w:t>FOLHA DE APROVAÇÃO</w:t>
+        <w:t>ABSTRACT</w:t>
       </w:r>
     </w:p>
     <w:p>
@@ -190,63 +282,7 @@
         <w:pStyle w:val="WorkingNote"/>
       </w:pPr>
       <w:r>
-        <w:t>A folha assinada será inserida após a apresentação e aprovação do trabalho, conforme o modelo da Facens.</w:t>
-      </w:r>
-    </w:p>
-    <w:p>
-      <w:r>
-        <w:br w:type="page"/>
-      </w:r>
-    </w:p>
-    <w:p>
-      <w:pPr>
-        <w:pStyle w:val="FrontMatterHeading"/>
-      </w:pPr>
-      <w:r>
-        <w:rPr>
-          <w:rFonts w:ascii="Arial" w:hAnsi="Arial" w:eastAsia="Arial" w:cs="Arial"/>
-          <w:b/>
-          <w:caps/>
-          <w:color w:val="000000"/>
-          <w:sz w:val="28"/>
-        </w:rPr>
-        <w:t>FICHA CATALOGRÁFICA</w:t>
-      </w:r>
-    </w:p>
-    <w:p>
-      <w:pPr>
-        <w:pStyle w:val="WorkingNote"/>
-      </w:pPr>
-      <w:r>
-        <w:t>A ficha catalográfica será solicitada à Biblioteca Facens e inserida nesta página antes da entrega final.</w:t>
-      </w:r>
-    </w:p>
-    <w:p>
-      <w:r>
-        <w:br w:type="page"/>
-      </w:r>
-    </w:p>
-    <w:p>
-      <w:pPr>
-        <w:pStyle w:val="FrontMatterHeading"/>
-      </w:pPr>
-      <w:r>
-        <w:rPr>
-          <w:rFonts w:ascii="Arial" w:hAnsi="Arial" w:eastAsia="Arial" w:cs="Arial"/>
-          <w:b/>
-          <w:caps/>
-          <w:color w:val="000000"/>
-          <w:sz w:val="28"/>
-        </w:rPr>
-        <w:t>RESUMO</w:t>
-      </w:r>
-    </w:p>
-    <w:p>
-      <w:pPr>
-        <w:pStyle w:val="WorkingNote"/>
-      </w:pPr>
-      <w:r>
-        <w:t>O resumo será consolidado após os testes, quando os resultados quantitativos e as conclusões puderem ser relatados sem antecipação. A versão final terá entre 150 e 500 palavras, em parágrafo único e espaçamento simples.</w:t>
+        <w:t>A versão em inglês será produzida a partir do resumo final aprovado, preservando objetivos, método, resultados e conclusões.</w:t>
       </w:r>
     </w:p>
     <w:p>
@@ -260,7 +296,7 @@
           <w:i w:val="0"/>
           <w:sz w:val="24"/>
         </w:rPr>
-        <w:t>Palavras-chave: sistemas multiagentes; arquiteturas de coordenação; atendimento farmacêutico; agentes inteligentes.</w:t>
+        <w:t>Keywords: multi-agent systems; coordination architectures; pharmacy customer service; intelligent agents.</w:t>
       </w:r>
     </w:p>
     <w:p>
@@ -271,6 +307,7 @@
     <w:p>
       <w:pPr>
         <w:pStyle w:val="FrontMatterHeading"/>
+        <w:pageBreakBefore/>
       </w:pPr>
       <w:r>
         <w:rPr>
@@ -280,51 +317,48 @@
           <w:color w:val="000000"/>
           <w:sz w:val="28"/>
         </w:rPr>
-        <w:t>ABSTRACT</w:t>
-      </w:r>
-    </w:p>
-    <w:p>
-      <w:pPr>
-        <w:pStyle w:val="WorkingNote"/>
-      </w:pPr>
-      <w:r>
-        <w:t>A versão em inglês será produzida a partir do resumo final aprovado, preservando objetivos, método, resultados e conclusões.</w:t>
-      </w:r>
-    </w:p>
-    <w:p>
-      <w:pPr>
-        <w:ind w:firstLine="0"/>
-      </w:pPr>
-      <w:r>
-        <w:rPr>
-          <w:rFonts w:ascii="Arial" w:hAnsi="Arial"/>
+        <w:t>LISTA DE FIGURAS</w:t>
+      </w:r>
+    </w:p>
+    <w:p>
+      <w:pPr>
+        <w:pStyle w:val="FacensFigureList"/>
+        <w:tabs>
+          <w:tab w:pos="9071" w:val="right" w:leader="dot"/>
+        </w:tabs>
+      </w:pPr>
+      <w:hyperlink w:anchor="_TCC_F_IMG_C033" w:history="1">
+        <w:r>
+          <w:rPr>
+            <w:rFonts w:ascii="Arial" w:hAnsi="Arial" w:eastAsia="Arial" w:cs="Arial"/>
+            <w:color w:val="000000"/>
+            <w:u w:val="none"/>
+            <w:sz w:val="24"/>
+          </w:rPr>
+          <w:t>Figura 1 – Fluxo simplificado de processamento em um modelo Transformer.</w:t>
+        </w:r>
+      </w:hyperlink>
+      <w:r>
+        <w:rPr>
+          <w:rFonts w:ascii="Arial" w:hAnsi="Arial" w:eastAsia="Arial" w:cs="Arial"/>
           <w:b w:val="0"/>
-          <w:i w:val="0"/>
-          <w:sz w:val="24"/>
-        </w:rPr>
-        <w:t>Keywords: multi-agent systems; coordination architectures; pharmacy customer service; intelligent agents.</w:t>
-      </w:r>
-    </w:p>
-    <w:p>
-      <w:r>
-        <w:br w:type="page"/>
-      </w:r>
-    </w:p>
-    <w:p>
-      <w:pPr>
-        <w:pStyle w:val="FrontMatterHeading"/>
-        <w:pageBreakBefore/>
-      </w:pPr>
-      <w:r>
-        <w:rPr>
-          <w:rFonts w:ascii="Arial" w:hAnsi="Arial" w:eastAsia="Arial" w:cs="Arial"/>
-          <w:b/>
-          <w:caps/>
-          <w:color w:val="000000"/>
-          <w:sz w:val="28"/>
-        </w:rPr>
-        <w:t>LISTA DE FIGURAS</w:t>
-      </w:r>
+          <w:caps w:val="0"/>
+          <w:color w:val="000000"/>
+          <w:sz w:val="24"/>
+        </w:rPr>
+        <w:tab/>
+      </w:r>
+      <w:hyperlink w:anchor="_TCC_F_IMG_C033" w:history="1">
+        <w:r>
+          <w:rPr>
+            <w:rFonts w:ascii="Arial" w:hAnsi="Arial" w:eastAsia="Arial" w:cs="Arial"/>
+            <w:color w:val="000000"/>
+            <w:u w:val="none"/>
+            <w:sz w:val="24"/>
+          </w:rPr>
+          <w:t>15</w:t>
+        </w:r>
+      </w:hyperlink>
     </w:p>
     <w:p>
       <w:pPr>
@@ -341,7 +375,7 @@
             <w:u w:val="none"/>
             <w:sz w:val="24"/>
           </w:rPr>
-          <w:t>Figura 1 – Ciclo de execução de um agente com ferramentas.</w:t>
+          <w:t>Figura 2 – Ciclo de execução de um agente com ferramentas.</w:t>
         </w:r>
       </w:hyperlink>
       <w:r>
@@ -381,7 +415,7 @@
             <w:u w:val="none"/>
             <w:sz w:val="24"/>
           </w:rPr>
-          <w:t>Figura 2 – Exemplos de topologias de comunicação entre agentes.</w:t>
+          <w:t>Figura 3 – Exemplos de topologias de comunicação entre agentes.</w:t>
         </w:r>
       </w:hyperlink>
       <w:r>
@@ -421,7 +455,7 @@
             <w:u w:val="none"/>
             <w:sz w:val="24"/>
           </w:rPr>
-          <w:t>Figura 3 – Distribuição de controle nas três arquiteturas de coordenação.</w:t>
+          <w:t>Figura 4 – Distribuição de controle nas três arquiteturas de coordenação.</w:t>
         </w:r>
       </w:hyperlink>
       <w:r>
@@ -442,7 +476,7 @@
             <w:u w:val="none"/>
             <w:sz w:val="24"/>
           </w:rPr>
-          <w:t>21</w:t>
+          <w:t>20</w:t>
         </w:r>
       </w:hyperlink>
     </w:p>
@@ -461,7 +495,7 @@
             <w:u w:val="none"/>
             <w:sz w:val="24"/>
           </w:rPr>
-          <w:t>Figura 4 – Processo de construção e validação dos cenários experimentais.</w:t>
+          <w:t>Figura 5 – Processo de construção e validação dos cenários experimentais.</w:t>
         </w:r>
       </w:hyperlink>
       <w:r>
@@ -482,7 +516,7 @@
             <w:u w:val="none"/>
             <w:sz w:val="24"/>
           </w:rPr>
-          <w:t>34</w:t>
+          <w:t>35</w:t>
         </w:r>
       </w:hyperlink>
     </w:p>
@@ -501,7 +535,7 @@
             <w:u w:val="none"/>
             <w:sz w:val="24"/>
           </w:rPr>
-          <w:t>Figura 5 – Etapas metodológicas da pesquisa.</w:t>
+          <w:t>Figura 6 – Etapas metodológicas da pesquisa.</w:t>
         </w:r>
       </w:hyperlink>
       <w:r>
@@ -522,7 +556,7 @@
             <w:u w:val="none"/>
             <w:sz w:val="24"/>
           </w:rPr>
-          <w:t>34</w:t>
+          <w:t>35</w:t>
         </w:r>
       </w:hyperlink>
     </w:p>
@@ -541,7 +575,7 @@
             <w:u w:val="none"/>
             <w:sz w:val="24"/>
           </w:rPr>
-          <w:t>Figura 6 – Delineamento experimental para comparação das arquiteturas.</w:t>
+          <w:t>Figura 7 – Delineamento experimental para comparação das arquiteturas.</w:t>
         </w:r>
       </w:hyperlink>
       <w:r>
@@ -562,7 +596,7 @@
             <w:u w:val="none"/>
             <w:sz w:val="24"/>
           </w:rPr>
-          <w:t>36</w:t>
+          <w:t>37</w:t>
         </w:r>
       </w:hyperlink>
     </w:p>
@@ -581,7 +615,7 @@
             <w:u w:val="none"/>
             <w:sz w:val="24"/>
           </w:rPr>
-          <w:t>Figura 7 – Processo de avaliação híbrida das respostas.</w:t>
+          <w:t>Figura 8 – Processo de avaliação híbrida das respostas.</w:t>
         </w:r>
       </w:hyperlink>
       <w:r>
@@ -602,7 +636,7 @@
             <w:u w:val="none"/>
             <w:sz w:val="24"/>
           </w:rPr>
-          <w:t>41</w:t>
+          <w:t>42</w:t>
         </w:r>
       </w:hyperlink>
     </w:p>
@@ -621,7 +655,7 @@
             <w:u w:val="none"/>
             <w:sz w:val="24"/>
           </w:rPr>
-          <w:t>Figura 8 – Organização dos serviços do MAB.</w:t>
+          <w:t>Figura 9 – Organização dos serviços do MAB.</w:t>
         </w:r>
       </w:hyperlink>
       <w:r>
@@ -642,7 +676,7 @@
             <w:u w:val="none"/>
             <w:sz w:val="24"/>
           </w:rPr>
-          <w:t>46</w:t>
+          <w:t>47</w:t>
         </w:r>
       </w:hyperlink>
     </w:p>
@@ -661,7 +695,7 @@
             <w:u w:val="none"/>
             <w:sz w:val="24"/>
           </w:rPr>
-          <w:t>Figura 9 – Base funcional e configurações comparadas no MAB.</w:t>
+          <w:t>Figura 10 – Base funcional e configurações comparadas no MAB.</w:t>
         </w:r>
       </w:hyperlink>
       <w:r>
@@ -682,7 +716,7 @@
             <w:u w:val="none"/>
             <w:sz w:val="24"/>
           </w:rPr>
-          <w:t>50</w:t>
+          <w:t>51</w:t>
         </w:r>
       </w:hyperlink>
     </w:p>
@@ -778,7 +812,7 @@
             <w:u w:val="none"/>
             <w:sz w:val="24"/>
           </w:rPr>
-          <w:t>13</w:t>
+          <w:t>12</w:t>
         </w:r>
       </w:hyperlink>
     </w:p>
@@ -818,7 +852,7 @@
             <w:u w:val="none"/>
             <w:sz w:val="24"/>
           </w:rPr>
-          <w:t>13</w:t>
+          <w:t>12</w:t>
         </w:r>
       </w:hyperlink>
     </w:p>
@@ -858,7 +892,7 @@
             <w:u w:val="none"/>
             <w:sz w:val="24"/>
           </w:rPr>
-          <w:t>14</w:t>
+          <w:t>13</w:t>
         </w:r>
       </w:hyperlink>
     </w:p>
@@ -898,7 +932,7 @@
             <w:u w:val="none"/>
             <w:sz w:val="24"/>
           </w:rPr>
-          <w:t>15</w:t>
+          <w:t>14</w:t>
         </w:r>
       </w:hyperlink>
     </w:p>
@@ -917,7 +951,7 @@
             <w:u w:val="none"/>
             <w:sz w:val="24"/>
           </w:rPr>
-          <w:t>2.3.1 MODELOS DE LINGUAGEM DE GRANDE PORTE</w:t>
+          <w:t>2.3.1 Modelos de linguagem de grande porte</w:t>
         </w:r>
       </w:hyperlink>
       <w:r>
@@ -938,7 +972,7 @@
             <w:u w:val="none"/>
             <w:sz w:val="24"/>
           </w:rPr>
-          <w:t>15</w:t>
+          <w:t>14</w:t>
         </w:r>
       </w:hyperlink>
     </w:p>
@@ -957,7 +991,7 @@
             <w:u w:val="none"/>
             <w:sz w:val="24"/>
           </w:rPr>
-          <w:t>2.3.2 AGENTES BASEADOS EM LLM</w:t>
+          <w:t>2.3.2 Agentes baseados em LLM</w:t>
         </w:r>
       </w:hyperlink>
       <w:r>
@@ -997,7 +1031,7 @@
             <w:u w:val="none"/>
             <w:sz w:val="24"/>
           </w:rPr>
-          <w:t>2.3.3 FERRAMENTAS, CONTEXTO E LIMITES DE EXECUÇÃO</w:t>
+          <w:t>2.3.3 Ferramentas, contexto e limites de execução</w:t>
         </w:r>
       </w:hyperlink>
       <w:r>
@@ -1077,7 +1111,7 @@
             <w:u w:val="none"/>
             <w:sz w:val="24"/>
           </w:rPr>
-          <w:t>2.4.1 AGENTES E DIVISÃO DE RESPONSABILIDADES</w:t>
+          <w:t>2.4.1 Agentes e divisão de responsabilidades</w:t>
         </w:r>
       </w:hyperlink>
       <w:r>
@@ -1117,7 +1151,7 @@
             <w:u w:val="none"/>
             <w:sz w:val="24"/>
           </w:rPr>
-          <w:t>2.4.2 TOPOLOGIA E DISTRIBUIÇÃO DE CONTROLE</w:t>
+          <w:t>2.4.2 Topologia e distribuição de controle</w:t>
         </w:r>
       </w:hyperlink>
       <w:r>
@@ -1157,7 +1191,7 @@
             <w:u w:val="none"/>
             <w:sz w:val="24"/>
           </w:rPr>
-          <w:t>2.4.3 COMUNICAÇÃO, COORDENAÇÃO E OBSERVABILIDADE</w:t>
+          <w:t>2.4.3 Comunicação, coordenação e observabilidade</w:t>
         </w:r>
       </w:hyperlink>
       <w:r>
@@ -1178,7 +1212,7 @@
             <w:u w:val="none"/>
             <w:sz w:val="24"/>
           </w:rPr>
-          <w:t>18</w:t>
+          <w:t>19</w:t>
         </w:r>
       </w:hyperlink>
     </w:p>
@@ -1237,7 +1271,7 @@
             <w:u w:val="none"/>
             <w:sz w:val="24"/>
           </w:rPr>
-          <w:t>2.5.1 ORQUESTRAÇÃO CENTRALIZADA</w:t>
+          <w:t>2.5.1 Orquestração centralizada</w:t>
         </w:r>
       </w:hyperlink>
       <w:r>
@@ -1258,7 +1292,7 @@
             <w:u w:val="none"/>
             <w:sz w:val="24"/>
           </w:rPr>
-          <w:t>19</w:t>
+          <w:t>20</w:t>
         </w:r>
       </w:hyperlink>
     </w:p>
@@ -1277,7 +1311,7 @@
             <w:u w:val="none"/>
             <w:sz w:val="24"/>
           </w:rPr>
-          <w:t>2.5.2 FLUXO ESTRUTURADO (</w:t>
+          <w:t>2.5.2 Fluxo estruturado (</w:t>
         </w:r>
         <w:r>
           <w:rPr>
@@ -1288,7 +1322,7 @@
             <w:i w:val="1"/>
             <w:iCs w:val="1"/>
           </w:rPr>
-          <w:t>WORKFLOW</w:t>
+          <w:t>workflow</w:t>
         </w:r>
         <w:r>
           <w:rPr>
@@ -1337,7 +1371,7 @@
             <w:u w:val="none"/>
             <w:sz w:val="24"/>
           </w:rPr>
-          <w:t>2.5.3 COORDENAÇÃO DESCENTRALIZADA (</w:t>
+          <w:t>2.5.3 Coordenação descentralizada (</w:t>
         </w:r>
         <w:r>
           <w:rPr>
@@ -1348,7 +1382,7 @@
             <w:i w:val="1"/>
             <w:iCs w:val="1"/>
           </w:rPr>
-          <w:t>SWARM</w:t>
+          <w:t>swarm</w:t>
         </w:r>
         <w:r>
           <w:rPr>
@@ -1378,7 +1412,7 @@
             <w:u w:val="none"/>
             <w:sz w:val="24"/>
           </w:rPr>
-          <w:t>20</w:t>
+          <w:t>21</w:t>
         </w:r>
       </w:hyperlink>
     </w:p>
@@ -1397,7 +1431,7 @@
             <w:u w:val="none"/>
             <w:sz w:val="24"/>
           </w:rPr>
-          <w:t>2.5.4 SÍNTESE DA COMPARAÇÃO</w:t>
+          <w:t>2.5.4 Síntese da comparação</w:t>
         </w:r>
       </w:hyperlink>
       <w:r>
@@ -1418,7 +1452,7 @@
             <w:u w:val="none"/>
             <w:sz w:val="24"/>
           </w:rPr>
-          <w:t>20</w:t>
+          <w:t>21</w:t>
         </w:r>
       </w:hyperlink>
     </w:p>
@@ -1458,7 +1492,7 @@
             <w:u w:val="none"/>
             <w:sz w:val="24"/>
           </w:rPr>
-          <w:t>22</w:t>
+          <w:t>23</w:t>
         </w:r>
       </w:hyperlink>
     </w:p>
@@ -1498,7 +1532,7 @@
             <w:u w:val="none"/>
             <w:sz w:val="24"/>
           </w:rPr>
-          <w:t>22</w:t>
+          <w:t>23</w:t>
         </w:r>
       </w:hyperlink>
     </w:p>
@@ -1538,7 +1572,7 @@
             <w:u w:val="none"/>
             <w:sz w:val="24"/>
           </w:rPr>
-          <w:t>23</w:t>
+          <w:t>24</w:t>
         </w:r>
       </w:hyperlink>
     </w:p>
@@ -1578,7 +1612,7 @@
             <w:u w:val="none"/>
             <w:sz w:val="24"/>
           </w:rPr>
-          <w:t>25</w:t>
+          <w:t>26</w:t>
         </w:r>
       </w:hyperlink>
     </w:p>
@@ -1618,7 +1652,7 @@
             <w:u w:val="none"/>
             <w:sz w:val="24"/>
           </w:rPr>
-          <w:t>28</w:t>
+          <w:t>29</w:t>
         </w:r>
       </w:hyperlink>
     </w:p>
@@ -1658,7 +1692,7 @@
             <w:u w:val="none"/>
             <w:sz w:val="24"/>
           </w:rPr>
-          <w:t>30</w:t>
+          <w:t>31</w:t>
         </w:r>
       </w:hyperlink>
     </w:p>
@@ -1698,7 +1732,7 @@
             <w:u w:val="none"/>
             <w:sz w:val="24"/>
           </w:rPr>
-          <w:t>30</w:t>
+          <w:t>31</w:t>
         </w:r>
       </w:hyperlink>
     </w:p>
@@ -1738,7 +1772,7 @@
             <w:u w:val="none"/>
             <w:sz w:val="24"/>
           </w:rPr>
-          <w:t>31</w:t>
+          <w:t>32</w:t>
         </w:r>
       </w:hyperlink>
     </w:p>
@@ -1778,7 +1812,7 @@
             <w:u w:val="none"/>
             <w:sz w:val="24"/>
           </w:rPr>
-          <w:t>32</w:t>
+          <w:t>33</w:t>
         </w:r>
       </w:hyperlink>
     </w:p>
@@ -1818,7 +1852,7 @@
             <w:u w:val="none"/>
             <w:sz w:val="24"/>
           </w:rPr>
-          <w:t>34</w:t>
+          <w:t>35</w:t>
         </w:r>
       </w:hyperlink>
     </w:p>
@@ -1858,7 +1892,7 @@
             <w:u w:val="none"/>
             <w:sz w:val="24"/>
           </w:rPr>
-          <w:t>35</w:t>
+          <w:t>36</w:t>
         </w:r>
       </w:hyperlink>
     </w:p>
@@ -1898,7 +1932,7 @@
             <w:u w:val="none"/>
             <w:sz w:val="24"/>
           </w:rPr>
-          <w:t>36</w:t>
+          <w:t>37</w:t>
         </w:r>
       </w:hyperlink>
     </w:p>
@@ -1938,7 +1972,7 @@
             <w:u w:val="none"/>
             <w:sz w:val="24"/>
           </w:rPr>
-          <w:t>37</w:t>
+          <w:t>38</w:t>
         </w:r>
       </w:hyperlink>
     </w:p>
@@ -1978,7 +2012,7 @@
             <w:u w:val="none"/>
             <w:sz w:val="24"/>
           </w:rPr>
-          <w:t>38</w:t>
+          <w:t>39</w:t>
         </w:r>
       </w:hyperlink>
     </w:p>
@@ -1997,7 +2031,7 @@
             <w:u w:val="none"/>
             <w:sz w:val="24"/>
           </w:rPr>
-          <w:t>4.8.1 DESEMPENHO OPERACIONAL</w:t>
+          <w:t>4.8.1 Desempenho operacional</w:t>
         </w:r>
       </w:hyperlink>
       <w:r>
@@ -2018,7 +2052,7 @@
             <w:u w:val="none"/>
             <w:sz w:val="24"/>
           </w:rPr>
-          <w:t>38</w:t>
+          <w:t>39</w:t>
         </w:r>
       </w:hyperlink>
     </w:p>
@@ -2037,7 +2071,7 @@
             <w:u w:val="none"/>
             <w:sz w:val="24"/>
           </w:rPr>
-          <w:t>4.8.2 CUSTO DE COORDENAÇÃO</w:t>
+          <w:t>4.8.2 Custo de coordenação</w:t>
         </w:r>
       </w:hyperlink>
       <w:r>
@@ -2058,7 +2092,7 @@
             <w:u w:val="none"/>
             <w:sz w:val="24"/>
           </w:rPr>
-          <w:t>38</w:t>
+          <w:t>39</w:t>
         </w:r>
       </w:hyperlink>
     </w:p>
@@ -2077,7 +2111,7 @@
             <w:u w:val="none"/>
             <w:sz w:val="24"/>
           </w:rPr>
-          <w:t>4.8.3 SEGURANÇA E ENCAMINHAMENTO PROFISSIONAL</w:t>
+          <w:t>4.8.3 Segurança e encaminhamento profissional</w:t>
         </w:r>
       </w:hyperlink>
       <w:r>
@@ -2098,7 +2132,7 @@
             <w:u w:val="none"/>
             <w:sz w:val="24"/>
           </w:rPr>
-          <w:t>39</w:t>
+          <w:t>40</w:t>
         </w:r>
       </w:hyperlink>
     </w:p>
@@ -2138,7 +2172,7 @@
             <w:u w:val="none"/>
             <w:sz w:val="24"/>
           </w:rPr>
-          <w:t>39</w:t>
+          <w:t>40</w:t>
         </w:r>
       </w:hyperlink>
     </w:p>
@@ -2178,7 +2212,7 @@
             <w:u w:val="none"/>
             <w:sz w:val="24"/>
           </w:rPr>
-          <w:t>41</w:t>
+          <w:t>42</w:t>
         </w:r>
       </w:hyperlink>
     </w:p>
@@ -2218,7 +2252,7 @@
             <w:u w:val="none"/>
             <w:sz w:val="24"/>
           </w:rPr>
-          <w:t>42</w:t>
+          <w:t>43</w:t>
         </w:r>
       </w:hyperlink>
     </w:p>
@@ -2258,7 +2292,7 @@
             <w:u w:val="none"/>
             <w:sz w:val="24"/>
           </w:rPr>
-          <w:t>43</w:t>
+          <w:t>44</w:t>
         </w:r>
       </w:hyperlink>
     </w:p>
@@ -2298,7 +2332,7 @@
             <w:u w:val="none"/>
             <w:sz w:val="24"/>
           </w:rPr>
-          <w:t>45</w:t>
+          <w:t>46</w:t>
         </w:r>
       </w:hyperlink>
     </w:p>
@@ -2338,7 +2372,7 @@
             <w:u w:val="none"/>
             <w:sz w:val="24"/>
           </w:rPr>
-          <w:t>45</w:t>
+          <w:t>46</w:t>
         </w:r>
       </w:hyperlink>
     </w:p>
@@ -2378,7 +2412,7 @@
             <w:u w:val="none"/>
             <w:sz w:val="24"/>
           </w:rPr>
-          <w:t>45</w:t>
+          <w:t>46</w:t>
         </w:r>
       </w:hyperlink>
     </w:p>
@@ -2418,7 +2452,7 @@
             <w:u w:val="none"/>
             <w:sz w:val="24"/>
           </w:rPr>
-          <w:t>46</w:t>
+          <w:t>47</w:t>
         </w:r>
       </w:hyperlink>
     </w:p>
@@ -2458,7 +2492,7 @@
             <w:u w:val="none"/>
             <w:sz w:val="24"/>
           </w:rPr>
-          <w:t>47</w:t>
+          <w:t>48</w:t>
         </w:r>
       </w:hyperlink>
     </w:p>
@@ -2498,7 +2532,7 @@
             <w:u w:val="none"/>
             <w:sz w:val="24"/>
           </w:rPr>
-          <w:t>48</w:t>
+          <w:t>49</w:t>
         </w:r>
       </w:hyperlink>
     </w:p>
@@ -2538,7 +2572,7 @@
             <w:u w:val="none"/>
             <w:sz w:val="24"/>
           </w:rPr>
-          <w:t>48</w:t>
+          <w:t>49</w:t>
         </w:r>
       </w:hyperlink>
     </w:p>
@@ -2578,7 +2612,7 @@
             <w:u w:val="none"/>
             <w:sz w:val="24"/>
           </w:rPr>
-          <w:t>48</w:t>
+          <w:t>49</w:t>
         </w:r>
       </w:hyperlink>
     </w:p>
@@ -2618,7 +2652,7 @@
             <w:u w:val="none"/>
             <w:sz w:val="24"/>
           </w:rPr>
-          <w:t>49</w:t>
+          <w:t>50</w:t>
         </w:r>
       </w:hyperlink>
     </w:p>
@@ -2658,7 +2692,7 @@
             <w:u w:val="none"/>
             <w:sz w:val="24"/>
           </w:rPr>
-          <w:t>50</w:t>
+          <w:t>51</w:t>
         </w:r>
       </w:hyperlink>
     </w:p>
@@ -2698,7 +2732,7 @@
             <w:u w:val="none"/>
             <w:sz w:val="24"/>
           </w:rPr>
-          <w:t>51</w:t>
+          <w:t>52</w:t>
         </w:r>
       </w:hyperlink>
     </w:p>
@@ -2738,7 +2772,7 @@
             <w:u w:val="none"/>
             <w:sz w:val="24"/>
           </w:rPr>
-          <w:t>51</w:t>
+          <w:t>52</w:t>
         </w:r>
       </w:hyperlink>
     </w:p>
@@ -2778,7 +2812,7 @@
             <w:u w:val="none"/>
             <w:sz w:val="24"/>
           </w:rPr>
-          <w:t>51</w:t>
+          <w:t>52</w:t>
         </w:r>
       </w:hyperlink>
     </w:p>
@@ -2818,7 +2852,7 @@
             <w:u w:val="none"/>
             <w:sz w:val="24"/>
           </w:rPr>
-          <w:t>51</w:t>
+          <w:t>52</w:t>
         </w:r>
       </w:hyperlink>
     </w:p>
@@ -2837,7 +2871,7 @@
             <w:u w:val="none"/>
             <w:sz w:val="24"/>
           </w:rPr>
-          <w:t>7.3.1 CARACTERÍSTICAS E DIFERENÇAS ENTRE AS ARQUITETURAS</w:t>
+          <w:t>7.3.1 Características e diferenças entre as arquiteturas</w:t>
         </w:r>
       </w:hyperlink>
       <w:r>
@@ -2858,7 +2892,7 @@
             <w:u w:val="none"/>
             <w:sz w:val="24"/>
           </w:rPr>
-          <w:t>51</w:t>
+          <w:t>52</w:t>
         </w:r>
       </w:hyperlink>
     </w:p>
@@ -2898,7 +2932,7 @@
             <w:u w:val="none"/>
             <w:sz w:val="24"/>
           </w:rPr>
-          <w:t>52</w:t>
+          <w:t>53</w:t>
         </w:r>
       </w:hyperlink>
     </w:p>
@@ -2938,7 +2972,7 @@
             <w:u w:val="none"/>
             <w:sz w:val="24"/>
           </w:rPr>
-          <w:t>52</w:t>
+          <w:t>53</w:t>
         </w:r>
       </w:hyperlink>
     </w:p>
@@ -2978,7 +3012,7 @@
             <w:u w:val="none"/>
             <w:sz w:val="24"/>
           </w:rPr>
-          <w:t>52</w:t>
+          <w:t>53</w:t>
         </w:r>
       </w:hyperlink>
     </w:p>
@@ -3018,7 +3052,7 @@
             <w:u w:val="none"/>
             <w:sz w:val="24"/>
           </w:rPr>
-          <w:t>52</w:t>
+          <w:t>53</w:t>
         </w:r>
       </w:hyperlink>
     </w:p>
@@ -3058,7 +3092,7 @@
             <w:u w:val="none"/>
             <w:sz w:val="24"/>
           </w:rPr>
-          <w:t>53</w:t>
+          <w:t>54</w:t>
         </w:r>
       </w:hyperlink>
     </w:p>
@@ -3098,7 +3132,7 @@
             <w:u w:val="none"/>
             <w:sz w:val="24"/>
           </w:rPr>
-          <w:t>53</w:t>
+          <w:t>54</w:t>
         </w:r>
       </w:hyperlink>
     </w:p>
@@ -3138,7 +3172,7 @@
             <w:u w:val="none"/>
             <w:sz w:val="24"/>
           </w:rPr>
-          <w:t>53</w:t>
+          <w:t>54</w:t>
         </w:r>
       </w:hyperlink>
     </w:p>
@@ -3178,7 +3212,7 @@
             <w:u w:val="none"/>
             <w:sz w:val="24"/>
           </w:rPr>
-          <w:t>53</w:t>
+          <w:t>54</w:t>
         </w:r>
       </w:hyperlink>
     </w:p>
@@ -3218,7 +3252,7 @@
             <w:u w:val="none"/>
             <w:sz w:val="24"/>
           </w:rPr>
-          <w:t>54</w:t>
+          <w:t>55</w:t>
         </w:r>
       </w:hyperlink>
     </w:p>
@@ -3265,7 +3299,7 @@
           <w:color w:val="000000"/>
           <w:sz w:val="24"/>
         </w:rPr>
-        <w:t>A inteligência artificial (IA) tem ampliado sua presença em diferentes setores econômicos e funções organizacionais, com avanço particularmente visível em atividades ligadas a operações de serviço, automação empresarial e atendimento ao cliente. Relatórios recentes indicam que a adoção de IA deixou de ser predominantemente experimental em muitas organizações e passou a integrar, de forma mais sistemática, processos de negócio voltados à produtividade, à personalização e ao suporte à decisão (STANFORD HAI, 2025; MCKINSEY &amp; COMPANY, 2024a).</w:t>
+        <w:t>A inteligência artificial (IA) tem ampliado sua presença em diferentes setores econômicos e funções organizacionais, sobretudo em atividades ligadas a operações de serviço, automação empresarial e atendimento ao cliente. Relatórios recentes indicam que, em muitas organizações, a adoção de IA deixou de se restringir a projetos-piloto e passou a integrar processos de negócio voltados à produtividade, à personalização e ao suporte à decisão (STANFORD HAI, 2025; MCKINSEY &amp; COMPANY, 2024a).</w:t>
       </w:r>
     </w:p>
     <w:p>
@@ -3276,43 +3310,90 @@
           <w:color w:val="000000"/>
           <w:sz w:val="24"/>
         </w:rPr>
-        <w:t xml:space="preserve">Esse movimento favoreceu o desenvolvimento de sistemas capazes de interpretar solicitações em linguagem natural, acionar ferramentas, estruturar subtarefas e apoiar fluxos de atendimento de maneira mais eficiente. No campo de </w:t>
-      </w:r>
-      <w:r>
-        <w:rPr>
-          <w:rFonts w:ascii="Arial" w:hAnsi="Arial" w:eastAsia="Arial" w:cs="Arial"/>
-          <w:color w:val="000000"/>
-          <w:sz w:val="24"/>
+        <w:t xml:space="preserve">Esse movimento favoreceu o desenvolvimento de sistemas capazes de interpretar solicitações em linguagem natural, acionar ferramentas, estruturar subtarefas e apoiar fluxos de atendimento. Em </w:t>
+      </w:r>
+      <w:r>
+        <w:rPr>
+          <w:rFonts w:ascii="Arial" w:hAnsi="Arial" w:eastAsia="Arial" w:cs="Arial"/>
+          <w:i w:val="1"/>
+          <w:color w:val="000000"/>
+          <w:sz w:val="24"/>
+          <w:iCs w:val="1"/>
+        </w:rPr>
+        <w:t>customer care</w:t>
+      </w:r>
+      <w:r>
+        <w:rPr>
+          <w:rFonts w:ascii="Arial" w:hAnsi="Arial" w:eastAsia="Arial" w:cs="Arial"/>
+          <w:color w:val="000000"/>
+          <w:sz w:val="24"/>
+        </w:rPr>
+        <w:t xml:space="preserve"> e </w:t>
+      </w:r>
+      <w:r>
+        <w:rPr>
+          <w:rFonts w:ascii="Arial" w:hAnsi="Arial" w:eastAsia="Arial" w:cs="Arial"/>
+          <w:i w:val="1"/>
+          <w:color w:val="000000"/>
+          <w:sz w:val="24"/>
+          <w:iCs w:val="1"/>
+        </w:rPr>
+        <w:t>service operations</w:t>
+      </w:r>
+      <w:r>
+        <w:rPr>
+          <w:rFonts w:ascii="Arial" w:hAnsi="Arial" w:eastAsia="Arial" w:cs="Arial"/>
+          <w:color w:val="000000"/>
+          <w:sz w:val="24"/>
+        </w:rPr>
+        <w:t xml:space="preserve">, a literatura recente mostra que a IA vem sendo incorporada a ambientes marcados por alto volume de interações, pressão por rapidez e necessidade de reorganização contínua dos processos (BUESING </w:t>
+      </w:r>
+      <w:r>
+        <w:rPr>
+          <w:rFonts w:ascii="Arial" w:hAnsi="Arial" w:eastAsia="Arial" w:cs="Arial"/>
           <w:i w:val="1"/>
           <w:iCs w:val="1"/>
-        </w:rPr>
-        <w:t>customer care</w:t>
-      </w:r>
-      <w:r>
-        <w:rPr>
-          <w:rFonts w:ascii="Arial" w:hAnsi="Arial" w:eastAsia="Arial" w:cs="Arial"/>
-          <w:color w:val="000000"/>
-          <w:sz w:val="24"/>
-        </w:rPr>
-        <w:t xml:space="preserve"> e </w:t>
-      </w:r>
-      <w:r>
-        <w:rPr>
-          <w:rFonts w:ascii="Arial" w:hAnsi="Arial" w:eastAsia="Arial" w:cs="Arial"/>
-          <w:color w:val="000000"/>
-          <w:sz w:val="24"/>
+          <w:color w:val="000000"/>
+          <w:sz w:val="24"/>
+        </w:rPr>
+        <w:t>et al.</w:t>
+      </w:r>
+      <w:r>
+        <w:rPr>
+          <w:rFonts w:ascii="Arial" w:hAnsi="Arial" w:eastAsia="Arial" w:cs="Arial"/>
+          <w:color w:val="000000"/>
+          <w:sz w:val="24"/>
+        </w:rPr>
+        <w:t xml:space="preserve">, 2024; YU </w:t>
+      </w:r>
+      <w:r>
+        <w:rPr>
+          <w:rFonts w:ascii="Arial" w:hAnsi="Arial" w:eastAsia="Arial" w:cs="Arial"/>
           <w:i w:val="1"/>
           <w:iCs w:val="1"/>
-        </w:rPr>
-        <w:t>service operations</w:t>
-      </w:r>
-      <w:r>
-        <w:rPr>
-          <w:rFonts w:ascii="Arial" w:hAnsi="Arial" w:eastAsia="Arial" w:cs="Arial"/>
-          <w:color w:val="000000"/>
-          <w:sz w:val="24"/>
-        </w:rPr>
-        <w:t xml:space="preserve">, a literatura recente mostra que a IA vem sendo incorporada justamente em cenários marcados por alto volume de interações, pressão por rapidez e necessidade de reorganização contínua dos processos de atendimento (BUESING </w:t>
+          <w:color w:val="000000"/>
+          <w:sz w:val="24"/>
+        </w:rPr>
+        <w:t>et al.</w:t>
+      </w:r>
+      <w:r>
+        <w:rPr>
+          <w:rFonts w:ascii="Arial" w:hAnsi="Arial" w:eastAsia="Arial" w:cs="Arial"/>
+          <w:color w:val="000000"/>
+          <w:sz w:val="24"/>
+        </w:rPr>
+        <w:t>, 2025).</w:t>
+      </w:r>
+    </w:p>
+    <w:p>
+      <w:pPr/>
+      <w:r>
+        <w:rPr>
+          <w:rFonts w:ascii="Arial" w:hAnsi="Arial" w:eastAsia="Arial" w:cs="Arial"/>
+          <w:color w:val="000000"/>
+          <w:sz w:val="24"/>
+        </w:rPr>
+        <w:t xml:space="preserve">Nesse campo, os sistemas multiagentes permitem distribuir responsabilidades entre agentes especializados. Revisões recentes sobre sistemas multiagentes baseados em grandes modelos de linguagem indicam que a arquitetura de coordenação influencia a comunicação entre componentes, o uso de memória, a integração com ferramentas externas, o controle do fluxo de execução e a capacidade de adaptação do sistema (LI </w:t>
       </w:r>
       <w:r>
         <w:rPr>
@@ -3330,7 +3411,7 @@
           <w:color w:val="000000"/>
           <w:sz w:val="24"/>
         </w:rPr>
-        <w:t xml:space="preserve">, 2024; YU </w:t>
+        <w:t xml:space="preserve">, 2024; PICCIALLI </w:t>
       </w:r>
       <w:r>
         <w:rPr>
@@ -3359,54 +3440,7 @@
           <w:color w:val="000000"/>
           <w:sz w:val="24"/>
         </w:rPr>
-        <w:t xml:space="preserve">Nesse cenário, os sistemas multiagentes destacam-se por permitir a distribuição de responsabilidades entre agentes especializados, favorecendo arranjos mais flexíveis, escaláveis e aderentes a problemas complexos. Revisões recentes sobre sistemas multiagentes baseados em grandes modelos de linguagem indicam que a arquitetura de coordenação influencia diretamente aspectos como comunicação entre componentes, uso de memória, integração com ferramentas externas, controle do fluxo de execução e capacidade de adaptação do sistema (LI </w:t>
-      </w:r>
-      <w:r>
-        <w:rPr>
-          <w:rFonts w:ascii="Arial" w:hAnsi="Arial" w:eastAsia="Arial" w:cs="Arial"/>
-          <w:i w:val="1"/>
-          <w:iCs w:val="1"/>
-          <w:color w:val="000000"/>
-          <w:sz w:val="24"/>
-        </w:rPr>
-        <w:t>et al.</w:t>
-      </w:r>
-      <w:r>
-        <w:rPr>
-          <w:rFonts w:ascii="Arial" w:hAnsi="Arial" w:eastAsia="Arial" w:cs="Arial"/>
-          <w:color w:val="000000"/>
-          <w:sz w:val="24"/>
-        </w:rPr>
-        <w:t xml:space="preserve">, 2024; PICCIALLI </w:t>
-      </w:r>
-      <w:r>
-        <w:rPr>
-          <w:rFonts w:ascii="Arial" w:hAnsi="Arial" w:eastAsia="Arial" w:cs="Arial"/>
-          <w:i w:val="1"/>
-          <w:iCs w:val="1"/>
-          <w:color w:val="000000"/>
-          <w:sz w:val="24"/>
-        </w:rPr>
-        <w:t>et al.</w:t>
-      </w:r>
-      <w:r>
-        <w:rPr>
-          <w:rFonts w:ascii="Arial" w:hAnsi="Arial" w:eastAsia="Arial" w:cs="Arial"/>
-          <w:color w:val="000000"/>
-          <w:sz w:val="24"/>
-        </w:rPr>
-        <w:t>, 2025).</w:t>
-      </w:r>
-    </w:p>
-    <w:p>
-      <w:pPr/>
-      <w:r>
-        <w:rPr>
-          <w:rFonts w:ascii="Arial" w:hAnsi="Arial" w:eastAsia="Arial" w:cs="Arial"/>
-          <w:color w:val="000000"/>
-          <w:sz w:val="24"/>
-        </w:rPr>
-        <w:t xml:space="preserve">No contexto farmacêutico, o atendimento não se limita à dispensação de medicamentos. Farmácias comunitárias frequentemente acumulam funções relacionadas à orientação ao usuário, ao esclarecimento de dúvidas, ao suporte sobre serviços disponíveis, à mediação do acesso a informações em saúde e ao encaminhamento de demandas para atendimento profissional apropriado. Ao mesmo tempo, documentos institucionais e estudos recentes mostram que esse ambiente convive com desafios operacionais relevantes, como pressão por produtividade, carga de trabalho elevada, necessidade de rastreabilidade e manutenção da qualidade do cuidado em condições de trabalho adversas (WHO EUROPE, 2024; ALVAREZ </w:t>
+        <w:t xml:space="preserve">Nas farmácias, o atendimento não se limita à dispensação de medicamentos. Estabelecimentos comunitários também orientam usuários, esclarecem dúvidas, informam sobre serviços e encaminham demandas para avaliação profissional. Documentos institucionais e estudos recentes mostram que esse setor convive com pressão por produtividade, carga de trabalho elevada, necessidade de rastreabilidade e manutenção da qualidade do cuidado em condições adversas (WHO EUROPE, 2024; ALVAREZ </w:t>
       </w:r>
       <w:r>
         <w:rPr>
@@ -3696,7 +3730,7 @@
           <w:color w:val="000000"/>
           <w:sz w:val="24"/>
         </w:rPr>
-        <w:t>Este capítulo apresenta os conceitos necessários para comparar arquiteturas de coordenação em sistemas baseados em modelos de linguagem. O atendimento em farmácias delimita o estudo de caso. Em seguida, são discutidos os sistemas conversacionais, o funcionamento dos agentes e as formas de organizar sua execução.</w:t>
+        <w:t>Este capítulo reúne os conceitos que fundamentam a análise comparativa das arquiteturas de coordenação. Primeiro, delimita o atendimento em farmácias como estudo de caso e discute o uso de inteligência artificial nesse ambiente. Em seguida, apresenta modelos de linguagem, agentes inteligentes, sistemas multiagentes e as três arquiteturas examinadas neste trabalho.</w:t>
       </w:r>
     </w:p>
     <w:p>
@@ -3729,7 +3763,7 @@
           <w:color w:val="000000"/>
           <w:sz w:val="24"/>
         </w:rPr>
-        <w:t>O atendimento em farmácias combina atividades comerciais, administrativas e de orientação em saúde. A atuação do farmacêutico não se limita à entrega de medicamentos: inclui apoiar seu uso seguro e encaminhar situações que exigem avaliação profissional (WHO EUROPE, 2024). Para um sistema automatizado, essa variedade torna necessário separar tarefas operacionais de solicitações que envolvem julgamento clínico.</w:t>
+        <w:t>O atendimento em farmácias combina atividades comerciais, administrativas e de orientação em saúde. A atuação do farmacêutico não se limita à entrega de medicamentos, pois inclui apoiar seu uso seguro e conduzir situações que exigem avaliação profissional (WHO EUROPE, 2024). Para um sistema automatizado, essa variedade exige distinguir tarefas operacionais, baseadas em informações institucionais ou consultas a sistemas, de solicitações clínicas, que dependem do julgamento de um farmacêutico.</w:t>
       </w:r>
     </w:p>
     <w:p>
@@ -3740,7 +3774,7 @@
           <w:color w:val="000000"/>
           <w:sz w:val="24"/>
         </w:rPr>
-        <w:t>Uma pergunta sobre horário de funcionamento pode ser respondida com informação institucional. Uma consulta de disponibilidade depende de uma fonte de estoque. Já uma dúvida sobre dose, contraindicação ou interação entre medicamentos requer análise profissional. Esses exemplos representam diferentes necessidades de informação e encaminhamento, mas não são categorias extraídas de conversas reais. A caracterização dos atendimentos será realizada na etapa metodológica prevista para o estudo de caso.</w:t>
+        <w:t>Uma pergunta sobre horário de funcionamento pode ser respondida com informação institucional, enquanto uma consulta de disponibilidade depende de uma fonte de estoque. Dúvidas sobre dose, contraindicação ou interação entre medicamentos, por sua vez, requerem análise profissional. Os exemplos apenas ilustram necessidades distintas de informação e encaminhamento; não representam categorias extraídas de conversas reais. A caracterização dos atendimentos será realizada na etapa metodológica prevista para o estudo de caso.</w:t>
       </w:r>
     </w:p>
     <w:p>
@@ -3798,7 +3832,25 @@
           <w:color w:val="000000"/>
           <w:sz w:val="24"/>
         </w:rPr>
-        <w:t xml:space="preserve"> (2024) analisam uma tarefa mais específica: identificar e corrigir instruções potencialmente incorretas sobre medicamentos em uma farmácia digital. O estudo combina modelo de linguagem, regras de domínio, salvaguardas e revisão farmacêutica. Seu escopo não equivale à validação de um atendente autônomo para qualquer solicitação de saúde. No MAB, a automação permanece restrita a funções operacionais e ao encaminhamento de casos sensíveis. A farmácia fornece, assim, um estudo de caso com diferentes fontes de informação e níveis de risco; o objeto principal da pesquisa continua sendo a coordenação computacional.</w:t>
+        <w:t xml:space="preserve"> (2024) analisam uma tarefa mais específica: identificar e corrigir instruções potencialmente incorretas sobre medicamentos em uma farmácia digital. O estudo combina modelo de linguagem, regras de domínio, salvaguardas e revisão farmacêutica. Seu escopo não equivale à validação de um sistema automatizado capaz de responder, sem supervisão profissional, a qualquer solicitação de saúde. Na plataforma experimental deste trabalho, denominada MAB (</w:t>
+      </w:r>
+      <w:r>
+        <w:rPr>
+          <w:rFonts w:ascii="Arial" w:hAnsi="Arial" w:eastAsia="Arial" w:cs="Arial"/>
+          <w:i w:val="1"/>
+          <w:color w:val="000000"/>
+          <w:sz w:val="24"/>
+          <w:iCs w:val="1"/>
+        </w:rPr>
+        <w:t>multi-agent benchmark</w:t>
+      </w:r>
+      <w:r>
+        <w:rPr>
+          <w:rFonts w:ascii="Arial" w:hAnsi="Arial" w:eastAsia="Arial" w:cs="Arial"/>
+          <w:color w:val="000000"/>
+          <w:sz w:val="24"/>
+        </w:rPr>
+        <w:t>), a automação permanece restrita a funções operacionais e ao encaminhamento de casos sensíveis. A farmácia fornece um estudo de caso com diferentes fontes de informação e níveis de risco; o objeto principal da pesquisa é a forma como o controle, a comunicação, o contexto e o encerramento das tarefas são organizados entre os componentes do sistema.</w:t>
       </w:r>
     </w:p>
     <w:p>
@@ -3918,7 +3970,7 @@
           <w:color w:val="000000"/>
           <w:sz w:val="24"/>
         </w:rPr>
-        <w:t>Neste estudo, a qualidade do atendimento automatizado envolve adequação à solicitação, correção das informações e encaminhamento quando a resposta depende de avaliação humana. Tempo de resposta e consumo de recursos formam outra dimensão. Os critérios devem ser examinados em conjunto: uma resposta fluente pode estar incorreta, e uma execução concluída pode não resolver a necessidade apresentada. A comparação das arquiteturas precisa, por isso, relacionar qualidade da resposta, percurso de coordenação e custo computacional, sem interpretar automação como substituição da decisão farmacêutica.</w:t>
+        <w:t>Neste estudo, a qualidade do atendimento automatizado envolve adequação à solicitação, correção das informações e encaminhamento quando a resposta depende de avaliação humana. Tempo de resposta e consumo de recursos formam a dimensão operacional. Esses critérios devem ser examinados em conjunto, pois uma resposta fluente pode estar incorreta e uma execução concluída pode não resolver a necessidade apresentada. A comparação das arquiteturas precisa relacionar qualidade da resposta, percurso de coordenação e custo computacional, sem interpretar a automação como substituição da decisão farmacêutica.</w:t>
       </w:r>
     </w:p>
     <w:p>
@@ -3944,28 +3996,6 @@
       <w:bookmarkEnd w:id="1004"/>
     </w:p>
     <w:p>
-      <w:pPr>
-        <w:pStyle w:val="Heading3"/>
-        <w:numPr>
-          <w:ilvl w:val="2"/>
-          <w:numId w:val="14"/>
-        </w:numPr>
-        <w:spacing w:before="0" w:after="360"/>
-      </w:pPr>
-      <w:bookmarkStart w:id="1005" w:name="_TCC_H_1005"/>
-      <w:r>
-        <w:rPr>
-          <w:rFonts w:ascii="Arial" w:hAnsi="Arial" w:eastAsia="Arial" w:cs="Arial"/>
-          <w:b w:val="0"/>
-          <w:caps/>
-          <w:color w:val="000000"/>
-          <w:sz w:val="24"/>
-        </w:rPr>
-        <w:t>MODELOS DE LINGUAGEM DE GRANDE PORTE</w:t>
-      </w:r>
-      <w:bookmarkEnd w:id="1005"/>
-    </w:p>
-    <w:p>
       <w:pPr/>
       <w:r>
         <w:rPr>
@@ -3973,134 +4003,7 @@
           <w:color w:val="000000"/>
           <w:sz w:val="24"/>
         </w:rPr>
-        <w:t xml:space="preserve">Modelos de linguagem de grande porte, conhecidos pela sigla LLM, de </w:t>
-      </w:r>
-      <w:r>
-        <w:rPr>
-          <w:rFonts w:ascii="Arial" w:hAnsi="Arial" w:eastAsia="Arial" w:cs="Arial"/>
-          <w:i w:val="1"/>
-          <w:color w:val="000000"/>
-          <w:sz w:val="24"/>
-          <w:iCs w:val="1"/>
-        </w:rPr>
-        <w:t>Large Language Model</w:t>
-      </w:r>
-      <w:r>
-        <w:rPr>
-          <w:rFonts w:ascii="Arial" w:hAnsi="Arial" w:eastAsia="Arial" w:cs="Arial"/>
-          <w:color w:val="000000"/>
-          <w:sz w:val="24"/>
-        </w:rPr>
-        <w:t xml:space="preserve">, aprendem regularidades em grandes coleções de texto. Em um modelo autorregressivo, a geração ocorre pela previsão do próximo </w:t>
-      </w:r>
-      <w:r>
-        <w:rPr>
-          <w:rFonts w:ascii="Arial" w:hAnsi="Arial" w:eastAsia="Arial" w:cs="Arial"/>
-          <w:i/>
-          <w:color w:val="000000"/>
-          <w:sz w:val="24"/>
-        </w:rPr>
-        <w:t>token</w:t>
-      </w:r>
-      <w:r>
-        <w:rPr>
-          <w:rFonts w:ascii="Arial" w:hAnsi="Arial" w:eastAsia="Arial" w:cs="Arial"/>
-          <w:color w:val="000000"/>
-          <w:sz w:val="24"/>
-        </w:rPr>
-        <w:t xml:space="preserve"> a partir dos anteriores. Um </w:t>
-      </w:r>
-      <w:r>
-        <w:rPr>
-          <w:rFonts w:ascii="Arial" w:hAnsi="Arial" w:eastAsia="Arial" w:cs="Arial"/>
-          <w:i/>
-          <w:color w:val="000000"/>
-          <w:sz w:val="24"/>
-        </w:rPr>
-        <w:t>token</w:t>
-      </w:r>
-      <w:r>
-        <w:rPr>
-          <w:rFonts w:ascii="Arial" w:hAnsi="Arial" w:eastAsia="Arial" w:cs="Arial"/>
-          <w:color w:val="000000"/>
-          <w:sz w:val="24"/>
-        </w:rPr>
-        <w:t xml:space="preserve"> é uma unidade de representação textual que pode corresponder a uma palavra, parte dela ou sinal de pontuação. Brown </w:t>
-      </w:r>
-      <w:r>
-        <w:rPr>
-          <w:rFonts w:ascii="Arial" w:hAnsi="Arial" w:eastAsia="Arial" w:cs="Arial"/>
-          <w:i w:val="1"/>
-          <w:iCs w:val="1"/>
-          <w:color w:val="000000"/>
-          <w:sz w:val="24"/>
-        </w:rPr>
-        <w:t>et al.</w:t>
-      </w:r>
-      <w:r>
-        <w:rPr>
-          <w:rFonts w:ascii="Arial" w:hAnsi="Arial" w:eastAsia="Arial" w:cs="Arial"/>
-          <w:color w:val="000000"/>
-          <w:sz w:val="24"/>
-        </w:rPr>
-        <w:t xml:space="preserve"> (2020) demonstram o uso de instruções e exemplos no próprio contexto de entrada para orientar tarefas sem atualizar os parâmetros do modelo a cada solicitação.</w:t>
-      </w:r>
-    </w:p>
-    <w:p>
-      <w:pPr/>
-      <w:r>
-        <w:rPr>
-          <w:rFonts w:ascii="Arial" w:hAnsi="Arial" w:eastAsia="Arial" w:cs="Arial"/>
-          <w:color w:val="000000"/>
-          <w:sz w:val="24"/>
-        </w:rPr>
-        <w:t xml:space="preserve">A arquitetura </w:t>
-      </w:r>
-      <w:r>
-        <w:rPr>
-          <w:rFonts w:ascii="Arial" w:hAnsi="Arial" w:eastAsia="Arial" w:cs="Arial"/>
-          <w:i/>
-          <w:color w:val="000000"/>
-          <w:sz w:val="24"/>
-        </w:rPr>
-        <w:t>Transformer</w:t>
-      </w:r>
-      <w:r>
-        <w:rPr>
-          <w:rFonts w:ascii="Arial" w:hAnsi="Arial" w:eastAsia="Arial" w:cs="Arial"/>
-          <w:color w:val="000000"/>
-          <w:sz w:val="24"/>
-        </w:rPr>
-        <w:t xml:space="preserve">, apresentada por Vaswani </w:t>
-      </w:r>
-      <w:r>
-        <w:rPr>
-          <w:rFonts w:ascii="Arial" w:hAnsi="Arial" w:eastAsia="Arial" w:cs="Arial"/>
-          <w:i w:val="1"/>
-          <w:iCs w:val="1"/>
-          <w:color w:val="000000"/>
-          <w:sz w:val="24"/>
-        </w:rPr>
-        <w:t>et al.</w:t>
-      </w:r>
-      <w:r>
-        <w:rPr>
-          <w:rFonts w:ascii="Arial" w:hAnsi="Arial" w:eastAsia="Arial" w:cs="Arial"/>
-          <w:color w:val="000000"/>
-          <w:sz w:val="24"/>
-        </w:rPr>
-        <w:t xml:space="preserve"> (2017), utiliza mecanismos de atenção para relacionar elementos da sequência. Esse fundamento ajuda a compreender por que o contexto fornecido ao modelo influencia a resposta: diferentes partes da entrada participam do cálculo das representações usadas na geração.</w:t>
-      </w:r>
-    </w:p>
-    <w:p>
-      <w:pPr/>
-      <w:r>
-        <w:rPr>
-          <w:rFonts w:ascii="Arial" w:hAnsi="Arial" w:eastAsia="Arial" w:cs="Arial"/>
-          <w:color w:val="000000"/>
-          <w:sz w:val="24"/>
-        </w:rPr>
-        <w:t>Os parâmetros aprendidos durante o treinamento são distintos do contexto fornecido na execução. Histórico de conversa, instruções e resultados de consultas podem ser incluídos nesse contexto sem representar novo treinamento. O acesso a informações atuais, como disponibilidade de produtos, exige uma fonte externa ao conhecimento aprendido. Por isso, a geração de texto precisa ser integrada às funções do sistema de atendimento.</w:t>
+        <w:t>Modelos de linguagem geram e interpretam texto, mas sua integração a agentes amplia o escopo da execução. Um agente combina o modelo com instruções, contexto, ferramentas e condições de encerramento. As subseções seguintes distinguem esses elementos para evitar que modelo, agente e aplicação sejam tratados como sinônimos.</w:t>
       </w:r>
     </w:p>
     <w:p>
@@ -4112,7 +4015,7 @@
         </w:numPr>
         <w:spacing w:before="360" w:after="360"/>
       </w:pPr>
-      <w:bookmarkStart w:id="1006" w:name="_TCC_H_1006"/>
+      <w:bookmarkStart w:id="1005" w:name="_TCC_H_1005"/>
       <w:r>
         <w:rPr>
           <w:rFonts w:ascii="Arial" w:hAnsi="Arial" w:eastAsia="Arial" w:cs="Arial"/>
@@ -4121,9 +4024,9 @@
           <w:color w:val="000000"/>
           <w:sz w:val="24"/>
         </w:rPr>
-        <w:t>AGENTES BASEADOS EM LLM</w:t>
-      </w:r>
-      <w:bookmarkEnd w:id="1006"/>
+        <w:t>MODELOS DE LINGUAGEM DE GRANDE PORTE</w:t>
+      </w:r>
+      <w:bookmarkEnd w:id="1005"/>
     </w:p>
     <w:p>
       <w:pPr/>
@@ -4133,7 +4036,76 @@
           <w:color w:val="000000"/>
           <w:sz w:val="24"/>
         </w:rPr>
-        <w:t xml:space="preserve">Um agente baseado em LLM combina o modelo com instruções, informações sobre a tarefa e meios de agir no ambiente. Ele utiliza as informações recebidas para selecionar uma ação, observar seu resultado e decidir como continuar. A revisão de Li </w:t>
+        <w:t xml:space="preserve">Modelos de linguagem de grande porte, conhecidos pela sigla LLM, de </w:t>
+      </w:r>
+      <w:r>
+        <w:rPr>
+          <w:rFonts w:ascii="Arial" w:hAnsi="Arial" w:eastAsia="Arial" w:cs="Arial"/>
+          <w:i w:val="1"/>
+          <w:color w:val="000000"/>
+          <w:sz w:val="24"/>
+          <w:iCs w:val="1"/>
+        </w:rPr>
+        <w:t>Large Language Model</w:t>
+      </w:r>
+      <w:r>
+        <w:rPr>
+          <w:rFonts w:ascii="Arial" w:hAnsi="Arial" w:eastAsia="Arial" w:cs="Arial"/>
+          <w:color w:val="000000"/>
+          <w:sz w:val="24"/>
+        </w:rPr>
+        <w:t xml:space="preserve">, aprendem regularidades em grandes coleções de texto. Em um modelo autorregressivo, o texto é produzido passo a passo: a cada etapa, o modelo estima o próximo </w:t>
+      </w:r>
+      <w:r>
+        <w:rPr>
+          <w:rFonts w:ascii="Arial" w:hAnsi="Arial" w:eastAsia="Arial" w:cs="Arial"/>
+          <w:i/>
+          <w:color w:val="000000"/>
+          <w:sz w:val="24"/>
+        </w:rPr>
+        <w:t>token</w:t>
+      </w:r>
+      <w:r>
+        <w:rPr>
+          <w:rFonts w:ascii="Arial" w:hAnsi="Arial" w:eastAsia="Arial" w:cs="Arial"/>
+          <w:color w:val="000000"/>
+          <w:sz w:val="24"/>
+        </w:rPr>
+        <w:t xml:space="preserve"> com base nos </w:t>
+      </w:r>
+      <w:r>
+        <w:rPr>
+          <w:rFonts w:ascii="Arial" w:hAnsi="Arial" w:eastAsia="Arial" w:cs="Arial"/>
+          <w:i/>
+          <w:color w:val="000000"/>
+          <w:sz w:val="24"/>
+        </w:rPr>
+        <w:t>tokens</w:t>
+      </w:r>
+      <w:r>
+        <w:rPr>
+          <w:rFonts w:ascii="Arial" w:hAnsi="Arial" w:eastAsia="Arial" w:cs="Arial"/>
+          <w:color w:val="000000"/>
+          <w:sz w:val="24"/>
+        </w:rPr>
+        <w:t xml:space="preserve"> anteriores e incorpora a unidade escolhida à sequência. Um </w:t>
+      </w:r>
+      <w:r>
+        <w:rPr>
+          <w:rFonts w:ascii="Arial" w:hAnsi="Arial" w:eastAsia="Arial" w:cs="Arial"/>
+          <w:i/>
+          <w:color w:val="000000"/>
+          <w:sz w:val="24"/>
+        </w:rPr>
+        <w:t>token</w:t>
+      </w:r>
+      <w:r>
+        <w:rPr>
+          <w:rFonts w:ascii="Arial" w:hAnsi="Arial" w:eastAsia="Arial" w:cs="Arial"/>
+          <w:color w:val="000000"/>
+          <w:sz w:val="24"/>
+        </w:rPr>
+        <w:t xml:space="preserve"> pode corresponder a uma palavra, parte dela ou sinal de pontuação. Brown </w:t>
       </w:r>
       <w:r>
         <w:rPr>
@@ -4151,7 +4123,7 @@
           <w:color w:val="000000"/>
           <w:sz w:val="24"/>
         </w:rPr>
-        <w:t xml:space="preserve"> (2024) descreve componentes como perfil, percepção, ação e interação, situando o modelo dentro de uma estrutura de execução mais ampla.</w:t>
+        <w:t xml:space="preserve"> (2020) demonstram o uso de instruções e exemplos no próprio contexto de entrada para orientar tarefas sem atualizar os parâmetros do modelo a cada solicitação.</w:t>
       </w:r>
     </w:p>
     <w:p>
@@ -4162,7 +4134,24 @@
           <w:color w:val="000000"/>
           <w:sz w:val="24"/>
         </w:rPr>
-        <w:t xml:space="preserve">Yao </w:t>
+        <w:t xml:space="preserve">A arquitetura </w:t>
+      </w:r>
+      <w:r>
+        <w:rPr>
+          <w:rFonts w:ascii="Arial" w:hAnsi="Arial" w:eastAsia="Arial" w:cs="Arial"/>
+          <w:i/>
+          <w:color w:val="000000"/>
+          <w:sz w:val="24"/>
+        </w:rPr>
+        <w:t>Transformer</w:t>
+      </w:r>
+      <w:r>
+        <w:rPr>
+          <w:rFonts w:ascii="Arial" w:hAnsi="Arial" w:eastAsia="Arial" w:cs="Arial"/>
+          <w:color w:val="000000"/>
+          <w:sz w:val="24"/>
+        </w:rPr>
+        <w:t xml:space="preserve">, apresentada por Vaswani </w:t>
       </w:r>
       <w:r>
         <w:rPr>
@@ -4180,25 +4169,49 @@
           <w:color w:val="000000"/>
           <w:sz w:val="24"/>
         </w:rPr>
-        <w:t xml:space="preserve"> (2023) apresentam o método ReAct, que intercala raciocínio textual, ações e observações do ambiente. O interesse desse método para a fundamentação está no ciclo de execução: uma consulta externa pode fornecer informação para a decisão seguinte, em vez de toda a resposta depender apenas da entrada inicial. Isso não significa que todo agente deva reproduzir exatamente esse método.</w:t>
-      </w:r>
-    </w:p>
-    <w:p>
-      <w:pPr/>
-      <w:r>
-        <w:rPr>
-          <w:rFonts w:ascii="Arial" w:hAnsi="Arial" w:eastAsia="Arial" w:cs="Arial"/>
-          <w:color w:val="000000"/>
-          <w:sz w:val="24"/>
-        </w:rPr>
-        <w:t>A figura a seguir representa uma forma simplificada desse ciclo. A aplicação executa a chamada de ferramenta solicitada pelo modelo, incorpora o retorno ao contexto e pode realizar uma nova consulta ao LLM. O ciclo termina quando há uma resposta ou quando uma condição de encerramento é atingida. Limites de tempo e de chamadas são controles da aplicação, não garantias fornecidas pela linguagem do modelo.</w:t>
-      </w:r>
-    </w:p>
-    <w:p>
-      <w:bookmarkStart w:id="6000" w:name="_TCC_F_IMG_C020"/>
+        <w:t xml:space="preserve"> (2017), utiliza mecanismos de atenção para relacionar elementos da sequência. A Figura 1 sintetiza esse processamento: o texto é convertido em </w:t>
+      </w:r>
+      <w:r>
+        <w:rPr>
+          <w:rFonts w:ascii="Arial" w:hAnsi="Arial" w:eastAsia="Arial" w:cs="Arial"/>
+          <w:i/>
+          <w:color w:val="000000"/>
+          <w:sz w:val="24"/>
+        </w:rPr>
+        <w:t>tokens</w:t>
+      </w:r>
+      <w:r>
+        <w:rPr>
+          <w:rFonts w:ascii="Arial" w:hAnsi="Arial" w:eastAsia="Arial" w:cs="Arial"/>
+          <w:color w:val="000000"/>
+          <w:sz w:val="24"/>
+        </w:rPr>
+        <w:t xml:space="preserve">, representado por vetores com informação de posição e processado por blocos que combinam atenção e transformações internas antes da previsão do próximo </w:t>
+      </w:r>
+      <w:r>
+        <w:rPr>
+          <w:rFonts w:ascii="Arial" w:hAnsi="Arial" w:eastAsia="Arial" w:cs="Arial"/>
+          <w:i/>
+          <w:color w:val="000000"/>
+          <w:sz w:val="24"/>
+        </w:rPr>
+        <w:t>token</w:t>
+      </w:r>
+      <w:r>
+        <w:rPr>
+          <w:rFonts w:ascii="Arial" w:hAnsi="Arial" w:eastAsia="Arial" w:cs="Arial"/>
+          <w:color w:val="000000"/>
+          <w:sz w:val="24"/>
+        </w:rPr>
+        <w:t>. O esquema é conceitual e não representa todas as operações de uma implementação específica.</w:t>
+      </w:r>
+    </w:p>
+    <w:p>
+      <w:bookmarkStart w:id="3006" w:name="_TCC_F_IMG_C033"/>
       <w:pPr>
         <w:pStyle w:val="FigureCaption"/>
         <w:keepNext/>
+        <w:ind w:firstLine="0"/>
         <w:jc w:val="center"/>
       </w:pPr>
       <w:r>
@@ -4279,9 +4292,9 @@
           <w:color w:val="000000"/>
           <w:sz w:val="20"/>
         </w:rPr>
-        <w:t>Ciclo de execução de um agente com ferramentas.</w:t>
-      </w:r>
-      <w:bookmarkEnd w:id="6000"/>
+        <w:t>Fluxo simplificado de processamento em um modelo Transformer.</w:t>
+      </w:r>
+      <w:bookmarkEnd w:id="3006"/>
     </w:p>
     <w:p>
       <w:pPr>
@@ -4298,8 +4311,8 @@
         </w:rPr>
         <w:drawing>
           <wp:inline xmlns:a="http://schemas.openxmlformats.org/drawingml/2006/main" xmlns:pic="http://schemas.openxmlformats.org/drawingml/2006/picture">
-            <wp:extent cx="5580000" cy="3162000"/>
-            <wp:docPr id="10" name="IMG-C020" descr="Entrada de contexto no LLM, seleção de ação, execução de ferramenta, retorno da observação e produção de resposta."/>
+            <wp:extent cx="5580000" cy="1674000"/>
+            <wp:docPr id="10" name="IMG-C033" descr="Fluxo simplificado de processamento em um modelo Transformer."/>
             <wp:cNvGraphicFramePr>
               <a:graphicFrameLocks noChangeAspect="1"/>
             </wp:cNvGraphicFramePr>
@@ -4307,14 +4320,298 @@
               <a:graphicData uri="http://schemas.openxmlformats.org/drawingml/2006/picture">
                 <pic:pic>
                   <pic:nvPicPr>
-                    <pic:cNvPr id="0" name="image.png"/>
+                    <pic:cNvPr id="0" name="15-fluxo-transformer.png"/>
                     <pic:cNvPicPr/>
                   </pic:nvPicPr>
                   <pic:blipFill>
-                    <a:blip r:embed="rId38">
+                    <a:blip r:embed="rId54">
                       <a:extLst>
                         <a:ext uri="{96DAC541-7B7A-43D3-8B79-37D633B846F1}">
-                          <ns0:svgBlip xmlns:ns0="http://schemas.microsoft.com/office/drawing/2016/SVG/main" r:embed="rId51"/>
+                          <ns0:svgBlip xmlns:ns0="http://schemas.microsoft.com/office/drawing/2016/SVG/main" r:embed="rId55"/>
+                        </a:ext>
+                      </a:extLst>
+                    </a:blip>
+                    <a:stretch>
+                      <a:fillRect/>
+                    </a:stretch>
+                  </pic:blipFill>
+                  <pic:spPr>
+                    <a:xfrm>
+                      <a:off x="0" y="0"/>
+                      <a:ext cx="5580000" cy="1674000"/>
+                    </a:xfrm>
+                    <a:prstGeom prst="rect"/>
+                  </pic:spPr>
+                </pic:pic>
+              </a:graphicData>
+            </a:graphic>
+          </wp:inline>
+        </w:drawing>
+      </w:r>
+    </w:p>
+    <w:p>
+      <w:pPr>
+        <w:pStyle w:val="FigureSource"/>
+        <w:ind w:firstLine="0"/>
+        <w:jc w:val="center"/>
+      </w:pPr>
+      <w:r>
+        <w:rPr>
+          <w:rFonts w:ascii="Arial" w:hAnsi="Arial" w:eastAsia="Arial" w:cs="Arial"/>
+          <w:b w:val="0"/>
+          <w:caps w:val="0"/>
+          <w:color w:val="000000"/>
+          <w:sz w:val="20"/>
+        </w:rPr>
+        <w:t xml:space="preserve">Fonte: adaptado de Vaswani </w:t>
+      </w:r>
+      <w:r>
+        <w:rPr>
+          <w:rFonts w:ascii="Arial" w:hAnsi="Arial" w:eastAsia="Arial" w:cs="Arial"/>
+          <w:b w:val="0"/>
+          <w:i w:val="1"/>
+          <w:iCs w:val="1"/>
+          <w:caps w:val="0"/>
+          <w:color w:val="000000"/>
+          <w:sz w:val="20"/>
+        </w:rPr>
+        <w:t>et al.</w:t>
+      </w:r>
+      <w:r>
+        <w:rPr>
+          <w:rFonts w:ascii="Arial" w:hAnsi="Arial" w:eastAsia="Arial" w:cs="Arial"/>
+          <w:b w:val="0"/>
+          <w:caps w:val="0"/>
+          <w:color w:val="000000"/>
+          <w:sz w:val="20"/>
+        </w:rPr>
+        <w:t xml:space="preserve"> (2017).</w:t>
+      </w:r>
+    </w:p>
+    <w:p>
+      <w:pPr/>
+      <w:r>
+        <w:rPr>
+          <w:rFonts w:ascii="Arial" w:hAnsi="Arial" w:eastAsia="Arial" w:cs="Arial"/>
+          <w:color w:val="000000"/>
+          <w:sz w:val="24"/>
+        </w:rPr>
+        <w:t>Os parâmetros aprendidos durante o treinamento permanecem fixos durante a inferência. Histórico de conversa, instruções e resultados de consultas podem ser incluídos na entrada sem constituir novo treinamento; eles apenas orientam a geração naquela execução. O acesso a informações atuais, como disponibilidade de produtos, exige uma fonte externa ao conhecimento aprendido. Por isso, a geração de texto precisa ser integrada às funções do sistema de atendimento.</w:t>
+      </w:r>
+    </w:p>
+    <w:p>
+      <w:pPr>
+        <w:pStyle w:val="Heading3"/>
+        <w:numPr>
+          <w:ilvl w:val="2"/>
+          <w:numId w:val="14"/>
+        </w:numPr>
+        <w:spacing w:before="360" w:after="360"/>
+      </w:pPr>
+      <w:bookmarkStart w:id="1006" w:name="_TCC_H_1006"/>
+      <w:r>
+        <w:rPr>
+          <w:rFonts w:ascii="Arial" w:hAnsi="Arial" w:eastAsia="Arial" w:cs="Arial"/>
+          <w:b w:val="0"/>
+          <w:caps/>
+          <w:color w:val="000000"/>
+          <w:sz w:val="24"/>
+        </w:rPr>
+        <w:t>AGENTES BASEADOS EM LLM</w:t>
+      </w:r>
+      <w:bookmarkEnd w:id="1006"/>
+    </w:p>
+    <w:p>
+      <w:pPr/>
+      <w:r>
+        <w:rPr>
+          <w:rFonts w:ascii="Arial" w:hAnsi="Arial" w:eastAsia="Arial" w:cs="Arial"/>
+          <w:color w:val="000000"/>
+          <w:sz w:val="24"/>
+        </w:rPr>
+        <w:t xml:space="preserve">Um agente baseado em LLM combina o modelo com instruções, informações sobre a tarefa e meios de agir no ambiente. Ele utiliza as informações recebidas para selecionar uma ação, observar seu resultado e decidir como continuar. A revisão de Li </w:t>
+      </w:r>
+      <w:r>
+        <w:rPr>
+          <w:rFonts w:ascii="Arial" w:hAnsi="Arial" w:eastAsia="Arial" w:cs="Arial"/>
+          <w:i w:val="1"/>
+          <w:iCs w:val="1"/>
+          <w:color w:val="000000"/>
+          <w:sz w:val="24"/>
+        </w:rPr>
+        <w:t>et al.</w:t>
+      </w:r>
+      <w:r>
+        <w:rPr>
+          <w:rFonts w:ascii="Arial" w:hAnsi="Arial" w:eastAsia="Arial" w:cs="Arial"/>
+          <w:color w:val="000000"/>
+          <w:sz w:val="24"/>
+        </w:rPr>
+        <w:t xml:space="preserve"> (2024) descreve componentes como perfil, percepção, ação e interação, situando o modelo dentro de uma estrutura de execução mais ampla.</w:t>
+      </w:r>
+    </w:p>
+    <w:p>
+      <w:pPr/>
+      <w:r>
+        <w:rPr>
+          <w:rFonts w:ascii="Arial" w:hAnsi="Arial" w:eastAsia="Arial" w:cs="Arial"/>
+          <w:color w:val="000000"/>
+          <w:sz w:val="24"/>
+        </w:rPr>
+        <w:t xml:space="preserve">Yao </w:t>
+      </w:r>
+      <w:r>
+        <w:rPr>
+          <w:rFonts w:ascii="Arial" w:hAnsi="Arial" w:eastAsia="Arial" w:cs="Arial"/>
+          <w:i w:val="1"/>
+          <w:iCs w:val="1"/>
+          <w:color w:val="000000"/>
+          <w:sz w:val="24"/>
+        </w:rPr>
+        <w:t>et al.</w:t>
+      </w:r>
+      <w:r>
+        <w:rPr>
+          <w:rFonts w:ascii="Arial" w:hAnsi="Arial" w:eastAsia="Arial" w:cs="Arial"/>
+          <w:color w:val="000000"/>
+          <w:sz w:val="24"/>
+        </w:rPr>
+        <w:t xml:space="preserve"> (2023) apresentam o método ReAct, que intercala raciocínio textual, ações e observações do ambiente. O interesse desse método para a fundamentação está no ciclo de execução, pois uma consulta externa pode fornecer informação para a decisão seguinte, em vez de toda a resposta depender apenas da entrada inicial. Isso não significa que todo agente deva reproduzir exatamente esse método.</w:t>
+      </w:r>
+    </w:p>
+    <w:p>
+      <w:pPr/>
+      <w:r>
+        <w:rPr>
+          <w:rFonts w:ascii="Arial" w:hAnsi="Arial" w:eastAsia="Arial" w:cs="Arial"/>
+          <w:color w:val="000000"/>
+          <w:sz w:val="24"/>
+        </w:rPr>
+        <w:t>A Figura 2 representa uma forma simplificada do ciclo de um agente com ferramentas.</w:t>
+      </w:r>
+    </w:p>
+    <w:p>
+      <w:bookmarkStart w:id="3007" w:name="_TCC_F_IMG_C020"/>
+      <w:pPr>
+        <w:pStyle w:val="FigureCaption"/>
+        <w:keepNext/>
+        <w:ind w:firstLine="0"/>
+        <w:jc w:val="center"/>
+      </w:pPr>
+      <w:r>
+        <w:rPr>
+          <w:rFonts w:ascii="Arial" w:hAnsi="Arial" w:eastAsia="Arial" w:cs="Arial"/>
+          <w:b w:val="0"/>
+          <w:caps w:val="0"/>
+          <w:color w:val="000000"/>
+          <w:sz w:val="20"/>
+        </w:rPr>
+        <w:t xml:space="preserve">Figura </w:t>
+      </w:r>
+      <w:r>
+        <w:rPr>
+          <w:rFonts w:ascii="Arial" w:hAnsi="Arial" w:eastAsia="Arial" w:cs="Arial"/>
+          <w:b w:val="0"/>
+          <w:caps w:val="0"/>
+          <w:color w:val="000000"/>
+          <w:sz w:val="20"/>
+        </w:rPr>
+        <w:fldChar w:fldCharType="begin"/>
+      </w:r>
+      <w:r>
+        <w:rPr>
+          <w:rFonts w:ascii="Arial" w:hAnsi="Arial" w:eastAsia="Arial" w:cs="Arial"/>
+          <w:b w:val="0"/>
+          <w:caps w:val="0"/>
+          <w:color w:val="000000"/>
+          <w:sz w:val="20"/>
+        </w:rPr>
+        <w:instrText xml:space="preserve"> SEQ Figura \* ARABIC </w:instrText>
+      </w:r>
+      <w:r>
+        <w:rPr>
+          <w:rFonts w:ascii="Arial" w:hAnsi="Arial" w:eastAsia="Arial" w:cs="Arial"/>
+          <w:b w:val="0"/>
+          <w:caps w:val="0"/>
+          <w:color w:val="000000"/>
+          <w:sz w:val="20"/>
+        </w:rPr>
+        <w:fldChar w:fldCharType="separate"/>
+      </w:r>
+      <w:r>
+        <w:rPr>
+          <w:rFonts w:ascii="Arial" w:hAnsi="Arial" w:eastAsia="Arial" w:cs="Arial"/>
+          <w:b w:val="0"/>
+          <w:caps w:val="0"/>
+          <w:color w:val="000000"/>
+          <w:sz w:val="20"/>
+        </w:rPr>
+        <w:t>2</w:t>
+      </w:r>
+      <w:r>
+        <w:rPr>
+          <w:rFonts w:ascii="Arial" w:hAnsi="Arial" w:eastAsia="Arial" w:cs="Arial"/>
+          <w:b w:val="0"/>
+          <w:caps w:val="0"/>
+          <w:color w:val="000000"/>
+          <w:sz w:val="20"/>
+        </w:rPr>
+        <w:fldChar w:fldCharType="end"/>
+      </w:r>
+      <w:r>
+        <w:rPr>
+          <w:rFonts w:ascii="Arial" w:hAnsi="Arial" w:eastAsia="Arial" w:cs="Arial"/>
+          <w:b w:val="0"/>
+          <w:caps w:val="0"/>
+          <w:color w:val="000000"/>
+          <w:sz w:val="20"/>
+        </w:rPr>
+        <w:t xml:space="preserve"> – </w:t>
+      </w:r>
+      <w:r>
+        <w:rPr>
+          <w:rFonts w:ascii="Arial" w:hAnsi="Arial" w:eastAsia="Arial" w:cs="Arial"/>
+          <w:b w:val="0"/>
+          <w:caps w:val="0"/>
+          <w:color w:val="000000"/>
+          <w:sz w:val="20"/>
+        </w:rPr>
+        <w:t>Ciclo de execução de um agente com ferramentas.</w:t>
+      </w:r>
+      <w:bookmarkEnd w:id="3007"/>
+    </w:p>
+    <w:p>
+      <w:pPr>
+        <w:keepNext/>
+        <w:keepLines/>
+        <w:ind w:firstLine="0"/>
+        <w:jc w:val="center"/>
+      </w:pPr>
+      <w:r>
+        <w:rPr>
+          <w:rFonts w:ascii="Arial" w:hAnsi="Arial" w:eastAsia="Arial" w:cs="Arial"/>
+          <w:color w:val="000000"/>
+          <w:sz w:val="24"/>
+        </w:rPr>
+        <w:drawing>
+          <wp:inline xmlns:a="http://schemas.openxmlformats.org/drawingml/2006/main" xmlns:pic="http://schemas.openxmlformats.org/drawingml/2006/picture">
+            <wp:extent cx="5580000" cy="3162000"/>
+            <wp:docPr id="11" name="IMG-C020" descr="Ciclo de execução de um agente com ferramentas."/>
+            <wp:cNvGraphicFramePr>
+              <a:graphicFrameLocks noChangeAspect="1"/>
+            </wp:cNvGraphicFramePr>
+            <a:graphic>
+              <a:graphicData uri="http://schemas.openxmlformats.org/drawingml/2006/picture">
+                <pic:pic>
+                  <pic:nvPicPr>
+                    <pic:cNvPr id="0" name="02-anatomia-agente-llm.png"/>
+                    <pic:cNvPicPr/>
+                  </pic:nvPicPr>
+                  <pic:blipFill>
+                    <a:blip r:embed="rId56">
+                      <a:extLst>
+                        <a:ext uri="{96DAC541-7B7A-43D3-8B79-37D633B846F1}">
+                          <ns1:svgBlip xmlns:ns1="http://schemas.microsoft.com/office/drawing/2016/SVG/main" r:embed="rId57"/>
                         </a:ext>
                       </a:extLst>
                     </a:blip>
@@ -4339,6 +4636,8 @@
     <w:p>
       <w:pPr>
         <w:pStyle w:val="FigureSource"/>
+        <w:ind w:firstLine="0"/>
+        <w:jc w:val="center"/>
       </w:pPr>
       <w:r>
         <w:rPr>
@@ -4348,7 +4647,7 @@
           <w:color w:val="000000"/>
           <w:sz w:val="20"/>
         </w:rPr>
-        <w:t xml:space="preserve">Fonte: elaboração própria (2026), com base em Yao </w:t>
+        <w:t xml:space="preserve">Fonte: adaptado de Yao </w:t>
       </w:r>
       <w:r>
         <w:rPr>
@@ -4371,6 +4670,17 @@
           <w:sz w:val="20"/>
         </w:rPr>
         <w:t xml:space="preserve"> (2023).</w:t>
+      </w:r>
+    </w:p>
+    <w:p>
+      <w:pPr/>
+      <w:r>
+        <w:rPr>
+          <w:rFonts w:ascii="Arial" w:hAnsi="Arial" w:eastAsia="Arial" w:cs="Arial"/>
+          <w:color w:val="000000"/>
+          <w:sz w:val="24"/>
+        </w:rPr>
+        <w:t>No esquema, a entrada e o contexto são enviados ao LLM, que pode produzir uma resposta ou selecionar uma ação. Quando escolhe uma ferramenta, a aplicação executa a chamada e devolve a observação ao contexto para uma nova consulta ao modelo. O ciclo termina quando o LLM fornece a resposta ou quando a aplicação aplica uma condição de encerramento. Limites de tempo e de chamadas são controles da aplicação, não garantias fornecidas pelo modelo.</w:t>
       </w:r>
     </w:p>
     <w:p>
@@ -4451,28 +4761,6 @@
       <w:bookmarkEnd w:id="1008"/>
     </w:p>
     <w:p>
-      <w:pPr>
-        <w:pStyle w:val="Heading3"/>
-        <w:numPr>
-          <w:ilvl w:val="2"/>
-          <w:numId w:val="14"/>
-        </w:numPr>
-        <w:spacing w:before="0" w:after="360"/>
-      </w:pPr>
-      <w:bookmarkStart w:id="1009" w:name="_TCC_H_1009"/>
-      <w:r>
-        <w:rPr>
-          <w:rFonts w:ascii="Arial" w:hAnsi="Arial" w:eastAsia="Arial" w:cs="Arial"/>
-          <w:b w:val="0"/>
-          <w:caps/>
-          <w:color w:val="000000"/>
-          <w:sz w:val="24"/>
-        </w:rPr>
-        <w:t>AGENTES E DIVISÃO DE RESPONSABILIDADES</w:t>
-      </w:r>
-      <w:bookmarkEnd w:id="1009"/>
-    </w:p>
-    <w:p>
       <w:pPr/>
       <w:r>
         <w:rPr>
@@ -4480,83 +4768,7 @@
           <w:color w:val="000000"/>
           <w:sz w:val="24"/>
         </w:rPr>
-        <w:t xml:space="preserve">Um sistema multiagente reúne agentes que interagem em um ambiente. Eles podem cooperar, competir ou combinar essas relações. Neste trabalho, o recorte é cooperativo: diferentes agentes participam da resolução de uma solicitação. A especialização pode ser definida por instruções, ferramentas e informações acessíveis, mesmo quando os participantes utilizam o mesmo modelo de linguagem (LI </w:t>
-      </w:r>
-      <w:r>
-        <w:rPr>
-          <w:rFonts w:ascii="Arial" w:hAnsi="Arial" w:eastAsia="Arial" w:cs="Arial"/>
-          <w:i w:val="1"/>
-          <w:iCs w:val="1"/>
-          <w:color w:val="000000"/>
-          <w:sz w:val="24"/>
-        </w:rPr>
-        <w:t>et al.</w:t>
-      </w:r>
-      <w:r>
-        <w:rPr>
-          <w:rFonts w:ascii="Arial" w:hAnsi="Arial" w:eastAsia="Arial" w:cs="Arial"/>
-          <w:color w:val="000000"/>
-          <w:sz w:val="24"/>
-        </w:rPr>
-        <w:t>, 2024).</w:t>
-      </w:r>
-    </w:p>
-    <w:p>
-      <w:pPr/>
-      <w:r>
-        <w:rPr>
-          <w:rFonts w:ascii="Arial" w:hAnsi="Arial" w:eastAsia="Arial" w:cs="Arial"/>
-          <w:color w:val="000000"/>
-          <w:sz w:val="24"/>
-        </w:rPr>
-        <w:t xml:space="preserve">Separar responsabilidades permite distribuir tarefas, como recuperar informação, revisar uma resposta e produzir sua versão final. Contudo, essa divisão cria dependências: um agente precisa receber dados suficientes e interpretar corretamente o trabalho anterior. A revisão de Li </w:t>
-      </w:r>
-      <w:r>
-        <w:rPr>
-          <w:rFonts w:ascii="Arial" w:hAnsi="Arial" w:eastAsia="Arial" w:cs="Arial"/>
-          <w:i w:val="1"/>
-          <w:iCs w:val="1"/>
-          <w:color w:val="000000"/>
-          <w:sz w:val="24"/>
-        </w:rPr>
-        <w:t>et al.</w:t>
-      </w:r>
-      <w:r>
-        <w:rPr>
-          <w:rFonts w:ascii="Arial" w:hAnsi="Arial" w:eastAsia="Arial" w:cs="Arial"/>
-          <w:color w:val="000000"/>
-          <w:sz w:val="24"/>
-        </w:rPr>
-        <w:t xml:space="preserve"> (2024) trata a interação como componente próprio do sistema, o que justifica analisar a colaboração além das capacidades individuais.</w:t>
-      </w:r>
-    </w:p>
-    <w:p>
-      <w:pPr/>
-      <w:r>
-        <w:rPr>
-          <w:rFonts w:ascii="Arial" w:hAnsi="Arial" w:eastAsia="Arial" w:cs="Arial"/>
-          <w:color w:val="000000"/>
-          <w:sz w:val="24"/>
-        </w:rPr>
-        <w:t xml:space="preserve">A participação de mais agentes não garante melhor desempenho. Kim </w:t>
-      </w:r>
-      <w:r>
-        <w:rPr>
-          <w:rFonts w:ascii="Arial" w:hAnsi="Arial" w:eastAsia="Arial" w:cs="Arial"/>
-          <w:i w:val="1"/>
-          <w:iCs w:val="1"/>
-          <w:color w:val="000000"/>
-          <w:sz w:val="24"/>
-        </w:rPr>
-        <w:t>et al.</w:t>
-      </w:r>
-      <w:r>
-        <w:rPr>
-          <w:rFonts w:ascii="Arial" w:hAnsi="Arial" w:eastAsia="Arial" w:cs="Arial"/>
-          <w:color w:val="000000"/>
-          <w:sz w:val="24"/>
-        </w:rPr>
-        <w:t xml:space="preserve"> (2026) investigam condições em que a capacidade do modelo e as características da tarefa alteram os benefícios da colaboração. Para este TCC, essa evidência fundamenta a necessidade de avaliar o custo da divisão de trabalho, em vez de considerar a quantidade de agentes como medida de qualidade.</w:t>
+        <w:t>Sistemas multiagentes ampliam o ciclo de um agente ao distribuir tarefas e decisões entre participantes. Para analisar essa organização, é necessário distinguir divisão de responsabilidades, topologia de comunicação, regras de coordenação e mecanismos de observabilidade.</w:t>
       </w:r>
     </w:p>
     <w:p>
@@ -4568,7 +4780,7 @@
         </w:numPr>
         <w:spacing w:before="360" w:after="360"/>
       </w:pPr>
-      <w:bookmarkStart w:id="1010" w:name="_TCC_H_1010"/>
+      <w:bookmarkStart w:id="1009" w:name="_TCC_H_1009"/>
       <w:r>
         <w:rPr>
           <w:rFonts w:ascii="Arial" w:hAnsi="Arial" w:eastAsia="Arial" w:cs="Arial"/>
@@ -4577,9 +4789,9 @@
           <w:color w:val="000000"/>
           <w:sz w:val="24"/>
         </w:rPr>
-        <w:t>TOPOLOGIA E DISTRIBUIÇÃO DE CONTROLE</w:t>
-      </w:r>
-      <w:bookmarkEnd w:id="1010"/>
+        <w:t>AGENTES E DIVISÃO DE RESPONSABILIDADES</w:t>
+      </w:r>
+      <w:bookmarkEnd w:id="1009"/>
     </w:p>
     <w:p>
       <w:pPr/>
@@ -4589,7 +4801,7 @@
           <w:color w:val="000000"/>
           <w:sz w:val="24"/>
         </w:rPr>
-        <w:t xml:space="preserve">A topologia descreve as conexões possíveis entre os participantes. Na estrela, os demais nós se ligam a um centro; na cadeia, as conexões formam uma sequência; na árvore, os nós se organizam em ramificações. Outras redes permitem conexões adicionais entre pares. Zhu </w:t>
+        <w:t xml:space="preserve">Um sistema multiagente reúne agentes que interagem em um ambiente. Eles podem cooperar, competir ou combinar essas relações. Neste trabalho, o recorte é cooperativo: diferentes agentes participam da resolução de uma solicitação. A especialização pode ser definida por instruções, ferramentas e informações acessíveis, mesmo quando os participantes utilizam o mesmo modelo de linguagem (LI </w:t>
       </w:r>
       <w:r>
         <w:rPr>
@@ -4607,14 +4819,124 @@
           <w:color w:val="000000"/>
           <w:sz w:val="24"/>
         </w:rPr>
-        <w:t xml:space="preserve"> (2025) incluem essas formas em sua avaliação de protocolos multiagentes. A figura seguinte apresenta apenas exemplos conceituais das conexões.</w:t>
-      </w:r>
-    </w:p>
-    <w:p>
-      <w:bookmarkStart w:id="6001" w:name="_TCC_F_IMG_C022"/>
+        <w:t>, 2024).</w:t>
+      </w:r>
+    </w:p>
+    <w:p>
+      <w:pPr/>
+      <w:r>
+        <w:rPr>
+          <w:rFonts w:ascii="Arial" w:hAnsi="Arial" w:eastAsia="Arial" w:cs="Arial"/>
+          <w:color w:val="000000"/>
+          <w:sz w:val="24"/>
+        </w:rPr>
+        <w:t xml:space="preserve">Separar responsabilidades permite distribuir tarefas, como recuperar informação, revisar uma resposta e produzir sua versão final. Contudo, essa divisão cria dependências, porque cada agente precisa receber dados suficientes e interpretar corretamente o trabalho anterior. A revisão de Li </w:t>
+      </w:r>
+      <w:r>
+        <w:rPr>
+          <w:rFonts w:ascii="Arial" w:hAnsi="Arial" w:eastAsia="Arial" w:cs="Arial"/>
+          <w:i w:val="1"/>
+          <w:iCs w:val="1"/>
+          <w:color w:val="000000"/>
+          <w:sz w:val="24"/>
+        </w:rPr>
+        <w:t>et al.</w:t>
+      </w:r>
+      <w:r>
+        <w:rPr>
+          <w:rFonts w:ascii="Arial" w:hAnsi="Arial" w:eastAsia="Arial" w:cs="Arial"/>
+          <w:color w:val="000000"/>
+          <w:sz w:val="24"/>
+        </w:rPr>
+        <w:t xml:space="preserve"> (2024) trata a interação como componente próprio do sistema, o que justifica analisar a colaboração além das capacidades individuais.</w:t>
+      </w:r>
+    </w:p>
+    <w:p>
+      <w:pPr/>
+      <w:r>
+        <w:rPr>
+          <w:rFonts w:ascii="Arial" w:hAnsi="Arial" w:eastAsia="Arial" w:cs="Arial"/>
+          <w:color w:val="000000"/>
+          <w:sz w:val="24"/>
+        </w:rPr>
+        <w:t xml:space="preserve">A participação de mais agentes não garante melhor desempenho. Kim </w:t>
+      </w:r>
+      <w:r>
+        <w:rPr>
+          <w:rFonts w:ascii="Arial" w:hAnsi="Arial" w:eastAsia="Arial" w:cs="Arial"/>
+          <w:i w:val="1"/>
+          <w:iCs w:val="1"/>
+          <w:color w:val="000000"/>
+          <w:sz w:val="24"/>
+        </w:rPr>
+        <w:t>et al.</w:t>
+      </w:r>
+      <w:r>
+        <w:rPr>
+          <w:rFonts w:ascii="Arial" w:hAnsi="Arial" w:eastAsia="Arial" w:cs="Arial"/>
+          <w:color w:val="000000"/>
+          <w:sz w:val="24"/>
+        </w:rPr>
+        <w:t xml:space="preserve"> (2026) mostram que os benefícios da colaboração variam conforme a capacidade do modelo e as características da tarefa. Quando a atividade não exige competências complementares ou o modelo individual já é suficiente, a comunicação adicional pode introduzir sobrecarga sem melhorar a resposta. Essa evidência fundamenta a necessidade de avaliar o custo da divisão de trabalho, em vez de considerar a quantidade de agentes como medida de qualidade.</w:t>
+      </w:r>
+    </w:p>
+    <w:p>
+      <w:pPr>
+        <w:pStyle w:val="Heading3"/>
+        <w:numPr>
+          <w:ilvl w:val="2"/>
+          <w:numId w:val="14"/>
+        </w:numPr>
+        <w:spacing w:before="360" w:after="360"/>
+      </w:pPr>
+      <w:bookmarkStart w:id="1010" w:name="_TCC_H_1010"/>
+      <w:r>
+        <w:rPr>
+          <w:rFonts w:ascii="Arial" w:hAnsi="Arial" w:eastAsia="Arial" w:cs="Arial"/>
+          <w:b w:val="0"/>
+          <w:caps/>
+          <w:color w:val="000000"/>
+          <w:sz w:val="24"/>
+        </w:rPr>
+        <w:t>TOPOLOGIA E DISTRIBUIÇÃO DE CONTROLE</w:t>
+      </w:r>
+      <w:bookmarkEnd w:id="1010"/>
+    </w:p>
+    <w:p>
+      <w:pPr/>
+      <w:r>
+        <w:rPr>
+          <w:rFonts w:ascii="Arial" w:hAnsi="Arial" w:eastAsia="Arial" w:cs="Arial"/>
+          <w:color w:val="000000"/>
+          <w:sz w:val="24"/>
+        </w:rPr>
+        <w:t xml:space="preserve">A topologia pode ser representada como um grafo no qual os nós correspondem aos agentes e as arestas indicam as conexões de comunicação permitidas. Na estrela, os agentes periféricos se ligam a um agente central; na cadeia, as conexões formam uma sequência; na árvore, organizam-se em ramificações; e outras redes permitem conexões adicionais entre pares. Zhu </w:t>
+      </w:r>
+      <w:r>
+        <w:rPr>
+          <w:rFonts w:ascii="Arial" w:hAnsi="Arial" w:eastAsia="Arial" w:cs="Arial"/>
+          <w:i w:val="1"/>
+          <w:iCs w:val="1"/>
+          <w:color w:val="000000"/>
+          <w:sz w:val="24"/>
+        </w:rPr>
+        <w:t>et al.</w:t>
+      </w:r>
+      <w:r>
+        <w:rPr>
+          <w:rFonts w:ascii="Arial" w:hAnsi="Arial" w:eastAsia="Arial" w:cs="Arial"/>
+          <w:color w:val="000000"/>
+          <w:sz w:val="24"/>
+        </w:rPr>
+        <w:t xml:space="preserve"> (2025) incluem essas configurações em sua avaliação de protocolos multiagentes. A Figura 3 apresenta exemplos conceituais dessas conexões.</w:t>
+      </w:r>
+    </w:p>
+    <w:p>
+      <w:bookmarkStart w:id="3008" w:name="_TCC_F_IMG_C022"/>
       <w:pPr>
         <w:pStyle w:val="FigureCaption"/>
         <w:keepNext/>
+        <w:ind w:firstLine="0"/>
         <w:jc w:val="center"/>
       </w:pPr>
       <w:r>
@@ -4665,7 +4987,7 @@
           <w:color w:val="000000"/>
           <w:sz w:val="20"/>
         </w:rPr>
-        <w:t>2</w:t>
+        <w:t>3</w:t>
       </w:r>
       <w:r>
         <w:rPr>
@@ -4697,7 +5019,7 @@
         </w:rPr>
         <w:t>Exemplos de topologias de comunicação entre agentes.</w:t>
       </w:r>
-      <w:bookmarkEnd w:id="6001"/>
+      <w:bookmarkEnd w:id="3008"/>
     </w:p>
     <w:p>
       <w:pPr>
@@ -4714,8 +5036,8 @@
         </w:rPr>
         <w:drawing>
           <wp:inline xmlns:a="http://schemas.openxmlformats.org/drawingml/2006/main" xmlns:pic="http://schemas.openxmlformats.org/drawingml/2006/picture">
-            <wp:extent cx="5580000" cy="1999500"/>
-            <wp:docPr id="11" name="IMG-C022" descr="Quatro redes com nós e conexões: estrela, cadeia, árvore e rede com conexões adicionais entre pares."/>
+            <wp:extent cx="5580000" cy="1674000"/>
+            <wp:docPr id="12" name="IMG-C022" descr="Exemplos de topologias de comunicação entre agentes."/>
             <wp:cNvGraphicFramePr>
               <a:graphicFrameLocks noChangeAspect="1"/>
             </wp:cNvGraphicFramePr>
@@ -4723,14 +5045,14 @@
               <a:graphicData uri="http://schemas.openxmlformats.org/drawingml/2006/picture">
                 <pic:pic>
                   <pic:nvPicPr>
-                    <pic:cNvPr id="0" name="image.png"/>
+                    <pic:cNvPr id="0" name="04-topologias-trabalhos-correlatos.png"/>
                     <pic:cNvPicPr/>
                   </pic:nvPicPr>
                   <pic:blipFill>
-                    <a:blip r:embed="rId40">
+                    <a:blip r:embed="rId58">
                       <a:extLst>
                         <a:ext uri="{96DAC541-7B7A-43D3-8B79-37D633B846F1}">
-                          <ns1:svgBlip xmlns:ns1="http://schemas.microsoft.com/office/drawing/2016/SVG/main" r:embed="rId52"/>
+                          <ns2:svgBlip xmlns:ns2="http://schemas.microsoft.com/office/drawing/2016/SVG/main" r:embed="rId59"/>
                         </a:ext>
                       </a:extLst>
                     </a:blip>
@@ -4741,7 +5063,7 @@
                   <pic:spPr>
                     <a:xfrm>
                       <a:off x="0" y="0"/>
-                      <a:ext cx="5580000" cy="1999500"/>
+                      <a:ext cx="5580000" cy="1674000"/>
                     </a:xfrm>
                     <a:prstGeom prst="rect"/>
                   </pic:spPr>
@@ -4755,6 +5077,8 @@
     <w:p>
       <w:pPr>
         <w:pStyle w:val="FigureSource"/>
+        <w:ind w:firstLine="0"/>
+        <w:jc w:val="center"/>
       </w:pPr>
       <w:r>
         <w:rPr>
@@ -4815,7 +5139,7 @@
           <w:color w:val="000000"/>
           <w:sz w:val="24"/>
         </w:rPr>
-        <w:t xml:space="preserve"> (2025) distinguem organização da autoridade, controle de participação, dinâmica das interações e gestão do histórico. Essas dimensões ajudam a descrever as regras de execução que um desenho de conexões não revela.</w:t>
+        <w:t xml:space="preserve"> (2025) distinguem organização da autoridade, controle de participação, dinâmica das interações e gestão do histórico. Essas dimensões descrevem regras de execução que o conjunto de conexões permitido pela topologia não revela.</w:t>
       </w:r>
     </w:p>
     <w:p>
@@ -4826,7 +5150,7 @@
           <w:color w:val="000000"/>
           <w:sz w:val="24"/>
         </w:rPr>
-        <w:t xml:space="preserve">Também é necessário separar estrutura permitida de percurso executado. Uma rede pode admitir várias conexões, embora uma solicitação utilize apenas parte delas. Zhuge </w:t>
+        <w:t xml:space="preserve">Também é necessário separar a estrutura permitida do percurso executado. Uma rede pode admitir várias conexões, embora uma solicitação utilize apenas parte delas. Zhuge </w:t>
       </w:r>
       <w:r>
         <w:rPr>
@@ -4877,7 +5201,7 @@
           <w:color w:val="000000"/>
           <w:sz w:val="24"/>
         </w:rPr>
-        <w:t xml:space="preserve">Comunicação é a troca de informações entre agentes. Coordenação é o conjunto de regras que organiza sua atuação: quem participa, quem recebe a tarefa, como se combinam as respostas e quais condições encerram a execução. Uma transferência de tarefa, ou </w:t>
+        <w:t xml:space="preserve">Comunicação é a troca de informações entre agentes. Coordenação é o conjunto de regras estabelecido para organizar sua atuação. Essas regras definem quem participa, quem recebe a tarefa, como as respostas são combinadas e quais condições encerram a execução. Uma transferência de tarefa, ou </w:t>
       </w:r>
       <w:r>
         <w:rPr>
@@ -4895,7 +5219,7 @@
           <w:color w:val="000000"/>
           <w:sz w:val="24"/>
         </w:rPr>
-        <w:t>, envolve a passagem da continuidade do processamento; uma mensagem, por sua vez, pode apenas fornecer informação a outro participante.</w:t>
+        <w:t>, altera o agente responsável por dar continuidade ao processamento, enquanto uma mensagem apenas fornece informação sem transferir essa responsabilidade.</w:t>
       </w:r>
     </w:p>
     <w:p>
@@ -4906,7 +5230,7 @@
           <w:color w:val="000000"/>
           <w:sz w:val="24"/>
         </w:rPr>
-        <w:t xml:space="preserve">O conteúdo compartilhado pode incluir a solicitação, resultados de ferramentas e partes do histórico. Enviar informação insuficiente pode comprometer a decisão seguinte; repetir todo o contexto em cada interação pode aumentar o consumo de </w:t>
+        <w:t xml:space="preserve">O conteúdo compartilhado pode incluir a solicitação, resultados de ferramentas e partes do histórico. Enviar informação insuficiente pode comprometer a decisão seguinte, enquanto repetir todo o contexto em cada interação pode aumentar o consumo de </w:t>
       </w:r>
       <w:r>
         <w:rPr>
@@ -4952,7 +5276,7 @@
           <w:color w:val="000000"/>
           <w:sz w:val="24"/>
         </w:rPr>
-        <w:t xml:space="preserve">As interações também podem propagar erros ou produzir conflitos. Hammond </w:t>
+        <w:t xml:space="preserve">As interações também podem propagar erros ou produzir conflitos. Cemri </w:t>
       </w:r>
       <w:r>
         <w:rPr>
@@ -4970,24 +5294,7 @@
           <w:color w:val="000000"/>
           <w:sz w:val="24"/>
         </w:rPr>
-        <w:t xml:space="preserve"> (2025), em relatório técnico disponibilizado como </w:t>
-      </w:r>
-      <w:r>
-        <w:rPr>
-          <w:rFonts w:ascii="Arial" w:hAnsi="Arial" w:eastAsia="Arial" w:cs="Arial"/>
-          <w:i/>
-          <w:color w:val="000000"/>
-          <w:sz w:val="24"/>
-        </w:rPr>
-        <w:t>preprint</w:t>
-      </w:r>
-      <w:r>
-        <w:rPr>
-          <w:rFonts w:ascii="Arial" w:hAnsi="Arial" w:eastAsia="Arial" w:cs="Arial"/>
-          <w:color w:val="000000"/>
-          <w:sz w:val="24"/>
-        </w:rPr>
-        <w:t>, sistematizam riscos de descoordenação, conflito e cooperação indesejada. Essa classificação não demonstra que todos esses riscos ocorram no MAB; ela fornece uma base para examinar falhas que surgem da interação entre agentes.</w:t>
+        <w:t xml:space="preserve"> (2025), em estudo publicado nos anais da NeurIPS, propõem uma taxonomia de falhas em sistemas multiagentes baseados em LLM. Entre os problemas analisados estão falhas na especificação, na coordenação entre agentes e na verificação dos resultados. Essa taxonomia não demonstra que tais falhas ocorram na plataforma deste trabalho; ela fornece categorias para interpretar problemas que podem surgir da interação.</w:t>
       </w:r>
     </w:p>
     <w:p>
@@ -4998,7 +5305,7 @@
           <w:color w:val="000000"/>
           <w:sz w:val="24"/>
         </w:rPr>
-        <w:t>A observabilidade permite reconstruir a execução a partir de registros de chamadas, retornos, transferências, erros e tempos. Esses registros ajudam a localizar onde o processamento falhou, mas não comprovam que o conteúdo da resposta esteja correto. Por isso, a avaliação precisa relacionar o percurso técnico com critérios de qualidade da tarefa.</w:t>
+        <w:t>Por fim, a observabilidade permite reconstruir a execução a partir de registros de chamadas, retornos, transferências, erros e tempos. Esses registros ajudam a localizar onde o processamento falhou, mas não comprovam que o conteúdo da resposta esteja correto. Comunicação, coordenação e observabilidade devem, portanto, ser avaliadas em conjunto, relacionando o percurso técnico aos critérios de qualidade da tarefa.</w:t>
       </w:r>
     </w:p>
     <w:p>
@@ -5024,28 +5331,6 @@
       <w:bookmarkEnd w:id="1012"/>
     </w:p>
     <w:p>
-      <w:pPr>
-        <w:pStyle w:val="Heading3"/>
-        <w:numPr>
-          <w:ilvl w:val="2"/>
-          <w:numId w:val="14"/>
-        </w:numPr>
-        <w:spacing w:before="0" w:after="360"/>
-      </w:pPr>
-      <w:bookmarkStart w:id="1013" w:name="_TCC_H_1013"/>
-      <w:r>
-        <w:rPr>
-          <w:rFonts w:ascii="Arial" w:hAnsi="Arial" w:eastAsia="Arial" w:cs="Arial"/>
-          <w:b w:val="0"/>
-          <w:caps/>
-          <w:color w:val="000000"/>
-          <w:sz w:val="24"/>
-        </w:rPr>
-        <w:t>ORQUESTRAÇÃO CENTRALIZADA</w:t>
-      </w:r>
-      <w:bookmarkEnd w:id="1013"/>
-    </w:p>
-    <w:p>
       <w:pPr/>
       <w:r>
         <w:rPr>
@@ -5053,280 +5338,15 @@
           <w:color w:val="000000"/>
           <w:sz w:val="24"/>
         </w:rPr>
-        <w:t xml:space="preserve">Na orquestração centralizada, um controlador concentra as decisões sobre o encaminhamento das tarefas e a composição da resposta. Ele pode acionar outros agentes ou utilizar ferramentas diretamente. A característica que define a centralização é a autoridade sobre o fluxo, e não a existência obrigatória de vários especialistas. A dimensão de organização da autoridade discutida por H. Wang </w:t>
-      </w:r>
-      <w:r>
-        <w:rPr>
-          <w:rFonts w:ascii="Arial" w:hAnsi="Arial" w:eastAsia="Arial" w:cs="Arial"/>
-          <w:i w:val="1"/>
-          <w:iCs w:val="1"/>
-          <w:color w:val="000000"/>
-          <w:sz w:val="24"/>
-        </w:rPr>
-        <w:t>et al.</w:t>
-      </w:r>
-      <w:r>
-        <w:rPr>
-          <w:rFonts w:ascii="Arial" w:hAnsi="Arial" w:eastAsia="Arial" w:cs="Arial"/>
-          <w:color w:val="000000"/>
-          <w:sz w:val="24"/>
-        </w:rPr>
-        <w:t xml:space="preserve"> (2025) sustenta essa distinção.</w:t>
-      </w:r>
-    </w:p>
-    <w:p>
-      <w:pPr/>
-      <w:r>
-        <w:rPr>
-          <w:rFonts w:ascii="Arial" w:hAnsi="Arial" w:eastAsia="Arial" w:cs="Arial"/>
-          <w:color w:val="000000"/>
-          <w:sz w:val="24"/>
-        </w:rPr>
-        <w:t>Um ponto de decisão explícito facilita identificar a origem do encaminhamento e aplicar regras comuns. Ao mesmo tempo, uma escolha incorreta do controlador pode comprometer as etapas seguintes. O efeito sobre latência e custo depende das chamadas realizadas; não decorre automaticamente do rótulo “centralizado”.</w:t>
-      </w:r>
-    </w:p>
-    <w:p>
-      <w:pPr>
-        <w:pStyle w:val="Heading3"/>
-        <w:numPr>
-          <w:ilvl w:val="2"/>
-          <w:numId w:val="14"/>
-        </w:numPr>
-        <w:spacing w:before="360" w:after="360"/>
-      </w:pPr>
-      <w:bookmarkStart w:id="1014" w:name="_TCC_H_1014"/>
-      <w:r>
-        <w:rPr>
-          <w:rFonts w:ascii="Arial" w:hAnsi="Arial" w:eastAsia="Arial" w:cs="Arial"/>
-          <w:b w:val="0"/>
-          <w:caps/>
-          <w:color w:val="000000"/>
-          <w:sz w:val="24"/>
-        </w:rPr>
-        <w:t>FLUXO ESTRUTURADO (</w:t>
-      </w:r>
-      <w:r>
-        <w:rPr>
-          <w:rFonts w:ascii="Arial" w:hAnsi="Arial" w:eastAsia="Arial" w:cs="Arial"/>
-          <w:b w:val="0"/>
-          <w:caps/>
-          <w:color w:val="000000"/>
-          <w:sz w:val="24"/>
-          <w:i w:val="1"/>
-          <w:iCs w:val="1"/>
-        </w:rPr>
-        <w:t>WORKFLOW</w:t>
-      </w:r>
-      <w:r>
-        <w:rPr>
-          <w:rFonts w:ascii="Arial" w:hAnsi="Arial" w:eastAsia="Arial" w:cs="Arial"/>
-          <w:b w:val="0"/>
-          <w:caps/>
-          <w:color w:val="000000"/>
-          <w:sz w:val="24"/>
-        </w:rPr>
-        <w:t>)</w:t>
-      </w:r>
-      <w:bookmarkEnd w:id="1014"/>
-    </w:p>
-    <w:p>
-      <w:pPr/>
-      <w:r>
-        <w:rPr>
-          <w:rFonts w:ascii="Arial" w:hAnsi="Arial" w:eastAsia="Arial" w:cs="Arial"/>
-          <w:color w:val="000000"/>
-          <w:sz w:val="24"/>
-        </w:rPr>
-        <w:t xml:space="preserve">Um </w:t>
-      </w:r>
-      <w:r>
-        <w:rPr>
-          <w:rFonts w:ascii="Arial" w:hAnsi="Arial" w:eastAsia="Arial" w:cs="Arial"/>
-          <w:i w:val="1"/>
-          <w:color w:val="000000"/>
-          <w:sz w:val="24"/>
-          <w:iCs w:val="1"/>
-        </w:rPr>
-        <w:t>workflow</w:t>
-      </w:r>
-      <w:r>
-        <w:rPr>
-          <w:rFonts w:ascii="Arial" w:hAnsi="Arial" w:eastAsia="Arial" w:cs="Arial"/>
-          <w:color w:val="000000"/>
-          <w:sz w:val="24"/>
-        </w:rPr>
-        <w:t xml:space="preserve"> organiza o processamento por etapas e transições definidas na aplicação. Cada etapa pode utilizar um agente, uma ferramenta ou uma regra determinística. A passagem entre etapas pode ser sequencial ou condicional. Assim, um fluxo estruturado não precisa executar sempre o mesmo caminho, mas suas alternativas são estabelecidas no projeto. Yu </w:t>
-      </w:r>
-      <w:r>
-        <w:rPr>
-          <w:rFonts w:ascii="Arial" w:hAnsi="Arial" w:eastAsia="Arial" w:cs="Arial"/>
-          <w:i w:val="1"/>
-          <w:iCs w:val="1"/>
-          <w:color w:val="000000"/>
-          <w:sz w:val="24"/>
-        </w:rPr>
-        <w:t>et al.</w:t>
-      </w:r>
-      <w:r>
-        <w:rPr>
-          <w:rFonts w:ascii="Arial" w:hAnsi="Arial" w:eastAsia="Arial" w:cs="Arial"/>
-          <w:color w:val="000000"/>
-          <w:sz w:val="24"/>
-        </w:rPr>
-        <w:t xml:space="preserve"> (2025) revisam diferentes formas de organização de fluxos de agentes.</w:t>
-      </w:r>
-    </w:p>
-    <w:p>
-      <w:pPr/>
-      <w:r>
-        <w:rPr>
-          <w:rFonts w:ascii="Arial" w:hAnsi="Arial" w:eastAsia="Arial" w:cs="Arial"/>
-          <w:color w:val="000000"/>
-          <w:sz w:val="24"/>
-        </w:rPr>
-        <w:t>A explicitação das transições favorece a identificação da etapa responsável por uma saída e permite definir pontos de validação. A limitação está na cobertura das rotas previstas: solicitações que exigem outra sequência podem depender de uma nova regra. A execução de etapas desnecessárias também pode acrescentar tempo e chamadas ao modelo.</w:t>
-      </w:r>
-    </w:p>
-    <w:p>
-      <w:pPr>
-        <w:pStyle w:val="Heading3"/>
-        <w:numPr>
-          <w:ilvl w:val="2"/>
-          <w:numId w:val="14"/>
-        </w:numPr>
-        <w:spacing w:before="360" w:after="360"/>
-      </w:pPr>
-      <w:bookmarkStart w:id="1015" w:name="_TCC_H_1015"/>
-      <w:r>
-        <w:rPr>
-          <w:rFonts w:ascii="Arial" w:hAnsi="Arial" w:eastAsia="Arial" w:cs="Arial"/>
-          <w:b w:val="0"/>
-          <w:caps/>
-          <w:color w:val="000000"/>
-          <w:sz w:val="24"/>
-        </w:rPr>
-        <w:t>COORDENAÇÃO DESCENTRALIZADA (</w:t>
-      </w:r>
-      <w:r>
-        <w:rPr>
-          <w:rFonts w:ascii="Arial" w:hAnsi="Arial" w:eastAsia="Arial" w:cs="Arial"/>
-          <w:b w:val="0"/>
-          <w:caps/>
-          <w:color w:val="000000"/>
-          <w:sz w:val="24"/>
-          <w:i w:val="1"/>
-          <w:iCs w:val="1"/>
-        </w:rPr>
-        <w:t>SWARM</w:t>
-      </w:r>
-      <w:r>
-        <w:rPr>
-          <w:rFonts w:ascii="Arial" w:hAnsi="Arial" w:eastAsia="Arial" w:cs="Arial"/>
-          <w:b w:val="0"/>
-          <w:caps/>
-          <w:color w:val="000000"/>
-          <w:sz w:val="24"/>
-        </w:rPr>
-        <w:t>)</w:t>
-      </w:r>
-      <w:bookmarkEnd w:id="1015"/>
-    </w:p>
-    <w:p>
-      <w:pPr/>
-      <w:r>
-        <w:rPr>
-          <w:rFonts w:ascii="Arial" w:hAnsi="Arial" w:eastAsia="Arial" w:cs="Arial"/>
-          <w:color w:val="000000"/>
-          <w:sz w:val="24"/>
-        </w:rPr>
-        <w:t xml:space="preserve">Na coordenação descentralizada, agentes podem decidir a continuidade do trabalho e transferir tarefas entre pares. O termo </w:t>
-      </w:r>
-      <w:r>
-        <w:rPr>
-          <w:rFonts w:ascii="Arial" w:hAnsi="Arial" w:eastAsia="Arial" w:cs="Arial"/>
-          <w:i w:val="1"/>
-          <w:color w:val="000000"/>
-          <w:sz w:val="24"/>
-          <w:iCs w:val="1"/>
-        </w:rPr>
-        <w:t>swarm</w:t>
-      </w:r>
-      <w:r>
-        <w:rPr>
-          <w:rFonts w:ascii="Arial" w:hAnsi="Arial" w:eastAsia="Arial" w:cs="Arial"/>
-          <w:color w:val="000000"/>
-          <w:sz w:val="24"/>
-        </w:rPr>
-        <w:t xml:space="preserve"> é utilizado neste estudo para essa forma de delegação. A existência de um agente que inicia a solicitação não elimina a descentralização das decisões posteriores. Também não implica que todos os agentes estejam conectados entre si ou executem em paralelo.</w:t>
-      </w:r>
-    </w:p>
-    <w:p>
-      <w:pPr/>
-      <w:r>
-        <w:rPr>
-          <w:rFonts w:ascii="Arial" w:hAnsi="Arial" w:eastAsia="Arial" w:cs="Arial"/>
-          <w:color w:val="000000"/>
-          <w:sz w:val="24"/>
-        </w:rPr>
-        <w:t xml:space="preserve">Essa organização permite solicitar outra competência durante a execução, mas exige regras para identificar o destinatário, transmitir contexto e encerrar transferências. Em termos conceituais, topologia e autonomia precisam ser analisadas separadamente, como indicam as dimensões de interação de Li </w:t>
-      </w:r>
-      <w:r>
-        <w:rPr>
-          <w:rFonts w:ascii="Arial" w:hAnsi="Arial" w:eastAsia="Arial" w:cs="Arial"/>
-          <w:i w:val="1"/>
-          <w:iCs w:val="1"/>
-          <w:color w:val="000000"/>
-          <w:sz w:val="24"/>
-        </w:rPr>
-        <w:t>et al.</w:t>
-      </w:r>
-      <w:r>
-        <w:rPr>
-          <w:rFonts w:ascii="Arial" w:hAnsi="Arial" w:eastAsia="Arial" w:cs="Arial"/>
-          <w:color w:val="000000"/>
-          <w:sz w:val="24"/>
-        </w:rPr>
-        <w:t xml:space="preserve"> (2024). A ausência de um supervisor em cada etapa não dispensa controle de erros nem acompanhamento do fluxo.</w:t>
-      </w:r>
-    </w:p>
-    <w:p>
-      <w:pPr>
-        <w:pStyle w:val="Heading3"/>
-        <w:numPr>
-          <w:ilvl w:val="2"/>
-          <w:numId w:val="14"/>
-        </w:numPr>
-        <w:spacing w:before="360" w:after="360"/>
-      </w:pPr>
-      <w:bookmarkStart w:id="1016" w:name="_TCC_H_1016"/>
-      <w:r>
-        <w:rPr>
-          <w:rFonts w:ascii="Arial" w:hAnsi="Arial" w:eastAsia="Arial" w:cs="Arial"/>
-          <w:b w:val="0"/>
-          <w:caps/>
-          <w:color w:val="000000"/>
-          <w:sz w:val="24"/>
-        </w:rPr>
-        <w:t>SÍNTESE DA COMPARAÇÃO</w:t>
-      </w:r>
-      <w:bookmarkEnd w:id="1016"/>
-    </w:p>
-    <w:p>
-      <w:pPr/>
-      <w:r>
-        <w:rPr>
-          <w:rFonts w:ascii="Arial" w:hAnsi="Arial" w:eastAsia="Arial" w:cs="Arial"/>
-          <w:color w:val="000000"/>
-          <w:sz w:val="24"/>
-        </w:rPr>
-        <w:t>A figura a seguir resume onde o controle é exercido nas três organizações. Os desenhos são esquemas conceituais: representam possibilidades de coordenação, e não medições ou a sequência exata de uma execução do MAB.</w:t>
-      </w:r>
-    </w:p>
-    <w:p>
-      <w:bookmarkStart w:id="6002" w:name="_TCC_F_IMG_C019"/>
+        <w:t>As arquiteturas de coordenação determinam onde as decisões de encaminhamento são tomadas e como as responsabilidades passam entre os agentes. A Figura 4 resume as três configurações comparadas neste trabalho. Os esquemas representam possibilidades conceituais de organização, não medições nem o percurso exato de uma execução.</w:t>
+      </w:r>
+    </w:p>
+    <w:p>
+      <w:bookmarkStart w:id="3009" w:name="_TCC_F_IMG_C019"/>
       <w:pPr>
         <w:pStyle w:val="FigureCaption"/>
         <w:keepNext/>
+        <w:ind w:firstLine="0"/>
         <w:jc w:val="center"/>
       </w:pPr>
       <w:r>
@@ -5377,7 +5397,7 @@
           <w:color w:val="000000"/>
           <w:sz w:val="20"/>
         </w:rPr>
-        <w:t>3</w:t>
+        <w:t>4</w:t>
       </w:r>
       <w:r>
         <w:rPr>
@@ -5409,7 +5429,7 @@
         </w:rPr>
         <w:t>Distribuição de controle nas três arquiteturas de coordenação.</w:t>
       </w:r>
-      <w:bookmarkEnd w:id="6002"/>
+      <w:bookmarkEnd w:id="3009"/>
     </w:p>
     <w:p>
       <w:pPr>
@@ -5427,7 +5447,7 @@
         <w:drawing>
           <wp:inline xmlns:a="http://schemas.openxmlformats.org/drawingml/2006/main" xmlns:pic="http://schemas.openxmlformats.org/drawingml/2006/picture">
             <wp:extent cx="5580000" cy="3301500"/>
-            <wp:docPr id="12" name="IMG-C019" descr="Supervisor central ligado a agentes, etapas ordenadas por regras e transferências entre agentes sem supervisor em cada passo."/>
+            <wp:docPr id="13" name="IMG-C019" descr="Distribuição de controle nas três arquiteturas de coordenação."/>
             <wp:cNvGraphicFramePr>
               <a:graphicFrameLocks noChangeAspect="1"/>
             </wp:cNvGraphicFramePr>
@@ -5435,14 +5455,14 @@
               <a:graphicData uri="http://schemas.openxmlformats.org/drawingml/2006/picture">
                 <pic:pic>
                   <pic:nvPicPr>
-                    <pic:cNvPr id="0" name="image.png"/>
+                    <pic:cNvPr id="0" name="01-comparacao-arquiteturas.png"/>
                     <pic:cNvPicPr/>
                   </pic:nvPicPr>
                   <pic:blipFill>
-                    <a:blip r:embed="rId42">
+                    <a:blip r:embed="rId60">
                       <a:extLst>
                         <a:ext uri="{96DAC541-7B7A-43D3-8B79-37D633B846F1}">
-                          <ns2:svgBlip xmlns:ns2="http://schemas.microsoft.com/office/drawing/2016/SVG/main" r:embed="rId53"/>
+                          <ns3:svgBlip xmlns:ns3="http://schemas.microsoft.com/office/drawing/2016/SVG/main" r:embed="rId61"/>
                         </a:ext>
                       </a:extLst>
                     </a:blip>
@@ -5467,6 +5487,8 @@
     <w:p>
       <w:pPr>
         <w:pStyle w:val="FigureSource"/>
+        <w:ind w:firstLine="0"/>
+        <w:jc w:val="center"/>
       </w:pPr>
       <w:r>
         <w:rPr>
@@ -5546,6 +5568,28 @@
       </w:r>
     </w:p>
     <w:p>
+      <w:pPr>
+        <w:pStyle w:val="Heading3"/>
+        <w:numPr>
+          <w:ilvl w:val="2"/>
+          <w:numId w:val="14"/>
+        </w:numPr>
+        <w:spacing w:before="360" w:after="360"/>
+      </w:pPr>
+      <w:bookmarkStart w:id="1013" w:name="_TCC_H_1013"/>
+      <w:r>
+        <w:rPr>
+          <w:rFonts w:ascii="Arial" w:hAnsi="Arial" w:eastAsia="Arial" w:cs="Arial"/>
+          <w:b w:val="0"/>
+          <w:caps/>
+          <w:color w:val="000000"/>
+          <w:sz w:val="24"/>
+        </w:rPr>
+        <w:t>ORQUESTRAÇÃO CENTRALIZADA</w:t>
+      </w:r>
+      <w:bookmarkEnd w:id="1013"/>
+    </w:p>
+    <w:p>
       <w:pPr/>
       <w:r>
         <w:rPr>
@@ -5553,7 +5597,7 @@
           <w:color w:val="000000"/>
           <w:sz w:val="24"/>
         </w:rPr>
-        <w:t xml:space="preserve">As três organizações diferem principalmente pela autoridade sobre o próximo passo e pela definição das transições. Entretanto, o custo depende do percurso realmente executado, das chamadas ao modelo e do contexto transmitido. A comparação deve considerar essas decisões em conjunto com a qualidade das respostas, conforme a análise dos mecanismos de colaboração de H. Wang </w:t>
+        <w:t xml:space="preserve">Na orquestração centralizada, um controlador concentra as decisões sobre o encaminhamento das tarefas e a composição da resposta. Ele pode acionar outros agentes ou utilizar ferramentas diretamente. A característica que define a centralização é a autoridade sobre o fluxo, e não a existência obrigatória de vários especialistas. A dimensão de organização da autoridade discutida por H. Wang </w:t>
       </w:r>
       <w:r>
         <w:rPr>
@@ -5571,6 +5615,289 @@
           <w:color w:val="000000"/>
           <w:sz w:val="24"/>
         </w:rPr>
+        <w:t xml:space="preserve"> (2025) sustenta essa distinção.</w:t>
+      </w:r>
+    </w:p>
+    <w:p>
+      <w:pPr/>
+      <w:r>
+        <w:rPr>
+          <w:rFonts w:ascii="Arial" w:hAnsi="Arial" w:eastAsia="Arial" w:cs="Arial"/>
+          <w:color w:val="000000"/>
+          <w:sz w:val="24"/>
+        </w:rPr>
+        <w:t>O primeiro painel da Figura 4 mostra que as decisões de encaminhamento permanecem no supervisor. Esse ponto explícito facilita identificar a origem de cada escolha e aplicar regras comuns. Ao mesmo tempo, uma decisão incorreta do controlador pode comprometer as etapas seguintes. O efeito sobre latência e custo depende das chamadas realizadas e não decorre automaticamente da centralização.</w:t>
+      </w:r>
+    </w:p>
+    <w:p>
+      <w:pPr>
+        <w:pStyle w:val="Heading3"/>
+        <w:numPr>
+          <w:ilvl w:val="2"/>
+          <w:numId w:val="14"/>
+        </w:numPr>
+        <w:spacing w:before="360" w:after="360"/>
+      </w:pPr>
+      <w:bookmarkStart w:id="1014" w:name="_TCC_H_1014"/>
+      <w:r>
+        <w:rPr>
+          <w:rFonts w:ascii="Arial" w:hAnsi="Arial" w:eastAsia="Arial" w:cs="Arial"/>
+          <w:b w:val="0"/>
+          <w:caps/>
+          <w:color w:val="000000"/>
+          <w:sz w:val="24"/>
+        </w:rPr>
+        <w:t>FLUXO ESTRUTURADO (</w:t>
+      </w:r>
+      <w:r>
+        <w:rPr>
+          <w:rFonts w:ascii="Arial" w:hAnsi="Arial" w:eastAsia="Arial" w:cs="Arial"/>
+          <w:b w:val="0"/>
+          <w:caps/>
+          <w:color w:val="000000"/>
+          <w:sz w:val="24"/>
+          <w:i w:val="1"/>
+          <w:iCs w:val="1"/>
+        </w:rPr>
+        <w:t>WORKFLOW</w:t>
+      </w:r>
+      <w:r>
+        <w:rPr>
+          <w:rFonts w:ascii="Arial" w:hAnsi="Arial" w:eastAsia="Arial" w:cs="Arial"/>
+          <w:b w:val="0"/>
+          <w:caps/>
+          <w:color w:val="000000"/>
+          <w:sz w:val="24"/>
+        </w:rPr>
+        <w:t>)</w:t>
+      </w:r>
+      <w:bookmarkEnd w:id="1014"/>
+    </w:p>
+    <w:p>
+      <w:pPr/>
+      <w:r>
+        <w:rPr>
+          <w:rFonts w:ascii="Arial" w:hAnsi="Arial" w:eastAsia="Arial" w:cs="Arial"/>
+          <w:color w:val="000000"/>
+          <w:sz w:val="24"/>
+        </w:rPr>
+        <w:t xml:space="preserve">Um </w:t>
+      </w:r>
+      <w:r>
+        <w:rPr>
+          <w:rFonts w:ascii="Arial" w:hAnsi="Arial" w:eastAsia="Arial" w:cs="Arial"/>
+          <w:i w:val="1"/>
+          <w:color w:val="000000"/>
+          <w:sz w:val="24"/>
+          <w:iCs w:val="1"/>
+        </w:rPr>
+        <w:t>workflow</w:t>
+      </w:r>
+      <w:r>
+        <w:rPr>
+          <w:rFonts w:ascii="Arial" w:hAnsi="Arial" w:eastAsia="Arial" w:cs="Arial"/>
+          <w:color w:val="000000"/>
+          <w:sz w:val="24"/>
+        </w:rPr>
+        <w:t xml:space="preserve"> organiza o processamento por etapas e transições definidas na aplicação. Cada etapa pode utilizar um agente, uma ferramenta ou uma regra determinística. A passagem entre etapas pode ser sequencial ou condicional. Assim, um fluxo estruturado não precisa executar sempre o mesmo caminho, mas suas alternativas são estabelecidas no projeto. Yu </w:t>
+      </w:r>
+      <w:r>
+        <w:rPr>
+          <w:rFonts w:ascii="Arial" w:hAnsi="Arial" w:eastAsia="Arial" w:cs="Arial"/>
+          <w:i w:val="1"/>
+          <w:iCs w:val="1"/>
+          <w:color w:val="000000"/>
+          <w:sz w:val="24"/>
+        </w:rPr>
+        <w:t>et al.</w:t>
+      </w:r>
+      <w:r>
+        <w:rPr>
+          <w:rFonts w:ascii="Arial" w:hAnsi="Arial" w:eastAsia="Arial" w:cs="Arial"/>
+          <w:color w:val="000000"/>
+          <w:sz w:val="24"/>
+        </w:rPr>
+        <w:t xml:space="preserve"> (2025) classificam fluxos de agentes segundo capacidades funcionais, como planejamento, colaboração e integração com APIs, e segundo características arquiteturais, como papéis, formas de orquestração e linguagens de especificação.</w:t>
+      </w:r>
+    </w:p>
+    <w:p>
+      <w:pPr/>
+      <w:r>
+        <w:rPr>
+          <w:rFonts w:ascii="Arial" w:hAnsi="Arial" w:eastAsia="Arial" w:cs="Arial"/>
+          <w:color w:val="000000"/>
+          <w:sz w:val="24"/>
+        </w:rPr>
+        <w:t>No painel central da Figura 4, as decisões estão associadas às transições entre etapas. Essa explicitação favorece a identificação da etapa responsável por uma saída e permite definir pontos de validação. A limitação está na cobertura das rotas previstas, pois solicitações que exigem outra sequência podem depender de uma nova regra. A execução de etapas desnecessárias também pode acrescentar tempo e chamadas ao modelo.</w:t>
+      </w:r>
+    </w:p>
+    <w:p>
+      <w:pPr>
+        <w:pStyle w:val="Heading3"/>
+        <w:numPr>
+          <w:ilvl w:val="2"/>
+          <w:numId w:val="14"/>
+        </w:numPr>
+        <w:spacing w:before="360" w:after="360"/>
+      </w:pPr>
+      <w:bookmarkStart w:id="1015" w:name="_TCC_H_1015"/>
+      <w:r>
+        <w:rPr>
+          <w:rFonts w:ascii="Arial" w:hAnsi="Arial" w:eastAsia="Arial" w:cs="Arial"/>
+          <w:b w:val="0"/>
+          <w:caps/>
+          <w:color w:val="000000"/>
+          <w:sz w:val="24"/>
+        </w:rPr>
+        <w:t>COORDENAÇÃO DESCENTRALIZADA (</w:t>
+      </w:r>
+      <w:r>
+        <w:rPr>
+          <w:rFonts w:ascii="Arial" w:hAnsi="Arial" w:eastAsia="Arial" w:cs="Arial"/>
+          <w:b w:val="0"/>
+          <w:caps/>
+          <w:color w:val="000000"/>
+          <w:sz w:val="24"/>
+          <w:i w:val="1"/>
+          <w:iCs w:val="1"/>
+        </w:rPr>
+        <w:t>SWARM</w:t>
+      </w:r>
+      <w:r>
+        <w:rPr>
+          <w:rFonts w:ascii="Arial" w:hAnsi="Arial" w:eastAsia="Arial" w:cs="Arial"/>
+          <w:b w:val="0"/>
+          <w:caps/>
+          <w:color w:val="000000"/>
+          <w:sz w:val="24"/>
+        </w:rPr>
+        <w:t>)</w:t>
+      </w:r>
+      <w:bookmarkEnd w:id="1015"/>
+    </w:p>
+    <w:p>
+      <w:pPr/>
+      <w:r>
+        <w:rPr>
+          <w:rFonts w:ascii="Arial" w:hAnsi="Arial" w:eastAsia="Arial" w:cs="Arial"/>
+          <w:color w:val="000000"/>
+          <w:sz w:val="24"/>
+        </w:rPr>
+        <w:t xml:space="preserve">Na coordenação descentralizada, agentes podem decidir a continuidade do trabalho e transferir tarefas entre pares. O termo </w:t>
+      </w:r>
+      <w:r>
+        <w:rPr>
+          <w:rFonts w:ascii="Arial" w:hAnsi="Arial" w:eastAsia="Arial" w:cs="Arial"/>
+          <w:i w:val="1"/>
+          <w:color w:val="000000"/>
+          <w:sz w:val="24"/>
+          <w:iCs w:val="1"/>
+        </w:rPr>
+        <w:t>swarm</w:t>
+      </w:r>
+      <w:r>
+        <w:rPr>
+          <w:rFonts w:ascii="Arial" w:hAnsi="Arial" w:eastAsia="Arial" w:cs="Arial"/>
+          <w:color w:val="000000"/>
+          <w:sz w:val="24"/>
+        </w:rPr>
+        <w:t xml:space="preserve"> é utilizado neste estudo para essa forma de delegação. A existência de um agente que inicia a solicitação não elimina a descentralização das decisões posteriores. Também não implica que todos os agentes estejam conectados entre si ou executem em paralelo.</w:t>
+      </w:r>
+    </w:p>
+    <w:p>
+      <w:pPr/>
+      <w:r>
+        <w:rPr>
+          <w:rFonts w:ascii="Arial" w:hAnsi="Arial" w:eastAsia="Arial" w:cs="Arial"/>
+          <w:color w:val="000000"/>
+          <w:sz w:val="24"/>
+        </w:rPr>
+        <w:t xml:space="preserve">O terceiro painel da Figura 4 representa transferências diretas entre agentes. Essa organização permite solicitar outra competência durante a execução, mas essas transferências exigem regras para identificar o destinatário, transmitir contexto e encerrar o percurso. Em termos conceituais, topologia e autonomia precisam ser analisadas separadamente, como indicam as dimensões de interação de Li </w:t>
+      </w:r>
+      <w:r>
+        <w:rPr>
+          <w:rFonts w:ascii="Arial" w:hAnsi="Arial" w:eastAsia="Arial" w:cs="Arial"/>
+          <w:i w:val="1"/>
+          <w:iCs w:val="1"/>
+          <w:color w:val="000000"/>
+          <w:sz w:val="24"/>
+        </w:rPr>
+        <w:t>et al.</w:t>
+      </w:r>
+      <w:r>
+        <w:rPr>
+          <w:rFonts w:ascii="Arial" w:hAnsi="Arial" w:eastAsia="Arial" w:cs="Arial"/>
+          <w:color w:val="000000"/>
+          <w:sz w:val="24"/>
+        </w:rPr>
+        <w:t xml:space="preserve"> (2024). A ausência de um supervisor em cada etapa não dispensa controle de erros nem acompanhamento do fluxo.</w:t>
+      </w:r>
+    </w:p>
+    <w:p>
+      <w:pPr>
+        <w:pStyle w:val="Heading3"/>
+        <w:numPr>
+          <w:ilvl w:val="2"/>
+          <w:numId w:val="14"/>
+        </w:numPr>
+        <w:spacing w:before="360" w:after="360"/>
+      </w:pPr>
+      <w:bookmarkStart w:id="1016" w:name="_TCC_H_1016"/>
+      <w:r>
+        <w:rPr>
+          <w:rFonts w:ascii="Arial" w:hAnsi="Arial" w:eastAsia="Arial" w:cs="Arial"/>
+          <w:b w:val="0"/>
+          <w:caps/>
+          <w:color w:val="000000"/>
+          <w:sz w:val="24"/>
+        </w:rPr>
+        <w:t>SÍNTESE DA COMPARAÇÃO</w:t>
+      </w:r>
+      <w:bookmarkEnd w:id="1016"/>
+    </w:p>
+    <w:p>
+      <w:pPr/>
+      <w:r>
+        <w:rPr>
+          <w:rFonts w:ascii="Arial" w:hAnsi="Arial" w:eastAsia="Arial" w:cs="Arial"/>
+          <w:color w:val="000000"/>
+          <w:sz w:val="24"/>
+        </w:rPr>
+        <w:t xml:space="preserve">As três arquiteturas de coordenação diferem principalmente pela autoridade sobre o próximo passo e pela definição das transições. Entretanto, o custo operacional depende do percurso executado, da quantidade de </w:t>
+      </w:r>
+      <w:r>
+        <w:rPr>
+          <w:rFonts w:ascii="Arial" w:hAnsi="Arial" w:eastAsia="Arial" w:cs="Arial"/>
+          <w:i/>
+          <w:color w:val="000000"/>
+          <w:sz w:val="24"/>
+        </w:rPr>
+        <w:t>tokens</w:t>
+      </w:r>
+      <w:r>
+        <w:rPr>
+          <w:rFonts w:ascii="Arial" w:hAnsi="Arial" w:eastAsia="Arial" w:cs="Arial"/>
+          <w:color w:val="000000"/>
+          <w:sz w:val="24"/>
+        </w:rPr>
+        <w:t xml:space="preserve">, das chamadas ao modelo, do uso de ferramentas e dos recursos necessários para aplicar o protocolo. A comparação deve considerar essas medidas em conjunto com a qualidade das respostas, conforme a análise dos mecanismos de colaboração de H. Wang </w:t>
+      </w:r>
+      <w:r>
+        <w:rPr>
+          <w:rFonts w:ascii="Arial" w:hAnsi="Arial" w:eastAsia="Arial" w:cs="Arial"/>
+          <w:i w:val="1"/>
+          <w:iCs w:val="1"/>
+          <w:color w:val="000000"/>
+          <w:sz w:val="24"/>
+        </w:rPr>
+        <w:t>et al.</w:t>
+      </w:r>
+      <w:r>
+        <w:rPr>
+          <w:rFonts w:ascii="Arial" w:hAnsi="Arial" w:eastAsia="Arial" w:cs="Arial"/>
+          <w:color w:val="000000"/>
+          <w:sz w:val="24"/>
+        </w:rPr>
         <w:t xml:space="preserve"> (2025).</w:t>
       </w:r>
     </w:p>
@@ -5582,7 +5909,7 @@
           <w:color w:val="000000"/>
           <w:sz w:val="24"/>
         </w:rPr>
-        <w:t xml:space="preserve">No MAB, a configuração centralizada utiliza um único agente com ferramentas; o fluxo estruturado e o </w:t>
+        <w:t xml:space="preserve">Na plataforma MAB, a configuração centralizada utiliza um único agente com ferramentas, enquanto o fluxo estruturado e o </w:t>
       </w:r>
       <w:r>
         <w:rPr>
@@ -5600,7 +5927,7 @@
           <w:color w:val="000000"/>
           <w:sz w:val="24"/>
         </w:rPr>
-        <w:t xml:space="preserve"> distribuem responsabilidades entre agentes, conforme descrito no Capítulo 6. Portanto, o experimento compara configurações completas de coordenação com funções de domínio comuns, e não apenas topologias com igual número de agentes. Essa diferença deve ser considerada na interpretação dos resultados, sem atribuir todo efeito exclusivamente ao formato das conexões. O capítulo seguinte apresenta os trabalhos que orientam esse recorte comparativo.</w:t>
+        <w:t xml:space="preserve"> distribuem responsabilidades entre agentes, conforme descrito no Capítulo 6. Portanto, o experimento compara configurações completas de coordenação com funções de domínio comuns, e não apenas topologias com igual número de agentes. Essa diferença deverá ser considerada na interpretação dos resultados, sem atribuir todo efeito exclusivamente ao formato das conexões. O capítulo seguinte apresenta os trabalhos que orientam esse recorte comparativo.</w:t>
       </w:r>
     </w:p>
     <w:p>
@@ -8813,7 +9140,7 @@
           <w:color w:val="000000"/>
           <w:sz w:val="20"/>
         </w:rPr>
-        <w:t>4</w:t>
+        <w:t>5</w:t>
       </w:r>
       <w:r>
         <w:rPr>
@@ -9075,7 +9402,7 @@
           <w:color w:val="000000"/>
           <w:sz w:val="20"/>
         </w:rPr>
-        <w:t>5</w:t>
+        <w:t>6</w:t>
       </w:r>
       <w:r>
         <w:rPr>
@@ -9700,7 +10027,7 @@
           <w:color w:val="000000"/>
           <w:sz w:val="20"/>
         </w:rPr>
-        <w:t>6</w:t>
+        <w:t>7</w:t>
       </w:r>
       <w:r>
         <w:rPr>
@@ -10893,7 +11220,7 @@
           <w:color w:val="000000"/>
           <w:sz w:val="20"/>
         </w:rPr>
-        <w:t>7</w:t>
+        <w:t>8</w:t>
       </w:r>
       <w:r>
         <w:rPr>
@@ -11994,7 +12321,7 @@
           <w:color w:val="000000"/>
           <w:sz w:val="20"/>
         </w:rPr>
-        <w:t>8</w:t>
+        <w:t>9</w:t>
       </w:r>
       <w:r>
         <w:rPr>
@@ -13250,7 +13577,7 @@
           <w:color w:val="000000"/>
           <w:sz w:val="20"/>
         </w:rPr>
-        <w:t>9</w:t>
+        <w:t>10</w:t>
       </w:r>
       <w:r>
         <w:rPr>
@@ -14469,7 +14796,25 @@
           <w:color w:val="000000"/>
           <w:sz w:val="24"/>
         </w:rPr>
-        <w:t xml:space="preserve">FIP. </w:t>
+        <w:t xml:space="preserve">CEMRI, Mert </w:t>
+      </w:r>
+      <w:r>
+        <w:rPr>
+          <w:rFonts w:ascii="Arial" w:hAnsi="Arial" w:eastAsia="Arial" w:cs="Arial"/>
+          <w:i w:val="1"/>
+          <w:iCs w:val="1"/>
+          <w:color w:val="000000"/>
+          <w:sz w:val="24"/>
+        </w:rPr>
+        <w:t>et al.</w:t>
+      </w:r>
+      <w:r>
+        <w:rPr>
+          <w:rFonts w:ascii="Arial" w:hAnsi="Arial" w:eastAsia="Arial" w:cs="Arial"/>
+          <w:color w:val="000000"/>
+          <w:sz w:val="24"/>
+        </w:rPr>
+        <w:t xml:space="preserve"> Why Do Multi-Agent LLM Systems Fail? </w:t>
       </w:r>
       <w:r>
         <w:rPr>
@@ -14479,15 +14824,15 @@
           <w:color w:val="000000"/>
           <w:sz w:val="24"/>
         </w:rPr>
-        <w:t>An artificial intelligence toolkit for pharmacy: an introduction and resource guide for pharmacists</w:t>
-      </w:r>
-      <w:r>
-        <w:rPr>
-          <w:rFonts w:ascii="Arial" w:hAnsi="Arial" w:eastAsia="Arial" w:cs="Arial"/>
-          <w:color w:val="000000"/>
-          <w:sz w:val="24"/>
-        </w:rPr>
-        <w:t>. The Hague: International Pharmaceutical Federation, 2025. Disponível em: https://www.fip.org/file/6202. Acesso em: 30 mar. 2026.</w:t>
+        <w:t>Advances in Neural Information Processing Systems</w:t>
+      </w:r>
+      <w:r>
+        <w:rPr>
+          <w:rFonts w:ascii="Arial" w:hAnsi="Arial" w:eastAsia="Arial" w:cs="Arial"/>
+          <w:color w:val="000000"/>
+          <w:sz w:val="24"/>
+        </w:rPr>
+        <w:t>, [S. l.], v. 38, 2025. DOI: 10.52202/085713-4082. Disponível em: https://doi.org/10.52202/085713-4082. Acesso em: 9 set. 2026.</w:t>
       </w:r>
     </w:p>
     <w:p>
@@ -14501,25 +14846,7 @@
           <w:color w:val="000000"/>
           <w:sz w:val="24"/>
         </w:rPr>
-        <w:t xml:space="preserve">HAMMOND, Lewis </w:t>
-      </w:r>
-      <w:r>
-        <w:rPr>
-          <w:rFonts w:ascii="Arial" w:hAnsi="Arial" w:eastAsia="Arial" w:cs="Arial"/>
-          <w:i w:val="1"/>
-          <w:iCs w:val="1"/>
-          <w:color w:val="000000"/>
-          <w:sz w:val="24"/>
-        </w:rPr>
-        <w:t>et al.</w:t>
-      </w:r>
-      <w:r>
-        <w:rPr>
-          <w:rFonts w:ascii="Arial" w:hAnsi="Arial" w:eastAsia="Arial" w:cs="Arial"/>
-          <w:color w:val="000000"/>
-          <w:sz w:val="24"/>
-        </w:rPr>
-        <w:t xml:space="preserve"> </w:t>
+        <w:t xml:space="preserve">FIP. </w:t>
       </w:r>
       <w:r>
         <w:rPr>
@@ -14529,15 +14856,15 @@
           <w:color w:val="000000"/>
           <w:sz w:val="24"/>
         </w:rPr>
-        <w:t>Multi-Agent Risks from Advanced AI</w:t>
-      </w:r>
-      <w:r>
-        <w:rPr>
-          <w:rFonts w:ascii="Arial" w:hAnsi="Arial" w:eastAsia="Arial" w:cs="Arial"/>
-          <w:color w:val="000000"/>
-          <w:sz w:val="24"/>
-        </w:rPr>
-        <w:t>. arXiv:2502.14143, 2025. Disponível em: https://arxiv.org/abs/2502.14143. Acesso em: 16 ago. 2026.</w:t>
+        <w:t>An artificial intelligence toolkit for pharmacy: an introduction and resource guide for pharmacists</w:t>
+      </w:r>
+      <w:r>
+        <w:rPr>
+          <w:rFonts w:ascii="Arial" w:hAnsi="Arial" w:eastAsia="Arial" w:cs="Arial"/>
+          <w:color w:val="000000"/>
+          <w:sz w:val="24"/>
+        </w:rPr>
+        <w:t>. The Hague: International Pharmaceutical Federation, 2025. Disponível em: https://www.fip.org/file/6202. Acesso em: 30 mar. 2026.</w:t>
       </w:r>
     </w:p>
     <w:p>

</xml_diff>

<commit_message>
docs(tcc): operacionalizar hipoteses e metricas
</commit_message>
<xml_diff>
--- a/TCC/TCC_MAB_Facens_Ralph_10x.docx
+++ b/TCC/TCC_MAB_Facens_Ralph_10x.docx
@@ -636,7 +636,7 @@
             <w:u w:val="none"/>
             <w:sz w:val="24"/>
           </w:rPr>
-          <w:t>42</w:t>
+          <w:t>43</w:t>
         </w:r>
       </w:hyperlink>
     </w:p>
@@ -676,7 +676,7 @@
             <w:u w:val="none"/>
             <w:sz w:val="24"/>
           </w:rPr>
-          <w:t>47</w:t>
+          <w:t>48</w:t>
         </w:r>
       </w:hyperlink>
     </w:p>
@@ -716,7 +716,7 @@
             <w:u w:val="none"/>
             <w:sz w:val="24"/>
           </w:rPr>
-          <w:t>51</w:t>
+          <w:t>52</w:t>
         </w:r>
       </w:hyperlink>
     </w:p>
@@ -2052,7 +2052,7 @@
             <w:u w:val="none"/>
             <w:sz w:val="24"/>
           </w:rPr>
-          <w:t>39</w:t>
+          <w:t>40</w:t>
         </w:r>
       </w:hyperlink>
     </w:p>
@@ -2092,7 +2092,7 @@
             <w:u w:val="none"/>
             <w:sz w:val="24"/>
           </w:rPr>
-          <w:t>39</w:t>
+          <w:t>40</w:t>
         </w:r>
       </w:hyperlink>
     </w:p>
@@ -2172,7 +2172,7 @@
             <w:u w:val="none"/>
             <w:sz w:val="24"/>
           </w:rPr>
-          <w:t>40</w:t>
+          <w:t>41</w:t>
         </w:r>
       </w:hyperlink>
     </w:p>
@@ -2212,7 +2212,7 @@
             <w:u w:val="none"/>
             <w:sz w:val="24"/>
           </w:rPr>
-          <w:t>42</w:t>
+          <w:t>43</w:t>
         </w:r>
       </w:hyperlink>
     </w:p>
@@ -2252,7 +2252,7 @@
             <w:u w:val="none"/>
             <w:sz w:val="24"/>
           </w:rPr>
-          <w:t>43</w:t>
+          <w:t>44</w:t>
         </w:r>
       </w:hyperlink>
     </w:p>
@@ -2292,7 +2292,7 @@
             <w:u w:val="none"/>
             <w:sz w:val="24"/>
           </w:rPr>
-          <w:t>44</w:t>
+          <w:t>45</w:t>
         </w:r>
       </w:hyperlink>
     </w:p>
@@ -2332,7 +2332,7 @@
             <w:u w:val="none"/>
             <w:sz w:val="24"/>
           </w:rPr>
-          <w:t>46</w:t>
+          <w:t>47</w:t>
         </w:r>
       </w:hyperlink>
     </w:p>
@@ -2372,7 +2372,7 @@
             <w:u w:val="none"/>
             <w:sz w:val="24"/>
           </w:rPr>
-          <w:t>46</w:t>
+          <w:t>47</w:t>
         </w:r>
       </w:hyperlink>
     </w:p>
@@ -2412,7 +2412,7 @@
             <w:u w:val="none"/>
             <w:sz w:val="24"/>
           </w:rPr>
-          <w:t>46</w:t>
+          <w:t>47</w:t>
         </w:r>
       </w:hyperlink>
     </w:p>
@@ -2452,7 +2452,7 @@
             <w:u w:val="none"/>
             <w:sz w:val="24"/>
           </w:rPr>
-          <w:t>47</w:t>
+          <w:t>48</w:t>
         </w:r>
       </w:hyperlink>
     </w:p>
@@ -2492,7 +2492,7 @@
             <w:u w:val="none"/>
             <w:sz w:val="24"/>
           </w:rPr>
-          <w:t>48</w:t>
+          <w:t>49</w:t>
         </w:r>
       </w:hyperlink>
     </w:p>
@@ -2532,7 +2532,7 @@
             <w:u w:val="none"/>
             <w:sz w:val="24"/>
           </w:rPr>
-          <w:t>49</w:t>
+          <w:t>50</w:t>
         </w:r>
       </w:hyperlink>
     </w:p>
@@ -2572,7 +2572,7 @@
             <w:u w:val="none"/>
             <w:sz w:val="24"/>
           </w:rPr>
-          <w:t>49</w:t>
+          <w:t>50</w:t>
         </w:r>
       </w:hyperlink>
     </w:p>
@@ -2612,7 +2612,7 @@
             <w:u w:val="none"/>
             <w:sz w:val="24"/>
           </w:rPr>
-          <w:t>49</w:t>
+          <w:t>50</w:t>
         </w:r>
       </w:hyperlink>
     </w:p>
@@ -2652,7 +2652,7 @@
             <w:u w:val="none"/>
             <w:sz w:val="24"/>
           </w:rPr>
-          <w:t>50</w:t>
+          <w:t>51</w:t>
         </w:r>
       </w:hyperlink>
     </w:p>
@@ -2692,7 +2692,7 @@
             <w:u w:val="none"/>
             <w:sz w:val="24"/>
           </w:rPr>
-          <w:t>51</w:t>
+          <w:t>52</w:t>
         </w:r>
       </w:hyperlink>
     </w:p>
@@ -2732,7 +2732,7 @@
             <w:u w:val="none"/>
             <w:sz w:val="24"/>
           </w:rPr>
-          <w:t>52</w:t>
+          <w:t>53</w:t>
         </w:r>
       </w:hyperlink>
     </w:p>
@@ -2772,7 +2772,7 @@
             <w:u w:val="none"/>
             <w:sz w:val="24"/>
           </w:rPr>
-          <w:t>52</w:t>
+          <w:t>53</w:t>
         </w:r>
       </w:hyperlink>
     </w:p>
@@ -2812,7 +2812,7 @@
             <w:u w:val="none"/>
             <w:sz w:val="24"/>
           </w:rPr>
-          <w:t>52</w:t>
+          <w:t>53</w:t>
         </w:r>
       </w:hyperlink>
     </w:p>
@@ -2852,7 +2852,7 @@
             <w:u w:val="none"/>
             <w:sz w:val="24"/>
           </w:rPr>
-          <w:t>52</w:t>
+          <w:t>53</w:t>
         </w:r>
       </w:hyperlink>
     </w:p>
@@ -2892,7 +2892,7 @@
             <w:u w:val="none"/>
             <w:sz w:val="24"/>
           </w:rPr>
-          <w:t>52</w:t>
+          <w:t>53</w:t>
         </w:r>
       </w:hyperlink>
     </w:p>
@@ -2932,7 +2932,7 @@
             <w:u w:val="none"/>
             <w:sz w:val="24"/>
           </w:rPr>
-          <w:t>53</w:t>
+          <w:t>54</w:t>
         </w:r>
       </w:hyperlink>
     </w:p>
@@ -2972,7 +2972,7 @@
             <w:u w:val="none"/>
             <w:sz w:val="24"/>
           </w:rPr>
-          <w:t>53</w:t>
+          <w:t>54</w:t>
         </w:r>
       </w:hyperlink>
     </w:p>
@@ -3012,7 +3012,7 @@
             <w:u w:val="none"/>
             <w:sz w:val="24"/>
           </w:rPr>
-          <w:t>53</w:t>
+          <w:t>54</w:t>
         </w:r>
       </w:hyperlink>
     </w:p>
@@ -3052,7 +3052,7 @@
             <w:u w:val="none"/>
             <w:sz w:val="24"/>
           </w:rPr>
-          <w:t>53</w:t>
+          <w:t>54</w:t>
         </w:r>
       </w:hyperlink>
     </w:p>
@@ -3092,7 +3092,7 @@
             <w:u w:val="none"/>
             <w:sz w:val="24"/>
           </w:rPr>
-          <w:t>54</w:t>
+          <w:t>55</w:t>
         </w:r>
       </w:hyperlink>
     </w:p>
@@ -3132,7 +3132,7 @@
             <w:u w:val="none"/>
             <w:sz w:val="24"/>
           </w:rPr>
-          <w:t>54</w:t>
+          <w:t>55</w:t>
         </w:r>
       </w:hyperlink>
     </w:p>
@@ -3172,7 +3172,7 @@
             <w:u w:val="none"/>
             <w:sz w:val="24"/>
           </w:rPr>
-          <w:t>54</w:t>
+          <w:t>55</w:t>
         </w:r>
       </w:hyperlink>
     </w:p>
@@ -3212,7 +3212,7 @@
             <w:u w:val="none"/>
             <w:sz w:val="24"/>
           </w:rPr>
-          <w:t>54</w:t>
+          <w:t>55</w:t>
         </w:r>
       </w:hyperlink>
     </w:p>
@@ -3252,7 +3252,7 @@
             <w:u w:val="none"/>
             <w:sz w:val="24"/>
           </w:rPr>
-          <w:t>55</w:t>
+          <w:t>56</w:t>
         </w:r>
       </w:hyperlink>
     </w:p>
@@ -8476,17 +8476,6 @@
     <w:p>
       <w:pPr>
         <w:pStyle w:val="ListBullet"/>
-        <w:keepNext w:val="0"/>
-        <w:keepLines/>
-        <w:numPr>
-          <w:ilvl w:val="0"/>
-          <w:numId w:val="15"/>
-        </w:numPr>
-        <w:tabs>
-          <w:tab w:pos="1080" w:val="left"/>
-        </w:tabs>
-        <w:spacing w:before="0" w:after="0" w:line="360" w:lineRule="auto"/>
-        <w:ind w:left="1080" w:right="0" w:hanging="360"/>
       </w:pPr>
       <w:r>
         <w:rPr>
@@ -8500,17 +8489,6 @@
     <w:p>
       <w:pPr>
         <w:pStyle w:val="ListBullet"/>
-        <w:keepNext w:val="0"/>
-        <w:keepLines/>
-        <w:numPr>
-          <w:ilvl w:val="0"/>
-          <w:numId w:val="15"/>
-        </w:numPr>
-        <w:tabs>
-          <w:tab w:pos="1080" w:val="left"/>
-        </w:tabs>
-        <w:spacing w:before="0" w:after="0" w:line="360" w:lineRule="auto"/>
-        <w:ind w:left="1080" w:right="0" w:hanging="360"/>
       </w:pPr>
       <w:r>
         <w:rPr>
@@ -8534,17 +8512,6 @@
     <w:p>
       <w:pPr>
         <w:pStyle w:val="ListBullet"/>
-        <w:keepNext w:val="0"/>
-        <w:keepLines/>
-        <w:numPr>
-          <w:ilvl w:val="0"/>
-          <w:numId w:val="15"/>
-        </w:numPr>
-        <w:tabs>
-          <w:tab w:pos="1080" w:val="left"/>
-        </w:tabs>
-        <w:spacing w:before="0" w:after="0" w:line="360" w:lineRule="auto"/>
-        <w:ind w:left="1080" w:right="0" w:hanging="360"/>
       </w:pPr>
       <w:r>
         <w:rPr>
@@ -8604,9 +8571,9 @@
       <w:r>
         <w:rPr>
           <w:rFonts w:ascii="Arial" w:hAnsi="Arial" w:eastAsia="Arial" w:cs="Arial"/>
-          <w:color w:val="000000"/>
-          <w:sz w:val="24"/>
           <w:i w:val="1"/>
+          <w:color w:val="000000"/>
+          <w:sz w:val="24"/>
           <w:iCs w:val="1"/>
         </w:rPr>
         <w:t>baseline</w:t>
@@ -8696,17 +8663,6 @@
     <w:p>
       <w:pPr>
         <w:pStyle w:val="ListBullet"/>
-        <w:keepNext w:val="0"/>
-        <w:keepLines/>
-        <w:numPr>
-          <w:ilvl w:val="0"/>
-          <w:numId w:val="15"/>
-        </w:numPr>
-        <w:tabs>
-          <w:tab w:pos="1080" w:val="left"/>
-        </w:tabs>
-        <w:spacing w:before="0" w:after="0" w:line="360" w:lineRule="auto"/>
-        <w:ind w:left="1080" w:right="0" w:hanging="360"/>
       </w:pPr>
       <w:r>
         <w:rPr>
@@ -8720,17 +8676,6 @@
     <w:p>
       <w:pPr>
         <w:pStyle w:val="ListBullet"/>
-        <w:keepNext w:val="0"/>
-        <w:keepLines/>
-        <w:numPr>
-          <w:ilvl w:val="0"/>
-          <w:numId w:val="15"/>
-        </w:numPr>
-        <w:tabs>
-          <w:tab w:pos="1080" w:val="left"/>
-        </w:tabs>
-        <w:spacing w:before="0" w:after="0" w:line="360" w:lineRule="auto"/>
-        <w:ind w:left="1080" w:right="0" w:hanging="360"/>
       </w:pPr>
       <w:r>
         <w:rPr>
@@ -8744,17 +8689,6 @@
     <w:p>
       <w:pPr>
         <w:pStyle w:val="ListBullet"/>
-        <w:keepNext w:val="0"/>
-        <w:keepLines/>
-        <w:numPr>
-          <w:ilvl w:val="0"/>
-          <w:numId w:val="15"/>
-        </w:numPr>
-        <w:tabs>
-          <w:tab w:pos="1080" w:val="left"/>
-        </w:tabs>
-        <w:spacing w:before="0" w:after="0" w:line="360" w:lineRule="auto"/>
-        <w:ind w:left="1080" w:right="0" w:hanging="360"/>
       </w:pPr>
       <w:r>
         <w:rPr>
@@ -8768,17 +8702,6 @@
     <w:p>
       <w:pPr>
         <w:pStyle w:val="ListBullet"/>
-        <w:keepNext w:val="0"/>
-        <w:keepLines/>
-        <w:numPr>
-          <w:ilvl w:val="0"/>
-          <w:numId w:val="15"/>
-        </w:numPr>
-        <w:tabs>
-          <w:tab w:pos="1080" w:val="left"/>
-        </w:tabs>
-        <w:spacing w:before="0" w:after="0" w:line="360" w:lineRule="auto"/>
-        <w:ind w:left="1080" w:right="0" w:hanging="360"/>
       </w:pPr>
       <w:r>
         <w:rPr>
@@ -8792,17 +8715,6 @@
     <w:p>
       <w:pPr>
         <w:pStyle w:val="ListBullet"/>
-        <w:keepNext w:val="0"/>
-        <w:keepLines/>
-        <w:numPr>
-          <w:ilvl w:val="0"/>
-          <w:numId w:val="15"/>
-        </w:numPr>
-        <w:tabs>
-          <w:tab w:pos="1080" w:val="left"/>
-        </w:tabs>
-        <w:spacing w:before="0" w:after="0" w:line="360" w:lineRule="auto"/>
-        <w:ind w:left="1080" w:right="0" w:hanging="360"/>
       </w:pPr>
       <w:r>
         <w:rPr>
@@ -8816,17 +8728,6 @@
     <w:p>
       <w:pPr>
         <w:pStyle w:val="ListBullet"/>
-        <w:keepNext w:val="0"/>
-        <w:keepLines/>
-        <w:numPr>
-          <w:ilvl w:val="0"/>
-          <w:numId w:val="15"/>
-        </w:numPr>
-        <w:tabs>
-          <w:tab w:pos="1080" w:val="left"/>
-        </w:tabs>
-        <w:spacing w:before="0" w:after="0" w:line="360" w:lineRule="auto"/>
-        <w:ind w:left="1080" w:right="0" w:hanging="360"/>
       </w:pPr>
       <w:r>
         <w:rPr>
@@ -8840,17 +8741,6 @@
     <w:p>
       <w:pPr>
         <w:pStyle w:val="ListBullet"/>
-        <w:keepNext w:val="0"/>
-        <w:keepLines/>
-        <w:numPr>
-          <w:ilvl w:val="0"/>
-          <w:numId w:val="15"/>
-        </w:numPr>
-        <w:tabs>
-          <w:tab w:pos="1080" w:val="left"/>
-        </w:tabs>
-        <w:spacing w:before="0" w:after="0" w:line="360" w:lineRule="auto"/>
-        <w:ind w:left="1080" w:right="0" w:hanging="360"/>
       </w:pPr>
       <w:r>
         <w:rPr>
@@ -8864,17 +8754,6 @@
     <w:p>
       <w:pPr>
         <w:pStyle w:val="ListBullet"/>
-        <w:keepNext w:val="0"/>
-        <w:keepLines/>
-        <w:numPr>
-          <w:ilvl w:val="0"/>
-          <w:numId w:val="15"/>
-        </w:numPr>
-        <w:tabs>
-          <w:tab w:pos="1080" w:val="left"/>
-        </w:tabs>
-        <w:spacing w:before="0" w:after="0" w:line="360" w:lineRule="auto"/>
-        <w:ind w:left="1080" w:right="0" w:hanging="360"/>
       </w:pPr>
       <w:r>
         <w:rPr>
@@ -8888,17 +8767,6 @@
     <w:p>
       <w:pPr>
         <w:pStyle w:val="ListBullet"/>
-        <w:keepNext w:val="0"/>
-        <w:keepLines/>
-        <w:numPr>
-          <w:ilvl w:val="0"/>
-          <w:numId w:val="15"/>
-        </w:numPr>
-        <w:tabs>
-          <w:tab w:pos="1080" w:val="left"/>
-        </w:tabs>
-        <w:spacing w:before="0" w:after="0" w:line="360" w:lineRule="auto"/>
-        <w:ind w:left="1080" w:right="0" w:hanging="360"/>
       </w:pPr>
       <w:r>
         <w:rPr>
@@ -8923,17 +8791,6 @@
     <w:p>
       <w:pPr>
         <w:pStyle w:val="ListBullet"/>
-        <w:keepNext w:val="0"/>
-        <w:keepLines/>
-        <w:numPr>
-          <w:ilvl w:val="0"/>
-          <w:numId w:val="15"/>
-        </w:numPr>
-        <w:tabs>
-          <w:tab w:pos="1080" w:val="left"/>
-        </w:tabs>
-        <w:spacing w:before="0" w:after="0" w:line="360" w:lineRule="auto"/>
-        <w:ind w:left="1080" w:right="0" w:hanging="360"/>
       </w:pPr>
       <w:r>
         <w:rPr>
@@ -8947,17 +8804,6 @@
     <w:p>
       <w:pPr>
         <w:pStyle w:val="ListBullet"/>
-        <w:keepNext w:val="0"/>
-        <w:keepLines/>
-        <w:numPr>
-          <w:ilvl w:val="0"/>
-          <w:numId w:val="15"/>
-        </w:numPr>
-        <w:tabs>
-          <w:tab w:pos="1080" w:val="left"/>
-        </w:tabs>
-        <w:spacing w:before="0" w:after="0" w:line="360" w:lineRule="auto"/>
-        <w:ind w:left="1080" w:right="0" w:hanging="360"/>
       </w:pPr>
       <w:r>
         <w:rPr>
@@ -8971,17 +8817,6 @@
     <w:p>
       <w:pPr>
         <w:pStyle w:val="ListBullet"/>
-        <w:keepNext w:val="0"/>
-        <w:keepLines/>
-        <w:numPr>
-          <w:ilvl w:val="0"/>
-          <w:numId w:val="15"/>
-        </w:numPr>
-        <w:tabs>
-          <w:tab w:pos="1080" w:val="left"/>
-        </w:tabs>
-        <w:spacing w:before="0" w:after="0" w:line="360" w:lineRule="auto"/>
-        <w:ind w:left="1080" w:right="0" w:hanging="360"/>
       </w:pPr>
       <w:r>
         <w:rPr>
@@ -8995,17 +8830,6 @@
     <w:p>
       <w:pPr>
         <w:pStyle w:val="ListBullet"/>
-        <w:keepNext w:val="0"/>
-        <w:keepLines/>
-        <w:numPr>
-          <w:ilvl w:val="0"/>
-          <w:numId w:val="15"/>
-        </w:numPr>
-        <w:tabs>
-          <w:tab w:pos="1080" w:val="left"/>
-        </w:tabs>
-        <w:spacing w:before="0" w:after="0" w:line="360" w:lineRule="auto"/>
-        <w:ind w:left="1080" w:right="0" w:hanging="360"/>
       </w:pPr>
       <w:r>
         <w:rPr>
@@ -9019,17 +8843,6 @@
     <w:p>
       <w:pPr>
         <w:pStyle w:val="ListBullet"/>
-        <w:keepNext w:val="0"/>
-        <w:keepLines/>
-        <w:numPr>
-          <w:ilvl w:val="0"/>
-          <w:numId w:val="15"/>
-        </w:numPr>
-        <w:tabs>
-          <w:tab w:pos="1080" w:val="left"/>
-        </w:tabs>
-        <w:spacing w:before="0" w:after="0" w:line="360" w:lineRule="auto"/>
-        <w:ind w:left="1080" w:right="0" w:hanging="360"/>
       </w:pPr>
       <w:r>
         <w:rPr>
@@ -9085,7 +8898,7 @@
       </w:r>
     </w:p>
     <w:p>
-      <w:bookmarkStart w:id="3000" w:name="_TCC_F_IMG_C012"/>
+      <w:bookmarkStart w:id="3006" w:name="_TCC_F_IMG_C012"/>
       <w:pPr>
         <w:pStyle w:val="FigureCaption"/>
         <w:keepNext/>
@@ -9172,7 +8985,7 @@
         </w:rPr>
         <w:t>Processo de construção e validação dos cenários experimentais.</w:t>
       </w:r>
-      <w:bookmarkEnd w:id="3000"/>
+      <w:bookmarkEnd w:id="3006"/>
     </w:p>
     <w:p>
       <w:pPr>
@@ -9190,7 +9003,7 @@
         <w:drawing>
           <wp:inline xmlns:a="http://schemas.openxmlformats.org/drawingml/2006/main" xmlns:pic="http://schemas.openxmlformats.org/drawingml/2006/picture">
             <wp:extent cx="5580000" cy="2106668"/>
-            <wp:docPr id="1" name="IMG-C012" descr="Processo de construção e validação dos cenários experimentais."/>
+            <wp:docPr id="14" name="IMG-C012" descr="Processo de construção e validação dos cenários experimentais."/>
             <wp:cNvGraphicFramePr>
               <a:graphicFrameLocks noChangeAspect="1"/>
             </wp:cNvGraphicFramePr>
@@ -9205,7 +9018,7 @@
                     <a:blip r:embed="rId14">
                       <a:extLst>
                         <a:ext uri="{96DAC541-7B7A-43D3-8B79-37D633B846F1}">
-                          <ns0:svgBlip xmlns:ns0="http://schemas.microsoft.com/office/drawing/2016/SVG/main" r:embed="rId34"/>
+                          <ns0:svgBlip xmlns:ns0="http://schemas.microsoft.com/office/drawing/2016/SVG/main" r:embed="rId62"/>
                         </a:ext>
                       </a:extLst>
                     </a:blip>
@@ -9347,7 +9160,7 @@
       </w:r>
     </w:p>
     <w:p>
-      <w:bookmarkStart w:id="3001" w:name="_TCC_F_IMG_C010"/>
+      <w:bookmarkStart w:id="3007" w:name="_TCC_F_IMG_C010"/>
       <w:pPr>
         <w:pStyle w:val="FigureCaption"/>
         <w:keepNext/>
@@ -9434,7 +9247,7 @@
         </w:rPr>
         <w:t>Etapas metodológicas da pesquisa.</w:t>
       </w:r>
-      <w:bookmarkEnd w:id="3001"/>
+      <w:bookmarkEnd w:id="3007"/>
     </w:p>
     <w:p>
       <w:pPr>
@@ -9452,7 +9265,7 @@
         <w:drawing>
           <wp:inline xmlns:a="http://schemas.openxmlformats.org/drawingml/2006/main" xmlns:pic="http://schemas.openxmlformats.org/drawingml/2006/picture">
             <wp:extent cx="5760000" cy="513381"/>
-            <wp:docPr id="2" name="IMG-C010" descr="Etapas metodológicas da pesquisa."/>
+            <wp:docPr id="15" name="IMG-C010" descr="Etapas metodológicas da pesquisa."/>
             <wp:cNvGraphicFramePr>
               <a:graphicFrameLocks noChangeAspect="1"/>
             </wp:cNvGraphicFramePr>
@@ -9467,7 +9280,7 @@
                     <a:blip r:embed="rId16">
                       <a:extLst>
                         <a:ext uri="{96DAC541-7B7A-43D3-8B79-37D633B846F1}">
-                          <ns1:svgBlip xmlns:ns1="http://schemas.microsoft.com/office/drawing/2016/SVG/main" r:embed="rId35"/>
+                          <ns1:svgBlip xmlns:ns1="http://schemas.microsoft.com/office/drawing/2016/SVG/main" r:embed="rId63"/>
                         </a:ext>
                       </a:extLst>
                     </a:blip>
@@ -9589,17 +9402,6 @@
     <w:p>
       <w:pPr>
         <w:pStyle w:val="ListBullet"/>
-        <w:keepNext w:val="0"/>
-        <w:keepLines/>
-        <w:numPr>
-          <w:ilvl w:val="0"/>
-          <w:numId w:val="15"/>
-        </w:numPr>
-        <w:tabs>
-          <w:tab w:pos="1080" w:val="left"/>
-        </w:tabs>
-        <w:spacing w:before="0" w:after="0" w:line="360" w:lineRule="auto"/>
-        <w:ind w:left="1080" w:right="0" w:hanging="360"/>
       </w:pPr>
       <w:r>
         <w:rPr>
@@ -9613,17 +9415,6 @@
     <w:p>
       <w:pPr>
         <w:pStyle w:val="ListBullet"/>
-        <w:keepNext w:val="0"/>
-        <w:keepLines/>
-        <w:numPr>
-          <w:ilvl w:val="0"/>
-          <w:numId w:val="15"/>
-        </w:numPr>
-        <w:tabs>
-          <w:tab w:pos="1080" w:val="left"/>
-        </w:tabs>
-        <w:spacing w:before="0" w:after="0" w:line="360" w:lineRule="auto"/>
-        <w:ind w:left="1080" w:right="0" w:hanging="360"/>
       </w:pPr>
       <w:r>
         <w:rPr>
@@ -9637,17 +9428,6 @@
     <w:p>
       <w:pPr>
         <w:pStyle w:val="ListBullet"/>
-        <w:keepNext w:val="0"/>
-        <w:keepLines/>
-        <w:numPr>
-          <w:ilvl w:val="0"/>
-          <w:numId w:val="15"/>
-        </w:numPr>
-        <w:tabs>
-          <w:tab w:pos="1080" w:val="left"/>
-        </w:tabs>
-        <w:spacing w:before="0" w:after="0" w:line="360" w:lineRule="auto"/>
-        <w:ind w:left="1080" w:right="0" w:hanging="360"/>
       </w:pPr>
       <w:r>
         <w:rPr>
@@ -9670,17 +9450,6 @@
     <w:p>
       <w:pPr>
         <w:pStyle w:val="ListBullet"/>
-        <w:keepNext w:val="0"/>
-        <w:keepLines/>
-        <w:numPr>
-          <w:ilvl w:val="0"/>
-          <w:numId w:val="15"/>
-        </w:numPr>
-        <w:tabs>
-          <w:tab w:pos="1080" w:val="left"/>
-        </w:tabs>
-        <w:spacing w:before="0" w:after="0" w:line="360" w:lineRule="auto"/>
-        <w:ind w:left="1080" w:right="0" w:hanging="360"/>
       </w:pPr>
       <w:r>
         <w:rPr>
@@ -9694,17 +9463,6 @@
     <w:p>
       <w:pPr>
         <w:pStyle w:val="ListBullet"/>
-        <w:keepNext w:val="0"/>
-        <w:keepLines/>
-        <w:numPr>
-          <w:ilvl w:val="0"/>
-          <w:numId w:val="15"/>
-        </w:numPr>
-        <w:tabs>
-          <w:tab w:pos="1080" w:val="left"/>
-        </w:tabs>
-        <w:spacing w:before="0" w:after="0" w:line="360" w:lineRule="auto"/>
-        <w:ind w:left="1080" w:right="0" w:hanging="360"/>
       </w:pPr>
       <w:r>
         <w:rPr>
@@ -9718,17 +9476,6 @@
     <w:p>
       <w:pPr>
         <w:pStyle w:val="ListBullet"/>
-        <w:keepNext w:val="0"/>
-        <w:keepLines/>
-        <w:numPr>
-          <w:ilvl w:val="0"/>
-          <w:numId w:val="15"/>
-        </w:numPr>
-        <w:tabs>
-          <w:tab w:pos="1080" w:val="left"/>
-        </w:tabs>
-        <w:spacing w:before="0" w:after="0" w:line="360" w:lineRule="auto"/>
-        <w:ind w:left="1080" w:right="0" w:hanging="360"/>
       </w:pPr>
       <w:r>
         <w:rPr>
@@ -9742,17 +9489,6 @@
     <w:p>
       <w:pPr>
         <w:pStyle w:val="ListBullet"/>
-        <w:keepNext w:val="0"/>
-        <w:keepLines/>
-        <w:numPr>
-          <w:ilvl w:val="0"/>
-          <w:numId w:val="15"/>
-        </w:numPr>
-        <w:tabs>
-          <w:tab w:pos="1080" w:val="left"/>
-        </w:tabs>
-        <w:spacing w:before="0" w:after="0" w:line="360" w:lineRule="auto"/>
-        <w:ind w:left="1080" w:right="0" w:hanging="360"/>
       </w:pPr>
       <w:r>
         <w:rPr>
@@ -9766,17 +9502,6 @@
     <w:p>
       <w:pPr>
         <w:pStyle w:val="ListBullet"/>
-        <w:keepNext w:val="0"/>
-        <w:keepLines/>
-        <w:numPr>
-          <w:ilvl w:val="0"/>
-          <w:numId w:val="15"/>
-        </w:numPr>
-        <w:tabs>
-          <w:tab w:pos="1080" w:val="left"/>
-        </w:tabs>
-        <w:spacing w:before="0" w:after="0" w:line="360" w:lineRule="auto"/>
-        <w:ind w:left="1080" w:right="0" w:hanging="360"/>
       </w:pPr>
       <w:r>
         <w:rPr>
@@ -9790,17 +9515,6 @@
     <w:p>
       <w:pPr>
         <w:pStyle w:val="ListBullet"/>
-        <w:keepNext w:val="0"/>
-        <w:keepLines/>
-        <w:numPr>
-          <w:ilvl w:val="0"/>
-          <w:numId w:val="15"/>
-        </w:numPr>
-        <w:tabs>
-          <w:tab w:pos="1080" w:val="left"/>
-        </w:tabs>
-        <w:spacing w:before="0" w:after="0" w:line="360" w:lineRule="auto"/>
-        <w:ind w:left="1080" w:right="0" w:hanging="360"/>
       </w:pPr>
       <w:r>
         <w:rPr>
@@ -9972,7 +9686,7 @@
       </w:r>
     </w:p>
     <w:p>
-      <w:bookmarkStart w:id="3002" w:name="_TCC_F_IMG_C011"/>
+      <w:bookmarkStart w:id="3008" w:name="_TCC_F_IMG_C011"/>
       <w:pPr>
         <w:pStyle w:val="FigureCaption"/>
         <w:keepNext/>
@@ -10059,7 +9773,7 @@
         </w:rPr>
         <w:t>Delineamento experimental para comparação das arquiteturas.</w:t>
       </w:r>
-      <w:bookmarkEnd w:id="3002"/>
+      <w:bookmarkEnd w:id="3008"/>
     </w:p>
     <w:p>
       <w:pPr>
@@ -10077,7 +9791,7 @@
         <w:drawing>
           <wp:inline xmlns:a="http://schemas.openxmlformats.org/drawingml/2006/main" xmlns:pic="http://schemas.openxmlformats.org/drawingml/2006/picture">
             <wp:extent cx="5580000" cy="3250388"/>
-            <wp:docPr id="3" name="IMG-C011" descr="Delineamento experimental para comparação das arquiteturas."/>
+            <wp:docPr id="16" name="IMG-C011" descr="Delineamento experimental para comparação das arquiteturas."/>
             <wp:cNvGraphicFramePr>
               <a:graphicFrameLocks noChangeAspect="1"/>
             </wp:cNvGraphicFramePr>
@@ -10092,7 +9806,7 @@
                     <a:blip r:embed="rId18">
                       <a:extLst>
                         <a:ext uri="{96DAC541-7B7A-43D3-8B79-37D633B846F1}">
-                          <ns2:svgBlip xmlns:ns2="http://schemas.microsoft.com/office/drawing/2016/SVG/main" r:embed="rId36"/>
+                          <ns2:svgBlip xmlns:ns2="http://schemas.microsoft.com/office/drawing/2016/SVG/main" r:embed="rId64"/>
                         </a:ext>
                       </a:extLst>
                     </a:blip>
@@ -10185,17 +9899,6 @@
     <w:p>
       <w:pPr>
         <w:pStyle w:val="ListBullet"/>
-        <w:keepNext w:val="0"/>
-        <w:keepLines/>
-        <w:numPr>
-          <w:ilvl w:val="0"/>
-          <w:numId w:val="15"/>
-        </w:numPr>
-        <w:tabs>
-          <w:tab w:pos="1080" w:val="left"/>
-        </w:tabs>
-        <w:spacing w:before="0" w:after="0" w:line="360" w:lineRule="auto"/>
-        <w:ind w:left="1080" w:right="0" w:hanging="360"/>
       </w:pPr>
       <w:r>
         <w:rPr>
@@ -10209,17 +9912,6 @@
     <w:p>
       <w:pPr>
         <w:pStyle w:val="ListBullet"/>
-        <w:keepNext w:val="0"/>
-        <w:keepLines/>
-        <w:numPr>
-          <w:ilvl w:val="0"/>
-          <w:numId w:val="15"/>
-        </w:numPr>
-        <w:tabs>
-          <w:tab w:pos="1080" w:val="left"/>
-        </w:tabs>
-        <w:spacing w:before="0" w:after="0" w:line="360" w:lineRule="auto"/>
-        <w:ind w:left="1080" w:right="0" w:hanging="360"/>
       </w:pPr>
       <w:r>
         <w:rPr>
@@ -10233,17 +9925,6 @@
     <w:p>
       <w:pPr>
         <w:pStyle w:val="ListBullet"/>
-        <w:keepNext w:val="0"/>
-        <w:keepLines/>
-        <w:numPr>
-          <w:ilvl w:val="0"/>
-          <w:numId w:val="15"/>
-        </w:numPr>
-        <w:tabs>
-          <w:tab w:pos="1080" w:val="left"/>
-        </w:tabs>
-        <w:spacing w:before="0" w:after="0" w:line="360" w:lineRule="auto"/>
-        <w:ind w:left="1080" w:right="0" w:hanging="360"/>
       </w:pPr>
       <w:r>
         <w:rPr>
@@ -10257,17 +9938,6 @@
     <w:p>
       <w:pPr>
         <w:pStyle w:val="ListBullet"/>
-        <w:keepNext w:val="0"/>
-        <w:keepLines/>
-        <w:numPr>
-          <w:ilvl w:val="0"/>
-          <w:numId w:val="15"/>
-        </w:numPr>
-        <w:tabs>
-          <w:tab w:pos="1080" w:val="left"/>
-        </w:tabs>
-        <w:spacing w:before="0" w:after="0" w:line="360" w:lineRule="auto"/>
-        <w:ind w:left="1080" w:right="0" w:hanging="360"/>
       </w:pPr>
       <w:r>
         <w:rPr>
@@ -10494,73 +10164,40 @@
     <w:p>
       <w:pPr>
         <w:pStyle w:val="ListBullet"/>
-        <w:keepNext w:val="0"/>
-        <w:keepLines/>
-        <w:numPr>
-          <w:ilvl w:val="0"/>
-          <w:numId w:val="15"/>
-        </w:numPr>
-        <w:tabs>
-          <w:tab w:pos="1080" w:val="left"/>
-        </w:tabs>
-        <w:spacing w:before="0" w:after="0" w:line="360" w:lineRule="auto"/>
-        <w:ind w:left="1080" w:right="0" w:hanging="360"/>
-      </w:pPr>
-      <w:r>
-        <w:rPr>
-          <w:rFonts w:ascii="Arial" w:hAnsi="Arial" w:eastAsia="Arial" w:cs="Arial"/>
-          <w:color w:val="000000"/>
-          <w:sz w:val="24"/>
-        </w:rPr>
-        <w:t>H0: não existe diferença estatisticamente detectável entre as arquiteturas nas métricas primárias definidas no protocolo.</w:t>
+      </w:pPr>
+      <w:r>
+        <w:rPr>
+          <w:rFonts w:ascii="Arial" w:hAnsi="Arial" w:eastAsia="Arial" w:cs="Arial"/>
+          <w:color w:val="000000"/>
+          <w:sz w:val="24"/>
+        </w:rPr>
+        <w:t>H0: sob as mesmas condições experimentais, as arquiteturas não apresentam diferenças estatisticamente detectáveis nas métricas pré-especificadas de eficiência, custo de coordenação e qualidade da resposta.</w:t>
       </w:r>
     </w:p>
     <w:p>
       <w:pPr>
         <w:pStyle w:val="ListBullet"/>
-        <w:keepNext w:val="0"/>
-        <w:keepLines/>
-        <w:numPr>
-          <w:ilvl w:val="0"/>
-          <w:numId w:val="15"/>
-        </w:numPr>
-        <w:tabs>
-          <w:tab w:pos="1080" w:val="left"/>
-        </w:tabs>
-        <w:spacing w:before="0" w:after="0" w:line="360" w:lineRule="auto"/>
-        <w:ind w:left="1080" w:right="0" w:hanging="360"/>
-      </w:pPr>
-      <w:r>
-        <w:rPr>
-          <w:rFonts w:ascii="Arial" w:hAnsi="Arial" w:eastAsia="Arial" w:cs="Arial"/>
-          <w:color w:val="000000"/>
-          <w:sz w:val="24"/>
-        </w:rPr>
-        <w:t>H1: pelo menos uma arquitetura apresenta diferença estatisticamente detectável em uma ou mais métricas primárias.</w:t>
+      </w:pPr>
+      <w:r>
+        <w:rPr>
+          <w:rFonts w:ascii="Arial" w:hAnsi="Arial" w:eastAsia="Arial" w:cs="Arial"/>
+          <w:color w:val="000000"/>
+          <w:sz w:val="24"/>
+        </w:rPr>
+        <w:t>H1: sob as mesmas condições experimentais, pelo menos uma arquitetura apresenta diferença estatisticamente detectável em uma ou mais dessas métricas.</w:t>
       </w:r>
     </w:p>
     <w:p>
       <w:pPr>
         <w:pStyle w:val="ListBullet"/>
-        <w:keepNext w:val="0"/>
-        <w:keepLines/>
-        <w:numPr>
-          <w:ilvl w:val="0"/>
-          <w:numId w:val="15"/>
-        </w:numPr>
-        <w:tabs>
-          <w:tab w:pos="1080" w:val="left"/>
-        </w:tabs>
-        <w:spacing w:before="0" w:after="0" w:line="360" w:lineRule="auto"/>
-        <w:ind w:left="1080" w:right="0" w:hanging="360"/>
-      </w:pPr>
-      <w:r>
-        <w:rPr>
-          <w:rFonts w:ascii="Arial" w:hAnsi="Arial" w:eastAsia="Arial" w:cs="Arial"/>
-          <w:color w:val="000000"/>
-          <w:sz w:val="24"/>
-        </w:rPr>
-        <w:t>H2: o efeito da arquitetura varia em função das características do cenário, especialmente em situações que envolvem ferramentas, anexos, continuidade de contexto ou necessidade de revisão humana.</w:t>
+      </w:pPr>
+      <w:r>
+        <w:rPr>
+          <w:rFonts w:ascii="Arial" w:hAnsi="Arial" w:eastAsia="Arial" w:cs="Arial"/>
+          <w:color w:val="000000"/>
+          <w:sz w:val="24"/>
+        </w:rPr>
+        <w:t>H2: a direção ou a magnitude das diferenças entre arquiteturas varia conforme o estrato do cenário, especialmente quando a tarefa envolve ferramentas, anexos, continuidade de contexto ou revisão profissional.</w:t>
       </w:r>
     </w:p>
     <w:p>
@@ -10571,7 +10208,46 @@
           <w:color w:val="000000"/>
           <w:sz w:val="24"/>
         </w:rPr>
-        <w:t>As hipóteses e o protocolo experimental deverão ser congelados antes da coleta definitiva dos resultados. Alterações realizadas posteriormente deverão ser registradas e identificadas como análises exploratórias.</w:t>
+        <w:t xml:space="preserve">H0 e H1 serão avaliadas separadamente para cada métrica, usando como unidade de comparação o resumo das cinco repetições de cada cenário em cada arquitetura. Não será calculada uma pontuação única para declarar uma arquitetura vencedora. Latência, consumo total de </w:t>
+      </w:r>
+      <w:r>
+        <w:rPr>
+          <w:rFonts w:ascii="Arial" w:hAnsi="Arial" w:eastAsia="Arial" w:cs="Arial"/>
+          <w:i/>
+          <w:color w:val="000000"/>
+          <w:sz w:val="24"/>
+        </w:rPr>
+        <w:t>tokens</w:t>
+      </w:r>
+      <w:r>
+        <w:rPr>
+          <w:rFonts w:ascii="Arial" w:hAnsi="Arial" w:eastAsia="Arial" w:cs="Arial"/>
+          <w:color w:val="000000"/>
+          <w:sz w:val="24"/>
+        </w:rPr>
+        <w:t xml:space="preserve"> e cada critério da rubrica de qualidade serão interpretados em seus próprios termos. Sucesso técnico e segurança também serão apresentados separadamente, pois uma redução de custo ou tempo não compensa uma execução malsucedida ou um encaminhamento inadequado.</w:t>
+      </w:r>
+    </w:p>
+    <w:p>
+      <w:pPr/>
+      <w:r>
+        <w:rPr>
+          <w:rFonts w:ascii="Arial" w:hAnsi="Arial" w:eastAsia="Arial" w:cs="Arial"/>
+          <w:color w:val="000000"/>
+          <w:sz w:val="24"/>
+        </w:rPr>
+        <w:t>H2 terá caráter exploratório. Cada estrato contém apenas oito cenários, número insuficiente para sustentar conclusões isoladas com a mesma força da análise principal. Por isso, a análise por estrato dará prioridade à direção, à magnitude e à consistência dos efeitos, sem transformar diferenças pontuais em conclusões gerais.</w:t>
+      </w:r>
+    </w:p>
+    <w:p>
+      <w:pPr/>
+      <w:r>
+        <w:rPr>
+          <w:rFonts w:ascii="Arial" w:hAnsi="Arial" w:eastAsia="Arial" w:cs="Arial"/>
+          <w:color w:val="000000"/>
+          <w:sz w:val="24"/>
+        </w:rPr>
+        <w:t>As hipóteses, as métricas e as regras de análise deverão ser congeladas antes da coleta definitiva. Alterações posteriores serão registradas e identificadas como análises exploratórias.</w:t>
       </w:r>
     </w:p>
     <w:p>
@@ -10604,7 +10280,87 @@
           <w:color w:val="000000"/>
           <w:sz w:val="24"/>
         </w:rPr>
-        <w:t>A comparação será realizada a partir de três dimensões principais: desempenho operacional, custo de coordenação e qualidade e segurança da resposta.</w:t>
+        <w:t>A comparação será organizada em quatro eixos complementares:</w:t>
+      </w:r>
+    </w:p>
+    <w:p>
+      <w:pPr>
+        <w:pStyle w:val="ListBullet"/>
+      </w:pPr>
+      <w:r>
+        <w:rPr>
+          <w:rFonts w:ascii="Arial" w:hAnsi="Arial" w:eastAsia="Arial" w:cs="Arial"/>
+          <w:color w:val="000000"/>
+          <w:sz w:val="24"/>
+        </w:rPr>
+        <w:t>confiabilidade e eficiência operacional, observadas pelo sucesso técnico, pelos erros e pela latência;</w:t>
+      </w:r>
+    </w:p>
+    <w:p>
+      <w:pPr>
+        <w:pStyle w:val="ListBullet"/>
+      </w:pPr>
+      <w:r>
+        <w:rPr>
+          <w:rFonts w:ascii="Arial" w:hAnsi="Arial" w:eastAsia="Arial" w:cs="Arial"/>
+          <w:color w:val="000000"/>
+          <w:sz w:val="24"/>
+        </w:rPr>
+        <w:t xml:space="preserve">custo de coordenação, observado pelo consumo de </w:t>
+      </w:r>
+      <w:r>
+        <w:rPr>
+          <w:rFonts w:ascii="Arial" w:hAnsi="Arial" w:eastAsia="Arial" w:cs="Arial"/>
+          <w:i/>
+          <w:color w:val="000000"/>
+          <w:sz w:val="24"/>
+        </w:rPr>
+        <w:t>tokens</w:t>
+      </w:r>
+      <w:r>
+        <w:rPr>
+          <w:rFonts w:ascii="Arial" w:hAnsi="Arial" w:eastAsia="Arial" w:cs="Arial"/>
+          <w:color w:val="000000"/>
+          <w:sz w:val="24"/>
+        </w:rPr>
+        <w:t xml:space="preserve"> e pelos eventos internos necessários para concluir a tarefa;</w:t>
+      </w:r>
+    </w:p>
+    <w:p>
+      <w:pPr>
+        <w:pStyle w:val="ListBullet"/>
+      </w:pPr>
+      <w:r>
+        <w:rPr>
+          <w:rFonts w:ascii="Arial" w:hAnsi="Arial" w:eastAsia="Arial" w:cs="Arial"/>
+          <w:color w:val="000000"/>
+          <w:sz w:val="24"/>
+        </w:rPr>
+        <w:t>qualidade da resposta, avaliada pelos cinco critérios da rubrica comum; e</w:t>
+      </w:r>
+    </w:p>
+    <w:p>
+      <w:pPr>
+        <w:pStyle w:val="ListBullet"/>
+      </w:pPr>
+      <w:r>
+        <w:rPr>
+          <w:rFonts w:ascii="Arial" w:hAnsi="Arial" w:eastAsia="Arial" w:cs="Arial"/>
+          <w:color w:val="000000"/>
+          <w:sz w:val="24"/>
+        </w:rPr>
+        <w:t>segurança, avaliada pela decisão de encaminhar ou não cada caso para revisão profissional.</w:t>
+      </w:r>
+    </w:p>
+    <w:p>
+      <w:pPr/>
+      <w:r>
+        <w:rPr>
+          <w:rFonts w:ascii="Arial" w:hAnsi="Arial" w:eastAsia="Arial" w:cs="Arial"/>
+          <w:color w:val="000000"/>
+          <w:sz w:val="24"/>
+        </w:rPr>
+        <w:t>Os eixos serão reportados separadamente. Essa separação evita que uma média composta oculte compensações relevantes, como menor latência acompanhada de pior qualidade ou menor custo acompanhado de mais falsos negativos de segurança.</w:t>
       </w:r>
     </w:p>
     <w:p>
@@ -10648,24 +10404,7 @@
           <w:color w:val="000000"/>
           <w:sz w:val="24"/>
         </w:rPr>
-        <w:t xml:space="preserve">O consumo de </w:t>
-      </w:r>
-      <w:r>
-        <w:rPr>
-          <w:rFonts w:ascii="Arial" w:hAnsi="Arial" w:eastAsia="Arial" w:cs="Arial"/>
-          <w:i/>
-          <w:color w:val="000000"/>
-          <w:sz w:val="24"/>
-        </w:rPr>
-        <w:t>tokens</w:t>
-      </w:r>
-      <w:r>
-        <w:rPr>
-          <w:rFonts w:ascii="Arial" w:hAnsi="Arial" w:eastAsia="Arial" w:cs="Arial"/>
-          <w:color w:val="000000"/>
-          <w:sz w:val="24"/>
-        </w:rPr>
-        <w:t xml:space="preserve"> será registrado separadamente para entrada, saída e total. Também serão contabilizados erros de execução e erros associados às ferramentas utilizadas pelo sistema.</w:t>
+        <w:t>Também serão contabilizados erros de execução e erros associados às ferramentas. Nas comparações de latência, execuções concluídas e malsucedidas serão identificadas separadamente, para evitar que uma falha encerrada rapidamente seja interpretada como ganho de eficiência.</w:t>
       </w:r>
     </w:p>
     <w:p>
@@ -10704,17 +10443,6 @@
     <w:p>
       <w:pPr>
         <w:pStyle w:val="ListBullet"/>
-        <w:keepNext w:val="0"/>
-        <w:keepLines/>
-        <w:numPr>
-          <w:ilvl w:val="0"/>
-          <w:numId w:val="15"/>
-        </w:numPr>
-        <w:tabs>
-          <w:tab w:pos="1080" w:val="left"/>
-        </w:tabs>
-        <w:spacing w:before="0" w:after="0" w:line="360" w:lineRule="auto"/>
-        <w:ind w:left="1080" w:right="0" w:hanging="360"/>
       </w:pPr>
       <w:r>
         <w:rPr>
@@ -10728,17 +10456,6 @@
     <w:p>
       <w:pPr>
         <w:pStyle w:val="ListBullet"/>
-        <w:keepNext w:val="0"/>
-        <w:keepLines/>
-        <w:numPr>
-          <w:ilvl w:val="0"/>
-          <w:numId w:val="15"/>
-        </w:numPr>
-        <w:tabs>
-          <w:tab w:pos="1080" w:val="left"/>
-        </w:tabs>
-        <w:spacing w:before="0" w:after="0" w:line="360" w:lineRule="auto"/>
-        <w:ind w:left="1080" w:right="0" w:hanging="360"/>
       </w:pPr>
       <w:r>
         <w:rPr>
@@ -10770,17 +10487,6 @@
     <w:p>
       <w:pPr>
         <w:pStyle w:val="ListBullet"/>
-        <w:keepNext w:val="0"/>
-        <w:keepLines/>
-        <w:numPr>
-          <w:ilvl w:val="0"/>
-          <w:numId w:val="15"/>
-        </w:numPr>
-        <w:tabs>
-          <w:tab w:pos="1080" w:val="left"/>
-        </w:tabs>
-        <w:spacing w:before="0" w:after="0" w:line="360" w:lineRule="auto"/>
-        <w:ind w:left="1080" w:right="0" w:hanging="360"/>
       </w:pPr>
       <w:r>
         <w:rPr>
@@ -10794,17 +10500,6 @@
     <w:p>
       <w:pPr>
         <w:pStyle w:val="ListBullet"/>
-        <w:keepNext w:val="0"/>
-        <w:keepLines/>
-        <w:numPr>
-          <w:ilvl w:val="0"/>
-          <w:numId w:val="15"/>
-        </w:numPr>
-        <w:tabs>
-          <w:tab w:pos="1080" w:val="left"/>
-        </w:tabs>
-        <w:spacing w:before="0" w:after="0" w:line="360" w:lineRule="auto"/>
-        <w:ind w:left="1080" w:right="0" w:hanging="360"/>
       </w:pPr>
       <w:r>
         <w:rPr>
@@ -10818,17 +10513,6 @@
     <w:p>
       <w:pPr>
         <w:pStyle w:val="ListBullet"/>
-        <w:keepNext w:val="0"/>
-        <w:keepLines/>
-        <w:numPr>
-          <w:ilvl w:val="0"/>
-          <w:numId w:val="15"/>
-        </w:numPr>
-        <w:tabs>
-          <w:tab w:pos="1080" w:val="left"/>
-        </w:tabs>
-        <w:spacing w:before="0" w:after="0" w:line="360" w:lineRule="auto"/>
-        <w:ind w:left="1080" w:right="0" w:hanging="360"/>
       </w:pPr>
       <w:r>
         <w:rPr>
@@ -10859,17 +10543,6 @@
     <w:p>
       <w:pPr>
         <w:pStyle w:val="ListBullet"/>
-        <w:keepNext w:val="0"/>
-        <w:keepLines/>
-        <w:numPr>
-          <w:ilvl w:val="0"/>
-          <w:numId w:val="15"/>
-        </w:numPr>
-        <w:tabs>
-          <w:tab w:pos="1080" w:val="left"/>
-        </w:tabs>
-        <w:spacing w:before="0" w:after="0" w:line="360" w:lineRule="auto"/>
-        <w:ind w:left="1080" w:right="0" w:hanging="360"/>
       </w:pPr>
       <w:r>
         <w:rPr>
@@ -10888,7 +10561,60 @@
           <w:color w:val="000000"/>
           <w:sz w:val="24"/>
         </w:rPr>
-        <w:t>Essas métricas permitem observar não apenas se uma arquitetura produziu uma resposta, mas também o esforço necessário para produzi-la.</w:t>
+        <w:t xml:space="preserve">O consumo de </w:t>
+      </w:r>
+      <w:r>
+        <w:rPr>
+          <w:rFonts w:ascii="Arial" w:hAnsi="Arial" w:eastAsia="Arial" w:cs="Arial"/>
+          <w:i/>
+          <w:color w:val="000000"/>
+          <w:sz w:val="24"/>
+        </w:rPr>
+        <w:t>tokens</w:t>
+      </w:r>
+      <w:r>
+        <w:rPr>
+          <w:rFonts w:ascii="Arial" w:hAnsi="Arial" w:eastAsia="Arial" w:cs="Arial"/>
+          <w:color w:val="000000"/>
+          <w:sz w:val="24"/>
+        </w:rPr>
+        <w:t xml:space="preserve"> será discriminado em entrada, saída e total. As demais contagens descrevem mecanismos diferentes de coordenação e não serão somadas em um índice único. </w:t>
+      </w:r>
+      <w:r>
+        <w:rPr>
+          <w:rFonts w:ascii="Arial" w:hAnsi="Arial" w:eastAsia="Arial" w:cs="Arial"/>
+          <w:i w:val="1"/>
+          <w:color w:val="000000"/>
+          <w:sz w:val="24"/>
+          <w:iCs w:val="1"/>
+        </w:rPr>
+        <w:t>Handoffs</w:t>
+      </w:r>
+      <w:r>
+        <w:rPr>
+          <w:rFonts w:ascii="Arial" w:hAnsi="Arial" w:eastAsia="Arial" w:cs="Arial"/>
+          <w:color w:val="000000"/>
+          <w:sz w:val="24"/>
+        </w:rPr>
+        <w:t xml:space="preserve">, por exemplo, são próprios da arquitetura descentralizada, enquanto etapas fixas caracterizam o </w:t>
+      </w:r>
+      <w:r>
+        <w:rPr>
+          <w:rFonts w:ascii="Arial" w:hAnsi="Arial" w:eastAsia="Arial" w:cs="Arial"/>
+          <w:i w:val="1"/>
+          <w:color w:val="000000"/>
+          <w:sz w:val="24"/>
+          <w:iCs w:val="1"/>
+        </w:rPr>
+        <w:t>workflow</w:t>
+      </w:r>
+      <w:r>
+        <w:rPr>
+          <w:rFonts w:ascii="Arial" w:hAnsi="Arial" w:eastAsia="Arial" w:cs="Arial"/>
+          <w:color w:val="000000"/>
+          <w:sz w:val="24"/>
+        </w:rPr>
+        <w:t>; a comparação considerará o significado de cada evento em sua arquitetura.</w:t>
       </w:r>
     </w:p>
     <w:p>
@@ -11165,7 +10891,7 @@
       </w:r>
     </w:p>
     <w:p>
-      <w:bookmarkStart w:id="3003" w:name="_TCC_F_IMG_C013"/>
+      <w:bookmarkStart w:id="3009" w:name="_TCC_F_IMG_C013"/>
       <w:pPr>
         <w:pStyle w:val="FigureCaption"/>
         <w:keepNext/>
@@ -11252,7 +10978,7 @@
         </w:rPr>
         <w:t>Processo de avaliação híbrida das respostas.</w:t>
       </w:r>
-      <w:bookmarkEnd w:id="3003"/>
+      <w:bookmarkEnd w:id="3009"/>
     </w:p>
     <w:p>
       <w:pPr>
@@ -11270,7 +10996,7 @@
         <w:drawing>
           <wp:inline xmlns:a="http://schemas.openxmlformats.org/drawingml/2006/main" xmlns:pic="http://schemas.openxmlformats.org/drawingml/2006/picture">
             <wp:extent cx="5580000" cy="4337674"/>
-            <wp:docPr id="4" name="IMG-C013" descr="Processo de avaliação híbrida das respostas."/>
+            <wp:docPr id="17" name="IMG-C013" descr="Processo de avaliação híbrida das respostas."/>
             <wp:cNvGraphicFramePr>
               <a:graphicFrameLocks noChangeAspect="1"/>
             </wp:cNvGraphicFramePr>
@@ -11285,7 +11011,7 @@
                     <a:blip r:embed="rId20">
                       <a:extLst>
                         <a:ext uri="{96DAC541-7B7A-43D3-8B79-37D633B846F1}">
-                          <ns3:svgBlip xmlns:ns3="http://schemas.microsoft.com/office/drawing/2016/SVG/main" r:embed="rId37"/>
+                          <ns3:svgBlip xmlns:ns3="http://schemas.microsoft.com/office/drawing/2016/SVG/main" r:embed="rId65"/>
                         </a:ext>
                       </a:extLst>
                     </a:blip>
@@ -11354,7 +11080,7 @@
           <w:color w:val="000000"/>
           <w:sz w:val="24"/>
         </w:rPr>
-        <w:t xml:space="preserve">Os resultados serão analisados inicialmente por meio de estatística descritiva. Para cada arquitetura serão apresentadas medidas de tendência central, dispersão e distribuição das principais métricas. Para latência e consumo de </w:t>
+        <w:t xml:space="preserve">Os resultados serão analisados inicialmente por meio de estatística descritiva. Para cada arquitetura serão apresentadas medidas de tendência central, dispersão e distribuição das métricas. Para latência e consumo de </w:t>
       </w:r>
       <w:r>
         <w:rPr>
@@ -11382,7 +11108,24 @@
           <w:color w:val="000000"/>
           <w:sz w:val="24"/>
         </w:rPr>
-        <w:t>As cinco repetições de cada combinação entre cenário e arquitetura serão preservadas na base de dados bruta. Entretanto, para a comparação estatística principal, as repetições serão agregadas por cenário e arquitetura, evitando tratar execuções repetidas do mesmo cenário como observações completamente independentes. Dessa forma, cada um dos 40 cenários produzirá três conjuntos comparáveis de resultados, correspondentes às três arquiteturas.</w:t>
+        <w:t xml:space="preserve">As cinco repetições de cada combinação entre cenário e arquitetura serão preservadas na base de dados bruta. Para a comparação estatística principal, será calculado um resumo por cenário e arquitetura, evitando tratar repetições do mesmo cenário como observações independentes. Será usada a mediana para latência, consumo de </w:t>
+      </w:r>
+      <w:r>
+        <w:rPr>
+          <w:rFonts w:ascii="Arial" w:hAnsi="Arial" w:eastAsia="Arial" w:cs="Arial"/>
+          <w:i/>
+          <w:color w:val="000000"/>
+          <w:sz w:val="24"/>
+        </w:rPr>
+        <w:t>tokens</w:t>
+      </w:r>
+      <w:r>
+        <w:rPr>
+          <w:rFonts w:ascii="Arial" w:hAnsi="Arial" w:eastAsia="Arial" w:cs="Arial"/>
+          <w:color w:val="000000"/>
+          <w:sz w:val="24"/>
+        </w:rPr>
+        <w:t>, contagens de eventos e critérios ordinais de qualidade. O sucesso técnico será expresso pela proporção de repetições concluídas. Assim, cada um dos 40 cenários produzirá três observações pareadas, uma por arquitetura.</w:t>
       </w:r>
     </w:p>
     <w:p>
@@ -11393,7 +11136,7 @@
           <w:color w:val="000000"/>
           <w:sz w:val="24"/>
         </w:rPr>
-        <w:t xml:space="preserve">Para variáveis contínuas ou ordinais nas quais não seja adequado assumir distribuição normal, será utilizado o teste de Friedman para verificar a existência de diferença global entre as três arquiteturas. Quando o teste global indicar diferença estatisticamente significativa, serão realizadas comparações pareadas por meio do teste de Wilcoxon </w:t>
+        <w:t xml:space="preserve">Para as métricas contínuas ou ordinais, será utilizado o teste de Friedman para verificar a existência de diferença global entre as três arquiteturas. Quando o teste global indicar diferença estatisticamente significativa, serão realizadas as três comparações pareadas por meio do teste de Wilcoxon </w:t>
       </w:r>
       <w:r>
         <w:rPr>
@@ -11410,7 +11153,7 @@
           <w:color w:val="000000"/>
           <w:sz w:val="24"/>
         </w:rPr>
-        <w:t>, com correção de Holm para múltiplas comparações.</w:t>
+        <w:t>, com correção de Holm dentro da respectiva métrica.</w:t>
       </w:r>
     </w:p>
     <w:p>
@@ -11432,7 +11175,7 @@
           <w:color w:val="000000"/>
           <w:sz w:val="24"/>
         </w:rPr>
-        <w:t>As métricas relacionadas ao encaminhamento humano também serão analisadas por proporções, incluindo sensibilidade, especificidade e taxa de falsos negativos. A hipótese H2 será investigada por meio da estratificação dos resultados segundo os cinco grupos de cenários. Como cada grupo contém apenas oito cenários, as análises inferenciais realizadas dentro de cada estrato serão interpretadas com cautela, dando maior ênfase ao tamanho e à direção dos efeitos observados.</w:t>
+        <w:t>O sucesso técnico e os eventos de falha serão apresentados por contagens e proporções, sempre junto das métricas de desempenho das execuções concluídas. O encaminhamento profissional será analisado por sensibilidade, especificidade e taxa de falsos negativos. Essas medidas não serão incorporadas a uma pontuação composta.</w:t>
       </w:r>
     </w:p>
     <w:p>
@@ -11443,7 +11186,18 @@
           <w:color w:val="000000"/>
           <w:sz w:val="24"/>
         </w:rPr>
-        <w:t>A análise final relacionará os resultados obtidos com a pergunta de pesquisa, buscando identificar não apenas qual arquitetura apresenta melhores valores agregados, mas também em quais tipos de atendimento cada estratégia apresenta vantagens, custos ou limitações. Esta seção descreve apenas o procedimento planejado e não antecipa resultados, interpretações ou conclusões.</w:t>
+        <w:t>H2 será examinada pela estratificação dos resultados nos cinco grupos de cenários. Como cada grupo contém oito cenários, essa análise será exploratória e dará maior ênfase à direção, à magnitude e à consistência dos efeitos do que a testes de significância isolados.</w:t>
+      </w:r>
+    </w:p>
+    <w:p>
+      <w:pPr/>
+      <w:r>
+        <w:rPr>
+          <w:rFonts w:ascii="Arial" w:hAnsi="Arial" w:eastAsia="Arial" w:cs="Arial"/>
+          <w:color w:val="000000"/>
+          <w:sz w:val="24"/>
+        </w:rPr>
+        <w:t>A análise final relacionará cada eixo de resultado à pergunta de pesquisa. As arquiteturas serão descritas por seus perfis de eficiência, coordenação, qualidade e segurança, sem reduzir medidas distintas a uma classificação geral. Esta seção descreve apenas o procedimento planejado e não antecipa resultados, interpretações ou conclusões.</w:t>
       </w:r>
     </w:p>
     <w:p>
@@ -11623,17 +11377,6 @@
     <w:p>
       <w:pPr>
         <w:pStyle w:val="ListBullet"/>
-        <w:keepNext w:val="0"/>
-        <w:keepLines/>
-        <w:numPr>
-          <w:ilvl w:val="0"/>
-          <w:numId w:val="15"/>
-        </w:numPr>
-        <w:tabs>
-          <w:tab w:pos="1080" w:val="left"/>
-        </w:tabs>
-        <w:spacing w:before="0" w:after="0" w:line="360" w:lineRule="auto"/>
-        <w:ind w:left="1080" w:right="0" w:hanging="360"/>
       </w:pPr>
       <w:r>
         <w:rPr>
@@ -11647,17 +11390,6 @@
     <w:p>
       <w:pPr>
         <w:pStyle w:val="ListBullet"/>
-        <w:keepNext w:val="0"/>
-        <w:keepLines/>
-        <w:numPr>
-          <w:ilvl w:val="0"/>
-          <w:numId w:val="15"/>
-        </w:numPr>
-        <w:tabs>
-          <w:tab w:pos="1080" w:val="left"/>
-        </w:tabs>
-        <w:spacing w:before="0" w:after="0" w:line="360" w:lineRule="auto"/>
-        <w:ind w:left="1080" w:right="0" w:hanging="360"/>
       </w:pPr>
       <w:r>
         <w:rPr>
@@ -11671,17 +11403,6 @@
     <w:p>
       <w:pPr>
         <w:pStyle w:val="ListBullet"/>
-        <w:keepNext w:val="0"/>
-        <w:keepLines/>
-        <w:numPr>
-          <w:ilvl w:val="0"/>
-          <w:numId w:val="15"/>
-        </w:numPr>
-        <w:tabs>
-          <w:tab w:pos="1080" w:val="left"/>
-        </w:tabs>
-        <w:spacing w:before="0" w:after="0" w:line="360" w:lineRule="auto"/>
-        <w:ind w:left="1080" w:right="0" w:hanging="360"/>
       </w:pPr>
       <w:r>
         <w:rPr>
@@ -11695,17 +11416,6 @@
     <w:p>
       <w:pPr>
         <w:pStyle w:val="ListBullet"/>
-        <w:keepNext w:val="0"/>
-        <w:keepLines/>
-        <w:numPr>
-          <w:ilvl w:val="0"/>
-          <w:numId w:val="15"/>
-        </w:numPr>
-        <w:tabs>
-          <w:tab w:pos="1080" w:val="left"/>
-        </w:tabs>
-        <w:spacing w:before="0" w:after="0" w:line="360" w:lineRule="auto"/>
-        <w:ind w:left="1080" w:right="0" w:hanging="360"/>
       </w:pPr>
       <w:r>
         <w:rPr>
@@ -11719,17 +11429,6 @@
     <w:p>
       <w:pPr>
         <w:pStyle w:val="ListBullet"/>
-        <w:keepNext w:val="0"/>
-        <w:keepLines/>
-        <w:numPr>
-          <w:ilvl w:val="0"/>
-          <w:numId w:val="15"/>
-        </w:numPr>
-        <w:tabs>
-          <w:tab w:pos="1080" w:val="left"/>
-        </w:tabs>
-        <w:spacing w:before="0" w:after="0" w:line="360" w:lineRule="auto"/>
-        <w:ind w:left="1080" w:right="0" w:hanging="360"/>
       </w:pPr>
       <w:r>
         <w:rPr>
@@ -11752,17 +11451,6 @@
     <w:p>
       <w:pPr>
         <w:pStyle w:val="ListBullet"/>
-        <w:keepNext w:val="0"/>
-        <w:keepLines/>
-        <w:numPr>
-          <w:ilvl w:val="0"/>
-          <w:numId w:val="15"/>
-        </w:numPr>
-        <w:tabs>
-          <w:tab w:pos="1080" w:val="left"/>
-        </w:tabs>
-        <w:spacing w:before="0" w:after="0" w:line="360" w:lineRule="auto"/>
-        <w:ind w:left="1080" w:right="0" w:hanging="360"/>
       </w:pPr>
       <w:r>
         <w:rPr>
@@ -11776,17 +11464,6 @@
     <w:p>
       <w:pPr>
         <w:pStyle w:val="ListBullet"/>
-        <w:keepNext w:val="0"/>
-        <w:keepLines/>
-        <w:numPr>
-          <w:ilvl w:val="0"/>
-          <w:numId w:val="15"/>
-        </w:numPr>
-        <w:tabs>
-          <w:tab w:pos="1080" w:val="left"/>
-        </w:tabs>
-        <w:spacing w:before="0" w:after="0" w:line="360" w:lineRule="auto"/>
-        <w:ind w:left="1080" w:right="0" w:hanging="360"/>
       </w:pPr>
       <w:r>
         <w:rPr>
@@ -11800,17 +11477,6 @@
     <w:p>
       <w:pPr>
         <w:pStyle w:val="ListBullet"/>
-        <w:keepNext w:val="0"/>
-        <w:keepLines/>
-        <w:numPr>
-          <w:ilvl w:val="0"/>
-          <w:numId w:val="15"/>
-        </w:numPr>
-        <w:tabs>
-          <w:tab w:pos="1080" w:val="left"/>
-        </w:tabs>
-        <w:spacing w:before="0" w:after="0" w:line="360" w:lineRule="auto"/>
-        <w:ind w:left="1080" w:right="0" w:hanging="360"/>
       </w:pPr>
       <w:r>
         <w:rPr>
@@ -11824,17 +11490,6 @@
     <w:p>
       <w:pPr>
         <w:pStyle w:val="ListBullet"/>
-        <w:keepNext w:val="0"/>
-        <w:keepLines/>
-        <w:numPr>
-          <w:ilvl w:val="0"/>
-          <w:numId w:val="15"/>
-        </w:numPr>
-        <w:tabs>
-          <w:tab w:pos="1080" w:val="left"/>
-        </w:tabs>
-        <w:spacing w:before="0" w:after="0" w:line="360" w:lineRule="auto"/>
-        <w:ind w:left="1080" w:right="0" w:hanging="360"/>
       </w:pPr>
       <w:r>
         <w:rPr>
@@ -11866,17 +11521,6 @@
     <w:p>
       <w:pPr>
         <w:pStyle w:val="ListBullet"/>
-        <w:keepNext w:val="0"/>
-        <w:keepLines/>
-        <w:numPr>
-          <w:ilvl w:val="0"/>
-          <w:numId w:val="15"/>
-        </w:numPr>
-        <w:tabs>
-          <w:tab w:pos="1080" w:val="left"/>
-        </w:tabs>
-        <w:spacing w:before="0" w:after="0" w:line="360" w:lineRule="auto"/>
-        <w:ind w:left="1080" w:right="0" w:hanging="360"/>
       </w:pPr>
       <w:r>
         <w:rPr>
@@ -11890,17 +11534,6 @@
     <w:p>
       <w:pPr>
         <w:pStyle w:val="ListBullet"/>
-        <w:keepNext w:val="0"/>
-        <w:keepLines/>
-        <w:numPr>
-          <w:ilvl w:val="0"/>
-          <w:numId w:val="15"/>
-        </w:numPr>
-        <w:tabs>
-          <w:tab w:pos="1080" w:val="left"/>
-        </w:tabs>
-        <w:spacing w:before="0" w:after="0" w:line="360" w:lineRule="auto"/>
-        <w:ind w:left="1080" w:right="0" w:hanging="360"/>
       </w:pPr>
       <w:r>
         <w:rPr>
@@ -11914,17 +11547,6 @@
     <w:p>
       <w:pPr>
         <w:pStyle w:val="ListBullet"/>
-        <w:keepNext w:val="0"/>
-        <w:keepLines/>
-        <w:numPr>
-          <w:ilvl w:val="0"/>
-          <w:numId w:val="15"/>
-        </w:numPr>
-        <w:tabs>
-          <w:tab w:pos="1080" w:val="left"/>
-        </w:tabs>
-        <w:spacing w:before="0" w:after="0" w:line="360" w:lineRule="auto"/>
-        <w:ind w:left="1080" w:right="0" w:hanging="360"/>
       </w:pPr>
       <w:r>
         <w:rPr>

</xml_diff>